<commit_message>
Deploying to gh-pages from  @ cfdf9d5f3d55e4bfbf5b8cfb49209831b2606000 🚀
</commit_message>
<xml_diff>
--- a/manuscript.docx
+++ b/manuscript.docx
@@ -72,7 +72,7 @@
         <w:t xml:space="preserve"> </w:t>
       </w:r>
       <w:r>
-        <w:t xml:space="preserve">was automatically generated on September 24, 2020.</w:t>
+        <w:t xml:space="preserve">was automatically generated on September 27, 2020.</w:t>
       </w:r>
       <w:r>
         <w:t xml:space="preserve"> </w:t>
@@ -1456,21 +1456,15 @@
         <m:r>
           <m:t>=</m:t>
         </m:r>
-        <m:sSup>
-          <m:e>
-            <m:r>
-              <m:t>10</m:t>
-            </m:r>
-          </m:e>
-          <m:sup>
-            <m:r>
-              <m:t>−</m:t>
-            </m:r>
-            <m:r>
-              <m:t>9</m:t>
-            </m:r>
-          </m:sup>
-        </m:sSup>
+        <m:r>
+          <m:t>1</m:t>
+        </m:r>
+        <m:r>
+          <m:rPr>
+            <m:sty m:val="p"/>
+          </m:rPr>
+          <m:t>n</m:t>
+        </m:r>
         <m:r>
           <m:rPr>
             <m:sty m:val="p"/>
@@ -2119,21 +2113,15 @@
         <m:r>
           <m:t>=</m:t>
         </m:r>
-        <m:sSup>
-          <m:e>
-            <m:r>
-              <m:t>10</m:t>
-            </m:r>
-          </m:e>
-          <m:sup>
-            <m:r>
-              <m:t>−</m:t>
-            </m:r>
-            <m:r>
-              <m:t>9</m:t>
-            </m:r>
-          </m:sup>
-        </m:sSup>
+        <m:r>
+          <m:t>1</m:t>
+        </m:r>
+        <m:r>
+          <m:rPr>
+            <m:sty m:val="p"/>
+          </m:rPr>
+          <m:t>n</m:t>
+        </m:r>
         <m:r>
           <m:rPr>
             <m:sty m:val="p"/>
@@ -4279,21 +4267,15 @@
         <m:r>
           <m:t>=</m:t>
         </m:r>
-        <m:sSup>
-          <m:e>
-            <m:r>
-              <m:t>10</m:t>
-            </m:r>
-          </m:e>
-          <m:sup>
-            <m:r>
-              <m:t>−</m:t>
-            </m:r>
-            <m:r>
-              <m:t>9</m:t>
-            </m:r>
-          </m:sup>
-        </m:sSup>
+        <m:r>
+          <m:t>1</m:t>
+        </m:r>
+        <m:r>
+          <m:rPr>
+            <m:sty m:val="p"/>
+          </m:rPr>
+          <m:t>n</m:t>
+        </m:r>
         <m:r>
           <m:rPr>
             <m:sty m:val="p"/>
@@ -4963,21 +4945,15 @@
         <m:r>
           <m:t>=</m:t>
         </m:r>
-        <m:sSup>
-          <m:e>
-            <m:r>
-              <m:t>10</m:t>
-            </m:r>
-          </m:e>
-          <m:sup>
-            <m:r>
-              <m:t>−</m:t>
-            </m:r>
-            <m:r>
-              <m:t>9</m:t>
-            </m:r>
-          </m:sup>
-        </m:sSup>
+        <m:r>
+          <m:t>1</m:t>
+        </m:r>
+        <m:r>
+          <m:rPr>
+            <m:sty m:val="p"/>
+          </m:rPr>
+          <m:t>n</m:t>
+        </m:r>
         <m:r>
           <m:rPr>
             <m:sty m:val="p"/>
@@ -6129,21 +6105,15 @@
         <m:r>
           <m:t>=</m:t>
         </m:r>
-        <m:sSup>
-          <m:e>
-            <m:r>
-              <m:t>10</m:t>
-            </m:r>
-          </m:e>
-          <m:sup>
-            <m:r>
-              <m:t>−</m:t>
-            </m:r>
-            <m:r>
-              <m:t>9</m:t>
-            </m:r>
-          </m:sup>
-        </m:sSup>
+        <m:r>
+          <m:t>1</m:t>
+        </m:r>
+        <m:r>
+          <m:rPr>
+            <m:sty m:val="p"/>
+          </m:rPr>
+          <m:t>n</m:t>
+        </m:r>
         <m:r>
           <m:rPr>
             <m:sty m:val="p"/>
@@ -6995,21 +6965,15 @@
         <m:r>
           <m:t>=</m:t>
         </m:r>
-        <m:sSup>
-          <m:e>
-            <m:r>
-              <m:t>10</m:t>
-            </m:r>
-          </m:e>
-          <m:sup>
-            <m:r>
-              <m:t>−</m:t>
-            </m:r>
-            <m:r>
-              <m:t>9</m:t>
-            </m:r>
-          </m:sup>
-        </m:sSup>
+        <m:r>
+          <m:t>1</m:t>
+        </m:r>
+        <m:r>
+          <m:rPr>
+            <m:sty m:val="p"/>
+          </m:rPr>
+          <m:t>n</m:t>
+        </m:r>
         <m:r>
           <m:rPr>
             <m:sty m:val="p"/>
@@ -8738,21 +8702,15 @@
         <m:r>
           <m:t>=</m:t>
         </m:r>
-        <m:sSup>
-          <m:e>
-            <m:r>
-              <m:t>10</m:t>
-            </m:r>
-          </m:e>
-          <m:sup>
-            <m:r>
-              <m:t>−</m:t>
-            </m:r>
-            <m:r>
-              <m:t>8</m:t>
-            </m:r>
-          </m:sup>
-        </m:sSup>
+        <m:r>
+          <m:t>10</m:t>
+        </m:r>
+        <m:r>
+          <m:rPr>
+            <m:sty m:val="p"/>
+          </m:rPr>
+          <m:t>n</m:t>
+        </m:r>
         <m:r>
           <m:rPr>
             <m:sty m:val="p"/>
@@ -9200,21 +9158,15 @@
         <m:r>
           <m:t>=</m:t>
         </m:r>
-        <m:sSup>
-          <m:e>
-            <m:r>
-              <m:t>10</m:t>
-            </m:r>
-          </m:e>
-          <m:sup>
-            <m:r>
-              <m:t>−</m:t>
-            </m:r>
-            <m:r>
-              <m:t>8</m:t>
-            </m:r>
-          </m:sup>
-        </m:sSup>
+        <m:r>
+          <m:t>10</m:t>
+        </m:r>
+        <m:r>
+          <m:rPr>
+            <m:sty m:val="p"/>
+          </m:rPr>
+          <m:t>n</m:t>
+        </m:r>
         <m:r>
           <m:rPr>
             <m:sty m:val="p"/>
@@ -10052,21 +10004,15 @@
         <m:r>
           <m:t>=</m:t>
         </m:r>
-        <m:sSup>
-          <m:e>
-            <m:r>
-              <m:t>10</m:t>
-            </m:r>
-          </m:e>
-          <m:sup>
-            <m:r>
-              <m:t>−</m:t>
-            </m:r>
-            <m:r>
-              <m:t>9</m:t>
-            </m:r>
-          </m:sup>
-        </m:sSup>
+        <m:r>
+          <m:t>1</m:t>
+        </m:r>
+        <m:r>
+          <m:rPr>
+            <m:sty m:val="p"/>
+          </m:rPr>
+          <m:t>n</m:t>
+        </m:r>
         <m:r>
           <m:rPr>
             <m:sty m:val="p"/>
@@ -10563,21 +10509,15 @@
         <m:r>
           <m:t>=</m:t>
         </m:r>
-        <m:sSup>
-          <m:e>
-            <m:r>
-              <m:t>10</m:t>
-            </m:r>
-          </m:e>
-          <m:sup>
-            <m:r>
-              <m:t>−</m:t>
-            </m:r>
-            <m:r>
-              <m:t>9</m:t>
-            </m:r>
-          </m:sup>
-        </m:sSup>
+        <m:r>
+          <m:t>1</m:t>
+        </m:r>
+        <m:r>
+          <m:rPr>
+            <m:sty m:val="p"/>
+          </m:rPr>
+          <m:t>n</m:t>
+        </m:r>
         <m:r>
           <m:rPr>
             <m:sty m:val="p"/>
@@ -11555,21 +11495,15 @@
         <m:r>
           <m:t>=</m:t>
         </m:r>
-        <m:sSup>
-          <m:e>
-            <m:r>
-              <m:t>10</m:t>
-            </m:r>
-          </m:e>
-          <m:sup>
-            <m:r>
-              <m:t>−</m:t>
-            </m:r>
-            <m:r>
-              <m:t>9</m:t>
-            </m:r>
-          </m:sup>
-        </m:sSup>
+        <m:r>
+          <m:t>1</m:t>
+        </m:r>
+        <m:r>
+          <m:rPr>
+            <m:sty m:val="p"/>
+          </m:rPr>
+          <m:t>n</m:t>
+        </m:r>
         <m:r>
           <m:rPr>
             <m:sty m:val="p"/>
@@ -11803,21 +11737,15 @@
         <m:r>
           <m:t>=</m:t>
         </m:r>
-        <m:sSup>
-          <m:e>
-            <m:r>
-              <m:t>10</m:t>
-            </m:r>
-          </m:e>
-          <m:sup>
-            <m:r>
-              <m:t>−</m:t>
-            </m:r>
-            <m:r>
-              <m:t>9</m:t>
-            </m:r>
-          </m:sup>
-        </m:sSup>
+        <m:r>
+          <m:t>1</m:t>
+        </m:r>
+        <m:r>
+          <m:rPr>
+            <m:sty m:val="p"/>
+          </m:rPr>
+          <m:t>n</m:t>
+        </m:r>
         <m:r>
           <m:rPr>
             <m:sty m:val="p"/>
@@ -18416,7 +18344,7 @@
         </w:r>
       </w:hyperlink>
       <w:r>
-        <w:t xml:space="preserve">. (Accessed: 24th September 2020)</w:t>
+        <w:t xml:space="preserve">. (Accessed: 27th September 2020)</w:t>
       </w:r>
     </w:p>
     <w:bookmarkEnd w:id="93"/>

</xml_diff>

<commit_message>
Deploying to gh-pages from  @ e1bccdbc26e6c82abf139eb14c2acf62af6d2caf 🚀
</commit_message>
<xml_diff>
--- a/manuscript.docx
+++ b/manuscript.docx
@@ -72,7 +72,7 @@
         <w:t xml:space="preserve"> </w:t>
       </w:r>
       <w:r>
-        <w:t xml:space="preserve">was automatically generated on September 27, 2020.</w:t>
+        <w:t xml:space="preserve">was automatically generated on September 28, 2020.</w:t>
       </w:r>
       <w:r>
         <w:t xml:space="preserve"> </w:t>
@@ -18344,7 +18344,7 @@
         </w:r>
       </w:hyperlink>
       <w:r>
-        <w:t xml:space="preserve">. (Accessed: 27th September 2020)</w:t>
+        <w:t xml:space="preserve">. (Accessed: 28th September 2020)</w:t>
       </w:r>
     </w:p>
     <w:bookmarkEnd w:id="93"/>

</xml_diff>

<commit_message>
Deploying to gh-pages from  @ c812553902a8e762407524e5a38e16373b3382ed 🚀
</commit_message>
<xml_diff>
--- a/manuscript.docx
+++ b/manuscript.docx
@@ -658,7 +658,7 @@
         <w:pStyle w:val="BodyText"/>
       </w:pPr>
       <w:r>
-        <w:t xml:space="preserve">While ligand-receptor binding events in biology are diverse, they are governed by their thermodynamic properties and the law of mass action. When a reaction reaches its equilibrium state, the ratio of the concentration of monomeric ligand-receptor complex,</w:t>
+        <w:t xml:space="preserve">While ligand-receptor binding events in biology are diverse, they are governed by their thermodynamic properties and the law of mass action. When a reaction reaches its equilibrium state, the ratio of the product of the concentrations of each,</w:t>
       </w:r>
       <w:r>
         <w:t xml:space="preserve"> </w:t>
@@ -671,6 +671,12 @@
           <m:t>L</m:t>
         </m:r>
         <m:r>
+          <m:t>]</m:t>
+        </m:r>
+        <m:r>
+          <m:t>[</m:t>
+        </m:r>
+        <m:r>
           <m:t>R</m:t>
         </m:r>
         <m:r>
@@ -678,7 +684,7 @@
         </m:r>
       </m:oMath>
       <w:r>
-        <w:t xml:space="preserve">, to the product of the concentrations of each,</w:t>
+        <w:t xml:space="preserve">, to the concentration of monomeric ligand-receptor complex,</w:t>
       </w:r>
       <w:r>
         <w:t xml:space="preserve"> </w:t>
@@ -691,20 +697,14 @@
           <m:t>L</m:t>
         </m:r>
         <m:r>
+          <m:t>R</m:t>
+        </m:r>
+        <m:r>
           <m:t>]</m:t>
         </m:r>
-        <m:r>
-          <m:t>[</m:t>
-        </m:r>
-        <m:r>
-          <m:t>R</m:t>
-        </m:r>
-        <m:r>
-          <m:t>]</m:t>
-        </m:r>
-      </m:oMath>
-      <w:r>
-        <w:t xml:space="preserve">, can be defined as an association constant</w:t>
+      </m:oMath>
+      <w:r>
+        <w:t xml:space="preserve">, can be defined as a dissociation constant</w:t>
       </w:r>
       <w:r>
         <w:t xml:space="preserve"> </w:t>
@@ -718,7 +718,7 @@
           </m:e>
           <m:sub>
             <m:r>
-              <m:t>a</m:t>
+              <m:t>D</m:t>
             </m:r>
           </m:sub>
         </m:sSub>
@@ -738,7 +738,7 @@
         </w:r>
       </w:hyperlink>
       <w:r>
-        <w:t xml:space="preserve">a). During initial association, we will assume that the first subunit on a ligand complex binds according to the same dynamics that govern monovalent binding. Subsequent binding events exhibit different behavior, however, due to the increased local concentration of the complex. Here, we assume that the effective association constant for the subsequent bindings is proportional to that of the free binding, but scaled by a constant,</w:t>
+        <w:t xml:space="preserve">a). During initial association, we will assume that the first subunit on a ligand complex binds according to the same dynamics that govern monovalent binding. Subsequent binding events exhibit different behavior, however, due to the increased local concentration of the complex. Here, we assume that the effective dissociation constant for the subsequent bindings is proportional to that of the free binding, but scaled by a constant,</w:t>
       </w:r>
       <w:r>
         <w:t xml:space="preserve"> </w:t>
@@ -896,7 +896,7 @@
         </m:r>
       </m:oMath>
       <w:r>
-        <w:t xml:space="preserve">, and the association constants to the two receptors to be</w:t>
+        <w:t xml:space="preserve">, and the dissociation constants to the two receptors to be</w:t>
       </w:r>
       <w:r>
         <w:t xml:space="preserve"> </w:t>
@@ -910,81 +910,45 @@
           </m:e>
           <m:sup>
             <m:r>
-              <m:t>5</m:t>
+              <m:t>4</m:t>
             </m:r>
           </m:sup>
         </m:sSup>
+        <m:r>
+          <m:t>n</m:t>
+        </m:r>
+        <m:r>
+          <m:t>M</m:t>
+        </m:r>
+      </m:oMath>
+      <w:r>
+        <w:t xml:space="preserve"> </w:t>
+      </w:r>
+      <w:r>
+        <w:t xml:space="preserve">and</w:t>
+      </w:r>
+      <w:r>
+        <w:t xml:space="preserve"> </w:t>
+      </w:r>
+      <m:oMath>
         <m:sSup>
           <m:e>
             <m:r>
-              <m:rPr>
-                <m:sty m:val="p"/>
-              </m:rPr>
-              <m:t>M</m:t>
-            </m:r>
-          </m:e>
-          <m:sup>
-            <m:r>
-              <m:rPr>
-                <m:sty m:val="p"/>
-              </m:rPr>
-              <m:t>−</m:t>
-            </m:r>
-            <m:r>
-              <m:rPr>
-                <m:sty m:val="p"/>
-              </m:rPr>
-              <m:t>1</m:t>
+              <m:t>10</m:t>
+            </m:r>
+          </m:e>
+          <m:sup>
+            <m:r>
+              <m:t>2</m:t>
             </m:r>
           </m:sup>
         </m:sSup>
-      </m:oMath>
-      <w:r>
-        <w:t xml:space="preserve"> </w:t>
-      </w:r>
-      <w:r>
-        <w:t xml:space="preserve">and</w:t>
-      </w:r>
-      <w:r>
-        <w:t xml:space="preserve"> </w:t>
-      </w:r>
-      <m:oMath>
-        <m:sSup>
-          <m:e>
-            <m:r>
-              <m:t>10</m:t>
-            </m:r>
-          </m:e>
-          <m:sup>
-            <m:r>
-              <m:t>7</m:t>
-            </m:r>
-          </m:sup>
-        </m:sSup>
-        <m:sSup>
-          <m:e>
-            <m:r>
-              <m:rPr>
-                <m:sty m:val="p"/>
-              </m:rPr>
-              <m:t>M</m:t>
-            </m:r>
-          </m:e>
-          <m:sup>
-            <m:r>
-              <m:rPr>
-                <m:sty m:val="p"/>
-              </m:rPr>
-              <m:t>−</m:t>
-            </m:r>
-            <m:r>
-              <m:rPr>
-                <m:sty m:val="p"/>
-              </m:rPr>
-              <m:t>1</m:t>
-            </m:r>
-          </m:sup>
-        </m:sSup>
+        <m:r>
+          <m:t>n</m:t>
+        </m:r>
+        <m:r>
+          <m:t>M</m:t>
+        </m:r>
       </m:oMath>
       <w:r>
         <w:t xml:space="preserve">, respectively. Figure</w:t>
@@ -1376,7 +1340,7 @@
         <w:t xml:space="preserve"> </w:t>
       </w:r>
       <w:r>
-        <w:t xml:space="preserve">a) Heat/contour maps of monovalent ligand binding to cell populations given the surface abundance of two receptors. Ligand association constants to these receptors range from</w:t>
+        <w:t xml:space="preserve">a) Heat/contour maps of monovalent ligand binding to cell populations given the surface abundance of two receptors. Ligand dissociation constants to these receptors range from</w:t>
       </w:r>
       <w:r>
         <w:t xml:space="preserve"> </w:t>
@@ -1390,7 +1354,7 @@
           </m:e>
           <m:sup>
             <m:r>
-              <m:t>5</m:t>
+              <m:t>4</m:t>
             </m:r>
           </m:sup>
         </m:sSup>
@@ -1405,34 +1369,16 @@
           </m:e>
           <m:sup>
             <m:r>
-              <m:t>7</m:t>
+              <m:t>2</m:t>
             </m:r>
           </m:sup>
         </m:sSup>
-        <m:sSup>
-          <m:e>
-            <m:r>
-              <m:rPr>
-                <m:sty m:val="p"/>
-              </m:rPr>
-              <m:t>M</m:t>
-            </m:r>
-          </m:e>
-          <m:sup>
-            <m:r>
-              <m:rPr>
-                <m:sty m:val="p"/>
-              </m:rPr>
-              <m:t>−</m:t>
-            </m:r>
-            <m:r>
-              <m:rPr>
-                <m:sty m:val="p"/>
-              </m:rPr>
-              <m:t>1</m:t>
-            </m:r>
-          </m:sup>
-        </m:sSup>
+        <m:r>
+          <m:t>n</m:t>
+        </m:r>
+        <m:r>
+          <m:t>M</m:t>
+        </m:r>
       </m:oMath>
       <w:r>
         <w:t xml:space="preserve">. Ligand concentration</w:t>
@@ -1516,7 +1462,7 @@
         </m:sSup>
       </m:oMath>
       <w:r>
-        <w:t xml:space="preserve">. b-e) Heatmap of binding ratio of cell populations exposed to a monovalent ligand with association constants to receptor 1 and 2 ranging from</w:t>
+        <w:t xml:space="preserve">. b-e) Heatmap of binding ratio of cell populations exposed to a monovalent ligand with dissociation constants to receptor 1 and 2 ranging from</w:t>
       </w:r>
       <w:r>
         <w:t xml:space="preserve"> </w:t>
@@ -1530,7 +1476,7 @@
           </m:e>
           <m:sup>
             <m:r>
-              <m:t>5</m:t>
+              <m:t>4</m:t>
             </m:r>
           </m:sup>
         </m:sSup>
@@ -1545,34 +1491,16 @@
           </m:e>
           <m:sup>
             <m:r>
-              <m:t>7</m:t>
+              <m:t>2</m:t>
             </m:r>
           </m:sup>
         </m:sSup>
-        <m:sSup>
-          <m:e>
-            <m:r>
-              <m:rPr>
-                <m:sty m:val="p"/>
-              </m:rPr>
-              <m:t>M</m:t>
-            </m:r>
-          </m:e>
-          <m:sup>
-            <m:r>
-              <m:rPr>
-                <m:sty m:val="p"/>
-              </m:rPr>
-              <m:t>−</m:t>
-            </m:r>
-            <m:r>
-              <m:rPr>
-                <m:sty m:val="p"/>
-              </m:rPr>
-              <m:t>1</m:t>
-            </m:r>
-          </m:sup>
-        </m:sSup>
+        <m:r>
+          <m:t>n</m:t>
+        </m:r>
+        <m:r>
+          <m:t>M</m:t>
+        </m:r>
       </m:oMath>
       <w:r>
         <w:t xml:space="preserve">, at a concentration of</w:t>
@@ -2033,7 +1961,7 @@
         <w:t xml:space="preserve"> </w:t>
       </w:r>
       <w:r>
-        <w:t xml:space="preserve">a) Heat/contour maps of monovalent ligand binding to cell populations given the surface abundance of two receptors. Ligand association constants to these receptors range from</w:t>
+        <w:t xml:space="preserve">a) Heat/contour maps of monovalent ligand binding to cell populations given the surface abundance of two receptors. Ligand dissociation constants to these receptors range from</w:t>
       </w:r>
       <w:r>
         <w:t xml:space="preserve"> </w:t>
@@ -2047,7 +1975,7 @@
           </m:e>
           <m:sup>
             <m:r>
-              <m:t>5</m:t>
+              <m:t>4</m:t>
             </m:r>
           </m:sup>
         </m:sSup>
@@ -2062,34 +1990,16 @@
           </m:e>
           <m:sup>
             <m:r>
-              <m:t>7</m:t>
+              <m:t>2</m:t>
             </m:r>
           </m:sup>
         </m:sSup>
-        <m:sSup>
-          <m:e>
-            <m:r>
-              <m:rPr>
-                <m:sty m:val="p"/>
-              </m:rPr>
-              <m:t>M</m:t>
-            </m:r>
-          </m:e>
-          <m:sup>
-            <m:r>
-              <m:rPr>
-                <m:sty m:val="p"/>
-              </m:rPr>
-              <m:t>−</m:t>
-            </m:r>
-            <m:r>
-              <m:rPr>
-                <m:sty m:val="p"/>
-              </m:rPr>
-              <m:t>1</m:t>
-            </m:r>
-          </m:sup>
-        </m:sSup>
+        <m:r>
+          <m:t>n</m:t>
+        </m:r>
+        <m:r>
+          <m:t>M</m:t>
+        </m:r>
       </m:oMath>
       <w:r>
         <w:t xml:space="preserve">. Ligand concentration</w:t>
@@ -2173,7 +2083,7 @@
         </m:sSup>
       </m:oMath>
       <w:r>
-        <w:t xml:space="preserve">. b-e) Heatmap of binding ratio of cell populations exposed to a monovalent ligand with association constants to receptor 1 and 2 ranging from</w:t>
+        <w:t xml:space="preserve">. b-e) Heatmap of binding ratio of cell populations exposed to a monovalent ligand with dissociation constants to receptor 1 and 2 ranging from</w:t>
       </w:r>
       <w:r>
         <w:t xml:space="preserve"> </w:t>
@@ -2187,7 +2097,7 @@
           </m:e>
           <m:sup>
             <m:r>
-              <m:t>5</m:t>
+              <m:t>4</m:t>
             </m:r>
           </m:sup>
         </m:sSup>
@@ -2202,34 +2112,16 @@
           </m:e>
           <m:sup>
             <m:r>
-              <m:t>7</m:t>
+              <m:t>2</m:t>
             </m:r>
           </m:sup>
         </m:sSup>
-        <m:sSup>
-          <m:e>
-            <m:r>
-              <m:rPr>
-                <m:sty m:val="p"/>
-              </m:rPr>
-              <m:t>M</m:t>
-            </m:r>
-          </m:e>
-          <m:sup>
-            <m:r>
-              <m:rPr>
-                <m:sty m:val="p"/>
-              </m:rPr>
-              <m:t>−</m:t>
-            </m:r>
-            <m:r>
-              <m:rPr>
-                <m:sty m:val="p"/>
-              </m:rPr>
-              <m:t>1</m:t>
-            </m:r>
-          </m:sup>
-        </m:sSup>
+        <m:r>
+          <m:t>n</m:t>
+        </m:r>
+        <m:r>
+          <m:t>M</m:t>
+        </m:r>
       </m:oMath>
       <w:r>
         <w:t xml:space="preserve">, at a concentration of</w:t>
@@ -3563,7 +3455,7 @@
         </w:r>
       </w:hyperlink>
       <w:r>
-        <w:t xml:space="preserve">b-d). Here, the ligand binding ratios between cell populations are shown for ligands of high, medium, and low affinities (</w:t>
+        <w:t xml:space="preserve">b-d). Here, the ligand binding ratios between cell populations are shown for ligands of low, medium, and high affinities (</w:t>
       </w:r>
       <m:oMath>
         <m:sSub>
@@ -3574,7 +3466,7 @@
           </m:e>
           <m:sub>
             <m:r>
-              <m:t>a</m:t>
+              <m:t>D</m:t>
             </m:r>
           </m:sub>
         </m:sSub>
@@ -3597,7 +3489,7 @@
           </m:e>
           <m:sup>
             <m:r>
-              <m:t>6</m:t>
+              <m:t>3</m:t>
             </m:r>
           </m:sup>
         </m:sSup>
@@ -3617,7 +3509,7 @@
           </m:e>
           <m:sup>
             <m:r>
-              <m:t>7</m:t>
+              <m:t>2</m:t>
             </m:r>
           </m:sup>
         </m:sSup>
@@ -3637,7 +3529,7 @@
           </m:e>
           <m:sup>
             <m:r>
-              <m:t>8</m:t>
+              <m:t>1</m:t>
             </m:r>
           </m:sup>
         </m:sSup>
@@ -3645,34 +3537,8 @@
       <w:r>
         <w:t xml:space="preserve"> </w:t>
       </w:r>
-      <m:oMath>
-        <m:sSup>
-          <m:e>
-            <m:r>
-              <m:rPr>
-                <m:sty m:val="p"/>
-              </m:rPr>
-              <m:t>M</m:t>
-            </m:r>
-          </m:e>
-          <m:sup>
-            <m:r>
-              <m:rPr>
-                <m:sty m:val="p"/>
-              </m:rPr>
-              <m:t>−</m:t>
-            </m:r>
-            <m:r>
-              <m:rPr>
-                <m:sty m:val="p"/>
-              </m:rPr>
-              <m:t>1</m:t>
-            </m:r>
-          </m:sup>
-        </m:sSup>
-      </m:oMath>
-      <w:r>
-        <w:t xml:space="preserve">). For example, the ligand binding ratio between</w:t>
+      <w:r>
+        <w:t xml:space="preserve">nM). For example, the ligand binding ratio between</w:t>
       </w:r>
       <w:r>
         <w:t xml:space="preserve"> </w:t>
@@ -4052,7 +3918,7 @@
         <w:t xml:space="preserve"> </w:t>
       </w:r>
       <w:r>
-        <w:t xml:space="preserve">receptors displays similar amounts of binding at each valency for ligands with association constants of</w:t>
+        <w:t xml:space="preserve">receptors displays similar amounts of binding at each valency for ligands with dissociation constants of</w:t>
       </w:r>
       <w:r>
         <w:t xml:space="preserve"> </w:t>
@@ -4066,7 +3932,7 @@
           </m:e>
           <m:sup>
             <m:r>
-              <m:t>6</m:t>
+              <m:t>3</m:t>
             </m:r>
           </m:sup>
         </m:sSup>
@@ -4086,7 +3952,7 @@
           </m:e>
           <m:sup>
             <m:r>
-              <m:t>7</m:t>
+              <m:t>2</m:t>
             </m:r>
           </m:sup>
         </m:sSup>
@@ -4106,7 +3972,7 @@
           </m:e>
           <m:sup>
             <m:r>
-              <m:t>8</m:t>
+              <m:t>1</m:t>
             </m:r>
           </m:sup>
         </m:sSup>
@@ -4115,7 +3981,7 @@
         <w:t xml:space="preserve"> </w:t>
       </w:r>
       <w:r>
-        <w:t xml:space="preserve">(Fig.</w:t>
+        <w:t xml:space="preserve">nM (Fig.</w:t>
       </w:r>
       <w:r>
         <w:t xml:space="preserve"> </w:t>
@@ -4196,14 +4062,14 @@
         <w:t xml:space="preserve"> </w:t>
       </w:r>
       <w:r>
-        <w:t xml:space="preserve">a) Heat/contour maps of multivalent ligands bound to cell populations given their expression profiles of two receptors. Multivalent ligand subunits bind to both receptor 1 and 2 with an association constant of</w:t>
-      </w:r>
-      <w:r>
-        <w:t xml:space="preserve"> </w:t>
-      </w:r>
-      <m:oMath>
-        <m:r>
-          <m:t>3</m:t>
+        <w:t xml:space="preserve">a) Heat/contour maps of multivalent ligands bound to cell populations given their expression profiles of two receptors. Multivalent ligand subunits bind to both receptor 1 with an dissociation constant of</w:t>
+      </w:r>
+      <w:r>
+        <w:t xml:space="preserve"> </w:t>
+      </w:r>
+      <m:oMath>
+        <m:r>
+          <m:t>3.3</m:t>
         </m:r>
         <m:r>
           <m:t>×</m:t>
@@ -4216,37 +4082,19 @@
           </m:e>
           <m:sup>
             <m:r>
-              <m:t>6</m:t>
+              <m:t>2</m:t>
             </m:r>
           </m:sup>
         </m:sSup>
-        <m:sSup>
-          <m:e>
-            <m:r>
-              <m:rPr>
-                <m:sty m:val="p"/>
-              </m:rPr>
-              <m:t>M</m:t>
-            </m:r>
-          </m:e>
-          <m:sup>
-            <m:r>
-              <m:rPr>
-                <m:sty m:val="p"/>
-              </m:rPr>
-              <m:t>−</m:t>
-            </m:r>
-            <m:r>
-              <m:rPr>
-                <m:sty m:val="p"/>
-              </m:rPr>
-              <m:t>1</m:t>
-            </m:r>
-          </m:sup>
-        </m:sSup>
-      </m:oMath>
-      <w:r>
-        <w:t xml:space="preserve">, and complexes vary in valency from 1 to 16. Ligand concentration</w:t>
+        <m:r>
+          <m:t>n</m:t>
+        </m:r>
+        <m:r>
+          <m:t>M</m:t>
+        </m:r>
+      </m:oMath>
+      <w:r>
+        <w:t xml:space="preserve">, and do not bind to receptor 2. Complexes vary in valency from 1 to 16. Ligand concentration</w:t>
       </w:r>
       <w:r>
         <w:t xml:space="preserve"> </w:t>
@@ -4642,7 +4490,7 @@
         </m:sSubSup>
       </m:oMath>
       <w:r>
-        <w:t xml:space="preserve">. e-f) Number of ligands bound at each degree of binding for cells exposed to octavalent ligand complexes composed of subunits with a association constants of</w:t>
+        <w:t xml:space="preserve">. e-f) Number of ligands bound at each degree of binding for cells exposed to octavalent ligand complexes composed of subunits with dissociation constants of</w:t>
       </w:r>
       <w:r>
         <w:t xml:space="preserve"> </w:t>
@@ -4662,137 +4510,51 @@
           </m:e>
           <m:sup>
             <m:r>
-              <m:t>6</m:t>
+              <m:t>3</m:t>
             </m:r>
           </m:sup>
         </m:sSup>
+        <m:r>
+          <m:t>n</m:t>
+        </m:r>
+        <m:r>
+          <m:t>M</m:t>
+        </m:r>
+      </m:oMath>
+      <w:r>
+        <w:t xml:space="preserve">,</w:t>
+      </w:r>
+      <w:r>
+        <w:t xml:space="preserve"> </w:t>
+      </w:r>
+      <m:oMath>
+        <m:r>
+          <m:t>1</m:t>
+        </m:r>
+        <m:r>
+          <m:t>×</m:t>
+        </m:r>
         <m:sSup>
           <m:e>
             <m:r>
-              <m:rPr>
-                <m:sty m:val="p"/>
-              </m:rPr>
-              <m:t>M</m:t>
-            </m:r>
-          </m:e>
-          <m:sup>
-            <m:r>
-              <m:rPr>
-                <m:sty m:val="p"/>
-              </m:rPr>
-              <m:t>−</m:t>
-            </m:r>
-            <m:r>
-              <m:rPr>
-                <m:sty m:val="p"/>
-              </m:rPr>
-              <m:t>1</m:t>
+              <m:t>10</m:t>
+            </m:r>
+          </m:e>
+          <m:sup>
+            <m:r>
+              <m:t>2</m:t>
             </m:r>
           </m:sup>
         </m:sSup>
-      </m:oMath>
-      <w:r>
-        <w:t xml:space="preserve">,</w:t>
-      </w:r>
-      <w:r>
-        <w:t xml:space="preserve"> </w:t>
-      </w:r>
-      <m:oMath>
-        <m:r>
-          <m:t>1</m:t>
-        </m:r>
-        <m:r>
-          <m:t>×</m:t>
-        </m:r>
-        <m:sSup>
-          <m:e>
-            <m:r>
-              <m:t>10</m:t>
-            </m:r>
-          </m:e>
-          <m:sup>
-            <m:r>
-              <m:t>7</m:t>
-            </m:r>
-          </m:sup>
-        </m:sSup>
-        <m:sSup>
-          <m:e>
-            <m:r>
-              <m:rPr>
-                <m:sty m:val="p"/>
-              </m:rPr>
-              <m:t>M</m:t>
-            </m:r>
-          </m:e>
-          <m:sup>
-            <m:r>
-              <m:rPr>
-                <m:sty m:val="p"/>
-              </m:rPr>
-              <m:t>−</m:t>
-            </m:r>
-            <m:r>
-              <m:rPr>
-                <m:sty m:val="p"/>
-              </m:rPr>
-              <m:t>1</m:t>
-            </m:r>
-          </m:sup>
-        </m:sSup>
-      </m:oMath>
-      <w:r>
-        <w:t xml:space="preserve">, or</w:t>
-      </w:r>
-      <w:r>
-        <w:t xml:space="preserve"> </w:t>
-      </w:r>
-      <m:oMath>
-        <m:r>
-          <m:t>1</m:t>
-        </m:r>
-        <m:r>
-          <m:t>×</m:t>
-        </m:r>
-        <m:sSup>
-          <m:e>
-            <m:r>
-              <m:t>10</m:t>
-            </m:r>
-          </m:e>
-          <m:sup>
-            <m:r>
-              <m:t>8</m:t>
-            </m:r>
-          </m:sup>
-        </m:sSup>
-        <m:sSup>
-          <m:e>
-            <m:r>
-              <m:rPr>
-                <m:sty m:val="p"/>
-              </m:rPr>
-              <m:t>M</m:t>
-            </m:r>
-          </m:e>
-          <m:sup>
-            <m:r>
-              <m:rPr>
-                <m:sty m:val="p"/>
-              </m:rPr>
-              <m:t>−</m:t>
-            </m:r>
-            <m:r>
-              <m:rPr>
-                <m:sty m:val="p"/>
-              </m:rPr>
-              <m:t>1</m:t>
-            </m:r>
-          </m:sup>
-        </m:sSup>
-      </m:oMath>
-      <w:r>
-        <w:t xml:space="preserve">. d) Number of octavalent complex bound at each degree for a cell with</w:t>
+        <m:r>
+          <m:t>n</m:t>
+        </m:r>
+        <m:r>
+          <m:t>M</m:t>
+        </m:r>
+      </m:oMath>
+      <w:r>
+        <w:t xml:space="preserve">, or 10 nM for receptor 1. d) Number of octavalent complex bound at each degree for a cell with</w:t>
       </w:r>
       <w:r>
         <w:t xml:space="preserve"> </w:t>
@@ -4874,14 +4636,14 @@
         <w:t xml:space="preserve"> </w:t>
       </w:r>
       <w:r>
-        <w:t xml:space="preserve">a) Heat/contour maps of multivalent ligands bound to cell populations given their expression profiles of two receptors. Multivalent ligand subunits bind to both receptor 1 and 2 with an association constant of</w:t>
-      </w:r>
-      <w:r>
-        <w:t xml:space="preserve"> </w:t>
-      </w:r>
-      <m:oMath>
-        <m:r>
-          <m:t>3</m:t>
+        <w:t xml:space="preserve">a) Heat/contour maps of multivalent ligands bound to cell populations given their expression profiles of two receptors. Multivalent ligand subunits bind to both receptor 1 with an dissociation constant of</w:t>
+      </w:r>
+      <w:r>
+        <w:t xml:space="preserve"> </w:t>
+      </w:r>
+      <m:oMath>
+        <m:r>
+          <m:t>3.3</m:t>
         </m:r>
         <m:r>
           <m:t>×</m:t>
@@ -4894,37 +4656,19 @@
           </m:e>
           <m:sup>
             <m:r>
-              <m:t>6</m:t>
+              <m:t>2</m:t>
             </m:r>
           </m:sup>
         </m:sSup>
-        <m:sSup>
-          <m:e>
-            <m:r>
-              <m:rPr>
-                <m:sty m:val="p"/>
-              </m:rPr>
-              <m:t>M</m:t>
-            </m:r>
-          </m:e>
-          <m:sup>
-            <m:r>
-              <m:rPr>
-                <m:sty m:val="p"/>
-              </m:rPr>
-              <m:t>−</m:t>
-            </m:r>
-            <m:r>
-              <m:rPr>
-                <m:sty m:val="p"/>
-              </m:rPr>
-              <m:t>1</m:t>
-            </m:r>
-          </m:sup>
-        </m:sSup>
-      </m:oMath>
-      <w:r>
-        <w:t xml:space="preserve">, and complexes vary in valency from 1 to 16. Ligand concentration</w:t>
+        <m:r>
+          <m:t>n</m:t>
+        </m:r>
+        <m:r>
+          <m:t>M</m:t>
+        </m:r>
+      </m:oMath>
+      <w:r>
+        <w:t xml:space="preserve">, and do not bind to receptor 2. Complexes vary in valency from 1 to 16. Ligand concentration</w:t>
       </w:r>
       <w:r>
         <w:t xml:space="preserve"> </w:t>
@@ -5320,7 +5064,7 @@
         </m:sSubSup>
       </m:oMath>
       <w:r>
-        <w:t xml:space="preserve">. e-f) Number of ligands bound at each degree of binding for cells exposed to octavalent ligand complexes composed of subunits with a association constants of</w:t>
+        <w:t xml:space="preserve">. e-f) Number of ligands bound at each degree of binding for cells exposed to octavalent ligand complexes composed of subunits with dissociation constants of</w:t>
       </w:r>
       <w:r>
         <w:t xml:space="preserve"> </w:t>
@@ -5340,137 +5084,51 @@
           </m:e>
           <m:sup>
             <m:r>
-              <m:t>6</m:t>
+              <m:t>3</m:t>
             </m:r>
           </m:sup>
         </m:sSup>
+        <m:r>
+          <m:t>n</m:t>
+        </m:r>
+        <m:r>
+          <m:t>M</m:t>
+        </m:r>
+      </m:oMath>
+      <w:r>
+        <w:t xml:space="preserve">,</w:t>
+      </w:r>
+      <w:r>
+        <w:t xml:space="preserve"> </w:t>
+      </w:r>
+      <m:oMath>
+        <m:r>
+          <m:t>1</m:t>
+        </m:r>
+        <m:r>
+          <m:t>×</m:t>
+        </m:r>
         <m:sSup>
           <m:e>
             <m:r>
-              <m:rPr>
-                <m:sty m:val="p"/>
-              </m:rPr>
-              <m:t>M</m:t>
-            </m:r>
-          </m:e>
-          <m:sup>
-            <m:r>
-              <m:rPr>
-                <m:sty m:val="p"/>
-              </m:rPr>
-              <m:t>−</m:t>
-            </m:r>
-            <m:r>
-              <m:rPr>
-                <m:sty m:val="p"/>
-              </m:rPr>
-              <m:t>1</m:t>
+              <m:t>10</m:t>
+            </m:r>
+          </m:e>
+          <m:sup>
+            <m:r>
+              <m:t>2</m:t>
             </m:r>
           </m:sup>
         </m:sSup>
-      </m:oMath>
-      <w:r>
-        <w:t xml:space="preserve">,</w:t>
-      </w:r>
-      <w:r>
-        <w:t xml:space="preserve"> </w:t>
-      </w:r>
-      <m:oMath>
-        <m:r>
-          <m:t>1</m:t>
-        </m:r>
-        <m:r>
-          <m:t>×</m:t>
-        </m:r>
-        <m:sSup>
-          <m:e>
-            <m:r>
-              <m:t>10</m:t>
-            </m:r>
-          </m:e>
-          <m:sup>
-            <m:r>
-              <m:t>7</m:t>
-            </m:r>
-          </m:sup>
-        </m:sSup>
-        <m:sSup>
-          <m:e>
-            <m:r>
-              <m:rPr>
-                <m:sty m:val="p"/>
-              </m:rPr>
-              <m:t>M</m:t>
-            </m:r>
-          </m:e>
-          <m:sup>
-            <m:r>
-              <m:rPr>
-                <m:sty m:val="p"/>
-              </m:rPr>
-              <m:t>−</m:t>
-            </m:r>
-            <m:r>
-              <m:rPr>
-                <m:sty m:val="p"/>
-              </m:rPr>
-              <m:t>1</m:t>
-            </m:r>
-          </m:sup>
-        </m:sSup>
-      </m:oMath>
-      <w:r>
-        <w:t xml:space="preserve">, or</w:t>
-      </w:r>
-      <w:r>
-        <w:t xml:space="preserve"> </w:t>
-      </w:r>
-      <m:oMath>
-        <m:r>
-          <m:t>1</m:t>
-        </m:r>
-        <m:r>
-          <m:t>×</m:t>
-        </m:r>
-        <m:sSup>
-          <m:e>
-            <m:r>
-              <m:t>10</m:t>
-            </m:r>
-          </m:e>
-          <m:sup>
-            <m:r>
-              <m:t>8</m:t>
-            </m:r>
-          </m:sup>
-        </m:sSup>
-        <m:sSup>
-          <m:e>
-            <m:r>
-              <m:rPr>
-                <m:sty m:val="p"/>
-              </m:rPr>
-              <m:t>M</m:t>
-            </m:r>
-          </m:e>
-          <m:sup>
-            <m:r>
-              <m:rPr>
-                <m:sty m:val="p"/>
-              </m:rPr>
-              <m:t>−</m:t>
-            </m:r>
-            <m:r>
-              <m:rPr>
-                <m:sty m:val="p"/>
-              </m:rPr>
-              <m:t>1</m:t>
-            </m:r>
-          </m:sup>
-        </m:sSup>
-      </m:oMath>
-      <w:r>
-        <w:t xml:space="preserve">. d) Number of octavalent complex bound at each degree for a cell with</w:t>
+        <m:r>
+          <m:t>n</m:t>
+        </m:r>
+        <m:r>
+          <m:t>M</m:t>
+        </m:r>
+      </m:oMath>
+      <w:r>
+        <w:t xml:space="preserve">, or 10 nM for receptor 1. d) Number of octavalent complex bound at each degree for a cell with</w:t>
       </w:r>
       <w:r>
         <w:t xml:space="preserve"> </w:t>
@@ -5896,7 +5554,7 @@
         <w:t xml:space="preserve"> </w:t>
       </w:r>
       <w:r>
-        <w:t xml:space="preserve">a) Heat/contour maps of multivalent ligands bound to cell populations given their expression profiles of two receptors. A mixture of monovalent ligands is used, with ligand 1 binding to receptor 1 and 2 with association constants of</w:t>
+        <w:t xml:space="preserve">a) Heat/contour maps of multivalent ligands bound to cell populations given their expression profiles of two receptors. A mixture of monovalent ligands is used, with ligand 1 binding to receptor 1 and 2 with dissociation constants of</w:t>
       </w:r>
       <w:r>
         <w:t xml:space="preserve"> </w:t>
@@ -5910,34 +5568,74 @@
           </m:e>
           <m:sup>
             <m:r>
-              <m:t>6</m:t>
+              <m:t>3</m:t>
             </m:r>
           </m:sup>
         </m:sSup>
+        <m:r>
+          <m:t>n</m:t>
+        </m:r>
+        <m:r>
+          <m:t>M</m:t>
+        </m:r>
+      </m:oMath>
+      <w:r>
+        <w:t xml:space="preserve"> </w:t>
+      </w:r>
+      <w:r>
+        <w:t xml:space="preserve">and</w:t>
+      </w:r>
+      <w:r>
+        <w:t xml:space="preserve"> </w:t>
+      </w:r>
+      <m:oMath>
         <m:sSup>
           <m:e>
             <m:r>
-              <m:rPr>
-                <m:sty m:val="p"/>
-              </m:rPr>
-              <m:t>M</m:t>
-            </m:r>
-          </m:e>
-          <m:sup>
-            <m:r>
-              <m:rPr>
-                <m:sty m:val="p"/>
-              </m:rPr>
-              <m:t>−</m:t>
-            </m:r>
-            <m:r>
-              <m:rPr>
-                <m:sty m:val="p"/>
-              </m:rPr>
-              <m:t>1</m:t>
+              <m:t>10</m:t>
+            </m:r>
+          </m:e>
+          <m:sup>
+            <m:r>
+              <m:t>4</m:t>
             </m:r>
           </m:sup>
         </m:sSup>
+        <m:r>
+          <m:t>n</m:t>
+        </m:r>
+        <m:r>
+          <m:t>M</m:t>
+        </m:r>
+      </m:oMath>
+      <w:r>
+        <w:t xml:space="preserve"> </w:t>
+      </w:r>
+      <w:r>
+        <w:t xml:space="preserve">respectively, and ligand 2 binding to receptors 1 and 2 with dissociation constants of</w:t>
+      </w:r>
+      <w:r>
+        <w:t xml:space="preserve"> </w:t>
+      </w:r>
+      <m:oMath>
+        <m:sSup>
+          <m:e>
+            <m:r>
+              <m:t>10</m:t>
+            </m:r>
+          </m:e>
+          <m:sup>
+            <m:r>
+              <m:t>4</m:t>
+            </m:r>
+          </m:sup>
+        </m:sSup>
+        <m:r>
+          <m:t>n</m:t>
+        </m:r>
+        <m:r>
+          <m:t>M</m:t>
+        </m:r>
       </m:oMath>
       <w:r>
         <w:t xml:space="preserve"> </w:t>
@@ -5957,128 +5655,16 @@
           </m:e>
           <m:sup>
             <m:r>
-              <m:t>5</m:t>
+              <m:t>3</m:t>
             </m:r>
           </m:sup>
         </m:sSup>
-        <m:sSup>
-          <m:e>
-            <m:r>
-              <m:rPr>
-                <m:sty m:val="p"/>
-              </m:rPr>
-              <m:t>M</m:t>
-            </m:r>
-          </m:e>
-          <m:sup>
-            <m:r>
-              <m:rPr>
-                <m:sty m:val="p"/>
-              </m:rPr>
-              <m:t>−</m:t>
-            </m:r>
-            <m:r>
-              <m:rPr>
-                <m:sty m:val="p"/>
-              </m:rPr>
-              <m:t>1</m:t>
-            </m:r>
-          </m:sup>
-        </m:sSup>
-      </m:oMath>
-      <w:r>
-        <w:t xml:space="preserve"> </w:t>
-      </w:r>
-      <w:r>
-        <w:t xml:space="preserve">respectively, and ligand 2 binding to receptors 1 and 2 with association constants of</w:t>
-      </w:r>
-      <w:r>
-        <w:t xml:space="preserve"> </w:t>
-      </w:r>
-      <m:oMath>
-        <m:sSup>
-          <m:e>
-            <m:r>
-              <m:t>10</m:t>
-            </m:r>
-          </m:e>
-          <m:sup>
-            <m:r>
-              <m:t>5</m:t>
-            </m:r>
-          </m:sup>
-        </m:sSup>
-        <m:sSup>
-          <m:e>
-            <m:r>
-              <m:rPr>
-                <m:sty m:val="p"/>
-              </m:rPr>
-              <m:t>M</m:t>
-            </m:r>
-          </m:e>
-          <m:sup>
-            <m:r>
-              <m:rPr>
-                <m:sty m:val="p"/>
-              </m:rPr>
-              <m:t>−</m:t>
-            </m:r>
-            <m:r>
-              <m:rPr>
-                <m:sty m:val="p"/>
-              </m:rPr>
-              <m:t>1</m:t>
-            </m:r>
-          </m:sup>
-        </m:sSup>
-      </m:oMath>
-      <w:r>
-        <w:t xml:space="preserve"> </w:t>
-      </w:r>
-      <w:r>
-        <w:t xml:space="preserve">and</w:t>
-      </w:r>
-      <w:r>
-        <w:t xml:space="preserve"> </w:t>
-      </w:r>
-      <m:oMath>
-        <m:sSup>
-          <m:e>
-            <m:r>
-              <m:t>10</m:t>
-            </m:r>
-          </m:e>
-          <m:sup>
-            <m:r>
-              <m:t>6</m:t>
-            </m:r>
-          </m:sup>
-        </m:sSup>
-        <m:sSup>
-          <m:e>
-            <m:r>
-              <m:rPr>
-                <m:sty m:val="p"/>
-              </m:rPr>
-              <m:t>M</m:t>
-            </m:r>
-          </m:e>
-          <m:sup>
-            <m:r>
-              <m:rPr>
-                <m:sty m:val="p"/>
-              </m:rPr>
-              <m:t>−</m:t>
-            </m:r>
-            <m:r>
-              <m:rPr>
-                <m:sty m:val="p"/>
-              </m:rPr>
-              <m:t>1</m:t>
-            </m:r>
-          </m:sup>
-        </m:sSup>
+        <m:r>
+          <m:t>n</m:t>
+        </m:r>
+        <m:r>
+          <m:t>M</m:t>
+        </m:r>
       </m:oMath>
       <w:r>
         <w:t xml:space="preserve"> </w:t>
@@ -6756,7 +6342,7 @@
         <w:t xml:space="preserve"> </w:t>
       </w:r>
       <w:r>
-        <w:t xml:space="preserve">a) Heat/contour maps of multivalent ligands bound to cell populations given their expression profiles of two receptors. A mixture of monovalent ligands is used, with ligand 1 binding to receptor 1 and 2 with association constants of</w:t>
+        <w:t xml:space="preserve">a) Heat/contour maps of multivalent ligands bound to cell populations given their expression profiles of two receptors. A mixture of monovalent ligands is used, with ligand 1 binding to receptor 1 and 2 with dissociation constants of</w:t>
       </w:r>
       <w:r>
         <w:t xml:space="preserve"> </w:t>
@@ -6770,34 +6356,74 @@
           </m:e>
           <m:sup>
             <m:r>
-              <m:t>6</m:t>
+              <m:t>3</m:t>
             </m:r>
           </m:sup>
         </m:sSup>
+        <m:r>
+          <m:t>n</m:t>
+        </m:r>
+        <m:r>
+          <m:t>M</m:t>
+        </m:r>
+      </m:oMath>
+      <w:r>
+        <w:t xml:space="preserve"> </w:t>
+      </w:r>
+      <w:r>
+        <w:t xml:space="preserve">and</w:t>
+      </w:r>
+      <w:r>
+        <w:t xml:space="preserve"> </w:t>
+      </w:r>
+      <m:oMath>
         <m:sSup>
           <m:e>
             <m:r>
-              <m:rPr>
-                <m:sty m:val="p"/>
-              </m:rPr>
-              <m:t>M</m:t>
-            </m:r>
-          </m:e>
-          <m:sup>
-            <m:r>
-              <m:rPr>
-                <m:sty m:val="p"/>
-              </m:rPr>
-              <m:t>−</m:t>
-            </m:r>
-            <m:r>
-              <m:rPr>
-                <m:sty m:val="p"/>
-              </m:rPr>
-              <m:t>1</m:t>
+              <m:t>10</m:t>
+            </m:r>
+          </m:e>
+          <m:sup>
+            <m:r>
+              <m:t>4</m:t>
             </m:r>
           </m:sup>
         </m:sSup>
+        <m:r>
+          <m:t>n</m:t>
+        </m:r>
+        <m:r>
+          <m:t>M</m:t>
+        </m:r>
+      </m:oMath>
+      <w:r>
+        <w:t xml:space="preserve"> </w:t>
+      </w:r>
+      <w:r>
+        <w:t xml:space="preserve">respectively, and ligand 2 binding to receptors 1 and 2 with dissociation constants of</w:t>
+      </w:r>
+      <w:r>
+        <w:t xml:space="preserve"> </w:t>
+      </w:r>
+      <m:oMath>
+        <m:sSup>
+          <m:e>
+            <m:r>
+              <m:t>10</m:t>
+            </m:r>
+          </m:e>
+          <m:sup>
+            <m:r>
+              <m:t>4</m:t>
+            </m:r>
+          </m:sup>
+        </m:sSup>
+        <m:r>
+          <m:t>n</m:t>
+        </m:r>
+        <m:r>
+          <m:t>M</m:t>
+        </m:r>
       </m:oMath>
       <w:r>
         <w:t xml:space="preserve"> </w:t>
@@ -6817,128 +6443,16 @@
           </m:e>
           <m:sup>
             <m:r>
-              <m:t>5</m:t>
+              <m:t>3</m:t>
             </m:r>
           </m:sup>
         </m:sSup>
-        <m:sSup>
-          <m:e>
-            <m:r>
-              <m:rPr>
-                <m:sty m:val="p"/>
-              </m:rPr>
-              <m:t>M</m:t>
-            </m:r>
-          </m:e>
-          <m:sup>
-            <m:r>
-              <m:rPr>
-                <m:sty m:val="p"/>
-              </m:rPr>
-              <m:t>−</m:t>
-            </m:r>
-            <m:r>
-              <m:rPr>
-                <m:sty m:val="p"/>
-              </m:rPr>
-              <m:t>1</m:t>
-            </m:r>
-          </m:sup>
-        </m:sSup>
-      </m:oMath>
-      <w:r>
-        <w:t xml:space="preserve"> </w:t>
-      </w:r>
-      <w:r>
-        <w:t xml:space="preserve">respectively, and ligand 2 binding to receptors 1 and 2 with association constants of</w:t>
-      </w:r>
-      <w:r>
-        <w:t xml:space="preserve"> </w:t>
-      </w:r>
-      <m:oMath>
-        <m:sSup>
-          <m:e>
-            <m:r>
-              <m:t>10</m:t>
-            </m:r>
-          </m:e>
-          <m:sup>
-            <m:r>
-              <m:t>5</m:t>
-            </m:r>
-          </m:sup>
-        </m:sSup>
-        <m:sSup>
-          <m:e>
-            <m:r>
-              <m:rPr>
-                <m:sty m:val="p"/>
-              </m:rPr>
-              <m:t>M</m:t>
-            </m:r>
-          </m:e>
-          <m:sup>
-            <m:r>
-              <m:rPr>
-                <m:sty m:val="p"/>
-              </m:rPr>
-              <m:t>−</m:t>
-            </m:r>
-            <m:r>
-              <m:rPr>
-                <m:sty m:val="p"/>
-              </m:rPr>
-              <m:t>1</m:t>
-            </m:r>
-          </m:sup>
-        </m:sSup>
-      </m:oMath>
-      <w:r>
-        <w:t xml:space="preserve"> </w:t>
-      </w:r>
-      <w:r>
-        <w:t xml:space="preserve">and</w:t>
-      </w:r>
-      <w:r>
-        <w:t xml:space="preserve"> </w:t>
-      </w:r>
-      <m:oMath>
-        <m:sSup>
-          <m:e>
-            <m:r>
-              <m:t>10</m:t>
-            </m:r>
-          </m:e>
-          <m:sup>
-            <m:r>
-              <m:t>6</m:t>
-            </m:r>
-          </m:sup>
-        </m:sSup>
-        <m:sSup>
-          <m:e>
-            <m:r>
-              <m:rPr>
-                <m:sty m:val="p"/>
-              </m:rPr>
-              <m:t>M</m:t>
-            </m:r>
-          </m:e>
-          <m:sup>
-            <m:r>
-              <m:rPr>
-                <m:sty m:val="p"/>
-              </m:rPr>
-              <m:t>−</m:t>
-            </m:r>
-            <m:r>
-              <m:rPr>
-                <m:sty m:val="p"/>
-              </m:rPr>
-              <m:t>1</m:t>
-            </m:r>
-          </m:sup>
-        </m:sSup>
+        <m:r>
+          <m:t>n</m:t>
+        </m:r>
+        <m:r>
+          <m:t>M</m:t>
+        </m:r>
       </m:oMath>
       <w:r>
         <w:t xml:space="preserve"> </w:t>

</xml_diff>

<commit_message>
Deploying to gh-pages from  @ 6efa7f7e66c21c6c43661287be1593e48a7c9071 🚀
</commit_message>
<xml_diff>
--- a/manuscript.docx
+++ b/manuscript.docx
@@ -72,7 +72,7 @@
         <w:t xml:space="preserve"> </w:t>
       </w:r>
       <w:r>
-        <w:t xml:space="preserve">was automatically generated on September 28, 2020.</w:t>
+        <w:t xml:space="preserve">was automatically generated on October 1, 2020.</w:t>
       </w:r>
       <w:r>
         <w:t xml:space="preserve"> </w:t>
@@ -2957,15 +2957,7 @@
         </w:r>
       </w:hyperlink>
       <w:r>
-        <w:t xml:space="preserve">c). Thus, to use affinity changes for selectivity enhancement it is critical to identify which receptors a cell population of interest expresses most uniquely.</w:t>
-      </w:r>
-    </w:p>
-    <w:p>
-      <w:pPr>
-        <w:pStyle w:val="BodyText"/>
-      </w:pPr>
-      <w:r>
-        <w:t xml:space="preserve">Cell populations are made up of individual cells with heterogeneous amounts of receptor. For example,</w:t>
+        <w:t xml:space="preserve">c). In situations where both target and off target receptors express of a receptor of interest, but in differing quantities, such as when comparing</w:t>
       </w:r>
       <w:r>
         <w:t xml:space="preserve"> </w:t>
@@ -2984,6 +2976,57 @@
           </m:sub>
           <m:sup>
             <m:r>
+              <m:t>h</m:t>
+            </m:r>
+            <m:r>
+              <m:t>i</m:t>
+            </m:r>
+          </m:sup>
+        </m:sSubSup>
+        <m:sSubSup>
+          <m:e>
+            <m:r>
+              <m:t>R</m:t>
+            </m:r>
+          </m:e>
+          <m:sub>
+            <m:r>
+              <m:t>2</m:t>
+            </m:r>
+          </m:sub>
+          <m:sup>
+            <m:r>
+              <m:t>l</m:t>
+            </m:r>
+            <m:r>
+              <m:t>o</m:t>
+            </m:r>
+          </m:sup>
+        </m:sSubSup>
+      </m:oMath>
+      <w:r>
+        <w:t xml:space="preserve"> </w:t>
+      </w:r>
+      <w:r>
+        <w:t xml:space="preserve">to</w:t>
+      </w:r>
+      <w:r>
+        <w:t xml:space="preserve"> </w:t>
+      </w:r>
+      <m:oMath>
+        <m:sSubSup>
+          <m:e>
+            <m:r>
+              <m:t>R</m:t>
+            </m:r>
+          </m:e>
+          <m:sub>
+            <m:r>
+              <m:t>1</m:t>
+            </m:r>
+          </m:sub>
+          <m:sup>
+            <m:r>
               <m:t>m</m:t>
             </m:r>
             <m:r>
@@ -3007,22 +3050,16 @@
           </m:sub>
           <m:sup>
             <m:r>
-              <m:t>m</m:t>
-            </m:r>
-            <m:r>
-              <m:t>e</m:t>
-            </m:r>
-            <m:r>
-              <m:t>d</m:t>
-            </m:r>
-          </m:sup>
-        </m:sSubSup>
-      </m:oMath>
-      <w:r>
-        <w:t xml:space="preserve"> </w:t>
-      </w:r>
-      <w:r>
-        <w:t xml:space="preserve">has relatively high variance (Fig.</w:t>
+              <m:t>l</m:t>
+            </m:r>
+            <m:r>
+              <m:t>o</m:t>
+            </m:r>
+          </m:sup>
+        </m:sSubSup>
+      </m:oMath>
+      <w:r>
+        <w:t xml:space="preserve">, we see that it is beneficial to tune a ligand for tighter binding to the differentially expressed receptor (Fig.</w:t>
       </w:r>
       <w:r>
         <w:t xml:space="preserve"> </w:t>
@@ -3036,7 +3073,7 @@
         </w:r>
       </w:hyperlink>
       <w:r>
-        <w:t xml:space="preserve">). The ellipse representing its range of receptor abundances rides through multiple contour lines, indicating wide variation in the quantity of bound ligand. Thus, if we choose to maneuver the affinity of receptor 1 to attain more selective binding to</w:t>
+        <w:t xml:space="preserve">b). In cases where multiple receptors of interest are uniformally upregulated in a target population, such as when comparing</w:t>
       </w:r>
       <w:r>
         <w:t xml:space="preserve"> </w:t>
@@ -3075,6 +3112,37 @@
           </m:sub>
           <m:sup>
             <m:r>
+              <m:t>h</m:t>
+            </m:r>
+            <m:r>
+              <m:t>i</m:t>
+            </m:r>
+          </m:sup>
+        </m:sSubSup>
+      </m:oMath>
+      <w:r>
+        <w:t xml:space="preserve"> </w:t>
+      </w:r>
+      <w:r>
+        <w:t xml:space="preserve">to</w:t>
+      </w:r>
+      <w:r>
+        <w:t xml:space="preserve"> </w:t>
+      </w:r>
+      <m:oMath>
+        <m:sSubSup>
+          <m:e>
+            <m:r>
+              <m:t>R</m:t>
+            </m:r>
+          </m:e>
+          <m:sub>
+            <m:r>
+              <m:t>1</m:t>
+            </m:r>
+          </m:sub>
+          <m:sup>
+            <m:r>
               <m:t>l</m:t>
             </m:r>
             <m:r>
@@ -3082,40 +3150,6 @@
             </m:r>
           </m:sup>
         </m:sSubSup>
-      </m:oMath>
-      <w:r>
-        <w:t xml:space="preserve"> </w:t>
-      </w:r>
-      <w:r>
-        <w:t xml:space="preserve">over</w:t>
-      </w:r>
-      <w:r>
-        <w:t xml:space="preserve"> </w:t>
-      </w:r>
-      <m:oMath>
-        <m:sSubSup>
-          <m:e>
-            <m:r>
-              <m:t>R</m:t>
-            </m:r>
-          </m:e>
-          <m:sub>
-            <m:r>
-              <m:t>1</m:t>
-            </m:r>
-          </m:sub>
-          <m:sup>
-            <m:r>
-              <m:t>m</m:t>
-            </m:r>
-            <m:r>
-              <m:t>e</m:t>
-            </m:r>
-            <m:r>
-              <m:t>d</m:t>
-            </m:r>
-          </m:sup>
-        </m:sSubSup>
         <m:sSubSup>
           <m:e>
             <m:r>
@@ -3129,19 +3163,16 @@
           </m:sub>
           <m:sup>
             <m:r>
-              <m:t>m</m:t>
-            </m:r>
-            <m:r>
-              <m:t>e</m:t>
-            </m:r>
-            <m:r>
-              <m:t>d</m:t>
-            </m:r>
-          </m:sup>
-        </m:sSubSup>
-      </m:oMath>
-      <w:r>
-        <w:t xml:space="preserve">, we can expect greater intra-population variation in binding to the latter (Fig.</w:t>
+              <m:t>l</m:t>
+            </m:r>
+            <m:r>
+              <m:t>o</m:t>
+            </m:r>
+          </m:sup>
+        </m:sSubSup>
+      </m:oMath>
+      <w:r>
+        <w:t xml:space="preserve">, affinity tuning is inneffective (Fig.</w:t>
       </w:r>
       <w:r>
         <w:t xml:space="preserve"> </w:t>
@@ -3155,7 +3186,205 @@
         </w:r>
       </w:hyperlink>
       <w:r>
-        <w:t xml:space="preserve">).</w:t>
+        <w:t xml:space="preserve">d). Thus, to use affinity changes for selectivity enhancement it is critical to identify which receptors a cell population of interest expresses most uniquely.</w:t>
+      </w:r>
+    </w:p>
+    <w:p>
+      <w:pPr>
+        <w:pStyle w:val="BodyText"/>
+      </w:pPr>
+      <w:r>
+        <w:t xml:space="preserve">Cell populations are made up of individual cells with heterogeneous amounts of receptor. For example,</w:t>
+      </w:r>
+      <w:r>
+        <w:t xml:space="preserve"> </w:t>
+      </w:r>
+      <m:oMath>
+        <m:sSubSup>
+          <m:e>
+            <m:r>
+              <m:t>R</m:t>
+            </m:r>
+          </m:e>
+          <m:sub>
+            <m:r>
+              <m:t>1</m:t>
+            </m:r>
+          </m:sub>
+          <m:sup>
+            <m:r>
+              <m:t>m</m:t>
+            </m:r>
+            <m:r>
+              <m:t>e</m:t>
+            </m:r>
+            <m:r>
+              <m:t>d</m:t>
+            </m:r>
+          </m:sup>
+        </m:sSubSup>
+        <m:sSubSup>
+          <m:e>
+            <m:r>
+              <m:t>R</m:t>
+            </m:r>
+          </m:e>
+          <m:sub>
+            <m:r>
+              <m:t>2</m:t>
+            </m:r>
+          </m:sub>
+          <m:sup>
+            <m:r>
+              <m:t>m</m:t>
+            </m:r>
+            <m:r>
+              <m:t>e</m:t>
+            </m:r>
+            <m:r>
+              <m:t>d</m:t>
+            </m:r>
+          </m:sup>
+        </m:sSubSup>
+      </m:oMath>
+      <w:r>
+        <w:t xml:space="preserve"> </w:t>
+      </w:r>
+      <w:r>
+        <w:t xml:space="preserve">has relatively high variance (Fig.</w:t>
+      </w:r>
+      <w:r>
+        <w:t xml:space="preserve"> </w:t>
+      </w:r>
+      <w:hyperlink w:anchor="fig:affinity">
+        <w:r>
+          <w:rPr>
+            <w:rStyle w:val="Hyperlink"/>
+          </w:rPr>
+          <w:t xml:space="preserve">2</w:t>
+        </w:r>
+      </w:hyperlink>
+      <w:r>
+        <w:t xml:space="preserve">). The ellipse representing its range of receptor abundances rides through multiple contour lines, indicating wide variation in the quantity of bound ligand. Thus, if we choose to maneuver the affinity of receptor 1 to attain more selective binding to</w:t>
+      </w:r>
+      <w:r>
+        <w:t xml:space="preserve"> </w:t>
+      </w:r>
+      <m:oMath>
+        <m:sSubSup>
+          <m:e>
+            <m:r>
+              <m:t>R</m:t>
+            </m:r>
+          </m:e>
+          <m:sub>
+            <m:r>
+              <m:t>1</m:t>
+            </m:r>
+          </m:sub>
+          <m:sup>
+            <m:r>
+              <m:t>h</m:t>
+            </m:r>
+            <m:r>
+              <m:t>i</m:t>
+            </m:r>
+          </m:sup>
+        </m:sSubSup>
+        <m:sSubSup>
+          <m:e>
+            <m:r>
+              <m:t>R</m:t>
+            </m:r>
+          </m:e>
+          <m:sub>
+            <m:r>
+              <m:t>2</m:t>
+            </m:r>
+          </m:sub>
+          <m:sup>
+            <m:r>
+              <m:t>l</m:t>
+            </m:r>
+            <m:r>
+              <m:t>o</m:t>
+            </m:r>
+          </m:sup>
+        </m:sSubSup>
+      </m:oMath>
+      <w:r>
+        <w:t xml:space="preserve"> </w:t>
+      </w:r>
+      <w:r>
+        <w:t xml:space="preserve">over</w:t>
+      </w:r>
+      <w:r>
+        <w:t xml:space="preserve"> </w:t>
+      </w:r>
+      <m:oMath>
+        <m:sSubSup>
+          <m:e>
+            <m:r>
+              <m:t>R</m:t>
+            </m:r>
+          </m:e>
+          <m:sub>
+            <m:r>
+              <m:t>1</m:t>
+            </m:r>
+          </m:sub>
+          <m:sup>
+            <m:r>
+              <m:t>m</m:t>
+            </m:r>
+            <m:r>
+              <m:t>e</m:t>
+            </m:r>
+            <m:r>
+              <m:t>d</m:t>
+            </m:r>
+          </m:sup>
+        </m:sSubSup>
+        <m:sSubSup>
+          <m:e>
+            <m:r>
+              <m:t>R</m:t>
+            </m:r>
+          </m:e>
+          <m:sub>
+            <m:r>
+              <m:t>2</m:t>
+            </m:r>
+          </m:sub>
+          <m:sup>
+            <m:r>
+              <m:t>m</m:t>
+            </m:r>
+            <m:r>
+              <m:t>e</m:t>
+            </m:r>
+            <m:r>
+              <m:t>d</m:t>
+            </m:r>
+          </m:sup>
+        </m:sSubSup>
+      </m:oMath>
+      <w:r>
+        <w:t xml:space="preserve">, we can expect greater intra-population variation in binding to the latter (Fig.</w:t>
+      </w:r>
+      <w:r>
+        <w:t xml:space="preserve"> </w:t>
+      </w:r>
+      <w:hyperlink w:anchor="fig:affinity">
+        <w:r>
+          <w:rPr>
+            <w:rStyle w:val="Hyperlink"/>
+          </w:rPr>
+          <w:t xml:space="preserve">2</w:t>
+        </w:r>
+      </w:hyperlink>
+      <w:r>
+        <w:t xml:space="preserve">a).</w:t>
       </w:r>
     </w:p>
     <w:p>
@@ -3887,7 +4116,7 @@
         </w:r>
       </w:hyperlink>
       <w:r>
-        <w:t xml:space="preserve">c-d). Ligands with lower affinities achieve optimal binding with higher valencies and exhibit higher selectivity than the high affinity ligands.</w:t>
+        <w:t xml:space="preserve">c-d). Ligands with lower affinities achieve optimal binding with higher valencies and exhibit higher selectivity than the high affinity ligands. The existence of this peak in selectivity, and its larger magnitude at lower affinities are in agreeance with previous simulations of nano-particle binding [doi:10.1073/pnas.1105351108].</w:t>
       </w:r>
     </w:p>
     <w:p>
@@ -5491,7 +5720,7 @@
         </w:r>
       </w:hyperlink>
       <w:r>
-        <w:t xml:space="preserve">c). We also demonstrate the utility of mixture engineering in two other target/off-target cell population combinations where multiple off-target populations are considered (Fig.</w:t>
+        <w:t xml:space="preserve">c). We also demonstrate the utility of mixture engineering in cell population combinations where many off-target populations are considered (Fig.</w:t>
       </w:r>
       <w:r>
         <w:t xml:space="preserve"> </w:t>
@@ -5505,7 +5734,7 @@
         </w:r>
       </w:hyperlink>
       <w:r>
-        <w:t xml:space="preserve">d/e). However, even in these cases, the magnitude of selectivity enhancement is modest. Finally, although we only consider the amount of binding, ligands can have non-overlapping signaling effects even with identical amounts of binding. In these cases, the effect of combinations can be distinct from either individual ligand.</w:t>
+        <w:t xml:space="preserve">d). However, even in these cases, the magnitude of selectivity enhancement is modest. Finally, although we only consider the amount of binding, ligands can have non-overlapping signaling effects even with identical amounts of binding. In these cases, the effect of combinations can be distinct from either individual ligand.</w:t>
       </w:r>
       <w:hyperlink w:anchor="ref-8lU1hNlA">
         <w:r>
@@ -17858,7 +18087,7 @@
         </w:r>
       </w:hyperlink>
       <w:r>
-        <w:t xml:space="preserve">. (Accessed: 28th September 2020)</w:t>
+        <w:t xml:space="preserve">. (Accessed: 2nd October 2020)</w:t>
       </w:r>
     </w:p>
     <w:bookmarkEnd w:id="93"/>

</xml_diff>

<commit_message>
Deploying to gh-pages from  @ 7e8198afbae41e5f573a847676f9a993492ec25f 🚀
</commit_message>
<xml_diff>
--- a/manuscript.docx
+++ b/manuscript.docx
@@ -72,7 +72,7 @@
         <w:t xml:space="preserve"> </w:t>
       </w:r>
       <w:r>
-        <w:t xml:space="preserve">was automatically generated on October 1, 2020.</w:t>
+        <w:t xml:space="preserve">was automatically generated on October 2, 2020.</w:t>
       </w:r>
       <w:r>
         <w:t xml:space="preserve"> </w:t>
@@ -658,7 +658,7 @@
         <w:pStyle w:val="BodyText"/>
       </w:pPr>
       <w:r>
-        <w:t xml:space="preserve">While ligand-receptor binding events in biology are diverse, they are governed by their thermodynamic properties and the law of mass action. When a reaction reaches its equilibrium state, the ratio of the product of the concentrations of each,</w:t>
+        <w:t xml:space="preserve">While ligand-receptor binding events in biology are diverse, they are governed by their thermodynamic properties and the law of mass action. When a reaction reaches its equilibrium state, the ratio of the concentration of monomeric ligand-receptor complex,</w:t>
       </w:r>
       <w:r>
         <w:t xml:space="preserve"> </w:t>
@@ -671,12 +671,32 @@
           <m:t>L</m:t>
         </m:r>
         <m:r>
+          <m:t>R</m:t>
+        </m:r>
+        <m:r>
           <m:t>]</m:t>
         </m:r>
+      </m:oMath>
+      <w:r>
+        <w:t xml:space="preserve">, to the product of the concentrations of each,</w:t>
+      </w:r>
+      <w:r>
+        <w:t xml:space="preserve"> </w:t>
+      </w:r>
+      <m:oMath>
         <m:r>
           <m:t>[</m:t>
         </m:r>
         <m:r>
+          <m:t>L</m:t>
+        </m:r>
+        <m:r>
+          <m:t>]</m:t>
+        </m:r>
+        <m:r>
+          <m:t>[</m:t>
+        </m:r>
+        <m:r>
           <m:t>R</m:t>
         </m:r>
         <m:r>
@@ -684,27 +704,7 @@
         </m:r>
       </m:oMath>
       <w:r>
-        <w:t xml:space="preserve">, to the concentration of monomeric ligand-receptor complex,</w:t>
-      </w:r>
-      <w:r>
-        <w:t xml:space="preserve"> </w:t>
-      </w:r>
-      <m:oMath>
-        <m:r>
-          <m:t>[</m:t>
-        </m:r>
-        <m:r>
-          <m:t>L</m:t>
-        </m:r>
-        <m:r>
-          <m:t>R</m:t>
-        </m:r>
-        <m:r>
-          <m:t>]</m:t>
-        </m:r>
-      </m:oMath>
-      <w:r>
-        <w:t xml:space="preserve">, can be defined as a dissociation constant</w:t>
+        <w:t xml:space="preserve">, can be defined as an association constant</w:t>
       </w:r>
       <w:r>
         <w:t xml:space="preserve"> </w:t>
@@ -718,7 +718,27 @@
           </m:e>
           <m:sub>
             <m:r>
-              <m:t>D</m:t>
+              <m:t>a</m:t>
+            </m:r>
+          </m:sub>
+        </m:sSub>
+      </m:oMath>
+      <w:r>
+        <w:t xml:space="preserve">, and its reciprocal is defined as the dissociation constant</w:t>
+      </w:r>
+      <w:r>
+        <w:t xml:space="preserve"> </w:t>
+      </w:r>
+      <m:oMath>
+        <m:sSub>
+          <m:e>
+            <m:r>
+              <m:t>K</m:t>
+            </m:r>
+          </m:e>
+          <m:sub>
+            <m:r>
+              <m:t>d</m:t>
             </m:r>
           </m:sub>
         </m:sSub>
@@ -738,7 +758,7 @@
         </w:r>
       </w:hyperlink>
       <w:r>
-        <w:t xml:space="preserve">a). During initial association, we will assume that the first subunit on a ligand complex binds according to the same dynamics that govern monovalent binding. Subsequent binding events exhibit different behavior, however, due to the increased local concentration of the complex. Here, we assume that the effective dissociation constant for the subsequent bindings is proportional to that of the free binding, but scaled by a constant,</w:t>
+        <w:t xml:space="preserve">a). During initial association, we will assume that the first subunit on a ligand complex binds according to the same dynamics that govern monovalent binding. Subsequent binding events exhibit different behavior, however, due to the increased local concentration of the complex. Here, we assume that the effective association constant for the subsequent bindings is proportional to that of the free binding, but scaled by a constant,</w:t>
       </w:r>
       <w:r>
         <w:t xml:space="preserve"> </w:t>
@@ -902,6 +922,32 @@
         <w:t xml:space="preserve"> </w:t>
       </w:r>
       <m:oMath>
+        <m:r>
+          <m:t>10</m:t>
+        </m:r>
+        <m:r>
+          <m:rPr>
+            <m:sty m:val="p"/>
+          </m:rPr>
+          <m:t>μ</m:t>
+        </m:r>
+        <m:r>
+          <m:rPr>
+            <m:sty m:val="p"/>
+          </m:rPr>
+          <m:t>M</m:t>
+        </m:r>
+      </m:oMath>
+      <w:r>
+        <w:t xml:space="preserve"> </w:t>
+      </w:r>
+      <w:r>
+        <w:t xml:space="preserve">and</w:t>
+      </w:r>
+      <w:r>
+        <w:t xml:space="preserve"> </w:t>
+      </w:r>
+      <m:oMath>
         <m:sSup>
           <m:e>
             <m:r>
@@ -910,43 +956,20 @@
           </m:e>
           <m:sup>
             <m:r>
-              <m:t>4</m:t>
+              <m:t>2</m:t>
             </m:r>
           </m:sup>
         </m:sSup>
         <m:r>
+          <m:rPr>
+            <m:sty m:val="p"/>
+          </m:rPr>
           <m:t>n</m:t>
         </m:r>
         <m:r>
-          <m:t>M</m:t>
-        </m:r>
-      </m:oMath>
-      <w:r>
-        <w:t xml:space="preserve"> </w:t>
-      </w:r>
-      <w:r>
-        <w:t xml:space="preserve">and</w:t>
-      </w:r>
-      <w:r>
-        <w:t xml:space="preserve"> </w:t>
-      </w:r>
-      <m:oMath>
-        <m:sSup>
-          <m:e>
-            <m:r>
-              <m:t>10</m:t>
-            </m:r>
-          </m:e>
-          <m:sup>
-            <m:r>
-              <m:t>2</m:t>
-            </m:r>
-          </m:sup>
-        </m:sSup>
-        <m:r>
-          <m:t>n</m:t>
-        </m:r>
-        <m:r>
+          <m:rPr>
+            <m:sty m:val="p"/>
+          </m:rPr>
           <m:t>M</m:t>
         </m:r>
       </m:oMath>
@@ -1346,6 +1369,24 @@
         <w:t xml:space="preserve"> </w:t>
       </w:r>
       <m:oMath>
+        <m:r>
+          <m:t>10</m:t>
+        </m:r>
+        <m:r>
+          <m:rPr>
+            <m:sty m:val="p"/>
+          </m:rPr>
+          <m:t>μ</m:t>
+        </m:r>
+        <m:r>
+          <m:rPr>
+            <m:sty m:val="p"/>
+          </m:rPr>
+          <m:t>M</m:t>
+        </m:r>
+        <m:r>
+          <m:t>∼</m:t>
+        </m:r>
         <m:sSup>
           <m:e>
             <m:r>
@@ -1354,29 +1395,20 @@
           </m:e>
           <m:sup>
             <m:r>
-              <m:t>4</m:t>
+              <m:t>2</m:t>
             </m:r>
           </m:sup>
         </m:sSup>
         <m:r>
-          <m:t>∼</m:t>
-        </m:r>
-        <m:sSup>
-          <m:e>
-            <m:r>
-              <m:t>10</m:t>
-            </m:r>
-          </m:e>
-          <m:sup>
-            <m:r>
-              <m:t>2</m:t>
-            </m:r>
-          </m:sup>
-        </m:sSup>
-        <m:r>
+          <m:rPr>
+            <m:sty m:val="p"/>
+          </m:rPr>
           <m:t>n</m:t>
         </m:r>
         <m:r>
+          <m:rPr>
+            <m:sty m:val="p"/>
+          </m:rPr>
           <m:t>M</m:t>
         </m:r>
       </m:oMath>
@@ -1967,6 +1999,24 @@
         <w:t xml:space="preserve"> </w:t>
       </w:r>
       <m:oMath>
+        <m:r>
+          <m:t>10</m:t>
+        </m:r>
+        <m:r>
+          <m:rPr>
+            <m:sty m:val="p"/>
+          </m:rPr>
+          <m:t>μ</m:t>
+        </m:r>
+        <m:r>
+          <m:rPr>
+            <m:sty m:val="p"/>
+          </m:rPr>
+          <m:t>M</m:t>
+        </m:r>
+        <m:r>
+          <m:t>∼</m:t>
+        </m:r>
         <m:sSup>
           <m:e>
             <m:r>
@@ -1975,29 +2025,20 @@
           </m:e>
           <m:sup>
             <m:r>
-              <m:t>4</m:t>
+              <m:t>2</m:t>
             </m:r>
           </m:sup>
         </m:sSup>
         <m:r>
-          <m:t>∼</m:t>
-        </m:r>
-        <m:sSup>
-          <m:e>
-            <m:r>
-              <m:t>10</m:t>
-            </m:r>
-          </m:e>
-          <m:sup>
-            <m:r>
-              <m:t>2</m:t>
-            </m:r>
-          </m:sup>
-        </m:sSup>
-        <m:r>
+          <m:rPr>
+            <m:sty m:val="p"/>
+          </m:rPr>
           <m:t>n</m:t>
         </m:r>
         <m:r>
+          <m:rPr>
+            <m:sty m:val="p"/>
+          </m:rPr>
           <m:t>M</m:t>
         </m:r>
       </m:oMath>
@@ -3695,7 +3736,7 @@
           </m:e>
           <m:sub>
             <m:r>
-              <m:t>D</m:t>
+              <m:t>d</m:t>
             </m:r>
           </m:sub>
         </m:sSub>
@@ -3750,24 +3791,24 @@
         <w:t xml:space="preserve"> </w:t>
       </w:r>
       <m:oMath>
-        <m:sSup>
-          <m:e>
-            <m:r>
-              <m:t>10</m:t>
-            </m:r>
-          </m:e>
-          <m:sup>
-            <m:r>
-              <m:t>1</m:t>
-            </m:r>
-          </m:sup>
-        </m:sSup>
-      </m:oMath>
-      <w:r>
-        <w:t xml:space="preserve"> </w:t>
-      </w:r>
-      <w:r>
-        <w:t xml:space="preserve">nM). For example, the ligand binding ratio between</w:t>
+        <m:r>
+          <m:t>10</m:t>
+        </m:r>
+        <m:r>
+          <m:rPr>
+            <m:sty m:val="p"/>
+          </m:rPr>
+          <m:t>n</m:t>
+        </m:r>
+        <m:r>
+          <m:rPr>
+            <m:sty m:val="p"/>
+          </m:rPr>
+          <m:t>M</m:t>
+        </m:r>
+      </m:oMath>
+      <w:r>
+        <w:t xml:space="preserve">). For example, the ligand binding ratio between</w:t>
       </w:r>
       <w:r>
         <w:t xml:space="preserve"> </w:t>
@@ -4193,24 +4234,27 @@
         <w:t xml:space="preserve"> </w:t>
       </w:r>
       <m:oMath>
-        <m:sSup>
-          <m:e>
-            <m:r>
-              <m:t>10</m:t>
-            </m:r>
-          </m:e>
-          <m:sup>
-            <m:r>
-              <m:t>1</m:t>
-            </m:r>
-          </m:sup>
-        </m:sSup>
-      </m:oMath>
-      <w:r>
-        <w:t xml:space="preserve"> </w:t>
-      </w:r>
-      <w:r>
-        <w:t xml:space="preserve">nM (Fig.</w:t>
+        <m:r>
+          <m:t>10</m:t>
+        </m:r>
+        <m:r>
+          <m:rPr>
+            <m:sty m:val="p"/>
+          </m:rPr>
+          <m:t>n</m:t>
+        </m:r>
+        <m:r>
+          <m:rPr>
+            <m:sty m:val="p"/>
+          </m:rPr>
+          <m:t>M</m:t>
+        </m:r>
+      </m:oMath>
+      <w:r>
+        <w:t xml:space="preserve"> </w:t>
+      </w:r>
+      <w:r>
+        <w:t xml:space="preserve">(Fig.</w:t>
       </w:r>
       <w:r>
         <w:t xml:space="preserve"> </w:t>
@@ -4298,54 +4342,7 @@
       </w:r>
       <m:oMath>
         <m:r>
-          <m:t>3.3</m:t>
-        </m:r>
-        <m:r>
-          <m:t>×</m:t>
-        </m:r>
-        <m:sSup>
-          <m:e>
-            <m:r>
-              <m:t>10</m:t>
-            </m:r>
-          </m:e>
-          <m:sup>
-            <m:r>
-              <m:t>2</m:t>
-            </m:r>
-          </m:sup>
-        </m:sSup>
-        <m:r>
-          <m:t>n</m:t>
-        </m:r>
-        <m:r>
-          <m:t>M</m:t>
-        </m:r>
-      </m:oMath>
-      <w:r>
-        <w:t xml:space="preserve">, and do not bind to receptor 2. Complexes vary in valency from 1 to 16. Ligand concentration</w:t>
-      </w:r>
-      <w:r>
-        <w:t xml:space="preserve"> </w:t>
-      </w:r>
-      <m:oMath>
-        <m:sSub>
-          <m:e>
-            <m:r>
-              <m:t>L</m:t>
-            </m:r>
-          </m:e>
-          <m:sub>
-            <m:r>
-              <m:t>0</m:t>
-            </m:r>
-          </m:sub>
-        </m:sSub>
-        <m:r>
-          <m:t>=</m:t>
-        </m:r>
-        <m:r>
-          <m:t>1</m:t>
+          <m:t>330</m:t>
         </m:r>
         <m:r>
           <m:rPr>
@@ -4361,6 +4358,44 @@
         </m:r>
       </m:oMath>
       <w:r>
+        <w:t xml:space="preserve">, and do not bind to receptor 2. Complexes vary in valency from 1 to 16. Ligand concentration</w:t>
+      </w:r>
+      <w:r>
+        <w:t xml:space="preserve"> </w:t>
+      </w:r>
+      <m:oMath>
+        <m:sSub>
+          <m:e>
+            <m:r>
+              <m:t>L</m:t>
+            </m:r>
+          </m:e>
+          <m:sub>
+            <m:r>
+              <m:t>0</m:t>
+            </m:r>
+          </m:sub>
+        </m:sSub>
+        <m:r>
+          <m:t>=</m:t>
+        </m:r>
+        <m:r>
+          <m:t>1</m:t>
+        </m:r>
+        <m:r>
+          <m:rPr>
+            <m:sty m:val="p"/>
+          </m:rPr>
+          <m:t>n</m:t>
+        </m:r>
+        <m:r>
+          <m:rPr>
+            <m:sty m:val="p"/>
+          </m:rPr>
+          <m:t>M</m:t>
+        </m:r>
+      </m:oMath>
+      <w:r>
         <w:t xml:space="preserve">; crosslinking constant</w:t>
       </w:r>
       <w:r>
@@ -4744,9 +4779,15 @@
           </m:sup>
         </m:sSup>
         <m:r>
+          <m:rPr>
+            <m:sty m:val="p"/>
+          </m:rPr>
           <m:t>n</m:t>
         </m:r>
         <m:r>
+          <m:rPr>
+            <m:sty m:val="p"/>
+          </m:rPr>
           <m:t>M</m:t>
         </m:r>
       </m:oMath>
@@ -4776,14 +4817,46 @@
           </m:sup>
         </m:sSup>
         <m:r>
+          <m:rPr>
+            <m:sty m:val="p"/>
+          </m:rPr>
           <m:t>n</m:t>
         </m:r>
         <m:r>
+          <m:rPr>
+            <m:sty m:val="p"/>
+          </m:rPr>
           <m:t>M</m:t>
         </m:r>
       </m:oMath>
       <w:r>
-        <w:t xml:space="preserve">, or 10 nM for receptor 1. d) Number of octavalent complex bound at each degree for a cell with</w:t>
+        <w:t xml:space="preserve">, or</w:t>
+      </w:r>
+      <w:r>
+        <w:t xml:space="preserve"> </w:t>
+      </w:r>
+      <m:oMath>
+        <m:r>
+          <m:t>10</m:t>
+        </m:r>
+        <m:r>
+          <m:rPr>
+            <m:sty m:val="p"/>
+          </m:rPr>
+          <m:t>n</m:t>
+        </m:r>
+        <m:r>
+          <m:rPr>
+            <m:sty m:val="p"/>
+          </m:rPr>
+          <m:t>M</m:t>
+        </m:r>
+      </m:oMath>
+      <w:r>
+        <w:t xml:space="preserve"> </w:t>
+      </w:r>
+      <w:r>
+        <w:t xml:space="preserve">for receptor 1. d) Number of octavalent complex bound at each degree for a cell with</w:t>
       </w:r>
       <w:r>
         <w:t xml:space="preserve"> </w:t>
@@ -4872,54 +4945,7 @@
       </w:r>
       <m:oMath>
         <m:r>
-          <m:t>3.3</m:t>
-        </m:r>
-        <m:r>
-          <m:t>×</m:t>
-        </m:r>
-        <m:sSup>
-          <m:e>
-            <m:r>
-              <m:t>10</m:t>
-            </m:r>
-          </m:e>
-          <m:sup>
-            <m:r>
-              <m:t>2</m:t>
-            </m:r>
-          </m:sup>
-        </m:sSup>
-        <m:r>
-          <m:t>n</m:t>
-        </m:r>
-        <m:r>
-          <m:t>M</m:t>
-        </m:r>
-      </m:oMath>
-      <w:r>
-        <w:t xml:space="preserve">, and do not bind to receptor 2. Complexes vary in valency from 1 to 16. Ligand concentration</w:t>
-      </w:r>
-      <w:r>
-        <w:t xml:space="preserve"> </w:t>
-      </w:r>
-      <m:oMath>
-        <m:sSub>
-          <m:e>
-            <m:r>
-              <m:t>L</m:t>
-            </m:r>
-          </m:e>
-          <m:sub>
-            <m:r>
-              <m:t>0</m:t>
-            </m:r>
-          </m:sub>
-        </m:sSub>
-        <m:r>
-          <m:t>=</m:t>
-        </m:r>
-        <m:r>
-          <m:t>1</m:t>
+          <m:t>330</m:t>
         </m:r>
         <m:r>
           <m:rPr>
@@ -4935,6 +4961,44 @@
         </m:r>
       </m:oMath>
       <w:r>
+        <w:t xml:space="preserve">, and do not bind to receptor 2. Complexes vary in valency from 1 to 16. Ligand concentration</w:t>
+      </w:r>
+      <w:r>
+        <w:t xml:space="preserve"> </w:t>
+      </w:r>
+      <m:oMath>
+        <m:sSub>
+          <m:e>
+            <m:r>
+              <m:t>L</m:t>
+            </m:r>
+          </m:e>
+          <m:sub>
+            <m:r>
+              <m:t>0</m:t>
+            </m:r>
+          </m:sub>
+        </m:sSub>
+        <m:r>
+          <m:t>=</m:t>
+        </m:r>
+        <m:r>
+          <m:t>1</m:t>
+        </m:r>
+        <m:r>
+          <m:rPr>
+            <m:sty m:val="p"/>
+          </m:rPr>
+          <m:t>n</m:t>
+        </m:r>
+        <m:r>
+          <m:rPr>
+            <m:sty m:val="p"/>
+          </m:rPr>
+          <m:t>M</m:t>
+        </m:r>
+      </m:oMath>
+      <w:r>
         <w:t xml:space="preserve">; crosslinking constant</w:t>
       </w:r>
       <w:r>
@@ -5318,9 +5382,15 @@
           </m:sup>
         </m:sSup>
         <m:r>
+          <m:rPr>
+            <m:sty m:val="p"/>
+          </m:rPr>
           <m:t>n</m:t>
         </m:r>
         <m:r>
+          <m:rPr>
+            <m:sty m:val="p"/>
+          </m:rPr>
           <m:t>M</m:t>
         </m:r>
       </m:oMath>
@@ -5350,14 +5420,46 @@
           </m:sup>
         </m:sSup>
         <m:r>
+          <m:rPr>
+            <m:sty m:val="p"/>
+          </m:rPr>
           <m:t>n</m:t>
         </m:r>
         <m:r>
+          <m:rPr>
+            <m:sty m:val="p"/>
+          </m:rPr>
           <m:t>M</m:t>
         </m:r>
       </m:oMath>
       <w:r>
-        <w:t xml:space="preserve">, or 10 nM for receptor 1. d) Number of octavalent complex bound at each degree for a cell with</w:t>
+        <w:t xml:space="preserve">, or</w:t>
+      </w:r>
+      <w:r>
+        <w:t xml:space="preserve"> </w:t>
+      </w:r>
+      <m:oMath>
+        <m:r>
+          <m:t>10</m:t>
+        </m:r>
+        <m:r>
+          <m:rPr>
+            <m:sty m:val="p"/>
+          </m:rPr>
+          <m:t>n</m:t>
+        </m:r>
+        <m:r>
+          <m:rPr>
+            <m:sty m:val="p"/>
+          </m:rPr>
+          <m:t>M</m:t>
+        </m:r>
+      </m:oMath>
+      <w:r>
+        <w:t xml:space="preserve"> </w:t>
+      </w:r>
+      <w:r>
+        <w:t xml:space="preserve">for receptor 1. d) Number of octavalent complex bound at each degree for a cell with</w:t>
       </w:r>
       <w:r>
         <w:t xml:space="preserve"> </w:t>
@@ -5789,22 +5891,19 @@
         <w:t xml:space="preserve"> </w:t>
       </w:r>
       <m:oMath>
-        <m:sSup>
-          <m:e>
-            <m:r>
-              <m:t>10</m:t>
-            </m:r>
-          </m:e>
-          <m:sup>
-            <m:r>
-              <m:t>3</m:t>
-            </m:r>
-          </m:sup>
-        </m:sSup>
-        <m:r>
-          <m:t>n</m:t>
-        </m:r>
-        <m:r>
+        <m:r>
+          <m:t>1</m:t>
+        </m:r>
+        <m:r>
+          <m:rPr>
+            <m:sty m:val="p"/>
+          </m:rPr>
+          <m:t>μ</m:t>
+        </m:r>
+        <m:r>
+          <m:rPr>
+            <m:sty m:val="p"/>
+          </m:rPr>
           <m:t>M</m:t>
         </m:r>
       </m:oMath>
@@ -5818,22 +5917,19 @@
         <w:t xml:space="preserve"> </w:t>
       </w:r>
       <m:oMath>
-        <m:sSup>
-          <m:e>
-            <m:r>
-              <m:t>10</m:t>
-            </m:r>
-          </m:e>
-          <m:sup>
-            <m:r>
-              <m:t>4</m:t>
-            </m:r>
-          </m:sup>
-        </m:sSup>
-        <m:r>
-          <m:t>n</m:t>
-        </m:r>
-        <m:r>
+        <m:r>
+          <m:t>10</m:t>
+        </m:r>
+        <m:r>
+          <m:rPr>
+            <m:sty m:val="p"/>
+          </m:rPr>
+          <m:t>μ</m:t>
+        </m:r>
+        <m:r>
+          <m:rPr>
+            <m:sty m:val="p"/>
+          </m:rPr>
           <m:t>M</m:t>
         </m:r>
       </m:oMath>
@@ -5847,22 +5943,19 @@
         <w:t xml:space="preserve"> </w:t>
       </w:r>
       <m:oMath>
-        <m:sSup>
-          <m:e>
-            <m:r>
-              <m:t>10</m:t>
-            </m:r>
-          </m:e>
-          <m:sup>
-            <m:r>
-              <m:t>4</m:t>
-            </m:r>
-          </m:sup>
-        </m:sSup>
-        <m:r>
-          <m:t>n</m:t>
-        </m:r>
-        <m:r>
+        <m:r>
+          <m:t>10</m:t>
+        </m:r>
+        <m:r>
+          <m:rPr>
+            <m:sty m:val="p"/>
+          </m:rPr>
+          <m:t>μ</m:t>
+        </m:r>
+        <m:r>
+          <m:rPr>
+            <m:sty m:val="p"/>
+          </m:rPr>
           <m:t>M</m:t>
         </m:r>
       </m:oMath>
@@ -5876,22 +5969,19 @@
         <w:t xml:space="preserve"> </w:t>
       </w:r>
       <m:oMath>
-        <m:sSup>
-          <m:e>
-            <m:r>
-              <m:t>10</m:t>
-            </m:r>
-          </m:e>
-          <m:sup>
-            <m:r>
-              <m:t>3</m:t>
-            </m:r>
-          </m:sup>
-        </m:sSup>
-        <m:r>
-          <m:t>n</m:t>
-        </m:r>
-        <m:r>
+        <m:r>
+          <m:t>1</m:t>
+        </m:r>
+        <m:r>
+          <m:rPr>
+            <m:sty m:val="p"/>
+          </m:rPr>
+          <m:t>μ</m:t>
+        </m:r>
+        <m:r>
+          <m:rPr>
+            <m:sty m:val="p"/>
+          </m:rPr>
           <m:t>M</m:t>
         </m:r>
       </m:oMath>
@@ -6577,22 +6667,19 @@
         <w:t xml:space="preserve"> </w:t>
       </w:r>
       <m:oMath>
-        <m:sSup>
-          <m:e>
-            <m:r>
-              <m:t>10</m:t>
-            </m:r>
-          </m:e>
-          <m:sup>
-            <m:r>
-              <m:t>3</m:t>
-            </m:r>
-          </m:sup>
-        </m:sSup>
-        <m:r>
-          <m:t>n</m:t>
-        </m:r>
-        <m:r>
+        <m:r>
+          <m:t>1</m:t>
+        </m:r>
+        <m:r>
+          <m:rPr>
+            <m:sty m:val="p"/>
+          </m:rPr>
+          <m:t>μ</m:t>
+        </m:r>
+        <m:r>
+          <m:rPr>
+            <m:sty m:val="p"/>
+          </m:rPr>
           <m:t>M</m:t>
         </m:r>
       </m:oMath>
@@ -6606,22 +6693,19 @@
         <w:t xml:space="preserve"> </w:t>
       </w:r>
       <m:oMath>
-        <m:sSup>
-          <m:e>
-            <m:r>
-              <m:t>10</m:t>
-            </m:r>
-          </m:e>
-          <m:sup>
-            <m:r>
-              <m:t>4</m:t>
-            </m:r>
-          </m:sup>
-        </m:sSup>
-        <m:r>
-          <m:t>n</m:t>
-        </m:r>
-        <m:r>
+        <m:r>
+          <m:t>10</m:t>
+        </m:r>
+        <m:r>
+          <m:rPr>
+            <m:sty m:val="p"/>
+          </m:rPr>
+          <m:t>μ</m:t>
+        </m:r>
+        <m:r>
+          <m:rPr>
+            <m:sty m:val="p"/>
+          </m:rPr>
           <m:t>M</m:t>
         </m:r>
       </m:oMath>
@@ -6635,22 +6719,19 @@
         <w:t xml:space="preserve"> </w:t>
       </w:r>
       <m:oMath>
-        <m:sSup>
-          <m:e>
-            <m:r>
-              <m:t>10</m:t>
-            </m:r>
-          </m:e>
-          <m:sup>
-            <m:r>
-              <m:t>4</m:t>
-            </m:r>
-          </m:sup>
-        </m:sSup>
-        <m:r>
-          <m:t>n</m:t>
-        </m:r>
-        <m:r>
+        <m:r>
+          <m:t>10</m:t>
+        </m:r>
+        <m:r>
+          <m:rPr>
+            <m:sty m:val="p"/>
+          </m:rPr>
+          <m:t>μ</m:t>
+        </m:r>
+        <m:r>
+          <m:rPr>
+            <m:sty m:val="p"/>
+          </m:rPr>
           <m:t>M</m:t>
         </m:r>
       </m:oMath>
@@ -6664,22 +6745,19 @@
         <w:t xml:space="preserve"> </w:t>
       </w:r>
       <m:oMath>
-        <m:sSup>
-          <m:e>
-            <m:r>
-              <m:t>10</m:t>
-            </m:r>
-          </m:e>
-          <m:sup>
-            <m:r>
-              <m:t>3</m:t>
-            </m:r>
-          </m:sup>
-        </m:sSup>
-        <m:r>
-          <m:t>n</m:t>
-        </m:r>
-        <m:r>
+        <m:r>
+          <m:t>1</m:t>
+        </m:r>
+        <m:r>
+          <m:rPr>
+            <m:sty m:val="p"/>
+          </m:rPr>
+          <m:t>μ</m:t>
+        </m:r>
+        <m:r>
+          <m:rPr>
+            <m:sty m:val="p"/>
+          </m:rPr>
           <m:t>M</m:t>
         </m:r>
       </m:oMath>
@@ -8476,6 +8554,9 @@
           </m:e>
           <m:sub>
             <m:r>
+              <m:t>d</m:t>
+            </m:r>
+            <m:r>
               <m:t>11</m:t>
             </m:r>
           </m:sub>
@@ -8483,42 +8564,21 @@
         <m:r>
           <m:t>=</m:t>
         </m:r>
-        <m:sSup>
-          <m:e>
-            <m:r>
-              <m:t>10</m:t>
-            </m:r>
-          </m:e>
-          <m:sup>
-            <m:r>
-              <m:t>7</m:t>
-            </m:r>
-          </m:sup>
-        </m:sSup>
-        <m:sSup>
-          <m:e>
-            <m:r>
-              <m:rPr>
-                <m:sty m:val="p"/>
-              </m:rPr>
-              <m:t>M</m:t>
-            </m:r>
-          </m:e>
-          <m:sup>
-            <m:r>
-              <m:rPr>
-                <m:sty m:val="p"/>
-              </m:rPr>
-              <m:t>−</m:t>
-            </m:r>
-            <m:r>
-              <m:rPr>
-                <m:sty m:val="p"/>
-              </m:rPr>
-              <m:t>1</m:t>
-            </m:r>
-          </m:sup>
-        </m:sSup>
+        <m:r>
+          <m:t>100</m:t>
+        </m:r>
+        <m:r>
+          <m:rPr>
+            <m:sty m:val="p"/>
+          </m:rPr>
+          <m:t>n</m:t>
+        </m:r>
+        <m:r>
+          <m:rPr>
+            <m:sty m:val="p"/>
+          </m:rPr>
+          <m:t>M</m:t>
+        </m:r>
         <m:r>
           <m:t>,</m:t>
         </m:r>
@@ -8530,6 +8590,9 @@
           </m:e>
           <m:sub>
             <m:r>
+              <m:t>d</m:t>
+            </m:r>
+            <m:r>
               <m:t>22</m:t>
             </m:r>
           </m:sub>
@@ -8537,42 +8600,21 @@
         <m:r>
           <m:t>=</m:t>
         </m:r>
-        <m:sSup>
-          <m:e>
-            <m:r>
-              <m:t>10</m:t>
-            </m:r>
-          </m:e>
-          <m:sup>
-            <m:r>
-              <m:t>6</m:t>
-            </m:r>
-          </m:sup>
-        </m:sSup>
-        <m:sSup>
-          <m:e>
-            <m:r>
-              <m:rPr>
-                <m:sty m:val="p"/>
-              </m:rPr>
-              <m:t>M</m:t>
-            </m:r>
-          </m:e>
-          <m:sup>
-            <m:r>
-              <m:rPr>
-                <m:sty m:val="p"/>
-              </m:rPr>
-              <m:t>−</m:t>
-            </m:r>
-            <m:r>
-              <m:rPr>
-                <m:sty m:val="p"/>
-              </m:rPr>
-              <m:t>1</m:t>
-            </m:r>
-          </m:sup>
-        </m:sSup>
+        <m:r>
+          <m:t>1</m:t>
+        </m:r>
+        <m:r>
+          <m:rPr>
+            <m:sty m:val="p"/>
+          </m:rPr>
+          <m:t>μ</m:t>
+        </m:r>
+        <m:r>
+          <m:rPr>
+            <m:sty m:val="p"/>
+          </m:rPr>
+          <m:t>M</m:t>
+        </m:r>
         <m:r>
           <m:t>,</m:t>
         </m:r>
@@ -8584,6 +8626,9 @@
           </m:e>
           <m:sub>
             <m:r>
+              <m:t>d</m:t>
+            </m:r>
+            <m:r>
               <m:t>12</m:t>
             </m:r>
           </m:sub>
@@ -8599,6 +8644,9 @@
           </m:e>
           <m:sub>
             <m:r>
+              <m:t>d</m:t>
+            </m:r>
+            <m:r>
               <m:t>21</m:t>
             </m:r>
           </m:sub>
@@ -8606,42 +8654,21 @@
         <m:r>
           <m:t>=</m:t>
         </m:r>
-        <m:sSup>
-          <m:e>
-            <m:r>
-              <m:t>10</m:t>
-            </m:r>
-          </m:e>
-          <m:sup>
-            <m:r>
-              <m:t>5</m:t>
-            </m:r>
-          </m:sup>
-        </m:sSup>
-        <m:sSup>
-          <m:e>
-            <m:r>
-              <m:rPr>
-                <m:sty m:val="p"/>
-              </m:rPr>
-              <m:t>M</m:t>
-            </m:r>
-          </m:e>
-          <m:sup>
-            <m:r>
-              <m:rPr>
-                <m:sty m:val="p"/>
-              </m:rPr>
-              <m:t>−</m:t>
-            </m:r>
-            <m:r>
-              <m:rPr>
-                <m:sty m:val="p"/>
-              </m:rPr>
-              <m:t>1</m:t>
-            </m:r>
-          </m:sup>
-        </m:sSup>
+        <m:r>
+          <m:t>10</m:t>
+        </m:r>
+        <m:r>
+          <m:rPr>
+            <m:sty m:val="p"/>
+          </m:rPr>
+          <m:t>μ</m:t>
+        </m:r>
+        <m:r>
+          <m:rPr>
+            <m:sty m:val="p"/>
+          </m:rPr>
+          <m:t>M</m:t>
+        </m:r>
       </m:oMath>
       <w:r>
         <w:t xml:space="preserve">. d-f) The amount of fully bound bispecific ligands depends on the tendency of multimerization, capsuled by</w:t>
@@ -8932,6 +8959,9 @@
           </m:e>
           <m:sub>
             <m:r>
+              <m:t>d</m:t>
+            </m:r>
+            <m:r>
               <m:t>11</m:t>
             </m:r>
           </m:sub>
@@ -8939,42 +8969,21 @@
         <m:r>
           <m:t>=</m:t>
         </m:r>
-        <m:sSup>
-          <m:e>
-            <m:r>
-              <m:t>10</m:t>
-            </m:r>
-          </m:e>
-          <m:sup>
-            <m:r>
-              <m:t>7</m:t>
-            </m:r>
-          </m:sup>
-        </m:sSup>
-        <m:sSup>
-          <m:e>
-            <m:r>
-              <m:rPr>
-                <m:sty m:val="p"/>
-              </m:rPr>
-              <m:t>M</m:t>
-            </m:r>
-          </m:e>
-          <m:sup>
-            <m:r>
-              <m:rPr>
-                <m:sty m:val="p"/>
-              </m:rPr>
-              <m:t>−</m:t>
-            </m:r>
-            <m:r>
-              <m:rPr>
-                <m:sty m:val="p"/>
-              </m:rPr>
-              <m:t>1</m:t>
-            </m:r>
-          </m:sup>
-        </m:sSup>
+        <m:r>
+          <m:t>100</m:t>
+        </m:r>
+        <m:r>
+          <m:rPr>
+            <m:sty m:val="p"/>
+          </m:rPr>
+          <m:t>n</m:t>
+        </m:r>
+        <m:r>
+          <m:rPr>
+            <m:sty m:val="p"/>
+          </m:rPr>
+          <m:t>M</m:t>
+        </m:r>
         <m:r>
           <m:t>,</m:t>
         </m:r>
@@ -8986,6 +8995,9 @@
           </m:e>
           <m:sub>
             <m:r>
+              <m:t>d</m:t>
+            </m:r>
+            <m:r>
               <m:t>22</m:t>
             </m:r>
           </m:sub>
@@ -8993,42 +9005,21 @@
         <m:r>
           <m:t>=</m:t>
         </m:r>
-        <m:sSup>
-          <m:e>
-            <m:r>
-              <m:t>10</m:t>
-            </m:r>
-          </m:e>
-          <m:sup>
-            <m:r>
-              <m:t>6</m:t>
-            </m:r>
-          </m:sup>
-        </m:sSup>
-        <m:sSup>
-          <m:e>
-            <m:r>
-              <m:rPr>
-                <m:sty m:val="p"/>
-              </m:rPr>
-              <m:t>M</m:t>
-            </m:r>
-          </m:e>
-          <m:sup>
-            <m:r>
-              <m:rPr>
-                <m:sty m:val="p"/>
-              </m:rPr>
-              <m:t>−</m:t>
-            </m:r>
-            <m:r>
-              <m:rPr>
-                <m:sty m:val="p"/>
-              </m:rPr>
-              <m:t>1</m:t>
-            </m:r>
-          </m:sup>
-        </m:sSup>
+        <m:r>
+          <m:t>1</m:t>
+        </m:r>
+        <m:r>
+          <m:rPr>
+            <m:sty m:val="p"/>
+          </m:rPr>
+          <m:t>μ</m:t>
+        </m:r>
+        <m:r>
+          <m:rPr>
+            <m:sty m:val="p"/>
+          </m:rPr>
+          <m:t>M</m:t>
+        </m:r>
         <m:r>
           <m:t>,</m:t>
         </m:r>
@@ -9040,6 +9031,9 @@
           </m:e>
           <m:sub>
             <m:r>
+              <m:t>d</m:t>
+            </m:r>
+            <m:r>
               <m:t>12</m:t>
             </m:r>
           </m:sub>
@@ -9055,6 +9049,9 @@
           </m:e>
           <m:sub>
             <m:r>
+              <m:t>d</m:t>
+            </m:r>
+            <m:r>
               <m:t>21</m:t>
             </m:r>
           </m:sub>
@@ -9062,42 +9059,21 @@
         <m:r>
           <m:t>=</m:t>
         </m:r>
-        <m:sSup>
-          <m:e>
-            <m:r>
-              <m:t>10</m:t>
-            </m:r>
-          </m:e>
-          <m:sup>
-            <m:r>
-              <m:t>5</m:t>
-            </m:r>
-          </m:sup>
-        </m:sSup>
-        <m:sSup>
-          <m:e>
-            <m:r>
-              <m:rPr>
-                <m:sty m:val="p"/>
-              </m:rPr>
-              <m:t>M</m:t>
-            </m:r>
-          </m:e>
-          <m:sup>
-            <m:r>
-              <m:rPr>
-                <m:sty m:val="p"/>
-              </m:rPr>
-              <m:t>−</m:t>
-            </m:r>
-            <m:r>
-              <m:rPr>
-                <m:sty m:val="p"/>
-              </m:rPr>
-              <m:t>1</m:t>
-            </m:r>
-          </m:sup>
-        </m:sSup>
+        <m:r>
+          <m:t>10</m:t>
+        </m:r>
+        <m:r>
+          <m:rPr>
+            <m:sty m:val="p"/>
+          </m:rPr>
+          <m:t>μ</m:t>
+        </m:r>
+        <m:r>
+          <m:rPr>
+            <m:sty m:val="p"/>
+          </m:rPr>
+          <m:t>M</m:t>
+        </m:r>
       </m:oMath>
       <w:r>
         <w:t xml:space="preserve">. d-f) The amount of fully bound bispecific ligands depends on the tendency of multimerization, capsuled by</w:t>
@@ -9770,89 +9746,47 @@
         <w:t xml:space="preserve"> </w:t>
       </w:r>
       <m:oMath>
-        <m:sSup>
-          <m:e>
-            <m:r>
-              <m:t>10</m:t>
-            </m:r>
-          </m:e>
-          <m:sup>
-            <m:r>
-              <m:t>6</m:t>
-            </m:r>
-          </m:sup>
-        </m:sSup>
-        <m:sSup>
-          <m:e>
-            <m:r>
-              <m:rPr>
-                <m:sty m:val="p"/>
-              </m:rPr>
-              <m:t>M</m:t>
-            </m:r>
-          </m:e>
-          <m:sup>
-            <m:r>
-              <m:rPr>
-                <m:sty m:val="p"/>
-              </m:rPr>
-              <m:t>−</m:t>
-            </m:r>
-            <m:r>
-              <m:rPr>
-                <m:sty m:val="p"/>
-              </m:rPr>
-              <m:t>1</m:t>
-            </m:r>
-          </m:sup>
-        </m:sSup>
-      </m:oMath>
-      <w:r>
-        <w:t xml:space="preserve"> </w:t>
-      </w:r>
-      <w:r>
-        <w:t xml:space="preserve">for both receptor 1 and 2. Affinity was allowed to vary between</w:t>
-      </w:r>
-      <w:r>
-        <w:t xml:space="preserve"> </w:t>
-      </w:r>
-      <m:oMath>
-        <m:sSup>
-          <m:e>
-            <m:r>
-              <m:t>10</m:t>
-            </m:r>
-          </m:e>
-          <m:sup>
-            <m:r>
-              <m:t>2</m:t>
-            </m:r>
-          </m:sup>
-        </m:sSup>
-        <m:sSup>
-          <m:e>
-            <m:r>
-              <m:rPr>
-                <m:sty m:val="p"/>
-              </m:rPr>
-              <m:t>M</m:t>
-            </m:r>
-          </m:e>
-          <m:sup>
-            <m:r>
-              <m:rPr>
-                <m:sty m:val="p"/>
-              </m:rPr>
-              <m:t>−</m:t>
-            </m:r>
-            <m:r>
-              <m:rPr>
-                <m:sty m:val="p"/>
-              </m:rPr>
-              <m:t>1</m:t>
-            </m:r>
-          </m:sup>
-        </m:sSup>
+        <m:r>
+          <m:t>1</m:t>
+        </m:r>
+        <m:r>
+          <m:rPr>
+            <m:sty m:val="p"/>
+          </m:rPr>
+          <m:t>μ</m:t>
+        </m:r>
+        <m:r>
+          <m:rPr>
+            <m:sty m:val="p"/>
+          </m:rPr>
+          <m:t>M</m:t>
+        </m:r>
+      </m:oMath>
+      <w:r>
+        <w:t xml:space="preserve"> </w:t>
+      </w:r>
+      <w:r>
+        <w:t xml:space="preserve">for both receptor 1 and 2. The dissociation constant was allowed to vary between</w:t>
+      </w:r>
+      <w:r>
+        <w:t xml:space="preserve"> </w:t>
+      </w:r>
+      <m:oMath>
+        <m:r>
+          <m:t>10</m:t>
+        </m:r>
+        <m:r>
+          <m:rPr>
+            <m:sty m:val="p"/>
+          </m:rPr>
+          <m:t>m</m:t>
+        </m:r>
+        <m:r>
+          <m:rPr>
+            <m:sty m:val="p"/>
+          </m:rPr>
+          <m:t>M</m:t>
+        </m:r>
       </m:oMath>
       <w:r>
         <w:t xml:space="preserve"> </w:t>
@@ -9864,42 +9798,21 @@
         <w:t xml:space="preserve"> </w:t>
       </w:r>
       <m:oMath>
-        <m:sSup>
-          <m:e>
-            <m:r>
-              <m:t>10</m:t>
-            </m:r>
-          </m:e>
-          <m:sup>
-            <m:r>
-              <m:t>10</m:t>
-            </m:r>
-          </m:sup>
-        </m:sSup>
-        <m:sSup>
-          <m:e>
-            <m:r>
-              <m:rPr>
-                <m:sty m:val="p"/>
-              </m:rPr>
-              <m:t>M</m:t>
-            </m:r>
-          </m:e>
-          <m:sup>
-            <m:r>
-              <m:rPr>
-                <m:sty m:val="p"/>
-              </m:rPr>
-              <m:t>−</m:t>
-            </m:r>
-            <m:r>
-              <m:rPr>
-                <m:sty m:val="p"/>
-              </m:rPr>
-              <m:t>1</m:t>
-            </m:r>
-          </m:sup>
-        </m:sSup>
+        <m:r>
+          <m:t>0.1</m:t>
+        </m:r>
+        <m:r>
+          <m:rPr>
+            <m:sty m:val="p"/>
+          </m:rPr>
+          <m:t>n</m:t>
+        </m:r>
+        <m:r>
+          <m:rPr>
+            <m:sty m:val="p"/>
+          </m:rPr>
+          <m:t>M</m:t>
+        </m:r>
       </m:oMath>
       <w:r>
         <w:t xml:space="preserve"> </w:t>
@@ -10275,89 +10188,47 @@
         <w:t xml:space="preserve"> </w:t>
       </w:r>
       <m:oMath>
-        <m:sSup>
-          <m:e>
-            <m:r>
-              <m:t>10</m:t>
-            </m:r>
-          </m:e>
-          <m:sup>
-            <m:r>
-              <m:t>6</m:t>
-            </m:r>
-          </m:sup>
-        </m:sSup>
-        <m:sSup>
-          <m:e>
-            <m:r>
-              <m:rPr>
-                <m:sty m:val="p"/>
-              </m:rPr>
-              <m:t>M</m:t>
-            </m:r>
-          </m:e>
-          <m:sup>
-            <m:r>
-              <m:rPr>
-                <m:sty m:val="p"/>
-              </m:rPr>
-              <m:t>−</m:t>
-            </m:r>
-            <m:r>
-              <m:rPr>
-                <m:sty m:val="p"/>
-              </m:rPr>
-              <m:t>1</m:t>
-            </m:r>
-          </m:sup>
-        </m:sSup>
-      </m:oMath>
-      <w:r>
-        <w:t xml:space="preserve"> </w:t>
-      </w:r>
-      <w:r>
-        <w:t xml:space="preserve">for both receptor 1 and 2. Affinity was allowed to vary between</w:t>
-      </w:r>
-      <w:r>
-        <w:t xml:space="preserve"> </w:t>
-      </w:r>
-      <m:oMath>
-        <m:sSup>
-          <m:e>
-            <m:r>
-              <m:t>10</m:t>
-            </m:r>
-          </m:e>
-          <m:sup>
-            <m:r>
-              <m:t>2</m:t>
-            </m:r>
-          </m:sup>
-        </m:sSup>
-        <m:sSup>
-          <m:e>
-            <m:r>
-              <m:rPr>
-                <m:sty m:val="p"/>
-              </m:rPr>
-              <m:t>M</m:t>
-            </m:r>
-          </m:e>
-          <m:sup>
-            <m:r>
-              <m:rPr>
-                <m:sty m:val="p"/>
-              </m:rPr>
-              <m:t>−</m:t>
-            </m:r>
-            <m:r>
-              <m:rPr>
-                <m:sty m:val="p"/>
-              </m:rPr>
-              <m:t>1</m:t>
-            </m:r>
-          </m:sup>
-        </m:sSup>
+        <m:r>
+          <m:t>1</m:t>
+        </m:r>
+        <m:r>
+          <m:rPr>
+            <m:sty m:val="p"/>
+          </m:rPr>
+          <m:t>μ</m:t>
+        </m:r>
+        <m:r>
+          <m:rPr>
+            <m:sty m:val="p"/>
+          </m:rPr>
+          <m:t>M</m:t>
+        </m:r>
+      </m:oMath>
+      <w:r>
+        <w:t xml:space="preserve"> </w:t>
+      </w:r>
+      <w:r>
+        <w:t xml:space="preserve">for both receptor 1 and 2. The dissociation constant was allowed to vary between</w:t>
+      </w:r>
+      <w:r>
+        <w:t xml:space="preserve"> </w:t>
+      </w:r>
+      <m:oMath>
+        <m:r>
+          <m:t>10</m:t>
+        </m:r>
+        <m:r>
+          <m:rPr>
+            <m:sty m:val="p"/>
+          </m:rPr>
+          <m:t>m</m:t>
+        </m:r>
+        <m:r>
+          <m:rPr>
+            <m:sty m:val="p"/>
+          </m:rPr>
+          <m:t>M</m:t>
+        </m:r>
       </m:oMath>
       <w:r>
         <w:t xml:space="preserve"> </w:t>
@@ -10369,42 +10240,21 @@
         <w:t xml:space="preserve"> </w:t>
       </w:r>
       <m:oMath>
-        <m:sSup>
-          <m:e>
-            <m:r>
-              <m:t>10</m:t>
-            </m:r>
-          </m:e>
-          <m:sup>
-            <m:r>
-              <m:t>10</m:t>
-            </m:r>
-          </m:sup>
-        </m:sSup>
-        <m:sSup>
-          <m:e>
-            <m:r>
-              <m:rPr>
-                <m:sty m:val="p"/>
-              </m:rPr>
-              <m:t>M</m:t>
-            </m:r>
-          </m:e>
-          <m:sup>
-            <m:r>
-              <m:rPr>
-                <m:sty m:val="p"/>
-              </m:rPr>
-              <m:t>−</m:t>
-            </m:r>
-            <m:r>
-              <m:rPr>
-                <m:sty m:val="p"/>
-              </m:rPr>
-              <m:t>1</m:t>
-            </m:r>
-          </m:sup>
-        </m:sSup>
+        <m:r>
+          <m:t>0.1</m:t>
+        </m:r>
+        <m:r>
+          <m:rPr>
+            <m:sty m:val="p"/>
+          </m:rPr>
+          <m:t>n</m:t>
+        </m:r>
+        <m:r>
+          <m:rPr>
+            <m:sty m:val="p"/>
+          </m:rPr>
+          <m:t>M</m:t>
+        </m:r>
       </m:oMath>
       <w:r>
         <w:t xml:space="preserve"> </w:t>

</xml_diff>

<commit_message>
Deploying to gh-pages from  @ fdacc289d06b45f3bb1a075e91a96a89cd800feb 🚀
</commit_message>
<xml_diff>
--- a/manuscript.docx
+++ b/manuscript.docx
@@ -7,25 +7,25 @@
         <w:pStyle w:val="Title"/>
       </w:pPr>
       <w:r>
-        <w:t xml:space="preserve">Exploiting</w:t>
-      </w:r>
-      <w:r>
-        <w:t xml:space="preserve"> </w:t>
-      </w:r>
-      <w:r>
-        <w:t xml:space="preserve">multivalency</w:t>
-      </w:r>
-      <w:r>
-        <w:t xml:space="preserve"> </w:t>
-      </w:r>
-      <w:r>
-        <w:t xml:space="preserve">and</w:t>
-      </w:r>
-      <w:r>
-        <w:t xml:space="preserve"> </w:t>
-      </w:r>
-      <w:r>
-        <w:t xml:space="preserve">other</w:t>
+        <w:t xml:space="preserve">A</w:t>
+      </w:r>
+      <w:r>
+        <w:t xml:space="preserve"> </w:t>
+      </w:r>
+      <w:r>
+        <w:t xml:space="preserve">quantitative</w:t>
+      </w:r>
+      <w:r>
+        <w:t xml:space="preserve"> </w:t>
+      </w:r>
+      <w:r>
+        <w:t xml:space="preserve">view</w:t>
+      </w:r>
+      <w:r>
+        <w:t xml:space="preserve"> </w:t>
+      </w:r>
+      <w:r>
+        <w:t xml:space="preserve">of</w:t>
       </w:r>
       <w:r>
         <w:t xml:space="preserve"> </w:t>
@@ -55,7 +55,13 @@
         <w:t xml:space="preserve"> </w:t>
       </w:r>
       <w:r>
-        <w:t xml:space="preserve">therapies</w:t>
+        <w:t xml:space="preserve">ligand</w:t>
+      </w:r>
+      <w:r>
+        <w:t xml:space="preserve"> </w:t>
+      </w:r>
+      <w:r>
+        <w:t xml:space="preserve">binding</w:t>
       </w:r>
     </w:p>
     <w:p>
@@ -300,7 +306,7 @@
         <w:pStyle w:val="FirstParagraph"/>
       </w:pPr>
       <w:r>
-        <w:t xml:space="preserve">A critical property of many therapies is their selective binding to specific target populations. Exceptional specificity can arise from high-affinity binding to unique cell surface targets. In many cases, however, therapeutic targets are only expressed at quantitatively different levels relative to off-target cells. More complex binding strategies have been designed to overcome this limitation, including multi-specific and multi-valent molecules, creating a combinatorial explosion of design possibilities. Therefore, guiding strategies for developing cell-specific binding are critical to employ these tools. Here, we extend a multi-valent binding model to multi-ligand and multi-receptor interactions. Using this model, we explore a series of mechanisms to engineer cell selectivity, including mixtures of molecules, affinity adjustments, and valency changes. Each of these strategies maximizes selectivity in distinct cases, leading to synergistic improvements when used in combination. Finally, we identify situations in which selectivity cannot be derived through passive binding alone to highlight areas in need of new developments. In total, this work uses a quantitative model to unify a comprehensive set of design guidelines for engineering cell-specific therapies.</w:t>
+        <w:t xml:space="preserve">A critical property of many therapies is their selective binding to specific target populations. Exceptional specificity can arise from high-affinity binding to unique cell surface targets. In many cases, however, therapeutic targets are only expressed at subtly different levels relative to off-target cells. More complex binding strategies have been developed to overcome this limitation, including multi-specific and multi-valent molecules, but create a combinatorial explosion of design possibilities. Therefore, guiding strategies for developing cell-specific binding are critical to employ these tools. Here, we extend a multi-valent binding model to multi-ligand and multi-receptor interactions. Using this model, we explore a series of mechanisms to engineer cell selectivity, including mixtures of molecules, affinity adjustments, and valency changes. Each of these strategies maximizes selectivity in distinct cases, leading to synergistic improvements when used in combination. Finally, we identify situations in which selectivity cannot be derived through passive binding alone to highlight areas in need of new developments. In total, this work uses a quantitative model to unify a comprehensive set of design guidelines for engineering cell-specific therapies.</w:t>
       </w:r>
     </w:p>
     <w:p>
@@ -1328,7 +1334,7 @@
         <w:t xml:space="preserve"> </w:t>
       </w:r>
       <w:r>
-        <w:t xml:space="preserve">has a wider range. We will use this binding model to examine how engineering on affinity, valency, and hetero-valent complexes improve cell-specific targeting. Although we will only consider two receptor and ligand subunit types, respectively, the principles we present generalize to more complex cases.</w:t>
+        <w:t xml:space="preserve">has a wider range. We will use this binding model to examine how engineering using affinity, valency, and hetero-valent complexes improve cell-specific targeting. Although we will only consider two receptor and ligand subunit types, respectively, the principles we present generalize to more complex cases.</w:t>
       </w:r>
     </w:p>
     <w:p>
@@ -3644,7 +3650,7 @@
         <w:pStyle w:val="BodyText"/>
       </w:pPr>
       <w:r>
-        <w:t xml:space="preserve">In order to further validate our model’s capacity to predict multivalent binding activity, we fit it to data gathered by Csizmar et al., where the amount of multivalent, fluorescently labeled nanorings bound to populations expressing large amounts of fibronectin was measured.</w:t>
+        <w:t xml:space="preserve">To further validate our model’s capacity to predict multivalent binding activity, we fit our model to previous experimental measurements wherein fluorescently labeled nanorings were assembled with specific numbers of binding units.</w:t>
       </w:r>
       <w:hyperlink w:anchor="ref-u2Cb0DBq">
         <w:r>
@@ -3659,7 +3665,7 @@
         <w:t xml:space="preserve"> </w:t>
       </w:r>
       <w:r>
-        <w:t xml:space="preserve">By using a least squares fitting to determine crosslinking coefficients, and receptor affinity values, our model was able to accurately predict the amount of nanorings with four or eight fibronectin binding domains bound to MCF-7 cells expressing a known abundance of fibronectin domains (Fig.</w:t>
+        <w:t xml:space="preserve">After fitting to determine the crosslinking coefficient and receptor affinity values, our model was able to accurately match the binding of nanorings with four or eight binding units to MCF-7 cells expressing a known abundance of receptor partners (Fig.</w:t>
       </w:r>
       <w:r>
         <w:t xml:space="preserve"> </w:t>
@@ -3681,7 +3687,7 @@
         <w:pStyle w:val="BodyText"/>
       </w:pPr>
       <w:r>
-        <w:t xml:space="preserve">Selectivity derived from valency engineering requires coordinate changes in affinity. Like we predict, lower affinity, multi-valent interactions have been shown to exhibit abundance selectivity for target cells.</w:t>
+        <w:t xml:space="preserve">Selectivity derived by changing valency requires coordinate changes in affinity. Like we predict, lower affinity, multi-valent interactions have been shown to exhibit selectivity based on receptor abundance.</w:t>
       </w:r>
       <w:hyperlink w:anchor="ref-B0xrCfE3">
         <w:r>
@@ -3725,7 +3731,7 @@
         </w:r>
       </w:hyperlink>
       <w:r>
-        <w:t xml:space="preserve">b-d). Here, the ligand binding ratios between cell populations are shown for ligands of low, medium, and high affinities (</w:t>
+        <w:t xml:space="preserve">b-d). Here, the ligand binding ratios between cell populations are shown for ligands of high, medium, and low affinities (</w:t>
       </w:r>
       <m:oMath>
         <m:sSub>
@@ -3736,7 +3742,7 @@
           </m:e>
           <m:sub>
             <m:r>
-              <m:t>d</m:t>
+              <m:t>a</m:t>
             </m:r>
           </m:sub>
         </m:sSub>
@@ -3759,7 +3765,7 @@
           </m:e>
           <m:sup>
             <m:r>
-              <m:t>3</m:t>
+              <m:t>6</m:t>
             </m:r>
           </m:sup>
         </m:sSup>
@@ -3779,7 +3785,7 @@
           </m:e>
           <m:sup>
             <m:r>
-              <m:t>2</m:t>
+              <m:t>7</m:t>
             </m:r>
           </m:sup>
         </m:sSup>
@@ -3791,21 +3797,47 @@
         <w:t xml:space="preserve"> </w:t>
       </w:r>
       <m:oMath>
-        <m:r>
-          <m:t>10</m:t>
-        </m:r>
-        <m:r>
-          <m:rPr>
-            <m:sty m:val="p"/>
-          </m:rPr>
-          <m:t>n</m:t>
-        </m:r>
-        <m:r>
-          <m:rPr>
-            <m:sty m:val="p"/>
-          </m:rPr>
-          <m:t>M</m:t>
-        </m:r>
+        <m:sSup>
+          <m:e>
+            <m:r>
+              <m:t>10</m:t>
+            </m:r>
+          </m:e>
+          <m:sup>
+            <m:r>
+              <m:t>8</m:t>
+            </m:r>
+          </m:sup>
+        </m:sSup>
+      </m:oMath>
+      <w:r>
+        <w:t xml:space="preserve"> </w:t>
+      </w:r>
+      <m:oMath>
+        <m:sSup>
+          <m:e>
+            <m:r>
+              <m:rPr>
+                <m:sty m:val="p"/>
+              </m:rPr>
+              <m:t>M</m:t>
+            </m:r>
+          </m:e>
+          <m:sup>
+            <m:r>
+              <m:rPr>
+                <m:sty m:val="p"/>
+              </m:rPr>
+              <m:t>−</m:t>
+            </m:r>
+            <m:r>
+              <m:rPr>
+                <m:sty m:val="p"/>
+              </m:rPr>
+              <m:t>1</m:t>
+            </m:r>
+          </m:sup>
+        </m:sSup>
       </m:oMath>
       <w:r>
         <w:t xml:space="preserve">). For example, the ligand binding ratio between</w:t>
@@ -4157,7 +4189,7 @@
         </w:r>
       </w:hyperlink>
       <w:r>
-        <w:t xml:space="preserve">c-d). Ligands with lower affinities achieve optimal binding with higher valencies and exhibit higher selectivity than the high affinity ligands. The existence of this peak in selectivity, and its larger magnitude at lower affinities are in agreeance with previous simulations of nano-particle binding [doi:10.1073/pnas.1105351108].</w:t>
+        <w:t xml:space="preserve">c-d). Ligands with lower affinities achieve optimal binding with higher valencies and exhibit higher selectivity for cells expressing greater amounts of receptor.</w:t>
       </w:r>
     </w:p>
     <w:p>
@@ -4188,7 +4220,7 @@
         <w:t xml:space="preserve"> </w:t>
       </w:r>
       <w:r>
-        <w:t xml:space="preserve">receptors displays similar amounts of binding at each valency for ligands with dissociation constants of</w:t>
+        <w:t xml:space="preserve">receptors displays similar amounts of binding at each valency for ligands with association constants of</w:t>
       </w:r>
       <w:r>
         <w:t xml:space="preserve"> </w:t>
@@ -4202,7 +4234,7 @@
           </m:e>
           <m:sup>
             <m:r>
-              <m:t>3</m:t>
+              <m:t>6</m:t>
             </m:r>
           </m:sup>
         </m:sSup>
@@ -4222,7 +4254,7 @@
           </m:e>
           <m:sup>
             <m:r>
-              <m:t>2</m:t>
+              <m:t>7</m:t>
             </m:r>
           </m:sup>
         </m:sSup>
@@ -4234,21 +4266,18 @@
         <w:t xml:space="preserve"> </w:t>
       </w:r>
       <m:oMath>
-        <m:r>
-          <m:t>10</m:t>
-        </m:r>
-        <m:r>
-          <m:rPr>
-            <m:sty m:val="p"/>
-          </m:rPr>
-          <m:t>n</m:t>
-        </m:r>
-        <m:r>
-          <m:rPr>
-            <m:sty m:val="p"/>
-          </m:rPr>
-          <m:t>M</m:t>
-        </m:r>
+        <m:sSup>
+          <m:e>
+            <m:r>
+              <m:t>10</m:t>
+            </m:r>
+          </m:e>
+          <m:sup>
+            <m:r>
+              <m:t>8</m:t>
+            </m:r>
+          </m:sup>
+        </m:sSup>
       </m:oMath>
       <w:r>
         <w:t xml:space="preserve"> </w:t>
@@ -4268,7 +4297,7 @@
         </w:r>
       </w:hyperlink>
       <w:r>
-        <w:t xml:space="preserve">e). However, a cell expressing a degree of magnitude fewer receptors exhibits extremely low amounts of multivalent binding for ligand complexes of low binding affinity (Fig.</w:t>
+        <w:t xml:space="preserve">e). However, a cell expressing 10% as many receptors exhibits extremely low amounts of multivalent binding for ligand complexes of low binding affinity (Fig.</w:t>
       </w:r>
       <w:r>
         <w:t xml:space="preserve"> </w:t>
@@ -4310,7 +4339,7 @@
         </w:r>
       </w:hyperlink>
       <w:r>
-        <w:t xml:space="preserve">f). This effect allows for valency to provide selectivity between cells having differences in receptor expression density, where affinity alone may fail.</w:t>
+        <w:t xml:space="preserve">f). This effect allows for valency to provide selectivity between cells having differences in receptor expression density, where affinity alone fails.</w:t>
       </w:r>
     </w:p>
     <w:bookmarkStart w:id="0" w:name="fig:valency"/>
@@ -5551,7 +5580,7 @@
         <w:t xml:space="preserve"> </w:t>
       </w:r>
       <w:r>
-        <w:t xml:space="preserve">Furthermore, some biologics inevitably end up as mixtures of species through heterogeneity in glycosylation.</w:t>
+        <w:t xml:space="preserve">Furthermore, some biologics inevitably act as mixtures of species through heterogeneity in glycosylation and the presence of endogenous ligands.</w:t>
       </w:r>
       <w:hyperlink w:anchor="ref-eR2h4yr3">
         <w:r>
@@ -10570,9 +10599,9 @@
       <w:pPr>
         <w:pStyle w:val="Heading3"/>
       </w:pPr>
-      <w:bookmarkStart w:id="44" w:name="X3e765bd312a14d14dd635be5d547990f6b5890d"/>
-      <w:r>
-        <w:t xml:space="preserve">Exploiting Combinations of Receptor Agonists and Antagonists for Enhanced Selectivity</w:t>
+      <w:bookmarkStart w:id="44" w:name="X94d61dc6a943133c806d80032df7da8a7f37fba"/>
+      <w:r>
+        <w:t xml:space="preserve">Using Binding Competition to Invert Receptor Targeting</w:t>
       </w:r>
       <w:bookmarkEnd w:id="44"/>
     </w:p>
@@ -10581,7 +10610,7 @@
         <w:pStyle w:val="FirstParagraph"/>
       </w:pPr>
       <w:r>
-        <w:t xml:space="preserve">While the situational benefits of ligand affinity modulation, valency engineering, and mixing of therapeutic ligands have been explored singularly and in combination, there remain some target and off-target populations which remain difficult to impart selectivity to. For example, achieving binding selectivity for target populations expressing moderate amounts of receptors compared to off-target populations remains challenging (Fig.</w:t>
+        <w:t xml:space="preserve">While the strategies above provided selectivity in many cases, we recognized that they are all limited to a positive relationship between receptor abundance and binding (Fig.</w:t>
       </w:r>
       <w:r>
         <w:t xml:space="preserve"> </w:t>
@@ -10595,7 +10624,7 @@
         </w:r>
       </w:hyperlink>
       <w:r>
-        <w:t xml:space="preserve">m-r). Here, we explore the utility of receptor antagonists for the blocking of off-target populations’ receptors.</w:t>
+        <w:t xml:space="preserve">m-r). Therefore, we wondered if binding competition with a receptor antagonist could invert this relationship.</w:t>
       </w:r>
     </w:p>
     <w:p>
@@ -10603,7 +10632,7 @@
         <w:pStyle w:val="BodyText"/>
       </w:pPr>
       <w:r>
-        <w:t xml:space="preserve">Mixtures of receptor agonists and antagonists are dependent both on the affinity and valency structure of antagonistic ligand. We explore the benefits to selectivity imparted by a tetravalent antagonist (Fig.</w:t>
+        <w:t xml:space="preserve">To investigate the effect of ligand competition with an antagonist, we modeled mixtures of ligands, but only quantified the amount of binding for the active ligand. As binding is dependent upon the properties of both ligands, we chose to only consider a monovalent agonist and tetravalent antagonist (Fig.</w:t>
       </w:r>
       <w:r>
         <w:t xml:space="preserve"> </w:t>
@@ -10617,7 +10646,7 @@
         </w:r>
       </w:hyperlink>
       <w:r>
-        <w:t xml:space="preserve">). Here, it is shown that selectivity for</w:t>
+        <w:t xml:space="preserve">). The selectivity toward</w:t>
       </w:r>
       <w:r>
         <w:t xml:space="preserve"> </w:t>
@@ -10674,7 +10703,7 @@
         <w:t xml:space="preserve"> </w:t>
       </w:r>
       <w:r>
-        <w:t xml:space="preserve">against all other populations using a monovalent ligand can be improved by combining the therapeutic with a tetravalent antagonist with similar affinities for receptor one and two (Fig.</w:t>
+        <w:t xml:space="preserve">was improved by combining the therapeutic with a tetravalent antagonist with similar affinities for receptor one and two (Fig.</w:t>
       </w:r>
       <w:r>
         <w:t xml:space="preserve"> </w:t>
@@ -10688,7 +10717,7 @@
         </w:r>
       </w:hyperlink>
       <w:r>
-        <w:t xml:space="preserve">a). The mechanism which is responsible for this, and which allows for combinations of monovalent agonistic ligands and multivalent antogonistic ligands to uniquely target populations expressing small or intermediate amounts of recepotrs is demonstrated when comparing ligand binding ratios between</w:t>
+        <w:t xml:space="preserve">a). The mechanism which is responsible for this, and which allows for combinations of monovalent agonistic ligands and multivalent antagonistic ligands to uniquely target populations expressing small or intermediate amounts of receptors is demonstrated when comparing ligand binding ratios between</w:t>
       </w:r>
       <w:r>
         <w:t xml:space="preserve"> </w:t>
@@ -10807,7 +10836,7 @@
         </w:r>
       </w:hyperlink>
       <w:r>
-        <w:t xml:space="preserve">e). Here, a nearly ten fold increase in selectivity can be granted to monovalent agonists when combined with a tetravalent antagonist. In this case, there are greater quantities of agonist bound to</w:t>
+        <w:t xml:space="preserve">e). Here, a nearly tenfold increase in selectivity can be granted to monovalent agonists when combined with a tetravalent antagonist. In this case, there are greater quantities of agonist bound to</w:t>
       </w:r>
       <w:r>
         <w:t xml:space="preserve"> </w:t>
@@ -11933,7 +11962,7 @@
         <w:pStyle w:val="FirstParagraph"/>
       </w:pPr>
       <w:r>
-        <w:t xml:space="preserve">To model multivalent ligand complexes, we extended our previous binding model.</w:t>
+        <w:t xml:space="preserve">To model multivalent ligand complexes, we extended our previous binding model to the multi-ligand case.</w:t>
       </w:r>
       <w:hyperlink w:anchor="ref-11gk5tUo7">
         <w:r>
@@ -13441,9 +13470,9 @@
       <w:pPr>
         <w:pStyle w:val="Heading3"/>
       </w:pPr>
-      <w:bookmarkStart w:id="51" w:name="Xc5fddc49d8b024fc5a44200e152f02646acf6d3"/>
-      <w:r>
-        <w:t xml:space="preserve">Generalized multivalent binding model with non-random complexes</w:t>
+      <w:bookmarkStart w:id="51" w:name="X24bd08806ffb8547c5a72680f5305356ed2b829"/>
+      <w:r>
+        <w:t xml:space="preserve">Generalized multivalent binding model with defined complexes</w:t>
       </w:r>
       <w:bookmarkEnd w:id="51"/>
     </w:p>
@@ -13755,10 +13784,7 @@
         </m:sSub>
       </m:oMath>
       <w:r>
-        <w:t xml:space="preserve"> </w:t>
-      </w:r>
-      <w:r>
-        <w:t xml:space="preserve">aforementioned. The relationship between</w:t>
+        <w:t xml:space="preserve">. The relationship between</w:t>
       </w:r>
       <w:r>
         <w:t xml:space="preserve"> </w:t>
@@ -14910,15 +14936,7 @@
         <w:t xml:space="preserve"> </w:t>
       </w:r>
       <w:r>
-        <w:t xml:space="preserve">numerically for each type of receptor.</w:t>
-      </w:r>
-    </w:p>
-    <w:p>
-      <w:pPr>
-        <w:pStyle w:val="BodyText"/>
-      </w:pPr>
-      <w:r>
-        <w:t xml:space="preserve">The total relative amount of ligand binding at equilibrium is</w:t>
+        <w:t xml:space="preserve">numerically for each type of receptor. The total relative amount of ligand binding at equilibrium is</w:t>
       </w:r>
     </w:p>
     <w:p>
@@ -15202,7 +15220,7 @@
         <w:pStyle w:val="FirstParagraph"/>
       </w:pPr>
       <w:r>
-        <w:t xml:space="preserve">We used SciPy function</w:t>
+        <w:t xml:space="preserve">We used the SciPy function</w:t>
       </w:r>
       <w:r>
         <w:t xml:space="preserve"> </w:t>
@@ -15213,7 +15231,13 @@
         </w:rPr>
         <w:t xml:space="preserve">scipy.optimize.minimize</w:t>
       </w:r>
-      <w:hyperlink w:anchor="ref-1GJeMVzz5">
+      <w:r>
+        <w:t xml:space="preserve"> </w:t>
+      </w:r>
+      <w:r>
+        <w:t xml:space="preserve">to combine several strategies and achieve optimal selectivity.</w:t>
+      </w:r>
+      <w:hyperlink w:anchor="ref-8Miti2Gz">
         <w:r>
           <w:rPr>
             <w:rStyle w:val="Hyperlink"/>
@@ -15226,7 +15250,7 @@
         <w:t xml:space="preserve"> </w:t>
       </w:r>
       <w:r>
-        <w:t xml:space="preserve">to combine several strategies and achieve optimal selectivity. Unless specified otherwise, the initial values for the variables in the optimizations are</w:t>
+        <w:t xml:space="preserve">Unless specified otherwise, the initial values for optimization were</w:t>
       </w:r>
       <w:r>
         <w:t xml:space="preserve"> </w:t>
@@ -15288,7 +15312,7 @@
         </m:r>
       </m:oMath>
       <w:r>
-        <w:t xml:space="preserve">, 100% for mixture compostion, and</w:t>
+        <w:t xml:space="preserve">, 100% for mixture composition, and</w:t>
       </w:r>
       <w:r>
         <w:t xml:space="preserve"> </w:t>
@@ -15335,7 +15359,7 @@
         <w:t xml:space="preserve"> </w:t>
       </w:r>
       <w:r>
-        <w:t xml:space="preserve">for the affinity constants; the boundaries are</w:t>
+        <w:t xml:space="preserve">for the affinity constants; the boundaries were</w:t>
       </w:r>
       <w:r>
         <w:t xml:space="preserve"> </w:t>
@@ -15356,11 +15380,12 @@
             </m:r>
           </m:sup>
         </m:sSup>
-      </m:oMath>
-      <w:r>
-        <w:t xml:space="preserve">~</w:t>
-      </w:r>
-      <m:oMath>
+        <m:r>
+          <m:t>−</m:t>
+        </m:r>
+        <m:r>
+          <m:t>−</m:t>
+        </m:r>
         <m:sSup>
           <m:e>
             <m:r>
@@ -15406,7 +15431,7 @@
         </m:sSubSup>
       </m:oMath>
       <w:r>
-        <w:t xml:space="preserve">, 1~16 for</w:t>
+        <w:t xml:space="preserve">, 1–16 for</w:t>
       </w:r>
       <w:r>
         <w:t xml:space="preserve"> </w:t>
@@ -15417,7 +15442,7 @@
         </m:r>
       </m:oMath>
       <w:r>
-        <w:t xml:space="preserve">, 0%~100% for mixture compostion, and</w:t>
+        <w:t xml:space="preserve">, 0–100% for mixture composition, and</w:t>
       </w:r>
       <w:r>
         <w:t xml:space="preserve"> </w:t>
@@ -15436,7 +15461,10 @@
           </m:sup>
         </m:sSup>
         <m:r>
-          <m:t>∼</m:t>
+          <m:t>−</m:t>
+        </m:r>
+        <m:r>
+          <m:t>−</m:t>
         </m:r>
         <m:sSup>
           <m:e>
@@ -15545,42 +15573,36 @@
         <w:t xml:space="preserve"> </w:t>
       </w:r>
       <w:r>
-        <w:t xml:space="preserve">Here, fluorescently labeled nanorings displaying 1, 2, 4, and 8 fibronectin clones, which bind to epithelial cell adhesion molecule (EpCAM) antigens, were fabricated. Binding activity of nanorings displaying both high (C5) and low (B22) affinity EpCAM binding domains was measured. Binding magnitude to an</w:t>
-      </w:r>
-      <w:r>
-        <w:t xml:space="preserve"> </w:t>
-      </w:r>
-      <m:oMath>
-        <m:r>
-          <m:t>E</m:t>
-        </m:r>
-        <m:r>
-          <m:t>p</m:t>
-        </m:r>
-        <m:r>
-          <m:t>C</m:t>
-        </m:r>
-        <m:r>
-          <m:t>A</m:t>
+        <w:t xml:space="preserve">Here, fluorescently labeled nanorings displaying 1, 2, 4, and 8 fibronectin clones, which bind to epithelial cell adhesion molecule (EpCAM) antigens, were fabricated. Binding activity of nanorings displaying both high (C5) and low (B22) affinity EpCAM binding domains was measured. Binding to an EpCAM</w:t>
+      </w:r>
+      <w:r>
+        <w:rPr>
+          <w:vertAlign w:val="superscript"/>
+        </w:rPr>
+        <w:t xml:space="preserve">high</w:t>
+      </w:r>
+      <w:r>
+        <w:t xml:space="preserve"> </w:t>
+      </w:r>
+      <w:r>
+        <w:t xml:space="preserve">(</w:t>
+      </w:r>
+      <m:oMath>
+        <m:r>
+          <m:t>3.3</m:t>
+        </m:r>
+        <m:r>
+          <m:t>x</m:t>
         </m:r>
         <m:sSup>
           <m:e>
             <m:r>
-              <m:t>M</m:t>
-            </m:r>
-          </m:e>
-          <m:sup>
-            <m:r>
-              <m:t>H</m:t>
-            </m:r>
-            <m:r>
-              <m:t>i</m:t>
-            </m:r>
-            <m:r>
-              <m:t>g</m:t>
-            </m:r>
-            <m:r>
-              <m:t>h</m:t>
+              <m:t>10</m:t>
+            </m:r>
+          </m:e>
+          <m:sup>
+            <m:r>
+              <m:t>6</m:t>
             </m:r>
           </m:sup>
         </m:sSup>
@@ -15589,30 +15611,7 @@
         <w:t xml:space="preserve"> </w:t>
       </w:r>
       <w:r>
-        <w:t xml:space="preserve">(3.3 x</w:t>
-      </w:r>
-      <w:r>
-        <w:t xml:space="preserve"> </w:t>
-      </w:r>
-      <m:oMath>
-        <m:sSup>
-          <m:e>
-            <m:r>
-              <m:t>10</m:t>
-            </m:r>
-          </m:e>
-          <m:sup>
-            <m:r>
-              <m:t>6</m:t>
-            </m:r>
-          </m:sup>
-        </m:sSup>
-      </m:oMath>
-      <w:r>
-        <w:t xml:space="preserve"> </w:t>
-      </w:r>
-      <w:r>
-        <w:t xml:space="preserve">antigens/cell) population was measured using flow cytometry. We used a least squares optimization method, as described above, to fit our multivalent binding model to the binding data, using a unique scaling factor for each fibronectin clone to convert between measured fluorescent intensity and magnitude of ligand bound. We allowed affinity of the fibronectin clones to vary during optimization.</w:t>
+        <w:t xml:space="preserve">antigens/cell) population was measured using flow cytometry. We used nonlinear least squares optimization, as described above, to fit our multivalent binding model to the binding data, using a unique scaling factor for each fibronectin clone to convert between measured fluorescent intensity and magnitude of ligand bound. We allowed affinity of the fibronectin clones to vary during optimization.</w:t>
       </w:r>
     </w:p>
     <w:p>
@@ -15647,9 +15646,18 @@
         <w:t xml:space="preserve"> </w:t>
       </w:r>
       <w:r>
-        <w:t xml:space="preserve">a) Experimental vs. predicted fluorescent units for MCF-7 cells expressing $3.8x</w:t>
-      </w:r>
-      <m:oMath>
+        <w:t xml:space="preserve">a) Experimental vs. predicted fluorescent units for MCF-7 cells expressing</w:t>
+      </w:r>
+      <w:r>
+        <w:t xml:space="preserve"> </w:t>
+      </w:r>
+      <m:oMath>
+        <m:r>
+          <m:t>3.8</m:t>
+        </m:r>
+        <m:r>
+          <m:t>x</m:t>
+        </m:r>
         <m:sSup>
           <m:e>
             <m:r>
@@ -15667,47 +15675,18 @@
         <w:t xml:space="preserve"> </w:t>
       </w:r>
       <w:r>
-        <w:t xml:space="preserve">fibronectin receptors</w:t>
-      </w:r>
-      <w:r>
-        <w:t xml:space="preserve"> </w:t>
-      </w:r>
-      <m:oMath>
-        <m:r>
-          <m:rPr>
-            <m:sty m:val="p"/>
-          </m:rPr>
-          <m:t>c</m:t>
-        </m:r>
-        <m:r>
-          <m:rPr>
-            <m:sty m:val="p"/>
-          </m:rPr>
-          <m:t>e</m:t>
-        </m:r>
-        <m:r>
-          <m:rPr>
-            <m:sty m:val="p"/>
-          </m:rPr>
-          <m:t>l</m:t>
-        </m:r>
-        <m:r>
-          <m:rPr>
-            <m:sty m:val="p"/>
-          </m:rPr>
-          <m:t>l</m:t>
-        </m:r>
-      </m:oMath>
-      <w:r>
-        <w:t xml:space="preserve"> </w:t>
-      </w:r>
-      <w:r>
-        <w:t xml:space="preserve">bound to nanorings expressing one, two, four or eight fibronectin binding domains at concentrations ranging from 1.6</w:t>
-      </w:r>
-      <w:r>
-        <w:t xml:space="preserve"> </w:t>
-      </w:r>
-      <m:oMath>
+        <w:t xml:space="preserve">fibronectin receptors per cell bound to nanorings expressing one, two, four or eight fibronectin binding domains at concentrations of 0.16–500 nM. C5 and B22 are high and low affinity fibronectin binding domains respectively. Using nonlinear least-squares regression, the crosslinking coeffient was found to be</w:t>
+      </w:r>
+      <w:r>
+        <w:t xml:space="preserve"> </w:t>
+      </w:r>
+      <m:oMath>
+        <m:r>
+          <m:t>1.11</m:t>
+        </m:r>
+        <m:r>
+          <m:t>x</m:t>
+        </m:r>
         <m:sSup>
           <m:e>
             <m:r>
@@ -15719,27 +15698,53 @@
               <m:t>−</m:t>
             </m:r>
             <m:r>
+              <m:t>12</m:t>
+            </m:r>
+          </m:sup>
+        </m:sSup>
+      </m:oMath>
+      <w:r>
+        <w:t xml:space="preserve">, the association constants for C5 and B22 were found to be</w:t>
+      </w:r>
+      <w:r>
+        <w:t xml:space="preserve"> </w:t>
+      </w:r>
+      <m:oMath>
+        <m:r>
+          <m:t>5.78</m:t>
+        </m:r>
+        <m:r>
+          <m:t>x</m:t>
+        </m:r>
+        <m:sSup>
+          <m:e>
+            <m:r>
               <m:t>10</m:t>
             </m:r>
+          </m:e>
+          <m:sup>
+            <m:r>
+              <m:t>−</m:t>
+            </m:r>
+            <m:r>
+              <m:t>5</m:t>
+            </m:r>
           </m:sup>
         </m:sSup>
-        <m:r>
-          <m:rPr>
-            <m:sty m:val="p"/>
-          </m:rPr>
-          <m:t>M</m:t>
-        </m:r>
-      </m:oMath>
-      <w:r>
-        <w:t xml:space="preserve"> </w:t>
-      </w:r>
-      <w:r>
-        <w:t xml:space="preserve">to 5</w:t>
-      </w:r>
-      <w:r>
-        <w:t xml:space="preserve"> </w:t>
-      </w:r>
-      <m:oMath>
+      </m:oMath>
+      <w:r>
+        <w:t xml:space="preserve">,</w:t>
+      </w:r>
+      <w:r>
+        <w:t xml:space="preserve"> </w:t>
+      </w:r>
+      <m:oMath>
+        <m:r>
+          <m:t>3.08</m:t>
+        </m:r>
+        <m:r>
+          <m:t>x</m:t>
+        </m:r>
         <m:sSup>
           <m:e>
             <m:r>
@@ -15751,24 +15756,27 @@
               <m:t>−</m:t>
             </m:r>
             <m:r>
-              <m:t>7</m:t>
+              <m:t>12</m:t>
             </m:r>
           </m:sup>
         </m:sSup>
-        <m:r>
-          <m:rPr>
-            <m:sty m:val="p"/>
-          </m:rPr>
-          <m:t>M</m:t>
-        </m:r>
-      </m:oMath>
-      <w:r>
-        <w:t xml:space="preserve">. C5 and B22 are high and low affinity fibronectin binding domains respectively. Using a least-squares regression, the crosslinking coeffient was found to be 1.11</w:t>
-      </w:r>
-      <w:r>
-        <w:t xml:space="preserve"> </w:t>
-      </w:r>
-      <m:oMath>
+      </m:oMath>
+      <w:r>
+        <w:t xml:space="preserve"> </w:t>
+      </w:r>
+      <w:r>
+        <w:t xml:space="preserve">respectively, and ligand to fluorescent conversion factor for C5 and B22 were found to be</w:t>
+      </w:r>
+      <w:r>
+        <w:t xml:space="preserve"> </w:t>
+      </w:r>
+      <m:oMath>
+        <m:r>
+          <m:t>5.0</m:t>
+        </m:r>
+        <m:r>
+          <m:t>x</m:t>
+        </m:r>
         <m:sSup>
           <m:e>
             <m:r>
@@ -15780,18 +15788,27 @@
               <m:t>−</m:t>
             </m:r>
             <m:r>
-              <m:t>12</m:t>
+              <m:t>2</m:t>
             </m:r>
           </m:sup>
         </m:sSup>
       </m:oMath>
       <w:r>
-        <w:t xml:space="preserve">, the association constants for C5 and B22 were found to be 5.78</w:t>
-      </w:r>
-      <w:r>
-        <w:t xml:space="preserve"> </w:t>
-      </w:r>
-      <m:oMath>
+        <w:t xml:space="preserve"> </w:t>
+      </w:r>
+      <w:r>
+        <w:t xml:space="preserve">and</w:t>
+      </w:r>
+      <w:r>
+        <w:t xml:space="preserve"> </w:t>
+      </w:r>
+      <m:oMath>
+        <m:r>
+          <m:t>3.2</m:t>
+        </m:r>
+        <m:r>
+          <m:t>x</m:t>
+        </m:r>
         <m:sSup>
           <m:e>
             <m:r>
@@ -15803,18 +15820,70 @@
               <m:t>−</m:t>
             </m:r>
             <m:r>
+              <m:t>2</m:t>
+            </m:r>
+          </m:sup>
+        </m:sSup>
+      </m:oMath>
+      <w:r>
+        <w:t xml:space="preserve"> </w:t>
+      </w:r>
+      <w:r>
+        <w:t xml:space="preserve">respectively. b) Predicted fluorescent values for MDA cells expressing</w:t>
+      </w:r>
+      <w:r>
+        <w:t xml:space="preserve"> </w:t>
+      </w:r>
+      <m:oMath>
+        <m:r>
+          <m:t>5.2</m:t>
+        </m:r>
+        <m:r>
+          <m:t>x</m:t>
+        </m:r>
+        <m:sSup>
+          <m:e>
+            <m:r>
+              <m:t>10</m:t>
+            </m:r>
+          </m:e>
+          <m:sup>
+            <m:r>
+              <m:t>4</m:t>
+            </m:r>
+          </m:sup>
+        </m:sSup>
+      </m:oMath>
+      <w:r>
+        <w:t xml:space="preserve">, SK cells expressing $2.2x</w:t>
+      </w:r>
+      <m:oMath>
+        <m:sSup>
+          <m:e>
+            <m:r>
+              <m:t>10</m:t>
+            </m:r>
+          </m:e>
+          <m:sup>
+            <m:r>
               <m:t>5</m:t>
             </m:r>
           </m:sup>
         </m:sSup>
       </m:oMath>
       <w:r>
-        <w:t xml:space="preserve">, 3.08</w:t>
-      </w:r>
-      <w:r>
-        <w:t xml:space="preserve"> </w:t>
-      </w:r>
-      <m:oMath>
+        <w:t xml:space="preserve">, LNCaP cells expressing</w:t>
+      </w:r>
+      <w:r>
+        <w:t xml:space="preserve"> </w:t>
+      </w:r>
+      <m:oMath>
+        <m:r>
+          <m:t>2.8</m:t>
+        </m:r>
+        <m:r>
+          <m:t>x</m:t>
+        </m:r>
         <m:sSup>
           <m:e>
             <m:r>
@@ -15823,24 +15892,24 @@
           </m:e>
           <m:sup>
             <m:r>
-              <m:t>−</m:t>
-            </m:r>
-            <m:r>
-              <m:t>12</m:t>
+              <m:t>6</m:t>
             </m:r>
           </m:sup>
         </m:sSup>
       </m:oMath>
       <w:r>
-        <w:t xml:space="preserve"> </w:t>
-      </w:r>
-      <w:r>
-        <w:t xml:space="preserve">respectively, and ligand to fluorescent conversion factor for C5 and B22 were found to be 5.0</w:t>
-      </w:r>
-      <w:r>
-        <w:t xml:space="preserve"> </w:t>
-      </w:r>
-      <m:oMath>
+        <w:t xml:space="preserve">, and MCF-7 cells expressing</w:t>
+      </w:r>
+      <w:r>
+        <w:t xml:space="preserve"> </w:t>
+      </w:r>
+      <m:oMath>
+        <m:r>
+          <m:t>3.8</m:t>
+        </m:r>
+        <m:r>
+          <m:t>x</m:t>
+        </m:r>
         <m:sSup>
           <m:e>
             <m:r>
@@ -15849,10 +15918,7 @@
           </m:e>
           <m:sup>
             <m:r>
-              <m:t>−</m:t>
-            </m:r>
-            <m:r>
-              <m:t>2</m:t>
+              <m:t>6</m:t>
             </m:r>
           </m:sup>
         </m:sSup>
@@ -15861,244 +15927,7 @@
         <w:t xml:space="preserve"> </w:t>
       </w:r>
       <w:r>
-        <w:t xml:space="preserve">and 3.2</w:t>
-      </w:r>
-      <w:r>
-        <w:t xml:space="preserve"> </w:t>
-      </w:r>
-      <m:oMath>
-        <m:sSup>
-          <m:e>
-            <m:r>
-              <m:t>10</m:t>
-            </m:r>
-          </m:e>
-          <m:sup>
-            <m:r>
-              <m:t>−</m:t>
-            </m:r>
-            <m:r>
-              <m:t>2</m:t>
-            </m:r>
-          </m:sup>
-        </m:sSup>
-      </m:oMath>
-      <w:r>
-        <w:t xml:space="preserve"> </w:t>
-      </w:r>
-      <w:r>
-        <w:t xml:space="preserve">respectively. b) Predicted fluorescent values for cells expressing MDA cells expressing $5.2x</w:t>
-      </w:r>
-      <m:oMath>
-        <m:sSup>
-          <m:e>
-            <m:r>
-              <m:t>10</m:t>
-            </m:r>
-          </m:e>
-          <m:sup>
-            <m:r>
-              <m:t>4</m:t>
-            </m:r>
-          </m:sup>
-        </m:sSup>
-      </m:oMath>
-      <w:r>
-        <w:t xml:space="preserve"> </w:t>
-      </w:r>
-      <w:r>
-        <w:t xml:space="preserve">receptors</w:t>
-      </w:r>
-      <w:r>
-        <w:t xml:space="preserve"> </w:t>
-      </w:r>
-      <m:oMath>
-        <m:r>
-          <m:rPr>
-            <m:sty m:val="p"/>
-          </m:rPr>
-          <m:t>c</m:t>
-        </m:r>
-        <m:r>
-          <m:rPr>
-            <m:sty m:val="p"/>
-          </m:rPr>
-          <m:t>e</m:t>
-        </m:r>
-        <m:r>
-          <m:rPr>
-            <m:sty m:val="p"/>
-          </m:rPr>
-          <m:t>l</m:t>
-        </m:r>
-        <m:r>
-          <m:rPr>
-            <m:sty m:val="p"/>
-          </m:rPr>
-          <m:t>l</m:t>
-        </m:r>
-      </m:oMath>
-      <w:r>
-        <w:t xml:space="preserve">, SK cells expressing $2.2x</w:t>
-      </w:r>
-      <m:oMath>
-        <m:sSup>
-          <m:e>
-            <m:r>
-              <m:t>10</m:t>
-            </m:r>
-          </m:e>
-          <m:sup>
-            <m:r>
-              <m:t>5</m:t>
-            </m:r>
-          </m:sup>
-        </m:sSup>
-      </m:oMath>
-      <w:r>
-        <w:t xml:space="preserve"> </w:t>
-      </w:r>
-      <w:r>
-        <w:t xml:space="preserve">receptors</w:t>
-      </w:r>
-      <w:r>
-        <w:t xml:space="preserve"> </w:t>
-      </w:r>
-      <m:oMath>
-        <m:r>
-          <m:rPr>
-            <m:sty m:val="p"/>
-          </m:rPr>
-          <m:t>c</m:t>
-        </m:r>
-        <m:r>
-          <m:rPr>
-            <m:sty m:val="p"/>
-          </m:rPr>
-          <m:t>e</m:t>
-        </m:r>
-        <m:r>
-          <m:rPr>
-            <m:sty m:val="p"/>
-          </m:rPr>
-          <m:t>l</m:t>
-        </m:r>
-        <m:r>
-          <m:rPr>
-            <m:sty m:val="p"/>
-          </m:rPr>
-          <m:t>l</m:t>
-        </m:r>
-      </m:oMath>
-      <w:r>
-        <w:t xml:space="preserve">, LNCaP cells expressing $2.8x</w:t>
-      </w:r>
-      <m:oMath>
-        <m:sSup>
-          <m:e>
-            <m:r>
-              <m:t>10</m:t>
-            </m:r>
-          </m:e>
-          <m:sup>
-            <m:r>
-              <m:t>6</m:t>
-            </m:r>
-          </m:sup>
-        </m:sSup>
-      </m:oMath>
-      <w:r>
-        <w:t xml:space="preserve"> </w:t>
-      </w:r>
-      <w:r>
-        <w:t xml:space="preserve">receptors</w:t>
-      </w:r>
-      <w:r>
-        <w:t xml:space="preserve"> </w:t>
-      </w:r>
-      <m:oMath>
-        <m:r>
-          <m:rPr>
-            <m:sty m:val="p"/>
-          </m:rPr>
-          <m:t>c</m:t>
-        </m:r>
-        <m:r>
-          <m:rPr>
-            <m:sty m:val="p"/>
-          </m:rPr>
-          <m:t>e</m:t>
-        </m:r>
-        <m:r>
-          <m:rPr>
-            <m:sty m:val="p"/>
-          </m:rPr>
-          <m:t>l</m:t>
-        </m:r>
-        <m:r>
-          <m:rPr>
-            <m:sty m:val="p"/>
-          </m:rPr>
-          <m:t>l</m:t>
-        </m:r>
-      </m:oMath>
-      <w:r>
-        <w:t xml:space="preserve">, and MCF-7 cells expressing $3.8x</w:t>
-      </w:r>
-      <m:oMath>
-        <m:sSup>
-          <m:e>
-            <m:r>
-              <m:t>10</m:t>
-            </m:r>
-          </m:e>
-          <m:sup>
-            <m:r>
-              <m:t>6</m:t>
-            </m:r>
-          </m:sup>
-        </m:sSup>
-      </m:oMath>
-      <w:r>
-        <w:t xml:space="preserve"> </w:t>
-      </w:r>
-      <w:r>
-        <w:t xml:space="preserve">receptors</w:t>
-      </w:r>
-      <w:r>
-        <w:t xml:space="preserve"> </w:t>
-      </w:r>
-      <m:oMath>
-        <m:r>
-          <m:rPr>
-            <m:sty m:val="p"/>
-          </m:rPr>
-          <m:t>c</m:t>
-        </m:r>
-        <m:r>
-          <m:rPr>
-            <m:sty m:val="p"/>
-          </m:rPr>
-          <m:t>e</m:t>
-        </m:r>
-        <m:r>
-          <m:rPr>
-            <m:sty m:val="p"/>
-          </m:rPr>
-          <m:t>l</m:t>
-        </m:r>
-        <m:r>
-          <m:rPr>
-            <m:sty m:val="p"/>
-          </m:rPr>
-          <m:t>l</m:t>
-        </m:r>
-      </m:oMath>
-      <w:r>
-        <w:t xml:space="preserve"> </w:t>
-      </w:r>
-      <w:r>
-        <w:t xml:space="preserve">as described in Csizmar et al.. Fluorescence was predicted for interactions with octa- and tetravalent ligands expressing either C5 or B22 fibronecting binding domains. c) Predicted binding ratios of MCF-7 cells to MDA cells when bound with octa- and tetravalent ligands expressing either C5 or B22 fibronecting binding domains.</w:t>
+        <w:t xml:space="preserve">receptors per cell as described in Csizmar et al.. Fluorescence was predicted for interactions with octa- and tetravalent ligands expressing either C5 or B22 fibronecting binding domains. c) Predicted binding ratios of MCF-7 cells to MDA cells when bound with octa- and tetravalent ligands expressing either C5 or B22 fibronecting binding domains.</w:t>
       </w:r>
       <w:bookmarkEnd w:id="56"/>
     </w:p>
@@ -16122,9 +15951,18 @@
         <w:t xml:space="preserve"> </w:t>
       </w:r>
       <w:r>
-        <w:t xml:space="preserve">a) Experimental vs. predicted fluorescent units for MCF-7 cells expressing $3.8x</w:t>
-      </w:r>
-      <m:oMath>
+        <w:t xml:space="preserve">a) Experimental vs. predicted fluorescent units for MCF-7 cells expressing</w:t>
+      </w:r>
+      <w:r>
+        <w:t xml:space="preserve"> </w:t>
+      </w:r>
+      <m:oMath>
+        <m:r>
+          <m:t>3.8</m:t>
+        </m:r>
+        <m:r>
+          <m:t>x</m:t>
+        </m:r>
         <m:sSup>
           <m:e>
             <m:r>
@@ -16142,47 +15980,18 @@
         <w:t xml:space="preserve"> </w:t>
       </w:r>
       <w:r>
-        <w:t xml:space="preserve">fibronectin receptors</w:t>
-      </w:r>
-      <w:r>
-        <w:t xml:space="preserve"> </w:t>
-      </w:r>
-      <m:oMath>
-        <m:r>
-          <m:rPr>
-            <m:sty m:val="p"/>
-          </m:rPr>
-          <m:t>c</m:t>
-        </m:r>
-        <m:r>
-          <m:rPr>
-            <m:sty m:val="p"/>
-          </m:rPr>
-          <m:t>e</m:t>
-        </m:r>
-        <m:r>
-          <m:rPr>
-            <m:sty m:val="p"/>
-          </m:rPr>
-          <m:t>l</m:t>
-        </m:r>
-        <m:r>
-          <m:rPr>
-            <m:sty m:val="p"/>
-          </m:rPr>
-          <m:t>l</m:t>
-        </m:r>
-      </m:oMath>
-      <w:r>
-        <w:t xml:space="preserve"> </w:t>
-      </w:r>
-      <w:r>
-        <w:t xml:space="preserve">bound to nanorings expressing one, two, four or eight fibronectin binding domains at concentrations ranging from 1.6</w:t>
-      </w:r>
-      <w:r>
-        <w:t xml:space="preserve"> </w:t>
-      </w:r>
-      <m:oMath>
+        <w:t xml:space="preserve">fibronectin receptors per cell bound to nanorings expressing one, two, four or eight fibronectin binding domains at concentrations of 0.16–500 nM. C5 and B22 are high and low affinity fibronectin binding domains respectively. Using nonlinear least-squares regression, the crosslinking coeffient was found to be</w:t>
+      </w:r>
+      <w:r>
+        <w:t xml:space="preserve"> </w:t>
+      </w:r>
+      <m:oMath>
+        <m:r>
+          <m:t>1.11</m:t>
+        </m:r>
+        <m:r>
+          <m:t>x</m:t>
+        </m:r>
         <m:sSup>
           <m:e>
             <m:r>
@@ -16194,27 +16003,53 @@
               <m:t>−</m:t>
             </m:r>
             <m:r>
+              <m:t>12</m:t>
+            </m:r>
+          </m:sup>
+        </m:sSup>
+      </m:oMath>
+      <w:r>
+        <w:t xml:space="preserve">, the association constants for C5 and B22 were found to be</w:t>
+      </w:r>
+      <w:r>
+        <w:t xml:space="preserve"> </w:t>
+      </w:r>
+      <m:oMath>
+        <m:r>
+          <m:t>5.78</m:t>
+        </m:r>
+        <m:r>
+          <m:t>x</m:t>
+        </m:r>
+        <m:sSup>
+          <m:e>
+            <m:r>
               <m:t>10</m:t>
             </m:r>
+          </m:e>
+          <m:sup>
+            <m:r>
+              <m:t>−</m:t>
+            </m:r>
+            <m:r>
+              <m:t>5</m:t>
+            </m:r>
           </m:sup>
         </m:sSup>
-        <m:r>
-          <m:rPr>
-            <m:sty m:val="p"/>
-          </m:rPr>
-          <m:t>M</m:t>
-        </m:r>
-      </m:oMath>
-      <w:r>
-        <w:t xml:space="preserve"> </w:t>
-      </w:r>
-      <w:r>
-        <w:t xml:space="preserve">to 5</w:t>
-      </w:r>
-      <w:r>
-        <w:t xml:space="preserve"> </w:t>
-      </w:r>
-      <m:oMath>
+      </m:oMath>
+      <w:r>
+        <w:t xml:space="preserve">,</w:t>
+      </w:r>
+      <w:r>
+        <w:t xml:space="preserve"> </w:t>
+      </w:r>
+      <m:oMath>
+        <m:r>
+          <m:t>3.08</m:t>
+        </m:r>
+        <m:r>
+          <m:t>x</m:t>
+        </m:r>
         <m:sSup>
           <m:e>
             <m:r>
@@ -16226,24 +16061,27 @@
               <m:t>−</m:t>
             </m:r>
             <m:r>
-              <m:t>7</m:t>
+              <m:t>12</m:t>
             </m:r>
           </m:sup>
         </m:sSup>
-        <m:r>
-          <m:rPr>
-            <m:sty m:val="p"/>
-          </m:rPr>
-          <m:t>M</m:t>
-        </m:r>
-      </m:oMath>
-      <w:r>
-        <w:t xml:space="preserve">. C5 and B22 are high and low affinity fibronectin binding domains respectively. Using a least-squares regression, the crosslinking coeffient was found to be 1.11</w:t>
-      </w:r>
-      <w:r>
-        <w:t xml:space="preserve"> </w:t>
-      </w:r>
-      <m:oMath>
+      </m:oMath>
+      <w:r>
+        <w:t xml:space="preserve"> </w:t>
+      </w:r>
+      <w:r>
+        <w:t xml:space="preserve">respectively, and ligand to fluorescent conversion factor for C5 and B22 were found to be</w:t>
+      </w:r>
+      <w:r>
+        <w:t xml:space="preserve"> </w:t>
+      </w:r>
+      <m:oMath>
+        <m:r>
+          <m:t>5.0</m:t>
+        </m:r>
+        <m:r>
+          <m:t>x</m:t>
+        </m:r>
         <m:sSup>
           <m:e>
             <m:r>
@@ -16255,18 +16093,27 @@
               <m:t>−</m:t>
             </m:r>
             <m:r>
-              <m:t>12</m:t>
+              <m:t>2</m:t>
             </m:r>
           </m:sup>
         </m:sSup>
       </m:oMath>
       <w:r>
-        <w:t xml:space="preserve">, the association constants for C5 and B22 were found to be 5.78</w:t>
-      </w:r>
-      <w:r>
-        <w:t xml:space="preserve"> </w:t>
-      </w:r>
-      <m:oMath>
+        <w:t xml:space="preserve"> </w:t>
+      </w:r>
+      <w:r>
+        <w:t xml:space="preserve">and</w:t>
+      </w:r>
+      <w:r>
+        <w:t xml:space="preserve"> </w:t>
+      </w:r>
+      <m:oMath>
+        <m:r>
+          <m:t>3.2</m:t>
+        </m:r>
+        <m:r>
+          <m:t>x</m:t>
+        </m:r>
         <m:sSup>
           <m:e>
             <m:r>
@@ -16278,18 +16125,70 @@
               <m:t>−</m:t>
             </m:r>
             <m:r>
+              <m:t>2</m:t>
+            </m:r>
+          </m:sup>
+        </m:sSup>
+      </m:oMath>
+      <w:r>
+        <w:t xml:space="preserve"> </w:t>
+      </w:r>
+      <w:r>
+        <w:t xml:space="preserve">respectively. b) Predicted fluorescent values for MDA cells expressing</w:t>
+      </w:r>
+      <w:r>
+        <w:t xml:space="preserve"> </w:t>
+      </w:r>
+      <m:oMath>
+        <m:r>
+          <m:t>5.2</m:t>
+        </m:r>
+        <m:r>
+          <m:t>x</m:t>
+        </m:r>
+        <m:sSup>
+          <m:e>
+            <m:r>
+              <m:t>10</m:t>
+            </m:r>
+          </m:e>
+          <m:sup>
+            <m:r>
+              <m:t>4</m:t>
+            </m:r>
+          </m:sup>
+        </m:sSup>
+      </m:oMath>
+      <w:r>
+        <w:t xml:space="preserve">, SK cells expressing $2.2x</w:t>
+      </w:r>
+      <m:oMath>
+        <m:sSup>
+          <m:e>
+            <m:r>
+              <m:t>10</m:t>
+            </m:r>
+          </m:e>
+          <m:sup>
+            <m:r>
               <m:t>5</m:t>
             </m:r>
           </m:sup>
         </m:sSup>
       </m:oMath>
       <w:r>
-        <w:t xml:space="preserve">, 3.08</w:t>
-      </w:r>
-      <w:r>
-        <w:t xml:space="preserve"> </w:t>
-      </w:r>
-      <m:oMath>
+        <w:t xml:space="preserve">, LNCaP cells expressing</w:t>
+      </w:r>
+      <w:r>
+        <w:t xml:space="preserve"> </w:t>
+      </w:r>
+      <m:oMath>
+        <m:r>
+          <m:t>2.8</m:t>
+        </m:r>
+        <m:r>
+          <m:t>x</m:t>
+        </m:r>
         <m:sSup>
           <m:e>
             <m:r>
@@ -16298,24 +16197,24 @@
           </m:e>
           <m:sup>
             <m:r>
-              <m:t>−</m:t>
-            </m:r>
-            <m:r>
-              <m:t>12</m:t>
+              <m:t>6</m:t>
             </m:r>
           </m:sup>
         </m:sSup>
       </m:oMath>
       <w:r>
-        <w:t xml:space="preserve"> </w:t>
-      </w:r>
-      <w:r>
-        <w:t xml:space="preserve">respectively, and ligand to fluorescent conversion factor for C5 and B22 were found to be 5.0</w:t>
-      </w:r>
-      <w:r>
-        <w:t xml:space="preserve"> </w:t>
-      </w:r>
-      <m:oMath>
+        <w:t xml:space="preserve">, and MCF-7 cells expressing</w:t>
+      </w:r>
+      <w:r>
+        <w:t xml:space="preserve"> </w:t>
+      </w:r>
+      <m:oMath>
+        <m:r>
+          <m:t>3.8</m:t>
+        </m:r>
+        <m:r>
+          <m:t>x</m:t>
+        </m:r>
         <m:sSup>
           <m:e>
             <m:r>
@@ -16324,10 +16223,7 @@
           </m:e>
           <m:sup>
             <m:r>
-              <m:t>−</m:t>
-            </m:r>
-            <m:r>
-              <m:t>2</m:t>
+              <m:t>6</m:t>
             </m:r>
           </m:sup>
         </m:sSup>
@@ -16336,244 +16232,7 @@
         <w:t xml:space="preserve"> </w:t>
       </w:r>
       <w:r>
-        <w:t xml:space="preserve">and 3.2</w:t>
-      </w:r>
-      <w:r>
-        <w:t xml:space="preserve"> </w:t>
-      </w:r>
-      <m:oMath>
-        <m:sSup>
-          <m:e>
-            <m:r>
-              <m:t>10</m:t>
-            </m:r>
-          </m:e>
-          <m:sup>
-            <m:r>
-              <m:t>−</m:t>
-            </m:r>
-            <m:r>
-              <m:t>2</m:t>
-            </m:r>
-          </m:sup>
-        </m:sSup>
-      </m:oMath>
-      <w:r>
-        <w:t xml:space="preserve"> </w:t>
-      </w:r>
-      <w:r>
-        <w:t xml:space="preserve">respectively. b) Predicted fluorescent values for cells expressing MDA cells expressing $5.2x</w:t>
-      </w:r>
-      <m:oMath>
-        <m:sSup>
-          <m:e>
-            <m:r>
-              <m:t>10</m:t>
-            </m:r>
-          </m:e>
-          <m:sup>
-            <m:r>
-              <m:t>4</m:t>
-            </m:r>
-          </m:sup>
-        </m:sSup>
-      </m:oMath>
-      <w:r>
-        <w:t xml:space="preserve"> </w:t>
-      </w:r>
-      <w:r>
-        <w:t xml:space="preserve">receptors</w:t>
-      </w:r>
-      <w:r>
-        <w:t xml:space="preserve"> </w:t>
-      </w:r>
-      <m:oMath>
-        <m:r>
-          <m:rPr>
-            <m:sty m:val="p"/>
-          </m:rPr>
-          <m:t>c</m:t>
-        </m:r>
-        <m:r>
-          <m:rPr>
-            <m:sty m:val="p"/>
-          </m:rPr>
-          <m:t>e</m:t>
-        </m:r>
-        <m:r>
-          <m:rPr>
-            <m:sty m:val="p"/>
-          </m:rPr>
-          <m:t>l</m:t>
-        </m:r>
-        <m:r>
-          <m:rPr>
-            <m:sty m:val="p"/>
-          </m:rPr>
-          <m:t>l</m:t>
-        </m:r>
-      </m:oMath>
-      <w:r>
-        <w:t xml:space="preserve">, SK cells expressing $2.2x</w:t>
-      </w:r>
-      <m:oMath>
-        <m:sSup>
-          <m:e>
-            <m:r>
-              <m:t>10</m:t>
-            </m:r>
-          </m:e>
-          <m:sup>
-            <m:r>
-              <m:t>5</m:t>
-            </m:r>
-          </m:sup>
-        </m:sSup>
-      </m:oMath>
-      <w:r>
-        <w:t xml:space="preserve"> </w:t>
-      </w:r>
-      <w:r>
-        <w:t xml:space="preserve">receptors</w:t>
-      </w:r>
-      <w:r>
-        <w:t xml:space="preserve"> </w:t>
-      </w:r>
-      <m:oMath>
-        <m:r>
-          <m:rPr>
-            <m:sty m:val="p"/>
-          </m:rPr>
-          <m:t>c</m:t>
-        </m:r>
-        <m:r>
-          <m:rPr>
-            <m:sty m:val="p"/>
-          </m:rPr>
-          <m:t>e</m:t>
-        </m:r>
-        <m:r>
-          <m:rPr>
-            <m:sty m:val="p"/>
-          </m:rPr>
-          <m:t>l</m:t>
-        </m:r>
-        <m:r>
-          <m:rPr>
-            <m:sty m:val="p"/>
-          </m:rPr>
-          <m:t>l</m:t>
-        </m:r>
-      </m:oMath>
-      <w:r>
-        <w:t xml:space="preserve">, LNCaP cells expressing $2.8x</w:t>
-      </w:r>
-      <m:oMath>
-        <m:sSup>
-          <m:e>
-            <m:r>
-              <m:t>10</m:t>
-            </m:r>
-          </m:e>
-          <m:sup>
-            <m:r>
-              <m:t>6</m:t>
-            </m:r>
-          </m:sup>
-        </m:sSup>
-      </m:oMath>
-      <w:r>
-        <w:t xml:space="preserve"> </w:t>
-      </w:r>
-      <w:r>
-        <w:t xml:space="preserve">receptors</w:t>
-      </w:r>
-      <w:r>
-        <w:t xml:space="preserve"> </w:t>
-      </w:r>
-      <m:oMath>
-        <m:r>
-          <m:rPr>
-            <m:sty m:val="p"/>
-          </m:rPr>
-          <m:t>c</m:t>
-        </m:r>
-        <m:r>
-          <m:rPr>
-            <m:sty m:val="p"/>
-          </m:rPr>
-          <m:t>e</m:t>
-        </m:r>
-        <m:r>
-          <m:rPr>
-            <m:sty m:val="p"/>
-          </m:rPr>
-          <m:t>l</m:t>
-        </m:r>
-        <m:r>
-          <m:rPr>
-            <m:sty m:val="p"/>
-          </m:rPr>
-          <m:t>l</m:t>
-        </m:r>
-      </m:oMath>
-      <w:r>
-        <w:t xml:space="preserve">, and MCF-7 cells expressing $3.8x</w:t>
-      </w:r>
-      <m:oMath>
-        <m:sSup>
-          <m:e>
-            <m:r>
-              <m:t>10</m:t>
-            </m:r>
-          </m:e>
-          <m:sup>
-            <m:r>
-              <m:t>6</m:t>
-            </m:r>
-          </m:sup>
-        </m:sSup>
-      </m:oMath>
-      <w:r>
-        <w:t xml:space="preserve"> </w:t>
-      </w:r>
-      <w:r>
-        <w:t xml:space="preserve">receptors</w:t>
-      </w:r>
-      <w:r>
-        <w:t xml:space="preserve"> </w:t>
-      </w:r>
-      <m:oMath>
-        <m:r>
-          <m:rPr>
-            <m:sty m:val="p"/>
-          </m:rPr>
-          <m:t>c</m:t>
-        </m:r>
-        <m:r>
-          <m:rPr>
-            <m:sty m:val="p"/>
-          </m:rPr>
-          <m:t>e</m:t>
-        </m:r>
-        <m:r>
-          <m:rPr>
-            <m:sty m:val="p"/>
-          </m:rPr>
-          <m:t>l</m:t>
-        </m:r>
-        <m:r>
-          <m:rPr>
-            <m:sty m:val="p"/>
-          </m:rPr>
-          <m:t>l</m:t>
-        </m:r>
-      </m:oMath>
-      <w:r>
-        <w:t xml:space="preserve"> </w:t>
-      </w:r>
-      <w:r>
-        <w:t xml:space="preserve">as described in Csizmar et al.. Fluorescence was predicted for interactions with octa- and tetravalent ligands expressing either C5 or B22 fibronecting binding domains. c) Predicted binding ratios of MCF-7 cells to MDA cells when bound with octa- and tetravalent ligands expressing either C5 or B22 fibronecting binding domains.</w:t>
+        <w:t xml:space="preserve">receptors per cell as described in Csizmar et al.. Fluorescence was predicted for interactions with octa- and tetravalent ligands expressing either C5 or B22 fibronecting binding domains. c) Predicted binding ratios of MCF-7 cells to MDA cells when bound with octa- and tetravalent ligands expressing either C5 or B22 fibronecting binding domains.</w:t>
       </w:r>
     </w:p>
     <w:bookmarkEnd w:id="0"/>
@@ -17917,28 +17576,52 @@
       </w:r>
     </w:p>
     <w:bookmarkEnd w:id="91"/>
-    <w:bookmarkStart w:id="93" w:name="ref-1GJeMVzz5"/>
+    <w:bookmarkStart w:id="93" w:name="ref-8Miti2Gz"/>
     <w:p>
       <w:pPr>
         <w:pStyle w:val="Bibliography"/>
       </w:pPr>
       <w:r>
-        <w:t xml:space="preserve">32. scipy.optimize.minimize — SciPy v1.5.2 Reference Guide. Available at:</w:t>
-      </w:r>
-      <w:r>
-        <w:t xml:space="preserve"> </w:t>
+        <w:t xml:space="preserve">32. Virtanen, P.</w:t>
+      </w:r>
+      <w:r>
+        <w:t xml:space="preserve"> </w:t>
+      </w:r>
+      <w:r>
+        <w:rPr>
+          <w:i/>
+        </w:rPr>
+        <w:t xml:space="preserve">et al.</w:t>
+      </w:r>
+      <w:r>
+        <w:t xml:space="preserve"> </w:t>
+      </w:r>
+      <w:r>
+        <w:t xml:space="preserve">SciPy 1.0: fundamental algorithms for scientific computing in Python.</w:t>
+      </w:r>
+      <w:r>
+        <w:t xml:space="preserve"> </w:t>
+      </w:r>
+      <w:r>
+        <w:rPr>
+          <w:i/>
+        </w:rPr>
+        <w:t xml:space="preserve">Nature Methods</w:t>
+      </w:r>
+      <w:r>
+        <w:t xml:space="preserve"> </w:t>
+      </w:r>
+      <w:r>
+        <w:t xml:space="preserve">(2020). doi:</w:t>
       </w:r>
       <w:hyperlink r:id="rId92">
         <w:r>
           <w:rPr>
             <w:rStyle w:val="Hyperlink"/>
           </w:rPr>
-          <w:t xml:space="preserve">https://docs.scipy.org/doc/scipy/reference/generated/scipy.optimize.minimize.html</w:t>
+          <w:t xml:space="preserve">10.1038/s41592-019-0686-2</w:t>
         </w:r>
       </w:hyperlink>
-      <w:r>
-        <w:t xml:space="preserve">. (Accessed: 2nd October 2020)</w:t>
-      </w:r>
     </w:p>
     <w:bookmarkEnd w:id="93"/>
     <w:bookmarkStart w:id="94" w:name="ref-VKATSjfe"/>

</xml_diff>

<commit_message>
Deploying to gh-pages from  @ 725222c53f693be761ffbe65a32f66ee641916ea 🚀
</commit_message>
<xml_diff>
--- a/manuscript.docx
+++ b/manuscript.docx
@@ -78,7 +78,7 @@
         <w:t xml:space="preserve"> </w:t>
       </w:r>
       <w:r>
-        <w:t xml:space="preserve">was automatically generated on October 2, 2020.</w:t>
+        <w:t xml:space="preserve">was automatically generated on October 6, 2020.</w:t>
       </w:r>
       <w:r>
         <w:t xml:space="preserve"> </w:t>
@@ -382,7 +382,7 @@
         <w:pStyle w:val="FirstParagraph"/>
       </w:pPr>
       <w:r>
-        <w:t xml:space="preserve">Many drugs derive their therapeutic benefit, and avoid toxicity, through selective binding to specific cells within the body. However, even with a drug of very specific molecular binding, genetic and non-genetic heterogeneity can create a wide distribution of cell responses. This results in reduced effectiveness and toxicity. For example, in cancer, resistance to anti-tumor antibodies,</w:t>
+        <w:t xml:space="preserve">Many drugs derive their therapeutic benefit, and avoid toxicity, through selective binding to specific cells within the body. However, even with a drug of very specific molecular binding, genetic and non-genetic heterogeneity can create a wide distribution of cell responses. This can result in reduced effectiveness and toxicity. For example, in cancer, resistance to anti-tumor antibodies,</w:t>
       </w:r>
       <w:hyperlink w:anchor="ref-dr9JS306">
         <w:r>
@@ -1106,7 +1106,7 @@
         </m:sSub>
       </m:oMath>
       <w:r>
-        <w:t xml:space="preserve">. This situation corresponds to some cue inducing expression of a receptor (e.g. interferon-induced upregulation of MHC, or regulatory T cell upregulation of IL-2R⍺</w:t>
+        <w:t xml:space="preserve">. This situation might correspond to some cue inducing expression of a receptor (e.g. interferon-induced upregulation of MHC, or regulatory T cell upregulation of IL-2R⍺</w:t>
       </w:r>
       <w:hyperlink w:anchor="ref-11Hb1fNV6">
         <w:r>
@@ -1393,18 +1393,9 @@
         <m:r>
           <m:t>∼</m:t>
         </m:r>
-        <m:sSup>
-          <m:e>
-            <m:r>
-              <m:t>10</m:t>
-            </m:r>
-          </m:e>
-          <m:sup>
-            <m:r>
-              <m:t>2</m:t>
-            </m:r>
-          </m:sup>
-        </m:sSup>
+        <m:r>
+          <m:t>100</m:t>
+        </m:r>
         <m:r>
           <m:rPr>
             <m:sty m:val="p"/>
@@ -2023,18 +2014,9 @@
         <m:r>
           <m:t>∼</m:t>
         </m:r>
-        <m:sSup>
-          <m:e>
-            <m:r>
-              <m:t>10</m:t>
-            </m:r>
-          </m:e>
-          <m:sup>
-            <m:r>
-              <m:t>2</m:t>
-            </m:r>
-          </m:sup>
-        </m:sSup>
+        <m:r>
+          <m:t>100</m:t>
+        </m:r>
         <m:r>
           <m:rPr>
             <m:sty m:val="p"/>
@@ -3106,7 +3088,7 @@
         </m:sSubSup>
       </m:oMath>
       <w:r>
-        <w:t xml:space="preserve">, we see that it is beneficial to tune a ligand for tighter binding to the differentially expressed receptor (Fig.</w:t>
+        <w:t xml:space="preserve">, we see that it is beneficial for a ligand to bind most tightly to the differentially expressed receptor (Fig.</w:t>
       </w:r>
       <w:r>
         <w:t xml:space="preserve"> </w:t>
@@ -3120,7 +3102,7 @@
         </w:r>
       </w:hyperlink>
       <w:r>
-        <w:t xml:space="preserve">b). In cases where multiple receptors of interest are uniformally upregulated in a target population, such as when comparing</w:t>
+        <w:t xml:space="preserve">b). When both receptors are uniformally more abundant in a target population than the off target population, such as when comparing</w:t>
       </w:r>
       <w:r>
         <w:t xml:space="preserve"> </w:t>
@@ -3190,10 +3172,13 @@
           </m:sub>
           <m:sup>
             <m:r>
-              <m:t>l</m:t>
-            </m:r>
-            <m:r>
-              <m:t>o</m:t>
+              <m:t>m</m:t>
+            </m:r>
+            <m:r>
+              <m:t>e</m:t>
+            </m:r>
+            <m:r>
+              <m:t>d</m:t>
             </m:r>
           </m:sup>
         </m:sSubSup>
@@ -3210,10 +3195,13 @@
           </m:sub>
           <m:sup>
             <m:r>
-              <m:t>l</m:t>
-            </m:r>
-            <m:r>
-              <m:t>o</m:t>
+              <m:t>m</m:t>
+            </m:r>
+            <m:r>
+              <m:t>e</m:t>
+            </m:r>
+            <m:r>
+              <m:t>d</m:t>
             </m:r>
           </m:sup>
         </m:sSubSup>
@@ -3417,7 +3405,7 @@
         </m:sSubSup>
       </m:oMath>
       <w:r>
-        <w:t xml:space="preserve">, we can expect greater intra-population variation in binding to the latter (Fig.</w:t>
+        <w:t xml:space="preserve">, we can also expect greater intra-population variation in binding to the latter (Fig.</w:t>
       </w:r>
       <w:r>
         <w:t xml:space="preserve"> </w:t>
@@ -3449,7 +3437,7 @@
         <w:pStyle w:val="FirstParagraph"/>
       </w:pPr>
       <w:r>
-        <w:t xml:space="preserve">Given the limitations of deriving selectivity from affinity changes we next explored the effect of valency changes (Fig.</w:t>
+        <w:t xml:space="preserve">Given the limitations of deriving selectivity from affinity changes, we next explored the effect of valency changes (Fig.</w:t>
       </w:r>
       <w:r>
         <w:t xml:space="preserve"> </w:t>
@@ -3492,7 +3480,30 @@
         </w:r>
       </w:hyperlink>
       <w:r>
-        <w:t xml:space="preserve">a-c. Here, the amount of ligand bound by cells expressing different abundances of receptor 1 and 2 is quantified. Ligand binds both receptors with equal affinity and the valency of the ligand is varied across subplots. The most notable effect of changing valency is observed as variable density of binding isoclines in the contour plot. For example, in the monovalent case, the relative levels of binding of</w:t>
+        <w:t xml:space="preserve">a-c. Here, the amount of ligand bound by cells expressing different abundances of receptor 1 and 2 is quantified. The ligand only binds to receptor</w:t>
+      </w:r>
+      <w:r>
+        <w:t xml:space="preserve"> </w:t>
+      </w:r>
+      <m:oMath>
+        <m:sSub>
+          <m:e>
+            <m:r>
+              <m:t>R</m:t>
+            </m:r>
+          </m:e>
+          <m:sub>
+            <m:r>
+              <m:t>1</m:t>
+            </m:r>
+          </m:sub>
+        </m:sSub>
+      </m:oMath>
+      <w:r>
+        <w:t xml:space="preserve"> </w:t>
+      </w:r>
+      <w:r>
+        <w:t xml:space="preserve">and the valency of the ligand is varied across subplots. The most notable effect of changing valency is observed as variable density of binding isoclines in the contour plot. For example, in the monovalent case, the relative quantities of binding of</w:t>
       </w:r>
       <w:r>
         <w:t xml:space="preserve"> </w:t>
@@ -3650,7 +3661,7 @@
         <w:pStyle w:val="BodyText"/>
       </w:pPr>
       <w:r>
-        <w:t xml:space="preserve">To further validate our model’s capacity to predict multivalent binding activity, we fit our model to previous experimental measurements wherein fluorescently labeled nanorings were assembled with specific numbers of binding units.</w:t>
+        <w:t xml:space="preserve">To validate our model’s capacity to predict multivalent binding activity, we fit our model to previous experimental measurements wherein fluorescently labeled nanorings were assembled with specific numbers of binding units.</w:t>
       </w:r>
       <w:hyperlink w:anchor="ref-u2Cb0DBq">
         <w:r>
@@ -3742,7 +3753,7 @@
           </m:e>
           <m:sub>
             <m:r>
-              <m:t>a</m:t>
+              <m:t>d</m:t>
             </m:r>
           </m:sub>
         </m:sSub>
@@ -3757,18 +3768,9 @@
         <w:t xml:space="preserve"> </w:t>
       </w:r>
       <m:oMath>
-        <m:sSup>
-          <m:e>
-            <m:r>
-              <m:t>10</m:t>
-            </m:r>
-          </m:e>
-          <m:sup>
-            <m:r>
-              <m:t>6</m:t>
-            </m:r>
-          </m:sup>
-        </m:sSup>
+        <m:r>
+          <m:t>1000</m:t>
+        </m:r>
       </m:oMath>
       <w:r>
         <w:t xml:space="preserve">,</w:t>
@@ -3777,70 +3779,40 @@
         <w:t xml:space="preserve"> </w:t>
       </w:r>
       <m:oMath>
-        <m:sSup>
-          <m:e>
-            <m:r>
-              <m:t>10</m:t>
-            </m:r>
-          </m:e>
-          <m:sup>
-            <m:r>
-              <m:t>7</m:t>
-            </m:r>
-          </m:sup>
-        </m:sSup>
-      </m:oMath>
-      <w:r>
-        <w:t xml:space="preserve">,</w:t>
-      </w:r>
-      <w:r>
-        <w:t xml:space="preserve"> </w:t>
-      </w:r>
-      <m:oMath>
-        <m:sSup>
-          <m:e>
-            <m:r>
-              <m:t>10</m:t>
-            </m:r>
-          </m:e>
-          <m:sup>
-            <m:r>
-              <m:t>8</m:t>
-            </m:r>
-          </m:sup>
-        </m:sSup>
-      </m:oMath>
-      <w:r>
-        <w:t xml:space="preserve"> </w:t>
-      </w:r>
-      <m:oMath>
-        <m:sSup>
-          <m:e>
-            <m:r>
-              <m:rPr>
-                <m:sty m:val="p"/>
-              </m:rPr>
-              <m:t>M</m:t>
-            </m:r>
-          </m:e>
-          <m:sup>
-            <m:r>
-              <m:rPr>
-                <m:sty m:val="p"/>
-              </m:rPr>
-              <m:t>−</m:t>
-            </m:r>
-            <m:r>
-              <m:rPr>
-                <m:sty m:val="p"/>
-              </m:rPr>
-              <m:t>1</m:t>
-            </m:r>
-          </m:sup>
-        </m:sSup>
-      </m:oMath>
-      <w:r>
-        <w:t xml:space="preserve">). For example, the ligand binding ratio between</w:t>
+        <m:r>
+          <m:t>100</m:t>
+        </m:r>
+      </m:oMath>
+      <w:r>
+        <w:t xml:space="preserve">, and</w:t>
+      </w:r>
+      <w:r>
+        <w:t xml:space="preserve"> </w:t>
+      </w:r>
+      <m:oMath>
+        <m:r>
+          <m:t>10</m:t>
+        </m:r>
+      </m:oMath>
+      <w:r>
+        <w:t xml:space="preserve"> </w:t>
+      </w:r>
+      <m:oMath>
+        <m:r>
+          <m:rPr>
+            <m:sty m:val="p"/>
+          </m:rPr>
+          <m:t>n</m:t>
+        </m:r>
+        <m:r>
+          <m:rPr>
+            <m:sty m:val="p"/>
+          </m:rPr>
+          <m:t>M</m:t>
+        </m:r>
+      </m:oMath>
+      <w:r>
+        <w:t xml:space="preserve">). The ligand binding ratio between</w:t>
       </w:r>
       <w:r>
         <w:t xml:space="preserve"> </w:t>
@@ -4197,7 +4169,7 @@
         <w:pStyle w:val="BodyText"/>
       </w:pPr>
       <w:r>
-        <w:t xml:space="preserve">Our model allows us to identify the mechanism of valency-mediated receptor abundance selectivity by looking at the average number of receptors bound by each ligand complex. A cell expressing</w:t>
+        <w:t xml:space="preserve">Our model allowed us to identify the mechanism of valency-mediated receptor abundance selectivity by looking at the average number of receptors bound by each ligand complex. A cell expressing</w:t>
       </w:r>
       <w:r>
         <w:t xml:space="preserve"> </w:t>
@@ -4220,24 +4192,15 @@
         <w:t xml:space="preserve"> </w:t>
       </w:r>
       <w:r>
-        <w:t xml:space="preserve">receptors displays similar amounts of binding at each valency for ligands with association constants of</w:t>
-      </w:r>
-      <w:r>
-        <w:t xml:space="preserve"> </w:t>
-      </w:r>
-      <m:oMath>
-        <m:sSup>
-          <m:e>
-            <m:r>
-              <m:t>10</m:t>
-            </m:r>
-          </m:e>
-          <m:sup>
-            <m:r>
-              <m:t>6</m:t>
-            </m:r>
-          </m:sup>
-        </m:sSup>
+        <w:t xml:space="preserve">receptors displays similar amounts of binding at each valency for ligands with dissociation constants of</w:t>
+      </w:r>
+      <w:r>
+        <w:t xml:space="preserve"> </w:t>
+      </w:r>
+      <m:oMath>
+        <m:r>
+          <m:t>1000</m:t>
+        </m:r>
       </m:oMath>
       <w:r>
         <w:t xml:space="preserve">,</w:t>
@@ -4246,18 +4209,9 @@
         <w:t xml:space="preserve"> </w:t>
       </w:r>
       <m:oMath>
-        <m:sSup>
-          <m:e>
-            <m:r>
-              <m:t>10</m:t>
-            </m:r>
-          </m:e>
-          <m:sup>
-            <m:r>
-              <m:t>7</m:t>
-            </m:r>
-          </m:sup>
-        </m:sSup>
+        <m:r>
+          <m:t>100</m:t>
+        </m:r>
       </m:oMath>
       <w:r>
         <w:t xml:space="preserve">, and</w:t>
@@ -4266,18 +4220,21 @@
         <w:t xml:space="preserve"> </w:t>
       </w:r>
       <m:oMath>
-        <m:sSup>
-          <m:e>
-            <m:r>
-              <m:t>10</m:t>
-            </m:r>
-          </m:e>
-          <m:sup>
-            <m:r>
-              <m:t>8</m:t>
-            </m:r>
-          </m:sup>
-        </m:sSup>
+        <m:r>
+          <m:t>10</m:t>
+        </m:r>
+        <m:r>
+          <m:rPr>
+            <m:sty m:val="p"/>
+          </m:rPr>
+          <m:t>n</m:t>
+        </m:r>
+        <m:r>
+          <m:rPr>
+            <m:sty m:val="p"/>
+          </m:rPr>
+          <m:t>M</m:t>
+        </m:r>
       </m:oMath>
       <w:r>
         <w:t xml:space="preserve"> </w:t>
@@ -4790,23 +4747,30 @@
       </w:r>
       <m:oMath>
         <m:r>
-          <m:t>1</m:t>
-        </m:r>
-        <m:r>
-          <m:t>×</m:t>
-        </m:r>
-        <m:sSup>
-          <m:e>
-            <m:r>
-              <m:t>10</m:t>
-            </m:r>
-          </m:e>
-          <m:sup>
-            <m:r>
-              <m:t>3</m:t>
-            </m:r>
-          </m:sup>
-        </m:sSup>
+          <m:t>1000</m:t>
+        </m:r>
+      </m:oMath>
+      <w:r>
+        <w:t xml:space="preserve">,</w:t>
+      </w:r>
+      <w:r>
+        <w:t xml:space="preserve"> </w:t>
+      </w:r>
+      <m:oMath>
+        <m:r>
+          <m:t>100</m:t>
+        </m:r>
+      </m:oMath>
+      <w:r>
+        <w:t xml:space="preserve">, or</w:t>
+      </w:r>
+      <w:r>
+        <w:t xml:space="preserve"> </w:t>
+      </w:r>
+      <m:oMath>
+        <m:r>
+          <m:t>10</m:t>
+        </m:r>
         <m:r>
           <m:rPr>
             <m:sty m:val="p"/>
@@ -4821,7 +4785,10 @@
         </m:r>
       </m:oMath>
       <w:r>
-        <w:t xml:space="preserve">,</w:t>
+        <w:t xml:space="preserve"> </w:t>
+      </w:r>
+      <w:r>
+        <w:t xml:space="preserve">for receptor 1. e) Number of octavalent complex bound at each degree for a cell with</w:t>
       </w:r>
       <w:r>
         <w:t xml:space="preserve"> </w:t>
@@ -4841,51 +4808,16 @@
           </m:e>
           <m:sup>
             <m:r>
-              <m:t>2</m:t>
+              <m:t>4</m:t>
             </m:r>
           </m:sup>
         </m:sSup>
-        <m:r>
-          <m:rPr>
-            <m:sty m:val="p"/>
-          </m:rPr>
-          <m:t>n</m:t>
-        </m:r>
-        <m:r>
-          <m:rPr>
-            <m:sty m:val="p"/>
-          </m:rPr>
-          <m:t>M</m:t>
-        </m:r>
-      </m:oMath>
-      <w:r>
-        <w:t xml:space="preserve">, or</w:t>
-      </w:r>
-      <w:r>
-        <w:t xml:space="preserve"> </w:t>
-      </w:r>
-      <m:oMath>
-        <m:r>
-          <m:t>10</m:t>
-        </m:r>
-        <m:r>
-          <m:rPr>
-            <m:sty m:val="p"/>
-          </m:rPr>
-          <m:t>n</m:t>
-        </m:r>
-        <m:r>
-          <m:rPr>
-            <m:sty m:val="p"/>
-          </m:rPr>
-          <m:t>M</m:t>
-        </m:r>
-      </m:oMath>
-      <w:r>
-        <w:t xml:space="preserve"> </w:t>
-      </w:r>
-      <w:r>
-        <w:t xml:space="preserve">for receptor 1. d) Number of octavalent complex bound at each degree for a cell with</w:t>
+      </m:oMath>
+      <w:r>
+        <w:t xml:space="preserve"> </w:t>
+      </w:r>
+      <w:r>
+        <w:t xml:space="preserve">receptors. f) Number of octavalent complex bound at each degree for a cell with</w:t>
       </w:r>
       <w:r>
         <w:t xml:space="preserve"> </w:t>
@@ -4905,7 +4837,7 @@
           </m:e>
           <m:sup>
             <m:r>
-              <m:t>4</m:t>
+              <m:t>3</m:t>
             </m:r>
           </m:sup>
         </m:sSup>
@@ -4914,36 +4846,7 @@
         <w:t xml:space="preserve"> </w:t>
       </w:r>
       <w:r>
-        <w:t xml:space="preserve">receptors. e) Number of octavalent complex bound at each degree for a cell with</w:t>
-      </w:r>
-      <w:r>
-        <w:t xml:space="preserve"> </w:t>
-      </w:r>
-      <m:oMath>
-        <m:r>
-          <m:t>1</m:t>
-        </m:r>
-        <m:r>
-          <m:t>×</m:t>
-        </m:r>
-        <m:sSup>
-          <m:e>
-            <m:r>
-              <m:t>10</m:t>
-            </m:r>
-          </m:e>
-          <m:sup>
-            <m:r>
-              <m:t>3</m:t>
-            </m:r>
-          </m:sup>
-        </m:sSup>
-      </m:oMath>
-      <w:r>
-        <w:t xml:space="preserve"> </w:t>
-      </w:r>
-      <w:r>
-        <w:t xml:space="preserve">receptors. f) Fraction of forward to reverse binding rates for a multivalent ligand binding to a cell with varying amounts of receptor expression, following an initial binding event.</w:t>
+        <w:t xml:space="preserve">receptors. g) Fraction of forward to reverse binding rates for a multivalent ligand binding to a cell with varying amounts of receptor expression, following an initial binding event.</w:t>
       </w:r>
       <w:bookmarkEnd w:id="37"/>
     </w:p>
@@ -5393,23 +5296,30 @@
       </w:r>
       <m:oMath>
         <m:r>
-          <m:t>1</m:t>
-        </m:r>
-        <m:r>
-          <m:t>×</m:t>
-        </m:r>
-        <m:sSup>
-          <m:e>
-            <m:r>
-              <m:t>10</m:t>
-            </m:r>
-          </m:e>
-          <m:sup>
-            <m:r>
-              <m:t>3</m:t>
-            </m:r>
-          </m:sup>
-        </m:sSup>
+          <m:t>1000</m:t>
+        </m:r>
+      </m:oMath>
+      <w:r>
+        <w:t xml:space="preserve">,</w:t>
+      </w:r>
+      <w:r>
+        <w:t xml:space="preserve"> </w:t>
+      </w:r>
+      <m:oMath>
+        <m:r>
+          <m:t>100</m:t>
+        </m:r>
+      </m:oMath>
+      <w:r>
+        <w:t xml:space="preserve">, or</w:t>
+      </w:r>
+      <w:r>
+        <w:t xml:space="preserve"> </w:t>
+      </w:r>
+      <m:oMath>
+        <m:r>
+          <m:t>10</m:t>
+        </m:r>
         <m:r>
           <m:rPr>
             <m:sty m:val="p"/>
@@ -5424,7 +5334,10 @@
         </m:r>
       </m:oMath>
       <w:r>
-        <w:t xml:space="preserve">,</w:t>
+        <w:t xml:space="preserve"> </w:t>
+      </w:r>
+      <w:r>
+        <w:t xml:space="preserve">for receptor 1. e) Number of octavalent complex bound at each degree for a cell with</w:t>
       </w:r>
       <w:r>
         <w:t xml:space="preserve"> </w:t>
@@ -5444,51 +5357,16 @@
           </m:e>
           <m:sup>
             <m:r>
-              <m:t>2</m:t>
+              <m:t>4</m:t>
             </m:r>
           </m:sup>
         </m:sSup>
-        <m:r>
-          <m:rPr>
-            <m:sty m:val="p"/>
-          </m:rPr>
-          <m:t>n</m:t>
-        </m:r>
-        <m:r>
-          <m:rPr>
-            <m:sty m:val="p"/>
-          </m:rPr>
-          <m:t>M</m:t>
-        </m:r>
-      </m:oMath>
-      <w:r>
-        <w:t xml:space="preserve">, or</w:t>
-      </w:r>
-      <w:r>
-        <w:t xml:space="preserve"> </w:t>
-      </w:r>
-      <m:oMath>
-        <m:r>
-          <m:t>10</m:t>
-        </m:r>
-        <m:r>
-          <m:rPr>
-            <m:sty m:val="p"/>
-          </m:rPr>
-          <m:t>n</m:t>
-        </m:r>
-        <m:r>
-          <m:rPr>
-            <m:sty m:val="p"/>
-          </m:rPr>
-          <m:t>M</m:t>
-        </m:r>
-      </m:oMath>
-      <w:r>
-        <w:t xml:space="preserve"> </w:t>
-      </w:r>
-      <w:r>
-        <w:t xml:space="preserve">for receptor 1. d) Number of octavalent complex bound at each degree for a cell with</w:t>
+      </m:oMath>
+      <w:r>
+        <w:t xml:space="preserve"> </w:t>
+      </w:r>
+      <w:r>
+        <w:t xml:space="preserve">receptors. f) Number of octavalent complex bound at each degree for a cell with</w:t>
       </w:r>
       <w:r>
         <w:t xml:space="preserve"> </w:t>
@@ -5508,7 +5386,7 @@
           </m:e>
           <m:sup>
             <m:r>
-              <m:t>4</m:t>
+              <m:t>3</m:t>
             </m:r>
           </m:sup>
         </m:sSup>
@@ -5517,36 +5395,7 @@
         <w:t xml:space="preserve"> </w:t>
       </w:r>
       <w:r>
-        <w:t xml:space="preserve">receptors. e) Number of octavalent complex bound at each degree for a cell with</w:t>
-      </w:r>
-      <w:r>
-        <w:t xml:space="preserve"> </w:t>
-      </w:r>
-      <m:oMath>
-        <m:r>
-          <m:t>1</m:t>
-        </m:r>
-        <m:r>
-          <m:t>×</m:t>
-        </m:r>
-        <m:sSup>
-          <m:e>
-            <m:r>
-              <m:t>10</m:t>
-            </m:r>
-          </m:e>
-          <m:sup>
-            <m:r>
-              <m:t>3</m:t>
-            </m:r>
-          </m:sup>
-        </m:sSup>
-      </m:oMath>
-      <w:r>
-        <w:t xml:space="preserve"> </w:t>
-      </w:r>
-      <w:r>
-        <w:t xml:space="preserve">receptors. f) Fraction of forward to reverse binding rates for a multivalent ligand binding to a cell with varying amounts of receptor expression, following an initial binding event.</w:t>
+        <w:t xml:space="preserve">receptors. g) Fraction of forward to reverse binding rates for a multivalent ligand binding to a cell with varying amounts of receptor expression, following an initial binding event.</w:t>
       </w:r>
     </w:p>
     <w:bookmarkEnd w:id="0"/>
@@ -9336,7 +9185,235 @@
         <w:pStyle w:val="FirstParagraph"/>
       </w:pPr>
       <w:r>
-        <w:t xml:space="preserve">Example:</w:t>
+        <w:t xml:space="preserve">Each strategy above provided selectivity benefits in distinct situations, suggesting that they might synergistically improve selectivity when combined. We explored this potential synergy using optimization to determine the optimally cell type selective ligand for our theoretical cell populations. It is often the case that target cell populations express receptors common to a range of adjacent, off-target populations. Thus, we sought to determine the optimal ligand for particular cell populations while considering all other theoretical populations as off-target cells. We set our initial binding selectivity performance metric and optimize it within set bounds (Fig.</w:t>
+      </w:r>
+      <w:r>
+        <w:t xml:space="preserve"> </w:t>
+      </w:r>
+      <w:hyperlink w:anchor="fig:combination">
+        <w:r>
+          <w:rPr>
+            <w:rStyle w:val="Hyperlink"/>
+          </w:rPr>
+          <w:t xml:space="preserve">6</w:t>
+        </w:r>
+      </w:hyperlink>
+      <w:r>
+        <w:t xml:space="preserve">). To simulate the effects that affinity engineering could impart on selectivity, we then allowed ligand-receptor affinities to vary. To understand the effects of valency and mixture engineering on selectivity, we allowed ligand valency and mixtures to vary, while also allowing affinity to vary due to the previously noted reliance that these strategies have on receptor-ligand kinetics. Finally, all ligand parameters were allowed to vary to simulate the effects of combining therapeutic engineering approaches.</w:t>
+      </w:r>
+    </w:p>
+    <w:p>
+      <w:pPr>
+        <w:pStyle w:val="BodyText"/>
+      </w:pPr>
+      <w:r>
+        <w:t xml:space="preserve">Optimizing a ligand for selectivity to</w:t>
+      </w:r>
+      <w:r>
+        <w:t xml:space="preserve"> </w:t>
+      </w:r>
+      <m:oMath>
+        <m:sSubSup>
+          <m:e>
+            <m:r>
+              <m:t>R</m:t>
+            </m:r>
+          </m:e>
+          <m:sub>
+            <m:r>
+              <m:t>1</m:t>
+            </m:r>
+          </m:sub>
+          <m:sup>
+            <m:r>
+              <m:t>l</m:t>
+            </m:r>
+            <m:r>
+              <m:t>o</m:t>
+            </m:r>
+          </m:sup>
+        </m:sSubSup>
+        <m:sSubSup>
+          <m:e>
+            <m:r>
+              <m:t>R</m:t>
+            </m:r>
+          </m:e>
+          <m:sub>
+            <m:r>
+              <m:t>2</m:t>
+            </m:r>
+          </m:sub>
+          <m:sup>
+            <m:r>
+              <m:t>h</m:t>
+            </m:r>
+            <m:r>
+              <m:t>i</m:t>
+            </m:r>
+          </m:sup>
+        </m:sSubSup>
+      </m:oMath>
+      <w:r>
+        <w:t xml:space="preserve"> </w:t>
+      </w:r>
+      <w:r>
+        <w:t xml:space="preserve">highlights a situation in which combined affinity and valency individually impart greater specificity, and optimal selectivity is achieved by combining these two strategies (Fig.</w:t>
+      </w:r>
+      <w:r>
+        <w:t xml:space="preserve"> </w:t>
+      </w:r>
+      <w:hyperlink w:anchor="fig:combination">
+        <w:r>
+          <w:rPr>
+            <w:rStyle w:val="Hyperlink"/>
+          </w:rPr>
+          <w:t xml:space="preserve">6</w:t>
+        </w:r>
+      </w:hyperlink>
+      <w:r>
+        <w:t xml:space="preserve">a-f). Here selectivity is optimized by ligands with selective binding to receptor 2, and those with valencies allowing for selective binding to cells with higher abundances of receptor expression. Here, dominant therapeutic design strategies emerge. One case contradictory to this trend is shown during the optimization for selectivity towards the</w:t>
+      </w:r>
+      <w:r>
+        <w:t xml:space="preserve"> </w:t>
+      </w:r>
+      <m:oMath>
+        <m:sSubSup>
+          <m:e>
+            <m:r>
+              <m:t>R</m:t>
+            </m:r>
+          </m:e>
+          <m:sub>
+            <m:r>
+              <m:t>1</m:t>
+            </m:r>
+          </m:sub>
+          <m:sup>
+            <m:r>
+              <m:t>h</m:t>
+            </m:r>
+            <m:r>
+              <m:t>i</m:t>
+            </m:r>
+          </m:sup>
+        </m:sSubSup>
+        <m:sSubSup>
+          <m:e>
+            <m:r>
+              <m:t>R</m:t>
+            </m:r>
+          </m:e>
+          <m:sub>
+            <m:r>
+              <m:t>2</m:t>
+            </m:r>
+          </m:sub>
+          <m:sup>
+            <m:r>
+              <m:t>h</m:t>
+            </m:r>
+            <m:r>
+              <m:t>i</m:t>
+            </m:r>
+          </m:sup>
+        </m:sSubSup>
+      </m:oMath>
+      <w:r>
+        <w:t xml:space="preserve"> </w:t>
+      </w:r>
+      <w:r>
+        <w:t xml:space="preserve">. While affinity, valency, and mixture engineering are able to impart some small contributions to enhanced selectivity, significant improvement is only achieved when combining them all (Fig.</w:t>
+      </w:r>
+      <w:r>
+        <w:t xml:space="preserve"> </w:t>
+      </w:r>
+      <w:hyperlink w:anchor="fig:combination">
+        <w:r>
+          <w:rPr>
+            <w:rStyle w:val="Hyperlink"/>
+          </w:rPr>
+          <w:t xml:space="preserve">6</w:t>
+        </w:r>
+      </w:hyperlink>
+      <w:r>
+        <w:t xml:space="preserve">g-l). Here, synergistic combination of strategies can be employed to great effect, granting far superior ligand selectivity. A more difficult design problem is featured in the optimization of</w:t>
+      </w:r>
+      <w:r>
+        <w:t xml:space="preserve"> </w:t>
+      </w:r>
+      <m:oMath>
+        <m:sSubSup>
+          <m:e>
+            <m:r>
+              <m:t>R</m:t>
+            </m:r>
+          </m:e>
+          <m:sub>
+            <m:r>
+              <m:t>1</m:t>
+            </m:r>
+          </m:sub>
+          <m:sup>
+            <m:r>
+              <m:t>m</m:t>
+            </m:r>
+            <m:r>
+              <m:t>e</m:t>
+            </m:r>
+            <m:r>
+              <m:t>d</m:t>
+            </m:r>
+          </m:sup>
+        </m:sSubSup>
+        <m:sSubSup>
+          <m:e>
+            <m:r>
+              <m:t>R</m:t>
+            </m:r>
+          </m:e>
+          <m:sub>
+            <m:r>
+              <m:t>2</m:t>
+            </m:r>
+          </m:sub>
+          <m:sup>
+            <m:r>
+              <m:t>m</m:t>
+            </m:r>
+            <m:r>
+              <m:t>e</m:t>
+            </m:r>
+            <m:r>
+              <m:t>d</m:t>
+            </m:r>
+          </m:sup>
+        </m:sSubSup>
+      </m:oMath>
+      <w:r>
+        <w:t xml:space="preserve">. Since it lies in the midst of the other populations in receptor expression space (Fig.</w:t>
+      </w:r>
+      <w:r>
+        <w:t xml:space="preserve"> </w:t>
+      </w:r>
+      <w:hyperlink w:anchor="fig:mixture">
+        <w:r>
+          <w:rPr>
+            <w:rStyle w:val="Hyperlink"/>
+          </w:rPr>
+          <w:t xml:space="preserve">4</w:t>
+        </w:r>
+      </w:hyperlink>
+      <w:r>
+        <w:t xml:space="preserve">m-r), any modulation of affinity, valency or combining it with mixture-based strategies seems ineffective.</w:t>
+      </w:r>
+    </w:p>
+    <w:p>
+      <w:pPr>
+        <w:pStyle w:val="BodyText"/>
+      </w:pPr>
+      <w:r>
+        <w:t xml:space="preserve">Our results highlight that both in singular and combined strategies for therapeutic manipulation, the target and off-target populations dictate the optimal approach. It is also clear that combined approaches do offer synergies which can be harnessed, but that those are only emergent in particular therapeutic situations.</w:t>
       </w:r>
       <w:hyperlink w:anchor="ref-y7JtEfom">
         <w:r>
@@ -9347,367 +9424,6 @@
           <w:t xml:space="preserve">24</w:t>
         </w:r>
       </w:hyperlink>
-    </w:p>
-    <w:p>
-      <w:pPr>
-        <w:pStyle w:val="BodyText"/>
-      </w:pPr>
-      <w:r>
-        <w:t xml:space="preserve">While each therapeutic design methodology discussed in this work can drive superior cell-type selectivity in certain situations, the advantages of intersecting these design strategies has yet to be thoroughly explored. Combining ligand design features such as affinity modulation, increasing valency, and mixing therapeutics offers a potential route for synergistically combining the effects offered by each. We explored these potential synergies using a quasi-newton optimizer to determine the optimally cell-type selective ligand for our theoretical cell populations.</w:t>
-      </w:r>
-    </w:p>
-    <w:p>
-      <w:pPr>
-        <w:pStyle w:val="BodyText"/>
-      </w:pPr>
-      <w:r>
-        <w:t xml:space="preserve">It is often the case that target cell populations express receptors common to a range of adjacent, off-target populations. Thus, we sought to determine the optimal ligand for particular cell populations while considering all other theoretical populations to exist as off-target cells. By optimizing within bounds that restricted all ligand modulations, we set our initial binding selectivity performance metric (Fig.</w:t>
-      </w:r>
-      <w:r>
-        <w:t xml:space="preserve"> </w:t>
-      </w:r>
-      <w:hyperlink w:anchor="fig:combination">
-        <w:r>
-          <w:rPr>
-            <w:rStyle w:val="Hyperlink"/>
-          </w:rPr>
-          <w:t xml:space="preserve">6</w:t>
-        </w:r>
-      </w:hyperlink>
-      <w:r>
-        <w:t xml:space="preserve">). To simulate the effects that affinity engineering could impart on selectivity, we then allowed ligand-receptor affinities to be varied. To understand the effects of valency and mixture engineering on selectivity, we allowed ligand valency and mixtures to vary, while also allowing affinity to vary due to the previously noted reliance that these strategies have on receptor-ligand kinetics. Finally, all ligand parameters were allowed to vary to simulate the effects of combining therapeutic engineering approaches.</w:t>
-      </w:r>
-    </w:p>
-    <w:p>
-      <w:pPr>
-        <w:pStyle w:val="BodyText"/>
-      </w:pPr>
-      <w:r>
-        <w:t xml:space="preserve">Optimizing a ligand for selectivity to</w:t>
-      </w:r>
-      <w:r>
-        <w:t xml:space="preserve"> </w:t>
-      </w:r>
-      <m:oMath>
-        <m:sSubSup>
-          <m:e>
-            <m:r>
-              <m:t>R</m:t>
-            </m:r>
-          </m:e>
-          <m:sub>
-            <m:r>
-              <m:t>1</m:t>
-            </m:r>
-          </m:sub>
-          <m:sup>
-            <m:r>
-              <m:t>l</m:t>
-            </m:r>
-            <m:r>
-              <m:t>o</m:t>
-            </m:r>
-          </m:sup>
-        </m:sSubSup>
-        <m:sSubSup>
-          <m:e>
-            <m:r>
-              <m:t>R</m:t>
-            </m:r>
-          </m:e>
-          <m:sub>
-            <m:r>
-              <m:t>2</m:t>
-            </m:r>
-          </m:sub>
-          <m:sup>
-            <m:r>
-              <m:t>h</m:t>
-            </m:r>
-            <m:r>
-              <m:t>i</m:t>
-            </m:r>
-          </m:sup>
-        </m:sSubSup>
-      </m:oMath>
-      <w:r>
-        <w:t xml:space="preserve"> </w:t>
-      </w:r>
-      <w:r>
-        <w:t xml:space="preserve">highlights a situation in which combined affinity and valency individually impart greater specificity, and optimal selectivity is achieved by synergistically combining these two strategies (Fig.</w:t>
-      </w:r>
-      <w:r>
-        <w:t xml:space="preserve"> </w:t>
-      </w:r>
-      <w:hyperlink w:anchor="fig:combination">
-        <w:r>
-          <w:rPr>
-            <w:rStyle w:val="Hyperlink"/>
-          </w:rPr>
-          <w:t xml:space="preserve">6</w:t>
-        </w:r>
-      </w:hyperlink>
-      <w:r>
-        <w:t xml:space="preserve">a-f). Here selectivity is optimized by ligands with selective binding to receptor 2, and those with valencies allowing for selective binding to cells with higher abundances of receptor expression. Here, and in many cases, a dominant therapeutic design strategy emerges without consideration of all possible engineering avenues. One case contradictory to this trend is shown during the optimization for selectivity towards the</w:t>
-      </w:r>
-      <w:r>
-        <w:t xml:space="preserve"> </w:t>
-      </w:r>
-      <m:oMath>
-        <m:sSubSup>
-          <m:e>
-            <m:r>
-              <m:t>R</m:t>
-            </m:r>
-          </m:e>
-          <m:sub>
-            <m:r>
-              <m:t>1</m:t>
-            </m:r>
-          </m:sub>
-          <m:sup>
-            <m:r>
-              <m:t>h</m:t>
-            </m:r>
-            <m:r>
-              <m:t>i</m:t>
-            </m:r>
-          </m:sup>
-        </m:sSubSup>
-        <m:sSubSup>
-          <m:e>
-            <m:r>
-              <m:t>R</m:t>
-            </m:r>
-          </m:e>
-          <m:sub>
-            <m:r>
-              <m:t>2</m:t>
-            </m:r>
-          </m:sub>
-          <m:sup>
-            <m:r>
-              <m:t>h</m:t>
-            </m:r>
-            <m:r>
-              <m:t>i</m:t>
-            </m:r>
-          </m:sup>
-        </m:sSubSup>
-      </m:oMath>
-      <w:r>
-        <w:t xml:space="preserve"> </w:t>
-      </w:r>
-      <w:r>
-        <w:t xml:space="preserve">. While affinity, valency, and mixture engineering are able to impart some small contributions to enhanced selectivity, significant improvement is only achieved when combining all aforementioned strategies (Fig.</w:t>
-      </w:r>
-      <w:r>
-        <w:t xml:space="preserve"> </w:t>
-      </w:r>
-      <w:hyperlink w:anchor="fig:combination">
-        <w:r>
-          <w:rPr>
-            <w:rStyle w:val="Hyperlink"/>
-          </w:rPr>
-          <w:t xml:space="preserve">6</w:t>
-        </w:r>
-      </w:hyperlink>
-      <w:r>
-        <w:t xml:space="preserve">g-l). Here, synergistic combination of strategies can be employed to great effect, granting far superior ligand selectivity. A more difficult design problem is featured in the optimization of</w:t>
-      </w:r>
-      <w:r>
-        <w:t xml:space="preserve"> </w:t>
-      </w:r>
-      <m:oMath>
-        <m:sSubSup>
-          <m:e>
-            <m:r>
-              <m:t>R</m:t>
-            </m:r>
-          </m:e>
-          <m:sub>
-            <m:r>
-              <m:t>1</m:t>
-            </m:r>
-          </m:sub>
-          <m:sup>
-            <m:r>
-              <m:t>m</m:t>
-            </m:r>
-            <m:r>
-              <m:t>e</m:t>
-            </m:r>
-            <m:r>
-              <m:t>d</m:t>
-            </m:r>
-          </m:sup>
-        </m:sSubSup>
-        <m:sSubSup>
-          <m:e>
-            <m:r>
-              <m:t>R</m:t>
-            </m:r>
-          </m:e>
-          <m:sub>
-            <m:r>
-              <m:t>2</m:t>
-            </m:r>
-          </m:sub>
-          <m:sup>
-            <m:r>
-              <m:t>m</m:t>
-            </m:r>
-            <m:r>
-              <m:t>e</m:t>
-            </m:r>
-            <m:r>
-              <m:t>d</m:t>
-            </m:r>
-          </m:sup>
-        </m:sSubSup>
-      </m:oMath>
-      <w:r>
-        <w:t xml:space="preserve">, which lies in the midst of the other populations in receptor expression space (Fig.</w:t>
-      </w:r>
-      <w:r>
-        <w:t xml:space="preserve"> </w:t>
-      </w:r>
-      <w:hyperlink w:anchor="fig:mixture">
-        <w:r>
-          <w:rPr>
-            <w:rStyle w:val="Hyperlink"/>
-          </w:rPr>
-          <w:t xml:space="preserve">4</w:t>
-        </w:r>
-      </w:hyperlink>
-      <w:r>
-        <w:t xml:space="preserve">m-r). Here, solely allowing for modulation of affinity, or combining it with mixture-based strategies is ineffective. Only with the introduction of valency modulation is selectivity significantly enhanced. However, an alternative approach to targeting</w:t>
-      </w:r>
-      <w:r>
-        <w:t xml:space="preserve"> </w:t>
-      </w:r>
-      <m:oMath>
-        <m:sSubSup>
-          <m:e>
-            <m:r>
-              <m:t>R</m:t>
-            </m:r>
-          </m:e>
-          <m:sub>
-            <m:r>
-              <m:t>1</m:t>
-            </m:r>
-          </m:sub>
-          <m:sup>
-            <m:r>
-              <m:t>m</m:t>
-            </m:r>
-            <m:r>
-              <m:t>e</m:t>
-            </m:r>
-            <m:r>
-              <m:t>d</m:t>
-            </m:r>
-          </m:sup>
-        </m:sSubSup>
-        <m:sSubSup>
-          <m:e>
-            <m:r>
-              <m:t>R</m:t>
-            </m:r>
-          </m:e>
-          <m:sub>
-            <m:r>
-              <m:t>2</m:t>
-            </m:r>
-          </m:sub>
-          <m:sup>
-            <m:r>
-              <m:t>m</m:t>
-            </m:r>
-            <m:r>
-              <m:t>e</m:t>
-            </m:r>
-            <m:r>
-              <m:t>d</m:t>
-            </m:r>
-          </m:sup>
-        </m:sSubSup>
-      </m:oMath>
-      <w:r>
-        <w:t xml:space="preserve"> </w:t>
-      </w:r>
-      <w:r>
-        <w:t xml:space="preserve">is presented in Fig.</w:t>
-      </w:r>
-      <w:r>
-        <w:t xml:space="preserve"> </w:t>
-      </w:r>
-      <w:hyperlink w:anchor="fig:combination">
-        <w:r>
-          <w:rPr>
-            <w:rStyle w:val="Hyperlink"/>
-          </w:rPr>
-          <w:t xml:space="preserve">6</w:t>
-        </w:r>
-      </w:hyperlink>
-      <w:r>
-        <w:t xml:space="preserve">s-v. Here the population is exposed to a mixture of an octovalent</w:t>
-      </w:r>
-      <w:r>
-        <w:t xml:space="preserve"> </w:t>
-      </w:r>
-      <w:r>
-        <w:t xml:space="preserve">“</w:t>
-      </w:r>
-      <w:r>
-        <w:t xml:space="preserve">dead</w:t>
-      </w:r>
-      <w:r>
-        <w:t xml:space="preserve">”</w:t>
-      </w:r>
-      <w:r>
-        <w:t xml:space="preserve"> </w:t>
-      </w:r>
-      <w:r>
-        <w:t xml:space="preserve">ligand which can bind receptors 1 and 2 but is assumed to not induce signaling response and a therapeutic monovalent ligand with optimized affinities. Results are normalized to the selectivity imparted when the dead ligand is non-binding (Fig.</w:t>
-      </w:r>
-      <w:r>
-        <w:t xml:space="preserve"> </w:t>
-      </w:r>
-      <w:hyperlink w:anchor="fig:combination">
-        <w:r>
-          <w:rPr>
-            <w:rStyle w:val="Hyperlink"/>
-          </w:rPr>
-          <w:t xml:space="preserve">6</w:t>
-        </w:r>
-      </w:hyperlink>
-      <w:r>
-        <w:t xml:space="preserve">s). We see here that enhanced selectivity can be achieved by these means, as the dead ligand blocks many of the available receptors on populations expressing higher abundances (Fig.</w:t>
-      </w:r>
-      <w:r>
-        <w:t xml:space="preserve"> </w:t>
-      </w:r>
-      <w:hyperlink w:anchor="fig:mixture">
-        <w:r>
-          <w:rPr>
-            <w:rStyle w:val="Hyperlink"/>
-          </w:rPr>
-          <w:t xml:space="preserve">4</w:t>
-        </w:r>
-      </w:hyperlink>
-      <w:r>
-        <w:t xml:space="preserve">u).</w:t>
-      </w:r>
-    </w:p>
-    <w:p>
-      <w:pPr>
-        <w:pStyle w:val="BodyText"/>
-      </w:pPr>
-      <w:r>
-        <w:t xml:space="preserve">Our results highlight that both in singular and combined strategies for therapeutic manipulation, the target and off-target populations dictate the optimal approach. It is also clear that combined approaches do offer synergies which can be harnessed, but that those are only emergent in particular therapeutic situations.</w:t>
-      </w:r>
     </w:p>
     <w:bookmarkStart w:id="0" w:name="fig:combination"/>
     <w:p>
@@ -16374,7 +16090,7 @@
         <w:rPr>
           <w:i/>
         </w:rPr>
-        <w:t xml:space="preserve">Cancer Cell</w:t>
+        <w:t xml:space="preserve">Cancer cell</w:t>
       </w:r>
       <w:r>
         <w:t xml:space="preserve"> </w:t>
@@ -16681,7 +16397,7 @@
         <w:rPr>
           <w:i/>
         </w:rPr>
-        <w:t xml:space="preserve">Cancer Cell</w:t>
+        <w:t xml:space="preserve">Cancer cell</w:t>
       </w:r>
       <w:r>
         <w:t xml:space="preserve"> </w:t>
@@ -17175,7 +16891,7 @@
         <w:rPr>
           <w:i/>
         </w:rPr>
-        <w:t xml:space="preserve">Cell Syst</w:t>
+        <w:t xml:space="preserve">Cell systems</w:t>
       </w:r>
       <w:r>
         <w:t xml:space="preserve"> </w:t>
@@ -17283,7 +16999,7 @@
         <w:rPr>
           <w:i/>
         </w:rPr>
-        <w:t xml:space="preserve">Methods</w:t>
+        <w:t xml:space="preserve">Methods (San Diego, Calif.)</w:t>
       </w:r>
       <w:r>
         <w:t xml:space="preserve"> </w:t>
@@ -17375,7 +17091,7 @@
         <w:rPr>
           <w:i/>
         </w:rPr>
-        <w:t xml:space="preserve">J. Autoimmun.</w:t>
+        <w:t xml:space="preserve">Journal of autoimmunity</w:t>
       </w:r>
       <w:r>
         <w:t xml:space="preserve"> </w:t>
@@ -17498,7 +17214,7 @@
         <w:rPr>
           <w:i/>
         </w:rPr>
-        <w:t xml:space="preserve">Oncol. Rep.</w:t>
+        <w:t xml:space="preserve">Oncology reports</w:t>
       </w:r>
       <w:r>
         <w:t xml:space="preserve"> </w:t>

</xml_diff>

<commit_message>
Deploying to gh-pages from  @ 57c35268da2004ba8592ad49c80bf346f4127ddf 🚀
</commit_message>
<xml_diff>
--- a/manuscript.docx
+++ b/manuscript.docx
@@ -3661,7 +3661,20 @@
         <w:pStyle w:val="BodyText"/>
       </w:pPr>
       <w:r>
-        <w:t xml:space="preserve">To validate our model’s capacity to predict multivalent binding activity, we fit our model to previous experimental measurements wherein fluorescently labeled nanorings were assembled with specific numbers of binding units.</w:t>
+        <w:t xml:space="preserve">Previous work has shown that our multivalent binding can accurately predict the complicated binding process between IgG antibodies and Fcγ receptors.</w:t>
+      </w:r>
+      <w:r>
+        <w:rPr>
+          <w:b/>
+          <w:vertAlign w:val="superscript"/>
+        </w:rPr>
+        <w:t xml:space="preserve">???</w:t>
+      </w:r>
+      <w:r>
+        <w:t xml:space="preserve"> </w:t>
+      </w:r>
+      <w:r>
+        <w:t xml:space="preserve">To further demonstrate our model’s capacity to predict multivalent binding activity, we fit our model to previous experimental measurements wherein fluorescently labeled nanorings were assembled with specific numbers of binding units.</w:t>
       </w:r>
       <w:hyperlink w:anchor="ref-u2Cb0DBq">
         <w:r>

</xml_diff>

<commit_message>
Deploying to gh-pages from  @ 806a0ae8f55419860811a4fa8870acdd767b0675 🚀
</commit_message>
<xml_diff>
--- a/manuscript.docx
+++ b/manuscript.docx
@@ -3663,13 +3663,15 @@
       <w:r>
         <w:t xml:space="preserve">Previous work has shown that our multivalent binding can accurately predict the complicated binding process between IgG antibodies and Fcγ receptors.</w:t>
       </w:r>
-      <w:r>
-        <w:rPr>
-          <w:b/>
-          <w:vertAlign w:val="superscript"/>
-        </w:rPr>
-        <w:t xml:space="preserve">???</w:t>
-      </w:r>
+      <w:hyperlink w:anchor="ref-11gk5tUo7">
+        <w:r>
+          <w:rPr>
+            <w:rStyle w:val="Hyperlink"/>
+            <w:vertAlign w:val="superscript"/>
+          </w:rPr>
+          <w:t xml:space="preserve">17</w:t>
+        </w:r>
+      </w:hyperlink>
       <w:r>
         <w:t xml:space="preserve"> </w:t>
       </w:r>
@@ -3682,7 +3684,7 @@
             <w:rStyle w:val="Hyperlink"/>
             <w:vertAlign w:val="superscript"/>
           </w:rPr>
-          <w:t xml:space="preserve">17</w:t>
+          <w:t xml:space="preserve">18</w:t>
         </w:r>
       </w:hyperlink>
       <w:r>
@@ -3734,7 +3736,7 @@
             <w:rStyle w:val="Hyperlink"/>
             <w:vertAlign w:val="superscript"/>
           </w:rPr>
-          <w:t xml:space="preserve">17</w:t>
+          <w:t xml:space="preserve">18</w:t>
         </w:r>
       </w:hyperlink>
       <w:r>
@@ -5435,7 +5437,7 @@
             <w:rStyle w:val="Hyperlink"/>
             <w:vertAlign w:val="superscript"/>
           </w:rPr>
-          <w:t xml:space="preserve">18</w:t>
+          <w:t xml:space="preserve">19</w:t>
         </w:r>
       </w:hyperlink>
       <w:r>
@@ -5450,7 +5452,7 @@
             <w:rStyle w:val="Hyperlink"/>
             <w:vertAlign w:val="superscript"/>
           </w:rPr>
-          <w:t xml:space="preserve">19</w:t>
+          <w:t xml:space="preserve">20</w:t>
         </w:r>
       </w:hyperlink>
       <w:r>
@@ -5729,13 +5731,13 @@
       <w:r>
         <w:t xml:space="preserve">d). However, even in these cases, the magnitude of selectivity enhancement is modest. Finally, although we only consider the amount of binding, ligands can have non-overlapping signaling effects even with identical amounts of binding. In these cases, the effect of combinations can be distinct from either individual ligand.</w:t>
       </w:r>
-      <w:hyperlink w:anchor="ref-8lU1hNlA">
+      <w:hyperlink w:anchor="ref-11gk5tUo7">
         <w:r>
           <w:rPr>
             <w:rStyle w:val="Hyperlink"/>
             <w:vertAlign w:val="superscript"/>
           </w:rPr>
-          <w:t xml:space="preserve">20</w:t>
+          <w:t xml:space="preserve">17</w:t>
         </w:r>
       </w:hyperlink>
       <w:r>
@@ -5744,7 +5746,7 @@
         </w:rPr>
         <w:t xml:space="preserve">,</w:t>
       </w:r>
-      <w:hyperlink w:anchor="ref-11gk5tUo7">
+      <w:hyperlink w:anchor="ref-8lU1hNlA">
         <w:r>
           <w:rPr>
             <w:rStyle w:val="Hyperlink"/>
@@ -11457,7 +11459,7 @@
             <w:rStyle w:val="Hyperlink"/>
             <w:vertAlign w:val="superscript"/>
           </w:rPr>
-          <w:t xml:space="preserve">17</w:t>
+          <w:t xml:space="preserve">18</w:t>
         </w:r>
       </w:hyperlink>
       <w:r>
@@ -11699,7 +11701,7 @@
             <w:rStyle w:val="Hyperlink"/>
             <w:vertAlign w:val="superscript"/>
           </w:rPr>
-          <w:t xml:space="preserve">21</w:t>
+          <w:t xml:space="preserve">17</w:t>
         </w:r>
       </w:hyperlink>
       <w:r>
@@ -15295,7 +15297,7 @@
             <w:rStyle w:val="Hyperlink"/>
             <w:vertAlign w:val="superscript"/>
           </w:rPr>
-          <w:t xml:space="preserve">17</w:t>
+          <w:t xml:space="preserve">18</w:t>
         </w:r>
       </w:hyperlink>
       <w:r>
@@ -16705,13 +16707,13 @@
       </w:r>
     </w:p>
     <w:bookmarkEnd w:id="76"/>
-    <w:bookmarkStart w:id="77" w:name="ref-u2Cb0DBq"/>
+    <w:bookmarkStart w:id="77" w:name="ref-11gk5tUo7"/>
     <w:p>
       <w:pPr>
         <w:pStyle w:val="Bibliography"/>
       </w:pPr>
       <w:r>
-        <w:t xml:space="preserve">17. Csizmar, C. M.</w:t>
+        <w:t xml:space="preserve">17. Robinett, R. A.</w:t>
       </w:r>
       <w:r>
         <w:t xml:space="preserve"> </w:t>
@@ -16726,6 +16728,52 @@
         <w:t xml:space="preserve"> </w:t>
       </w:r>
       <w:r>
+        <w:t xml:space="preserve">Dissecting FcγR Regulation through a Multivalent Binding Model.</w:t>
+      </w:r>
+      <w:r>
+        <w:t xml:space="preserve"> </w:t>
+      </w:r>
+      <w:r>
+        <w:rPr>
+          <w:i/>
+        </w:rPr>
+        <w:t xml:space="preserve">Cell systems</w:t>
+      </w:r>
+      <w:r>
+        <w:t xml:space="preserve"> </w:t>
+      </w:r>
+      <w:r>
+        <w:rPr>
+          <w:b/>
+        </w:rPr>
+        <w:t xml:space="preserve">7</w:t>
+      </w:r>
+      <w:r>
+        <w:t xml:space="preserve">, 41–48.e5 (2018).</w:t>
+      </w:r>
+    </w:p>
+    <w:bookmarkEnd w:id="77"/>
+    <w:bookmarkStart w:id="78" w:name="ref-u2Cb0DBq"/>
+    <w:p>
+      <w:pPr>
+        <w:pStyle w:val="Bibliography"/>
+      </w:pPr>
+      <w:r>
+        <w:t xml:space="preserve">18. Csizmar, C. M.</w:t>
+      </w:r>
+      <w:r>
+        <w:t xml:space="preserve"> </w:t>
+      </w:r>
+      <w:r>
+        <w:rPr>
+          <w:i/>
+        </w:rPr>
+        <w:t xml:space="preserve">et al.</w:t>
+      </w:r>
+      <w:r>
+        <w:t xml:space="preserve"> </w:t>
+      </w:r>
+      <w:r>
         <w:t xml:space="preserve">Multivalent Ligand Binding to Cell Membrane Antigens: Defining the Interplay of Affinity, Valency, and Expression Density.</w:t>
       </w:r>
       <w:r>
@@ -16750,14 +16798,14 @@
         <w:t xml:space="preserve">, 251–261 (2018).</w:t>
       </w:r>
     </w:p>
-    <w:bookmarkEnd w:id="77"/>
-    <w:bookmarkStart w:id="78" w:name="ref-luDqQ0zL"/>
+    <w:bookmarkEnd w:id="78"/>
+    <w:bookmarkStart w:id="79" w:name="ref-luDqQ0zL"/>
     <w:p>
       <w:pPr>
         <w:pStyle w:val="Bibliography"/>
       </w:pPr>
       <w:r>
-        <w:t xml:space="preserve">18. Lehár, J.</w:t>
+        <w:t xml:space="preserve">19. Lehár, J.</w:t>
       </w:r>
       <w:r>
         <w:t xml:space="preserve"> </w:t>
@@ -16796,14 +16844,14 @@
         <w:t xml:space="preserve">, 659–666 (2009).</w:t>
       </w:r>
     </w:p>
-    <w:bookmarkEnd w:id="78"/>
-    <w:bookmarkStart w:id="79" w:name="ref-eR2h4yr3"/>
+    <w:bookmarkEnd w:id="79"/>
+    <w:bookmarkStart w:id="80" w:name="ref-eR2h4yr3"/>
     <w:p>
       <w:pPr>
         <w:pStyle w:val="Bibliography"/>
       </w:pPr>
       <w:r>
-        <w:t xml:space="preserve">19. Olivova, P., Chen, W., Chakraborty, A. B. &amp; Gebler, J. C. Determination of N-glycosylation sites and site heterogeneity in a monoclonal antibody by electrospray quadrupole ion-mobility time-of-flight mass spectrometry.</w:t>
+        <w:t xml:space="preserve">20. Olivova, P., Chen, W., Chakraborty, A. B. &amp; Gebler, J. C. Determination of N-glycosylation sites and site heterogeneity in a monoclonal antibody by electrospray quadrupole ion-mobility time-of-flight mass spectrometry.</w:t>
       </w:r>
       <w:r>
         <w:t xml:space="preserve"> </w:t>
@@ -16827,14 +16875,14 @@
         <w:t xml:space="preserve">, 29–40 (2008).</w:t>
       </w:r>
     </w:p>
-    <w:bookmarkEnd w:id="79"/>
-    <w:bookmarkStart w:id="80" w:name="ref-8lU1hNlA"/>
+    <w:bookmarkEnd w:id="80"/>
+    <w:bookmarkStart w:id="81" w:name="ref-8lU1hNlA"/>
     <w:p>
       <w:pPr>
         <w:pStyle w:val="Bibliography"/>
       </w:pPr>
       <w:r>
-        <w:t xml:space="preserve">20. Antebi, Y. E.</w:t>
+        <w:t xml:space="preserve">21. Antebi, Y. E.</w:t>
       </w:r>
       <w:r>
         <w:t xml:space="preserve"> </w:t>
@@ -16871,52 +16919,6 @@
       </w:r>
       <w:r>
         <w:t xml:space="preserve">, 1184–1196.e24 (2017).</w:t>
-      </w:r>
-    </w:p>
-    <w:bookmarkEnd w:id="80"/>
-    <w:bookmarkStart w:id="81" w:name="ref-11gk5tUo7"/>
-    <w:p>
-      <w:pPr>
-        <w:pStyle w:val="Bibliography"/>
-      </w:pPr>
-      <w:r>
-        <w:t xml:space="preserve">21. Robinett, R. A.</w:t>
-      </w:r>
-      <w:r>
-        <w:t xml:space="preserve"> </w:t>
-      </w:r>
-      <w:r>
-        <w:rPr>
-          <w:i/>
-        </w:rPr>
-        <w:t xml:space="preserve">et al.</w:t>
-      </w:r>
-      <w:r>
-        <w:t xml:space="preserve"> </w:t>
-      </w:r>
-      <w:r>
-        <w:t xml:space="preserve">Dissecting FcγR Regulation through a Multivalent Binding Model.</w:t>
-      </w:r>
-      <w:r>
-        <w:t xml:space="preserve"> </w:t>
-      </w:r>
-      <w:r>
-        <w:rPr>
-          <w:i/>
-        </w:rPr>
-        <w:t xml:space="preserve">Cell systems</w:t>
-      </w:r>
-      <w:r>
-        <w:t xml:space="preserve"> </w:t>
-      </w:r>
-      <w:r>
-        <w:rPr>
-          <w:b/>
-        </w:rPr>
-        <w:t xml:space="preserve">7</w:t>
-      </w:r>
-      <w:r>
-        <w:t xml:space="preserve">, 41–48.e5 (2018).</w:t>
       </w:r>
     </w:p>
     <w:bookmarkEnd w:id="81"/>

</xml_diff>

<commit_message>
Deploying to gh-pages from  @ 27cd32606df9c3d2b7d0596150bbe8413e3b6704 🚀
</commit_message>
<xml_diff>
--- a/manuscript.docx
+++ b/manuscript.docx
@@ -78,7 +78,7 @@
         <w:t xml:space="preserve"> </w:t>
       </w:r>
       <w:r>
-        <w:t xml:space="preserve">was automatically generated on October 6, 2020.</w:t>
+        <w:t xml:space="preserve">was automatically generated on October 7, 2020.</w:t>
       </w:r>
       <w:r>
         <w:t xml:space="preserve"> </w:t>
@@ -10377,7 +10377,7 @@
         </w:r>
       </w:hyperlink>
       <w:r>
-        <w:t xml:space="preserve">). The selectivity toward</w:t>
+        <w:t xml:space="preserve">). We found that combinations of monovalent agonistic ligands and multivalent antagonistic ligands were able to uniquely target populations expressing small or intermediate amounts of receptors, which is demonstrated when comparing ligand binding ratios between</w:t>
       </w:r>
       <w:r>
         <w:t xml:space="preserve"> </w:t>
@@ -10419,22 +10419,70 @@
           </m:sub>
           <m:sup>
             <m:r>
-              <m:t>m</m:t>
-            </m:r>
-            <m:r>
-              <m:t>e</m:t>
-            </m:r>
-            <m:r>
-              <m:t>d</m:t>
-            </m:r>
-          </m:sup>
-        </m:sSubSup>
-      </m:oMath>
-      <w:r>
-        <w:t xml:space="preserve"> </w:t>
-      </w:r>
-      <w:r>
-        <w:t xml:space="preserve">was improved by combining the therapeutic with a tetravalent antagonist with similar affinities for receptor one and two (Fig.</w:t>
+              <m:t>l</m:t>
+            </m:r>
+            <m:r>
+              <m:t>o</m:t>
+            </m:r>
+          </m:sup>
+        </m:sSubSup>
+      </m:oMath>
+      <w:r>
+        <w:t xml:space="preserve"> </w:t>
+      </w:r>
+      <w:r>
+        <w:t xml:space="preserve">to</w:t>
+      </w:r>
+      <w:r>
+        <w:t xml:space="preserve"> </w:t>
+      </w:r>
+      <m:oMath>
+        <m:sSubSup>
+          <m:e>
+            <m:r>
+              <m:t>R</m:t>
+            </m:r>
+          </m:e>
+          <m:sub>
+            <m:r>
+              <m:t>1</m:t>
+            </m:r>
+          </m:sub>
+          <m:sup>
+            <m:r>
+              <m:t>h</m:t>
+            </m:r>
+            <m:r>
+              <m:t>i</m:t>
+            </m:r>
+          </m:sup>
+        </m:sSubSup>
+        <m:sSubSup>
+          <m:e>
+            <m:r>
+              <m:t>R</m:t>
+            </m:r>
+          </m:e>
+          <m:sub>
+            <m:r>
+              <m:t>2</m:t>
+            </m:r>
+          </m:sub>
+          <m:sup>
+            <m:r>
+              <m:t>l</m:t>
+            </m:r>
+            <m:r>
+              <m:t>o</m:t>
+            </m:r>
+          </m:sup>
+        </m:sSubSup>
+      </m:oMath>
+      <w:r>
+        <w:t xml:space="preserve"> </w:t>
+      </w:r>
+      <w:r>
+        <w:t xml:space="preserve">(Fig.</w:t>
       </w:r>
       <w:r>
         <w:t xml:space="preserve"> </w:t>
@@ -10448,7 +10496,7 @@
         </w:r>
       </w:hyperlink>
       <w:r>
-        <w:t xml:space="preserve">a). The mechanism which is responsible for this, and which allows for combinations of monovalent agonistic ligands and multivalent antagonistic ligands to uniquely target populations expressing small or intermediate amounts of receptors is demonstrated when comparing ligand binding ratios between</w:t>
+        <w:t xml:space="preserve">a). Here, a nearly tenfold increase in selectivity can be granted to monovalent agonists when combined with a tetravalent antagonist. In this case, there are greater quantities of agonist bound to</w:t>
       </w:r>
       <w:r>
         <w:t xml:space="preserve"> </w:t>
@@ -10502,7 +10550,7 @@
         <w:t xml:space="preserve"> </w:t>
       </w:r>
       <w:r>
-        <w:t xml:space="preserve">to</w:t>
+        <w:t xml:space="preserve">than</w:t>
       </w:r>
       <w:r>
         <w:t xml:space="preserve"> </w:t>
@@ -10567,7 +10615,7 @@
         </w:r>
       </w:hyperlink>
       <w:r>
-        <w:t xml:space="preserve">e). Here, a nearly tenfold increase in selectivity can be granted to monovalent agonists when combined with a tetravalent antagonist. In this case, there are greater quantities of agonist bound to</w:t>
+        <w:t xml:space="preserve">b). This is striking, as</w:t>
       </w:r>
       <w:r>
         <w:t xml:space="preserve"> </w:t>
@@ -10621,7 +10669,7 @@
         <w:t xml:space="preserve"> </w:t>
       </w:r>
       <w:r>
-        <w:t xml:space="preserve">than</w:t>
+        <w:t xml:space="preserve">expresses either as many or fewer abundances of receptors one and two when compared to</w:t>
       </w:r>
       <w:r>
         <w:t xml:space="preserve"> </w:t>
@@ -10669,10 +10717,7 @@
         </m:sSubSup>
       </m:oMath>
       <w:r>
-        <w:t xml:space="preserve"> </w:t>
-      </w:r>
-      <w:r>
-        <w:t xml:space="preserve">(Fig.</w:t>
+        <w:t xml:space="preserve">. This phenomenon, which could not be achieved without multivalent antagonists, occurs due to the preferential binding of multivalent antagonists to populations expressing higher abundances of receptors (Fig.</w:t>
       </w:r>
       <w:r>
         <w:t xml:space="preserve"> </w:t>
@@ -10686,123 +10731,7 @@
         </w:r>
       </w:hyperlink>
       <w:r>
-        <w:t xml:space="preserve">f). This is striking, as</w:t>
-      </w:r>
-      <w:r>
-        <w:t xml:space="preserve"> </w:t>
-      </w:r>
-      <m:oMath>
-        <m:sSubSup>
-          <m:e>
-            <m:r>
-              <m:t>R</m:t>
-            </m:r>
-          </m:e>
-          <m:sub>
-            <m:r>
-              <m:t>1</m:t>
-            </m:r>
-          </m:sub>
-          <m:sup>
-            <m:r>
-              <m:t>m</m:t>
-            </m:r>
-            <m:r>
-              <m:t>e</m:t>
-            </m:r>
-            <m:r>
-              <m:t>d</m:t>
-            </m:r>
-          </m:sup>
-        </m:sSubSup>
-        <m:sSubSup>
-          <m:e>
-            <m:r>
-              <m:t>R</m:t>
-            </m:r>
-          </m:e>
-          <m:sub>
-            <m:r>
-              <m:t>2</m:t>
-            </m:r>
-          </m:sub>
-          <m:sup>
-            <m:r>
-              <m:t>l</m:t>
-            </m:r>
-            <m:r>
-              <m:t>o</m:t>
-            </m:r>
-          </m:sup>
-        </m:sSubSup>
-      </m:oMath>
-      <w:r>
-        <w:t xml:space="preserve"> </w:t>
-      </w:r>
-      <w:r>
-        <w:t xml:space="preserve">expresses either as many or fewer abundances of receptors one and two when compared to</w:t>
-      </w:r>
-      <w:r>
-        <w:t xml:space="preserve"> </w:t>
-      </w:r>
-      <m:oMath>
-        <m:sSubSup>
-          <m:e>
-            <m:r>
-              <m:t>R</m:t>
-            </m:r>
-          </m:e>
-          <m:sub>
-            <m:r>
-              <m:t>1</m:t>
-            </m:r>
-          </m:sub>
-          <m:sup>
-            <m:r>
-              <m:t>h</m:t>
-            </m:r>
-            <m:r>
-              <m:t>i</m:t>
-            </m:r>
-          </m:sup>
-        </m:sSubSup>
-        <m:sSubSup>
-          <m:e>
-            <m:r>
-              <m:t>R</m:t>
-            </m:r>
-          </m:e>
-          <m:sub>
-            <m:r>
-              <m:t>2</m:t>
-            </m:r>
-          </m:sub>
-          <m:sup>
-            <m:r>
-              <m:t>l</m:t>
-            </m:r>
-            <m:r>
-              <m:t>o</m:t>
-            </m:r>
-          </m:sup>
-        </m:sSubSup>
-      </m:oMath>
-      <w:r>
-        <w:t xml:space="preserve">. This phenomenon, which could not be achieved without multivalent antagonists, occurs due to the preferential binding of multivalent antagonists to populations expressing higher abundances of receptors (Fig.</w:t>
-      </w:r>
-      <w:r>
-        <w:t xml:space="preserve"> </w:t>
-      </w:r>
-      <w:hyperlink w:anchor="fig:deadLig">
-        <w:r>
-          <w:rPr>
-            <w:rStyle w:val="Hyperlink"/>
-          </w:rPr>
-          <w:t xml:space="preserve">7</w:t>
-        </w:r>
-      </w:hyperlink>
-      <w:r>
-        <w:t xml:space="preserve">c,g). Thus, in cases where previously discussed ligand engineering strategies and approaches fail to achieve selective binding to cells expressing smaller or similar amounts of receptors to off-target populations, combinations of agonistic and antagonistic ligands may provide unique benefits.</w:t>
+        <w:t xml:space="preserve">c). Thus, in cases where previously discussed ligand engineering strategies and approaches fail to achieve selective binding to cells expressing smaller or similar amounts of receptors to off-target populations, combinations of agonistic and antagonistic ligands may provide unique benefits.</w:t>
       </w:r>
     </w:p>
     <w:bookmarkStart w:id="0" w:name="fig:deadLig"/>
@@ -10865,7 +10794,7 @@
         </m:r>
       </m:oMath>
       <w:r>
-        <w:t xml:space="preserve">. a,e) Selectivity for</w:t>
+        <w:t xml:space="preserve">. a) Selectivity for</w:t>
       </w:r>
       <w:r>
         <w:t xml:space="preserve"> </w:t>
@@ -10907,22 +10836,19 @@
           </m:sub>
           <m:sup>
             <m:r>
-              <m:t>m</m:t>
-            </m:r>
-            <m:r>
-              <m:t>e</m:t>
-            </m:r>
-            <m:r>
-              <m:t>d</m:t>
-            </m:r>
-          </m:sup>
-        </m:sSubSup>
-      </m:oMath>
-      <w:r>
-        <w:t xml:space="preserve"> </w:t>
-      </w:r>
-      <w:r>
-        <w:t xml:space="preserve">against all other populations (a), and</w:t>
+              <m:t>l</m:t>
+            </m:r>
+            <m:r>
+              <m:t>o</m:t>
+            </m:r>
+          </m:sup>
+        </m:sSubSup>
+      </m:oMath>
+      <w:r>
+        <w:t xml:space="preserve"> </w:t>
+      </w:r>
+      <w:r>
+        <w:t xml:space="preserve">against</w:t>
       </w:r>
       <w:r>
         <w:t xml:space="preserve"> </w:t>
@@ -10941,13 +10867,10 @@
           </m:sub>
           <m:sup>
             <m:r>
-              <m:t>m</m:t>
-            </m:r>
-            <m:r>
-              <m:t>e</m:t>
-            </m:r>
-            <m:r>
-              <m:t>d</m:t>
+              <m:t>h</m:t>
+            </m:r>
+            <m:r>
+              <m:t>i</m:t>
             </m:r>
           </m:sup>
         </m:sSubSup>
@@ -10976,58 +10899,7 @@
         <w:t xml:space="preserve"> </w:t>
       </w:r>
       <w:r>
-        <w:t xml:space="preserve">against</w:t>
-      </w:r>
-      <w:r>
-        <w:t xml:space="preserve"> </w:t>
-      </w:r>
-      <m:oMath>
-        <m:sSubSup>
-          <m:e>
-            <m:r>
-              <m:t>R</m:t>
-            </m:r>
-          </m:e>
-          <m:sub>
-            <m:r>
-              <m:t>1</m:t>
-            </m:r>
-          </m:sub>
-          <m:sup>
-            <m:r>
-              <m:t>h</m:t>
-            </m:r>
-            <m:r>
-              <m:t>i</m:t>
-            </m:r>
-          </m:sup>
-        </m:sSubSup>
-        <m:sSubSup>
-          <m:e>
-            <m:r>
-              <m:t>R</m:t>
-            </m:r>
-          </m:e>
-          <m:sub>
-            <m:r>
-              <m:t>2</m:t>
-            </m:r>
-          </m:sub>
-          <m:sup>
-            <m:r>
-              <m:t>l</m:t>
-            </m:r>
-            <m:r>
-              <m:t>o</m:t>
-            </m:r>
-          </m:sup>
-        </m:sSubSup>
-      </m:oMath>
-      <w:r>
-        <w:t xml:space="preserve"> </w:t>
-      </w:r>
-      <w:r>
-        <w:t xml:space="preserve">(e) when exposed to a tetravalent</w:t>
+        <w:t xml:space="preserve">when exposed to a tetravalent</w:t>
       </w:r>
       <w:r>
         <w:t xml:space="preserve"> </w:t>
@@ -11045,7 +10917,7 @@
         <w:t xml:space="preserve"> </w:t>
       </w:r>
       <w:r>
-        <w:t xml:space="preserve">antagonist with varying affinities for receptors 1 and 2, and a monovalent therapeutic receptor agonists with affinities optimized for selectivity. Heatmap values are normalized to specificity imparted with non-binding antagonists. Only amount of agonist bound is considered in determination of selectivity. b-d,f-h) Heatmap of agonist (b,f), and antagonist (c,g) ligand bound for antagonist and agonist ligand combination shown to imaprt greatest selectivity improvement in (a). d,h) Heatmap of agonist bound in b,c (d) and f,g (h) when no antagonist is present.</w:t>
+        <w:t xml:space="preserve">antagonist with varying affinities for receptors 1 and 2, and a monovalent therapeutic receptor agonists with affinities optimized for selectivity. Heatmap values are normalized to specificity imparted with non-binding antagonists. Only amount of agonist bound is considered in determination of selectivity. b-d) Heatmap of agonist (b), and antagonist (c) ligand bound for antagonist and agonist ligand combination shown to imaprt greatest selectivity improvement in (a). d) Heatmap of agonist bound in b,c when no antagonist is present.</w:t>
       </w:r>
       <w:bookmarkEnd w:id="45"/>
     </w:p>
@@ -11107,7 +10979,7 @@
         </m:r>
       </m:oMath>
       <w:r>
-        <w:t xml:space="preserve">. a,e) Selectivity for</w:t>
+        <w:t xml:space="preserve">. a) Selectivity for</w:t>
       </w:r>
       <w:r>
         <w:t xml:space="preserve"> </w:t>
@@ -11149,22 +11021,19 @@
           </m:sub>
           <m:sup>
             <m:r>
-              <m:t>m</m:t>
-            </m:r>
-            <m:r>
-              <m:t>e</m:t>
-            </m:r>
-            <m:r>
-              <m:t>d</m:t>
-            </m:r>
-          </m:sup>
-        </m:sSubSup>
-      </m:oMath>
-      <w:r>
-        <w:t xml:space="preserve"> </w:t>
-      </w:r>
-      <w:r>
-        <w:t xml:space="preserve">against all other populations (a), and</w:t>
+              <m:t>l</m:t>
+            </m:r>
+            <m:r>
+              <m:t>o</m:t>
+            </m:r>
+          </m:sup>
+        </m:sSubSup>
+      </m:oMath>
+      <w:r>
+        <w:t xml:space="preserve"> </w:t>
+      </w:r>
+      <w:r>
+        <w:t xml:space="preserve">against</w:t>
       </w:r>
       <w:r>
         <w:t xml:space="preserve"> </w:t>
@@ -11183,13 +11052,10 @@
           </m:sub>
           <m:sup>
             <m:r>
-              <m:t>m</m:t>
-            </m:r>
-            <m:r>
-              <m:t>e</m:t>
-            </m:r>
-            <m:r>
-              <m:t>d</m:t>
+              <m:t>h</m:t>
+            </m:r>
+            <m:r>
+              <m:t>i</m:t>
             </m:r>
           </m:sup>
         </m:sSubSup>
@@ -11218,58 +11084,7 @@
         <w:t xml:space="preserve"> </w:t>
       </w:r>
       <w:r>
-        <w:t xml:space="preserve">against</w:t>
-      </w:r>
-      <w:r>
-        <w:t xml:space="preserve"> </w:t>
-      </w:r>
-      <m:oMath>
-        <m:sSubSup>
-          <m:e>
-            <m:r>
-              <m:t>R</m:t>
-            </m:r>
-          </m:e>
-          <m:sub>
-            <m:r>
-              <m:t>1</m:t>
-            </m:r>
-          </m:sub>
-          <m:sup>
-            <m:r>
-              <m:t>h</m:t>
-            </m:r>
-            <m:r>
-              <m:t>i</m:t>
-            </m:r>
-          </m:sup>
-        </m:sSubSup>
-        <m:sSubSup>
-          <m:e>
-            <m:r>
-              <m:t>R</m:t>
-            </m:r>
-          </m:e>
-          <m:sub>
-            <m:r>
-              <m:t>2</m:t>
-            </m:r>
-          </m:sub>
-          <m:sup>
-            <m:r>
-              <m:t>l</m:t>
-            </m:r>
-            <m:r>
-              <m:t>o</m:t>
-            </m:r>
-          </m:sup>
-        </m:sSubSup>
-      </m:oMath>
-      <w:r>
-        <w:t xml:space="preserve"> </w:t>
-      </w:r>
-      <w:r>
-        <w:t xml:space="preserve">(e) when exposed to a tetravalent</w:t>
+        <w:t xml:space="preserve">when exposed to a tetravalent</w:t>
       </w:r>
       <w:r>
         <w:t xml:space="preserve"> </w:t>
@@ -11287,7 +11102,7 @@
         <w:t xml:space="preserve"> </w:t>
       </w:r>
       <w:r>
-        <w:t xml:space="preserve">antagonist with varying affinities for receptors 1 and 2, and a monovalent therapeutic receptor agonists with affinities optimized for selectivity. Heatmap values are normalized to specificity imparted with non-binding antagonists. Only amount of agonist bound is considered in determination of selectivity. b-d,f-h) Heatmap of agonist (b,f), and antagonist (c,g) ligand bound for antagonist and agonist ligand combination shown to imaprt greatest selectivity improvement in (a). d,h) Heatmap of agonist bound in b,c (d) and f,g (h) when no antagonist is present.</w:t>
+        <w:t xml:space="preserve">antagonist with varying affinities for receptors 1 and 2, and a monovalent therapeutic receptor agonists with affinities optimized for selectivity. Heatmap values are normalized to specificity imparted with non-binding antagonists. Only amount of agonist bound is considered in determination of selectivity. b-d) Heatmap of agonist (b), and antagonist (c) ligand bound for antagonist and agonist ligand combination shown to imaprt greatest selectivity improvement in (a). d) Heatmap of agonist bound in b,c when no antagonist is present.</w:t>
       </w:r>
     </w:p>
     <w:bookmarkEnd w:id="0"/>

</xml_diff>

<commit_message>
Deploying to gh-pages from  @ 08207fd85ce543acc8a22a7a060d4ddab4a6872c 🚀
</commit_message>
<xml_diff>
--- a/manuscript.docx
+++ b/manuscript.docx
@@ -78,7 +78,7 @@
         <w:t xml:space="preserve"> </w:t>
       </w:r>
       <w:r>
-        <w:t xml:space="preserve">was automatically generated on October 7, 2020.</w:t>
+        <w:t xml:space="preserve">was automatically generated on October 8, 2020.</w:t>
       </w:r>
       <w:r>
         <w:t xml:space="preserve"> </w:t>
@@ -7325,7 +7325,7 @@
         <w:pStyle w:val="FirstParagraph"/>
       </w:pPr>
       <w:r>
-        <w:t xml:space="preserve">Constructing multispecific drug has become a promising new strategy for finer target cell specificity with the advancement of engineering techniques.</w:t>
+        <w:t xml:space="preserve">Constructing multispecific drugs has become a promising new strategy for finer target cell specificity with the advancement of engineering techniques.</w:t>
       </w:r>
       <w:hyperlink w:anchor="ref-iG3t9Py2">
         <w:r>
@@ -7340,7 +7340,7 @@
         <w:t xml:space="preserve"> </w:t>
       </w:r>
       <w:r>
-        <w:t xml:space="preserve">Here, we use the bispecific ligand as an exemplar to dissect its advantages. Heterovalency is comparable to the two aforementioned strategies: it includes two distinct ligand monomers, similar to a 50%-50% mixture strategy, but these two subunits are tethered together; alternatively, it is also analogous to having a mixture of bivalent ligands. We applied the binding model to these cases with the same set of parameters and compared them in line to identify the unique advantage of heterovalency. These two monomers must have different binding profiles, otherwise it will be identical to the homogeneous bivalent case.</w:t>
+        <w:t xml:space="preserve">However, the number of possible configurations of multispecific drugs is combinatorially large and impossible to enumerate. Here, we use the heterovalent bispecific ligand as an exemplar to explore the unique benefit of multispecificity distinct from any strategy analyzed before. We compared bispecificity to two aforementioned strategies: a 50%-50% mixture of two monovalent ligands, and a 50%-50% mixture of two different homogeneous bivalent ligands. These two strategies both have some similarities to bispecific therapeutics. A bispecific ligand contains two different ligand monomers with equal proportion, similar to a 50%-50% monovalent mixture. By comparing bispecific to a 50%-50% monovalent mixture, we can elucidate the extra benefit of tethering these two monomers into one complex. A bispecific ligand is also by nature bivalent, and by comparing it to homogeneous bivalent drugs, we can understand how having two different subunits in the same complex modify the behavior of a drug. Together, we sought to identify the unique advantage of heterovalency.</w:t>
       </w:r>
     </w:p>
     <w:p>
@@ -7348,7 +7348,7 @@
         <w:pStyle w:val="BodyText"/>
       </w:pPr>
       <w:r>
-        <w:t xml:space="preserve">The amount of bispecific ligand bound in general is plotted in Figure</w:t>
+        <w:t xml:space="preserve">We first applied the binding model to predict the amount of ligand bound in bispecific drugs (Fig</w:t>
       </w:r>
       <w:r>
         <w:t xml:space="preserve"> </w:t>
@@ -7365,7 +7365,7 @@
         <w:t xml:space="preserve"> </w:t>
       </w:r>
       <w:r>
-        <w:t xml:space="preserve">a, while the ligand-bound of a 50%-50% mix of monovalent ligands in Figure</w:t>
+        <w:t xml:space="preserve">a), a 50%-50% mixture of two monomers (Fig</w:t>
       </w:r>
       <w:r>
         <w:t xml:space="preserve"> </w:t>
@@ -7382,7 +7382,7 @@
         <w:t xml:space="preserve"> </w:t>
       </w:r>
       <w:r>
-        <w:t xml:space="preserve">b and 50%-50% mix of bivalent ligands in Figure</w:t>
+        <w:t xml:space="preserve">b), and a 50%-50% mixture of two different homogeneous bivalents (Fig</w:t>
       </w:r>
       <w:r>
         <w:t xml:space="preserve"> </w:t>
@@ -7399,35 +7399,7 @@
         <w:t xml:space="preserve"> </w:t>
       </w:r>
       <w:r>
-        <w:t xml:space="preserve">c. Given the same parameter, the ligand-bounds of these three cases are almost exactly the same, and bispecific doesn’t exhibit any merit. When</w:t>
-      </w:r>
-      <w:r>
-        <w:t xml:space="preserve"> </w:t>
-      </w:r>
-      <m:oMath>
-        <m:sSubSup>
-          <m:e>
-            <m:r>
-              <m:t>K</m:t>
-            </m:r>
-          </m:e>
-          <m:sub>
-            <m:r>
-              <m:t>x</m:t>
-            </m:r>
-          </m:sub>
-          <m:sup>
-            <m:r>
-              <m:t>*</m:t>
-            </m:r>
-          </m:sup>
-        </m:sSubSup>
-      </m:oMath>
-      <w:r>
-        <w:t xml:space="preserve"> </w:t>
-      </w:r>
-      <w:r>
-        <w:t xml:space="preserve">is relatively small, it is expected that most bindings are the initial docking of the ligand without subsequent binding. Nonetheless, in many heterovalent cases such as the bispecific antibody,</w:t>
+        <w:t xml:space="preserve">c), with the same set of parameters in ligand concentration and affinities. It turned out that the patterns of ligand bounds of these three cases are almost exactly the same, and bispecific doesn’t exhibit any merit. We then investigated if bispecific ligands that have to be activated with both of their subunits binding to a target display any special cell population selectivity characteristics. Bispecific ligands that require both subunits bound to be effective are common in the design of bispecific antibodies. To be specific, when the first antigen-binding region of a bispecific antibody docks at an antigen, it will only make a loose connection between the target and the antibody, unable to induce a strong immune response, and only when both antigen-binding regions bind to their target will this bispecific antibody be fully effective.</w:t>
       </w:r>
       <w:hyperlink w:anchor="ref-18yoQOgm4">
         <w:r>
@@ -7453,54 +7425,13 @@
           <w:t xml:space="preserve">24</w:t>
         </w:r>
       </w:hyperlink>
-      <w:r>
-        <w:t xml:space="preserve"> </w:t>
-      </w:r>
-      <w:r>
-        <w:t xml:space="preserve">the drug will not be fully effective unless both subunits bind to targets. To scrutinize this case, we extended our model to calculate the amount of ligand fully bound. The predictions made for bispecific fully bound (with</w:t>
-      </w:r>
-      <w:r>
-        <w:t xml:space="preserve"> </w:t>
-      </w:r>
-      <m:oMath>
-        <m:sSubSup>
-          <m:e>
-            <m:r>
-              <m:t>K</m:t>
-            </m:r>
-          </m:e>
-          <m:sub>
-            <m:r>
-              <m:t>x</m:t>
-            </m:r>
-          </m:sub>
-          <m:sup>
-            <m:r>
-              <m:t>*</m:t>
-            </m:r>
-          </m:sup>
-        </m:sSubSup>
-        <m:r>
-          <m:t>=</m:t>
-        </m:r>
-        <m:sSup>
-          <m:e>
-            <m:r>
-              <m:t>10</m:t>
-            </m:r>
-          </m:e>
-          <m:sup>
-            <m:r>
-              <m:t>−</m:t>
-            </m:r>
-            <m:r>
-              <m:t>12</m:t>
-            </m:r>
-          </m:sup>
-        </m:sSup>
-      </m:oMath>
-      <w:r>
-        <w:t xml:space="preserve">) plotted in Figure</w:t>
+    </w:p>
+    <w:p>
+      <w:pPr>
+        <w:pStyle w:val="BodyText"/>
+      </w:pPr>
+      <w:r>
+        <w:t xml:space="preserve">To scrutinize the case where the target binding of both subunits is required, we extended our model to calculate the amount of ligand fully bound. For the heterovalent bispecific case, ligand fully bound will only account the amount of ligand with both of their ligand monomers bind to a target. With the same set of parameters, the predictions made for bispecific fully bound show a very distinct pattern from general ligand bound (Fig</w:t>
       </w:r>
       <w:r>
         <w:t xml:space="preserve"> </w:t>
@@ -7517,7 +7448,112 @@
         <w:t xml:space="preserve"> </w:t>
       </w:r>
       <w:r>
-        <w:t xml:space="preserve">e show a different pattern than general ligand bound. Besides having a lower amount, fully bound ligand prefers double-positively expressed cells. This can be observed from the more concaved isoclines in Figure</w:t>
+        <w:t xml:space="preserve">e). Besides that ligand fully bound has lower amounts, the contour plot of fully bound bispecific ligands has more concaved contour lines. For example,</w:t>
+      </w:r>
+      <w:r>
+        <w:t xml:space="preserve"> </w:t>
+      </w:r>
+      <m:oMath>
+        <m:sSubSup>
+          <m:e>
+            <m:r>
+              <m:t>R</m:t>
+            </m:r>
+          </m:e>
+          <m:sub>
+            <m:r>
+              <m:t>1</m:t>
+            </m:r>
+          </m:sub>
+          <m:sup>
+            <m:r>
+              <m:t>h</m:t>
+            </m:r>
+            <m:r>
+              <m:t>i</m:t>
+            </m:r>
+          </m:sup>
+        </m:sSubSup>
+        <m:sSubSup>
+          <m:e>
+            <m:r>
+              <m:t>R</m:t>
+            </m:r>
+          </m:e>
+          <m:sub>
+            <m:r>
+              <m:t>2</m:t>
+            </m:r>
+          </m:sub>
+          <m:sup>
+            <m:r>
+              <m:t>h</m:t>
+            </m:r>
+            <m:r>
+              <m:t>i</m:t>
+            </m:r>
+          </m:sup>
+        </m:sSubSup>
+      </m:oMath>
+      <w:r>
+        <w:t xml:space="preserve"> </w:t>
+      </w:r>
+      <w:r>
+        <w:t xml:space="preserve">has about the same level of general ligand bound as</w:t>
+      </w:r>
+      <w:r>
+        <w:t xml:space="preserve"> </w:t>
+      </w:r>
+      <m:oMath>
+        <m:sSubSup>
+          <m:e>
+            <m:r>
+              <m:t>R</m:t>
+            </m:r>
+          </m:e>
+          <m:sub>
+            <m:r>
+              <m:t>1</m:t>
+            </m:r>
+          </m:sub>
+          <m:sup>
+            <m:r>
+              <m:t>h</m:t>
+            </m:r>
+            <m:r>
+              <m:t>i</m:t>
+            </m:r>
+          </m:sup>
+        </m:sSubSup>
+        <m:sSubSup>
+          <m:e>
+            <m:r>
+              <m:t>R</m:t>
+            </m:r>
+          </m:e>
+          <m:sub>
+            <m:r>
+              <m:t>2</m:t>
+            </m:r>
+          </m:sub>
+          <m:sup>
+            <m:r>
+              <m:t>m</m:t>
+            </m:r>
+            <m:r>
+              <m:t>e</m:t>
+            </m:r>
+            <m:r>
+              <m:t>d</m:t>
+            </m:r>
+          </m:sup>
+        </m:sSubSup>
+      </m:oMath>
+      <w:r>
+        <w:t xml:space="preserve"> </w:t>
+      </w:r>
+      <w:r>
+        <w:t xml:space="preserve">(Fig</w:t>
       </w:r>
       <w:r>
         <w:t xml:space="preserve"> </w:t>
@@ -7534,7 +7570,61 @@
         <w:t xml:space="preserve"> </w:t>
       </w:r>
       <w:r>
-        <w:t xml:space="preserve">e compare with Figure</w:t>
+        <w:t xml:space="preserve">a), but it has significantly more ligand fully bound than</w:t>
+      </w:r>
+      <w:r>
+        <w:t xml:space="preserve"> </w:t>
+      </w:r>
+      <m:oMath>
+        <m:sSubSup>
+          <m:e>
+            <m:r>
+              <m:t>R</m:t>
+            </m:r>
+          </m:e>
+          <m:sub>
+            <m:r>
+              <m:t>1</m:t>
+            </m:r>
+          </m:sub>
+          <m:sup>
+            <m:r>
+              <m:t>h</m:t>
+            </m:r>
+            <m:r>
+              <m:t>i</m:t>
+            </m:r>
+          </m:sup>
+        </m:sSubSup>
+        <m:sSubSup>
+          <m:e>
+            <m:r>
+              <m:t>R</m:t>
+            </m:r>
+          </m:e>
+          <m:sub>
+            <m:r>
+              <m:t>2</m:t>
+            </m:r>
+          </m:sub>
+          <m:sup>
+            <m:r>
+              <m:t>m</m:t>
+            </m:r>
+            <m:r>
+              <m:t>e</m:t>
+            </m:r>
+            <m:r>
+              <m:t>d</m:t>
+            </m:r>
+          </m:sup>
+        </m:sSubSup>
+      </m:oMath>
+      <w:r>
+        <w:t xml:space="preserve"> </w:t>
+      </w:r>
+      <w:r>
+        <w:t xml:space="preserve">(Fig</w:t>
       </w:r>
       <w:r>
         <w:t xml:space="preserve"> </w:t>
@@ -7551,7 +7641,132 @@
         <w:t xml:space="preserve"> </w:t>
       </w:r>
       <w:r>
-        <w:t xml:space="preserve">a: in Figure</w:t>
+        <w:t xml:space="preserve">e). This concavity of contour lines indicates that for bispecific complexes, ligand fully bound prefers double-positively expressed cells than singly-positively expressed cells. This should be obvious since these two subunits of the bispecific complex prefer different receptors. The results indicate that bispecific ligands will only exhibit special characteristics when it can only be activated fully bound. This characteristic opens up brand new engineering opportunities for targeting specific cell populations.</w:t>
+      </w:r>
+    </w:p>
+    <w:p>
+      <w:pPr>
+        <w:pStyle w:val="BodyText"/>
+      </w:pPr>
+      <w:r>
+        <w:t xml:space="preserve">The specific amount of fully bound ligands depends on the propensity of crosslinking, captured by</w:t>
+      </w:r>
+      <w:r>
+        <w:t xml:space="preserve"> </w:t>
+      </w:r>
+      <m:oMath>
+        <m:sSubSup>
+          <m:e>
+            <m:r>
+              <m:t>K</m:t>
+            </m:r>
+          </m:e>
+          <m:sub>
+            <m:r>
+              <m:t>x</m:t>
+            </m:r>
+          </m:sub>
+          <m:sup>
+            <m:r>
+              <m:t>*</m:t>
+            </m:r>
+          </m:sup>
+        </m:sSubSup>
+      </m:oMath>
+      <w:r>
+        <w:t xml:space="preserve">. We plotted the pattern of bispecific fully bound with</w:t>
+      </w:r>
+      <w:r>
+        <w:t xml:space="preserve"> </w:t>
+      </w:r>
+      <m:oMath>
+        <m:sSubSup>
+          <m:e>
+            <m:r>
+              <m:t>K</m:t>
+            </m:r>
+          </m:e>
+          <m:sub>
+            <m:r>
+              <m:t>x</m:t>
+            </m:r>
+          </m:sub>
+          <m:sup>
+            <m:r>
+              <m:t>*</m:t>
+            </m:r>
+          </m:sup>
+        </m:sSubSup>
+        <m:r>
+          <m:t>=</m:t>
+        </m:r>
+        <m:sSup>
+          <m:e>
+            <m:r>
+              <m:t>10</m:t>
+            </m:r>
+          </m:e>
+          <m:sup>
+            <m:r>
+              <m:t>−</m:t>
+            </m:r>
+            <m:r>
+              <m:t>10</m:t>
+            </m:r>
+          </m:sup>
+        </m:sSup>
+      </m:oMath>
+      <w:r>
+        <w:t xml:space="preserve">,</w:t>
+      </w:r>
+      <w:r>
+        <w:t xml:space="preserve"> </w:t>
+      </w:r>
+      <m:oMath>
+        <m:sSup>
+          <m:e>
+            <m:r>
+              <m:t>10</m:t>
+            </m:r>
+          </m:e>
+          <m:sup>
+            <m:r>
+              <m:t>−</m:t>
+            </m:r>
+            <m:r>
+              <m:t>12</m:t>
+            </m:r>
+          </m:sup>
+        </m:sSup>
+      </m:oMath>
+      <w:r>
+        <w:t xml:space="preserve">, and</w:t>
+      </w:r>
+      <w:r>
+        <w:t xml:space="preserve"> </w:t>
+      </w:r>
+      <m:oMath>
+        <m:sSup>
+          <m:e>
+            <m:r>
+              <m:t>10</m:t>
+            </m:r>
+          </m:e>
+          <m:sup>
+            <m:r>
+              <m:t>−</m:t>
+            </m:r>
+            <m:r>
+              <m:t>14</m:t>
+            </m:r>
+          </m:sup>
+        </m:sSup>
+      </m:oMath>
+      <w:r>
+        <w:t xml:space="preserve"> </w:t>
+      </w:r>
+      <w:r>
+        <w:t xml:space="preserve">(Fig.</w:t>
       </w:r>
       <w:r>
         <w:t xml:space="preserve"> </w:t>
@@ -7568,160 +7783,63 @@
         <w:t xml:space="preserve"> </w:t>
       </w:r>
       <w:r>
-        <w:t xml:space="preserve">e,</w:t>
-      </w:r>
-      <w:r>
-        <w:t xml:space="preserve"> </w:t>
-      </w:r>
-      <m:oMath>
-        <m:sSubSup>
-          <m:e>
-            <m:r>
-              <m:t>R</m:t>
-            </m:r>
-          </m:e>
-          <m:sub>
-            <m:r>
-              <m:t>1</m:t>
-            </m:r>
-          </m:sub>
-          <m:sup>
-            <m:r>
-              <m:t>l</m:t>
-            </m:r>
-            <m:r>
-              <m:t>o</m:t>
-            </m:r>
-          </m:sup>
-        </m:sSubSup>
-        <m:sSubSup>
-          <m:e>
-            <m:r>
-              <m:t>R</m:t>
-            </m:r>
-          </m:e>
-          <m:sub>
-            <m:r>
-              <m:t>2</m:t>
-            </m:r>
-          </m:sub>
-          <m:sup>
-            <m:r>
-              <m:t>h</m:t>
-            </m:r>
-            <m:r>
-              <m:t>i</m:t>
-            </m:r>
-          </m:sup>
-        </m:sSubSup>
-      </m:oMath>
-      <w:r>
-        <w:t xml:space="preserve">,</w:t>
-      </w:r>
-      <w:r>
-        <w:t xml:space="preserve"> </w:t>
-      </w:r>
-      <m:oMath>
-        <m:sSubSup>
-          <m:e>
-            <m:r>
-              <m:t>R</m:t>
-            </m:r>
-          </m:e>
-          <m:sub>
-            <m:r>
-              <m:t>1</m:t>
-            </m:r>
-          </m:sub>
-          <m:sup>
-            <m:r>
-              <m:t>m</m:t>
-            </m:r>
-            <m:r>
-              <m:t>e</m:t>
-            </m:r>
-            <m:r>
-              <m:t>d</m:t>
-            </m:r>
-          </m:sup>
-        </m:sSubSup>
-        <m:sSubSup>
-          <m:e>
-            <m:r>
-              <m:t>R</m:t>
-            </m:r>
-          </m:e>
-          <m:sub>
-            <m:r>
-              <m:t>2</m:t>
-            </m:r>
-          </m:sub>
-          <m:sup>
-            <m:r>
-              <m:t>m</m:t>
-            </m:r>
-            <m:r>
-              <m:t>e</m:t>
-            </m:r>
-            <m:r>
-              <m:t>d</m:t>
-            </m:r>
-          </m:sup>
-        </m:sSubSup>
-      </m:oMath>
-      <w:r>
-        <w:t xml:space="preserve">, and</w:t>
-      </w:r>
-      <w:r>
-        <w:t xml:space="preserve"> </w:t>
-      </w:r>
-      <m:oMath>
-        <m:sSubSup>
-          <m:e>
-            <m:r>
-              <m:t>R</m:t>
-            </m:r>
-          </m:e>
-          <m:sub>
-            <m:r>
-              <m:t>1</m:t>
-            </m:r>
-          </m:sub>
-          <m:sup>
-            <m:r>
-              <m:t>h</m:t>
-            </m:r>
-            <m:r>
-              <m:t>i</m:t>
-            </m:r>
-          </m:sup>
-        </m:sSubSup>
-        <m:sSubSup>
-          <m:e>
-            <m:r>
-              <m:t>R</m:t>
-            </m:r>
-          </m:e>
-          <m:sub>
-            <m:r>
-              <m:t>2</m:t>
-            </m:r>
-          </m:sub>
-          <m:sup>
-            <m:r>
-              <m:t>l</m:t>
-            </m:r>
-            <m:r>
-              <m:t>o</m:t>
-            </m:r>
-          </m:sup>
-        </m:sSubSup>
-      </m:oMath>
-      <w:r>
-        <w:t xml:space="preserve"> </w:t>
-      </w:r>
-      <w:r>
-        <w:t xml:space="preserve">have about the same level of fully bound ligands. The bispecific also behaves differently from a 50%-50% mixture of homogeneous bivalent ligands when they fully bound, as plotted in Figure</w:t>
+        <w:t xml:space="preserve">d-f). In general, when</w:t>
+      </w:r>
+      <w:r>
+        <w:t xml:space="preserve"> </w:t>
+      </w:r>
+      <m:oMath>
+        <m:sSubSup>
+          <m:e>
+            <m:r>
+              <m:t>K</m:t>
+            </m:r>
+          </m:e>
+          <m:sub>
+            <m:r>
+              <m:t>x</m:t>
+            </m:r>
+          </m:sub>
+          <m:sup>
+            <m:r>
+              <m:t>*</m:t>
+            </m:r>
+          </m:sup>
+        </m:sSubSup>
+      </m:oMath>
+      <w:r>
+        <w:t xml:space="preserve"> </w:t>
+      </w:r>
+      <w:r>
+        <w:t xml:space="preserve">is larger, the ligands are more capable of multimerization, and there will be more fully bound units. To demonstrate how this characteristic of fully bound bispecific ligand imparts cell population specificity, we plotted the ratios of selectivities between some cell population pairs under bispecific versus another drugs given a range of</w:t>
+      </w:r>
+      <w:r>
+        <w:t xml:space="preserve"> </w:t>
+      </w:r>
+      <m:oMath>
+        <m:sSubSup>
+          <m:e>
+            <m:r>
+              <m:t>K</m:t>
+            </m:r>
+          </m:e>
+          <m:sub>
+            <m:r>
+              <m:t>x</m:t>
+            </m:r>
+          </m:sub>
+          <m:sup>
+            <m:r>
+              <m:t>*</m:t>
+            </m:r>
+          </m:sup>
+        </m:sSubSup>
+      </m:oMath>
+      <w:r>
+        <w:t xml:space="preserve"> </w:t>
+      </w:r>
+      <w:r>
+        <w:t xml:space="preserve">(Figure</w:t>
       </w:r>
       <w:r>
         <w:t xml:space="preserve"> </w:t>
@@ -7738,40 +7856,7 @@
         <w:t xml:space="preserve"> </w:t>
       </w:r>
       <w:r>
-        <w:t xml:space="preserve">g. This indicates that bispecific ligand will provide unique enhancement only when the binding of both subunits is required.</w:t>
-      </w:r>
-    </w:p>
-    <w:p>
-      <w:pPr>
-        <w:pStyle w:val="BodyText"/>
-      </w:pPr>
-      <w:r>
-        <w:t xml:space="preserve">The binding characteristics of fully bound bispecific opens up new opportunities for targeting specific cell populations. The specific amount of fully bound ligands depends on the tendency of crosslinking, captured by</w:t>
-      </w:r>
-      <w:r>
-        <w:t xml:space="preserve"> </w:t>
-      </w:r>
-      <m:oMath>
-        <m:sSubSup>
-          <m:e>
-            <m:r>
-              <m:t>K</m:t>
-            </m:r>
-          </m:e>
-          <m:sub>
-            <m:r>
-              <m:t>x</m:t>
-            </m:r>
-          </m:sub>
-          <m:sup>
-            <m:r>
-              <m:t>*</m:t>
-            </m:r>
-          </m:sup>
-        </m:sSubSup>
-      </m:oMath>
-      <w:r>
-        <w:t xml:space="preserve">, as shown in Figure</w:t>
+        <w:t xml:space="preserve">g,h). These plotted numbers are ratios of ligand (fully) bound ratios between two cell populations, so when they are larger, it implies that fully bound bispecific ligand has more advantages than its counterpart to impart selective binding between these two cell populations. Figure</w:t>
       </w:r>
       <w:r>
         <w:t xml:space="preserve"> </w:t>
@@ -7788,7 +7873,7 @@
         <w:t xml:space="preserve"> </w:t>
       </w:r>
       <w:r>
-        <w:t xml:space="preserve">d-f. In general, when</w:t>
+        <w:t xml:space="preserve">g compares the selectivities under bispecific ligands versus a 50%-50% mixture of monovalent ligands. The results show that fully bound bispecific can grant better selective binding when</w:t>
       </w:r>
       <w:r>
         <w:t xml:space="preserve"> </w:t>
@@ -7816,7 +7901,35 @@
         <w:t xml:space="preserve"> </w:t>
       </w:r>
       <w:r>
-        <w:t xml:space="preserve">is larger, the ligands are more capable of multimerization, and there will be more fully bound units. To recognize how the amount of fully bound bispecifics varies comparing with its untethered version (monovalent mixture) and the homogeneous bivalent case, we plotted Figure</w:t>
+        <w:t xml:space="preserve">is small enough. This logical, since when</w:t>
+      </w:r>
+      <w:r>
+        <w:t xml:space="preserve"> </w:t>
+      </w:r>
+      <m:oMath>
+        <m:sSubSup>
+          <m:e>
+            <m:r>
+              <m:t>K</m:t>
+            </m:r>
+          </m:e>
+          <m:sub>
+            <m:r>
+              <m:t>x</m:t>
+            </m:r>
+          </m:sub>
+          <m:sup>
+            <m:r>
+              <m:t>*</m:t>
+            </m:r>
+          </m:sup>
+        </m:sSubSup>
+      </m:oMath>
+      <w:r>
+        <w:t xml:space="preserve"> </w:t>
+      </w:r>
+      <w:r>
+        <w:t xml:space="preserve">is small and crosslinking is rarer, most ligands will bind monovalently, and fully bound bispecific will especially favor the cell populations with higher receptor expression. However, when we compare fully bound bispecific to fully bound homogeneous bivalent mixtures (Fig.</w:t>
       </w:r>
       <w:r>
         <w:t xml:space="preserve"> </w:t>
@@ -7833,7 +7946,115 @@
         <w:t xml:space="preserve"> </w:t>
       </w:r>
       <w:r>
-        <w:t xml:space="preserve">a normalized by</w:t>
+        <w:t xml:space="preserve">h), the advantage of bispecific drugs is not obvious except for</w:t>
+      </w:r>
+      <w:r>
+        <w:t xml:space="preserve"> </w:t>
+      </w:r>
+      <m:oMath>
+        <m:sSubSup>
+          <m:e>
+            <m:r>
+              <m:t>R</m:t>
+            </m:r>
+          </m:e>
+          <m:sub>
+            <m:r>
+              <m:t>1</m:t>
+            </m:r>
+          </m:sub>
+          <m:sup>
+            <m:r>
+              <m:t>m</m:t>
+            </m:r>
+            <m:r>
+              <m:t>e</m:t>
+            </m:r>
+            <m:r>
+              <m:t>d</m:t>
+            </m:r>
+          </m:sup>
+        </m:sSubSup>
+        <m:sSubSup>
+          <m:e>
+            <m:r>
+              <m:t>R</m:t>
+            </m:r>
+          </m:e>
+          <m:sub>
+            <m:r>
+              <m:t>2</m:t>
+            </m:r>
+          </m:sub>
+          <m:sup>
+            <m:r>
+              <m:t>h</m:t>
+            </m:r>
+            <m:r>
+              <m:t>i</m:t>
+            </m:r>
+          </m:sup>
+        </m:sSubSup>
+      </m:oMath>
+      <w:r>
+        <w:t xml:space="preserve"> </w:t>
+      </w:r>
+      <w:r>
+        <w:t xml:space="preserve">to</w:t>
+      </w:r>
+      <w:r>
+        <w:t xml:space="preserve"> </w:t>
+      </w:r>
+      <m:oMath>
+        <m:sSubSup>
+          <m:e>
+            <m:r>
+              <m:t>R</m:t>
+            </m:r>
+          </m:e>
+          <m:sub>
+            <m:r>
+              <m:t>1</m:t>
+            </m:r>
+          </m:sub>
+          <m:sup>
+            <m:r>
+              <m:t>h</m:t>
+            </m:r>
+            <m:r>
+              <m:t>i</m:t>
+            </m:r>
+          </m:sup>
+        </m:sSubSup>
+        <m:sSubSup>
+          <m:e>
+            <m:r>
+              <m:t>R</m:t>
+            </m:r>
+          </m:e>
+          <m:sub>
+            <m:r>
+              <m:t>2</m:t>
+            </m:r>
+          </m:sub>
+          <m:sup>
+            <m:r>
+              <m:t>m</m:t>
+            </m:r>
+            <m:r>
+              <m:t>e</m:t>
+            </m:r>
+            <m:r>
+              <m:t>d</m:t>
+            </m:r>
+          </m:sup>
+        </m:sSubSup>
+      </m:oMath>
+      <w:r>
+        <w:t xml:space="preserve"> </w:t>
+      </w:r>
+      <w:r>
+        <w:t xml:space="preserve">selectivity. Given that both therapeutics in comparison only account for fully bound ligands, the effect demonstrated in Figure</w:t>
       </w:r>
       <w:r>
         <w:t xml:space="preserve"> </w:t>
@@ -7850,527 +8071,7 @@
         <w:t xml:space="preserve"> </w:t>
       </w:r>
       <w:r>
-        <w:t xml:space="preserve">b in</w:t>
-      </w:r>
-      <w:r>
-        <w:t xml:space="preserve"> </w:t>
-      </w:r>
-      <w:hyperlink w:anchor="fig:bispecific">
-        <w:r>
-          <w:rPr>
-            <w:rStyle w:val="Hyperlink"/>
-          </w:rPr>
-          <w:t xml:space="preserve">5</w:t>
-        </w:r>
-      </w:hyperlink>
-      <w:r>
-        <w:t xml:space="preserve"> </w:t>
-      </w:r>
-      <w:r>
-        <w:t xml:space="preserve">h and by</w:t>
-      </w:r>
-      <w:r>
-        <w:t xml:space="preserve"> </w:t>
-      </w:r>
-      <w:hyperlink w:anchor="fig:bispecific">
-        <w:r>
-          <w:rPr>
-            <w:rStyle w:val="Hyperlink"/>
-          </w:rPr>
-          <w:t xml:space="preserve">5</w:t>
-        </w:r>
-      </w:hyperlink>
-      <w:r>
-        <w:t xml:space="preserve"> </w:t>
-      </w:r>
-      <w:r>
-        <w:t xml:space="preserve">c in</w:t>
-      </w:r>
-      <w:r>
-        <w:t xml:space="preserve"> </w:t>
-      </w:r>
-      <w:hyperlink w:anchor="fig:bispecific">
-        <w:r>
-          <w:rPr>
-            <w:rStyle w:val="Hyperlink"/>
-          </w:rPr>
-          <w:t xml:space="preserve">5</w:t>
-        </w:r>
-      </w:hyperlink>
-      <w:r>
-        <w:t xml:space="preserve"> </w:t>
-      </w:r>
-      <w:r>
-        <w:t xml:space="preserve">i. Compared with the monovalent mixture (Fig.</w:t>
-      </w:r>
-      <w:r>
-        <w:t xml:space="preserve"> </w:t>
-      </w:r>
-      <w:hyperlink w:anchor="fig:bispecific">
-        <w:r>
-          <w:rPr>
-            <w:rStyle w:val="Hyperlink"/>
-          </w:rPr>
-          <w:t xml:space="preserve">5</w:t>
-        </w:r>
-      </w:hyperlink>
-      <w:r>
-        <w:t xml:space="preserve"> </w:t>
-      </w:r>
-      <w:r>
-        <w:t xml:space="preserve">h), fully bound bispecific clearly prefers doubly-positive cell populations, although in a non-linear fashion. This is verified by plotting the ratios of selectivities of various population pairs under tethered versus untethered condition in Figure</w:t>
-      </w:r>
-      <w:r>
-        <w:t xml:space="preserve"> </w:t>
-      </w:r>
-      <w:hyperlink w:anchor="fig:bispecific">
-        <w:r>
-          <w:rPr>
-            <w:rStyle w:val="Hyperlink"/>
-          </w:rPr>
-          <w:t xml:space="preserve">5</w:t>
-        </w:r>
-      </w:hyperlink>
-      <w:r>
-        <w:t xml:space="preserve"> </w:t>
-      </w:r>
-      <w:r>
-        <w:t xml:space="preserve">k: when</w:t>
-      </w:r>
-      <w:r>
-        <w:t xml:space="preserve"> </w:t>
-      </w:r>
-      <m:oMath>
-        <m:sSubSup>
-          <m:e>
-            <m:r>
-              <m:t>K</m:t>
-            </m:r>
-          </m:e>
-          <m:sub>
-            <m:r>
-              <m:t>x</m:t>
-            </m:r>
-          </m:sub>
-          <m:sup>
-            <m:r>
-              <m:t>*</m:t>
-            </m:r>
-          </m:sup>
-        </m:sSubSup>
-      </m:oMath>
-      <w:r>
-        <w:t xml:space="preserve"> </w:t>
-      </w:r>
-      <w:r>
-        <w:t xml:space="preserve">is small, bispecific fully bound better targets towards</w:t>
-      </w:r>
-      <w:r>
-        <w:t xml:space="preserve"> </w:t>
-      </w:r>
-      <m:oMath>
-        <m:sSubSup>
-          <m:e>
-            <m:r>
-              <m:t>R</m:t>
-            </m:r>
-          </m:e>
-          <m:sub>
-            <m:r>
-              <m:t>1</m:t>
-            </m:r>
-          </m:sub>
-          <m:sup>
-            <m:r>
-              <m:t>h</m:t>
-            </m:r>
-            <m:r>
-              <m:t>i</m:t>
-            </m:r>
-          </m:sup>
-        </m:sSubSup>
-        <m:sSubSup>
-          <m:e>
-            <m:r>
-              <m:t>R</m:t>
-            </m:r>
-          </m:e>
-          <m:sub>
-            <m:r>
-              <m:t>2</m:t>
-            </m:r>
-          </m:sub>
-          <m:sup>
-            <m:r>
-              <m:t>h</m:t>
-            </m:r>
-            <m:r>
-              <m:t>i</m:t>
-            </m:r>
-          </m:sup>
-        </m:sSubSup>
-      </m:oMath>
-      <w:r>
-        <w:t xml:space="preserve"> </w:t>
-      </w:r>
-      <w:r>
-        <w:t xml:space="preserve">, but doesn’t help separating</w:t>
-      </w:r>
-      <w:r>
-        <w:t xml:space="preserve"> </w:t>
-      </w:r>
-      <m:oMath>
-        <m:sSubSup>
-          <m:e>
-            <m:r>
-              <m:t>R</m:t>
-            </m:r>
-          </m:e>
-          <m:sub>
-            <m:r>
-              <m:t>1</m:t>
-            </m:r>
-          </m:sub>
-          <m:sup>
-            <m:r>
-              <m:t>m</m:t>
-            </m:r>
-            <m:r>
-              <m:t>e</m:t>
-            </m:r>
-            <m:r>
-              <m:t>d</m:t>
-            </m:r>
-          </m:sup>
-        </m:sSubSup>
-        <m:sSubSup>
-          <m:e>
-            <m:r>
-              <m:t>R</m:t>
-            </m:r>
-          </m:e>
-          <m:sub>
-            <m:r>
-              <m:t>2</m:t>
-            </m:r>
-          </m:sub>
-          <m:sup>
-            <m:r>
-              <m:t>h</m:t>
-            </m:r>
-            <m:r>
-              <m:t>i</m:t>
-            </m:r>
-          </m:sup>
-        </m:sSubSup>
-      </m:oMath>
-      <w:r>
-        <w:t xml:space="preserve"> </w:t>
-      </w:r>
-      <w:r>
-        <w:t xml:space="preserve">from</w:t>
-      </w:r>
-      <w:r>
-        <w:t xml:space="preserve"> </w:t>
-      </w:r>
-      <m:oMath>
-        <m:sSubSup>
-          <m:e>
-            <m:r>
-              <m:t>R</m:t>
-            </m:r>
-          </m:e>
-          <m:sub>
-            <m:r>
-              <m:t>1</m:t>
-            </m:r>
-          </m:sub>
-          <m:sup>
-            <m:r>
-              <m:t>h</m:t>
-            </m:r>
-            <m:r>
-              <m:t>i</m:t>
-            </m:r>
-          </m:sup>
-        </m:sSubSup>
-        <m:sSubSup>
-          <m:e>
-            <m:r>
-              <m:t>R</m:t>
-            </m:r>
-          </m:e>
-          <m:sub>
-            <m:r>
-              <m:t>2</m:t>
-            </m:r>
-          </m:sub>
-          <m:sup>
-            <m:r>
-              <m:t>m</m:t>
-            </m:r>
-            <m:r>
-              <m:t>e</m:t>
-            </m:r>
-            <m:r>
-              <m:t>d</m:t>
-            </m:r>
-          </m:sup>
-        </m:sSubSup>
-      </m:oMath>
-      <w:r>
-        <w:t xml:space="preserve">. Compared with the bivalent mixture, bispecific fully bound prefers a narrow range of cell population with a certain receptor expression profile, as shown in Figure</w:t>
-      </w:r>
-      <w:r>
-        <w:t xml:space="preserve"> </w:t>
-      </w:r>
-      <w:hyperlink w:anchor="fig:bispecific">
-        <w:r>
-          <w:rPr>
-            <w:rStyle w:val="Hyperlink"/>
-          </w:rPr>
-          <w:t xml:space="preserve">5</w:t>
-        </w:r>
-      </w:hyperlink>
-      <w:r>
-        <w:t xml:space="preserve"> </w:t>
-      </w:r>
-      <w:r>
-        <w:t xml:space="preserve">i as the</w:t>
-      </w:r>
-      <w:r>
-        <w:t xml:space="preserve"> </w:t>
-      </w:r>
-      <w:r>
-        <w:t xml:space="preserve">“</w:t>
-      </w:r>
-      <w:r>
-        <w:t xml:space="preserve">dark belt</w:t>
-      </w:r>
-      <w:r>
-        <w:t xml:space="preserve">”</w:t>
-      </w:r>
-      <w:r>
-        <w:t xml:space="preserve">. The position of this dark belt may be dependent on the choices of ligand affinities.</w:t>
-      </w:r>
-      <w:r>
-        <w:t xml:space="preserve"> </w:t>
-      </w:r>
-      <m:oMath>
-        <m:sSubSup>
-          <m:e>
-            <m:r>
-              <m:t>R</m:t>
-            </m:r>
-          </m:e>
-          <m:sub>
-            <m:r>
-              <m:t>1</m:t>
-            </m:r>
-          </m:sub>
-          <m:sup>
-            <m:r>
-              <m:t>m</m:t>
-            </m:r>
-            <m:r>
-              <m:t>e</m:t>
-            </m:r>
-            <m:r>
-              <m:t>d</m:t>
-            </m:r>
-          </m:sup>
-        </m:sSubSup>
-        <m:sSubSup>
-          <m:e>
-            <m:r>
-              <m:t>R</m:t>
-            </m:r>
-          </m:e>
-          <m:sub>
-            <m:r>
-              <m:t>2</m:t>
-            </m:r>
-          </m:sub>
-          <m:sup>
-            <m:r>
-              <m:t>h</m:t>
-            </m:r>
-            <m:r>
-              <m:t>i</m:t>
-            </m:r>
-          </m:sup>
-        </m:sSubSup>
-      </m:oMath>
-      <w:r>
-        <w:t xml:space="preserve"> </w:t>
-      </w:r>
-      <w:r>
-        <w:t xml:space="preserve">sits in this</w:t>
-      </w:r>
-      <w:r>
-        <w:t xml:space="preserve"> </w:t>
-      </w:r>
-      <w:r>
-        <w:t xml:space="preserve">“</w:t>
-      </w:r>
-      <w:r>
-        <w:t xml:space="preserve">belt</w:t>
-      </w:r>
-      <w:r>
-        <w:t xml:space="preserve">”</w:t>
-      </w:r>
-      <w:r>
-        <w:t xml:space="preserve">, thus preferred by the bispecifics. This is also corroborated by Figure</w:t>
-      </w:r>
-      <w:r>
-        <w:t xml:space="preserve"> </w:t>
-      </w:r>
-      <w:hyperlink w:anchor="fig:bispecific">
-        <w:r>
-          <w:rPr>
-            <w:rStyle w:val="Hyperlink"/>
-          </w:rPr>
-          <w:t xml:space="preserve">5</w:t>
-        </w:r>
-      </w:hyperlink>
-      <w:r>
-        <w:t xml:space="preserve"> </w:t>
-      </w:r>
-      <w:r>
-        <w:t xml:space="preserve">l, the ratios of selectivities between bivalent mixture and bispecifics, where the green line illustrating the</w:t>
-      </w:r>
-      <w:r>
-        <w:t xml:space="preserve"> </w:t>
-      </w:r>
-      <m:oMath>
-        <m:sSubSup>
-          <m:e>
-            <m:r>
-              <m:t>R</m:t>
-            </m:r>
-          </m:e>
-          <m:sub>
-            <m:r>
-              <m:t>1</m:t>
-            </m:r>
-          </m:sub>
-          <m:sup>
-            <m:r>
-              <m:t>m</m:t>
-            </m:r>
-            <m:r>
-              <m:t>e</m:t>
-            </m:r>
-            <m:r>
-              <m:t>d</m:t>
-            </m:r>
-          </m:sup>
-        </m:sSubSup>
-        <m:sSubSup>
-          <m:e>
-            <m:r>
-              <m:t>R</m:t>
-            </m:r>
-          </m:e>
-          <m:sub>
-            <m:r>
-              <m:t>2</m:t>
-            </m:r>
-          </m:sub>
-          <m:sup>
-            <m:r>
-              <m:t>h</m:t>
-            </m:r>
-            <m:r>
-              <m:t>i</m:t>
-            </m:r>
-          </m:sup>
-        </m:sSubSup>
-      </m:oMath>
-      <w:r>
-        <w:t xml:space="preserve"> </w:t>
-      </w:r>
-      <w:r>
-        <w:t xml:space="preserve">to</w:t>
-      </w:r>
-      <w:r>
-        <w:t xml:space="preserve"> </w:t>
-      </w:r>
-      <m:oMath>
-        <m:sSubSup>
-          <m:e>
-            <m:r>
-              <m:t>R</m:t>
-            </m:r>
-          </m:e>
-          <m:sub>
-            <m:r>
-              <m:t>1</m:t>
-            </m:r>
-          </m:sub>
-          <m:sup>
-            <m:r>
-              <m:t>h</m:t>
-            </m:r>
-            <m:r>
-              <m:t>i</m:t>
-            </m:r>
-          </m:sup>
-        </m:sSubSup>
-        <m:sSubSup>
-          <m:e>
-            <m:r>
-              <m:t>R</m:t>
-            </m:r>
-          </m:e>
-          <m:sub>
-            <m:r>
-              <m:t>2</m:t>
-            </m:r>
-          </m:sub>
-          <m:sup>
-            <m:r>
-              <m:t>m</m:t>
-            </m:r>
-            <m:r>
-              <m:t>e</m:t>
-            </m:r>
-            <m:r>
-              <m:t>d</m:t>
-            </m:r>
-          </m:sup>
-        </m:sSubSup>
-      </m:oMath>
-      <w:r>
-        <w:t xml:space="preserve"> </w:t>
-      </w:r>
-      <w:r>
-        <w:t xml:space="preserve">ratio shoots up with decreasing</w:t>
-      </w:r>
-      <w:r>
-        <w:t xml:space="preserve"> </w:t>
-      </w:r>
-      <m:oMath>
-        <m:sSubSup>
-          <m:e>
-            <m:r>
-              <m:t>K</m:t>
-            </m:r>
-          </m:e>
-          <m:sub>
-            <m:r>
-              <m:t>x</m:t>
-            </m:r>
-          </m:sub>
-          <m:sup>
-            <m:r>
-              <m:t>*</m:t>
-            </m:r>
-          </m:sup>
-        </m:sSubSup>
-      </m:oMath>
-      <w:r>
-        <w:t xml:space="preserve">.</w:t>
+        <w:t xml:space="preserve">g no longer holds. Together, we showed that bispecific ligands only exhibit unique advantages in inducing selective binding when they can only be effective when both of their subunits bind and crosslinking is more difficult.</w:t>
       </w:r>
     </w:p>
     <w:bookmarkStart w:id="0" w:name="fig:bispecific"/>
@@ -8718,7 +8419,7 @@
         </m:sSup>
       </m:oMath>
       <w:r>
-        <w:t xml:space="preserve">. g) Predictions of fully bound ligand in a mixture of two homogeneous bivalent drugs, which is different from the bispecific case. h) Bispecific fully bound normalized by its untethered counterpart, mixture of monovalents. Bispecific prefers doubly-positive populations. i) Bispecific fully bound normalized by its equivalent homogeneous bivalent mixture case. The</w:t>
+        <w:t xml:space="preserve">. g,h) The ratios of selectivities, thus</w:t>
       </w:r>
       <w:r>
         <w:t xml:space="preserve"> </w:t>
@@ -8727,30 +8428,12 @@
         <w:t xml:space="preserve">“</w:t>
       </w:r>
       <w:r>
-        <w:t xml:space="preserve">dark belt</w:t>
+        <w:t xml:space="preserve">the ratios of binding ratios</w:t>
       </w:r>
       <w:r>
         <w:t xml:space="preserve">”</w:t>
       </w:r>
       <w:r>
-        <w:t xml:space="preserve"> </w:t>
-      </w:r>
-      <w:r>
-        <w:t xml:space="preserve">covers the preferred populations. j-l) The ratios of selectivities, thus</w:t>
-      </w:r>
-      <w:r>
-        <w:t xml:space="preserve"> </w:t>
-      </w:r>
-      <w:r>
-        <w:t xml:space="preserve">“</w:t>
-      </w:r>
-      <w:r>
-        <w:t xml:space="preserve">the ratios of binding ratios</w:t>
-      </w:r>
-      <w:r>
-        <w:t xml:space="preserve">”</w:t>
-      </w:r>
-      <w:r>
         <w:t xml:space="preserve">, varies with</w:t>
       </w:r>
       <w:r>
@@ -8776,7 +8459,7 @@
         </m:sSubSup>
       </m:oMath>
       <w:r>
-        <w:t xml:space="preserve">. j) for bispecifics, fully bound ligands versus general ligand bound, k) bispecific versus monovalent mixture, the untethered, l) bispecific versus a 50%-50% mixture of bivalent.</w:t>
+        <w:t xml:space="preserve">. g) bispecific versus monovalent 50%-50% mixture, h) bispecific versus a 50%-50% homo-bivalent mixture.</w:t>
       </w:r>
       <w:bookmarkEnd w:id="41"/>
     </w:p>
@@ -9123,7 +8806,7 @@
         </m:sSup>
       </m:oMath>
       <w:r>
-        <w:t xml:space="preserve">. g) Predictions of fully bound ligand in a mixture of two homogeneous bivalent drugs, which is different from the bispecific case. h) Bispecific fully bound normalized by its untethered counterpart, mixture of monovalents. Bispecific prefers doubly-positive populations. i) Bispecific fully bound normalized by its equivalent homogeneous bivalent mixture case. The</w:t>
+        <w:t xml:space="preserve">. g,h) The ratios of selectivities, thus</w:t>
       </w:r>
       <w:r>
         <w:t xml:space="preserve"> </w:t>
@@ -9132,30 +8815,12 @@
         <w:t xml:space="preserve">“</w:t>
       </w:r>
       <w:r>
-        <w:t xml:space="preserve">dark belt</w:t>
+        <w:t xml:space="preserve">the ratios of binding ratios</w:t>
       </w:r>
       <w:r>
         <w:t xml:space="preserve">”</w:t>
       </w:r>
       <w:r>
-        <w:t xml:space="preserve"> </w:t>
-      </w:r>
-      <w:r>
-        <w:t xml:space="preserve">covers the preferred populations. j-l) The ratios of selectivities, thus</w:t>
-      </w:r>
-      <w:r>
-        <w:t xml:space="preserve"> </w:t>
-      </w:r>
-      <w:r>
-        <w:t xml:space="preserve">“</w:t>
-      </w:r>
-      <w:r>
-        <w:t xml:space="preserve">the ratios of binding ratios</w:t>
-      </w:r>
-      <w:r>
-        <w:t xml:space="preserve">”</w:t>
-      </w:r>
-      <w:r>
         <w:t xml:space="preserve">, varies with</w:t>
       </w:r>
       <w:r>
@@ -9181,7 +8846,7 @@
         </m:sSubSup>
       </m:oMath>
       <w:r>
-        <w:t xml:space="preserve">. j) for bispecifics, fully bound ligands versus general ligand bound, k) bispecific versus monovalent mixture, the untethered, l) bispecific versus a 50%-50% mixture of bivalent.</w:t>
+        <w:t xml:space="preserve">. g) bispecific versus monovalent 50%-50% mixture, h) bispecific versus a 50%-50% homo-bivalent mixture.</w:t>
       </w:r>
     </w:p>
     <w:bookmarkEnd w:id="0"/>

</xml_diff>

<commit_message>
Deploying to gh-pages from  @ fb2954db831b245fde9b9bcc315e0ed68259d103 🚀
</commit_message>
<xml_diff>
--- a/manuscript.docx
+++ b/manuscript.docx
@@ -382,7 +382,7 @@
         <w:pStyle w:val="FirstParagraph"/>
       </w:pPr>
       <w:r>
-        <w:t xml:space="preserve">Many drugs derive their therapeutic benefit, and avoid toxicity, through selective binding to specific cells within the body. However, even with a drug of very specific molecular binding, genetic and non-genetic heterogeneity can create a wide distribution of cell responses. This can result in reduced effectiveness and toxicity. For example, in cancer, resistance to anti-tumor antibodies,</w:t>
+        <w:t xml:space="preserve">Many drugs derive their therapeutic benefit and avoid toxicity through selective binding to specific cells within the body. However, even with a drug of very specific molecular binding, genetic and non-genetic heterogeneity can create a wide distribution of cell responses. This can result in reduced effectiveness and toxicity. For example, in cancer, resistance to anti-tumor antibodies,</w:t>
       </w:r>
       <w:hyperlink w:anchor="ref-dr9JS306">
         <w:r>
@@ -626,7 +626,7 @@
         <w:pStyle w:val="BodyText"/>
       </w:pPr>
       <w:r>
-        <w:t xml:space="preserve">Here we investigate cell-specific targeting quantitatively by extending an equilibrium, multi-valent, multi-ligand binding model. Virtually any therapy, including monoclonal antibodies, small-molecule inhibitors, and cytokines, can be thought of as ligands for respective receptors expressed on target cells. Ligand binding to target cells is the first step and essential for a drug’s intended action; in contrast, binding to off-target cells can result in unintended effects or toxicity. Some cell populations can be distinguished by unique receptor expression, but more commonly target and off-target cells express the same collection of receptors and differ only in their amounts. In such situations, engineering drugs optimized to achieve more ligand bound to the target cells, while minimizing the binding to off-target cells, is an area of ongoing research and has inspired myriad drug design strategies.</w:t>
+        <w:t xml:space="preserve">Here we investigate cell-specific targeting quantitatively by extending a multi-valent, multi-ligand equilibrium binding model. Virtually any therapy, including monoclonal antibodies, small-molecule inhibitors, and cytokines, can be thought of as ligands for respective receptors expressed on target cells. Ligand binding to target cells is the first step and essential for a drug’s intended action; in contrast, binding to off-target cells can result in unintended effects or toxicity. Some cell populations can be distinguished by unique receptor expression, but more commonly target and off-target cells express the same collection of receptors and differ only in their amounts. In such situations, engineering drugs optimized to achieve more ligand bound to the target cells while minimizing the binding to off-target cells, is an area of ongoing research and has inspired myriad drug design strategies.</w:t>
       </w:r>
       <w:hyperlink w:anchor="ref-10kZoPeON">
         <w:r>
@@ -656,7 +656,7 @@
         <w:t xml:space="preserve"> </w:t>
       </w:r>
       <w:r>
-        <w:t xml:space="preserve">We will use a quantitative binding estimation for these two cell populations to examine these strategies.</w:t>
+        <w:t xml:space="preserve">In this work, we define cell population selectivity as the ratio of the number of ligands bound to target cell populations over the number of ligands bound to off-target cell populations. We will use a quantitative binding estimation for each cell population to examine these strategies.</w:t>
       </w:r>
     </w:p>
     <w:p>
@@ -664,7 +664,7 @@
         <w:pStyle w:val="BodyText"/>
       </w:pPr>
       <w:r>
-        <w:t xml:space="preserve">While ligand-receptor binding events in biology are diverse, they are governed by their thermodynamic properties and the law of mass action. When a reaction reaches its equilibrium state, the ratio of the concentration of monomeric ligand-receptor complex,</w:t>
+        <w:t xml:space="preserve">While ligand-receptor binding events in biology are diverse, they are governed by thermodynamic properties and the law of mass action. When a reaction reaches its equilibrium state, the ratio of the concentration of monomeric ligand-receptor complex,</w:t>
       </w:r>
       <w:r>
         <w:t xml:space="preserve"> </w:t>
@@ -750,7 +750,7 @@
         </m:sSub>
       </m:oMath>
       <w:r>
-        <w:t xml:space="preserve">. The number of ligands in the solution is often much greater than that of the receptors so that binding does not deplete the ligand concentration. Binding behavior is more complex when the ligands are multivalent complexes consisting of multiple units, each of which can bind to a receptor (Fig.</w:t>
+        <w:t xml:space="preserve">. The number of ligands in the solution is usually much greater than that of the receptors, so we assume binding does not deplete the ligand concentration. Binding behavior is more complex when the ligands are multivalent complexes consisting of multiple units, each of which can bind to a receptor (Fig.</w:t>
       </w:r>
       <w:r>
         <w:t xml:space="preserve"> </w:t>
@@ -764,7 +764,7 @@
         </w:r>
       </w:hyperlink>
       <w:r>
-        <w:t xml:space="preserve">a). During initial association, we will assume that the first subunit on a ligand complex binds according to the same dynamics that govern monovalent binding. Subsequent binding events exhibit different behavior, however, due to the increased local concentration of the complex. Here, we assume that the effective association constant for the subsequent bindings is proportional to that of the free binding, but scaled by a constant,</w:t>
+        <w:t xml:space="preserve">a). During initial association, we assume that the first subunit on a ligand complex binds according to the same dynamics that govern monovalent binding. Subsequent binding events exhibit different behavior, however, due to the increased local concentration of the complex and steric effects. Here, we assume that the effective association constant for the subsequent bindings is proportional to that of the free binding, but scaled by a constant,</w:t>
       </w:r>
       <w:r>
         <w:t xml:space="preserve"> </w:t>
@@ -789,7 +789,7 @@
         </m:sSubSup>
       </m:oMath>
       <w:r>
-        <w:t xml:space="preserve">, due to its different local concentration and steric effects. Another consideration that must be made when modeling multivalent binding processes is whether a ligand complex is formed by a random assortment of monomer units or by engineering to produce complexes of defined uniform composition. We developed a multivalent binding model that calculates the amount of ligand bound at equilibrium taking each of these factors into account (see methods).</w:t>
+        <w:t xml:space="preserve">. Another consideration that must be made when modeling multivalent binding processes is whether a ligand complex is formed by a random assortment of monomer units or by engineering to produce complexes of defined uniform composition. We developed a multivalent binding model that calculates the amount of ligand bound at equilibrium taking each of these factors into account (see methods).</w:t>
       </w:r>
     </w:p>
     <w:p>
@@ -825,7 +825,104 @@
         </w:r>
       </w:hyperlink>
       <w:r>
-        <w:t xml:space="preserve">c shows the log-scaled predicted amount of binding of a monovalent ligand given the abundance of two receptors. Because all axes are log-scaled the number of contour lines between two points indicates the ratio of ligand binding between populations. For instance, in figure</w:t>
+        <w:t xml:space="preserve">c shows the log-scaled predicted amount of binding of a monovalent ligand given the abundance of two receptors, with the concentration of ligand,</w:t>
+      </w:r>
+      <w:r>
+        <w:t xml:space="preserve"> </w:t>
+      </w:r>
+      <m:oMath>
+        <m:sSub>
+          <m:e>
+            <m:r>
+              <m:t>L</m:t>
+            </m:r>
+          </m:e>
+          <m:sub>
+            <m:r>
+              <m:t>0</m:t>
+            </m:r>
+          </m:sub>
+        </m:sSub>
+      </m:oMath>
+      <w:r>
+        <w:t xml:space="preserve">, to be</w:t>
+      </w:r>
+      <w:r>
+        <w:t xml:space="preserve"> </w:t>
+      </w:r>
+      <m:oMath>
+        <m:r>
+          <m:t>1</m:t>
+        </m:r>
+        <m:r>
+          <m:rPr>
+            <m:sty m:val="p"/>
+          </m:rPr>
+          <m:t>n</m:t>
+        </m:r>
+        <m:r>
+          <m:rPr>
+            <m:sty m:val="p"/>
+          </m:rPr>
+          <m:t>M</m:t>
+        </m:r>
+      </m:oMath>
+      <w:r>
+        <w:t xml:space="preserve">, and its dissociation constants to the two receptors to be</w:t>
+      </w:r>
+      <w:r>
+        <w:t xml:space="preserve"> </w:t>
+      </w:r>
+      <m:oMath>
+        <m:r>
+          <m:t>10</m:t>
+        </m:r>
+        <m:r>
+          <m:rPr>
+            <m:sty m:val="p"/>
+          </m:rPr>
+          <m:t>μ</m:t>
+        </m:r>
+        <m:r>
+          <m:rPr>
+            <m:sty m:val="p"/>
+          </m:rPr>
+          <m:t>M</m:t>
+        </m:r>
+      </m:oMath>
+      <w:r>
+        <w:t xml:space="preserve"> </w:t>
+      </w:r>
+      <w:r>
+        <w:t xml:space="preserve">and</w:t>
+      </w:r>
+      <w:r>
+        <w:t xml:space="preserve"> </w:t>
+      </w:r>
+      <m:oMath>
+        <m:r>
+          <m:t>100</m:t>
+        </m:r>
+      </m:oMath>
+      <w:r>
+        <w:t xml:space="preserve"> </w:t>
+      </w:r>
+      <m:oMath>
+        <m:r>
+          <m:rPr>
+            <m:sty m:val="p"/>
+          </m:rPr>
+          <m:t>n</m:t>
+        </m:r>
+        <m:r>
+          <m:rPr>
+            <m:sty m:val="p"/>
+          </m:rPr>
+          <m:t>M</m:t>
+        </m:r>
+      </m:oMath>
+      <w:r>
+        <w:t xml:space="preserve">, respectively. Because all axes are log-scaled, the number of contour lines between two points indicates the ratio of ligand binding between populations. For instance, in figure</w:t>
       </w:r>
       <w:r>
         <w:t xml:space="preserve"> </w:t>
@@ -839,7 +936,7 @@
         </w:r>
       </w:hyperlink>
       <w:r>
-        <w:t xml:space="preserve">c, cell populations at points 1 and 2 are on the same contour line and thus have the same amount of ligand bound; the cell populations at points 1 and 3 have multiple contour lines between and so point 3 has more ligand binding. (In fact, the ratio can be read as the exponent of the contour line difference. For point 3 to point 1, the ratio is</w:t>
+        <w:t xml:space="preserve">c, cell populations at points 1 and 2 are on the same contour line and thus have the same amount of ligand bound; the cell populations at points 1 and 3 have multiple contour lines between and so point 3 has more ligand binding (In fact, the ratio can be read as the exponent of the contour line difference. For point 3 to point 1, the ratio is</w:t>
       </w:r>
       <w:r>
         <w:t xml:space="preserve"> </w:t>
@@ -871,15 +968,7 @@
         </m:r>
       </m:oMath>
       <w:r>
-        <w:t xml:space="preserve">.)</w:t>
-      </w:r>
-    </w:p>
-    <w:p>
-      <w:pPr>
-        <w:pStyle w:val="BodyText"/>
-      </w:pPr>
-      <w:r>
-        <w:t xml:space="preserve">As an example, we chose the concentration of ligand,</w:t>
+        <w:t xml:space="preserve">). Alternatively, we can think of moving from one point to another as a change of expression profile for a cell population. When the amount of</w:t>
       </w:r>
       <w:r>
         <w:t xml:space="preserve"> </w:t>
@@ -888,113 +977,44 @@
         <m:sSub>
           <m:e>
             <m:r>
-              <m:t>L</m:t>
-            </m:r>
-          </m:e>
-          <m:sub>
-            <m:r>
-              <m:t>0</m:t>
+              <m:t>R</m:t>
+            </m:r>
+          </m:e>
+          <m:sub>
+            <m:r>
+              <m:t>1</m:t>
             </m:r>
           </m:sub>
         </m:sSub>
       </m:oMath>
       <w:r>
-        <w:t xml:space="preserve">, to be</w:t>
-      </w:r>
-      <w:r>
-        <w:t xml:space="preserve"> </w:t>
-      </w:r>
-      <m:oMath>
-        <m:r>
-          <m:t>1</m:t>
-        </m:r>
-        <m:r>
-          <m:rPr>
-            <m:sty m:val="p"/>
-          </m:rPr>
-          <m:t>n</m:t>
-        </m:r>
-        <m:r>
-          <m:rPr>
-            <m:sty m:val="p"/>
-          </m:rPr>
-          <m:t>M</m:t>
-        </m:r>
-      </m:oMath>
-      <w:r>
-        <w:t xml:space="preserve">, and the dissociation constants to the two receptors to be</w:t>
-      </w:r>
-      <w:r>
-        <w:t xml:space="preserve"> </w:t>
-      </w:r>
-      <m:oMath>
-        <m:r>
-          <m:t>10</m:t>
-        </m:r>
-        <m:r>
-          <m:rPr>
-            <m:sty m:val="p"/>
-          </m:rPr>
-          <m:t>μ</m:t>
-        </m:r>
-        <m:r>
-          <m:rPr>
-            <m:sty m:val="p"/>
-          </m:rPr>
-          <m:t>M</m:t>
-        </m:r>
-      </m:oMath>
-      <w:r>
-        <w:t xml:space="preserve"> </w:t>
-      </w:r>
-      <w:r>
-        <w:t xml:space="preserve">and</w:t>
-      </w:r>
-      <w:r>
-        <w:t xml:space="preserve"> </w:t>
-      </w:r>
-      <m:oMath>
-        <m:sSup>
-          <m:e>
-            <m:r>
-              <m:t>10</m:t>
-            </m:r>
-          </m:e>
-          <m:sup>
+        <w:t xml:space="preserve"> </w:t>
+      </w:r>
+      <w:r>
+        <w:t xml:space="preserve">increases on a cell (a point moves rightward, e.g. from 1 to 2), the amount of binding doesn’t increase significantly. On the contrary, adding more</w:t>
+      </w:r>
+      <w:r>
+        <w:t xml:space="preserve"> </w:t>
+      </w:r>
+      <m:oMath>
+        <m:sSub>
+          <m:e>
+            <m:r>
+              <m:t>R</m:t>
+            </m:r>
+          </m:e>
+          <m:sub>
             <m:r>
               <m:t>2</m:t>
             </m:r>
-          </m:sup>
-        </m:sSup>
-        <m:r>
-          <m:rPr>
-            <m:sty m:val="p"/>
-          </m:rPr>
-          <m:t>n</m:t>
-        </m:r>
-        <m:r>
-          <m:rPr>
-            <m:sty m:val="p"/>
-          </m:rPr>
-          <m:t>M</m:t>
-        </m:r>
-      </m:oMath>
-      <w:r>
-        <w:t xml:space="preserve">, respectively. Figure</w:t>
-      </w:r>
-      <w:r>
-        <w:t xml:space="preserve"> </w:t>
-      </w:r>
-      <w:hyperlink w:anchor="fig:model">
-        <w:r>
-          <w:rPr>
-            <w:rStyle w:val="Hyperlink"/>
-          </w:rPr>
-          <w:t xml:space="preserve">1</w:t>
-        </w:r>
-      </w:hyperlink>
-      <w:r>
-        <w:t xml:space="preserve">c shows that when the amount of</w:t>
+          </m:sub>
+        </m:sSub>
+      </m:oMath>
+      <w:r>
+        <w:t xml:space="preserve"> </w:t>
+      </w:r>
+      <w:r>
+        <w:t xml:space="preserve">(moving upward, e.g. from 1 to 3) will lead to a great boost on ligand bound. The high affinity of</w:t>
       </w:r>
       <w:r>
         <w:t xml:space="preserve"> </w:t>
@@ -1008,105 +1028,59 @@
           </m:e>
           <m:sub>
             <m:r>
+              <m:t>2</m:t>
+            </m:r>
+          </m:sub>
+        </m:sSub>
+      </m:oMath>
+      <w:r>
+        <w:t xml:space="preserve"> </w:t>
+      </w:r>
+      <w:r>
+        <w:t xml:space="preserve">leads to a greater binding sensitivity on the expression of</w:t>
+      </w:r>
+      <w:r>
+        <w:t xml:space="preserve"> </w:t>
+      </w:r>
+      <m:oMath>
+        <m:sSub>
+          <m:e>
+            <m:r>
+              <m:t>R</m:t>
+            </m:r>
+          </m:e>
+          <m:sub>
+            <m:r>
+              <m:t>2</m:t>
+            </m:r>
+          </m:sub>
+        </m:sSub>
+      </m:oMath>
+      <w:r>
+        <w:t xml:space="preserve"> </w:t>
+      </w:r>
+      <w:r>
+        <w:t xml:space="preserve">than</w:t>
+      </w:r>
+      <w:r>
+        <w:t xml:space="preserve"> </w:t>
+      </w:r>
+      <m:oMath>
+        <m:sSub>
+          <m:e>
+            <m:r>
+              <m:t>R</m:t>
+            </m:r>
+          </m:e>
+          <m:sub>
+            <m:r>
               <m:t>1</m:t>
             </m:r>
           </m:sub>
         </m:sSub>
       </m:oMath>
       <w:r>
-        <w:t xml:space="preserve"> </w:t>
-      </w:r>
-      <w:r>
-        <w:t xml:space="preserve">increases on a cell (a point moves rightward, e.g. from 1 to 2), the amount of binding doesn’t increase significantly. On the contrary, adding more</w:t>
-      </w:r>
-      <w:r>
-        <w:t xml:space="preserve"> </w:t>
-      </w:r>
-      <m:oMath>
-        <m:sSub>
-          <m:e>
-            <m:r>
-              <m:t>R</m:t>
-            </m:r>
-          </m:e>
-          <m:sub>
-            <m:r>
-              <m:t>2</m:t>
-            </m:r>
-          </m:sub>
-        </m:sSub>
-      </m:oMath>
-      <w:r>
-        <w:t xml:space="preserve"> </w:t>
-      </w:r>
-      <w:r>
-        <w:t xml:space="preserve">(moving upward, e.g. from 1 to 3) will lead to a great boost on ligand bound. The high affinity of</w:t>
-      </w:r>
-      <w:r>
-        <w:t xml:space="preserve"> </w:t>
-      </w:r>
-      <m:oMath>
-        <m:sSub>
-          <m:e>
-            <m:r>
-              <m:t>R</m:t>
-            </m:r>
-          </m:e>
-          <m:sub>
-            <m:r>
-              <m:t>2</m:t>
-            </m:r>
-          </m:sub>
-        </m:sSub>
-      </m:oMath>
-      <w:r>
-        <w:t xml:space="preserve"> </w:t>
-      </w:r>
-      <w:r>
-        <w:t xml:space="preserve">leads to a greater binding dependence on the expression of</w:t>
-      </w:r>
-      <w:r>
-        <w:t xml:space="preserve"> </w:t>
-      </w:r>
-      <m:oMath>
-        <m:sSub>
-          <m:e>
-            <m:r>
-              <m:t>R</m:t>
-            </m:r>
-          </m:e>
-          <m:sub>
-            <m:r>
-              <m:t>2</m:t>
-            </m:r>
-          </m:sub>
-        </m:sSub>
-      </m:oMath>
-      <w:r>
-        <w:t xml:space="preserve"> </w:t>
-      </w:r>
-      <w:r>
-        <w:t xml:space="preserve">than</w:t>
-      </w:r>
-      <w:r>
-        <w:t xml:space="preserve"> </w:t>
-      </w:r>
-      <m:oMath>
-        <m:sSub>
-          <m:e>
-            <m:r>
-              <m:t>R</m:t>
-            </m:r>
-          </m:e>
-          <m:sub>
-            <m:r>
-              <m:t>1</m:t>
-            </m:r>
-          </m:sub>
-        </m:sSub>
-      </m:oMath>
-      <w:r>
-        <w:t xml:space="preserve">. This situation might correspond to some cue inducing expression of a receptor (e.g. interferon-induced upregulation of MHC, or regulatory T cell upregulation of IL-2R⍺</w:t>
+        <w:t xml:space="preserve">. This situation might correspond to some cue inducing expression of a receptor, such as interferon-induced upregulation of MHC and regulatory T cell upregulation of IL-2R⍺.</w:t>
       </w:r>
       <w:hyperlink w:anchor="ref-11Hb1fNV6">
         <w:r>
@@ -1117,9 +1091,6 @@
           <w:t xml:space="preserve">15</w:t>
         </w:r>
       </w:hyperlink>
-      <w:r>
-        <w:t xml:space="preserve">).</w:t>
-      </w:r>
     </w:p>
     <w:p>
       <w:pPr>
@@ -1334,7 +1305,7 @@
         <w:t xml:space="preserve"> </w:t>
       </w:r>
       <w:r>
-        <w:t xml:space="preserve">has a wider range. We will use this binding model to examine how engineering using affinity, valency, and hetero-valent complexes improve cell-specific targeting. Although we will only consider two receptor and ligand subunit types, respectively, the principles we present generalize to more complex cases.</w:t>
+        <w:t xml:space="preserve">has a wider range. We will use this binding model to examine how engineering using affinity, valency, and hetero-valent complexes improve cell-specific targeting. Although we will only consider two receptor and ligand subunit types respectively, the principles we present can generalize to more complex cases.</w:t>
       </w:r>
     </w:p>
     <w:p>
@@ -1448,32 +1419,12 @@
         </m:r>
       </m:oMath>
       <w:r>
-        <w:t xml:space="preserve">; crosslinking constant</w:t>
-      </w:r>
-      <w:r>
-        <w:t xml:space="preserve"> </w:t>
-      </w:r>
-      <m:oMath>
-        <m:sSubSup>
-          <m:e>
-            <m:r>
-              <m:t>K</m:t>
-            </m:r>
-          </m:e>
-          <m:sub>
-            <m:r>
-              <m:t>x</m:t>
-            </m:r>
-          </m:sub>
-          <m:sup>
-            <m:r>
-              <m:t>*</m:t>
-            </m:r>
-          </m:sup>
-        </m:sSubSup>
-        <m:r>
-          <m:t>=</m:t>
-        </m:r>
+        <w:t xml:space="preserve">. b-e) Heatmap of binding ratio of cell populations exposed to a monovalent ligand with dissociation constants to receptor 1 and 2 ranging from</w:t>
+      </w:r>
+      <w:r>
+        <w:t xml:space="preserve"> </w:t>
+      </w:r>
+      <m:oMath>
         <m:sSup>
           <m:e>
             <m:r>
@@ -1482,65 +1433,25 @@
           </m:e>
           <m:sup>
             <m:r>
-              <m:t>−</m:t>
-            </m:r>
+              <m:t>4</m:t>
+            </m:r>
+          </m:sup>
+        </m:sSup>
+        <m:r>
+          <m:t>∼</m:t>
+        </m:r>
+        <m:sSup>
+          <m:e>
             <m:r>
               <m:t>10</m:t>
             </m:r>
+          </m:e>
+          <m:sup>
+            <m:r>
+              <m:t>2</m:t>
+            </m:r>
           </m:sup>
         </m:sSup>
-      </m:oMath>
-      <w:r>
-        <w:t xml:space="preserve">. b-e) Heatmap of binding ratio of cell populations exposed to a monovalent ligand with dissociation constants to receptor 1 and 2 ranging from</w:t>
-      </w:r>
-      <w:r>
-        <w:t xml:space="preserve"> </w:t>
-      </w:r>
-      <m:oMath>
-        <m:sSup>
-          <m:e>
-            <m:r>
-              <m:t>10</m:t>
-            </m:r>
-          </m:e>
-          <m:sup>
-            <m:r>
-              <m:t>4</m:t>
-            </m:r>
-          </m:sup>
-        </m:sSup>
-        <m:r>
-          <m:t>∼</m:t>
-        </m:r>
-        <m:sSup>
-          <m:e>
-            <m:r>
-              <m:t>10</m:t>
-            </m:r>
-          </m:e>
-          <m:sup>
-            <m:r>
-              <m:t>2</m:t>
-            </m:r>
-          </m:sup>
-        </m:sSup>
-        <m:r>
-          <m:t>n</m:t>
-        </m:r>
-        <m:r>
-          <m:t>M</m:t>
-        </m:r>
-      </m:oMath>
-      <w:r>
-        <w:t xml:space="preserve">, at a concentration of</w:t>
-      </w:r>
-      <w:r>
-        <w:t xml:space="preserve"> </w:t>
-      </w:r>
-      <m:oMath>
-        <m:r>
-          <m:t>10</m:t>
-        </m:r>
         <m:r>
           <m:rPr>
             <m:sty m:val="p"/>
@@ -1555,7 +1466,45 @@
         </m:r>
       </m:oMath>
       <w:r>
-        <w:t xml:space="preserve">. b–e) Ligand bound ratio of (b)</w:t>
+        <w:t xml:space="preserve">, at a concentration</w:t>
+      </w:r>
+      <w:r>
+        <w:t xml:space="preserve"> </w:t>
+      </w:r>
+      <m:oMath>
+        <m:sSub>
+          <m:e>
+            <m:r>
+              <m:t>L</m:t>
+            </m:r>
+          </m:e>
+          <m:sub>
+            <m:r>
+              <m:t>0</m:t>
+            </m:r>
+          </m:sub>
+        </m:sSub>
+        <m:r>
+          <m:t>=</m:t>
+        </m:r>
+        <m:r>
+          <m:t>1</m:t>
+        </m:r>
+        <m:r>
+          <m:rPr>
+            <m:sty m:val="p"/>
+          </m:rPr>
+          <m:t>n</m:t>
+        </m:r>
+        <m:r>
+          <m:rPr>
+            <m:sty m:val="p"/>
+          </m:rPr>
+          <m:t>M</m:t>
+        </m:r>
+      </m:oMath>
+      <w:r>
+        <w:t xml:space="preserve">. Ligand bound ratio of (b)</w:t>
       </w:r>
       <w:r>
         <w:t xml:space="preserve"> </w:t>
@@ -1625,6 +1574,54 @@
           </m:sub>
           <m:sup>
             <m:r>
+              <m:t>l</m:t>
+            </m:r>
+            <m:r>
+              <m:t>o</m:t>
+            </m:r>
+          </m:sup>
+        </m:sSubSup>
+        <m:sSubSup>
+          <m:e>
+            <m:r>
+              <m:t>R</m:t>
+            </m:r>
+          </m:e>
+          <m:sub>
+            <m:r>
+              <m:t>2</m:t>
+            </m:r>
+          </m:sub>
+          <m:sup>
+            <m:r>
+              <m:t>h</m:t>
+            </m:r>
+            <m:r>
+              <m:t>i</m:t>
+            </m:r>
+          </m:sup>
+        </m:sSubSup>
+      </m:oMath>
+      <w:r>
+        <w:t xml:space="preserve">, (c)</w:t>
+      </w:r>
+      <w:r>
+        <w:t xml:space="preserve"> </w:t>
+      </w:r>
+      <m:oMath>
+        <m:sSubSup>
+          <m:e>
+            <m:r>
+              <m:t>R</m:t>
+            </m:r>
+          </m:e>
+          <m:sub>
+            <m:r>
+              <m:t>1</m:t>
+            </m:r>
+          </m:sub>
+          <m:sup>
+            <m:r>
               <m:t>m</m:t>
             </m:r>
             <m:r>
@@ -1648,6 +1645,108 @@
           </m:sub>
           <m:sup>
             <m:r>
+              <m:t>h</m:t>
+            </m:r>
+            <m:r>
+              <m:t>i</m:t>
+            </m:r>
+          </m:sup>
+        </m:sSubSup>
+      </m:oMath>
+      <w:r>
+        <w:t xml:space="preserve"> </w:t>
+      </w:r>
+      <w:r>
+        <w:t xml:space="preserve">to</w:t>
+      </w:r>
+      <w:r>
+        <w:t xml:space="preserve"> </w:t>
+      </w:r>
+      <m:oMath>
+        <m:sSubSup>
+          <m:e>
+            <m:r>
+              <m:t>R</m:t>
+            </m:r>
+          </m:e>
+          <m:sub>
+            <m:r>
+              <m:t>1</m:t>
+            </m:r>
+          </m:sub>
+          <m:sup>
+            <m:r>
+              <m:t>h</m:t>
+            </m:r>
+            <m:r>
+              <m:t>i</m:t>
+            </m:r>
+          </m:sup>
+        </m:sSubSup>
+        <m:sSubSup>
+          <m:e>
+            <m:r>
+              <m:t>R</m:t>
+            </m:r>
+          </m:e>
+          <m:sub>
+            <m:r>
+              <m:t>2</m:t>
+            </m:r>
+          </m:sub>
+          <m:sup>
+            <m:r>
+              <m:t>m</m:t>
+            </m:r>
+            <m:r>
+              <m:t>e</m:t>
+            </m:r>
+            <m:r>
+              <m:t>d</m:t>
+            </m:r>
+          </m:sup>
+        </m:sSubSup>
+      </m:oMath>
+      <w:r>
+        <w:t xml:space="preserve">, (d)</w:t>
+      </w:r>
+      <w:r>
+        <w:t xml:space="preserve"> </w:t>
+      </w:r>
+      <m:oMath>
+        <m:sSubSup>
+          <m:e>
+            <m:r>
+              <m:t>R</m:t>
+            </m:r>
+          </m:e>
+          <m:sub>
+            <m:r>
+              <m:t>1</m:t>
+            </m:r>
+          </m:sub>
+          <m:sup>
+            <m:r>
+              <m:t>h</m:t>
+            </m:r>
+            <m:r>
+              <m:t>i</m:t>
+            </m:r>
+          </m:sup>
+        </m:sSubSup>
+        <m:sSubSup>
+          <m:e>
+            <m:r>
+              <m:t>R</m:t>
+            </m:r>
+          </m:e>
+          <m:sub>
+            <m:r>
+              <m:t>2</m:t>
+            </m:r>
+          </m:sub>
+          <m:sup>
+            <m:r>
               <m:t>l</m:t>
             </m:r>
             <m:r>
@@ -1657,7 +1756,10 @@
         </m:sSubSup>
       </m:oMath>
       <w:r>
-        <w:t xml:space="preserve">, (c)</w:t>
+        <w:t xml:space="preserve"> </w:t>
+      </w:r>
+      <w:r>
+        <w:t xml:space="preserve">to</w:t>
       </w:r>
       <w:r>
         <w:t xml:space="preserve"> </w:t>
@@ -1699,6 +1801,34 @@
           </m:sub>
           <m:sup>
             <m:r>
+              <m:t>l</m:t>
+            </m:r>
+            <m:r>
+              <m:t>o</m:t>
+            </m:r>
+          </m:sup>
+        </m:sSubSup>
+      </m:oMath>
+      <w:r>
+        <w:t xml:space="preserve">, and (e)</w:t>
+      </w:r>
+      <w:r>
+        <w:t xml:space="preserve"> </w:t>
+      </w:r>
+      <m:oMath>
+        <m:sSubSup>
+          <m:e>
+            <m:r>
+              <m:t>R</m:t>
+            </m:r>
+          </m:e>
+          <m:sub>
+            <m:r>
+              <m:t>1</m:t>
+            </m:r>
+          </m:sub>
+          <m:sup>
+            <m:r>
               <m:t>h</m:t>
             </m:r>
             <m:r>
@@ -1706,6 +1836,26 @@
             </m:r>
           </m:sup>
         </m:sSubSup>
+        <m:sSubSup>
+          <m:e>
+            <m:r>
+              <m:t>R</m:t>
+            </m:r>
+          </m:e>
+          <m:sub>
+            <m:r>
+              <m:t>2</m:t>
+            </m:r>
+          </m:sub>
+          <m:sup>
+            <m:r>
+              <m:t>h</m:t>
+            </m:r>
+            <m:r>
+              <m:t>i</m:t>
+            </m:r>
+          </m:sup>
+        </m:sSubSup>
       </m:oMath>
       <w:r>
         <w:t xml:space="preserve"> </w:t>
@@ -1730,10 +1880,13 @@
           </m:sub>
           <m:sup>
             <m:r>
-              <m:t>h</m:t>
-            </m:r>
-            <m:r>
-              <m:t>i</m:t>
+              <m:t>m</m:t>
+            </m:r>
+            <m:r>
+              <m:t>e</m:t>
+            </m:r>
+            <m:r>
+              <m:t>d</m:t>
             </m:r>
           </m:sup>
         </m:sSubSup>
@@ -1757,210 +1910,6 @@
             </m:r>
             <m:r>
               <m:t>d</m:t>
-            </m:r>
-          </m:sup>
-        </m:sSubSup>
-      </m:oMath>
-      <w:r>
-        <w:t xml:space="preserve">, (d)</w:t>
-      </w:r>
-      <w:r>
-        <w:t xml:space="preserve"> </w:t>
-      </w:r>
-      <m:oMath>
-        <m:sSubSup>
-          <m:e>
-            <m:r>
-              <m:t>R</m:t>
-            </m:r>
-          </m:e>
-          <m:sub>
-            <m:r>
-              <m:t>1</m:t>
-            </m:r>
-          </m:sub>
-          <m:sup>
-            <m:r>
-              <m:t>h</m:t>
-            </m:r>
-            <m:r>
-              <m:t>i</m:t>
-            </m:r>
-          </m:sup>
-        </m:sSubSup>
-        <m:sSubSup>
-          <m:e>
-            <m:r>
-              <m:t>R</m:t>
-            </m:r>
-          </m:e>
-          <m:sub>
-            <m:r>
-              <m:t>2</m:t>
-            </m:r>
-          </m:sub>
-          <m:sup>
-            <m:r>
-              <m:t>h</m:t>
-            </m:r>
-            <m:r>
-              <m:t>i</m:t>
-            </m:r>
-          </m:sup>
-        </m:sSubSup>
-      </m:oMath>
-      <w:r>
-        <w:t xml:space="preserve"> </w:t>
-      </w:r>
-      <w:r>
-        <w:t xml:space="preserve">to</w:t>
-      </w:r>
-      <w:r>
-        <w:t xml:space="preserve"> </w:t>
-      </w:r>
-      <m:oMath>
-        <m:sSubSup>
-          <m:e>
-            <m:r>
-              <m:t>R</m:t>
-            </m:r>
-          </m:e>
-          <m:sub>
-            <m:r>
-              <m:t>1</m:t>
-            </m:r>
-          </m:sub>
-          <m:sup>
-            <m:r>
-              <m:t>m</m:t>
-            </m:r>
-            <m:r>
-              <m:t>e</m:t>
-            </m:r>
-            <m:r>
-              <m:t>d</m:t>
-            </m:r>
-          </m:sup>
-        </m:sSubSup>
-        <m:sSubSup>
-          <m:e>
-            <m:r>
-              <m:t>R</m:t>
-            </m:r>
-          </m:e>
-          <m:sub>
-            <m:r>
-              <m:t>2</m:t>
-            </m:r>
-          </m:sub>
-          <m:sup>
-            <m:r>
-              <m:t>m</m:t>
-            </m:r>
-            <m:r>
-              <m:t>e</m:t>
-            </m:r>
-            <m:r>
-              <m:t>d</m:t>
-            </m:r>
-          </m:sup>
-        </m:sSubSup>
-      </m:oMath>
-      <w:r>
-        <w:t xml:space="preserve">, and (e)</w:t>
-      </w:r>
-      <w:r>
-        <w:t xml:space="preserve"> </w:t>
-      </w:r>
-      <m:oMath>
-        <m:sSubSup>
-          <m:e>
-            <m:r>
-              <m:t>R</m:t>
-            </m:r>
-          </m:e>
-          <m:sub>
-            <m:r>
-              <m:t>1</m:t>
-            </m:r>
-          </m:sub>
-          <m:sup>
-            <m:r>
-              <m:t>h</m:t>
-            </m:r>
-            <m:r>
-              <m:t>i</m:t>
-            </m:r>
-          </m:sup>
-        </m:sSubSup>
-        <m:sSubSup>
-          <m:e>
-            <m:r>
-              <m:t>R</m:t>
-            </m:r>
-          </m:e>
-          <m:sub>
-            <m:r>
-              <m:t>2</m:t>
-            </m:r>
-          </m:sub>
-          <m:sup>
-            <m:r>
-              <m:t>l</m:t>
-            </m:r>
-            <m:r>
-              <m:t>o</m:t>
-            </m:r>
-          </m:sup>
-        </m:sSubSup>
-      </m:oMath>
-      <w:r>
-        <w:t xml:space="preserve"> </w:t>
-      </w:r>
-      <w:r>
-        <w:t xml:space="preserve">to</w:t>
-      </w:r>
-      <w:r>
-        <w:t xml:space="preserve"> </w:t>
-      </w:r>
-      <m:oMath>
-        <m:sSubSup>
-          <m:e>
-            <m:r>
-              <m:t>R</m:t>
-            </m:r>
-          </m:e>
-          <m:sub>
-            <m:r>
-              <m:t>1</m:t>
-            </m:r>
-          </m:sub>
-          <m:sup>
-            <m:r>
-              <m:t>l</m:t>
-            </m:r>
-            <m:r>
-              <m:t>o</m:t>
-            </m:r>
-          </m:sup>
-        </m:sSubSup>
-        <m:sSubSup>
-          <m:e>
-            <m:r>
-              <m:t>R</m:t>
-            </m:r>
-          </m:e>
-          <m:sub>
-            <m:r>
-              <m:t>2</m:t>
-            </m:r>
-          </m:sub>
-          <m:sup>
-            <m:r>
-              <m:t>h</m:t>
-            </m:r>
-            <m:r>
-              <m:t>i</m:t>
             </m:r>
           </m:sup>
         </m:sSubSup>
@@ -2069,32 +2018,12 @@
         </m:r>
       </m:oMath>
       <w:r>
-        <w:t xml:space="preserve">; crosslinking constant</w:t>
-      </w:r>
-      <w:r>
-        <w:t xml:space="preserve"> </w:t>
-      </w:r>
-      <m:oMath>
-        <m:sSubSup>
-          <m:e>
-            <m:r>
-              <m:t>K</m:t>
-            </m:r>
-          </m:e>
-          <m:sub>
-            <m:r>
-              <m:t>x</m:t>
-            </m:r>
-          </m:sub>
-          <m:sup>
-            <m:r>
-              <m:t>*</m:t>
-            </m:r>
-          </m:sup>
-        </m:sSubSup>
-        <m:r>
-          <m:t>=</m:t>
-        </m:r>
+        <w:t xml:space="preserve">. b-e) Heatmap of binding ratio of cell populations exposed to a monovalent ligand with dissociation constants to receptor 1 and 2 ranging from</w:t>
+      </w:r>
+      <w:r>
+        <w:t xml:space="preserve"> </w:t>
+      </w:r>
+      <m:oMath>
         <m:sSup>
           <m:e>
             <m:r>
@@ -2103,65 +2032,25 @@
           </m:e>
           <m:sup>
             <m:r>
-              <m:t>−</m:t>
-            </m:r>
+              <m:t>4</m:t>
+            </m:r>
+          </m:sup>
+        </m:sSup>
+        <m:r>
+          <m:t>∼</m:t>
+        </m:r>
+        <m:sSup>
+          <m:e>
             <m:r>
               <m:t>10</m:t>
             </m:r>
+          </m:e>
+          <m:sup>
+            <m:r>
+              <m:t>2</m:t>
+            </m:r>
           </m:sup>
         </m:sSup>
-      </m:oMath>
-      <w:r>
-        <w:t xml:space="preserve">. b-e) Heatmap of binding ratio of cell populations exposed to a monovalent ligand with dissociation constants to receptor 1 and 2 ranging from</w:t>
-      </w:r>
-      <w:r>
-        <w:t xml:space="preserve"> </w:t>
-      </w:r>
-      <m:oMath>
-        <m:sSup>
-          <m:e>
-            <m:r>
-              <m:t>10</m:t>
-            </m:r>
-          </m:e>
-          <m:sup>
-            <m:r>
-              <m:t>4</m:t>
-            </m:r>
-          </m:sup>
-        </m:sSup>
-        <m:r>
-          <m:t>∼</m:t>
-        </m:r>
-        <m:sSup>
-          <m:e>
-            <m:r>
-              <m:t>10</m:t>
-            </m:r>
-          </m:e>
-          <m:sup>
-            <m:r>
-              <m:t>2</m:t>
-            </m:r>
-          </m:sup>
-        </m:sSup>
-        <m:r>
-          <m:t>n</m:t>
-        </m:r>
-        <m:r>
-          <m:t>M</m:t>
-        </m:r>
-      </m:oMath>
-      <w:r>
-        <w:t xml:space="preserve">, at a concentration of</w:t>
-      </w:r>
-      <w:r>
-        <w:t xml:space="preserve"> </w:t>
-      </w:r>
-      <m:oMath>
-        <m:r>
-          <m:t>10</m:t>
-        </m:r>
         <m:r>
           <m:rPr>
             <m:sty m:val="p"/>
@@ -2176,7 +2065,45 @@
         </m:r>
       </m:oMath>
       <w:r>
-        <w:t xml:space="preserve">. b–e) Ligand bound ratio of (b)</w:t>
+        <w:t xml:space="preserve">, at a concentration</w:t>
+      </w:r>
+      <w:r>
+        <w:t xml:space="preserve"> </w:t>
+      </w:r>
+      <m:oMath>
+        <m:sSub>
+          <m:e>
+            <m:r>
+              <m:t>L</m:t>
+            </m:r>
+          </m:e>
+          <m:sub>
+            <m:r>
+              <m:t>0</m:t>
+            </m:r>
+          </m:sub>
+        </m:sSub>
+        <m:r>
+          <m:t>=</m:t>
+        </m:r>
+        <m:r>
+          <m:t>1</m:t>
+        </m:r>
+        <m:r>
+          <m:rPr>
+            <m:sty m:val="p"/>
+          </m:rPr>
+          <m:t>n</m:t>
+        </m:r>
+        <m:r>
+          <m:rPr>
+            <m:sty m:val="p"/>
+          </m:rPr>
+          <m:t>M</m:t>
+        </m:r>
+      </m:oMath>
+      <w:r>
+        <w:t xml:space="preserve">. Ligand bound ratio of (b)</w:t>
       </w:r>
       <w:r>
         <w:t xml:space="preserve"> </w:t>
@@ -2246,6 +2173,54 @@
           </m:sub>
           <m:sup>
             <m:r>
+              <m:t>l</m:t>
+            </m:r>
+            <m:r>
+              <m:t>o</m:t>
+            </m:r>
+          </m:sup>
+        </m:sSubSup>
+        <m:sSubSup>
+          <m:e>
+            <m:r>
+              <m:t>R</m:t>
+            </m:r>
+          </m:e>
+          <m:sub>
+            <m:r>
+              <m:t>2</m:t>
+            </m:r>
+          </m:sub>
+          <m:sup>
+            <m:r>
+              <m:t>h</m:t>
+            </m:r>
+            <m:r>
+              <m:t>i</m:t>
+            </m:r>
+          </m:sup>
+        </m:sSubSup>
+      </m:oMath>
+      <w:r>
+        <w:t xml:space="preserve">, (c)</w:t>
+      </w:r>
+      <w:r>
+        <w:t xml:space="preserve"> </w:t>
+      </w:r>
+      <m:oMath>
+        <m:sSubSup>
+          <m:e>
+            <m:r>
+              <m:t>R</m:t>
+            </m:r>
+          </m:e>
+          <m:sub>
+            <m:r>
+              <m:t>1</m:t>
+            </m:r>
+          </m:sub>
+          <m:sup>
+            <m:r>
               <m:t>m</m:t>
             </m:r>
             <m:r>
@@ -2269,6 +2244,108 @@
           </m:sub>
           <m:sup>
             <m:r>
+              <m:t>h</m:t>
+            </m:r>
+            <m:r>
+              <m:t>i</m:t>
+            </m:r>
+          </m:sup>
+        </m:sSubSup>
+      </m:oMath>
+      <w:r>
+        <w:t xml:space="preserve"> </w:t>
+      </w:r>
+      <w:r>
+        <w:t xml:space="preserve">to</w:t>
+      </w:r>
+      <w:r>
+        <w:t xml:space="preserve"> </w:t>
+      </w:r>
+      <m:oMath>
+        <m:sSubSup>
+          <m:e>
+            <m:r>
+              <m:t>R</m:t>
+            </m:r>
+          </m:e>
+          <m:sub>
+            <m:r>
+              <m:t>1</m:t>
+            </m:r>
+          </m:sub>
+          <m:sup>
+            <m:r>
+              <m:t>h</m:t>
+            </m:r>
+            <m:r>
+              <m:t>i</m:t>
+            </m:r>
+          </m:sup>
+        </m:sSubSup>
+        <m:sSubSup>
+          <m:e>
+            <m:r>
+              <m:t>R</m:t>
+            </m:r>
+          </m:e>
+          <m:sub>
+            <m:r>
+              <m:t>2</m:t>
+            </m:r>
+          </m:sub>
+          <m:sup>
+            <m:r>
+              <m:t>m</m:t>
+            </m:r>
+            <m:r>
+              <m:t>e</m:t>
+            </m:r>
+            <m:r>
+              <m:t>d</m:t>
+            </m:r>
+          </m:sup>
+        </m:sSubSup>
+      </m:oMath>
+      <w:r>
+        <w:t xml:space="preserve">, (d)</w:t>
+      </w:r>
+      <w:r>
+        <w:t xml:space="preserve"> </w:t>
+      </w:r>
+      <m:oMath>
+        <m:sSubSup>
+          <m:e>
+            <m:r>
+              <m:t>R</m:t>
+            </m:r>
+          </m:e>
+          <m:sub>
+            <m:r>
+              <m:t>1</m:t>
+            </m:r>
+          </m:sub>
+          <m:sup>
+            <m:r>
+              <m:t>h</m:t>
+            </m:r>
+            <m:r>
+              <m:t>i</m:t>
+            </m:r>
+          </m:sup>
+        </m:sSubSup>
+        <m:sSubSup>
+          <m:e>
+            <m:r>
+              <m:t>R</m:t>
+            </m:r>
+          </m:e>
+          <m:sub>
+            <m:r>
+              <m:t>2</m:t>
+            </m:r>
+          </m:sub>
+          <m:sup>
+            <m:r>
               <m:t>l</m:t>
             </m:r>
             <m:r>
@@ -2278,7 +2355,10 @@
         </m:sSubSup>
       </m:oMath>
       <w:r>
-        <w:t xml:space="preserve">, (c)</w:t>
+        <w:t xml:space="preserve"> </w:t>
+      </w:r>
+      <w:r>
+        <w:t xml:space="preserve">to</w:t>
       </w:r>
       <w:r>
         <w:t xml:space="preserve"> </w:t>
@@ -2320,6 +2400,34 @@
           </m:sub>
           <m:sup>
             <m:r>
+              <m:t>l</m:t>
+            </m:r>
+            <m:r>
+              <m:t>o</m:t>
+            </m:r>
+          </m:sup>
+        </m:sSubSup>
+      </m:oMath>
+      <w:r>
+        <w:t xml:space="preserve">, and (e)</w:t>
+      </w:r>
+      <w:r>
+        <w:t xml:space="preserve"> </w:t>
+      </w:r>
+      <m:oMath>
+        <m:sSubSup>
+          <m:e>
+            <m:r>
+              <m:t>R</m:t>
+            </m:r>
+          </m:e>
+          <m:sub>
+            <m:r>
+              <m:t>1</m:t>
+            </m:r>
+          </m:sub>
+          <m:sup>
+            <m:r>
               <m:t>h</m:t>
             </m:r>
             <m:r>
@@ -2327,6 +2435,26 @@
             </m:r>
           </m:sup>
         </m:sSubSup>
+        <m:sSubSup>
+          <m:e>
+            <m:r>
+              <m:t>R</m:t>
+            </m:r>
+          </m:e>
+          <m:sub>
+            <m:r>
+              <m:t>2</m:t>
+            </m:r>
+          </m:sub>
+          <m:sup>
+            <m:r>
+              <m:t>h</m:t>
+            </m:r>
+            <m:r>
+              <m:t>i</m:t>
+            </m:r>
+          </m:sup>
+        </m:sSubSup>
       </m:oMath>
       <w:r>
         <w:t xml:space="preserve"> </w:t>
@@ -2351,10 +2479,13 @@
           </m:sub>
           <m:sup>
             <m:r>
-              <m:t>h</m:t>
-            </m:r>
-            <m:r>
-              <m:t>i</m:t>
+              <m:t>m</m:t>
+            </m:r>
+            <m:r>
+              <m:t>e</m:t>
+            </m:r>
+            <m:r>
+              <m:t>d</m:t>
             </m:r>
           </m:sup>
         </m:sSubSup>
@@ -2378,210 +2509,6 @@
             </m:r>
             <m:r>
               <m:t>d</m:t>
-            </m:r>
-          </m:sup>
-        </m:sSubSup>
-      </m:oMath>
-      <w:r>
-        <w:t xml:space="preserve">, (d)</w:t>
-      </w:r>
-      <w:r>
-        <w:t xml:space="preserve"> </w:t>
-      </w:r>
-      <m:oMath>
-        <m:sSubSup>
-          <m:e>
-            <m:r>
-              <m:t>R</m:t>
-            </m:r>
-          </m:e>
-          <m:sub>
-            <m:r>
-              <m:t>1</m:t>
-            </m:r>
-          </m:sub>
-          <m:sup>
-            <m:r>
-              <m:t>h</m:t>
-            </m:r>
-            <m:r>
-              <m:t>i</m:t>
-            </m:r>
-          </m:sup>
-        </m:sSubSup>
-        <m:sSubSup>
-          <m:e>
-            <m:r>
-              <m:t>R</m:t>
-            </m:r>
-          </m:e>
-          <m:sub>
-            <m:r>
-              <m:t>2</m:t>
-            </m:r>
-          </m:sub>
-          <m:sup>
-            <m:r>
-              <m:t>h</m:t>
-            </m:r>
-            <m:r>
-              <m:t>i</m:t>
-            </m:r>
-          </m:sup>
-        </m:sSubSup>
-      </m:oMath>
-      <w:r>
-        <w:t xml:space="preserve"> </w:t>
-      </w:r>
-      <w:r>
-        <w:t xml:space="preserve">to</w:t>
-      </w:r>
-      <w:r>
-        <w:t xml:space="preserve"> </w:t>
-      </w:r>
-      <m:oMath>
-        <m:sSubSup>
-          <m:e>
-            <m:r>
-              <m:t>R</m:t>
-            </m:r>
-          </m:e>
-          <m:sub>
-            <m:r>
-              <m:t>1</m:t>
-            </m:r>
-          </m:sub>
-          <m:sup>
-            <m:r>
-              <m:t>m</m:t>
-            </m:r>
-            <m:r>
-              <m:t>e</m:t>
-            </m:r>
-            <m:r>
-              <m:t>d</m:t>
-            </m:r>
-          </m:sup>
-        </m:sSubSup>
-        <m:sSubSup>
-          <m:e>
-            <m:r>
-              <m:t>R</m:t>
-            </m:r>
-          </m:e>
-          <m:sub>
-            <m:r>
-              <m:t>2</m:t>
-            </m:r>
-          </m:sub>
-          <m:sup>
-            <m:r>
-              <m:t>m</m:t>
-            </m:r>
-            <m:r>
-              <m:t>e</m:t>
-            </m:r>
-            <m:r>
-              <m:t>d</m:t>
-            </m:r>
-          </m:sup>
-        </m:sSubSup>
-      </m:oMath>
-      <w:r>
-        <w:t xml:space="preserve">, and (e)</w:t>
-      </w:r>
-      <w:r>
-        <w:t xml:space="preserve"> </w:t>
-      </w:r>
-      <m:oMath>
-        <m:sSubSup>
-          <m:e>
-            <m:r>
-              <m:t>R</m:t>
-            </m:r>
-          </m:e>
-          <m:sub>
-            <m:r>
-              <m:t>1</m:t>
-            </m:r>
-          </m:sub>
-          <m:sup>
-            <m:r>
-              <m:t>h</m:t>
-            </m:r>
-            <m:r>
-              <m:t>i</m:t>
-            </m:r>
-          </m:sup>
-        </m:sSubSup>
-        <m:sSubSup>
-          <m:e>
-            <m:r>
-              <m:t>R</m:t>
-            </m:r>
-          </m:e>
-          <m:sub>
-            <m:r>
-              <m:t>2</m:t>
-            </m:r>
-          </m:sub>
-          <m:sup>
-            <m:r>
-              <m:t>l</m:t>
-            </m:r>
-            <m:r>
-              <m:t>o</m:t>
-            </m:r>
-          </m:sup>
-        </m:sSubSup>
-      </m:oMath>
-      <w:r>
-        <w:t xml:space="preserve"> </w:t>
-      </w:r>
-      <w:r>
-        <w:t xml:space="preserve">to</w:t>
-      </w:r>
-      <w:r>
-        <w:t xml:space="preserve"> </w:t>
-      </w:r>
-      <m:oMath>
-        <m:sSubSup>
-          <m:e>
-            <m:r>
-              <m:t>R</m:t>
-            </m:r>
-          </m:e>
-          <m:sub>
-            <m:r>
-              <m:t>1</m:t>
-            </m:r>
-          </m:sub>
-          <m:sup>
-            <m:r>
-              <m:t>l</m:t>
-            </m:r>
-            <m:r>
-              <m:t>o</m:t>
-            </m:r>
-          </m:sup>
-        </m:sSubSup>
-        <m:sSubSup>
-          <m:e>
-            <m:r>
-              <m:t>R</m:t>
-            </m:r>
-          </m:e>
-          <m:sub>
-            <m:r>
-              <m:t>2</m:t>
-            </m:r>
-          </m:sub>
-          <m:sup>
-            <m:r>
-              <m:t>h</m:t>
-            </m:r>
-            <m:r>
-              <m:t>i</m:t>
             </m:r>
           </m:sup>
         </m:sSubSup>
@@ -2596,7 +2523,105 @@
         <w:pStyle w:val="BodyText"/>
       </w:pPr>
       <w:r>
-        <w:t xml:space="preserve">When a target cell population expresses a unique receptor or pattern of receptors, enhancing the affinity to this receptor or reducing the affinity to other receptors are clear strategies to increase selective binding (Fig.</w:t>
+        <w:t xml:space="preserve">We first explored altering the affinities of a ligand to the receptors as an engineering strategy to enhance its cell population specificity. Here, we showed the binding pattern of monovalent ligands with various affinities ranging from</w:t>
+      </w:r>
+      <w:r>
+        <w:t xml:space="preserve"> </w:t>
+      </w:r>
+      <m:oMath>
+        <m:r>
+          <m:t>10000</m:t>
+        </m:r>
+        <m:r>
+          <m:rPr>
+            <m:sty m:val="p"/>
+          </m:rPr>
+          <m:t>n</m:t>
+        </m:r>
+        <m:r>
+          <m:rPr>
+            <m:sty m:val="p"/>
+          </m:rPr>
+          <m:t>M</m:t>
+        </m:r>
+      </m:oMath>
+      <w:r>
+        <w:t xml:space="preserve"> </w:t>
+      </w:r>
+      <w:r>
+        <w:t xml:space="preserve">to</w:t>
+      </w:r>
+      <w:r>
+        <w:t xml:space="preserve"> </w:t>
+      </w:r>
+      <m:oMath>
+        <m:r>
+          <m:t>100</m:t>
+        </m:r>
+        <m:r>
+          <m:rPr>
+            <m:sty m:val="p"/>
+          </m:rPr>
+          <m:t>n</m:t>
+        </m:r>
+        <m:r>
+          <m:rPr>
+            <m:sty m:val="p"/>
+          </m:rPr>
+          <m:t>M</m:t>
+        </m:r>
+      </m:oMath>
+      <w:r>
+        <w:t xml:space="preserve"> </w:t>
+      </w:r>
+      <w:r>
+        <w:t xml:space="preserve">to the two receptors</w:t>
+      </w:r>
+      <w:r>
+        <w:t xml:space="preserve"> </w:t>
+      </w:r>
+      <m:oMath>
+        <m:sSub>
+          <m:e>
+            <m:r>
+              <m:t>R</m:t>
+            </m:r>
+          </m:e>
+          <m:sub>
+            <m:r>
+              <m:t>1</m:t>
+            </m:r>
+          </m:sub>
+        </m:sSub>
+      </m:oMath>
+      <w:r>
+        <w:t xml:space="preserve"> </w:t>
+      </w:r>
+      <w:r>
+        <w:t xml:space="preserve">and</w:t>
+      </w:r>
+      <w:r>
+        <w:t xml:space="preserve"> </w:t>
+      </w:r>
+      <m:oMath>
+        <m:sSub>
+          <m:e>
+            <m:r>
+              <m:t>R</m:t>
+            </m:r>
+          </m:e>
+          <m:sub>
+            <m:r>
+              <m:t>2</m:t>
+            </m:r>
+          </m:sub>
+        </m:sSub>
+      </m:oMath>
+      <w:r>
+        <w:t xml:space="preserve"> </w:t>
+      </w:r>
+      <w:r>
+        <w:t xml:space="preserve">(Fig.</w:t>
       </w:r>
       <w:r>
         <w:t xml:space="preserve"> </w:t>
@@ -2610,7 +2635,7 @@
         </w:r>
       </w:hyperlink>
       <w:r>
-        <w:t xml:space="preserve">a). As an example, cell type</w:t>
+        <w:t xml:space="preserve">a). When a target cell population expresses a receptor uniquely higher than other populations, enhancing the affinity of the drug to this receptor is a clear strategy to increase selective binding to this population. For example,</w:t>
       </w:r>
       <w:r>
         <w:t xml:space="preserve"> </w:t>
@@ -2661,13 +2686,13 @@
         <w:t xml:space="preserve"> </w:t>
       </w:r>
       <w:r>
-        <w:t xml:space="preserve">expresses a high amount of receptor 1, while type</w:t>
-      </w:r>
-      <w:r>
-        <w:t xml:space="preserve"> </w:t>
-      </w:r>
-      <m:oMath>
-        <m:sSubSup>
+        <w:t xml:space="preserve">only expresses a high amount of</w:t>
+      </w:r>
+      <w:r>
+        <w:t xml:space="preserve"> </w:t>
+      </w:r>
+      <m:oMath>
+        <m:sSub>
           <m:e>
             <m:r>
               <m:t>R</m:t>
@@ -2678,6 +2703,26 @@
               <m:t>1</m:t>
             </m:r>
           </m:sub>
+        </m:sSub>
+      </m:oMath>
+      <w:r>
+        <w:t xml:space="preserve">, while</w:t>
+      </w:r>
+      <w:r>
+        <w:t xml:space="preserve"> </w:t>
+      </w:r>
+      <m:oMath>
+        <m:sSubSup>
+          <m:e>
+            <m:r>
+              <m:t>R</m:t>
+            </m:r>
+          </m:e>
+          <m:sub>
+            <m:r>
+              <m:t>1</m:t>
+            </m:r>
+          </m:sub>
           <m:sup>
             <m:r>
               <m:t>l</m:t>
@@ -2712,7 +2757,124 @@
         <w:t xml:space="preserve"> </w:t>
       </w:r>
       <w:r>
-        <w:t xml:space="preserve">expresses receptor 2 at a higher abundance (Fig.</w:t>
+        <w:t xml:space="preserve">only expresses a high amount of</w:t>
+      </w:r>
+      <w:r>
+        <w:t xml:space="preserve"> </w:t>
+      </w:r>
+      <m:oMath>
+        <m:sSub>
+          <m:e>
+            <m:r>
+              <m:t>R</m:t>
+            </m:r>
+          </m:e>
+          <m:sub>
+            <m:r>
+              <m:t>2</m:t>
+            </m:r>
+          </m:sub>
+        </m:sSub>
+      </m:oMath>
+      <w:r>
+        <w:t xml:space="preserve">. When the affinity to</w:t>
+      </w:r>
+      <w:r>
+        <w:t xml:space="preserve"> </w:t>
+      </w:r>
+      <m:oMath>
+        <m:sSub>
+          <m:e>
+            <m:r>
+              <m:t>R</m:t>
+            </m:r>
+          </m:e>
+          <m:sub>
+            <m:r>
+              <m:t>1</m:t>
+            </m:r>
+          </m:sub>
+        </m:sSub>
+      </m:oMath>
+      <w:r>
+        <w:t xml:space="preserve"> </w:t>
+      </w:r>
+      <w:r>
+        <w:t xml:space="preserve">is enhanced and the affinity to</w:t>
+      </w:r>
+      <w:r>
+        <w:t xml:space="preserve"> </w:t>
+      </w:r>
+      <m:oMath>
+        <m:sSub>
+          <m:e>
+            <m:r>
+              <m:t>R</m:t>
+            </m:r>
+          </m:e>
+          <m:sub>
+            <m:r>
+              <m:t>2</m:t>
+            </m:r>
+          </m:sub>
+        </m:sSub>
+      </m:oMath>
+      <w:r>
+        <w:t xml:space="preserve"> </w:t>
+      </w:r>
+      <w:r>
+        <w:t xml:space="preserve">is reduced, the binding selectivity towards</w:t>
+      </w:r>
+      <w:r>
+        <w:t xml:space="preserve"> </w:t>
+      </w:r>
+      <m:oMath>
+        <m:sSubSup>
+          <m:e>
+            <m:r>
+              <m:t>R</m:t>
+            </m:r>
+          </m:e>
+          <m:sub>
+            <m:r>
+              <m:t>1</m:t>
+            </m:r>
+          </m:sub>
+          <m:sup>
+            <m:r>
+              <m:t>h</m:t>
+            </m:r>
+            <m:r>
+              <m:t>i</m:t>
+            </m:r>
+          </m:sup>
+        </m:sSubSup>
+        <m:sSubSup>
+          <m:e>
+            <m:r>
+              <m:t>R</m:t>
+            </m:r>
+          </m:e>
+          <m:sub>
+            <m:r>
+              <m:t>2</m:t>
+            </m:r>
+          </m:sub>
+          <m:sup>
+            <m:r>
+              <m:t>l</m:t>
+            </m:r>
+            <m:r>
+              <m:t>o</m:t>
+            </m:r>
+          </m:sup>
+        </m:sSubSup>
+      </m:oMath>
+      <w:r>
+        <w:t xml:space="preserve"> </w:t>
+      </w:r>
+      <w:r>
+        <w:t xml:space="preserve">increases (Fig.</w:t>
       </w:r>
       <w:r>
         <w:t xml:space="preserve"> </w:t>
@@ -2726,109 +2888,7 @@
         </w:r>
       </w:hyperlink>
       <w:r>
-        <w:t xml:space="preserve">a). Enhancing ligand affinity for receptor 1 and weakening its interaction with receptor 2 results in improved binding selectivity toward</w:t>
-      </w:r>
-      <w:r>
-        <w:t xml:space="preserve"> </w:t>
-      </w:r>
-      <m:oMath>
-        <m:sSubSup>
-          <m:e>
-            <m:r>
-              <m:t>R</m:t>
-            </m:r>
-          </m:e>
-          <m:sub>
-            <m:r>
-              <m:t>1</m:t>
-            </m:r>
-          </m:sub>
-          <m:sup>
-            <m:r>
-              <m:t>h</m:t>
-            </m:r>
-            <m:r>
-              <m:t>i</m:t>
-            </m:r>
-          </m:sup>
-        </m:sSubSup>
-        <m:sSubSup>
-          <m:e>
-            <m:r>
-              <m:t>R</m:t>
-            </m:r>
-          </m:e>
-          <m:sub>
-            <m:r>
-              <m:t>2</m:t>
-            </m:r>
-          </m:sub>
-          <m:sup>
-            <m:r>
-              <m:t>l</m:t>
-            </m:r>
-            <m:r>
-              <m:t>o</m:t>
-            </m:r>
-          </m:sup>
-        </m:sSubSup>
-      </m:oMath>
-      <w:r>
-        <w:t xml:space="preserve"> </w:t>
-      </w:r>
-      <w:r>
-        <w:t xml:space="preserve">over</w:t>
-      </w:r>
-      <w:r>
-        <w:t xml:space="preserve"> </w:t>
-      </w:r>
-      <m:oMath>
-        <m:sSubSup>
-          <m:e>
-            <m:r>
-              <m:t>R</m:t>
-            </m:r>
-          </m:e>
-          <m:sub>
-            <m:r>
-              <m:t>1</m:t>
-            </m:r>
-          </m:sub>
-          <m:sup>
-            <m:r>
-              <m:t>l</m:t>
-            </m:r>
-            <m:r>
-              <m:t>o</m:t>
-            </m:r>
-          </m:sup>
-        </m:sSubSup>
-        <m:sSubSup>
-          <m:e>
-            <m:r>
-              <m:t>R</m:t>
-            </m:r>
-          </m:e>
-          <m:sub>
-            <m:r>
-              <m:t>2</m:t>
-            </m:r>
-          </m:sub>
-          <m:sup>
-            <m:r>
-              <m:t>h</m:t>
-            </m:r>
-            <m:r>
-              <m:t>i</m:t>
-            </m:r>
-          </m:sup>
-        </m:sSubSup>
-      </m:oMath>
-      <w:r>
-        <w:t xml:space="preserve"> </w:t>
-      </w:r>
-      <w:r>
-        <w:t xml:space="preserve">(Fig.</w:t>
+        <w:t xml:space="preserve">b). The contour plots in Fig.</w:t>
       </w:r>
       <w:r>
         <w:t xml:space="preserve"> </w:t>
@@ -2842,7 +2902,200 @@
         </w:r>
       </w:hyperlink>
       <w:r>
-        <w:t xml:space="preserve">e). Unsurprisingly, all cell populations with abundant receptor 1 bind greater amounts of ligand in this case. The contour plot on the background shows this trend more intuitively: when the affinity of receptor 1 increases (from the subplots on the left to those on the right), the contour lines shift inward and cluster more densely, indicating an enhanced sensitivity of binding to expression of receptor 1.</w:t>
+        <w:t xml:space="preserve">a shows this trend more intuitively: when the affinity of</w:t>
+      </w:r>
+      <w:r>
+        <w:t xml:space="preserve"> </w:t>
+      </w:r>
+      <m:oMath>
+        <m:sSub>
+          <m:e>
+            <m:r>
+              <m:t>R</m:t>
+            </m:r>
+          </m:e>
+          <m:sub>
+            <m:r>
+              <m:t>1</m:t>
+            </m:r>
+          </m:sub>
+        </m:sSub>
+      </m:oMath>
+      <w:r>
+        <w:t xml:space="preserve"> </w:t>
+      </w:r>
+      <w:r>
+        <w:t xml:space="preserve">increases, which corresponds to shifting from the left subplots to the right ones, the contour lines of higher values shift inward and cluster more densely, indicating an increase in the amount of ligand bound for the populations with high</w:t>
+      </w:r>
+      <w:r>
+        <w:t xml:space="preserve"> </w:t>
+      </w:r>
+      <m:oMath>
+        <m:sSub>
+          <m:e>
+            <m:r>
+              <m:t>R</m:t>
+            </m:r>
+          </m:e>
+          <m:sub>
+            <m:r>
+              <m:t>1</m:t>
+            </m:r>
+          </m:sub>
+        </m:sSub>
+      </m:oMath>
+      <w:r>
+        <w:t xml:space="preserve"> </w:t>
+      </w:r>
+      <w:r>
+        <w:t xml:space="preserve">expression, such as</w:t>
+      </w:r>
+      <w:r>
+        <w:t xml:space="preserve"> </w:t>
+      </w:r>
+      <m:oMath>
+        <m:sSubSup>
+          <m:e>
+            <m:r>
+              <m:t>R</m:t>
+            </m:r>
+          </m:e>
+          <m:sub>
+            <m:r>
+              <m:t>1</m:t>
+            </m:r>
+          </m:sub>
+          <m:sup>
+            <m:r>
+              <m:t>h</m:t>
+            </m:r>
+            <m:r>
+              <m:t>i</m:t>
+            </m:r>
+          </m:sup>
+        </m:sSubSup>
+        <m:sSubSup>
+          <m:e>
+            <m:r>
+              <m:t>R</m:t>
+            </m:r>
+          </m:e>
+          <m:sub>
+            <m:r>
+              <m:t>2</m:t>
+            </m:r>
+          </m:sub>
+          <m:sup>
+            <m:r>
+              <m:t>h</m:t>
+            </m:r>
+            <m:r>
+              <m:t>i</m:t>
+            </m:r>
+          </m:sup>
+        </m:sSubSup>
+      </m:oMath>
+      <w:r>
+        <w:t xml:space="preserve">,</w:t>
+      </w:r>
+      <w:r>
+        <w:t xml:space="preserve"> </w:t>
+      </w:r>
+      <m:oMath>
+        <m:sSubSup>
+          <m:e>
+            <m:r>
+              <m:t>R</m:t>
+            </m:r>
+          </m:e>
+          <m:sub>
+            <m:r>
+              <m:t>1</m:t>
+            </m:r>
+          </m:sub>
+          <m:sup>
+            <m:r>
+              <m:t>h</m:t>
+            </m:r>
+            <m:r>
+              <m:t>i</m:t>
+            </m:r>
+          </m:sup>
+        </m:sSubSup>
+        <m:sSubSup>
+          <m:e>
+            <m:r>
+              <m:t>R</m:t>
+            </m:r>
+          </m:e>
+          <m:sub>
+            <m:r>
+              <m:t>2</m:t>
+            </m:r>
+          </m:sub>
+          <m:sup>
+            <m:r>
+              <m:t>m</m:t>
+            </m:r>
+            <m:r>
+              <m:t>e</m:t>
+            </m:r>
+            <m:r>
+              <m:t>d</m:t>
+            </m:r>
+          </m:sup>
+        </m:sSubSup>
+      </m:oMath>
+      <w:r>
+        <w:t xml:space="preserve">, and</w:t>
+      </w:r>
+      <w:r>
+        <w:t xml:space="preserve"> </w:t>
+      </w:r>
+      <m:oMath>
+        <m:sSubSup>
+          <m:e>
+            <m:r>
+              <m:t>R</m:t>
+            </m:r>
+          </m:e>
+          <m:sub>
+            <m:r>
+              <m:t>1</m:t>
+            </m:r>
+          </m:sub>
+          <m:sup>
+            <m:r>
+              <m:t>h</m:t>
+            </m:r>
+            <m:r>
+              <m:t>i</m:t>
+            </m:r>
+          </m:sup>
+        </m:sSubSup>
+        <m:sSubSup>
+          <m:e>
+            <m:r>
+              <m:t>R</m:t>
+            </m:r>
+          </m:e>
+          <m:sub>
+            <m:r>
+              <m:t>2</m:t>
+            </m:r>
+          </m:sub>
+          <m:sup>
+            <m:r>
+              <m:t>l</m:t>
+            </m:r>
+            <m:r>
+              <m:t>o</m:t>
+            </m:r>
+          </m:sup>
+        </m:sSubSup>
+      </m:oMath>
+      <w:r>
+        <w:t xml:space="preserve">.</w:t>
       </w:r>
     </w:p>
     <w:p>
@@ -2850,7 +3103,7 @@
         <w:pStyle w:val="BodyText"/>
       </w:pPr>
       <w:r>
-        <w:t xml:space="preserve">However, just as often, both on- and off-target cell populations express the same set of receptors and only differ in their magnitude of expression. An example of this pattern is</w:t>
+        <w:t xml:space="preserve">However, it is quite often that both on- and off-target cell populations express the same set of receptors and only differ in their magnitude of expression. In these cases, we found out that it is beneficial for the drug to bind tightly to the most comparatively highly expressed receptor on the target population. Some examples of this pattern are the selective binding to</w:t>
       </w:r>
       <w:r>
         <w:t xml:space="preserve"> </w:t>
@@ -2904,7 +3157,7 @@
         <w:t xml:space="preserve"> </w:t>
       </w:r>
       <w:r>
-        <w:t xml:space="preserve">and</w:t>
+        <w:t xml:space="preserve">over</w:t>
       </w:r>
       <w:r>
         <w:t xml:space="preserve"> </w:t>
@@ -2950,6 +3203,108 @@
             </m:r>
             <m:r>
               <m:t>d</m:t>
+            </m:r>
+          </m:sup>
+        </m:sSubSup>
+      </m:oMath>
+      <w:r>
+        <w:t xml:space="preserve">, and</w:t>
+      </w:r>
+      <w:r>
+        <w:t xml:space="preserve"> </w:t>
+      </w:r>
+      <m:oMath>
+        <m:sSubSup>
+          <m:e>
+            <m:r>
+              <m:t>R</m:t>
+            </m:r>
+          </m:e>
+          <m:sub>
+            <m:r>
+              <m:t>1</m:t>
+            </m:r>
+          </m:sub>
+          <m:sup>
+            <m:r>
+              <m:t>h</m:t>
+            </m:r>
+            <m:r>
+              <m:t>i</m:t>
+            </m:r>
+          </m:sup>
+        </m:sSubSup>
+        <m:sSubSup>
+          <m:e>
+            <m:r>
+              <m:t>R</m:t>
+            </m:r>
+          </m:e>
+          <m:sub>
+            <m:r>
+              <m:t>2</m:t>
+            </m:r>
+          </m:sub>
+          <m:sup>
+            <m:r>
+              <m:t>l</m:t>
+            </m:r>
+            <m:r>
+              <m:t>o</m:t>
+            </m:r>
+          </m:sup>
+        </m:sSubSup>
+      </m:oMath>
+      <w:r>
+        <w:t xml:space="preserve"> </w:t>
+      </w:r>
+      <w:r>
+        <w:t xml:space="preserve">over</w:t>
+      </w:r>
+      <w:r>
+        <w:t xml:space="preserve"> </w:t>
+      </w:r>
+      <m:oMath>
+        <m:sSubSup>
+          <m:e>
+            <m:r>
+              <m:t>R</m:t>
+            </m:r>
+          </m:e>
+          <m:sub>
+            <m:r>
+              <m:t>1</m:t>
+            </m:r>
+          </m:sub>
+          <m:sup>
+            <m:r>
+              <m:t>m</m:t>
+            </m:r>
+            <m:r>
+              <m:t>e</m:t>
+            </m:r>
+            <m:r>
+              <m:t>d</m:t>
+            </m:r>
+          </m:sup>
+        </m:sSubSup>
+        <m:sSubSup>
+          <m:e>
+            <m:r>
+              <m:t>R</m:t>
+            </m:r>
+          </m:e>
+          <m:sub>
+            <m:r>
+              <m:t>2</m:t>
+            </m:r>
+          </m:sub>
+          <m:sup>
+            <m:r>
+              <m:t>l</m:t>
+            </m:r>
+            <m:r>
+              <m:t>o</m:t>
             </m:r>
           </m:sup>
         </m:sSubSup>
@@ -2972,7 +3327,7 @@
         </w:r>
       </w:hyperlink>
       <w:r>
-        <w:t xml:space="preserve">a). In this case, the benefit of affinity changes is limited to the relative difference in receptor amounts (Fig.</w:t>
+        <w:t xml:space="preserve">a). For these two pairs, the benefit of affinity changes is limited to the relative discrepancy in receptor amounts (Fig.</w:t>
       </w:r>
       <w:r>
         <w:t xml:space="preserve"> </w:t>
@@ -2986,7 +3341,7 @@
         </w:r>
       </w:hyperlink>
       <w:r>
-        <w:t xml:space="preserve">c). In situations where both target and off target receptors express of a receptor of interest, but in differing quantities, such as when comparing</w:t>
+        <w:t xml:space="preserve">c,d). Since the more highly expressed receptors have only 10-fold difference comparing with the 100-fold difference in</w:t>
       </w:r>
       <w:r>
         <w:t xml:space="preserve"> </w:t>
@@ -3037,6 +3392,105 @@
         <w:t xml:space="preserve"> </w:t>
       </w:r>
       <w:r>
+        <w:t xml:space="preserve">over</w:t>
+      </w:r>
+      <w:r>
+        <w:t xml:space="preserve"> </w:t>
+      </w:r>
+      <m:oMath>
+        <m:sSubSup>
+          <m:e>
+            <m:r>
+              <m:t>R</m:t>
+            </m:r>
+          </m:e>
+          <m:sub>
+            <m:r>
+              <m:t>1</m:t>
+            </m:r>
+          </m:sub>
+          <m:sup>
+            <m:r>
+              <m:t>l</m:t>
+            </m:r>
+            <m:r>
+              <m:t>o</m:t>
+            </m:r>
+          </m:sup>
+        </m:sSubSup>
+        <m:sSubSup>
+          <m:e>
+            <m:r>
+              <m:t>R</m:t>
+            </m:r>
+          </m:e>
+          <m:sub>
+            <m:r>
+              <m:t>2</m:t>
+            </m:r>
+          </m:sub>
+          <m:sup>
+            <m:r>
+              <m:t>h</m:t>
+            </m:r>
+            <m:r>
+              <m:t>i</m:t>
+            </m:r>
+          </m:sup>
+        </m:sSubSup>
+      </m:oMath>
+      <w:r>
+        <w:t xml:space="preserve">, the greatest binding ratios these two pairs can achieve are no more than 10 times instead of 50 times. When both receptors are uniformally more abundant in a target population than the off target population, such as when comparing</w:t>
+      </w:r>
+      <w:r>
+        <w:t xml:space="preserve"> </w:t>
+      </w:r>
+      <m:oMath>
+        <m:sSubSup>
+          <m:e>
+            <m:r>
+              <m:t>R</m:t>
+            </m:r>
+          </m:e>
+          <m:sub>
+            <m:r>
+              <m:t>1</m:t>
+            </m:r>
+          </m:sub>
+          <m:sup>
+            <m:r>
+              <m:t>h</m:t>
+            </m:r>
+            <m:r>
+              <m:t>i</m:t>
+            </m:r>
+          </m:sup>
+        </m:sSubSup>
+        <m:sSubSup>
+          <m:e>
+            <m:r>
+              <m:t>R</m:t>
+            </m:r>
+          </m:e>
+          <m:sub>
+            <m:r>
+              <m:t>2</m:t>
+            </m:r>
+          </m:sub>
+          <m:sup>
+            <m:r>
+              <m:t>h</m:t>
+            </m:r>
+            <m:r>
+              <m:t>i</m:t>
+            </m:r>
+          </m:sup>
+        </m:sSubSup>
+      </m:oMath>
+      <w:r>
+        <w:t xml:space="preserve"> </w:t>
+      </w:r>
+      <w:r>
         <w:t xml:space="preserve">to</w:t>
       </w:r>
       <w:r>
@@ -3079,16 +3533,19 @@
           </m:sub>
           <m:sup>
             <m:r>
-              <m:t>l</m:t>
-            </m:r>
-            <m:r>
-              <m:t>o</m:t>
-            </m:r>
-          </m:sup>
-        </m:sSubSup>
-      </m:oMath>
-      <w:r>
-        <w:t xml:space="preserve">, we see that it is beneficial for a ligand to bind most tightly to the differentially expressed receptor (Fig.</w:t>
+              <m:t>m</m:t>
+            </m:r>
+            <m:r>
+              <m:t>e</m:t>
+            </m:r>
+            <m:r>
+              <m:t>d</m:t>
+            </m:r>
+          </m:sup>
+        </m:sSubSup>
+      </m:oMath>
+      <w:r>
+        <w:t xml:space="preserve">, affinity tuning doesn’t change selective binding (Fig.</w:t>
       </w:r>
       <w:r>
         <w:t xml:space="preserve"> </w:t>
@@ -3102,7 +3559,15 @@
         </w:r>
       </w:hyperlink>
       <w:r>
-        <w:t xml:space="preserve">b). When both receptors are uniformally more abundant in a target population than the off target population, such as when comparing</w:t>
+        <w:t xml:space="preserve">d). Therefore, to use affinity changes for selectivity enhancement, it is critical to identify which receptors a cell population of interest expresses the most uniquely.</w:t>
+      </w:r>
+    </w:p>
+    <w:p>
+      <w:pPr>
+        <w:pStyle w:val="BodyText"/>
+      </w:pPr>
+      <w:r>
+        <w:t xml:space="preserve">Through reading the contour plots, we can also ponder how affinity changes affect the intrapopulation heterogeneity. For example,</w:t>
       </w:r>
       <w:r>
         <w:t xml:space="preserve"> </w:t>
@@ -3121,10 +3586,13 @@
           </m:sub>
           <m:sup>
             <m:r>
-              <m:t>h</m:t>
-            </m:r>
-            <m:r>
-              <m:t>i</m:t>
+              <m:t>m</m:t>
+            </m:r>
+            <m:r>
+              <m:t>e</m:t>
+            </m:r>
+            <m:r>
+              <m:t>d</m:t>
             </m:r>
           </m:sup>
         </m:sSubSup>
@@ -3141,25 +3609,28 @@
           </m:sub>
           <m:sup>
             <m:r>
-              <m:t>h</m:t>
-            </m:r>
-            <m:r>
-              <m:t>i</m:t>
-            </m:r>
-          </m:sup>
-        </m:sSubSup>
-      </m:oMath>
-      <w:r>
-        <w:t xml:space="preserve"> </w:t>
-      </w:r>
-      <w:r>
-        <w:t xml:space="preserve">to</w:t>
-      </w:r>
-      <w:r>
-        <w:t xml:space="preserve"> </w:t>
-      </w:r>
-      <m:oMath>
-        <m:sSubSup>
+              <m:t>m</m:t>
+            </m:r>
+            <m:r>
+              <m:t>e</m:t>
+            </m:r>
+            <m:r>
+              <m:t>d</m:t>
+            </m:r>
+          </m:sup>
+        </m:sSubSup>
+      </m:oMath>
+      <w:r>
+        <w:t xml:space="preserve"> </w:t>
+      </w:r>
+      <w:r>
+        <w:t xml:space="preserve">has relatively high variance in both</w:t>
+      </w:r>
+      <w:r>
+        <w:t xml:space="preserve"> </w:t>
+      </w:r>
+      <m:oMath>
+        <m:sSub>
           <m:e>
             <m:r>
               <m:t>R</m:t>
@@ -3170,19 +3641,19 @@
               <m:t>1</m:t>
             </m:r>
           </m:sub>
-          <m:sup>
-            <m:r>
-              <m:t>m</m:t>
-            </m:r>
-            <m:r>
-              <m:t>e</m:t>
-            </m:r>
-            <m:r>
-              <m:t>d</m:t>
-            </m:r>
-          </m:sup>
-        </m:sSubSup>
-        <m:sSubSup>
+        </m:sSub>
+      </m:oMath>
+      <w:r>
+        <w:t xml:space="preserve"> </w:t>
+      </w:r>
+      <w:r>
+        <w:t xml:space="preserve">and</w:t>
+      </w:r>
+      <w:r>
+        <w:t xml:space="preserve"> </w:t>
+      </w:r>
+      <m:oMath>
+        <m:sSub>
           <m:e>
             <m:r>
               <m:t>R</m:t>
@@ -3193,21 +3664,13 @@
               <m:t>2</m:t>
             </m:r>
           </m:sub>
-          <m:sup>
-            <m:r>
-              <m:t>m</m:t>
-            </m:r>
-            <m:r>
-              <m:t>e</m:t>
-            </m:r>
-            <m:r>
-              <m:t>d</m:t>
-            </m:r>
-          </m:sup>
-        </m:sSubSup>
-      </m:oMath>
-      <w:r>
-        <w:t xml:space="preserve">, affinity tuning is inneffective (Fig.</w:t>
+        </m:sSub>
+      </m:oMath>
+      <w:r>
+        <w:t xml:space="preserve"> </w:t>
+      </w:r>
+      <w:r>
+        <w:t xml:space="preserve">expression (Fig.</w:t>
       </w:r>
       <w:r>
         <w:t xml:space="preserve"> </w:t>
@@ -3221,21 +3684,16 @@
         </w:r>
       </w:hyperlink>
       <w:r>
-        <w:t xml:space="preserve">d). Thus, to use affinity changes for selectivity enhancement it is critical to identify which receptors a cell population of interest expresses most uniquely.</w:t>
-      </w:r>
-    </w:p>
-    <w:p>
-      <w:pPr>
-        <w:pStyle w:val="BodyText"/>
-      </w:pPr>
-      <w:r>
-        <w:t xml:space="preserve">Cell populations are made up of individual cells with heterogeneous amounts of receptor. For example,</w:t>
-      </w:r>
-      <w:r>
-        <w:t xml:space="preserve"> </w:t>
-      </w:r>
-      <m:oMath>
-        <m:sSubSup>
+        <w:t xml:space="preserve"> </w:t>
+      </w:r>
+      <w:r>
+        <w:t xml:space="preserve">a). When the binding affinities to</w:t>
+      </w:r>
+      <w:r>
+        <w:t xml:space="preserve"> </w:t>
+      </w:r>
+      <m:oMath>
+        <m:sSub>
           <m:e>
             <m:r>
               <m:t>R</m:t>
@@ -3246,19 +3704,19 @@
               <m:t>1</m:t>
             </m:r>
           </m:sub>
-          <m:sup>
-            <m:r>
-              <m:t>m</m:t>
-            </m:r>
-            <m:r>
-              <m:t>e</m:t>
-            </m:r>
-            <m:r>
-              <m:t>d</m:t>
-            </m:r>
-          </m:sup>
-        </m:sSubSup>
-        <m:sSubSup>
+        </m:sSub>
+      </m:oMath>
+      <w:r>
+        <w:t xml:space="preserve"> </w:t>
+      </w:r>
+      <w:r>
+        <w:t xml:space="preserve">and</w:t>
+      </w:r>
+      <w:r>
+        <w:t xml:space="preserve"> </w:t>
+      </w:r>
+      <m:oMath>
+        <m:sSub>
           <m:e>
             <m:r>
               <m:t>R</m:t>
@@ -3269,24 +3727,13 @@
               <m:t>2</m:t>
             </m:r>
           </m:sub>
-          <m:sup>
-            <m:r>
-              <m:t>m</m:t>
-            </m:r>
-            <m:r>
-              <m:t>e</m:t>
-            </m:r>
-            <m:r>
-              <m:t>d</m:t>
-            </m:r>
-          </m:sup>
-        </m:sSubSup>
-      </m:oMath>
-      <w:r>
-        <w:t xml:space="preserve"> </w:t>
-      </w:r>
-      <w:r>
-        <w:t xml:space="preserve">has relatively high variance (Fig.</w:t>
+        </m:sSub>
+      </m:oMath>
+      <w:r>
+        <w:t xml:space="preserve"> </w:t>
+      </w:r>
+      <w:r>
+        <w:t xml:space="preserve">are divergent, such as shown in the subplots in the upper left corner and bottom right corner of Figure</w:t>
       </w:r>
       <w:r>
         <w:t xml:space="preserve"> </w:t>
@@ -3300,13 +3747,16 @@
         </w:r>
       </w:hyperlink>
       <w:r>
-        <w:t xml:space="preserve">). The ellipse representing its range of receptor abundances rides through multiple contour lines, indicating wide variation in the quantity of bound ligand. Thus, if we choose to maneuver the affinity of receptor 1 to attain more selective binding to</w:t>
-      </w:r>
-      <w:r>
-        <w:t xml:space="preserve"> </w:t>
-      </w:r>
-      <m:oMath>
-        <m:sSubSup>
+        <w:t xml:space="preserve"> </w:t>
+      </w:r>
+      <w:r>
+        <w:t xml:space="preserve">a, the ellipse representing its range of receptor abundances rides through multiple contour lines, indicating wide variation in the quantity of bound ligand. This intrapopulation variation in the amount of ligand bound, however, is not observed when the affinities to</w:t>
+      </w:r>
+      <w:r>
+        <w:t xml:space="preserve"> </w:t>
+      </w:r>
+      <m:oMath>
+        <m:sSub>
           <m:e>
             <m:r>
               <m:t>R</m:t>
@@ -3317,16 +3767,19 @@
               <m:t>1</m:t>
             </m:r>
           </m:sub>
-          <m:sup>
-            <m:r>
-              <m:t>h</m:t>
-            </m:r>
-            <m:r>
-              <m:t>i</m:t>
-            </m:r>
-          </m:sup>
-        </m:sSubSup>
-        <m:sSubSup>
+        </m:sSub>
+      </m:oMath>
+      <w:r>
+        <w:t xml:space="preserve"> </w:t>
+      </w:r>
+      <w:r>
+        <w:t xml:space="preserve">and</w:t>
+      </w:r>
+      <w:r>
+        <w:t xml:space="preserve"> </w:t>
+      </w:r>
+      <m:oMath>
+        <m:sSub>
           <m:e>
             <m:r>
               <m:t>R</m:t>
@@ -3337,89 +3790,13 @@
               <m:t>2</m:t>
             </m:r>
           </m:sub>
-          <m:sup>
-            <m:r>
-              <m:t>l</m:t>
-            </m:r>
-            <m:r>
-              <m:t>o</m:t>
-            </m:r>
-          </m:sup>
-        </m:sSubSup>
-      </m:oMath>
-      <w:r>
-        <w:t xml:space="preserve"> </w:t>
-      </w:r>
-      <w:r>
-        <w:t xml:space="preserve">over</w:t>
-      </w:r>
-      <w:r>
-        <w:t xml:space="preserve"> </w:t>
-      </w:r>
-      <m:oMath>
-        <m:sSubSup>
-          <m:e>
-            <m:r>
-              <m:t>R</m:t>
-            </m:r>
-          </m:e>
-          <m:sub>
-            <m:r>
-              <m:t>1</m:t>
-            </m:r>
-          </m:sub>
-          <m:sup>
-            <m:r>
-              <m:t>m</m:t>
-            </m:r>
-            <m:r>
-              <m:t>e</m:t>
-            </m:r>
-            <m:r>
-              <m:t>d</m:t>
-            </m:r>
-          </m:sup>
-        </m:sSubSup>
-        <m:sSubSup>
-          <m:e>
-            <m:r>
-              <m:t>R</m:t>
-            </m:r>
-          </m:e>
-          <m:sub>
-            <m:r>
-              <m:t>2</m:t>
-            </m:r>
-          </m:sub>
-          <m:sup>
-            <m:r>
-              <m:t>m</m:t>
-            </m:r>
-            <m:r>
-              <m:t>e</m:t>
-            </m:r>
-            <m:r>
-              <m:t>d</m:t>
-            </m:r>
-          </m:sup>
-        </m:sSubSup>
-      </m:oMath>
-      <w:r>
-        <w:t xml:space="preserve">, we can also expect greater intra-population variation in binding to the latter (Fig.</w:t>
-      </w:r>
-      <w:r>
-        <w:t xml:space="preserve"> </w:t>
-      </w:r>
-      <w:hyperlink w:anchor="fig:affinity">
-        <w:r>
-          <w:rPr>
-            <w:rStyle w:val="Hyperlink"/>
-          </w:rPr>
-          <w:t xml:space="preserve">2</w:t>
-        </w:r>
-      </w:hyperlink>
-      <w:r>
-        <w:t xml:space="preserve">a).</w:t>
+        </m:sSub>
+      </m:oMath>
+      <w:r>
+        <w:t xml:space="preserve"> </w:t>
+      </w:r>
+      <w:r>
+        <w:t xml:space="preserve">are more balanced. When designing a therapeutic for cell populations with broader or more dynamic expression profile, such as tumor cells, the consideration in intrapopulation heterogeneity when using affinity engineering is worthwhile.</w:t>
       </w:r>
     </w:p>
     <w:p>
@@ -3451,7 +3828,7 @@
         </w:r>
       </w:hyperlink>
       <w:r>
-        <w:t xml:space="preserve">d). Multivalent ligand binding differs from monovalent binding in its non-linear relationship with cellular receptor density, allowing multivalent ligands to potentially selectively target cells based on receptor abundance.</w:t>
+        <w:t xml:space="preserve">). Multivalent ligand binding differs from monovalent binding in its non-linear relationship with cellular receptor density, allowing multivalent ligands to potentially selectively target cells based on receptor abundance.</w:t>
       </w:r>
       <w:hyperlink w:anchor="ref-IanZRiFA">
         <w:r>
@@ -3480,7 +3857,7 @@
         </w:r>
       </w:hyperlink>
       <w:r>
-        <w:t xml:space="preserve">a-c. Here, the amount of ligand bound by cells expressing different abundances of receptor 1 and 2 is quantified. The ligand only binds to receptor</w:t>
+        <w:t xml:space="preserve">a. Here, the amount of ligand bound by cells expressing different abundances of receptor</w:t>
       </w:r>
       <w:r>
         <w:t xml:space="preserve"> </w:t>
@@ -3503,13 +3880,36 @@
         <w:t xml:space="preserve"> </w:t>
       </w:r>
       <w:r>
-        <w:t xml:space="preserve">and the valency of the ligand is varied across subplots. The most notable effect of changing valency is observed as variable density of binding isoclines in the contour plot. For example, in the monovalent case, the relative quantities of binding of</w:t>
-      </w:r>
-      <w:r>
-        <w:t xml:space="preserve"> </w:t>
-      </w:r>
-      <m:oMath>
-        <m:sSubSup>
+        <w:t xml:space="preserve">and</w:t>
+      </w:r>
+      <w:r>
+        <w:t xml:space="preserve"> </w:t>
+      </w:r>
+      <m:oMath>
+        <m:sSub>
+          <m:e>
+            <m:r>
+              <m:t>R</m:t>
+            </m:r>
+          </m:e>
+          <m:sub>
+            <m:r>
+              <m:t>2</m:t>
+            </m:r>
+          </m:sub>
+        </m:sSub>
+      </m:oMath>
+      <w:r>
+        <w:t xml:space="preserve"> </w:t>
+      </w:r>
+      <w:r>
+        <w:t xml:space="preserve">is quantified. The ligand only binds to receptor</w:t>
+      </w:r>
+      <w:r>
+        <w:t xml:space="preserve"> </w:t>
+      </w:r>
+      <m:oMath>
+        <m:sSub>
           <m:e>
             <m:r>
               <m:t>R</m:t>
@@ -3520,12 +3920,47 @@
               <m:t>1</m:t>
             </m:r>
           </m:sub>
-          <m:sup>
-            <m:r>
-              <m:t>l</m:t>
-            </m:r>
-            <m:r>
-              <m:t>o</m:t>
+        </m:sSub>
+      </m:oMath>
+      <w:r>
+        <w:t xml:space="preserve"> </w:t>
+      </w:r>
+      <w:r>
+        <w:t xml:space="preserve">and the valency of the ligand is varied across subplots. The most notable effect of changing valency is observed as variable density of lines in the binding contour plot. For example, in the monovalent case, there are roughly the same amount of contour lines between $ R_1</w:t>
+      </w:r>
+      <w:r>
+        <w:rPr>
+          <w:vertAlign w:val="superscript"/>
+        </w:rPr>
+        <w:t xml:space="preserve">{lo}R_2</w:t>
+      </w:r>
+      <w:r>
+        <w:t xml:space="preserve">{lo}$ and</w:t>
+      </w:r>
+      <w:r>
+        <w:t xml:space="preserve"> </w:t>
+      </w:r>
+      <m:oMath>
+        <m:sSubSup>
+          <m:e>
+            <m:r>
+              <m:t>R</m:t>
+            </m:r>
+          </m:e>
+          <m:sub>
+            <m:r>
+              <m:t>1</m:t>
+            </m:r>
+          </m:sub>
+          <m:sup>
+            <m:r>
+              <m:t>m</m:t>
+            </m:r>
+            <m:r>
+              <m:t>e</m:t>
+            </m:r>
+            <m:r>
+              <m:t>d</m:t>
             </m:r>
           </m:sup>
         </m:sSubSup>
@@ -3542,16 +3977,22 @@
           </m:sub>
           <m:sup>
             <m:r>
-              <m:t>l</m:t>
-            </m:r>
-            <m:r>
-              <m:t>o</m:t>
-            </m:r>
-          </m:sup>
-        </m:sSubSup>
-      </m:oMath>
-      <w:r>
-        <w:t xml:space="preserve">,</w:t>
+              <m:t>m</m:t>
+            </m:r>
+            <m:r>
+              <m:t>e</m:t>
+            </m:r>
+            <m:r>
+              <m:t>d</m:t>
+            </m:r>
+          </m:sup>
+        </m:sSubSup>
+      </m:oMath>
+      <w:r>
+        <w:t xml:space="preserve"> </w:t>
+      </w:r>
+      <w:r>
+        <w:t xml:space="preserve">and between</w:t>
       </w:r>
       <w:r>
         <w:t xml:space="preserve"> </w:t>
@@ -3605,7 +4046,10 @@
         </m:sSubSup>
       </m:oMath>
       <w:r>
-        <w:t xml:space="preserve">, and</w:t>
+        <w:t xml:space="preserve"> </w:t>
+      </w:r>
+      <w:r>
+        <w:t xml:space="preserve">and</w:t>
       </w:r>
       <w:r>
         <w:t xml:space="preserve"> </w:t>
@@ -3653,7 +4097,126 @@
         </m:sSubSup>
       </m:oMath>
       <w:r>
-        <w:t xml:space="preserve">, all of which have identical relative abundance of receptors 1 and 2, is exactly proportional to their receptor abundance. However, in the multivalent case, the density of contour isoclines varies as a function of receptor expression, causing the ligand binding difference between these populations to vary.</w:t>
+        <w:t xml:space="preserve">, but in the tetravalent case, there are more contour lines between</w:t>
+      </w:r>
+      <w:r>
+        <w:t xml:space="preserve"> </w:t>
+      </w:r>
+      <m:oMath>
+        <m:sSubSup>
+          <m:e>
+            <m:r>
+              <m:t>R</m:t>
+            </m:r>
+          </m:e>
+          <m:sub>
+            <m:r>
+              <m:t>1</m:t>
+            </m:r>
+          </m:sub>
+          <m:sup>
+            <m:r>
+              <m:t>m</m:t>
+            </m:r>
+            <m:r>
+              <m:t>e</m:t>
+            </m:r>
+            <m:r>
+              <m:t>d</m:t>
+            </m:r>
+          </m:sup>
+        </m:sSubSup>
+        <m:sSubSup>
+          <m:e>
+            <m:r>
+              <m:t>R</m:t>
+            </m:r>
+          </m:e>
+          <m:sub>
+            <m:r>
+              <m:t>2</m:t>
+            </m:r>
+          </m:sub>
+          <m:sup>
+            <m:r>
+              <m:t>m</m:t>
+            </m:r>
+            <m:r>
+              <m:t>e</m:t>
+            </m:r>
+            <m:r>
+              <m:t>d</m:t>
+            </m:r>
+          </m:sup>
+        </m:sSubSup>
+      </m:oMath>
+      <w:r>
+        <w:t xml:space="preserve"> </w:t>
+      </w:r>
+      <w:r>
+        <w:t xml:space="preserve">and</w:t>
+      </w:r>
+      <w:r>
+        <w:t xml:space="preserve"> </w:t>
+      </w:r>
+      <m:oMath>
+        <m:sSubSup>
+          <m:e>
+            <m:r>
+              <m:t>R</m:t>
+            </m:r>
+          </m:e>
+          <m:sub>
+            <m:r>
+              <m:t>1</m:t>
+            </m:r>
+          </m:sub>
+          <m:sup>
+            <m:r>
+              <m:t>h</m:t>
+            </m:r>
+            <m:r>
+              <m:t>i</m:t>
+            </m:r>
+          </m:sup>
+        </m:sSubSup>
+        <m:sSubSup>
+          <m:e>
+            <m:r>
+              <m:t>R</m:t>
+            </m:r>
+          </m:e>
+          <m:sub>
+            <m:r>
+              <m:t>2</m:t>
+            </m:r>
+          </m:sub>
+          <m:sup>
+            <m:r>
+              <m:t>h</m:t>
+            </m:r>
+            <m:r>
+              <m:t>i</m:t>
+            </m:r>
+          </m:sup>
+        </m:sSubSup>
+      </m:oMath>
+      <w:r>
+        <w:t xml:space="preserve">, suggesting a sharper increase in ligand bound (Fig.</w:t>
+      </w:r>
+      <w:r>
+        <w:t xml:space="preserve"> </w:t>
+      </w:r>
+      <w:hyperlink w:anchor="fig:valency">
+        <w:r>
+          <w:rPr>
+            <w:rStyle w:val="Hyperlink"/>
+          </w:rPr>
+          <w:t xml:space="preserve">3</w:t>
+        </w:r>
+      </w:hyperlink>
+      <w:r>
+        <w:t xml:space="preserve">a).</w:t>
       </w:r>
     </w:p>
     <w:p>
@@ -3661,7 +4224,7 @@
         <w:pStyle w:val="BodyText"/>
       </w:pPr>
       <w:r>
-        <w:t xml:space="preserve">Previous work has shown that our multivalent binding can accurately predict the complicated binding process between IgG antibodies and Fcγ receptors.</w:t>
+        <w:t xml:space="preserve">Previous work has shown that our binding model can accurately predict the complicated multivalent binding process between IgG antibodies and Fcγ receptors.</w:t>
       </w:r>
       <w:hyperlink w:anchor="ref-11gk5tUo7">
         <w:r>
@@ -3713,7 +4276,7 @@
         <w:pStyle w:val="BodyText"/>
       </w:pPr>
       <w:r>
-        <w:t xml:space="preserve">Selectivity derived by changing valency requires coordinate changes in affinity. Like we predict, lower affinity, multi-valent interactions have been shown to exhibit selectivity based on receptor abundance.</w:t>
+        <w:t xml:space="preserve">Selectivity derived by changing valency is dependent on affinity. As many previous studies have suggested, lower affinity, multi-valent interactions have been shown to exhibit selectivity based on receptor abundance.</w:t>
       </w:r>
       <w:hyperlink w:anchor="ref-B0xrCfE3">
         <w:r>
@@ -3757,7 +4320,30 @@
         </w:r>
       </w:hyperlink>
       <w:r>
-        <w:t xml:space="preserve">b-d). Here, the ligand binding ratios between cell populations are shown for ligands of high, medium, and low affinities (</w:t>
+        <w:t xml:space="preserve">b-d). Here, the ligand binding ratios for</w:t>
+      </w:r>
+      <w:r>
+        <w:t xml:space="preserve"> </w:t>
+      </w:r>
+      <m:oMath>
+        <m:sSub>
+          <m:e>
+            <m:r>
+              <m:t>R</m:t>
+            </m:r>
+          </m:e>
+          <m:sub>
+            <m:r>
+              <m:t>1</m:t>
+            </m:r>
+          </m:sub>
+        </m:sSub>
+      </m:oMath>
+      <w:r>
+        <w:t xml:space="preserve"> </w:t>
+      </w:r>
+      <w:r>
+        <w:t xml:space="preserve">between cell populations are shown for ligands of high, medium, and low affinities (</w:t>
       </w:r>
       <m:oMath>
         <m:sSub>
@@ -4184,7 +4770,7 @@
         <w:pStyle w:val="BodyText"/>
       </w:pPr>
       <w:r>
-        <w:t xml:space="preserve">Our model allowed us to identify the mechanism of valency-mediated receptor abundance selectivity by looking at the average number of receptors bound by each ligand complex. A cell expressing</w:t>
+        <w:t xml:space="preserve">Our model allowed us to identify the mechanism of valency-mediated receptor abundance selectivity by looking at the number of complex bound in each degree. A cell expressing</w:t>
       </w:r>
       <w:r>
         <w:t xml:space="preserve"> </w:t>
@@ -4336,7 +4922,30 @@
         <w:t xml:space="preserve"> </w:t>
       </w:r>
       <w:r>
-        <w:t xml:space="preserve">a) Heat/contour maps of multivalent ligands bound to cell populations given their expression profiles of two receptors. Multivalent ligand subunits bind to both receptor 1 with an dissociation constant of</w:t>
+        <w:t xml:space="preserve">a) Heat/contour maps of multivalent ligands bound to cell populations given their expression profiles of two receptors. Multivalent ligand subunits bind to only</w:t>
+      </w:r>
+      <w:r>
+        <w:t xml:space="preserve"> </w:t>
+      </w:r>
+      <m:oMath>
+        <m:sSub>
+          <m:e>
+            <m:r>
+              <m:t>R</m:t>
+            </m:r>
+          </m:e>
+          <m:sub>
+            <m:r>
+              <m:t>1</m:t>
+            </m:r>
+          </m:sub>
+        </m:sSub>
+      </m:oMath>
+      <w:r>
+        <w:t xml:space="preserve"> </w:t>
+      </w:r>
+      <w:r>
+        <w:t xml:space="preserve">with an dissociation constant of</w:t>
       </w:r>
       <w:r>
         <w:t xml:space="preserve"> </w:t>
@@ -4359,7 +4968,27 @@
         </m:r>
       </m:oMath>
       <w:r>
-        <w:t xml:space="preserve">, and do not bind to receptor 2. Complexes vary in valency from 1 to 16. Ligand concentration</w:t>
+        <w:t xml:space="preserve">, and do not bind to</w:t>
+      </w:r>
+      <w:r>
+        <w:t xml:space="preserve"> </w:t>
+      </w:r>
+      <m:oMath>
+        <m:sSub>
+          <m:e>
+            <m:r>
+              <m:t>R</m:t>
+            </m:r>
+          </m:e>
+          <m:sub>
+            <m:r>
+              <m:t>2</m:t>
+            </m:r>
+          </m:sub>
+        </m:sSub>
+      </m:oMath>
+      <w:r>
+        <w:t xml:space="preserve">. Complexes vary in valency from 1 to 16. Ligand concentration</w:t>
       </w:r>
       <w:r>
         <w:t xml:space="preserve"> </w:t>
@@ -4809,12 +5438,6 @@
         <w:t xml:space="preserve"> </w:t>
       </w:r>
       <m:oMath>
-        <m:r>
-          <m:t>1</m:t>
-        </m:r>
-        <m:r>
-          <m:t>×</m:t>
-        </m:r>
         <m:sSup>
           <m:e>
             <m:r>
@@ -4838,12 +5461,6 @@
         <w:t xml:space="preserve"> </w:t>
       </w:r>
       <m:oMath>
-        <m:r>
-          <m:t>1</m:t>
-        </m:r>
-        <m:r>
-          <m:t>×</m:t>
-        </m:r>
         <m:sSup>
           <m:e>
             <m:r>
@@ -4885,7 +5502,30 @@
         <w:t xml:space="preserve"> </w:t>
       </w:r>
       <w:r>
-        <w:t xml:space="preserve">a) Heat/contour maps of multivalent ligands bound to cell populations given their expression profiles of two receptors. Multivalent ligand subunits bind to both receptor 1 with an dissociation constant of</w:t>
+        <w:t xml:space="preserve">a) Heat/contour maps of multivalent ligands bound to cell populations given their expression profiles of two receptors. Multivalent ligand subunits bind to only</w:t>
+      </w:r>
+      <w:r>
+        <w:t xml:space="preserve"> </w:t>
+      </w:r>
+      <m:oMath>
+        <m:sSub>
+          <m:e>
+            <m:r>
+              <m:t>R</m:t>
+            </m:r>
+          </m:e>
+          <m:sub>
+            <m:r>
+              <m:t>1</m:t>
+            </m:r>
+          </m:sub>
+        </m:sSub>
+      </m:oMath>
+      <w:r>
+        <w:t xml:space="preserve"> </w:t>
+      </w:r>
+      <w:r>
+        <w:t xml:space="preserve">with an dissociation constant of</w:t>
       </w:r>
       <w:r>
         <w:t xml:space="preserve"> </w:t>
@@ -4908,7 +5548,27 @@
         </m:r>
       </m:oMath>
       <w:r>
-        <w:t xml:space="preserve">, and do not bind to receptor 2. Complexes vary in valency from 1 to 16. Ligand concentration</w:t>
+        <w:t xml:space="preserve">, and do not bind to</w:t>
+      </w:r>
+      <w:r>
+        <w:t xml:space="preserve"> </w:t>
+      </w:r>
+      <m:oMath>
+        <m:sSub>
+          <m:e>
+            <m:r>
+              <m:t>R</m:t>
+            </m:r>
+          </m:e>
+          <m:sub>
+            <m:r>
+              <m:t>2</m:t>
+            </m:r>
+          </m:sub>
+        </m:sSub>
+      </m:oMath>
+      <w:r>
+        <w:t xml:space="preserve">. Complexes vary in valency from 1 to 16. Ligand concentration</w:t>
       </w:r>
       <w:r>
         <w:t xml:space="preserve"> </w:t>
@@ -5358,12 +6018,6 @@
         <w:t xml:space="preserve"> </w:t>
       </w:r>
       <m:oMath>
-        <m:r>
-          <m:t>1</m:t>
-        </m:r>
-        <m:r>
-          <m:t>×</m:t>
-        </m:r>
         <m:sSup>
           <m:e>
             <m:r>
@@ -5387,12 +6041,6 @@
         <w:t xml:space="preserve"> </w:t>
       </w:r>
       <m:oMath>
-        <m:r>
-          <m:t>1</m:t>
-        </m:r>
-        <m:r>
-          <m:t>×</m:t>
-        </m:r>
         <m:sSup>
           <m:e>
             <m:r>
@@ -5459,7 +6107,7 @@
         <w:t xml:space="preserve"> </w:t>
       </w:r>
       <w:r>
-        <w:t xml:space="preserve">In these cases, it is important to understand how these species influence the overall response.</w:t>
+        <w:t xml:space="preserve">Therefore, it is important to understand how mixtures of complexes influence the overall response.</w:t>
       </w:r>
     </w:p>
     <w:p>
@@ -5467,7 +6115,50 @@
         <w:pStyle w:val="BodyText"/>
       </w:pPr>
       <w:r>
-        <w:t xml:space="preserve">To evaluate the contribution of mixtures, we evaluated model-predicted binding while varying the composition between ligands with either receptor 1- or 2-preferred binding, respectively (Fig.</w:t>
+        <w:t xml:space="preserve">To evaluate the contribution of mixtures, we evaluated model-predicted binding while varying the composition between ligands with either</w:t>
+      </w:r>
+      <w:r>
+        <w:t xml:space="preserve"> </w:t>
+      </w:r>
+      <m:oMath>
+        <m:sSub>
+          <m:e>
+            <m:r>
+              <m:t>R</m:t>
+            </m:r>
+          </m:e>
+          <m:sub>
+            <m:r>
+              <m:t>1</m:t>
+            </m:r>
+          </m:sub>
+        </m:sSub>
+      </m:oMath>
+      <w:r>
+        <w:t xml:space="preserve"> </w:t>
+      </w:r>
+      <w:r>
+        <w:t xml:space="preserve">or</w:t>
+      </w:r>
+      <w:r>
+        <w:t xml:space="preserve"> </w:t>
+      </w:r>
+      <m:oMath>
+        <m:sSub>
+          <m:e>
+            <m:r>
+              <m:t>R</m:t>
+            </m:r>
+          </m:e>
+          <m:sub>
+            <m:r>
+              <m:t>2</m:t>
+            </m:r>
+          </m:sub>
+        </m:sSub>
+      </m:oMath>
+      <w:r>
+        <w:t xml:space="preserve">-preferred binding, respectively (Fig.</w:t>
       </w:r>
       <w:r>
         <w:t xml:space="preserve"> </w:t>
@@ -5481,7 +6172,7 @@
         </w:r>
       </w:hyperlink>
       <w:r>
-        <w:t xml:space="preserve">a). The trend that arises is very similar to an additive combination of the single ligand cases. This pattern highlights a key limitation of using mixtures for selectivity; selectivity is always maximized by using 100% of the more specific ligand, at least when defining selectivity between two populations (Fig.</w:t>
+        <w:t xml:space="preserve">a). The trend that arises is very similar to an additive combination of the single ligand cases. This pattern highlights a key limitation of using mixtures for selectivity: selectivity between two populations varies monotonic with the composition, so any mixture combination is no better than using the more specific ligand entirely(Fig.</w:t>
       </w:r>
       <w:r>
         <w:t xml:space="preserve"> </w:t>
@@ -5503,7 +6194,7 @@
         <w:pStyle w:val="BodyText"/>
       </w:pPr>
       <w:r>
-        <w:t xml:space="preserve">While mixture engineering fails to enhance binding selectivity between two cell populations, it is potentially effective when considering three or more off-target cell populations. More specifically, when a target population expresses two target receptors, but off-target populations express each receptor individually in high amounts, drug mixtures can offer enhanced selectivity. For example, when maximizing targeting to</w:t>
+        <w:t xml:space="preserve">While mixture engineering fails to enhance binding selectivity between two cell populations, it is potentially beneficial when considering two or more off-target cell populations. More specifically, when a target population expresses two target receptors, but off-target populations express each receptor individually in high amounts, drug mixtures can offer enhanced selectivity. For example, when maximizing targeting to</w:t>
       </w:r>
       <w:r>
         <w:t xml:space="preserve"> </w:t>
@@ -5963,7 +6654,7 @@
         </m:sSup>
       </m:oMath>
       <w:r>
-        <w:t xml:space="preserve">. b-e) Ratio of ligand bound to cell populations exposed to monovalent mixtures of ligand one and 2. For c-e, the ratio of the target population to the single off target population with the greatest ligand bound is plotted. b) Ligand bound ratio of</w:t>
+        <w:t xml:space="preserve">. b-e) Ratio of ligand bound to cell populations exposed to monovalent mixtures of ligand one and 2. For b-d, the ratio of the target population to the single off target population with the greatest ligand bound is plotted. b) Ligand bound ratio of</w:t>
       </w:r>
       <w:r>
         <w:t xml:space="preserve"> </w:t>
@@ -6372,159 +7063,6 @@
             </m:r>
             <m:r>
               <m:t>d</m:t>
-            </m:r>
-          </m:sup>
-        </m:sSubSup>
-      </m:oMath>
-      <w:r>
-        <w:t xml:space="preserve">, e)</w:t>
-      </w:r>
-      <w:r>
-        <w:t xml:space="preserve"> </w:t>
-      </w:r>
-      <m:oMath>
-        <m:sSubSup>
-          <m:e>
-            <m:r>
-              <m:t>R</m:t>
-            </m:r>
-          </m:e>
-          <m:sub>
-            <m:r>
-              <m:t>1</m:t>
-            </m:r>
-          </m:sub>
-          <m:sup>
-            <m:r>
-              <m:t>m</m:t>
-            </m:r>
-            <m:r>
-              <m:t>e</m:t>
-            </m:r>
-            <m:r>
-              <m:t>d</m:t>
-            </m:r>
-          </m:sup>
-        </m:sSubSup>
-        <m:sSubSup>
-          <m:e>
-            <m:r>
-              <m:t>R</m:t>
-            </m:r>
-          </m:e>
-          <m:sub>
-            <m:r>
-              <m:t>2</m:t>
-            </m:r>
-          </m:sub>
-          <m:sup>
-            <m:r>
-              <m:t>h</m:t>
-            </m:r>
-            <m:r>
-              <m:t>i</m:t>
-            </m:r>
-          </m:sup>
-        </m:sSubSup>
-      </m:oMath>
-      <w:r>
-        <w:t xml:space="preserve"> </w:t>
-      </w:r>
-      <w:r>
-        <w:t xml:space="preserve">to</w:t>
-      </w:r>
-      <w:r>
-        <w:t xml:space="preserve"> </w:t>
-      </w:r>
-      <m:oMath>
-        <m:sSubSup>
-          <m:e>
-            <m:r>
-              <m:t>R</m:t>
-            </m:r>
-          </m:e>
-          <m:sub>
-            <m:r>
-              <m:t>1</m:t>
-            </m:r>
-          </m:sub>
-          <m:sup>
-            <m:r>
-              <m:t>h</m:t>
-            </m:r>
-            <m:r>
-              <m:t>i</m:t>
-            </m:r>
-          </m:sup>
-        </m:sSubSup>
-        <m:sSubSup>
-          <m:e>
-            <m:r>
-              <m:t>R</m:t>
-            </m:r>
-          </m:e>
-          <m:sub>
-            <m:r>
-              <m:t>2</m:t>
-            </m:r>
-          </m:sub>
-          <m:sup>
-            <m:r>
-              <m:t>l</m:t>
-            </m:r>
-            <m:r>
-              <m:t>o</m:t>
-            </m:r>
-          </m:sup>
-        </m:sSubSup>
-      </m:oMath>
-      <w:r>
-        <w:t xml:space="preserve"> </w:t>
-      </w:r>
-      <w:r>
-        <w:t xml:space="preserve">and</w:t>
-      </w:r>
-      <w:r>
-        <w:t xml:space="preserve"> </w:t>
-      </w:r>
-      <m:oMath>
-        <m:sSubSup>
-          <m:e>
-            <m:r>
-              <m:t>R</m:t>
-            </m:r>
-          </m:e>
-          <m:sub>
-            <m:r>
-              <m:t>1</m:t>
-            </m:r>
-          </m:sub>
-          <m:sup>
-            <m:r>
-              <m:t>l</m:t>
-            </m:r>
-            <m:r>
-              <m:t>o</m:t>
-            </m:r>
-          </m:sup>
-        </m:sSubSup>
-        <m:sSubSup>
-          <m:e>
-            <m:r>
-              <m:t>R</m:t>
-            </m:r>
-          </m:e>
-          <m:sub>
-            <m:r>
-              <m:t>2</m:t>
-            </m:r>
-          </m:sub>
-          <m:sup>
-            <m:r>
-              <m:t>h</m:t>
-            </m:r>
-            <m:r>
-              <m:t>i</m:t>
             </m:r>
           </m:sup>
         </m:sSubSup>
@@ -6739,7 +7277,7 @@
         </m:sSup>
       </m:oMath>
       <w:r>
-        <w:t xml:space="preserve">. b-e) Ratio of ligand bound to cell populations exposed to monovalent mixtures of ligand one and 2. For c-e, the ratio of the target population to the single off target population with the greatest ligand bound is plotted. b) Ligand bound ratio of</w:t>
+        <w:t xml:space="preserve">. b-e) Ratio of ligand bound to cell populations exposed to monovalent mixtures of ligand one and 2. For b-d, the ratio of the target population to the single off target population with the greatest ligand bound is plotted. b) Ligand bound ratio of</w:t>
       </w:r>
       <w:r>
         <w:t xml:space="preserve"> </w:t>
@@ -7148,159 +7686,6 @@
             </m:r>
             <m:r>
               <m:t>d</m:t>
-            </m:r>
-          </m:sup>
-        </m:sSubSup>
-      </m:oMath>
-      <w:r>
-        <w:t xml:space="preserve">, e)</w:t>
-      </w:r>
-      <w:r>
-        <w:t xml:space="preserve"> </w:t>
-      </w:r>
-      <m:oMath>
-        <m:sSubSup>
-          <m:e>
-            <m:r>
-              <m:t>R</m:t>
-            </m:r>
-          </m:e>
-          <m:sub>
-            <m:r>
-              <m:t>1</m:t>
-            </m:r>
-          </m:sub>
-          <m:sup>
-            <m:r>
-              <m:t>m</m:t>
-            </m:r>
-            <m:r>
-              <m:t>e</m:t>
-            </m:r>
-            <m:r>
-              <m:t>d</m:t>
-            </m:r>
-          </m:sup>
-        </m:sSubSup>
-        <m:sSubSup>
-          <m:e>
-            <m:r>
-              <m:t>R</m:t>
-            </m:r>
-          </m:e>
-          <m:sub>
-            <m:r>
-              <m:t>2</m:t>
-            </m:r>
-          </m:sub>
-          <m:sup>
-            <m:r>
-              <m:t>h</m:t>
-            </m:r>
-            <m:r>
-              <m:t>i</m:t>
-            </m:r>
-          </m:sup>
-        </m:sSubSup>
-      </m:oMath>
-      <w:r>
-        <w:t xml:space="preserve"> </w:t>
-      </w:r>
-      <w:r>
-        <w:t xml:space="preserve">to</w:t>
-      </w:r>
-      <w:r>
-        <w:t xml:space="preserve"> </w:t>
-      </w:r>
-      <m:oMath>
-        <m:sSubSup>
-          <m:e>
-            <m:r>
-              <m:t>R</m:t>
-            </m:r>
-          </m:e>
-          <m:sub>
-            <m:r>
-              <m:t>1</m:t>
-            </m:r>
-          </m:sub>
-          <m:sup>
-            <m:r>
-              <m:t>h</m:t>
-            </m:r>
-            <m:r>
-              <m:t>i</m:t>
-            </m:r>
-          </m:sup>
-        </m:sSubSup>
-        <m:sSubSup>
-          <m:e>
-            <m:r>
-              <m:t>R</m:t>
-            </m:r>
-          </m:e>
-          <m:sub>
-            <m:r>
-              <m:t>2</m:t>
-            </m:r>
-          </m:sub>
-          <m:sup>
-            <m:r>
-              <m:t>l</m:t>
-            </m:r>
-            <m:r>
-              <m:t>o</m:t>
-            </m:r>
-          </m:sup>
-        </m:sSubSup>
-      </m:oMath>
-      <w:r>
-        <w:t xml:space="preserve"> </w:t>
-      </w:r>
-      <w:r>
-        <w:t xml:space="preserve">and</w:t>
-      </w:r>
-      <w:r>
-        <w:t xml:space="preserve"> </w:t>
-      </w:r>
-      <m:oMath>
-        <m:sSubSup>
-          <m:e>
-            <m:r>
-              <m:t>R</m:t>
-            </m:r>
-          </m:e>
-          <m:sub>
-            <m:r>
-              <m:t>1</m:t>
-            </m:r>
-          </m:sub>
-          <m:sup>
-            <m:r>
-              <m:t>l</m:t>
-            </m:r>
-            <m:r>
-              <m:t>o</m:t>
-            </m:r>
-          </m:sup>
-        </m:sSubSup>
-        <m:sSubSup>
-          <m:e>
-            <m:r>
-              <m:t>R</m:t>
-            </m:r>
-          </m:e>
-          <m:sub>
-            <m:r>
-              <m:t>2</m:t>
-            </m:r>
-          </m:sub>
-          <m:sup>
-            <m:r>
-              <m:t>h</m:t>
-            </m:r>
-            <m:r>
-              <m:t>i</m:t>
             </m:r>
           </m:sup>
         </m:sSubSup>
@@ -7340,7 +7725,7 @@
         <w:t xml:space="preserve"> </w:t>
       </w:r>
       <w:r>
-        <w:t xml:space="preserve">However, the number of possible configurations of multispecific drugs is combinatorially large and impossible to enumerate. Here, we use the heterovalent bispecific ligand as an exemplar to explore the unique benefit of multispecificity distinct from any strategy analyzed before. We compared bispecificity to two aforementioned strategies: a 50%-50% mixture of two monovalent ligands, and a 50%-50% mixture of two different homogeneous bivalent ligands. These two strategies both have some similarities to bispecific therapeutics. A bispecific ligand contains two different ligand monomers with equal proportion, similar to a 50%-50% monovalent mixture. By comparing bispecific to a 50%-50% monovalent mixture, we can elucidate the extra benefit of tethering these two monomers into one complex. A bispecific ligand is also by nature bivalent, and by comparing it to homogeneous bivalent drugs, we can understand how having two different subunits in the same complex modify the behavior of a drug. Together, we sought to identify the unique advantage of heterovalency.</w:t>
+        <w:t xml:space="preserve">However, the number of possible configurations of multispecific drugs is combinatorially large and impossible to enumerate. Here, we use the heterovalent bispecific ligand as an example to explore the unique benefit of multispecificity distinct from any strategy analyzed before. We compared bispecificity with two aforementioned strategies: a 50%-50% mixture of two monovalent ligands, and a 50%-50% mixture of two different homogeneous bivalent ligands. These two strategies both have some similarities to bispecific therapeutics. A bispecific ligand contains two different ligand monomers with equal proportion, similar to a 50%-50% monovalent mixture. By comparing bispecific with a 50%-50% monovalent mixture, we can elucidate the extra benefit of tethering these two monomers into one complex. A bispecific ligand is also by nature bivalent, and by comparing it with homogeneous bivalent drugs, we can understand how having two different subunits in the same complex modify the behavior of a drug. Together, we sought to identify the unique advantage of heterovalency.</w:t>
       </w:r>
     </w:p>
     <w:p>
@@ -8865,7 +9250,7 @@
         <w:pStyle w:val="FirstParagraph"/>
       </w:pPr>
       <w:r>
-        <w:t xml:space="preserve">Each strategy above provided selectivity benefits in distinct situations, suggesting that they might synergistically improve selectivity when combined. We explored this potential synergy using optimization to determine the optimally cell type selective ligand for our theoretical cell populations. It is often the case that target cell populations express receptors common to a range of adjacent, off-target populations. Thus, we sought to determine the optimal ligand for particular cell populations while considering all other theoretical populations as off-target cells. We set our initial binding selectivity performance metric and optimize it within set bounds (Fig.</w:t>
+        <w:t xml:space="preserve">Each strategy above provided selectivity benefits in distinct situations, suggesting that they might synergistically improve selectivity when combined. We explored this potential synergy using mathematical optimization to determine the optimally cell type selective ligand for our theoretical cell populations. Here, we sought to determine the optimal ligand for particular cell populations while considering all other theoretical populations as off-target cells. We set our initial binding selectivity performance metric and optimize it within set bounds (Fig.</w:t>
       </w:r>
       <w:r>
         <w:t xml:space="preserve"> </w:t>
@@ -8879,7 +9264,7 @@
         </w:r>
       </w:hyperlink>
       <w:r>
-        <w:t xml:space="preserve">). To simulate the effects that affinity engineering could impart on selectivity, we then allowed ligand-receptor affinities to vary. To understand the effects of valency and mixture engineering on selectivity, we allowed ligand valency and mixtures to vary, while also allowing affinity to vary due to the previously noted reliance that these strategies have on receptor-ligand kinetics. Finally, all ligand parameters were allowed to vary to simulate the effects of combining therapeutic engineering approaches.</w:t>
+        <w:t xml:space="preserve">). To simulate the effects that affinity engineering, we allowed ligand-receptor affinities to vary. To understand the effects of valency and mixture engineering on selectivity, we allowed ligand valency and mixtures to vary, while also allowing affinity to vary due to the previously noted reliance that these strategies have on receptor-ligand kinetics. Finally, all ligand parameters were allowed to vary to simulate the effects of combining therapeutic engineering approaches.</w:t>
       </w:r>
     </w:p>
     <w:p>
@@ -8952,7 +9337,7 @@
         </w:r>
       </w:hyperlink>
       <w:r>
-        <w:t xml:space="preserve">a-f). Here selectivity is optimized by ligands with selective binding to receptor 2, and those with valencies allowing for selective binding to cells with higher abundances of receptor expression. Here, dominant therapeutic design strategies emerge. One case contradictory to this trend is shown during the optimization for selectivity towards the</w:t>
+        <w:t xml:space="preserve">a-f). Here selectivity is optimized by ligands with selective binding to receptor 2, and those with valencies allowing for selective binding to cells with higher abundances of receptor expression. One case contradictory to this trend is shown during the optimization for selectivity towards the</w:t>
       </w:r>
       <w:r>
         <w:t xml:space="preserve"> </w:t>
@@ -9279,7 +9664,7 @@
         <w:t xml:space="preserve"> </w:t>
       </w:r>
       <w:r>
-        <w:t xml:space="preserve">approach in addition to affinities varying. Mixtures were assumed to be monovalent, and affinities were allowed to vary in the</w:t>
+        <w:t xml:space="preserve">approach in addition to affinities varying. Mixtures were assumed to be composed of two monovalent ligands, and affinities were allowed to vary in the</w:t>
       </w:r>
       <w:r>
         <w:t xml:space="preserve"> </w:t>
@@ -9721,7 +10106,7 @@
         <w:t xml:space="preserve"> </w:t>
       </w:r>
       <w:r>
-        <w:t xml:space="preserve">approach in addition to affinities varying. Mixtures were assumed to be monovalent, and affinities were allowed to vary in the</w:t>
+        <w:t xml:space="preserve">approach in addition to affinities varying. Mixtures were assumed to be composed of two monovalent ligands, and affinities were allowed to vary in the</w:t>
       </w:r>
       <w:r>
         <w:t xml:space="preserve"> </w:t>
@@ -10006,21 +10391,22 @@
         <w:pStyle w:val="FirstParagraph"/>
       </w:pPr>
       <w:r>
-        <w:t xml:space="preserve">While the strategies above provided selectivity in many cases, we recognized that they are all limited to a positive relationship between receptor abundance and binding (Fig.</w:t>
-      </w:r>
-      <w:r>
-        <w:t xml:space="preserve"> </w:t>
-      </w:r>
-      <w:hyperlink w:anchor="fig:combination">
-        <w:r>
-          <w:rPr>
-            <w:rStyle w:val="Hyperlink"/>
-          </w:rPr>
-          <w:t xml:space="preserve">6</w:t>
-        </w:r>
-      </w:hyperlink>
-      <w:r>
-        <w:t xml:space="preserve">m-r). Therefore, we wondered if binding competition with a receptor antagonist could invert this relationship.</w:t>
+        <w:t xml:space="preserve">While the strategies above provided selectivity in many cases, we recognized that they are all limited to a positive relationship between receptor abundance and binding. Therefore, we wondered if binding competition with a receptor antagonist, or</w:t>
+      </w:r>
+      <w:r>
+        <w:t xml:space="preserve"> </w:t>
+      </w:r>
+      <w:r>
+        <w:t xml:space="preserve">“</w:t>
+      </w:r>
+      <w:r>
+        <w:t xml:space="preserve">dead ligand</w:t>
+      </w:r>
+      <w:r>
+        <w:t xml:space="preserve">”</w:t>
+      </w:r>
+      <w:r>
+        <w:t xml:space="preserve">, could invert this relationship.</w:t>
       </w:r>
     </w:p>
     <w:p>
@@ -14803,7 +15189,7 @@
           <m:t>3.3</m:t>
         </m:r>
         <m:r>
-          <m:t>x</m:t>
+          <m:t>×</m:t>
         </m:r>
         <m:sSup>
           <m:e>
@@ -14867,7 +15253,7 @@
           <m:t>3.8</m:t>
         </m:r>
         <m:r>
-          <m:t>x</m:t>
+          <m:t>×</m:t>
         </m:r>
         <m:sSup>
           <m:e>
@@ -14896,7 +15282,7 @@
           <m:t>1.11</m:t>
         </m:r>
         <m:r>
-          <m:t>x</m:t>
+          <m:t>×</m:t>
         </m:r>
         <m:sSup>
           <m:e>
@@ -14915,7 +15301,7 @@
         </m:sSup>
       </m:oMath>
       <w:r>
-        <w:t xml:space="preserve">, the association constants for C5 and B22 were found to be</w:t>
+        <w:t xml:space="preserve">; the association constants for C5 and B22 were found to be</w:t>
       </w:r>
       <w:r>
         <w:t xml:space="preserve"> </w:t>
@@ -14925,7 +15311,7 @@
           <m:t>5.78</m:t>
         </m:r>
         <m:r>
-          <m:t>x</m:t>
+          <m:t>×</m:t>
         </m:r>
         <m:sSup>
           <m:e>
@@ -14954,7 +15340,7 @@
           <m:t>3.08</m:t>
         </m:r>
         <m:r>
-          <m:t>x</m:t>
+          <m:t>×</m:t>
         </m:r>
         <m:sSup>
           <m:e>
@@ -14986,7 +15372,7 @@
           <m:t>5.0</m:t>
         </m:r>
         <m:r>
-          <m:t>x</m:t>
+          <m:t>×</m:t>
         </m:r>
         <m:sSup>
           <m:e>
@@ -15018,7 +15404,7 @@
           <m:t>3.2</m:t>
         </m:r>
         <m:r>
-          <m:t>x</m:t>
+          <m:t>×</m:t>
         </m:r>
         <m:sSup>
           <m:e>
@@ -15050,7 +15436,7 @@
           <m:t>5.2</m:t>
         </m:r>
         <m:r>
-          <m:t>x</m:t>
+          <m:t>×</m:t>
         </m:r>
         <m:sSup>
           <m:e>
@@ -15066,9 +15452,18 @@
         </m:sSup>
       </m:oMath>
       <w:r>
-        <w:t xml:space="preserve">, SK cells expressing $2.2x</w:t>
-      </w:r>
-      <m:oMath>
+        <w:t xml:space="preserve">, SK cells expressing</w:t>
+      </w:r>
+      <w:r>
+        <w:t xml:space="preserve"> </w:t>
+      </w:r>
+      <m:oMath>
+        <m:r>
+          <m:t>2.2</m:t>
+        </m:r>
+        <m:r>
+          <m:t>×</m:t>
+        </m:r>
         <m:sSup>
           <m:e>
             <m:r>
@@ -15093,7 +15488,7 @@
           <m:t>2.8</m:t>
         </m:r>
         <m:r>
-          <m:t>x</m:t>
+          <m:t>×</m:t>
         </m:r>
         <m:sSup>
           <m:e>
@@ -15119,7 +15514,7 @@
           <m:t>3.8</m:t>
         </m:r>
         <m:r>
-          <m:t>x</m:t>
+          <m:t>×</m:t>
         </m:r>
         <m:sSup>
           <m:e>
@@ -15138,7 +15533,19 @@
         <w:t xml:space="preserve"> </w:t>
       </w:r>
       <w:r>
-        <w:t xml:space="preserve">receptors per cell as described in Csizmar et al.. Fluorescence was predicted for interactions with octa- and tetravalent ligands expressing either C5 or B22 fibronecting binding domains. c) Predicted binding ratios of MCF-7 cells to MDA cells when bound with octa- and tetravalent ligands expressing either C5 or B22 fibronecting binding domains.</w:t>
+        <w:t xml:space="preserve">receptors per cell as described in Csizmar et al. </w:t>
+      </w:r>
+      <w:hyperlink w:anchor="ref-u2Cb0DBq">
+        <w:r>
+          <w:rPr>
+            <w:rStyle w:val="Hyperlink"/>
+            <w:vertAlign w:val="superscript"/>
+          </w:rPr>
+          <w:t xml:space="preserve">18</w:t>
+        </w:r>
+      </w:hyperlink>
+      <w:r>
+        <w:t xml:space="preserve">. Fluorescence was predicted for interactions with octa- and tetravalent ligands expressing either C5 or B22 fibronecting binding domains. c) Predicted binding ratios of MCF-7 cells to MDA cells when bound with octa- and tetravalent ligands expressing either C5 or B22 fibronecting binding domains.</w:t>
       </w:r>
       <w:bookmarkEnd w:id="56"/>
     </w:p>
@@ -15172,7 +15579,7 @@
           <m:t>3.8</m:t>
         </m:r>
         <m:r>
-          <m:t>x</m:t>
+          <m:t>×</m:t>
         </m:r>
         <m:sSup>
           <m:e>
@@ -15201,7 +15608,7 @@
           <m:t>1.11</m:t>
         </m:r>
         <m:r>
-          <m:t>x</m:t>
+          <m:t>×</m:t>
         </m:r>
         <m:sSup>
           <m:e>
@@ -15220,7 +15627,7 @@
         </m:sSup>
       </m:oMath>
       <w:r>
-        <w:t xml:space="preserve">, the association constants for C5 and B22 were found to be</w:t>
+        <w:t xml:space="preserve">; the association constants for C5 and B22 were found to be</w:t>
       </w:r>
       <w:r>
         <w:t xml:space="preserve"> </w:t>
@@ -15230,7 +15637,7 @@
           <m:t>5.78</m:t>
         </m:r>
         <m:r>
-          <m:t>x</m:t>
+          <m:t>×</m:t>
         </m:r>
         <m:sSup>
           <m:e>
@@ -15259,7 +15666,7 @@
           <m:t>3.08</m:t>
         </m:r>
         <m:r>
-          <m:t>x</m:t>
+          <m:t>×</m:t>
         </m:r>
         <m:sSup>
           <m:e>
@@ -15291,7 +15698,7 @@
           <m:t>5.0</m:t>
         </m:r>
         <m:r>
-          <m:t>x</m:t>
+          <m:t>×</m:t>
         </m:r>
         <m:sSup>
           <m:e>
@@ -15323,7 +15730,7 @@
           <m:t>3.2</m:t>
         </m:r>
         <m:r>
-          <m:t>x</m:t>
+          <m:t>×</m:t>
         </m:r>
         <m:sSup>
           <m:e>
@@ -15355,7 +15762,7 @@
           <m:t>5.2</m:t>
         </m:r>
         <m:r>
-          <m:t>x</m:t>
+          <m:t>×</m:t>
         </m:r>
         <m:sSup>
           <m:e>
@@ -15371,9 +15778,18 @@
         </m:sSup>
       </m:oMath>
       <w:r>
-        <w:t xml:space="preserve">, SK cells expressing $2.2x</w:t>
-      </w:r>
-      <m:oMath>
+        <w:t xml:space="preserve">, SK cells expressing</w:t>
+      </w:r>
+      <w:r>
+        <w:t xml:space="preserve"> </w:t>
+      </w:r>
+      <m:oMath>
+        <m:r>
+          <m:t>2.2</m:t>
+        </m:r>
+        <m:r>
+          <m:t>×</m:t>
+        </m:r>
         <m:sSup>
           <m:e>
             <m:r>
@@ -15398,7 +15814,7 @@
           <m:t>2.8</m:t>
         </m:r>
         <m:r>
-          <m:t>x</m:t>
+          <m:t>×</m:t>
         </m:r>
         <m:sSup>
           <m:e>
@@ -15424,7 +15840,7 @@
           <m:t>3.8</m:t>
         </m:r>
         <m:r>
-          <m:t>x</m:t>
+          <m:t>×</m:t>
         </m:r>
         <m:sSup>
           <m:e>
@@ -15443,7 +15859,19 @@
         <w:t xml:space="preserve"> </w:t>
       </w:r>
       <w:r>
-        <w:t xml:space="preserve">receptors per cell as described in Csizmar et al.. Fluorescence was predicted for interactions with octa- and tetravalent ligands expressing either C5 or B22 fibronecting binding domains. c) Predicted binding ratios of MCF-7 cells to MDA cells when bound with octa- and tetravalent ligands expressing either C5 or B22 fibronecting binding domains.</w:t>
+        <w:t xml:space="preserve">receptors per cell as described in Csizmar et al. </w:t>
+      </w:r>
+      <w:hyperlink w:anchor="ref-u2Cb0DBq">
+        <w:r>
+          <w:rPr>
+            <w:rStyle w:val="Hyperlink"/>
+            <w:vertAlign w:val="superscript"/>
+          </w:rPr>
+          <w:t xml:space="preserve">18</w:t>
+        </w:r>
+      </w:hyperlink>
+      <w:r>
+        <w:t xml:space="preserve">. Fluorescence was predicted for interactions with octa- and tetravalent ligands expressing either C5 or B22 fibronecting binding domains. c) Predicted binding ratios of MCF-7 cells to MDA cells when bound with octa- and tetravalent ligands expressing either C5 or B22 fibronecting binding domains.</w:t>
       </w:r>
     </w:p>
     <w:bookmarkEnd w:id="0"/>

</xml_diff>

<commit_message>
Deploying to gh-pages from  @ e36835fd04fb7d9cf759a9ef97e4e239b67d6287 🚀
</commit_message>
<xml_diff>
--- a/manuscript.docx
+++ b/manuscript.docx
@@ -78,7 +78,7 @@
         <w:t xml:space="preserve"> </w:t>
       </w:r>
       <w:r>
-        <w:t xml:space="preserve">was automatically generated on October 9, 2020.</w:t>
+        <w:t xml:space="preserve">was automatically generated on October 10, 2020.</w:t>
       </w:r>
       <w:r>
         <w:t xml:space="preserve"> </w:t>
@@ -626,7 +626,7 @@
         <w:pStyle w:val="BodyText"/>
       </w:pPr>
       <w:r>
-        <w:t xml:space="preserve">Here we investigate cell-specific targeting quantitatively by extending a multi-valent, multi-ligand equilibrium binding model. Virtually any therapy, including monoclonal antibodies, small-molecule inhibitors, and cytokines, can be thought of as ligands for respective receptors expressed on target cells. Ligand binding to target cells is the first step and essential for a drug’s intended action; in contrast, binding to off-target cells can result in unintended effects or toxicity. Some cell populations can be distinguished by unique receptor expression, but more commonly target and off-target cells express the same collection of receptors and differ only in their amounts. In such situations, engineering drugs optimized to achieve more ligand bound to the target cells while minimizing the binding to off-target cells, is an area of ongoing research and has inspired myriad drug design strategies.</w:t>
+        <w:t xml:space="preserve">Here we investigate cell-specific targeting quantitatively by extending a multi-valent, multi-ligand equilibrium binding model. Virtually any therapy, including monoclonal antibodies, small-molecule inhibitors, and cytokines, can be thought of as ligands for respective receptors expressed on target cells. Ligand binding to target cells is the first step and essential for a drug’s intended action; in contrast, binding to off-target cells can result in unintended effects or toxicity. Some cell populations can be distinguished by their expression of a receptor not expressed by other populations, but more commonly target and off-target cells express the same collection of receptors and differ only in their magnitudes of receptor expression. In such situations, engineering drugs optimized to achieve more ligand bound to the target cells while minimizing the binding to off-target cells is an area of ongoing research and has inspired myriad drug design strategies.</w:t>
       </w:r>
       <w:hyperlink w:anchor="ref-10kZoPeON">
         <w:r>
@@ -664,93 +664,7 @@
         <w:pStyle w:val="BodyText"/>
       </w:pPr>
       <w:r>
-        <w:t xml:space="preserve">While ligand-receptor binding events in biology are diverse, they are governed by thermodynamic properties and the law of mass action. When a reaction reaches its equilibrium state, the ratio of the concentration of monomeric ligand-receptor complex,</w:t>
-      </w:r>
-      <w:r>
-        <w:t xml:space="preserve"> </w:t>
-      </w:r>
-      <m:oMath>
-        <m:r>
-          <m:t>[</m:t>
-        </m:r>
-        <m:r>
-          <m:t>L</m:t>
-        </m:r>
-        <m:r>
-          <m:t>R</m:t>
-        </m:r>
-        <m:r>
-          <m:t>]</m:t>
-        </m:r>
-      </m:oMath>
-      <w:r>
-        <w:t xml:space="preserve">, to the product of the concentrations of each,</w:t>
-      </w:r>
-      <w:r>
-        <w:t xml:space="preserve"> </w:t>
-      </w:r>
-      <m:oMath>
-        <m:r>
-          <m:t>[</m:t>
-        </m:r>
-        <m:r>
-          <m:t>L</m:t>
-        </m:r>
-        <m:r>
-          <m:t>]</m:t>
-        </m:r>
-        <m:r>
-          <m:t>[</m:t>
-        </m:r>
-        <m:r>
-          <m:t>R</m:t>
-        </m:r>
-        <m:r>
-          <m:t>]</m:t>
-        </m:r>
-      </m:oMath>
-      <w:r>
-        <w:t xml:space="preserve">, can be defined as an association constant</w:t>
-      </w:r>
-      <w:r>
-        <w:t xml:space="preserve"> </w:t>
-      </w:r>
-      <m:oMath>
-        <m:sSub>
-          <m:e>
-            <m:r>
-              <m:t>K</m:t>
-            </m:r>
-          </m:e>
-          <m:sub>
-            <m:r>
-              <m:t>a</m:t>
-            </m:r>
-          </m:sub>
-        </m:sSub>
-      </m:oMath>
-      <w:r>
-        <w:t xml:space="preserve">, and its reciprocal is defined as the dissociation constant</w:t>
-      </w:r>
-      <w:r>
-        <w:t xml:space="preserve"> </w:t>
-      </w:r>
-      <m:oMath>
-        <m:sSub>
-          <m:e>
-            <m:r>
-              <m:t>K</m:t>
-            </m:r>
-          </m:e>
-          <m:sub>
-            <m:r>
-              <m:t>d</m:t>
-            </m:r>
-          </m:sub>
-        </m:sSub>
-      </m:oMath>
-      <w:r>
-        <w:t xml:space="preserve">. The number of ligands in the solution is usually much greater than that of the receptors, so we assume binding does not deplete the ligand concentration. Binding behavior is more complex when the ligands are multivalent complexes consisting of multiple units, each of which can bind to a receptor (Fig.</w:t>
+        <w:t xml:space="preserve">While ligand-receptor binding events in biology are diverse, they are governed by thermodynamic properties and the law of mass action. Binding behavior is more complex when the ligands are multivalent complexes consisting of multiple units, each of which can bind to a receptor (Fig.</w:t>
       </w:r>
       <w:r>
         <w:t xml:space="preserve"> </w:t>
@@ -789,7 +703,7 @@
         </m:sSubSup>
       </m:oMath>
       <w:r>
-        <w:t xml:space="preserve">. Another consideration that must be made when modeling multivalent binding processes is whether a ligand complex is formed by a random assortment of monomer units or by engineering to produce complexes of defined uniform composition. We developed a multivalent binding model that calculates the amount of ligand bound at equilibrium taking each of these factors into account (see methods).</w:t>
+        <w:t xml:space="preserve">. Another consideration that must be made when modeling multivalent binding processes is whether ligand complexes are formed via random assortment of monomers, or whether the monomer composition is uniform across complexes. We developed a multivalent binding model that calculates the amount of ligand bound at equilibrium taking each of these factors into account (see methods).</w:t>
       </w:r>
     </w:p>
     <w:p>
@@ -936,7 +850,7 @@
         </w:r>
       </w:hyperlink>
       <w:r>
-        <w:t xml:space="preserve">c, cell populations at points 1 and 2 are on the same contour line and thus have the same amount of ligand bound; the cell populations at points 1 and 3 have multiple contour lines between and so point 3 has more ligand binding (In fact, the ratio can be read as the exponent of the contour line difference. For point 3 to point 1, the ratio is</w:t>
+        <w:t xml:space="preserve">c, cell populations at points 1 and 2 are on the same contour line and thus have the same amount of ligand bound; the cell populations at points 1 and 3 are separated by multiple contour lines, indicating that cells at point 3 bind more ligand (In fact, the ratio can be read as the exponent of the contour line difference. For point 3 to point 1, the ratio is</w:t>
       </w:r>
       <w:r>
         <w:t xml:space="preserve"> </w:t>
@@ -991,7 +905,7 @@
         <w:t xml:space="preserve"> </w:t>
       </w:r>
       <w:r>
-        <w:t xml:space="preserve">increases on a cell (a point moves rightward, e.g. from 1 to 2), the amount of binding doesn’t increase significantly. On the contrary, adding more</w:t>
+        <w:t xml:space="preserve">increases on a cell (a point moves rightward, e.g. from 1 to 2), the amount of binding doesn’t increase significantly. On the contrary, a cell with increased expression of</w:t>
       </w:r>
       <w:r>
         <w:t xml:space="preserve"> </w:t>
@@ -1014,7 +928,7 @@
         <w:t xml:space="preserve"> </w:t>
       </w:r>
       <w:r>
-        <w:t xml:space="preserve">(moving upward, e.g. from 1 to 3) will lead to a great boost on ligand bound. The high affinity of</w:t>
+        <w:t xml:space="preserve">(moving upward, e.g. from 1 to 3) will bind significantly more ligand. Here, the ligand’s high affinity for</w:t>
       </w:r>
       <w:r>
         <w:t xml:space="preserve"> </w:t>
@@ -1029,6 +943,26 @@
           <m:sub>
             <m:r>
               <m:t>2</m:t>
+            </m:r>
+          </m:sub>
+        </m:sSub>
+      </m:oMath>
+      <w:r>
+        <w:t xml:space="preserve">, and relatively low affinity for</w:t>
+      </w:r>
+      <w:r>
+        <w:t xml:space="preserve"> </w:t>
+      </w:r>
+      <m:oMath>
+        <m:sSub>
+          <m:e>
+            <m:r>
+              <m:t>R</m:t>
+            </m:r>
+          </m:e>
+          <m:sub>
+            <m:r>
+              <m:t>1</m:t>
             </m:r>
           </m:sub>
         </m:sSub>
@@ -2530,7 +2464,33 @@
       </w:r>
       <m:oMath>
         <m:r>
-          <m:t>10000</m:t>
+          <m:t>10</m:t>
+        </m:r>
+        <m:r>
+          <m:rPr>
+            <m:sty m:val="p"/>
+          </m:rPr>
+          <m:t>μ</m:t>
+        </m:r>
+        <m:r>
+          <m:rPr>
+            <m:sty m:val="p"/>
+          </m:rPr>
+          <m:t>M</m:t>
+        </m:r>
+      </m:oMath>
+      <w:r>
+        <w:t xml:space="preserve"> </w:t>
+      </w:r>
+      <w:r>
+        <w:t xml:space="preserve">to</w:t>
+      </w:r>
+      <w:r>
+        <w:t xml:space="preserve"> </w:t>
+      </w:r>
+      <m:oMath>
+        <m:r>
+          <m:t>100</m:t>
         </m:r>
         <m:r>
           <m:rPr>
@@ -2549,33 +2509,7 @@
         <w:t xml:space="preserve"> </w:t>
       </w:r>
       <w:r>
-        <w:t xml:space="preserve">to</w:t>
-      </w:r>
-      <w:r>
-        <w:t xml:space="preserve"> </w:t>
-      </w:r>
-      <m:oMath>
-        <m:r>
-          <m:t>100</m:t>
-        </m:r>
-        <m:r>
-          <m:rPr>
-            <m:sty m:val="p"/>
-          </m:rPr>
-          <m:t>n</m:t>
-        </m:r>
-        <m:r>
-          <m:rPr>
-            <m:sty m:val="p"/>
-          </m:rPr>
-          <m:t>M</m:t>
-        </m:r>
-      </m:oMath>
-      <w:r>
-        <w:t xml:space="preserve"> </w:t>
-      </w:r>
-      <w:r>
-        <w:t xml:space="preserve">to the two receptors</w:t>
+        <w:t xml:space="preserve">to both receptors</w:t>
       </w:r>
       <w:r>
         <w:t xml:space="preserve"> </w:t>
@@ -2635,7 +2569,7 @@
         </w:r>
       </w:hyperlink>
       <w:r>
-        <w:t xml:space="preserve">a). When a target cell population expresses a receptor uniquely higher than other populations, enhancing the affinity of the drug to this receptor is a clear strategy to increase selective binding to this population. For example,</w:t>
+        <w:t xml:space="preserve">a). When a target cell population expresses a receptor not expressed by off-target cell populations, enhancing the affinity of the drug to this receptor is a clear strategy to increase selective binding to this population. For example,</w:t>
       </w:r>
       <w:r>
         <w:t xml:space="preserve"> </w:t>
@@ -2686,7 +2620,7 @@
         <w:t xml:space="preserve"> </w:t>
       </w:r>
       <w:r>
-        <w:t xml:space="preserve">only expresses a high amount of</w:t>
+        <w:t xml:space="preserve">only significantly expresses</w:t>
       </w:r>
       <w:r>
         <w:t xml:space="preserve"> </w:t>
@@ -2757,7 +2691,7 @@
         <w:t xml:space="preserve"> </w:t>
       </w:r>
       <w:r>
-        <w:t xml:space="preserve">only expresses a high amount of</w:t>
+        <w:t xml:space="preserve">only significantly expresses</w:t>
       </w:r>
       <w:r>
         <w:t xml:space="preserve"> </w:t>
@@ -2902,7 +2836,7 @@
         </w:r>
       </w:hyperlink>
       <w:r>
-        <w:t xml:space="preserve">a shows this trend more intuitively: when the affinity of</w:t>
+        <w:t xml:space="preserve">a shows this trend more intuitively: when ligand affinity to</w:t>
       </w:r>
       <w:r>
         <w:t xml:space="preserve"> </w:t>
@@ -2925,7 +2859,30 @@
         <w:t xml:space="preserve"> </w:t>
       </w:r>
       <w:r>
-        <w:t xml:space="preserve">increases, which corresponds to shifting from the left subplots to the right ones, the contour lines of higher values shift inward and cluster more densely, indicating an increase in the amount of ligand bound for the populations with high</w:t>
+        <w:t xml:space="preserve">increases, binding is shown to vary more strongly according to</w:t>
+      </w:r>
+      <w:r>
+        <w:t xml:space="preserve"> </w:t>
+      </w:r>
+      <m:oMath>
+        <m:sSub>
+          <m:e>
+            <m:r>
+              <m:t>R</m:t>
+            </m:r>
+          </m:e>
+          <m:sub>
+            <m:r>
+              <m:t>1</m:t>
+            </m:r>
+          </m:sub>
+        </m:sSub>
+      </m:oMath>
+      <w:r>
+        <w:t xml:space="preserve"> </w:t>
+      </w:r>
+      <w:r>
+        <w:t xml:space="preserve">expression, indicating an increase in the amount of ligand bound for the populations with high</w:t>
       </w:r>
       <w:r>
         <w:t xml:space="preserve"> </w:t>
@@ -3103,7 +3060,7 @@
         <w:pStyle w:val="BodyText"/>
       </w:pPr>
       <w:r>
-        <w:t xml:space="preserve">However, it is quite often that both on- and off-target cell populations express the same set of receptors and only differ in their magnitude of expression. In these cases, we found out that it is beneficial for the drug to bind tightly to the most comparatively highly expressed receptor on the target population. Some examples of this pattern are the selective binding to</w:t>
+        <w:t xml:space="preserve">However, situations where both on- and off-target cell populations express the same set of receptors and only differ in their magnitude of expression are just as common. In these cases, we found out that it is beneficial for the drug to bind tightly to the most comparatively highly expressed receptor on the target population. Some examples of this pattern are the selective binding to</w:t>
       </w:r>
       <w:r>
         <w:t xml:space="preserve"> </w:t>
@@ -3341,7 +3298,7 @@
         </w:r>
       </w:hyperlink>
       <w:r>
-        <w:t xml:space="preserve">c,d). Since the more highly expressed receptors have only 10-fold difference comparing with the 100-fold difference in</w:t>
+        <w:t xml:space="preserve">c,d). Since the ratios of receptor expressions between</w:t>
       </w:r>
       <w:r>
         <w:t xml:space="preserve"> </w:t>
@@ -3360,6 +3317,29 @@
           </m:sub>
           <m:sup>
             <m:r>
+              <m:t>m</m:t>
+            </m:r>
+            <m:r>
+              <m:t>e</m:t>
+            </m:r>
+            <m:r>
+              <m:t>d</m:t>
+            </m:r>
+          </m:sup>
+        </m:sSubSup>
+        <m:sSubSup>
+          <m:e>
+            <m:r>
+              <m:t>R</m:t>
+            </m:r>
+          </m:e>
+          <m:sub>
+            <m:r>
+              <m:t>2</m:t>
+            </m:r>
+          </m:sub>
+          <m:sup>
+            <m:r>
               <m:t>h</m:t>
             </m:r>
             <m:r>
@@ -3367,6 +3347,37 @@
             </m:r>
           </m:sup>
         </m:sSubSup>
+      </m:oMath>
+      <w:r>
+        <w:t xml:space="preserve"> </w:t>
+      </w:r>
+      <w:r>
+        <w:t xml:space="preserve">and</w:t>
+      </w:r>
+      <w:r>
+        <w:t xml:space="preserve"> </w:t>
+      </w:r>
+      <m:oMath>
+        <m:sSubSup>
+          <m:e>
+            <m:r>
+              <m:t>R</m:t>
+            </m:r>
+          </m:e>
+          <m:sub>
+            <m:r>
+              <m:t>1</m:t>
+            </m:r>
+          </m:sub>
+          <m:sup>
+            <m:r>
+              <m:t>h</m:t>
+            </m:r>
+            <m:r>
+              <m:t>i</m:t>
+            </m:r>
+          </m:sup>
+        </m:sSubSup>
         <m:sSubSup>
           <m:e>
             <m:r>
@@ -3380,6 +3391,60 @@
           </m:sub>
           <m:sup>
             <m:r>
+              <m:t>m</m:t>
+            </m:r>
+            <m:r>
+              <m:t>e</m:t>
+            </m:r>
+            <m:r>
+              <m:t>d</m:t>
+            </m:r>
+          </m:sup>
+        </m:sSubSup>
+      </m:oMath>
+      <w:r>
+        <w:t xml:space="preserve"> </w:t>
+      </w:r>
+      <w:r>
+        <w:t xml:space="preserve">are significantly lower than those between</w:t>
+      </w:r>
+      <w:r>
+        <w:t xml:space="preserve"> </w:t>
+      </w:r>
+      <m:oMath>
+        <m:sSubSup>
+          <m:e>
+            <m:r>
+              <m:t>R</m:t>
+            </m:r>
+          </m:e>
+          <m:sub>
+            <m:r>
+              <m:t>1</m:t>
+            </m:r>
+          </m:sub>
+          <m:sup>
+            <m:r>
+              <m:t>h</m:t>
+            </m:r>
+            <m:r>
+              <m:t>i</m:t>
+            </m:r>
+          </m:sup>
+        </m:sSubSup>
+        <m:sSubSup>
+          <m:e>
+            <m:r>
+              <m:t>R</m:t>
+            </m:r>
+          </m:e>
+          <m:sub>
+            <m:r>
+              <m:t>2</m:t>
+            </m:r>
+          </m:sub>
+          <m:sup>
+            <m:r>
               <m:t>l</m:t>
             </m:r>
             <m:r>
@@ -3392,7 +3457,7 @@
         <w:t xml:space="preserve"> </w:t>
       </w:r>
       <w:r>
-        <w:t xml:space="preserve">over</w:t>
+        <w:t xml:space="preserve">and</w:t>
       </w:r>
       <w:r>
         <w:t xml:space="preserve"> </w:t>
@@ -3440,7 +3505,7 @@
         </m:sSubSup>
       </m:oMath>
       <w:r>
-        <w:t xml:space="preserve">, the greatest binding ratios these two pairs can achieve are no more than 10 times instead of 50 times. When both receptors are uniformally more abundant in a target population than the off target population, such as when comparing</w:t>
+        <w:t xml:space="preserve">, the greatest binding selectivity that can be achieved for these two populations is also significantly lower. When both receptors are uniformally more abundant in a target population than the off target population, such as when comparing</w:t>
       </w:r>
       <w:r>
         <w:t xml:space="preserve"> </w:t>
@@ -3559,7 +3624,7 @@
         </w:r>
       </w:hyperlink>
       <w:r>
-        <w:t xml:space="preserve">d). Therefore, to use affinity changes for selectivity enhancement, it is critical to identify which receptors a cell population of interest expresses the most uniquely.</w:t>
+        <w:t xml:space="preserve">d). Therefore, to use affinity changes for selectivity enhancement, it is critical to identify which receptors a cell population of interest expresses the most uniquely when compared to off-target populations.</w:t>
       </w:r>
     </w:p>
     <w:p>
@@ -3567,7 +3632,7 @@
         <w:pStyle w:val="BodyText"/>
       </w:pPr>
       <w:r>
-        <w:t xml:space="preserve">Through reading the contour plots, we can also ponder how affinity changes affect the intrapopulation heterogeneity. For example,</w:t>
+        <w:t xml:space="preserve">Our binding contour plots are also useful for considering the interplay between affinity modulation and intrapopulation receptor expression heterogeneity. For example,</w:t>
       </w:r>
       <w:r>
         <w:t xml:space="preserve"> </w:t>
@@ -3684,9 +3749,6 @@
         </w:r>
       </w:hyperlink>
       <w:r>
-        <w:t xml:space="preserve"> </w:t>
-      </w:r>
-      <w:r>
         <w:t xml:space="preserve">a). When the binding affinities to</w:t>
       </w:r>
       <w:r>
@@ -3733,7 +3795,7 @@
         <w:t xml:space="preserve"> </w:t>
       </w:r>
       <w:r>
-        <w:t xml:space="preserve">are divergent, such as shown in the subplots in the upper left corner and bottom right corner of Figure</w:t>
+        <w:t xml:space="preserve">are divergent, as shown in the subplots in the upper left corner and bottom right corner of Fig.</w:t>
       </w:r>
       <w:r>
         <w:t xml:space="preserve"> </w:t>
@@ -3747,9 +3809,6 @@
         </w:r>
       </w:hyperlink>
       <w:r>
-        <w:t xml:space="preserve"> </w:t>
-      </w:r>
-      <w:r>
         <w:t xml:space="preserve">a, the ellipse representing its range of receptor abundances rides through multiple contour lines, indicating wide variation in the quantity of bound ligand. This intrapopulation variation in the amount of ligand bound, however, is not observed when the affinities to</w:t>
       </w:r>
       <w:r>
@@ -3796,7 +3855,7 @@
         <w:t xml:space="preserve"> </w:t>
       </w:r>
       <w:r>
-        <w:t xml:space="preserve">are more balanced. When designing a therapeutic for cell populations with broader or more dynamic expression profile, such as tumor cells, the consideration in intrapopulation heterogeneity when using affinity engineering is worthwhile.</w:t>
+        <w:t xml:space="preserve">are more balanced. Thus, a populations receptor expression heterogeneity may be an important factor to consider when modulating ligand affinity.</w:t>
       </w:r>
     </w:p>
     <w:p>
@@ -3857,7 +3916,7 @@
         </w:r>
       </w:hyperlink>
       <w:r>
-        <w:t xml:space="preserve">a. Here, the amount of ligand bound by cells expressing different abundances of receptor</w:t>
+        <w:t xml:space="preserve">a. Here, the ligand considered only binds to receptor</w:t>
       </w:r>
       <w:r>
         <w:t xml:space="preserve"> </w:t>
@@ -3880,53 +3939,7 @@
         <w:t xml:space="preserve"> </w:t>
       </w:r>
       <w:r>
-        <w:t xml:space="preserve">and</w:t>
-      </w:r>
-      <w:r>
-        <w:t xml:space="preserve"> </w:t>
-      </w:r>
-      <m:oMath>
-        <m:sSub>
-          <m:e>
-            <m:r>
-              <m:t>R</m:t>
-            </m:r>
-          </m:e>
-          <m:sub>
-            <m:r>
-              <m:t>2</m:t>
-            </m:r>
-          </m:sub>
-        </m:sSub>
-      </m:oMath>
-      <w:r>
-        <w:t xml:space="preserve"> </w:t>
-      </w:r>
-      <w:r>
-        <w:t xml:space="preserve">is quantified. The ligand only binds to receptor</w:t>
-      </w:r>
-      <w:r>
-        <w:t xml:space="preserve"> </w:t>
-      </w:r>
-      <m:oMath>
-        <m:sSub>
-          <m:e>
-            <m:r>
-              <m:t>R</m:t>
-            </m:r>
-          </m:e>
-          <m:sub>
-            <m:r>
-              <m:t>1</m:t>
-            </m:r>
-          </m:sub>
-        </m:sSub>
-      </m:oMath>
-      <w:r>
-        <w:t xml:space="preserve"> </w:t>
-      </w:r>
-      <w:r>
-        <w:t xml:space="preserve">and the valency of the ligand is varied across subplots. The most notable effect of changing valency is observed as variable density of lines in the binding contour plot. For example, in the monovalent case, there are roughly the same amount of contour lines between $ R_1</w:t>
+        <w:t xml:space="preserve">and the valency of the ligand is varied across subplots. Here, it is shown that varying ligand valency results in a nonlinear relationship between receptor abundance and binding magnitude. For example, in the monovalent case, there are roughly the same amount of contour lines between $ R_1</w:t>
       </w:r>
       <w:r>
         <w:rPr>
@@ -3977,6 +3990,37 @@
           </m:sub>
           <m:sup>
             <m:r>
+              <m:t>l</m:t>
+            </m:r>
+            <m:r>
+              <m:t>o</m:t>
+            </m:r>
+          </m:sup>
+        </m:sSubSup>
+      </m:oMath>
+      <w:r>
+        <w:t xml:space="preserve"> </w:t>
+      </w:r>
+      <w:r>
+        <w:t xml:space="preserve">as there are between</w:t>
+      </w:r>
+      <w:r>
+        <w:t xml:space="preserve"> </w:t>
+      </w:r>
+      <m:oMath>
+        <m:sSubSup>
+          <m:e>
+            <m:r>
+              <m:t>R</m:t>
+            </m:r>
+          </m:e>
+          <m:sub>
+            <m:r>
+              <m:t>1</m:t>
+            </m:r>
+          </m:sub>
+          <m:sup>
+            <m:r>
               <m:t>m</m:t>
             </m:r>
             <m:r>
@@ -3987,12 +4031,32 @@
             </m:r>
           </m:sup>
         </m:sSubSup>
-      </m:oMath>
-      <w:r>
-        <w:t xml:space="preserve"> </w:t>
-      </w:r>
-      <w:r>
-        <w:t xml:space="preserve">and between</w:t>
+        <m:sSubSup>
+          <m:e>
+            <m:r>
+              <m:t>R</m:t>
+            </m:r>
+          </m:e>
+          <m:sub>
+            <m:r>
+              <m:t>2</m:t>
+            </m:r>
+          </m:sub>
+          <m:sup>
+            <m:r>
+              <m:t>l</m:t>
+            </m:r>
+            <m:r>
+              <m:t>o</m:t>
+            </m:r>
+          </m:sup>
+        </m:sSubSup>
+      </m:oMath>
+      <w:r>
+        <w:t xml:space="preserve"> </w:t>
+      </w:r>
+      <w:r>
+        <w:t xml:space="preserve">and</w:t>
       </w:r>
       <w:r>
         <w:t xml:space="preserve"> </w:t>
@@ -4011,6 +4075,57 @@
           </m:sub>
           <m:sup>
             <m:r>
+              <m:t>h</m:t>
+            </m:r>
+            <m:r>
+              <m:t>i</m:t>
+            </m:r>
+          </m:sup>
+        </m:sSubSup>
+        <m:sSubSup>
+          <m:e>
+            <m:r>
+              <m:t>R</m:t>
+            </m:r>
+          </m:e>
+          <m:sub>
+            <m:r>
+              <m:t>2</m:t>
+            </m:r>
+          </m:sub>
+          <m:sup>
+            <m:r>
+              <m:t>l</m:t>
+            </m:r>
+            <m:r>
+              <m:t>o</m:t>
+            </m:r>
+          </m:sup>
+        </m:sSubSup>
+      </m:oMath>
+      <w:r>
+        <w:t xml:space="preserve"> </w:t>
+      </w:r>
+      <w:r>
+        <w:t xml:space="preserve">due to the linear relationship between receptors expressed and ligand bound. However, in the tetravalent case, there are comparatively more contour lines between</w:t>
+      </w:r>
+      <w:r>
+        <w:t xml:space="preserve"> </w:t>
+      </w:r>
+      <m:oMath>
+        <m:sSubSup>
+          <m:e>
+            <m:r>
+              <m:t>R</m:t>
+            </m:r>
+          </m:e>
+          <m:sub>
+            <m:r>
+              <m:t>1</m:t>
+            </m:r>
+          </m:sub>
+          <m:sup>
+            <m:r>
               <m:t>m</m:t>
             </m:r>
             <m:r>
@@ -4034,13 +4149,10 @@
           </m:sub>
           <m:sup>
             <m:r>
-              <m:t>m</m:t>
-            </m:r>
-            <m:r>
-              <m:t>e</m:t>
-            </m:r>
-            <m:r>
-              <m:t>d</m:t>
+              <m:t>l</m:t>
+            </m:r>
+            <m:r>
+              <m:t>o</m:t>
             </m:r>
           </m:sup>
         </m:sSubSup>
@@ -4088,121 +4200,16 @@
           </m:sub>
           <m:sup>
             <m:r>
-              <m:t>h</m:t>
-            </m:r>
-            <m:r>
-              <m:t>i</m:t>
-            </m:r>
-          </m:sup>
-        </m:sSubSup>
-      </m:oMath>
-      <w:r>
-        <w:t xml:space="preserve">, but in the tetravalent case, there are more contour lines between</w:t>
-      </w:r>
-      <w:r>
-        <w:t xml:space="preserve"> </w:t>
-      </w:r>
-      <m:oMath>
-        <m:sSubSup>
-          <m:e>
-            <m:r>
-              <m:t>R</m:t>
-            </m:r>
-          </m:e>
-          <m:sub>
-            <m:r>
-              <m:t>1</m:t>
-            </m:r>
-          </m:sub>
-          <m:sup>
-            <m:r>
-              <m:t>m</m:t>
-            </m:r>
-            <m:r>
-              <m:t>e</m:t>
-            </m:r>
-            <m:r>
-              <m:t>d</m:t>
-            </m:r>
-          </m:sup>
-        </m:sSubSup>
-        <m:sSubSup>
-          <m:e>
-            <m:r>
-              <m:t>R</m:t>
-            </m:r>
-          </m:e>
-          <m:sub>
-            <m:r>
-              <m:t>2</m:t>
-            </m:r>
-          </m:sub>
-          <m:sup>
-            <m:r>
-              <m:t>m</m:t>
-            </m:r>
-            <m:r>
-              <m:t>e</m:t>
-            </m:r>
-            <m:r>
-              <m:t>d</m:t>
-            </m:r>
-          </m:sup>
-        </m:sSubSup>
-      </m:oMath>
-      <w:r>
-        <w:t xml:space="preserve"> </w:t>
-      </w:r>
-      <w:r>
-        <w:t xml:space="preserve">and</w:t>
-      </w:r>
-      <w:r>
-        <w:t xml:space="preserve"> </w:t>
-      </w:r>
-      <m:oMath>
-        <m:sSubSup>
-          <m:e>
-            <m:r>
-              <m:t>R</m:t>
-            </m:r>
-          </m:e>
-          <m:sub>
-            <m:r>
-              <m:t>1</m:t>
-            </m:r>
-          </m:sub>
-          <m:sup>
-            <m:r>
-              <m:t>h</m:t>
-            </m:r>
-            <m:r>
-              <m:t>i</m:t>
-            </m:r>
-          </m:sup>
-        </m:sSubSup>
-        <m:sSubSup>
-          <m:e>
-            <m:r>
-              <m:t>R</m:t>
-            </m:r>
-          </m:e>
-          <m:sub>
-            <m:r>
-              <m:t>2</m:t>
-            </m:r>
-          </m:sub>
-          <m:sup>
-            <m:r>
-              <m:t>h</m:t>
-            </m:r>
-            <m:r>
-              <m:t>i</m:t>
-            </m:r>
-          </m:sup>
-        </m:sSubSup>
-      </m:oMath>
-      <w:r>
-        <w:t xml:space="preserve">, suggesting a sharper increase in ligand bound (Fig.</w:t>
+              <m:t>l</m:t>
+            </m:r>
+            <m:r>
+              <m:t>o</m:t>
+            </m:r>
+          </m:sup>
+        </m:sSubSup>
+      </m:oMath>
+      <w:r>
+        <w:t xml:space="preserve">, indicating that ligand bound is a nonlinear function of receptor expression (Fig.</w:t>
       </w:r>
       <w:r>
         <w:t xml:space="preserve"> </w:t>
@@ -4276,7 +4283,7 @@
         <w:pStyle w:val="BodyText"/>
       </w:pPr>
       <w:r>
-        <w:t xml:space="preserve">Selectivity derived by changing valency is dependent on affinity. As many previous studies have suggested, lower affinity, multi-valent interactions have been shown to exhibit selectivity based on receptor abundance.</w:t>
+        <w:t xml:space="preserve">Selectivity derived by changing valency requires coordinate changes in affinity. As is shown by our model, and as many previous studies have suggested, lower affinity, multi-valent interactions can result in extreme selectivity for target populations expressing high abundances of receptors.</w:t>
       </w:r>
       <w:hyperlink w:anchor="ref-B0xrCfE3">
         <w:r>
@@ -4306,7 +4313,7 @@
         <w:t xml:space="preserve"> </w:t>
       </w:r>
       <w:r>
-        <w:t xml:space="preserve">Comparing binding between cell populations exposed to ligands of variable affinities over a range of ligand valency demonstrates this interplay (Fig.</w:t>
+        <w:t xml:space="preserve">Comparing binding between cell populations exposed to ligands of variable affinities over a range of ligand valency demonstrates the interplay between these factors (Fig.</w:t>
       </w:r>
       <w:r>
         <w:t xml:space="preserve"> </w:t>
@@ -4320,7 +4327,7 @@
         </w:r>
       </w:hyperlink>
       <w:r>
-        <w:t xml:space="preserve">b-d). Here, the ligand binding ratios for</w:t>
+        <w:t xml:space="preserve">b-d). Here, the ligand binding ratios between cell populations are shown for ligands of high, medium, and low affinities for</w:t>
       </w:r>
       <w:r>
         <w:t xml:space="preserve"> </w:t>
@@ -4343,7 +4350,7 @@
         <w:t xml:space="preserve"> </w:t>
       </w:r>
       <w:r>
-        <w:t xml:space="preserve">between cell populations are shown for ligands of high, medium, and low affinities (</w:t>
+        <w:t xml:space="preserve">(</w:t>
       </w:r>
       <m:oMath>
         <m:sSub>
@@ -4883,7 +4890,7 @@
         </w:r>
       </w:hyperlink>
       <w:r>
-        <w:t xml:space="preserve">g). Multivalent ligands will undergo initial binding events at rates unaffected by receptor abundance, but low affinity and receptor density severely limit the possibility of secondary binding events. In contrast, cells with higher receptor abundance accumulate ligand binding by binding ligand at high valency, as the rate of multi-valent binding is greater than that of disassociation (Fig.</w:t>
+        <w:t xml:space="preserve">g). Multivalent ligands will undergo initial binding events at rates unaffected by receptor abundance, but low affinity and receptor density severely limit the possibility of secondary binding events. In contrast, cells with higher receptor abundance accumulate ligand binding by binding multivalent ligands to multiple receptors, as the forward rate of secondary binding events is greater than that of receptor-ligand disassociation (Fig.</w:t>
       </w:r>
       <w:r>
         <w:t xml:space="preserve"> </w:t>
@@ -4897,7 +4904,7 @@
         </w:r>
       </w:hyperlink>
       <w:r>
-        <w:t xml:space="preserve">f). This effect allows for valency to provide selectivity between cells having differences in receptor expression density, where affinity alone fails.</w:t>
+        <w:t xml:space="preserve">f). This effect allows multivalent ligands to achieve selective binding to cells based on their receptor abundances, which monovalent ligands, even with engineered affinities, are unable to do.</w:t>
       </w:r>
     </w:p>
     <w:bookmarkStart w:id="0" w:name="fig:valency"/>
@@ -4952,7 +4959,7 @@
       </w:r>
       <m:oMath>
         <m:r>
-          <m:t>330</m:t>
+          <m:t>100</m:t>
         </m:r>
         <m:r>
           <m:rPr>
@@ -5384,7 +5391,7 @@
         </m:sSubSup>
       </m:oMath>
       <w:r>
-        <w:t xml:space="preserve">. e-f) Number of ligands bound at each degree of binding for cells exposed to octavalent ligand complexes composed of subunits with dissociation constants of</w:t>
+        <w:t xml:space="preserve">. e-f) Number of ligand bound to each possible number of receptors for cells exposed to octavalent ligand complexes composed of subunits with dissociation constants of</w:t>
       </w:r>
       <w:r>
         <w:t xml:space="preserve"> </w:t>
@@ -5478,7 +5485,7 @@
         <w:t xml:space="preserve"> </w:t>
       </w:r>
       <w:r>
-        <w:t xml:space="preserve">receptors. g) Fraction of forward to reverse binding rates for a multivalent ligand binding to a cell with varying amounts of receptor expression, following an initial binding event.</w:t>
+        <w:t xml:space="preserve">receptors. g) Ratio of forward to reverse binding rate for secondary binding events for multivalent ligands to cells expressing variable amounts of receptors.</w:t>
       </w:r>
       <w:bookmarkEnd w:id="37"/>
     </w:p>
@@ -5532,7 +5539,7 @@
       </w:r>
       <m:oMath>
         <m:r>
-          <m:t>330</m:t>
+          <m:t>100</m:t>
         </m:r>
         <m:r>
           <m:rPr>
@@ -5964,7 +5971,7 @@
         </m:sSubSup>
       </m:oMath>
       <w:r>
-        <w:t xml:space="preserve">. e-f) Number of ligands bound at each degree of binding for cells exposed to octavalent ligand complexes composed of subunits with dissociation constants of</w:t>
+        <w:t xml:space="preserve">. e-f) Number of ligand bound to each possible number of receptors for cells exposed to octavalent ligand complexes composed of subunits with dissociation constants of</w:t>
       </w:r>
       <w:r>
         <w:t xml:space="preserve"> </w:t>
@@ -6058,7 +6065,7 @@
         <w:t xml:space="preserve"> </w:t>
       </w:r>
       <w:r>
-        <w:t xml:space="preserve">receptors. g) Fraction of forward to reverse binding rates for a multivalent ligand binding to a cell with varying amounts of receptor expression, following an initial binding event.</w:t>
+        <w:t xml:space="preserve">receptors. g) Ratio of forward to reverse binding rate for secondary binding events for multivalent ligands to cells expressing variable amounts of receptors.</w:t>
       </w:r>
     </w:p>
     <w:bookmarkEnd w:id="0"/>
@@ -7725,7 +7732,7 @@
         <w:t xml:space="preserve"> </w:t>
       </w:r>
       <w:r>
-        <w:t xml:space="preserve">However, the number of possible configurations of multispecific drugs is combinatorially large and impossible to enumerate. Here, we use the heterovalent bispecific ligand as an example to explore the unique benefit of multispecificity distinct from any strategy analyzed before. We compared bispecificity with two aforementioned strategies: a 50%-50% mixture of two monovalent ligands, and a 50%-50% mixture of two different homogeneous bivalent ligands. These two strategies both have some similarities to bispecific therapeutics. A bispecific ligand contains two different ligand monomers with equal proportion, similar to a 50%-50% monovalent mixture. By comparing bispecific with a 50%-50% monovalent mixture, we can elucidate the extra benefit of tethering these two monomers into one complex. A bispecific ligand is also by nature bivalent, and by comparing it with homogeneous bivalent drugs, we can understand how having two different subunits in the same complex modify the behavior of a drug. Together, we sought to identify the unique advantage of heterovalency.</w:t>
+        <w:t xml:space="preserve">However, the number of possible configurations of multispecific drugs is combinatorially large and impossible to enumerate. Here, we use the heterovalent bispecific ligand as an example to explore the unique benefit of multispecificity distinct from any strategy analyzed before. Here, we compare bispecificity with a 50%-50% mixture of two monovalent ligands, and a 50%-50% mixture of two different homogeneous bivalent ligands. These two strategies both have some similarities to bispecific therapeutics. A bispecific ligand contains two different ligand monomers with equal proportion, similar to a 50%-50% monovalent mixture. By comparing bispecific with a 50%-50% monovalent mixture, we can elucidate the extra benefit of tethering these two monomers into one complex. A bispecific ligand is also by nature bivalent, and by comparing it with homogeneous bivalent drugs, we can understand how having two different subunits in the same complex modify the behavior of a drug. Together, we sought to identify the unique advantage of heterovalency.</w:t>
       </w:r>
     </w:p>
     <w:p>
@@ -7733,7 +7740,7 @@
         <w:pStyle w:val="BodyText"/>
       </w:pPr>
       <w:r>
-        <w:t xml:space="preserve">We first applied the binding model to predict the amount of ligand bound in bispecific drugs (Fig</w:t>
+        <w:t xml:space="preserve">We first applied the binding model to predict the amount of ligand bound in bispecific drugs (Fig.</w:t>
       </w:r>
       <w:r>
         <w:t xml:space="preserve"> </w:t>
@@ -7747,10 +7754,7 @@
         </w:r>
       </w:hyperlink>
       <w:r>
-        <w:t xml:space="preserve"> </w:t>
-      </w:r>
-      <w:r>
-        <w:t xml:space="preserve">a), a 50%-50% mixture of two monomers (Fig</w:t>
+        <w:t xml:space="preserve">a), a 50%-50% mixture of two monomers (Fig.</w:t>
       </w:r>
       <w:r>
         <w:t xml:space="preserve"> </w:t>
@@ -7764,10 +7768,7 @@
         </w:r>
       </w:hyperlink>
       <w:r>
-        <w:t xml:space="preserve"> </w:t>
-      </w:r>
-      <w:r>
-        <w:t xml:space="preserve">b), and a 50%-50% mixture of two different homogeneous bivalents (Fig</w:t>
+        <w:t xml:space="preserve">b), and a 50%-50% mixture of two different homogeneous bivalents (Fig.</w:t>
       </w:r>
       <w:r>
         <w:t xml:space="preserve"> </w:t>
@@ -7781,10 +7782,7 @@
         </w:r>
       </w:hyperlink>
       <w:r>
-        <w:t xml:space="preserve"> </w:t>
-      </w:r>
-      <w:r>
-        <w:t xml:space="preserve">c), with the same set of parameters in ligand concentration and affinities. It turned out that the patterns of ligand bounds of these three cases are almost exactly the same, and bispecific doesn’t exhibit any merit. We then investigated if bispecific ligands that have to be activated with both of their subunits binding to a target display any special cell population selectivity characteristics. Bispecific ligands that require both subunits bound to be effective are common in the design of bispecific antibodies. To be specific, when the first antigen-binding region of a bispecific antibody docks at an antigen, it will only make a loose connection between the target and the antibody, unable to induce a strong immune response, and only when both antigen-binding regions bind to their target will this bispecific antibody be fully effective.</w:t>
+        <w:t xml:space="preserve">c), with the same set of parameters in ligand concentration and affinities. Surprisingly, the patterns of ligand binding in these three cases are almost exactly the same, and bispecificity appeared to offer no unique properties. However, many bispecifics only impart their therapeutic action when both of their subunits bind to a target population. We investigated if bispecific ligands that have to be activated with both of their subunits binding to a target display any special cell population selectivity characteristics. Bispecific ligands that require both subunits bound to be effective are common in the design of bispecific antibodies. To be specific, when the first antigen-binding region of a bispecific antibody docks at an antigen, it will only make a loose connection between the target and the antibody, unable to induce a strong immune response, and only when both antigen-binding regions bind to their target will this bispecific antibody be fully effective.</w:t>
       </w:r>
       <w:hyperlink w:anchor="ref-18yoQOgm4">
         <w:r>
@@ -7816,7 +7814,7 @@
         <w:pStyle w:val="BodyText"/>
       </w:pPr>
       <w:r>
-        <w:t xml:space="preserve">To scrutinize the case where the target binding of both subunits is required, we extended our model to calculate the amount of ligand fully bound. For the heterovalent bispecific case, ligand fully bound will only account the amount of ligand with both of their ligand monomers bind to a target. With the same set of parameters, the predictions made for bispecific fully bound show a very distinct pattern from general ligand bound (Fig</w:t>
+        <w:t xml:space="preserve">To scrutinize the case where the target binding of both subunits is required, we extended our model to calculate the amount of ligand which was fully bound (both receptors of the bivalent molecule bound). For the heterovalent bispecific case, ligand fully bound will only account the amount of ligand with both of their ligand monomers bind to a target. With the same set of parameters, the predictions made for bispecific fully bound show a very distinct pattern from general ligand bound (Fig</w:t>
       </w:r>
       <w:r>
         <w:t xml:space="preserve"> </w:t>
@@ -7833,7 +7831,7 @@
         <w:t xml:space="preserve"> </w:t>
       </w:r>
       <w:r>
-        <w:t xml:space="preserve">e). Besides that ligand fully bound has lower amounts, the contour plot of fully bound bispecific ligands has more concaved contour lines. For example,</w:t>
+        <w:t xml:space="preserve">e). The contour plot of fully bound bispecific ligands has more concaved contour lines. For example,</w:t>
       </w:r>
       <w:r>
         <w:t xml:space="preserve"> </w:t>
@@ -8026,7 +8024,7 @@
         <w:t xml:space="preserve"> </w:t>
       </w:r>
       <w:r>
-        <w:t xml:space="preserve">e). This concavity of contour lines indicates that for bispecific complexes, ligand fully bound prefers double-positively expressed cells than singly-positively expressed cells. This should be obvious since these two subunits of the bispecific complex prefer different receptors. The results indicate that bispecific ligands will only exhibit special characteristics when it can only be activated fully bound. This characteristic opens up brand new engineering opportunities for targeting specific cell populations.</w:t>
+        <w:t xml:space="preserve">e). This concavity of contour lines indicates that for bispecific complexes, double-positive cells bind more ligand fully than singly-positively expressed cells. This should be obvious since these two subunits of the bispecific complex prefer different receptors. The results indicate that bispecific ligands will only exhibit special characteristics when it requires both receptor binding subunits to bind a receptor.</w:t>
       </w:r>
     </w:p>
     <w:p>
@@ -9250,7 +9248,7 @@
         <w:pStyle w:val="FirstParagraph"/>
       </w:pPr>
       <w:r>
-        <w:t xml:space="preserve">Each strategy above provided selectivity benefits in distinct situations, suggesting that they might synergistically improve selectivity when combined. We explored this potential synergy using mathematical optimization to determine the optimally cell type selective ligand for our theoretical cell populations. Here, we sought to determine the optimal ligand for particular cell populations while considering all other theoretical populations as off-target cells. We set our initial binding selectivity performance metric and optimize it within set bounds (Fig.</w:t>
+        <w:t xml:space="preserve">Each strategy described above provided selectivity benefits in distinct situations, suggesting that they might synergistically improve selectivity when combined. We explored this potential synergy using mathematical optimization to determine the ligand specifications which provided optimal selectivity for our theoretical cell populations. More specifically, we considered the selectivity for a particular population, while considering all other populations as off-target. Our optimization allowed for ligand characteristics to vary within biologically plausible bounds; which characteristics we allowed to vary defined our examination of the efficacy of our various ligand engineering strategies (Fig.</w:t>
       </w:r>
       <w:r>
         <w:t xml:space="preserve"> </w:t>
@@ -9264,7 +9262,7 @@
         </w:r>
       </w:hyperlink>
       <w:r>
-        <w:t xml:space="preserve">). To simulate the effects that affinity engineering, we allowed ligand-receptor affinities to vary. To understand the effects of valency and mixture engineering on selectivity, we allowed ligand valency and mixtures to vary, while also allowing affinity to vary due to the previously noted reliance that these strategies have on receptor-ligand kinetics. Finally, all ligand parameters were allowed to vary to simulate the effects of combining therapeutic engineering approaches.</w:t>
+        <w:t xml:space="preserve">). To simulate the effects of affinity engineering, we allowed ligand-receptor affinities to vary. To understand the effects of valency and mixture engineering on selectivity, we allowed ligand valency and mixtures to vary, while also allowing affinity to vary due to the previously noted reliance that these strategies have on receptor-ligand kinetics. Finally, all ligand parameters were allowed to vary to simulate the effects of combining therapeutic engineering approaches.</w:t>
       </w:r>
     </w:p>
     <w:p>
@@ -9388,7 +9386,7 @@
         <w:t xml:space="preserve"> </w:t>
       </w:r>
       <w:r>
-        <w:t xml:space="preserve">. While affinity, valency, and mixture engineering are able to impart some small contributions to enhanced selectivity, significant improvement is only achieved when combining them all (Fig.</w:t>
+        <w:t xml:space="preserve">(Fig.</w:t>
       </w:r>
       <w:r>
         <w:t xml:space="preserve"> </w:t>
@@ -9402,7 +9400,7 @@
         </w:r>
       </w:hyperlink>
       <w:r>
-        <w:t xml:space="preserve">g-l). Here, synergistic combination of strategies can be employed to great effect, granting far superior ligand selectivity. A more difficult design problem is featured in the optimization of</w:t>
+        <w:t xml:space="preserve">g-l). While affinity, valency, and mixture engineering are able to impart some small contributions to enhanced selectivity, significant improvement is only achieved when combining them all. Here, synergistic combination of strategies can be employed to great effect, granting far superior ligand selectivity. A more difficult design problem is featured in the optimization of</w:t>
       </w:r>
       <w:r>
         <w:t xml:space="preserve"> </w:t>
@@ -9456,7 +9454,10 @@
         </m:sSubSup>
       </m:oMath>
       <w:r>
-        <w:t xml:space="preserve">. Since it lies in the midst of the other populations in receptor expression space (Fig.</w:t>
+        <w:t xml:space="preserve"> </w:t>
+      </w:r>
+      <w:r>
+        <w:t xml:space="preserve">(Fig.</w:t>
       </w:r>
       <w:r>
         <w:t xml:space="preserve"> </w:t>
@@ -9470,7 +9471,7 @@
         </w:r>
       </w:hyperlink>
       <w:r>
-        <w:t xml:space="preserve">m-r), any modulation of affinity, valency or combining it with mixture-based strategies seems ineffective.</w:t>
+        <w:t xml:space="preserve">m-r). Since it lies in the midst of the other populations in receptor expression space , any modulation of affinity, valency or combining it with mixture-based strategies seems ineffective.</w:t>
       </w:r>
     </w:p>
     <w:p>
@@ -11186,7 +11187,7 @@
         </w:r>
       </w:hyperlink>
       <w:r>
-        <w:t xml:space="preserve">). We compared a few different strategies, including changes to affinity, ligand valency, mixtures of species, multi-specificity, and these in combination. Our analysis was performed using a representative set of theoretical cell populations defined by their distinct expression of two receptors. We identified that each strategy helped to enhance specificity, but only in certain situations. The specific benefits of each strategy meant that their combination led to synergistic specificity enhancements.</w:t>
+        <w:t xml:space="preserve">). Using a representative set of theoretical cell populations defined by their distinct expression of two receptors, we examined the efficacy of several potential ligand engineering strategies, including changes to affinity, ligand valency, mixtures of species, multi-specificity, and these in combination.</w:t>
       </w:r>
     </w:p>
     <w:p>
@@ -11208,7 +11209,7 @@
         </w:r>
       </w:hyperlink>
       <w:r>
-        <w:t xml:space="preserve">). Increasing the affinity of the receptors that are more abundantly expressed on the target cells, and decreasing those that are not, increased the binding selectivity, with greater differences in receptor patterns corresponding to greater benefits. When target and off-target populations had similar receptor expression profiles and only differed in amounts, valency, but not affinity, changes were effective (Fig.</w:t>
+        <w:t xml:space="preserve">). Increasing the affinity of the receptors that are more abundantly expressed on the target cells, and decreasing those that are not, increased the binding selectivity, with greater differences in receptor patterns corresponding to greater benefits. When target and off-target populations had expressed an identical set of receptors, and only differed in receptor abundances, valency, but not affinity, changes were effective (Fig.</w:t>
       </w:r>
       <w:r>
         <w:t xml:space="preserve"> </w:t>
@@ -11222,7 +11223,7 @@
         </w:r>
       </w:hyperlink>
       <w:r>
-        <w:t xml:space="preserve">). The efficacy of valency changes was greatly dependent on the kinetics of the receptor-ligand interactions and the difference in receptor abundance as the secondary binding and unbinding rates were a key determinant. Mixtures of therapeutic ligands were found to be mostly ineffective in imparting binding selectivity, but had modest benefits with multiple off-target populations (Fig.</w:t>
+        <w:t xml:space="preserve">). The efficacy of valency changes was greatly dependent on the kinetics of the receptor-ligand interactions and the difference in receptor abundance as the secondary binding and unbinding rates were a key determinant of ligand binding behavior. Mixtures of therapeutic ligands were found to be mostly ineffective in imparting binding selectivity, but had modest benefits with multiple off-target populations (Fig.</w:t>
       </w:r>
       <w:r>
         <w:t xml:space="preserve"> </w:t>
@@ -11265,6 +11266,31 @@
       </w:hyperlink>
       <w:r>
         <w:t xml:space="preserve">). Finally, we found that combinations of monovalent therapeutic ligands with multivalent antagonistic ligands allowed improved selectivity for target populations expressing relatively fewer receptors to off-target populations.</w:t>
+      </w:r>
+    </w:p>
+    <w:p>
+      <w:pPr>
+        <w:pStyle w:val="BodyText"/>
+      </w:pPr>
+      <w:r>
+        <w:t xml:space="preserve">While the exploration of our multivalent binding model has elucidated strategies for selective targeting of many populations with respect to one or many off-target populations, several inter-population receptor expression relationships remain challenging to impart selectivity to. For example, target populations that unilaterally express fewer receptors of every type than off-target populations present a unique challenge for the design of a selective ligand. While we computationally show the potential for the simultaneous use of multivalent antagonistic ligands, which bind but do not induce a response, and monovalent agonists to exploit reduced receptor expression levels, the translation of such a therapeutic to a clinical application remains questionable (Fig.</w:t>
+      </w:r>
+      <w:r>
+        <w:t xml:space="preserve"> </w:t>
+      </w:r>
+      <w:hyperlink w:anchor="fig:combination">
+        <w:r>
+          <w:rPr>
+            <w:rStyle w:val="Hyperlink"/>
+          </w:rPr>
+          <w:t xml:space="preserve">6</w:t>
+        </w:r>
+      </w:hyperlink>
+      <w:r>
+        <w:t xml:space="preserve"> </w:t>
+      </w:r>
+      <w:r>
+        <w:t xml:space="preserve">s-v). In cases where a target population expresses fewer receptors of any kind than an off-target population, our analysis suggests that other target receptors or therapeutic strategies should be considered. However, in cases where target populations express more of any type of receptor than an off-target population, we show that one or more of our formulated ligand engineering strategies can be employed to improve binding selectivity.</w:t>
       </w:r>
     </w:p>
     <w:p>
@@ -11332,7 +11358,7 @@
         <w:t xml:space="preserve"> </w:t>
       </w:r>
       <w:r>
-        <w:t xml:space="preserve">The advantages offered by therapeutics reliant on low-affinity, multivalent interactions to selectively bind cells with high receptor expression densities were also described in a study considering a therapeutic reliant on multivalent complement binding to small-molecule therapeutics with αvβ3 binding domains, which is expressed at higher densities on tumor cells, and ⍺-Gal binding domains which are recognized by multivalent human anti-α-galactosyl antibodies.</w:t>
+        <w:t xml:space="preserve">The advantages offered by therapeutics reliant on low-affinity, multivalent interactions to selectively bind cells with high receptor expression densities were also described in a study considering a therapeutic reliant on multivalent interactions between antibodies and therapeutic bound to receptors most prevalently expressed on tumor cells.</w:t>
       </w:r>
       <w:hyperlink w:anchor="ref-B0xrCfE3">
         <w:r>
@@ -11355,7 +11381,7 @@
         <w:pStyle w:val="BodyText"/>
       </w:pPr>
       <w:r>
-        <w:t xml:space="preserve">Nonetheless, many optimization strategies described in this study have not been exploited in pharmaceutical practice yet, not because of the lack of consideration but due to the complexity of real biological contexts. First, some strategies are not practical biochemically. For example, the manipulation of ligand affinity requires intricate protein engineering. While the direction of affinity changes can be predicted, dictating the affinity of an engineered molecular a priori is almost unattainable. Moreover, it is very likely altering the affinity of a ligand to the receptor of interest can change the affinity of it to other receptors, which may offset the intended benefit in improving selectivity. Also, the change in the receptor expression profile of a cell population complicates the matter. It is well documented that cancer cells can escape therapeutic targeting by upregulating</w:t>
+        <w:t xml:space="preserve">Nonetheless, many optimization strategies described in this study have not been exploited in pharmaceutical practice yet, not because of the lack of consideration but due to the complexity of real biological contexts. First, some strategies are not practical biochemically. For example, the manipulation of ligand affinity requires intricate protein engineering. While the direction of affinity changes can be predicted, dictating the affinity is extremely difficult. Moreover, it is very likely altering the affinity of a ligand to a receptor of interest can change its affinity for other receptors, which may offset the intended benefit in improving selectivity. Potential dynamic changes in the receptor expression profile of a target population also complicate the matter. It is well documented that cancer cells can escape therapeutic targeting by upregulating</w:t>
       </w:r>
       <w:hyperlink w:anchor="ref-3WVNxYBN">
         <w:r>
@@ -11408,67 +11434,6 @@
         <w:pStyle w:val="BodyText"/>
       </w:pPr>
       <w:r>
-        <w:t xml:space="preserve">While the exploration of our multivalent binding model has elucidated strategies for selective targeting of many populations with respect to one or many off-target populations, several inter-population receptor expression relationships remain challenging to impart selectivity to. For example, target populations that unilaterally express fewer receptors of every type than off-target populations present a unique challenge for the design of a selective ligand. While we computationally show the potential for the simultaneous use of multivalent</w:t>
-      </w:r>
-      <w:r>
-        <w:t xml:space="preserve"> </w:t>
-      </w:r>
-      <w:r>
-        <w:t xml:space="preserve">“</w:t>
-      </w:r>
-      <w:r>
-        <w:t xml:space="preserve">dead</w:t>
-      </w:r>
-      <w:r>
-        <w:t xml:space="preserve">”</w:t>
-      </w:r>
-      <w:r>
-        <w:t xml:space="preserve"> </w:t>
-      </w:r>
-      <w:r>
-        <w:t xml:space="preserve">ligands, which bind but do not induce a response, and monovalent</w:t>
-      </w:r>
-      <w:r>
-        <w:t xml:space="preserve"> </w:t>
-      </w:r>
-      <w:r>
-        <w:t xml:space="preserve">“</w:t>
-      </w:r>
-      <w:r>
-        <w:t xml:space="preserve">live</w:t>
-      </w:r>
-      <w:r>
-        <w:t xml:space="preserve">”</w:t>
-      </w:r>
-      <w:r>
-        <w:t xml:space="preserve"> </w:t>
-      </w:r>
-      <w:r>
-        <w:t xml:space="preserve">ligands to exploit reduced receptor expression levels, the translation of such a therapeutic to a clinical application remains questionable (Fig.</w:t>
-      </w:r>
-      <w:r>
-        <w:t xml:space="preserve"> </w:t>
-      </w:r>
-      <w:hyperlink w:anchor="fig:combination">
-        <w:r>
-          <w:rPr>
-            <w:rStyle w:val="Hyperlink"/>
-          </w:rPr>
-          <w:t xml:space="preserve">6</w:t>
-        </w:r>
-      </w:hyperlink>
-      <w:r>
-        <w:t xml:space="preserve"> </w:t>
-      </w:r>
-      <w:r>
-        <w:t xml:space="preserve">s-v). In cases where a target population expresses fewer receptors of any kind than an off-target population, our analysis suggests that other target receptors or therapeutic strategies should be considered. However, in cases where target populations express more of any type of receptor than an off-target population, we show that one or more of our formulated ligand engineering strategies can be employed to improve binding selectivity.</w:t>
-      </w:r>
-    </w:p>
-    <w:p>
-      <w:pPr>
-        <w:pStyle w:val="BodyText"/>
-      </w:pPr>
-      <w:r>
         <w:t xml:space="preserve">In many therapeutic applications where selective engagement of target cell populations is an important performance metric, such as the treatment of cancer, cellular engineering is becoming increasingly popular.</w:t>
       </w:r>
       <w:hyperlink w:anchor="ref-bi6A2xzH">
@@ -11499,7 +11464,7 @@
         <w:t xml:space="preserve"> </w:t>
       </w:r>
       <w:r>
-        <w:t xml:space="preserve">These technologies bypass ligand-receptor binding considerations by manipulating the complexities of the immune system to attack cells expressing particular receptors. However, manipulations of the immune system inevitably lead to myriad unintended effects due to the complex regulatory mechanisms which control immune activation and activity. We have shown here that complex and targeted changes to the binding activity of simple therapeutic ligands can be achieved via simple ligand characteristic manipulation. These manipulations can be generally applied to achieve greater selectivity, as well as more precisely guided using a computational binding model. The impressive array of logic described in this study can be applied to guide rational ligand engineering applications. It should be noted that the application of this logic is reliant on knowledge of the target and off-target cell population receptor expression levels. Future application of the ligand binding logic described in this study could be guided using high throughputs single-cell profiling techniques, such as RNA-seq or high-parameter flow cytometry. A computational tool that could translate such data-sets into immediately applicable ligand design criteria may represent a potential avenue for the translation of our analyses into a more broadly applicable ligand engineering tool.</w:t>
+        <w:t xml:space="preserve">These technologies bypass ligand-receptor binding considerations by manipulating the complexities of the immune system to attack cells expressing particular receptors. However, manipulations of the immune system inevitably lead to myriad unintended effects due to the complex regulatory mechanisms which control immune activation and activity. We have shown here that complex and targeted changes to the binding activity of simple therapeutic ligands can be achieved via relatively simple ligand characteristic manipulation. This study lays the framework for how protein engineering specifications can be defined using computational modeling. It should be noted that the application of this logic is reliant on knowledge of the target and off-target cell population receptor expression levels. Future application of the ligand binding logic described in this study could be guided using high throughputs single-cell profiling techniques, such as RNA-seq or high-parameter flow cytometry. A computational tool that could translate such data-sets into immediately applicable ligand design criteria may represent a potential avenue for the translation of our analyses into a more broadly applicable ligand engineering tool.</w:t>
       </w:r>
     </w:p>
     <w:p>

</xml_diff>

<commit_message>
Deploying to gh-pages from  @ 36e1aa687fe0a6b1c6d2eba12cdefc9ad5640ec8 🚀
</commit_message>
<xml_diff>
--- a/manuscript.docx
+++ b/manuscript.docx
@@ -626,7 +626,7 @@
         <w:pStyle w:val="BodyText"/>
       </w:pPr>
       <w:r>
-        <w:t xml:space="preserve">Here we investigate cell-specific targeting quantitatively by extending a multi-valent, multi-ligand equilibrium binding model. Virtually any therapy, including monoclonal antibodies, small-molecule inhibitors, and cytokines, can be thought of as ligands for respective receptors expressed on target cells. Ligand binding to target cells is the first step and essential for a drug’s intended action; in contrast, binding to off-target cells can result in unintended effects or toxicity. Some cell populations can be distinguished by their expression of a receptor not expressed by other populations, but more commonly target and off-target cells express the same collection of receptors and differ only in their magnitudes of receptor expression. In such situations, engineering drugs optimized to achieve more ligand bound to the target cells while minimizing the binding to off-target cells is an area of ongoing research and has inspired myriad drug design strategies.</w:t>
+        <w:t xml:space="preserve">Here we investigate cell-specific targeting quantitatively by extending a multi-valent, multi-ligand equilibrium binding model. Virtually any therapy, including monoclonal antibodies, small-molecule inhibitors, and cytokines, can be thought of as ligands for respective receptors expressed on target cells. Ligand binding to target cells is the first step and essential for a drug’s intended action; in contrast, binding to off-target cells can result in unintended effects or toxicity. Some cell populations can be distinguished by their expression of a unique receptor not expressed by other populations, but more commonly target and off-target cells express the same collection of receptors and differ only in their magnitudes of receptor expression. In such situations, engineering drugs optimized to achieve more ligand bound to the target cells while minimizing the binding to off-target cells is an area of ongoing research and has inspired myriad drug design strategies.</w:t>
       </w:r>
       <w:hyperlink w:anchor="ref-10kZoPeON">
         <w:r>
@@ -664,7 +664,47 @@
         <w:pStyle w:val="BodyText"/>
       </w:pPr>
       <w:r>
-        <w:t xml:space="preserve">While ligand-receptor binding events in biology are diverse, they are governed by thermodynamic properties and the law of mass action. Binding behavior is more complex when the ligands are multivalent complexes consisting of multiple units, each of which can bind to a receptor (Fig.</w:t>
+        <w:t xml:space="preserve">While ligand-receptor binding events in biology are diverse, they are governed by thermodynamic properties and the law of mass action. The binding between monomer ligands and receptors at equilibrium can be depicted by their association constant</w:t>
+      </w:r>
+      <w:r>
+        <w:t xml:space="preserve"> </w:t>
+      </w:r>
+      <m:oMath>
+        <m:sSub>
+          <m:e>
+            <m:r>
+              <m:t>K</m:t>
+            </m:r>
+          </m:e>
+          <m:sub>
+            <m:r>
+              <m:t>a</m:t>
+            </m:r>
+          </m:sub>
+        </m:sSub>
+      </m:oMath>
+      <w:r>
+        <w:t xml:space="preserve">, or its reciprocal, the dissociation constant</w:t>
+      </w:r>
+      <w:r>
+        <w:t xml:space="preserve"> </w:t>
+      </w:r>
+      <m:oMath>
+        <m:sSub>
+          <m:e>
+            <m:r>
+              <m:t>K</m:t>
+            </m:r>
+          </m:e>
+          <m:sub>
+            <m:r>
+              <m:t>d</m:t>
+            </m:r>
+          </m:sub>
+        </m:sSub>
+      </m:oMath>
+      <w:r>
+        <w:t xml:space="preserve">. Binding behavior is more complicated when the ligands are multivalent complexes consisting of multiple units, each of which can bind to a receptor (Fig.</w:t>
       </w:r>
       <w:r>
         <w:t xml:space="preserve"> </w:t>
@@ -703,7 +743,7 @@
         </m:sSubSup>
       </m:oMath>
       <w:r>
-        <w:t xml:space="preserve">. Another consideration that must be made when modeling multivalent binding processes is whether ligand complexes are formed via random assortment of monomers, or whether the monomer composition is uniform across complexes. We developed a multivalent binding model that calculates the amount of ligand bound at equilibrium taking each of these factors into account (see methods).</w:t>
+        <w:t xml:space="preserve">. Another consideration that must be made when modeling multivalent binding processes is whether ligand complexes are formed via random assortment of monomers, or whether the monomer composition is uniform across complexes by engineering. We developed a multivalent binding model that calculates the amount of ligand bound at equilibrium taking each of these factors into account (see methods).</w:t>
       </w:r>
     </w:p>
     <w:p>
@@ -850,7 +890,7 @@
         </w:r>
       </w:hyperlink>
       <w:r>
-        <w:t xml:space="preserve">c, cell populations at points 1 and 2 are on the same contour line and thus have the same amount of ligand bound; the cell populations at points 1 and 3 are separated by multiple contour lines, indicating that cells at point 3 bind more ligand (In fact, the ratio can be read as the exponent of the contour line difference. For point 3 to point 1, the ratio is</w:t>
+        <w:t xml:space="preserve">c, cell populations at points 1 and 2 are on the same contour line and thus have the same amount of ligand bound; the cell populations at points 1 and 3 are separated by multiple contour lines, indicating that cells at point 3 bind more ligands (In fact, the ratio can be read as the exponent of the contour line difference. For point 3 to point 1, the ratio is</w:t>
       </w:r>
       <w:r>
         <w:t xml:space="preserve"> </w:t>
@@ -928,7 +968,7 @@
         <w:t xml:space="preserve"> </w:t>
       </w:r>
       <w:r>
-        <w:t xml:space="preserve">(moving upward, e.g. from 1 to 3) will bind significantly more ligand. Here, the ligand’s high affinity for</w:t>
+        <w:t xml:space="preserve">(moving upward, e.g. from 1 to 3) will bind significantly more ligands. Here, the ligand’s high affinity for</w:t>
       </w:r>
       <w:r>
         <w:t xml:space="preserve"> </w:t>
@@ -948,7 +988,10 @@
         </m:sSub>
       </m:oMath>
       <w:r>
-        <w:t xml:space="preserve">, and relatively low affinity for</w:t>
+        <w:t xml:space="preserve"> </w:t>
+      </w:r>
+      <w:r>
+        <w:t xml:space="preserve">and relatively low affinity for</w:t>
       </w:r>
       <w:r>
         <w:t xml:space="preserve"> </w:t>
@@ -971,7 +1014,7 @@
         <w:t xml:space="preserve"> </w:t>
       </w:r>
       <w:r>
-        <w:t xml:space="preserve">leads to a greater binding sensitivity on the expression of</w:t>
+        <w:t xml:space="preserve">lead to a greater binding sensitivity on the expression of</w:t>
       </w:r>
       <w:r>
         <w:t xml:space="preserve"> </w:t>
@@ -2859,7 +2902,7 @@
         <w:t xml:space="preserve"> </w:t>
       </w:r>
       <w:r>
-        <w:t xml:space="preserve">increases, binding is shown to vary more strongly according to</w:t>
+        <w:t xml:space="preserve">increases, which corresponds to shifting from subplots on the left to the ones on the right, binding is shown to vary more strongly according to</w:t>
       </w:r>
       <w:r>
         <w:t xml:space="preserve"> </w:t>
@@ -3855,7 +3898,7 @@
         <w:t xml:space="preserve"> </w:t>
       </w:r>
       <w:r>
-        <w:t xml:space="preserve">are more balanced. Thus, a populations receptor expression heterogeneity may be an important factor to consider when modulating ligand affinity.</w:t>
+        <w:t xml:space="preserve">are more balanced. Thus, a population’s receptor expression heterogeneity and variation are important factors to consider when modulating ligand affinity.</w:t>
       </w:r>
     </w:p>
     <w:p>
@@ -3887,9 +3930,9 @@
         </w:r>
       </w:hyperlink>
       <w:r>
-        <w:t xml:space="preserve">). Multivalent ligand binding differs from monovalent binding in its non-linear relationship with cellular receptor density, allowing multivalent ligands to potentially selectively target cells based on receptor abundance.</w:t>
-      </w:r>
-      <w:hyperlink w:anchor="ref-IanZRiFA">
+        <w:t xml:space="preserve">). Previous work has shown that our binding model can accurately predict the complicated multivalent binding process between IgG antibodies and Fcγ receptors.</w:t>
+      </w:r>
+      <w:hyperlink w:anchor="ref-11gk5tUo7">
         <w:r>
           <w:rPr>
             <w:rStyle w:val="Hyperlink"/>
@@ -3902,6 +3945,58 @@
         <w:t xml:space="preserve"> </w:t>
       </w:r>
       <w:r>
+        <w:t xml:space="preserve">To further demonstrate our model’s capacity to predict multivalent binding activity, we fit our model to previous experimental measurements wherein fluorescently labeled nanorings were assembled with specific numbers of binding units.</w:t>
+      </w:r>
+      <w:hyperlink w:anchor="ref-u2Cb0DBq">
+        <w:r>
+          <w:rPr>
+            <w:rStyle w:val="Hyperlink"/>
+            <w:vertAlign w:val="superscript"/>
+          </w:rPr>
+          <w:t xml:space="preserve">17</w:t>
+        </w:r>
+      </w:hyperlink>
+      <w:r>
+        <w:t xml:space="preserve"> </w:t>
+      </w:r>
+      <w:r>
+        <w:t xml:space="preserve">After fitting to determine the crosslinking coefficient and receptor affinity values, our model was able to accurately match the binding of nanorings with four or eight binding units to MCF-7 cells expressing a known abundance of receptor partners (Fig.</w:t>
+      </w:r>
+      <w:r>
+        <w:t xml:space="preserve"> </w:t>
+      </w:r>
+      <w:hyperlink w:anchor="fig:Csizmar">
+        <w:r>
+          <w:rPr>
+            <w:rStyle w:val="Hyperlink"/>
+          </w:rPr>
+          <w:t xml:space="preserve">8</w:t>
+        </w:r>
+      </w:hyperlink>
+      <w:r>
+        <w:t xml:space="preserve">a).</w:t>
+      </w:r>
+    </w:p>
+    <w:p>
+      <w:pPr>
+        <w:pStyle w:val="BodyText"/>
+      </w:pPr>
+      <w:r>
+        <w:t xml:space="preserve">Multivalent ligand binding differs from monovalent binding in its nonlinear relationship with cellular receptor density, allowing multivalent ligands to potentially selectively target cells based on receptor abundance.</w:t>
+      </w:r>
+      <w:hyperlink w:anchor="ref-IanZRiFA">
+        <w:r>
+          <w:rPr>
+            <w:rStyle w:val="Hyperlink"/>
+            <w:vertAlign w:val="superscript"/>
+          </w:rPr>
+          <w:t xml:space="preserve">18</w:t>
+        </w:r>
+      </w:hyperlink>
+      <w:r>
+        <w:t xml:space="preserve"> </w:t>
+      </w:r>
+      <w:r>
         <w:t xml:space="preserve">The effects of varying ligand valency are visualized in Fig.</w:t>
       </w:r>
       <w:r>
@@ -3916,7 +4011,7 @@
         </w:r>
       </w:hyperlink>
       <w:r>
-        <w:t xml:space="preserve">a. Here, the ligand considered only binds to receptor</w:t>
+        <w:t xml:space="preserve">a. Here, the ligand only binds to receptor</w:t>
       </w:r>
       <w:r>
         <w:t xml:space="preserve"> </w:t>
@@ -3939,16 +4034,7 @@
         <w:t xml:space="preserve"> </w:t>
       </w:r>
       <w:r>
-        <w:t xml:space="preserve">and the valency of the ligand is varied across subplots. Here, it is shown that varying ligand valency results in a nonlinear relationship between receptor abundance and binding magnitude. For example, in the monovalent case, there are roughly the same amount of contour lines between $ R_1</w:t>
-      </w:r>
-      <w:r>
-        <w:rPr>
-          <w:vertAlign w:val="superscript"/>
-        </w:rPr>
-        <w:t xml:space="preserve">{lo}R_2</w:t>
-      </w:r>
-      <w:r>
-        <w:t xml:space="preserve">{lo}$ and</w:t>
+        <w:t xml:space="preserve">and the valency of the ligand is varied across subplots. It is shown that varying ligand valency results in a nonlinear relationship between receptor abundance and binding magnitude. For example, in the monovalent case, there are roughly the same amount of contour lines between</w:t>
       </w:r>
       <w:r>
         <w:t xml:space="preserve"> </w:t>
@@ -3967,6 +4053,57 @@
           </m:sub>
           <m:sup>
             <m:r>
+              <m:t>l</m:t>
+            </m:r>
+            <m:r>
+              <m:t>o</m:t>
+            </m:r>
+          </m:sup>
+        </m:sSubSup>
+        <m:sSubSup>
+          <m:e>
+            <m:r>
+              <m:t>R</m:t>
+            </m:r>
+          </m:e>
+          <m:sub>
+            <m:r>
+              <m:t>2</m:t>
+            </m:r>
+          </m:sub>
+          <m:sup>
+            <m:r>
+              <m:t>l</m:t>
+            </m:r>
+            <m:r>
+              <m:t>o</m:t>
+            </m:r>
+          </m:sup>
+        </m:sSubSup>
+      </m:oMath>
+      <w:r>
+        <w:t xml:space="preserve"> </w:t>
+      </w:r>
+      <w:r>
+        <w:t xml:space="preserve">and</w:t>
+      </w:r>
+      <w:r>
+        <w:t xml:space="preserve"> </w:t>
+      </w:r>
+      <m:oMath>
+        <m:sSubSup>
+          <m:e>
+            <m:r>
+              <m:t>R</m:t>
+            </m:r>
+          </m:e>
+          <m:sub>
+            <m:r>
+              <m:t>1</m:t>
+            </m:r>
+          </m:sub>
+          <m:sup>
+            <m:r>
               <m:t>m</m:t>
             </m:r>
             <m:r>
@@ -4104,10 +4241,7 @@
         </m:sSubSup>
       </m:oMath>
       <w:r>
-        <w:t xml:space="preserve"> </w:t>
-      </w:r>
-      <w:r>
-        <w:t xml:space="preserve">due to the linear relationship between receptors expressed and ligand bound. However, in the tetravalent case, there are comparatively more contour lines between</w:t>
+        <w:t xml:space="preserve">. However, in the tetravalent case, there are comparatively more contour lines between</w:t>
       </w:r>
       <w:r>
         <w:t xml:space="preserve"> </w:t>
@@ -4231,59 +4365,7 @@
         <w:pStyle w:val="BodyText"/>
       </w:pPr>
       <w:r>
-        <w:t xml:space="preserve">Previous work has shown that our binding model can accurately predict the complicated multivalent binding process between IgG antibodies and Fcγ receptors.</w:t>
-      </w:r>
-      <w:hyperlink w:anchor="ref-11gk5tUo7">
-        <w:r>
-          <w:rPr>
-            <w:rStyle w:val="Hyperlink"/>
-            <w:vertAlign w:val="superscript"/>
-          </w:rPr>
-          <w:t xml:space="preserve">17</w:t>
-        </w:r>
-      </w:hyperlink>
-      <w:r>
-        <w:t xml:space="preserve"> </w:t>
-      </w:r>
-      <w:r>
-        <w:t xml:space="preserve">To further demonstrate our model’s capacity to predict multivalent binding activity, we fit our model to previous experimental measurements wherein fluorescently labeled nanorings were assembled with specific numbers of binding units.</w:t>
-      </w:r>
-      <w:hyperlink w:anchor="ref-u2Cb0DBq">
-        <w:r>
-          <w:rPr>
-            <w:rStyle w:val="Hyperlink"/>
-            <w:vertAlign w:val="superscript"/>
-          </w:rPr>
-          <w:t xml:space="preserve">18</w:t>
-        </w:r>
-      </w:hyperlink>
-      <w:r>
-        <w:t xml:space="preserve"> </w:t>
-      </w:r>
-      <w:r>
-        <w:t xml:space="preserve">After fitting to determine the crosslinking coefficient and receptor affinity values, our model was able to accurately match the binding of nanorings with four or eight binding units to MCF-7 cells expressing a known abundance of receptor partners (Fig.</w:t>
-      </w:r>
-      <w:r>
-        <w:t xml:space="preserve"> </w:t>
-      </w:r>
-      <w:hyperlink w:anchor="fig:Csizmar">
-        <w:r>
-          <w:rPr>
-            <w:rStyle w:val="Hyperlink"/>
-          </w:rPr>
-          <w:t xml:space="preserve">8</w:t>
-        </w:r>
-      </w:hyperlink>
-      <w:r>
-        <w:t xml:space="preserve">a).</w:t>
-      </w:r>
-    </w:p>
-    <w:p>
-      <w:pPr>
-        <w:pStyle w:val="BodyText"/>
-      </w:pPr>
-      <w:r>
-        <w:t xml:space="preserve">Selectivity derived by changing valency requires coordinate changes in affinity. As is shown by our model, and as many previous studies have suggested, lower affinity, multi-valent interactions can result in extreme selectivity for target populations expressing high abundances of receptors.</w:t>
+        <w:t xml:space="preserve">Selectivity derived by changing valency requires coordinate changes in affinity. As is shown by our model, and as many previous studies have suggested, lower affinity, multi-valent interactions can result in particular selectivity for target populations expressing high abundances of receptors.</w:t>
       </w:r>
       <w:hyperlink w:anchor="ref-B0xrCfE3">
         <w:r>
@@ -4306,7 +4388,7 @@
             <w:rStyle w:val="Hyperlink"/>
             <w:vertAlign w:val="superscript"/>
           </w:rPr>
-          <w:t xml:space="preserve">18</w:t>
+          <w:t xml:space="preserve">17</w:t>
         </w:r>
       </w:hyperlink>
       <w:r>
@@ -4876,7 +4958,7 @@
         </w:r>
       </w:hyperlink>
       <w:r>
-        <w:t xml:space="preserve">f). This effect arises due to a higher dissociation rate than multi-valent binding association rate at low receptor abundances (Fig.</w:t>
+        <w:t xml:space="preserve">f). This effect arises due to a higher dissociation rate than multivalent binding association rate at low receptor abundances (Fig.</w:t>
       </w:r>
       <w:r>
         <w:t xml:space="preserve"> </w:t>
@@ -4890,7 +4972,7 @@
         </w:r>
       </w:hyperlink>
       <w:r>
-        <w:t xml:space="preserve">g). Multivalent ligands will undergo initial binding events at rates unaffected by receptor abundance, but low affinity and receptor density severely limit the possibility of secondary binding events. In contrast, cells with higher receptor abundance accumulate ligand binding by binding multivalent ligands to multiple receptors, as the forward rate of secondary binding events is greater than that of receptor-ligand disassociation (Fig.</w:t>
+        <w:t xml:space="preserve">g). Multivalent ligands will undergo initial binding events at rates unaffected by receptor abundance, but low affinity and receptor density severely limit the possibility of secondary binding events. In contrast, cells with higher receptor abundance accumulate ligand bound by having them binding multivalently, as the forward rate of secondary binding events is greater than that of receptor-ligand disassociation (Fig.</w:t>
       </w:r>
       <w:r>
         <w:t xml:space="preserve"> </w:t>
@@ -6122,7 +6204,7 @@
         <w:pStyle w:val="BodyText"/>
       </w:pPr>
       <w:r>
-        <w:t xml:space="preserve">To evaluate the contribution of mixtures, we evaluated model-predicted binding while varying the composition between ligands with either</w:t>
+        <w:t xml:space="preserve">To evaluate the contribution of mixtures, we evaluated model-predicted binding while varying the composition between two ligands with either</w:t>
       </w:r>
       <w:r>
         <w:t xml:space="preserve"> </w:t>
@@ -6179,7 +6261,7 @@
         </w:r>
       </w:hyperlink>
       <w:r>
-        <w:t xml:space="preserve">a). The trend that arises is very similar to an additive combination of the single ligand cases. This pattern highlights a key limitation of using mixtures for selectivity: selectivity between two populations varies monotonic with the composition, so any mixture combination is no better than using the more specific ligand entirely(Fig.</w:t>
+        <w:t xml:space="preserve">a). The trend that arises is very similar to an additive combination of the single ligand cases. This pattern highlights a key limitation of using mixtures for selectivity: selectivity between two populations varies monotonically with the composition, so any mixture combination is no better than using the more specific ligand entirely (Fig.</w:t>
       </w:r>
       <w:r>
         <w:t xml:space="preserve"> </w:t>
@@ -6435,7 +6517,7 @@
             <w:rStyle w:val="Hyperlink"/>
             <w:vertAlign w:val="superscript"/>
           </w:rPr>
-          <w:t xml:space="preserve">17</w:t>
+          <w:t xml:space="preserve">16</w:t>
         </w:r>
       </w:hyperlink>
       <w:r>
@@ -7782,7 +7864,7 @@
         </w:r>
       </w:hyperlink>
       <w:r>
-        <w:t xml:space="preserve">c), with the same set of parameters in ligand concentration and affinities. Surprisingly, the patterns of ligand binding in these three cases are almost exactly the same, and bispecificity appeared to offer no unique properties. However, many bispecifics only impart their therapeutic action when both of their subunits bind to a target population. We investigated if bispecific ligands that have to be activated with both of their subunits binding to a target display any special cell population selectivity characteristics. Bispecific ligands that require both subunits bound to be effective are common in the design of bispecific antibodies. To be specific, when the first antigen-binding region of a bispecific antibody docks at an antigen, it will only make a loose connection between the target and the antibody, unable to induce a strong immune response, and only when both antigen-binding regions bind to their target will this bispecific antibody be fully effective.</w:t>
+        <w:t xml:space="preserve">c), with the same set of parameters in ligand concentration and affinities. Surprisingly, the patterns of ligand binding in these three cases are almost exactly the same, and bispecificity appeared to offer no unique properties. However, many bispecifics only impart their therapeutic action when both of their subunits bind to a target population. For example, in the design of bispecific antibodies, it is common to require both subunits bound to be effective. When the first antigen-binding region of a bispecific antibody docks at an antigen, it will only make a loose connection between the target and the antibody, unable to induce a strong immune response, and only when both antigen-binding regions bind to their target will this bispecific antibody be fully effective.</w:t>
       </w:r>
       <w:hyperlink w:anchor="ref-18yoQOgm4">
         <w:r>
@@ -7808,13 +7890,19 @@
           <w:t xml:space="preserve">24</w:t>
         </w:r>
       </w:hyperlink>
+      <w:r>
+        <w:t xml:space="preserve"> </w:t>
+      </w:r>
+      <w:r>
+        <w:t xml:space="preserve">We investigated if bispecific ligands that have to be activated with both of their subunits binding to a target display any special cell population selectivity characteristics.</w:t>
+      </w:r>
     </w:p>
     <w:p>
       <w:pPr>
         <w:pStyle w:val="BodyText"/>
       </w:pPr>
       <w:r>
-        <w:t xml:space="preserve">To scrutinize the case where the target binding of both subunits is required, we extended our model to calculate the amount of ligand which was fully bound (both receptors of the bivalent molecule bound). For the heterovalent bispecific case, ligand fully bound will only account the amount of ligand with both of their ligand monomers bind to a target. With the same set of parameters, the predictions made for bispecific fully bound show a very distinct pattern from general ligand bound (Fig</w:t>
+        <w:t xml:space="preserve">To scrutinize the case for bispecific ligands where the target binding of both subunits is required, we extended our model to calculate the amount of ligand fully bound. For the heterovalent bispecific case, ligand fully bound will only account the amount of ligand with both of their ligand monomers bind to a target. With the same set of parameters, the predictions made for bispecific fully bound show a very distinct pattern from general ligand bound (Fig</w:t>
       </w:r>
       <w:r>
         <w:t xml:space="preserve"> </w:t>
@@ -8024,7 +8112,7 @@
         <w:t xml:space="preserve"> </w:t>
       </w:r>
       <w:r>
-        <w:t xml:space="preserve">e). This concavity of contour lines indicates that for bispecific complexes, double-positive cells bind more ligand fully than singly-positively expressed cells. This should be obvious since these two subunits of the bispecific complex prefer different receptors. The results indicate that bispecific ligands will only exhibit special characteristics when it requires both receptor binding subunits to bind a receptor.</w:t>
+        <w:t xml:space="preserve">e). This concavity of contour lines indicates that for bispecific complexes, double-positive cells bind more ligands fully than singly-positively expressed cells. This should be obvious since these two subunits of the bispecific complex prefer different receptors. The results indicate that bispecific ligands will only exhibit special characteristics when it requires both receptor binding subunits to bind a receptor.</w:t>
       </w:r>
     </w:p>
     <w:p>
@@ -11195,7 +11283,7 @@
         <w:pStyle w:val="BodyText"/>
       </w:pPr>
       <w:r>
-        <w:t xml:space="preserve">Each strategy’s contribution could be summarized by general patterns. We found that affinity changes were most effective when the target and off-target populations expressed distinct combinations receptors (Fig.</w:t>
+        <w:t xml:space="preserve">Each strategy’s contribution could be summarized by general patterns. We found that affinity changes were most effective when the target and off-target populations expressed distinct combinations of receptors (Fig.</w:t>
       </w:r>
       <w:r>
         <w:t xml:space="preserve"> </w:t>
@@ -11209,7 +11297,7 @@
         </w:r>
       </w:hyperlink>
       <w:r>
-        <w:t xml:space="preserve">). Increasing the affinity of the receptors that are more abundantly expressed on the target cells, and decreasing those that are not, increased the binding selectivity, with greater differences in receptor patterns corresponding to greater benefits. When target and off-target populations had expressed an identical set of receptors, and only differed in receptor abundances, valency, but not affinity, changes were effective (Fig.</w:t>
+        <w:t xml:space="preserve">). Increasing the affinity of the receptors that are more abundantly expressed on the target cells, and decreasing those that are not, enhanced the binding selectivity, with greater differences in receptor patterns corresponding to greater benefits. When target and off-target populations had expressed an identical set of receptors, and only differed in receptor abundances, modulations in valency were effective (Fig.</w:t>
       </w:r>
       <w:r>
         <w:t xml:space="preserve"> </w:t>
@@ -11273,24 +11361,7 @@
         <w:pStyle w:val="BodyText"/>
       </w:pPr>
       <w:r>
-        <w:t xml:space="preserve">While the exploration of our multivalent binding model has elucidated strategies for selective targeting of many populations with respect to one or many off-target populations, several inter-population receptor expression relationships remain challenging to impart selectivity to. For example, target populations that unilaterally express fewer receptors of every type than off-target populations present a unique challenge for the design of a selective ligand. While we computationally show the potential for the simultaneous use of multivalent antagonistic ligands, which bind but do not induce a response, and monovalent agonists to exploit reduced receptor expression levels, the translation of such a therapeutic to a clinical application remains questionable (Fig.</w:t>
-      </w:r>
-      <w:r>
-        <w:t xml:space="preserve"> </w:t>
-      </w:r>
-      <w:hyperlink w:anchor="fig:combination">
-        <w:r>
-          <w:rPr>
-            <w:rStyle w:val="Hyperlink"/>
-          </w:rPr>
-          <w:t xml:space="preserve">6</w:t>
-        </w:r>
-      </w:hyperlink>
-      <w:r>
-        <w:t xml:space="preserve"> </w:t>
-      </w:r>
-      <w:r>
-        <w:t xml:space="preserve">s-v). In cases where a target population expresses fewer receptors of any kind than an off-target population, our analysis suggests that other target receptors or therapeutic strategies should be considered. However, in cases where target populations express more of any type of receptor than an off-target population, we show that one or more of our formulated ligand engineering strategies can be employed to improve binding selectivity.</w:t>
+        <w:t xml:space="preserve">While the exploration of our multivalent binding model has elucidated strategies for selective targeting of many populations with respect to one or many off-target populations, several inter-population receptor expression relationships remain challenging to impart selectivity to. For example, target populations that unilaterally express fewer receptors of every type than off-target populations present a unique challenge for the design of a selective ligand. While we computationally show the potential for the simultaneous use of multivalent antagonistic ligands, which bind but do not induce a response, and monovalent agonists to exploit reduced receptor expression levels, the translation of such a therapeutic to a clinical application remains questionable. In cases where a target population expresses fewer receptors of any kind than an off-target population, our analysis suggests that other target receptors or therapeutic strategies should be considered. However, in cases where target populations express more of any type of receptor than an off-target population, we show that one or more of our formulated ligand engineering strategies can be employed to improve binding selectivity.</w:t>
       </w:r>
     </w:p>
     <w:p>
@@ -11336,7 +11407,7 @@
             <w:rStyle w:val="Hyperlink"/>
             <w:vertAlign w:val="superscript"/>
           </w:rPr>
-          <w:t xml:space="preserve">16</w:t>
+          <w:t xml:space="preserve">18</w:t>
         </w:r>
       </w:hyperlink>
       <w:r>
@@ -11351,7 +11422,7 @@
             <w:rStyle w:val="Hyperlink"/>
             <w:vertAlign w:val="superscript"/>
           </w:rPr>
-          <w:t xml:space="preserve">18</w:t>
+          <w:t xml:space="preserve">17</w:t>
         </w:r>
       </w:hyperlink>
       <w:r>
@@ -11532,7 +11603,7 @@
             <w:rStyle w:val="Hyperlink"/>
             <w:vertAlign w:val="superscript"/>
           </w:rPr>
-          <w:t xml:space="preserve">17</w:t>
+          <w:t xml:space="preserve">16</w:t>
         </w:r>
       </w:hyperlink>
       <w:r>
@@ -11708,7 +11779,7 @@
         </m:sSub>
       </m:oMath>
       <w:r>
-        <w:t xml:space="preserve">, and the complexes consist of random ligand monomer assortments accoring to their relative proportion. The proportion of ligand</w:t>
+        <w:t xml:space="preserve">, and the complexes consist of random ligand monomer assortments accoring to their relative proportion. The number of ligand complexes in the solution is usually much greater than that of the receptors, so we assume binding does not deplete the ligand concentration. The proportion of ligand</w:t>
       </w:r>
       <w:r>
         <w:t xml:space="preserve"> </w:t>
@@ -14874,7 +14945,33 @@
         </m:r>
       </m:oMath>
       <w:r>
-        <w:t xml:space="preserve">, 100% for mixture composition, and</w:t>
+        <w:t xml:space="preserve">, 100% ligand 1 for mixture composition, and</w:t>
+      </w:r>
+      <w:r>
+        <w:t xml:space="preserve"> </w:t>
+      </w:r>
+      <m:oMath>
+        <m:r>
+          <m:t>1</m:t>
+        </m:r>
+        <m:r>
+          <m:rPr>
+            <m:sty m:val="p"/>
+          </m:rPr>
+          <m:t>μ</m:t>
+        </m:r>
+        <m:r>
+          <m:rPr>
+            <m:sty m:val="p"/>
+          </m:rPr>
+          <m:t>M</m:t>
+        </m:r>
+      </m:oMath>
+      <w:r>
+        <w:t xml:space="preserve"> </w:t>
+      </w:r>
+      <w:r>
+        <w:t xml:space="preserve">for the affinity dissociation constants. The boundaries were</w:t>
       </w:r>
       <w:r>
         <w:t xml:space="preserve"> </w:t>
@@ -14888,31 +14985,28 @@
           </m:e>
           <m:sup>
             <m:r>
-              <m:t>6</m:t>
+              <m:t>−</m:t>
+            </m:r>
+            <m:r>
+              <m:t>15</m:t>
             </m:r>
           </m:sup>
         </m:sSup>
+        <m:r>
+          <m:t>∼</m:t>
+        </m:r>
         <m:sSup>
           <m:e>
             <m:r>
-              <m:rPr>
-                <m:sty m:val="p"/>
-              </m:rPr>
-              <m:t>M</m:t>
-            </m:r>
-          </m:e>
-          <m:sup>
-            <m:r>
-              <m:rPr>
-                <m:sty m:val="p"/>
-              </m:rPr>
+              <m:t>10</m:t>
+            </m:r>
+          </m:e>
+          <m:sup>
+            <m:r>
               <m:t>−</m:t>
             </m:r>
             <m:r>
-              <m:rPr>
-                <m:sty m:val="p"/>
-              </m:rPr>
-              <m:t>1</m:t>
+              <m:t>9</m:t>
             </m:r>
           </m:sup>
         </m:sSup>
@@ -14921,53 +15015,6 @@
         <w:t xml:space="preserve"> </w:t>
       </w:r>
       <w:r>
-        <w:t xml:space="preserve">for the affinity constants; the boundaries were</w:t>
-      </w:r>
-      <w:r>
-        <w:t xml:space="preserve"> </w:t>
-      </w:r>
-      <m:oMath>
-        <m:sSup>
-          <m:e>
-            <m:r>
-              <m:t>10</m:t>
-            </m:r>
-          </m:e>
-          <m:sup>
-            <m:r>
-              <m:t>−</m:t>
-            </m:r>
-            <m:r>
-              <m:t>15</m:t>
-            </m:r>
-          </m:sup>
-        </m:sSup>
-        <m:r>
-          <m:t>−</m:t>
-        </m:r>
-        <m:r>
-          <m:t>−</m:t>
-        </m:r>
-        <m:sSup>
-          <m:e>
-            <m:r>
-              <m:t>10</m:t>
-            </m:r>
-          </m:e>
-          <m:sup>
-            <m:r>
-              <m:t>−</m:t>
-            </m:r>
-            <m:r>
-              <m:t>9</m:t>
-            </m:r>
-          </m:sup>
-        </m:sSup>
-      </m:oMath>
-      <w:r>
-        <w:t xml:space="preserve"> </w:t>
-      </w:r>
-      <w:r>
         <w:t xml:space="preserve">for</w:t>
       </w:r>
       <w:r>
@@ -15004,72 +15051,51 @@
         </m:r>
       </m:oMath>
       <w:r>
-        <w:t xml:space="preserve">, 0–100% for mixture composition, and</w:t>
-      </w:r>
-      <w:r>
-        <w:t xml:space="preserve"> </w:t>
-      </w:r>
-      <m:oMath>
-        <m:sSup>
-          <m:e>
-            <m:r>
-              <m:t>10</m:t>
-            </m:r>
-          </m:e>
-          <m:sup>
-            <m:r>
-              <m:t>2</m:t>
-            </m:r>
-          </m:sup>
-        </m:sSup>
-        <m:r>
-          <m:t>−</m:t>
-        </m:r>
-        <m:r>
-          <m:t>−</m:t>
-        </m:r>
-        <m:sSup>
-          <m:e>
-            <m:r>
-              <m:t>10</m:t>
-            </m:r>
-          </m:e>
-          <m:sup>
-            <m:r>
-              <m:t>10</m:t>
-            </m:r>
-          </m:sup>
-        </m:sSup>
-        <m:sSup>
-          <m:e>
-            <m:r>
-              <m:rPr>
-                <m:sty m:val="p"/>
-              </m:rPr>
-              <m:t>M</m:t>
-            </m:r>
-          </m:e>
-          <m:sup>
-            <m:r>
-              <m:rPr>
-                <m:sty m:val="p"/>
-              </m:rPr>
-              <m:t>−</m:t>
-            </m:r>
-            <m:r>
-              <m:rPr>
-                <m:sty m:val="p"/>
-              </m:rPr>
-              <m:t>1</m:t>
-            </m:r>
-          </m:sup>
-        </m:sSup>
-      </m:oMath>
-      <w:r>
-        <w:t xml:space="preserve"> </w:t>
-      </w:r>
-      <w:r>
-        <w:t xml:space="preserve">for the affinity constants.</w:t>
+        <w:t xml:space="preserve">, 0–100% ligand 1 for mixture composition, and</w:t>
+      </w:r>
+      <w:r>
+        <w:t xml:space="preserve"> </w:t>
+      </w:r>
+      <m:oMath>
+        <m:r>
+          <m:t>10</m:t>
+        </m:r>
+        <m:r>
+          <m:rPr>
+            <m:sty m:val="p"/>
+          </m:rPr>
+          <m:t>m</m:t>
+        </m:r>
+        <m:r>
+          <m:rPr>
+            <m:sty m:val="p"/>
+          </m:rPr>
+          <m:t>M</m:t>
+        </m:r>
+        <m:r>
+          <m:t>∼</m:t>
+        </m:r>
+        <m:r>
+          <m:t>0.1</m:t>
+        </m:r>
+        <m:r>
+          <m:rPr>
+            <m:sty m:val="p"/>
+          </m:rPr>
+          <m:t>n</m:t>
+        </m:r>
+        <m:r>
+          <m:rPr>
+            <m:sty m:val="p"/>
+          </m:rPr>
+          <m:t>M</m:t>
+        </m:r>
+      </m:oMath>
+      <w:r>
+        <w:t xml:space="preserve"> </w:t>
+      </w:r>
+      <w:r>
+        <w:t xml:space="preserve">for the affinity dissociation constants.</w:t>
       </w:r>
     </w:p>
     <w:p>
@@ -15128,7 +15154,7 @@
             <w:rStyle w:val="Hyperlink"/>
             <w:vertAlign w:val="superscript"/>
           </w:rPr>
-          <w:t xml:space="preserve">18</w:t>
+          <w:t xml:space="preserve">17</w:t>
         </w:r>
       </w:hyperlink>
       <w:r>
@@ -15202,7 +15228,7 @@
         <w:rPr>
           <w:b/>
         </w:rPr>
-        <w:t xml:space="preserve">Model is able to recapitulate experimental multivalent binding activity.</w:t>
+        <w:t xml:space="preserve">Our model is able to recapitulate experimental multivalent binding activity.</w:t>
       </w:r>
       <w:r>
         <w:t xml:space="preserve"> </w:t>
@@ -15506,7 +15532,7 @@
             <w:rStyle w:val="Hyperlink"/>
             <w:vertAlign w:val="superscript"/>
           </w:rPr>
-          <w:t xml:space="preserve">18</w:t>
+          <w:t xml:space="preserve">17</w:t>
         </w:r>
       </w:hyperlink>
       <w:r>
@@ -15528,7 +15554,7 @@
         <w:rPr>
           <w:b/>
         </w:rPr>
-        <w:t xml:space="preserve">Model is able to recapitulate experimental multivalent binding activity.</w:t>
+        <w:t xml:space="preserve">Our model is able to recapitulate experimental multivalent binding activity.</w:t>
       </w:r>
       <w:r>
         <w:t xml:space="preserve"> </w:t>
@@ -15832,7 +15858,7 @@
             <w:rStyle w:val="Hyperlink"/>
             <w:vertAlign w:val="superscript"/>
           </w:rPr>
-          <w:t xml:space="preserve">18</w:t>
+          <w:t xml:space="preserve">17</w:t>
         </w:r>
       </w:hyperlink>
       <w:r>
@@ -16534,13 +16560,13 @@
       </w:r>
     </w:p>
     <w:bookmarkEnd w:id="75"/>
-    <w:bookmarkStart w:id="76" w:name="ref-IanZRiFA"/>
+    <w:bookmarkStart w:id="76" w:name="ref-11gk5tUo7"/>
     <w:p>
       <w:pPr>
         <w:pStyle w:val="Bibliography"/>
       </w:pPr>
       <w:r>
-        <w:t xml:space="preserve">16. Mazor, Y.</w:t>
+        <w:t xml:space="preserve">16. Robinett, R. A.</w:t>
       </w:r>
       <w:r>
         <w:t xml:space="preserve"> </w:t>
@@ -16555,6 +16581,98 @@
         <w:t xml:space="preserve"> </w:t>
       </w:r>
       <w:r>
+        <w:t xml:space="preserve">Dissecting FcγR Regulation through a Multivalent Binding Model.</w:t>
+      </w:r>
+      <w:r>
+        <w:t xml:space="preserve"> </w:t>
+      </w:r>
+      <w:r>
+        <w:rPr>
+          <w:i/>
+        </w:rPr>
+        <w:t xml:space="preserve">Cell systems</w:t>
+      </w:r>
+      <w:r>
+        <w:t xml:space="preserve"> </w:t>
+      </w:r>
+      <w:r>
+        <w:rPr>
+          <w:b/>
+        </w:rPr>
+        <w:t xml:space="preserve">7</w:t>
+      </w:r>
+      <w:r>
+        <w:t xml:space="preserve">, 41–48.e5 (2018).</w:t>
+      </w:r>
+    </w:p>
+    <w:bookmarkEnd w:id="76"/>
+    <w:bookmarkStart w:id="77" w:name="ref-u2Cb0DBq"/>
+    <w:p>
+      <w:pPr>
+        <w:pStyle w:val="Bibliography"/>
+      </w:pPr>
+      <w:r>
+        <w:t xml:space="preserve">17. Csizmar, C. M.</w:t>
+      </w:r>
+      <w:r>
+        <w:t xml:space="preserve"> </w:t>
+      </w:r>
+      <w:r>
+        <w:rPr>
+          <w:i/>
+        </w:rPr>
+        <w:t xml:space="preserve">et al.</w:t>
+      </w:r>
+      <w:r>
+        <w:t xml:space="preserve"> </w:t>
+      </w:r>
+      <w:r>
+        <w:t xml:space="preserve">Multivalent Ligand Binding to Cell Membrane Antigens: Defining the Interplay of Affinity, Valency, and Expression Density.</w:t>
+      </w:r>
+      <w:r>
+        <w:t xml:space="preserve"> </w:t>
+      </w:r>
+      <w:r>
+        <w:rPr>
+          <w:i/>
+        </w:rPr>
+        <w:t xml:space="preserve">Journal of the American Chemical Society</w:t>
+      </w:r>
+      <w:r>
+        <w:t xml:space="preserve"> </w:t>
+      </w:r>
+      <w:r>
+        <w:rPr>
+          <w:b/>
+        </w:rPr>
+        <w:t xml:space="preserve">141</w:t>
+      </w:r>
+      <w:r>
+        <w:t xml:space="preserve">, 251–261 (2018).</w:t>
+      </w:r>
+    </w:p>
+    <w:bookmarkEnd w:id="77"/>
+    <w:bookmarkStart w:id="78" w:name="ref-IanZRiFA"/>
+    <w:p>
+      <w:pPr>
+        <w:pStyle w:val="Bibliography"/>
+      </w:pPr>
+      <w:r>
+        <w:t xml:space="preserve">18. Mazor, Y.</w:t>
+      </w:r>
+      <w:r>
+        <w:t xml:space="preserve"> </w:t>
+      </w:r>
+      <w:r>
+        <w:rPr>
+          <w:i/>
+        </w:rPr>
+        <w:t xml:space="preserve">et al.</w:t>
+      </w:r>
+      <w:r>
+        <w:t xml:space="preserve"> </w:t>
+      </w:r>
+      <w:r>
         <w:t xml:space="preserve">Enhanced tumor-targeting selectivity by modulating bispecific antibody binding affinity and format valence.</w:t>
       </w:r>
       <w:r>
@@ -16577,98 +16695,6 @@
       </w:r>
       <w:r>
         <w:t xml:space="preserve">, (2017).</w:t>
-      </w:r>
-    </w:p>
-    <w:bookmarkEnd w:id="76"/>
-    <w:bookmarkStart w:id="77" w:name="ref-11gk5tUo7"/>
-    <w:p>
-      <w:pPr>
-        <w:pStyle w:val="Bibliography"/>
-      </w:pPr>
-      <w:r>
-        <w:t xml:space="preserve">17. Robinett, R. A.</w:t>
-      </w:r>
-      <w:r>
-        <w:t xml:space="preserve"> </w:t>
-      </w:r>
-      <w:r>
-        <w:rPr>
-          <w:i/>
-        </w:rPr>
-        <w:t xml:space="preserve">et al.</w:t>
-      </w:r>
-      <w:r>
-        <w:t xml:space="preserve"> </w:t>
-      </w:r>
-      <w:r>
-        <w:t xml:space="preserve">Dissecting FcγR Regulation through a Multivalent Binding Model.</w:t>
-      </w:r>
-      <w:r>
-        <w:t xml:space="preserve"> </w:t>
-      </w:r>
-      <w:r>
-        <w:rPr>
-          <w:i/>
-        </w:rPr>
-        <w:t xml:space="preserve">Cell systems</w:t>
-      </w:r>
-      <w:r>
-        <w:t xml:space="preserve"> </w:t>
-      </w:r>
-      <w:r>
-        <w:rPr>
-          <w:b/>
-        </w:rPr>
-        <w:t xml:space="preserve">7</w:t>
-      </w:r>
-      <w:r>
-        <w:t xml:space="preserve">, 41–48.e5 (2018).</w:t>
-      </w:r>
-    </w:p>
-    <w:bookmarkEnd w:id="77"/>
-    <w:bookmarkStart w:id="78" w:name="ref-u2Cb0DBq"/>
-    <w:p>
-      <w:pPr>
-        <w:pStyle w:val="Bibliography"/>
-      </w:pPr>
-      <w:r>
-        <w:t xml:space="preserve">18. Csizmar, C. M.</w:t>
-      </w:r>
-      <w:r>
-        <w:t xml:space="preserve"> </w:t>
-      </w:r>
-      <w:r>
-        <w:rPr>
-          <w:i/>
-        </w:rPr>
-        <w:t xml:space="preserve">et al.</w:t>
-      </w:r>
-      <w:r>
-        <w:t xml:space="preserve"> </w:t>
-      </w:r>
-      <w:r>
-        <w:t xml:space="preserve">Multivalent Ligand Binding to Cell Membrane Antigens: Defining the Interplay of Affinity, Valency, and Expression Density.</w:t>
-      </w:r>
-      <w:r>
-        <w:t xml:space="preserve"> </w:t>
-      </w:r>
-      <w:r>
-        <w:rPr>
-          <w:i/>
-        </w:rPr>
-        <w:t xml:space="preserve">Journal of the American Chemical Society</w:t>
-      </w:r>
-      <w:r>
-        <w:t xml:space="preserve"> </w:t>
-      </w:r>
-      <w:r>
-        <w:rPr>
-          <w:b/>
-        </w:rPr>
-        <w:t xml:space="preserve">141</w:t>
-      </w:r>
-      <w:r>
-        <w:t xml:space="preserve">, 251–261 (2018).</w:t>
       </w:r>
     </w:p>
     <w:bookmarkEnd w:id="78"/>

</xml_diff>

<commit_message>
Deploying to gh-pages from  @ 6f259dfa69bfbe32cd0b94f65250c6ba063277ef 🚀
</commit_message>
<xml_diff>
--- a/manuscript.docx
+++ b/manuscript.docx
@@ -78,7 +78,7 @@
         <w:t xml:space="preserve"> </w:t>
       </w:r>
       <w:r>
-        <w:t xml:space="preserve">was automatically generated on October 10, 2020.</w:t>
+        <w:t xml:space="preserve">was automatically generated on October 11, 2020.</w:t>
       </w:r>
       <w:r>
         <w:t xml:space="preserve"> </w:t>
@@ -16004,7 +16004,7 @@
         <w:rPr>
           <w:i/>
         </w:rPr>
-        <w:t xml:space="preserve">Cancer cell</w:t>
+        <w:t xml:space="preserve">Cancer Cell</w:t>
       </w:r>
       <w:r>
         <w:t xml:space="preserve"> </w:t>
@@ -16311,7 +16311,7 @@
         <w:rPr>
           <w:i/>
         </w:rPr>
-        <w:t xml:space="preserve">Cancer cell</w:t>
+        <w:t xml:space="preserve">Cancer Cell</w:t>
       </w:r>
       <w:r>
         <w:t xml:space="preserve"> </w:t>
@@ -16590,7 +16590,7 @@
         <w:rPr>
           <w:i/>
         </w:rPr>
-        <w:t xml:space="preserve">Cell systems</w:t>
+        <w:t xml:space="preserve">Cell Syst</w:t>
       </w:r>
       <w:r>
         <w:t xml:space="preserve"> </w:t>
@@ -16913,7 +16913,7 @@
         <w:rPr>
           <w:i/>
         </w:rPr>
-        <w:t xml:space="preserve">Methods (San Diego, Calif.)</w:t>
+        <w:t xml:space="preserve">Methods</w:t>
       </w:r>
       <w:r>
         <w:t xml:space="preserve"> </w:t>
@@ -17005,7 +17005,7 @@
         <w:rPr>
           <w:i/>
         </w:rPr>
-        <w:t xml:space="preserve">Journal of autoimmunity</w:t>
+        <w:t xml:space="preserve">J Autoimmun</w:t>
       </w:r>
       <w:r>
         <w:t xml:space="preserve"> </w:t>
@@ -17128,7 +17128,7 @@
         <w:rPr>
           <w:i/>
         </w:rPr>
-        <w:t xml:space="preserve">Oncology reports</w:t>
+        <w:t xml:space="preserve">Oncol Rep</w:t>
       </w:r>
       <w:r>
         <w:t xml:space="preserve"> </w:t>

</xml_diff>

<commit_message>
Deploying to gh-pages from  @ 0259e00a800489c63214a828a0af1bbbfdae921d 🚀
</commit_message>
<xml_diff>
--- a/manuscript.docx
+++ b/manuscript.docx
@@ -78,7 +78,7 @@
         <w:t xml:space="preserve"> </w:t>
       </w:r>
       <w:r>
-        <w:t xml:space="preserve">was automatically generated on October 11, 2020.</w:t>
+        <w:t xml:space="preserve">was automatically generated on October 13, 2020.</w:t>
       </w:r>
       <w:r>
         <w:t xml:space="preserve"> </w:t>
@@ -6353,6 +6353,29 @@
           </m:sub>
           <m:sup>
             <m:r>
+              <m:t>m</m:t>
+            </m:r>
+            <m:r>
+              <m:t>e</m:t>
+            </m:r>
+            <m:r>
+              <m:t>d</m:t>
+            </m:r>
+          </m:sup>
+        </m:sSubSup>
+        <m:sSubSup>
+          <m:e>
+            <m:r>
+              <m:t>R</m:t>
+            </m:r>
+          </m:e>
+          <m:sub>
+            <m:r>
+              <m:t>2</m:t>
+            </m:r>
+          </m:sub>
+          <m:sup>
+            <m:r>
               <m:t>h</m:t>
             </m:r>
             <m:r>
@@ -6360,6 +6383,37 @@
             </m:r>
           </m:sup>
         </m:sSubSup>
+      </m:oMath>
+      <w:r>
+        <w:t xml:space="preserve"> </w:t>
+      </w:r>
+      <w:r>
+        <w:t xml:space="preserve">and</w:t>
+      </w:r>
+      <w:r>
+        <w:t xml:space="preserve"> </w:t>
+      </w:r>
+      <m:oMath>
+        <m:sSubSup>
+          <m:e>
+            <m:r>
+              <m:t>R</m:t>
+            </m:r>
+          </m:e>
+          <m:sub>
+            <m:r>
+              <m:t>1</m:t>
+            </m:r>
+          </m:sub>
+          <m:sup>
+            <m:r>
+              <m:t>h</m:t>
+            </m:r>
+            <m:r>
+              <m:t>i</m:t>
+            </m:r>
+          </m:sup>
+        </m:sSubSup>
         <m:sSubSup>
           <m:e>
             <m:r>
@@ -6373,61 +6427,13 @@
           </m:sub>
           <m:sup>
             <m:r>
-              <m:t>l</m:t>
-            </m:r>
-            <m:r>
-              <m:t>o</m:t>
-            </m:r>
-          </m:sup>
-        </m:sSubSup>
-      </m:oMath>
-      <w:r>
-        <w:t xml:space="preserve"> </w:t>
-      </w:r>
-      <w:r>
-        <w:t xml:space="preserve">and</w:t>
-      </w:r>
-      <w:r>
-        <w:t xml:space="preserve"> </w:t>
-      </w:r>
-      <m:oMath>
-        <m:sSubSup>
-          <m:e>
-            <m:r>
-              <m:t>R</m:t>
-            </m:r>
-          </m:e>
-          <m:sub>
-            <m:r>
-              <m:t>1</m:t>
-            </m:r>
-          </m:sub>
-          <m:sup>
-            <m:r>
-              <m:t>l</m:t>
-            </m:r>
-            <m:r>
-              <m:t>o</m:t>
-            </m:r>
-          </m:sup>
-        </m:sSubSup>
-        <m:sSubSup>
-          <m:e>
-            <m:r>
-              <m:t>R</m:t>
-            </m:r>
-          </m:e>
-          <m:sub>
-            <m:r>
-              <m:t>2</m:t>
-            </m:r>
-          </m:sub>
-          <m:sup>
-            <m:r>
-              <m:t>h</m:t>
-            </m:r>
-            <m:r>
-              <m:t>i</m:t>
+              <m:t>m</m:t>
+            </m:r>
+            <m:r>
+              <m:t>e</m:t>
+            </m:r>
+            <m:r>
+              <m:t>d</m:t>
             </m:r>
           </m:sup>
         </m:sSubSup>
@@ -6495,21 +6501,7 @@
         </w:r>
       </w:hyperlink>
       <w:r>
-        <w:t xml:space="preserve">c). We also demonstrate the utility of mixture engineering in cell population combinations where many off-target populations are considered (Fig.</w:t>
-      </w:r>
-      <w:r>
-        <w:t xml:space="preserve"> </w:t>
-      </w:r>
-      <w:hyperlink w:anchor="fig:mixture">
-        <w:r>
-          <w:rPr>
-            <w:rStyle w:val="Hyperlink"/>
-          </w:rPr>
-          <w:t xml:space="preserve">4</w:t>
-        </w:r>
-      </w:hyperlink>
-      <w:r>
-        <w:t xml:space="preserve">d). However, even in these cases, the magnitude of selectivity enhancement is modest. Finally, although we only consider the amount of binding, ligands can have non-overlapping signaling effects even with identical amounts of binding. In these cases, the effect of combinations can be distinct from either individual ligand.</w:t>
+        <w:t xml:space="preserve">c). However, even in these cases, the magnitude of selectivity enhancement is modest. Finally, although we only consider the amount of binding, ligands can have non-overlapping signaling effects even with identical amounts of binding. In these cases, the effect of combinations can be distinct from either individual ligand.</w:t>
       </w:r>
       <w:hyperlink w:anchor="ref-11gk5tUo7">
         <w:r>
@@ -6915,162 +6907,6 @@
           </m:sub>
           <m:sup>
             <m:r>
-              <m:t>h</m:t>
-            </m:r>
-            <m:r>
-              <m:t>i</m:t>
-            </m:r>
-          </m:sup>
-        </m:sSubSup>
-        <m:sSubSup>
-          <m:e>
-            <m:r>
-              <m:t>R</m:t>
-            </m:r>
-          </m:e>
-          <m:sub>
-            <m:r>
-              <m:t>2</m:t>
-            </m:r>
-          </m:sub>
-          <m:sup>
-            <m:r>
-              <m:t>l</m:t>
-            </m:r>
-            <m:r>
-              <m:t>o</m:t>
-            </m:r>
-          </m:sup>
-        </m:sSubSup>
-      </m:oMath>
-      <w:r>
-        <w:t xml:space="preserve"> </w:t>
-      </w:r>
-      <w:r>
-        <w:t xml:space="preserve">and</w:t>
-      </w:r>
-      <w:r>
-        <w:t xml:space="preserve"> </w:t>
-      </w:r>
-      <m:oMath>
-        <m:sSubSup>
-          <m:e>
-            <m:r>
-              <m:t>R</m:t>
-            </m:r>
-          </m:e>
-          <m:sub>
-            <m:r>
-              <m:t>1</m:t>
-            </m:r>
-          </m:sub>
-          <m:sup>
-            <m:r>
-              <m:t>l</m:t>
-            </m:r>
-            <m:r>
-              <m:t>o</m:t>
-            </m:r>
-          </m:sup>
-        </m:sSubSup>
-        <m:sSubSup>
-          <m:e>
-            <m:r>
-              <m:t>R</m:t>
-            </m:r>
-          </m:e>
-          <m:sub>
-            <m:r>
-              <m:t>2</m:t>
-            </m:r>
-          </m:sub>
-          <m:sup>
-            <m:r>
-              <m:t>h</m:t>
-            </m:r>
-            <m:r>
-              <m:t>i</m:t>
-            </m:r>
-          </m:sup>
-        </m:sSubSup>
-      </m:oMath>
-      <w:r>
-        <w:t xml:space="preserve">, d)</w:t>
-      </w:r>
-      <w:r>
-        <w:t xml:space="preserve"> </w:t>
-      </w:r>
-      <m:oMath>
-        <m:sSubSup>
-          <m:e>
-            <m:r>
-              <m:t>R</m:t>
-            </m:r>
-          </m:e>
-          <m:sub>
-            <m:r>
-              <m:t>1</m:t>
-            </m:r>
-          </m:sub>
-          <m:sup>
-            <m:r>
-              <m:t>m</m:t>
-            </m:r>
-            <m:r>
-              <m:t>e</m:t>
-            </m:r>
-            <m:r>
-              <m:t>d</m:t>
-            </m:r>
-          </m:sup>
-        </m:sSubSup>
-        <m:sSubSup>
-          <m:e>
-            <m:r>
-              <m:t>R</m:t>
-            </m:r>
-          </m:e>
-          <m:sub>
-            <m:r>
-              <m:t>2</m:t>
-            </m:r>
-          </m:sub>
-          <m:sup>
-            <m:r>
-              <m:t>m</m:t>
-            </m:r>
-            <m:r>
-              <m:t>e</m:t>
-            </m:r>
-            <m:r>
-              <m:t>d</m:t>
-            </m:r>
-          </m:sup>
-        </m:sSubSup>
-      </m:oMath>
-      <w:r>
-        <w:t xml:space="preserve"> </w:t>
-      </w:r>
-      <w:r>
-        <w:t xml:space="preserve">to</w:t>
-      </w:r>
-      <w:r>
-        <w:t xml:space="preserve"> </w:t>
-      </w:r>
-      <m:oMath>
-        <m:sSubSup>
-          <m:e>
-            <m:r>
-              <m:t>R</m:t>
-            </m:r>
-          </m:e>
-          <m:sub>
-            <m:r>
-              <m:t>1</m:t>
-            </m:r>
-          </m:sub>
-          <m:sup>
-            <m:r>
               <m:t>m</m:t>
             </m:r>
             <m:r>
@@ -7511,162 +7347,6 @@
             </m:r>
             <m:r>
               <m:t>i</m:t>
-            </m:r>
-          </m:sup>
-        </m:sSubSup>
-      </m:oMath>
-      <w:r>
-        <w:t xml:space="preserve"> </w:t>
-      </w:r>
-      <w:r>
-        <w:t xml:space="preserve">to</w:t>
-      </w:r>
-      <w:r>
-        <w:t xml:space="preserve"> </w:t>
-      </w:r>
-      <m:oMath>
-        <m:sSubSup>
-          <m:e>
-            <m:r>
-              <m:t>R</m:t>
-            </m:r>
-          </m:e>
-          <m:sub>
-            <m:r>
-              <m:t>1</m:t>
-            </m:r>
-          </m:sub>
-          <m:sup>
-            <m:r>
-              <m:t>h</m:t>
-            </m:r>
-            <m:r>
-              <m:t>i</m:t>
-            </m:r>
-          </m:sup>
-        </m:sSubSup>
-        <m:sSubSup>
-          <m:e>
-            <m:r>
-              <m:t>R</m:t>
-            </m:r>
-          </m:e>
-          <m:sub>
-            <m:r>
-              <m:t>2</m:t>
-            </m:r>
-          </m:sub>
-          <m:sup>
-            <m:r>
-              <m:t>l</m:t>
-            </m:r>
-            <m:r>
-              <m:t>o</m:t>
-            </m:r>
-          </m:sup>
-        </m:sSubSup>
-      </m:oMath>
-      <w:r>
-        <w:t xml:space="preserve"> </w:t>
-      </w:r>
-      <w:r>
-        <w:t xml:space="preserve">and</w:t>
-      </w:r>
-      <w:r>
-        <w:t xml:space="preserve"> </w:t>
-      </w:r>
-      <m:oMath>
-        <m:sSubSup>
-          <m:e>
-            <m:r>
-              <m:t>R</m:t>
-            </m:r>
-          </m:e>
-          <m:sub>
-            <m:r>
-              <m:t>1</m:t>
-            </m:r>
-          </m:sub>
-          <m:sup>
-            <m:r>
-              <m:t>l</m:t>
-            </m:r>
-            <m:r>
-              <m:t>o</m:t>
-            </m:r>
-          </m:sup>
-        </m:sSubSup>
-        <m:sSubSup>
-          <m:e>
-            <m:r>
-              <m:t>R</m:t>
-            </m:r>
-          </m:e>
-          <m:sub>
-            <m:r>
-              <m:t>2</m:t>
-            </m:r>
-          </m:sub>
-          <m:sup>
-            <m:r>
-              <m:t>h</m:t>
-            </m:r>
-            <m:r>
-              <m:t>i</m:t>
-            </m:r>
-          </m:sup>
-        </m:sSubSup>
-      </m:oMath>
-      <w:r>
-        <w:t xml:space="preserve">, d)</w:t>
-      </w:r>
-      <w:r>
-        <w:t xml:space="preserve"> </w:t>
-      </w:r>
-      <m:oMath>
-        <m:sSubSup>
-          <m:e>
-            <m:r>
-              <m:t>R</m:t>
-            </m:r>
-          </m:e>
-          <m:sub>
-            <m:r>
-              <m:t>1</m:t>
-            </m:r>
-          </m:sub>
-          <m:sup>
-            <m:r>
-              <m:t>m</m:t>
-            </m:r>
-            <m:r>
-              <m:t>e</m:t>
-            </m:r>
-            <m:r>
-              <m:t>d</m:t>
-            </m:r>
-          </m:sup>
-        </m:sSubSup>
-        <m:sSubSup>
-          <m:e>
-            <m:r>
-              <m:t>R</m:t>
-            </m:r>
-          </m:e>
-          <m:sub>
-            <m:r>
-              <m:t>2</m:t>
-            </m:r>
-          </m:sub>
-          <m:sup>
-            <m:r>
-              <m:t>m</m:t>
-            </m:r>
-            <m:r>
-              <m:t>e</m:t>
-            </m:r>
-            <m:r>
-              <m:t>d</m:t>
             </m:r>
           </m:sup>
         </m:sSubSup>

</xml_diff>

<commit_message>
Deploying to gh-pages from  @ 996e665000d99b1f93e4cfd6a9d6d317ac7fd446 🚀
</commit_message>
<xml_diff>
--- a/manuscript.docx
+++ b/manuscript.docx
@@ -382,7 +382,7 @@
         <w:pStyle w:val="FirstParagraph"/>
       </w:pPr>
       <w:r>
-        <w:t xml:space="preserve">Many drugs derive their therapeutic benefit and avoid toxicity through selective binding to specific cells within the body. However, even with a drug of very specific molecular binding, genetic and non-genetic heterogeneity can create a wide distribution of cell responses. This can result in reduced effectiveness and toxicity. For example, in cancer, resistance to anti-tumor antibodies,</w:t>
+        <w:t xml:space="preserve">Many drugs derive their therapeutic benefit and avoid toxicity through selective binding to specific cells within the body. Often, target cells can differ from off-target populations only by subtle changes in surface receptor expression, making selective activation of target cells difficult to achieve. Even with a drug of very specific molecular binding, genetic and non-genetic heterogeneity can create a wide distribution of cell responses. This can result in reduced effectiveness and toxicity. For example, in cancer, resistance to anti-tumor antibodies,</w:t>
       </w:r>
       <w:hyperlink w:anchor="ref-dr9JS306">
         <w:r>
@@ -472,7 +472,7 @@
         <w:t xml:space="preserve"> </w:t>
       </w:r>
       <w:r>
-        <w:t xml:space="preserve">Even in the absence of heterogeneity, target cells can differ from off-target populations only by subtle changes in surface receptor expression. These challenges limit the selectivity of therapies within the body.</w:t>
+        <w:t xml:space="preserve">The intricacies of both inter-population receptor expression relationships, and intra-population receptor expression heterogeneity both represent signficiant challenges which limit the selectivity of therapies within the body.</w:t>
       </w:r>
     </w:p>
     <w:p>
@@ -548,7 +548,7 @@
         <w:t xml:space="preserve"> </w:t>
       </w:r>
       <w:r>
-        <w:t xml:space="preserve">Here, we analyze a suite of molecular strategies for engineering cell-specific binding using a multi-valent, multi-receptor, multi-ligand model. We show that strategies including affinity, valency, binding competition, ligand mixtures, and hetero-valent complexes provide distinct and non-overlapping improvements in cell-specific targeting. With each strategy, we highlight evidence of its effect in existing therapeutic agents. Finally, we combine these strategies to target cells through combinatorial strategies. In total, our results demonstrate that binding programs can offer combinatorial targeting strategies with similar effectiveness as complex engineered cellular therapies and can be engineered using a mechanistic binding model.</w:t>
+        <w:t xml:space="preserve">Here, we analyze a suite of molecular strategies for engineering cell-specific binding using a multi-valent, multi-receptor, multi-ligand model. We show that strategies including affinity, valency, binding competition, ligand mixtures, and hetero-valent complexes provide distinct improvements in cell-specific targeting. Finally, we combine these strategies to target cells through combinatorial strategies. In total, our results demonstrate that binding programs can offer combinatorial targeting strategies with similar effectiveness as complex engineered cellular therapies and can be engineered using a mechanistic binding model.</w:t>
       </w:r>
     </w:p>
     <w:p>
@@ -626,7 +626,7 @@
         <w:pStyle w:val="BodyText"/>
       </w:pPr>
       <w:r>
-        <w:t xml:space="preserve">Here we investigate cell-specific targeting quantitatively by extending a multi-valent, multi-ligand equilibrium binding model. Virtually any therapy, including monoclonal antibodies, small-molecule inhibitors, and cytokines, can be thought of as ligands for respective receptors expressed on target cells. Ligand binding to target cells is the first step and essential for a drug’s intended action; in contrast, binding to off-target cells can result in unintended effects or toxicity. Some cell populations can be distinguished by their expression of a unique receptor not expressed by other populations, but more commonly target and off-target cells express the same collection of receptors and differ only in their magnitudes of receptor expression. In such situations, engineering drugs optimized to achieve more ligand bound to the target cells while minimizing the binding to off-target cells is an area of ongoing research and has inspired myriad drug design strategies.</w:t>
+        <w:t xml:space="preserve">Here we investigate cell-specific targeting quantitatively by extending a multi-valent, multi-ligand equilibrium binding model. Virtually any therapy, including monoclonal antibodies, small-molecule inhibitors, and cytokines, can be thought of as ligands for respective receptors expressed on target cells. Ligand binding to target cells is the first step and essential for a drug’s intended action; in contrast, binding to off-target cells can result in unintended effects or toxicity. Some cell populations can be distinguished by their expression of a unique receptor not expressed by other populations, but more commonly target and off-target cells express the same collection of receptors and differ only in their magnitudes of receptor expression. In such situations, engineering drugs optimized to bind tightly to target cells while minimizing the amount of drug bound to off-target cells is an area of ongoing research and has inspired myriad drug design strategies.</w:t>
       </w:r>
       <w:hyperlink w:anchor="ref-10kZoPeON">
         <w:r>
@@ -656,7 +656,7 @@
         <w:t xml:space="preserve"> </w:t>
       </w:r>
       <w:r>
-        <w:t xml:space="preserve">In this work, we define cell population selectivity as the ratio of the number of ligands bound to target cell populations over the number of ligands bound to off-target cell populations. We will use a quantitative binding estimation for each cell population to examine these strategies.</w:t>
+        <w:t xml:space="preserve">In this work, we define cell population selectivity as the ratio of the number of ligands bound to target cell populations divided by the number of ligands bound to off-target cell populations. We will use a quantitative binding estimation for each cell population to examine these strategies.</w:t>
       </w:r>
     </w:p>
     <w:p>
@@ -664,7 +664,7 @@
         <w:pStyle w:val="BodyText"/>
       </w:pPr>
       <w:r>
-        <w:t xml:space="preserve">While ligand-receptor binding events in biology are diverse, they are governed by thermodynamic properties and the law of mass action. The binding between monomer ligands and receptors at equilibrium can be depicted by their association constant</w:t>
+        <w:t xml:space="preserve">While ligand-receptor binding events in biology are diverse, they are governed by thermodynamic properties and the law of mass action. The binding between monomer ligands and receptors at equilibrium can be described by their association constant</w:t>
       </w:r>
       <w:r>
         <w:t xml:space="preserve"> </w:t>
@@ -704,7 +704,7 @@
         </m:sSub>
       </m:oMath>
       <w:r>
-        <w:t xml:space="preserve">. Binding behavior is more complicated when the ligands are multivalent complexes consisting of multiple units, each of which can bind to a receptor (Fig.</w:t>
+        <w:t xml:space="preserve">. These constants are indicative of the affinity with which the monomeric ligand binds a receptor. Binding behavior is more complicated when the ligands are multivalent complexes consisting of multiple units, each of which can bind to a receptor (Fig.</w:t>
       </w:r>
       <w:r>
         <w:t xml:space="preserve"> </w:t>
@@ -890,7 +890,7 @@
         </w:r>
       </w:hyperlink>
       <w:r>
-        <w:t xml:space="preserve">c, cell populations at points 1 and 2 are on the same contour line and thus have the same amount of ligand bound; the cell populations at points 1 and 3 are separated by multiple contour lines, indicating that cells at point 3 bind more ligands (In fact, the ratio can be read as the exponent of the contour line difference. For point 3 to point 1, the ratio is</w:t>
+        <w:t xml:space="preserve">c, cell populations at points 1 and 2 are on the same contour line and thus have the same amount of ligand bound; the cell populations at points 1 and 3 are separated by multiple contour lines, indicating that cells at point 3 bind more ligand (In fact, the ratio can be read as the exponent of the contour line difference. For point 3 to point 1, the ratio is</w:t>
       </w:r>
       <w:r>
         <w:t xml:space="preserve"> </w:t>
@@ -1014,7 +1014,7 @@
         <w:t xml:space="preserve"> </w:t>
       </w:r>
       <w:r>
-        <w:t xml:space="preserve">lead to a greater binding sensitivity on the expression of</w:t>
+        <w:t xml:space="preserve">lead to binding varying more strongly with changes to</w:t>
       </w:r>
       <w:r>
         <w:t xml:space="preserve"> </w:t>
@@ -1037,7 +1037,7 @@
         <w:t xml:space="preserve"> </w:t>
       </w:r>
       <w:r>
-        <w:t xml:space="preserve">than</w:t>
+        <w:t xml:space="preserve">expression than</w:t>
       </w:r>
       <w:r>
         <w:t xml:space="preserve"> </w:t>
@@ -1282,7 +1282,7 @@
         <w:t xml:space="preserve"> </w:t>
       </w:r>
       <w:r>
-        <w:t xml:space="preserve">has a wider range. We will use this binding model to examine how engineering using affinity, valency, and hetero-valent complexes improve cell-specific targeting. Although we will only consider two receptor and ligand subunit types respectively, the principles we present can generalize to more complex cases.</w:t>
+        <w:t xml:space="preserve">has a wider range. We will use this binding model to examine how engineering a ligand using various strategies can improve cell-specific targeting. Although we will only consider two receptor and ligand subunit types respectively, the principles we present can generalize to more complex cases.</w:t>
       </w:r>
     </w:p>
     <w:p>
@@ -2500,7 +2500,7 @@
         <w:pStyle w:val="BodyText"/>
       </w:pPr>
       <w:r>
-        <w:t xml:space="preserve">We first explored altering the affinities of a ligand to the receptors as an engineering strategy to enhance its cell population specificity. Here, we showed the binding pattern of monovalent ligands with various affinities ranging from</w:t>
+        <w:t xml:space="preserve">We first explored how altering the affinity with which a ligand binds receptors can be used as an engineering strategy to enhance its cell population specificity. Here, we showed the binding pattern of monovalent ligands with various affinities ranging from</w:t>
       </w:r>
       <w:r>
         <w:t xml:space="preserve"> </w:t>
@@ -2902,7 +2902,7 @@
         <w:t xml:space="preserve"> </w:t>
       </w:r>
       <w:r>
-        <w:t xml:space="preserve">increases, which corresponds to shifting from subplots on the left to the ones on the right, binding is shown to vary more strongly according to</w:t>
+        <w:t xml:space="preserve">increases, binding is shown to vary more strongly according to</w:t>
       </w:r>
       <w:r>
         <w:t xml:space="preserve"> </w:t>
@@ -3103,7 +3103,7 @@
         <w:pStyle w:val="BodyText"/>
       </w:pPr>
       <w:r>
-        <w:t xml:space="preserve">However, situations where both on- and off-target cell populations express the same set of receptors and only differ in their magnitude of expression are just as common. In these cases, we found out that it is beneficial for the drug to bind tightly to the most comparatively highly expressed receptor on the target population. Some examples of this pattern are the selective binding to</w:t>
+        <w:t xml:space="preserve">However, situations where both on- and off-target cell populations express the same set of receptors and differ only subtly in their magnitude of expression are just as common. In these cases, we found out that it is beneficial for the drug to bind tightly to the most comparatively highly expressed receptor on the target population. Some examples of this pattern are the selective binding to</w:t>
       </w:r>
       <w:r>
         <w:t xml:space="preserve"> </w:t>
@@ -3327,7 +3327,7 @@
         </w:r>
       </w:hyperlink>
       <w:r>
-        <w:t xml:space="preserve">a). For these two pairs, the benefit of affinity changes is limited to the relative discrepancy in receptor amounts (Fig.</w:t>
+        <w:t xml:space="preserve">a). For these two pairs, the benefit of affinity changes is limited by the relative discrepancy in receptor amounts (Fig.</w:t>
       </w:r>
       <w:r>
         <w:t xml:space="preserve"> </w:t>
@@ -3341,7 +3341,7 @@
         </w:r>
       </w:hyperlink>
       <w:r>
-        <w:t xml:space="preserve">c,d). Since the ratios of receptor expressions between</w:t>
+        <w:t xml:space="preserve">c,d). Becuase the ratios of receptor expressions between</w:t>
       </w:r>
       <w:r>
         <w:t xml:space="preserve"> </w:t>
@@ -3653,7 +3653,7 @@
         </m:sSubSup>
       </m:oMath>
       <w:r>
-        <w:t xml:space="preserve">, affinity tuning doesn’t change selective binding (Fig.</w:t>
+        <w:t xml:space="preserve">, affinity tuning fails to achieve selective binding (Fig.</w:t>
       </w:r>
       <w:r>
         <w:t xml:space="preserve"> </w:t>
@@ -3960,7 +3960,7 @@
         <w:t xml:space="preserve"> </w:t>
       </w:r>
       <w:r>
-        <w:t xml:space="preserve">After fitting to determine the crosslinking coefficient and receptor affinity values, our model was able to accurately match the binding of nanorings with four or eight binding units to MCF-7 cells expressing a known abundance of receptor partners (Fig.</w:t>
+        <w:t xml:space="preserve">After fitting to determine the crosslinking coefficient and receptor affinity values, our model was able to accurately match the binding of nanorings with four or eight binding units to cells expressing a known abundance of receptor partners (Fig.</w:t>
       </w:r>
       <w:r>
         <w:t xml:space="preserve"> </w:t>
@@ -4343,7 +4343,7 @@
         </m:sSubSup>
       </m:oMath>
       <w:r>
-        <w:t xml:space="preserve">, indicating that ligand bound is a nonlinear function of receptor expression (Fig.</w:t>
+        <w:t xml:space="preserve">, indicating that ligand bound is a nonlinear function of receptor expression when considering multivalent binding (Fig.</w:t>
       </w:r>
       <w:r>
         <w:t xml:space="preserve"> </w:t>
@@ -4365,7 +4365,7 @@
         <w:pStyle w:val="BodyText"/>
       </w:pPr>
       <w:r>
-        <w:t xml:space="preserve">Selectivity derived by changing valency requires coordinate changes in affinity. As is shown by our model, and as many previous studies have suggested, lower affinity, multi-valent interactions can result in particular selectivity for target populations expressing high abundances of receptors.</w:t>
+        <w:t xml:space="preserve">Selectivity derived by changing valency requires coordinate changes in affinity. As is shown by our model, and as many previous studies have suggested, multi-valent ligands can demosntrate extremely selective binding to target populations expressing high abundances of receptors when receptor-ligand interactions occur with low affinity.</w:t>
       </w:r>
       <w:hyperlink w:anchor="ref-B0xrCfE3">
         <w:r>
@@ -4859,7 +4859,7 @@
         <w:pStyle w:val="BodyText"/>
       </w:pPr>
       <w:r>
-        <w:t xml:space="preserve">Our model allowed us to identify the mechanism of valency-mediated receptor abundance selectivity by looking at the number of complex bound in each degree. A cell expressing</w:t>
+        <w:t xml:space="preserve">When a cell is bound by multivalent ligands, ligands will individually bind a variable amount of receptors, which we will refer to as the binding degree of the ligand. Our model allowed us to identify the mechanism of valency-mediated receptor abundance selectivity by examining the distribution of ligands bound at each degree to different cells. A cell expressing</w:t>
       </w:r>
       <w:r>
         <w:t xml:space="preserve"> </w:t>
@@ -4882,7 +4882,7 @@
         <w:t xml:space="preserve"> </w:t>
       </w:r>
       <w:r>
-        <w:t xml:space="preserve">receptors displays similar amounts of binding at each valency for ligands with dissociation constants of</w:t>
+        <w:t xml:space="preserve">receptors displays similar amounts of binding at each degree for ligands with dissociation constants of</w:t>
       </w:r>
       <w:r>
         <w:t xml:space="preserve"> </w:t>
@@ -4944,7 +4944,7 @@
         </w:r>
       </w:hyperlink>
       <w:r>
-        <w:t xml:space="preserve">e). However, a cell expressing 10% as many receptors exhibits extremely low amounts of multivalent binding for ligand complexes of low binding affinity (Fig.</w:t>
+        <w:t xml:space="preserve">e). However, a cell expressing 10% as many receptors exhibits extremely low amounts of higher-degree binding for ligand complexes of low binding affinity (Fig.</w:t>
       </w:r>
       <w:r>
         <w:t xml:space="preserve"> </w:t>
@@ -4958,7 +4958,7 @@
         </w:r>
       </w:hyperlink>
       <w:r>
-        <w:t xml:space="preserve">f). This effect arises due to a higher dissociation rate than multivalent binding association rate at low receptor abundances (Fig.</w:t>
+        <w:t xml:space="preserve">f). This effect arises due to the ligand’s rate of dissociation being larger than it’s multivalent binding association rate at low receptor abundances (Fig.</w:t>
       </w:r>
       <w:r>
         <w:t xml:space="preserve"> </w:t>
@@ -7494,7 +7494,7 @@
         <w:t xml:space="preserve"> </w:t>
       </w:r>
       <w:r>
-        <w:t xml:space="preserve">However, the number of possible configurations of multispecific drugs is combinatorially large and impossible to enumerate. Here, we use the heterovalent bispecific ligand as an example to explore the unique benefit of multispecificity distinct from any strategy analyzed before. Here, we compare bispecificity with a 50%-50% mixture of two monovalent ligands, and a 50%-50% mixture of two different homogeneous bivalent ligands. These two strategies both have some similarities to bispecific therapeutics. A bispecific ligand contains two different ligand monomers with equal proportion, similar to a 50%-50% monovalent mixture. By comparing bispecific with a 50%-50% monovalent mixture, we can elucidate the extra benefit of tethering these two monomers into one complex. A bispecific ligand is also by nature bivalent, and by comparing it with homogeneous bivalent drugs, we can understand how having two different subunits in the same complex modify the behavior of a drug. Together, we sought to identify the unique advantage of heterovalency.</w:t>
+        <w:t xml:space="preserve">However, the number of possible configurations of multispecific drugs is combinatorially large and impossible to enumerate. Here, we use the heterovalent bispecific ligand as an example to explore the unique benefit of multispecificity distinct from any strategy analyzed before. Here, we compare bispecificity with a 50%-50% mixture of two monovalent ligands, and a 50%-50% mixture of two different homogeneous bivalent ligands. These two strategies both have some similarities to bispecific therapeutics. A bispecific ligand contains two different ligand monomers with equal proportion, similar to a 50%-50% monovalent mixture. By comparing bispecific with a 50%-50% monovalent mixture, we can elucidate the extra benefit of tethering these two monomers into one complex. A bispecific ligand is also by nature bivalent, and by comparing it with homogeneous bivalent drugs, we can understand how having two different subunits in the same complex modify the behavior of a drug. Together, we sought to identify the potential unique advantages affored by heterovalent ligands.</w:t>
       </w:r>
     </w:p>
     <w:p>
@@ -7582,7 +7582,7 @@
         <w:pStyle w:val="BodyText"/>
       </w:pPr>
       <w:r>
-        <w:t xml:space="preserve">To scrutinize the case for bispecific ligands where the target binding of both subunits is required, we extended our model to calculate the amount of ligand fully bound. For the heterovalent bispecific case, ligand fully bound will only account the amount of ligand with both of their ligand monomers bind to a target. With the same set of parameters, the predictions made for bispecific fully bound show a very distinct pattern from general ligand bound (Fig</w:t>
+        <w:t xml:space="preserve">To scrutinize the case for bispecific ligands where the target binding of both subunits is required, we extended our model to calculate the amount of ligand fully bound. For the heterovalent bispecific case, ligand fully bound will only account for the amount of ligand with both of their ligand monomers bind to a target. With the same set of parameters, the predictions made for bispecific fully bound show a very distinct pattern from general ligand bound (Fig.</w:t>
       </w:r>
       <w:r>
         <w:t xml:space="preserve"> </w:t>
@@ -7596,9 +7596,6 @@
         </w:r>
       </w:hyperlink>
       <w:r>
-        <w:t xml:space="preserve"> </w:t>
-      </w:r>
-      <w:r>
         <w:t xml:space="preserve">e). The contour plot of fully bound bispecific ligands has more concaved contour lines. For example,</w:t>
       </w:r>
       <w:r>
@@ -7704,7 +7701,7 @@
         <w:t xml:space="preserve"> </w:t>
       </w:r>
       <w:r>
-        <w:t xml:space="preserve">(Fig</w:t>
+        <w:t xml:space="preserve">(Fig.</w:t>
       </w:r>
       <w:r>
         <w:t xml:space="preserve"> </w:t>
@@ -7718,9 +7715,6 @@
         </w:r>
       </w:hyperlink>
       <w:r>
-        <w:t xml:space="preserve"> </w:t>
-      </w:r>
-      <w:r>
         <w:t xml:space="preserve">a), but it has significantly more ligand fully bound than</w:t>
       </w:r>
       <w:r>
@@ -7775,7 +7769,7 @@
         <w:t xml:space="preserve"> </w:t>
       </w:r>
       <w:r>
-        <w:t xml:space="preserve">(Fig</w:t>
+        <w:t xml:space="preserve">(Fig.</w:t>
       </w:r>
       <w:r>
         <w:t xml:space="preserve"> </w:t>
@@ -7789,9 +7783,6 @@
         </w:r>
       </w:hyperlink>
       <w:r>
-        <w:t xml:space="preserve"> </w:t>
-      </w:r>
-      <w:r>
         <w:t xml:space="preserve">e). This concavity of contour lines indicates that for bispecific complexes, double-positive cells bind more ligands fully than singly-positively expressed cells. This should be obvious since these two subunits of the bispecific complex prefer different receptors. The results indicate that bispecific ligands will only exhibit special characteristics when it requires both receptor binding subunits to bind a receptor.</w:t>
       </w:r>
     </w:p>
@@ -7918,9 +7909,6 @@
       </w:r>
       <w:r>
         <w:t xml:space="preserve">(Fig.</w:t>
-      </w:r>
-      <w:r>
-        <w:t xml:space="preserve"> </w:t>
       </w:r>
       <w:hyperlink w:anchor="fig:bispecific">
         <w:r>
@@ -7931,9 +7919,6 @@
         </w:r>
       </w:hyperlink>
       <w:r>
-        <w:t xml:space="preserve"> </w:t>
-      </w:r>
-      <w:r>
         <w:t xml:space="preserve">d-f). In general, when</w:t>
       </w:r>
       <w:r>
@@ -7990,7 +7975,7 @@
         <w:t xml:space="preserve"> </w:t>
       </w:r>
       <w:r>
-        <w:t xml:space="preserve">(Figure</w:t>
+        <w:t xml:space="preserve">(Fig.</w:t>
       </w:r>
       <w:r>
         <w:t xml:space="preserve"> </w:t>
@@ -8004,9 +7989,6 @@
         </w:r>
       </w:hyperlink>
       <w:r>
-        <w:t xml:space="preserve"> </w:t>
-      </w:r>
-      <w:r>
         <w:t xml:space="preserve">g,h). These plotted numbers are ratios of ligand (fully) bound ratios between two cell populations, so when they are larger, it implies that fully bound bispecific ligand has more advantages than its counterpart to impart selective binding between these two cell populations. Figure</w:t>
       </w:r>
       <w:r>
@@ -8021,9 +8003,6 @@
         </w:r>
       </w:hyperlink>
       <w:r>
-        <w:t xml:space="preserve"> </w:t>
-      </w:r>
-      <w:r>
         <w:t xml:space="preserve">g compares the selectivities under bispecific ligands versus a 50%-50% mixture of monovalent ligands. The results show that fully bound bispecific can grant better selective binding when</w:t>
       </w:r>
       <w:r>
@@ -8094,9 +8073,6 @@
         </w:r>
       </w:hyperlink>
       <w:r>
-        <w:t xml:space="preserve"> </w:t>
-      </w:r>
-      <w:r>
         <w:t xml:space="preserve">h), the advantage of bispecific drugs is not obvious except for</w:t>
       </w:r>
       <w:r>
@@ -8219,9 +8195,6 @@
         </w:r>
       </w:hyperlink>
       <w:r>
-        <w:t xml:space="preserve"> </w:t>
-      </w:r>
-      <w:r>
         <w:t xml:space="preserve">g no longer holds. Together, we showed that bispecific ligands only exhibit unique advantages in inducing selective binding when they can only be effective when both of their subunits bind and crosslinking is more difficult.</w:t>
       </w:r>
     </w:p>
@@ -9016,7 +8989,7 @@
         <w:pStyle w:val="FirstParagraph"/>
       </w:pPr>
       <w:r>
-        <w:t xml:space="preserve">Each strategy described above provided selectivity benefits in distinct situations, suggesting that they might synergistically improve selectivity when combined. We explored this potential synergy using mathematical optimization to determine the ligand specifications which provided optimal selectivity for our theoretical cell populations. More specifically, we considered the selectivity for a particular population, while considering all other populations as off-target. Our optimization allowed for ligand characteristics to vary within biologically plausible bounds; which characteristics we allowed to vary defined our examination of the efficacy of our various ligand engineering strategies (Fig.</w:t>
+        <w:t xml:space="preserve">Each strategy described above provided selectivity benefits in distinct situations, suggesting that they might synergistically improve selectivity when combined. We explored this potential synergy using mathematical optimization to determine the ligand specifications which provided optimal selectivity for our theoretical cell populations. More specifically, we optimized the selectivity of a ligand for a particular population, while considering all other populations to be off-target. Our optimization allowed for ligand characteristics to vary within biologically plausible bounds; which characteristics we allowed to vary defined our examination of the efficacy of our various ligand engineering strategies (Fig.</w:t>
       </w:r>
       <w:r>
         <w:t xml:space="preserve"> </w:t>
@@ -9030,7 +9003,7 @@
         </w:r>
       </w:hyperlink>
       <w:r>
-        <w:t xml:space="preserve">). To simulate the effects of affinity engineering, we allowed ligand-receptor affinities to vary. To understand the effects of valency and mixture engineering on selectivity, we allowed ligand valency and mixtures to vary, while also allowing affinity to vary due to the previously noted reliance that these strategies have on receptor-ligand kinetics. Finally, all ligand parameters were allowed to vary to simulate the effects of combining therapeutic engineering approaches.</w:t>
+        <w:t xml:space="preserve">). To simulate the effects of affinity engineering, we allowed ligand-receptor affinities to vary. To understand the effects of valency and mixture engineering on selectivity, we allowed ligand valency and ligand mixture composition to vary, while also allowing affinity to vary due to the previously noted reliance that these strategies have on receptor-ligand kinetics. Finally, all ligand parameters were allowed to vary to simulate the effects of combining therapeutic engineering approaches.</w:t>
       </w:r>
     </w:p>
     <w:p>
@@ -9089,7 +9062,7 @@
         <w:t xml:space="preserve"> </w:t>
       </w:r>
       <w:r>
-        <w:t xml:space="preserve">highlights a situation in which combined affinity and valency individually impart greater specificity, and optimal selectivity is achieved by combining these two strategies (Fig.</w:t>
+        <w:t xml:space="preserve">highlights a situation in which affinity imparts greater specificity, and optimal selectivity is achieved by combining these affinity and valency modulation (Fig.</w:t>
       </w:r>
       <w:r>
         <w:t xml:space="preserve"> </w:t>
@@ -10963,7 +10936,7 @@
         <w:pStyle w:val="BodyText"/>
       </w:pPr>
       <w:r>
-        <w:t xml:space="preserve">Each strategy’s contribution could be summarized by general patterns. We found that affinity changes were most effective when the target and off-target populations expressed distinct combinations of receptors (Fig.</w:t>
+        <w:t xml:space="preserve">Each strategy’s contribution can be summarized by general patterns. We found that affinity changes were most effective when the target and off-target populations expressed distinct combinations of receptors (Fig.</w:t>
       </w:r>
       <w:r>
         <w:t xml:space="preserve"> </w:t>
@@ -10977,7 +10950,7 @@
         </w:r>
       </w:hyperlink>
       <w:r>
-        <w:t xml:space="preserve">). Increasing the affinity of the receptors that are more abundantly expressed on the target cells, and decreasing those that are not, enhanced the binding selectivity, with greater differences in receptor patterns corresponding to greater benefits. When target and off-target populations had expressed an identical set of receptors, and only differed in receptor abundances, modulations in valency were effective (Fig.</w:t>
+        <w:t xml:space="preserve">). Increasing the affinity of the ligand for those receptors that are more abundantly expressed on the target cells, and decreasing its affinity for those that are not, enhanced the binding selectivity. Greater differences in receptor expression levels between on- and off-target popuilations corresponded to greater benefits to selectivity when modulating ligand affinties. When target and off-target populations had expressed an identical set of receptors, and only differed in receptor abundances, modulations in valency were effective, where changes to only affinity were not (Fig.</w:t>
       </w:r>
       <w:r>
         <w:t xml:space="preserve"> </w:t>
@@ -10991,7 +10964,7 @@
         </w:r>
       </w:hyperlink>
       <w:r>
-        <w:t xml:space="preserve">). The efficacy of valency changes was greatly dependent on the kinetics of the receptor-ligand interactions and the difference in receptor abundance as the secondary binding and unbinding rates were a key determinant of ligand binding behavior. Mixtures of therapeutic ligands were found to be mostly ineffective in imparting binding selectivity, but had modest benefits with multiple off-target populations (Fig.</w:t>
+        <w:t xml:space="preserve">). The efficacy of valency changes was greatly dependent on the kinetics of the receptor-ligand interactions and the difference in receptor abundance as the secondary binding and unbinding rates were a key determinant of ligand binding behavior. Mixtures of therapeutic ligands were found to be mostly ineffective in imparting binding selectivity, but had modest benefits when multiple off-target populations were considered (Fig.</w:t>
       </w:r>
       <w:r>
         <w:t xml:space="preserve"> </w:t>
@@ -11041,7 +11014,7 @@
         <w:pStyle w:val="BodyText"/>
       </w:pPr>
       <w:r>
-        <w:t xml:space="preserve">While the exploration of our multivalent binding model has elucidated strategies for selective targeting of many populations with respect to one or many off-target populations, several inter-population receptor expression relationships remain challenging to impart selectivity to. For example, target populations that unilaterally express fewer receptors of every type than off-target populations present a unique challenge for the design of a selective ligand. While we computationally show the potential for the simultaneous use of multivalent antagonistic ligands, which bind but do not induce a response, and monovalent agonists to exploit reduced receptor expression levels, the translation of such a therapeutic to a clinical application remains questionable. In cases where a target population expresses fewer receptors of any kind than an off-target population, our analysis suggests that other target receptors or therapeutic strategies should be considered. However, in cases where target populations express more of any type of receptor than an off-target population, we show that one or more of our formulated ligand engineering strategies can be employed to improve binding selectivity.</w:t>
+        <w:t xml:space="preserve">While the exploration of our multivalent binding model has elucidated strategies for selective targeting of many populations with respect to one or many off-target populations, several inter-population receptor expression relationships remain challenging to impart selective binding to. For example, target populations that unilaterally express fewer receptors of every type than off-target populations present a unique challenge for the design of a selective ligand. While we computationally show the potential for the simultaneous use of multivalent antagonistic ligands, which bind but do not induce a response, and monovalent agonists to exploit reduced receptor expression levels, the translation of such a therapeutic to a clinical application remains questionable. In cases where a target population expresses fewer receptors of any kind than an off-target population, our analysis suggests that other target receptors or therapeutic strategies should be considered. However, in cases where target populations express more of any type of receptor than an off-target population, we show that one or more of our formulated ligand engineering strategies can be employed to improve binding selectivity.</w:t>
       </w:r>
     </w:p>
     <w:p>
@@ -11132,7 +11105,7 @@
         <w:pStyle w:val="BodyText"/>
       </w:pPr>
       <w:r>
-        <w:t xml:space="preserve">Nonetheless, many optimization strategies described in this study have not been exploited in pharmaceutical practice yet, not because of the lack of consideration but due to the complexity of real biological contexts. First, some strategies are not practical biochemically. For example, the manipulation of ligand affinity requires intricate protein engineering. While the direction of affinity changes can be predicted, dictating the affinity is extremely difficult. Moreover, it is very likely altering the affinity of a ligand to a receptor of interest can change its affinity for other receptors, which may offset the intended benefit in improving selectivity. Potential dynamic changes in the receptor expression profile of a target population also complicate the matter. It is well documented that cancer cells can escape therapeutic targeting by upregulating</w:t>
+        <w:t xml:space="preserve">Nonetheless, many optimization strategies described in this study have not been exploited in pharmaceutical practice yet, not because of the lack of consideration but due to the complexity of real biological contexts. First, some strategies are not practical biochemically. For example, the manipulation of ligand affinity requires intricate protein engineering, and precise modulation is difficult to attain. Potential dynamic changes in the receptor expression profile of a target population also complicate the matter. It is well documented that cancer cells can escape therapeutic targeting by upregulating</w:t>
       </w:r>
       <w:hyperlink w:anchor="ref-3WVNxYBN">
         <w:r>
@@ -11177,7 +11150,7 @@
         <w:t xml:space="preserve"> </w:t>
       </w:r>
       <w:r>
-        <w:t xml:space="preserve">certain receptors. In this case, not only should the abundance of receptors be considered, but also their variance within a cell population over time. The effects of expression change on the efficacy of a therapeutic are not evident without a mechanism-based analysis. Furthermore, while we explore the efficacy of combining monovalent agonists with multivalent antagonists for targeting cells expressing relatively fewer receptors to off-target populations, the complexity of engineering the affinities of both ligands makes effective implementation of the strategy much more difficult in practice. While this work does not intend to solve every aspect of these issues, we propose that using a computational binding model can analyze these strategies quantitatively and collectively from a mechanistic perspective. Even when the absolute mathematical optimum cannot be achieved biochemically, our analyses provide good guidance to what is attainable and how to approach the optimum, accounting those biological complexities and facilitating the implementation of complicated combinations of several strategies.</w:t>
+        <w:t xml:space="preserve">the expression of certain receptors. In this case, not only should the abundance of receptors be considered, but also their variance within a cell population over time. While this work does not intend to solve every aspect of these issues, we propose that using a computational binding model can analyze these strategies quantitatively and collectively from a mechanistic perspective. Even when the absolute mathematical optimum cannot be achieved biochemically, our analyses provide good guidance to what is attainable and how to approach the optimum, accounting those biological complexities and facilitating the implementation of complicated combinations of several strategies.</w:t>
       </w:r>
     </w:p>
     <w:p>
@@ -11215,7 +11188,7 @@
         <w:t xml:space="preserve"> </w:t>
       </w:r>
       <w:r>
-        <w:t xml:space="preserve">These technologies bypass ligand-receptor binding considerations by manipulating the complexities of the immune system to attack cells expressing particular receptors. However, manipulations of the immune system inevitably lead to myriad unintended effects due to the complex regulatory mechanisms which control immune activation and activity. We have shown here that complex and targeted changes to the binding activity of simple therapeutic ligands can be achieved via relatively simple ligand characteristic manipulation. This study lays the framework for how protein engineering specifications can be defined using computational modeling. It should be noted that the application of this logic is reliant on knowledge of the target and off-target cell population receptor expression levels. Future application of the ligand binding logic described in this study could be guided using high throughputs single-cell profiling techniques, such as RNA-seq or high-parameter flow cytometry. A computational tool that could translate such data-sets into immediately applicable ligand design criteria may represent a potential avenue for the translation of our analyses into a more broadly applicable ligand engineering tool.</w:t>
+        <w:t xml:space="preserve">These technologies bypass ligand-receptor binding considerations by manipulating the complexities of the immune system to attack cells expressing particular receptors. However, manipulations of the immune system inevitably lead to myriad unintended effects due to the complex regulatory mechanisms which control immune activation and activity. We have shown here that complex and targeted changes to the binding activity of simple therapeutic ligands can be achieved via relatively simple ligand characteristic manipulation. This study lays the framework for how protein engineering specifications can be defined using computational modeling. It should be noted that the application of this logic is reliant on knowledge of the target and off-target cell population receptor expression levels. Future application of the ligand binding logic described in this study could be guided using high throughput single-cell profiling techniques, such as RNA-seq or high-parameter flow cytometry. A computational tool that could translate such data-sets into immediately applicable ligand design criteria may represent a potential avenue for the translation of our analyses into a more broadly applicable ligand engineering tool.</w:t>
       </w:r>
     </w:p>
     <w:p>

</xml_diff>

<commit_message>
Deploying to gh-pages from  @ b85b469712804295555f61b70782883a2992c848 🚀
</commit_message>
<xml_diff>
--- a/manuscript.docx
+++ b/manuscript.docx
@@ -78,7 +78,7 @@
         <w:t xml:space="preserve"> </w:t>
       </w:r>
       <w:r>
-        <w:t xml:space="preserve">was automatically generated on October 13, 2020.</w:t>
+        <w:t xml:space="preserve">was automatically generated on October 14, 2020.</w:t>
       </w:r>
       <w:r>
         <w:t xml:space="preserve"> </w:t>
@@ -382,7 +382,7 @@
         <w:pStyle w:val="FirstParagraph"/>
       </w:pPr>
       <w:r>
-        <w:t xml:space="preserve">Many drugs derive their therapeutic benefit and avoid toxicity through selective binding to specific cells within the body. Often, target cells can differ from off-target populations only by subtle changes in surface receptor expression, making selective activation of target cells difficult to achieve. Even with a drug of very specific molecular binding, genetic and non-genetic heterogeneity can create a wide distribution of cell responses. This can result in reduced effectiveness and toxicity. For example, in cancer, resistance to anti-tumor antibodies,</w:t>
+        <w:t xml:space="preserve">Many drugs derive their therapeutic benefit and avoid toxicity through selective binding to specific cells within the body. Often, target cells can differ from off-target populations only subtly in surface receptor expression, making selective activation of target cells difficult to achieve. Even with a drug of very specific molecular binding, genetic and non-genetic heterogeneity can create a wide distribution of cell responses. This can result in reduced effectiveness and toxicity. Specific cell targeting is a universal challenge in protein-based therapies. For example, in cancer, resistance to anti-tumor antibodies,</w:t>
       </w:r>
       <w:hyperlink w:anchor="ref-dr9JS306">
         <w:r>
@@ -457,7 +457,7 @@
         <w:t xml:space="preserve"> </w:t>
       </w:r>
       <w:r>
-        <w:t xml:space="preserve">all can arise through the selection of cells within a heterogeneous population. Indeed, the immune system takes advantage of heterogeneity at the single-cell level to translate noisy inflammatory signals into robust yet sensitive responses.</w:t>
+        <w:t xml:space="preserve">all can arise through the selection among heterogeneous cell populations. While the immune system takes advantage of heterogeneity at the single-cell level to translate noisy inflammatory signals into robust yet sensitive responses,</w:t>
       </w:r>
       <w:hyperlink w:anchor="ref-3qk2Wsrw">
         <w:r>
@@ -472,7 +472,7 @@
         <w:t xml:space="preserve"> </w:t>
       </w:r>
       <w:r>
-        <w:t xml:space="preserve">The intricacies of both inter-population receptor expression relationships, and intra-population receptor expression heterogeneity both represent signficiant challenges which limit the selectivity of therapies within the body.</w:t>
+        <w:t xml:space="preserve">this heterogeneity impedes our effort of creating a highly specific drug. The intricacies of both inter-population receptor expression difference and intra-population receptor expression heterogeneity present significant challenges that limit the selectivity of therapies within the body.</w:t>
       </w:r>
     </w:p>
     <w:p>
@@ -626,7 +626,7 @@
         <w:pStyle w:val="BodyText"/>
       </w:pPr>
       <w:r>
-        <w:t xml:space="preserve">Here we investigate cell-specific targeting quantitatively by extending a multi-valent, multi-ligand equilibrium binding model. Virtually any therapy, including monoclonal antibodies, small-molecule inhibitors, and cytokines, can be thought of as ligands for respective receptors expressed on target cells. Ligand binding to target cells is the first step and essential for a drug’s intended action; in contrast, binding to off-target cells can result in unintended effects or toxicity. Some cell populations can be distinguished by their expression of a unique receptor not expressed by other populations, but more commonly target and off-target cells express the same collection of receptors and differ only in their magnitudes of receptor expression. In such situations, engineering drugs optimized to bind tightly to target cells while minimizing the amount of drug bound to off-target cells is an area of ongoing research and has inspired myriad drug design strategies.</w:t>
+        <w:t xml:space="preserve">Here we investigate cell-specific targeting quantitatively by extending a multi-valent, multi-ligand equilibrium binding model. Virtually any therapy, including monoclonal antibodies, small-molecule inhibitors, and cytokines, can be thought of as ligands for respective receptors expressed on target cells. Ligand binding to target cells is the first step and essential for a drug’s intended action; in contrast, binding to off-target cells can result in unintended effects or toxicity. Some cell populations can be distinguished by their expression of a unique receptor not expressed by other populations, but more commonly target and off-target cells express the same collection of receptors and differ only in their magnitudes of receptor expression. In such situations, engineering drugs to optimize target cell binding while minimizing their off-target cells binding is an area of ongoing research and has inspired myriad drug design strategies.</w:t>
       </w:r>
       <w:hyperlink w:anchor="ref-10kZoPeON">
         <w:r>
@@ -664,7 +664,7 @@
         <w:pStyle w:val="BodyText"/>
       </w:pPr>
       <w:r>
-        <w:t xml:space="preserve">While ligand-receptor binding events in biology are diverse, they are governed by thermodynamic properties and the law of mass action. The binding between monomer ligands and receptors at equilibrium can be described by their association constant</w:t>
+        <w:t xml:space="preserve">While ligand-receptor binding events in biology are diverse, they are governed by thermodynamic properties and the law of mass action. For the binding between monomer ligands and receptors, their affinity can be described by the association constant</w:t>
       </w:r>
       <w:r>
         <w:t xml:space="preserve"> </w:t>
@@ -704,7 +704,7 @@
         </m:sSub>
       </m:oMath>
       <w:r>
-        <w:t xml:space="preserve">. These constants are indicative of the affinity with which the monomeric ligand binds a receptor. Binding behavior is more complicated when the ligands are multivalent complexes consisting of multiple units, each of which can bind to a receptor (Fig.</w:t>
+        <w:t xml:space="preserve">. Binding behavior is more complicated when the ligands are multivalent complexes consisting of multiple units, each of which can bind to a receptor (Fig.</w:t>
       </w:r>
       <w:r>
         <w:t xml:space="preserve"> </w:t>
@@ -890,7 +890,7 @@
         </w:r>
       </w:hyperlink>
       <w:r>
-        <w:t xml:space="preserve">c, cell populations at points 1 and 2 are on the same contour line and thus have the same amount of ligand bound; the cell populations at points 1 and 3 are separated by multiple contour lines, indicating that cells at point 3 bind more ligand (In fact, the ratio can be read as the exponent of the contour line difference. For point 3 to point 1, the ratio is</w:t>
+        <w:t xml:space="preserve">c, cell populations at points 1 and 2 are on the same contour line and thus have the same amount of ligand bound; the cell populations at points 1 and 3 are separated by multiple contour lines, indicating that cells at point 3 bind more ligands (In fact, the ratio can be read as the exponent of the contour line difference. For point 3 to point 1, the ratio is</w:t>
       </w:r>
       <w:r>
         <w:t xml:space="preserve"> </w:t>
@@ -2500,7 +2500,7 @@
         <w:pStyle w:val="BodyText"/>
       </w:pPr>
       <w:r>
-        <w:t xml:space="preserve">We first explored how altering the affinity with which a ligand binds receptors can be used as an engineering strategy to enhance its cell population specificity. Here, we showed the binding pattern of monovalent ligands with various affinities ranging from</w:t>
+        <w:t xml:space="preserve">We first explored altering the ligand binding affinity as an engineering strategy to enhance its cell population specificity. Here, we showed the binding pattern of monovalent ligands with various affinities ranging from</w:t>
       </w:r>
       <w:r>
         <w:t xml:space="preserve"> </w:t>
@@ -2902,7 +2902,7 @@
         <w:t xml:space="preserve"> </w:t>
       </w:r>
       <w:r>
-        <w:t xml:space="preserve">increases, binding is shown to vary more strongly according to</w:t>
+        <w:t xml:space="preserve">increases, which corresponds to shifting from subplots on the left to the ones on the right, binding is shown to vary more strongly according to</w:t>
       </w:r>
       <w:r>
         <w:t xml:space="preserve"> </w:t>
@@ -3103,7 +3103,7 @@
         <w:pStyle w:val="BodyText"/>
       </w:pPr>
       <w:r>
-        <w:t xml:space="preserve">However, situations where both on- and off-target cell populations express the same set of receptors and differ only subtly in their magnitude of expression are just as common. In these cases, we found out that it is beneficial for the drug to bind tightly to the most comparatively highly expressed receptor on the target population. Some examples of this pattern are the selective binding to</w:t>
+        <w:t xml:space="preserve">However, situations where both on- and off-target cell populations express the same set of receptors and differ only in their magnitude of expression are just as common. In these cases, we found out that it is beneficial for the drug to bind tightly to the most comparatively highly expressed receptor on the target population. Some examples of this pattern are the selective binding to</w:t>
       </w:r>
       <w:r>
         <w:t xml:space="preserve"> </w:t>
@@ -3653,7 +3653,7 @@
         </m:sSubSup>
       </m:oMath>
       <w:r>
-        <w:t xml:space="preserve">, affinity tuning fails to achieve selective binding (Fig.</w:t>
+        <w:t xml:space="preserve">, affinity tuning fails to modulate binding selectivity (Fig.</w:t>
       </w:r>
       <w:r>
         <w:t xml:space="preserve"> </w:t>
@@ -4365,7 +4365,7 @@
         <w:pStyle w:val="BodyText"/>
       </w:pPr>
       <w:r>
-        <w:t xml:space="preserve">Selectivity derived by changing valency requires coordinate changes in affinity. As is shown by our model, and as many previous studies have suggested, multi-valent ligands can demosntrate extremely selective binding to target populations expressing high abundances of receptors when receptor-ligand interactions occur with low affinity.</w:t>
+        <w:t xml:space="preserve">Selectivity derived by changing valency requires coordinate changes in affinity. As is shown by our model, and as many previous studies have suggested, multi-valent ligands can demonstrate particular selectivity to target populations with high receptor abundances when their subunits have low affinity to the receptors.</w:t>
       </w:r>
       <w:hyperlink w:anchor="ref-B0xrCfE3">
         <w:r>
@@ -4859,7 +4859,7 @@
         <w:pStyle w:val="BodyText"/>
       </w:pPr>
       <w:r>
-        <w:t xml:space="preserve">When a cell is bound by multivalent ligands, ligands will individually bind a variable amount of receptors, which we will refer to as the binding degree of the ligand. Our model allowed us to identify the mechanism of valency-mediated receptor abundance selectivity by examining the distribution of ligands bound at each degree to different cells. A cell expressing</w:t>
+        <w:t xml:space="preserve">In a binding reaction, a multivalent ligand may bind to any amount of receptors no higher than its valency, which we will refer to as its binding degree. Our model allowed us to identify the mechanism of valency-mediated receptor abundance selectivity by examining the distribution of ligands bound at each degree to different cells. A cell expressing</w:t>
       </w:r>
       <w:r>
         <w:t xml:space="preserve"> </w:t>
@@ -4958,7 +4958,7 @@
         </w:r>
       </w:hyperlink>
       <w:r>
-        <w:t xml:space="preserve">f). This effect arises due to the ligand’s rate of dissociation being larger than it’s multivalent binding association rate at low receptor abundances (Fig.</w:t>
+        <w:t xml:space="preserve">f). This effect arises due to the ligand’s rate of dissociation being larger than its multivalent binding association rate at low receptor abundances (Fig.</w:t>
       </w:r>
       <w:r>
         <w:t xml:space="preserve"> </w:t>
@@ -6353,13 +6353,10 @@
           </m:sub>
           <m:sup>
             <m:r>
-              <m:t>m</m:t>
-            </m:r>
-            <m:r>
-              <m:t>e</m:t>
-            </m:r>
-            <m:r>
-              <m:t>d</m:t>
+              <m:t>h</m:t>
+            </m:r>
+            <m:r>
+              <m:t>i</m:t>
             </m:r>
           </m:sup>
         </m:sSubSup>
@@ -6376,64 +6373,61 @@
           </m:sub>
           <m:sup>
             <m:r>
+              <m:t>l</m:t>
+            </m:r>
+            <m:r>
+              <m:t>o</m:t>
+            </m:r>
+          </m:sup>
+        </m:sSubSup>
+      </m:oMath>
+      <w:r>
+        <w:t xml:space="preserve"> </w:t>
+      </w:r>
+      <w:r>
+        <w:t xml:space="preserve">and</w:t>
+      </w:r>
+      <w:r>
+        <w:t xml:space="preserve"> </w:t>
+      </w:r>
+      <m:oMath>
+        <m:sSubSup>
+          <m:e>
+            <m:r>
+              <m:t>R</m:t>
+            </m:r>
+          </m:e>
+          <m:sub>
+            <m:r>
+              <m:t>1</m:t>
+            </m:r>
+          </m:sub>
+          <m:sup>
+            <m:r>
+              <m:t>l</m:t>
+            </m:r>
+            <m:r>
+              <m:t>o</m:t>
+            </m:r>
+          </m:sup>
+        </m:sSubSup>
+        <m:sSubSup>
+          <m:e>
+            <m:r>
+              <m:t>R</m:t>
+            </m:r>
+          </m:e>
+          <m:sub>
+            <m:r>
+              <m:t>2</m:t>
+            </m:r>
+          </m:sub>
+          <m:sup>
+            <m:r>
               <m:t>h</m:t>
             </m:r>
             <m:r>
               <m:t>i</m:t>
-            </m:r>
-          </m:sup>
-        </m:sSubSup>
-      </m:oMath>
-      <w:r>
-        <w:t xml:space="preserve"> </w:t>
-      </w:r>
-      <w:r>
-        <w:t xml:space="preserve">and</w:t>
-      </w:r>
-      <w:r>
-        <w:t xml:space="preserve"> </w:t>
-      </w:r>
-      <m:oMath>
-        <m:sSubSup>
-          <m:e>
-            <m:r>
-              <m:t>R</m:t>
-            </m:r>
-          </m:e>
-          <m:sub>
-            <m:r>
-              <m:t>1</m:t>
-            </m:r>
-          </m:sub>
-          <m:sup>
-            <m:r>
-              <m:t>h</m:t>
-            </m:r>
-            <m:r>
-              <m:t>i</m:t>
-            </m:r>
-          </m:sup>
-        </m:sSubSup>
-        <m:sSubSup>
-          <m:e>
-            <m:r>
-              <m:t>R</m:t>
-            </m:r>
-          </m:e>
-          <m:sub>
-            <m:r>
-              <m:t>2</m:t>
-            </m:r>
-          </m:sub>
-          <m:sup>
-            <m:r>
-              <m:t>m</m:t>
-            </m:r>
-            <m:r>
-              <m:t>e</m:t>
-            </m:r>
-            <m:r>
-              <m:t>d</m:t>
             </m:r>
           </m:sup>
         </m:sSubSup>
@@ -6907,6 +6901,162 @@
           </m:sub>
           <m:sup>
             <m:r>
+              <m:t>h</m:t>
+            </m:r>
+            <m:r>
+              <m:t>i</m:t>
+            </m:r>
+          </m:sup>
+        </m:sSubSup>
+        <m:sSubSup>
+          <m:e>
+            <m:r>
+              <m:t>R</m:t>
+            </m:r>
+          </m:e>
+          <m:sub>
+            <m:r>
+              <m:t>2</m:t>
+            </m:r>
+          </m:sub>
+          <m:sup>
+            <m:r>
+              <m:t>l</m:t>
+            </m:r>
+            <m:r>
+              <m:t>o</m:t>
+            </m:r>
+          </m:sup>
+        </m:sSubSup>
+      </m:oMath>
+      <w:r>
+        <w:t xml:space="preserve"> </w:t>
+      </w:r>
+      <w:r>
+        <w:t xml:space="preserve">and</w:t>
+      </w:r>
+      <w:r>
+        <w:t xml:space="preserve"> </w:t>
+      </w:r>
+      <m:oMath>
+        <m:sSubSup>
+          <m:e>
+            <m:r>
+              <m:t>R</m:t>
+            </m:r>
+          </m:e>
+          <m:sub>
+            <m:r>
+              <m:t>1</m:t>
+            </m:r>
+          </m:sub>
+          <m:sup>
+            <m:r>
+              <m:t>l</m:t>
+            </m:r>
+            <m:r>
+              <m:t>o</m:t>
+            </m:r>
+          </m:sup>
+        </m:sSubSup>
+        <m:sSubSup>
+          <m:e>
+            <m:r>
+              <m:t>R</m:t>
+            </m:r>
+          </m:e>
+          <m:sub>
+            <m:r>
+              <m:t>2</m:t>
+            </m:r>
+          </m:sub>
+          <m:sup>
+            <m:r>
+              <m:t>h</m:t>
+            </m:r>
+            <m:r>
+              <m:t>i</m:t>
+            </m:r>
+          </m:sup>
+        </m:sSubSup>
+      </m:oMath>
+      <w:r>
+        <w:t xml:space="preserve">, d)</w:t>
+      </w:r>
+      <w:r>
+        <w:t xml:space="preserve"> </w:t>
+      </w:r>
+      <m:oMath>
+        <m:sSubSup>
+          <m:e>
+            <m:r>
+              <m:t>R</m:t>
+            </m:r>
+          </m:e>
+          <m:sub>
+            <m:r>
+              <m:t>1</m:t>
+            </m:r>
+          </m:sub>
+          <m:sup>
+            <m:r>
+              <m:t>m</m:t>
+            </m:r>
+            <m:r>
+              <m:t>e</m:t>
+            </m:r>
+            <m:r>
+              <m:t>d</m:t>
+            </m:r>
+          </m:sup>
+        </m:sSubSup>
+        <m:sSubSup>
+          <m:e>
+            <m:r>
+              <m:t>R</m:t>
+            </m:r>
+          </m:e>
+          <m:sub>
+            <m:r>
+              <m:t>2</m:t>
+            </m:r>
+          </m:sub>
+          <m:sup>
+            <m:r>
+              <m:t>m</m:t>
+            </m:r>
+            <m:r>
+              <m:t>e</m:t>
+            </m:r>
+            <m:r>
+              <m:t>d</m:t>
+            </m:r>
+          </m:sup>
+        </m:sSubSup>
+      </m:oMath>
+      <w:r>
+        <w:t xml:space="preserve"> </w:t>
+      </w:r>
+      <w:r>
+        <w:t xml:space="preserve">to</w:t>
+      </w:r>
+      <w:r>
+        <w:t xml:space="preserve"> </w:t>
+      </w:r>
+      <m:oMath>
+        <m:sSubSup>
+          <m:e>
+            <m:r>
+              <m:t>R</m:t>
+            </m:r>
+          </m:e>
+          <m:sub>
+            <m:r>
+              <m:t>1</m:t>
+            </m:r>
+          </m:sub>
+          <m:sup>
+            <m:r>
               <m:t>m</m:t>
             </m:r>
             <m:r>
@@ -7347,6 +7497,162 @@
             </m:r>
             <m:r>
               <m:t>i</m:t>
+            </m:r>
+          </m:sup>
+        </m:sSubSup>
+      </m:oMath>
+      <w:r>
+        <w:t xml:space="preserve"> </w:t>
+      </w:r>
+      <w:r>
+        <w:t xml:space="preserve">to</w:t>
+      </w:r>
+      <w:r>
+        <w:t xml:space="preserve"> </w:t>
+      </w:r>
+      <m:oMath>
+        <m:sSubSup>
+          <m:e>
+            <m:r>
+              <m:t>R</m:t>
+            </m:r>
+          </m:e>
+          <m:sub>
+            <m:r>
+              <m:t>1</m:t>
+            </m:r>
+          </m:sub>
+          <m:sup>
+            <m:r>
+              <m:t>h</m:t>
+            </m:r>
+            <m:r>
+              <m:t>i</m:t>
+            </m:r>
+          </m:sup>
+        </m:sSubSup>
+        <m:sSubSup>
+          <m:e>
+            <m:r>
+              <m:t>R</m:t>
+            </m:r>
+          </m:e>
+          <m:sub>
+            <m:r>
+              <m:t>2</m:t>
+            </m:r>
+          </m:sub>
+          <m:sup>
+            <m:r>
+              <m:t>l</m:t>
+            </m:r>
+            <m:r>
+              <m:t>o</m:t>
+            </m:r>
+          </m:sup>
+        </m:sSubSup>
+      </m:oMath>
+      <w:r>
+        <w:t xml:space="preserve"> </w:t>
+      </w:r>
+      <w:r>
+        <w:t xml:space="preserve">and</w:t>
+      </w:r>
+      <w:r>
+        <w:t xml:space="preserve"> </w:t>
+      </w:r>
+      <m:oMath>
+        <m:sSubSup>
+          <m:e>
+            <m:r>
+              <m:t>R</m:t>
+            </m:r>
+          </m:e>
+          <m:sub>
+            <m:r>
+              <m:t>1</m:t>
+            </m:r>
+          </m:sub>
+          <m:sup>
+            <m:r>
+              <m:t>l</m:t>
+            </m:r>
+            <m:r>
+              <m:t>o</m:t>
+            </m:r>
+          </m:sup>
+        </m:sSubSup>
+        <m:sSubSup>
+          <m:e>
+            <m:r>
+              <m:t>R</m:t>
+            </m:r>
+          </m:e>
+          <m:sub>
+            <m:r>
+              <m:t>2</m:t>
+            </m:r>
+          </m:sub>
+          <m:sup>
+            <m:r>
+              <m:t>h</m:t>
+            </m:r>
+            <m:r>
+              <m:t>i</m:t>
+            </m:r>
+          </m:sup>
+        </m:sSubSup>
+      </m:oMath>
+      <w:r>
+        <w:t xml:space="preserve">, d)</w:t>
+      </w:r>
+      <w:r>
+        <w:t xml:space="preserve"> </w:t>
+      </w:r>
+      <m:oMath>
+        <m:sSubSup>
+          <m:e>
+            <m:r>
+              <m:t>R</m:t>
+            </m:r>
+          </m:e>
+          <m:sub>
+            <m:r>
+              <m:t>1</m:t>
+            </m:r>
+          </m:sub>
+          <m:sup>
+            <m:r>
+              <m:t>m</m:t>
+            </m:r>
+            <m:r>
+              <m:t>e</m:t>
+            </m:r>
+            <m:r>
+              <m:t>d</m:t>
+            </m:r>
+          </m:sup>
+        </m:sSubSup>
+        <m:sSubSup>
+          <m:e>
+            <m:r>
+              <m:t>R</m:t>
+            </m:r>
+          </m:e>
+          <m:sub>
+            <m:r>
+              <m:t>2</m:t>
+            </m:r>
+          </m:sub>
+          <m:sup>
+            <m:r>
+              <m:t>m</m:t>
+            </m:r>
+            <m:r>
+              <m:t>e</m:t>
+            </m:r>
+            <m:r>
+              <m:t>d</m:t>
             </m:r>
           </m:sup>
         </m:sSubSup>
@@ -7494,7 +7800,7 @@
         <w:t xml:space="preserve"> </w:t>
       </w:r>
       <w:r>
-        <w:t xml:space="preserve">However, the number of possible configurations of multispecific drugs is combinatorially large and impossible to enumerate. Here, we use the heterovalent bispecific ligand as an example to explore the unique benefit of multispecificity distinct from any strategy analyzed before. Here, we compare bispecificity with a 50%-50% mixture of two monovalent ligands, and a 50%-50% mixture of two different homogeneous bivalent ligands. These two strategies both have some similarities to bispecific therapeutics. A bispecific ligand contains two different ligand monomers with equal proportion, similar to a 50%-50% monovalent mixture. By comparing bispecific with a 50%-50% monovalent mixture, we can elucidate the extra benefit of tethering these two monomers into one complex. A bispecific ligand is also by nature bivalent, and by comparing it with homogeneous bivalent drugs, we can understand how having two different subunits in the same complex modify the behavior of a drug. Together, we sought to identify the potential unique advantages affored by heterovalent ligands.</w:t>
+        <w:t xml:space="preserve">However, the number of possible configurations of multispecific drugs is combinatorially large and impossible to enumerate. Here, we use the heterovalent bispecific ligand as an example to explore the unique benefit of multispecificity distinct from any strategy analyzed before. Here, we compare bispecificity with a 50%-50% mixture of two monovalent ligands, and a 50%-50% mixture of two different homogeneous bivalent ligands. These two strategies both have some similarities to bispecific therapeutics. A bispecific ligand contains two different ligand monomers with equal proportion, similar to a 50%-50% monovalent mixture. By comparing bispecific with a 50%-50% monovalent mixture, we can elucidate the extra benefit of tethering these two monomers into one complex. A bispecific ligand is also by nature bivalent, and by comparing it with homogeneous bivalent drugs, we can understand how having two different subunits in the same complex modify the behavior of a drug. Together, we sought to identify the unique advantages afforded by heterovalent ligands.</w:t>
       </w:r>
     </w:p>
     <w:p>
@@ -9062,7 +9368,7 @@
         <w:t xml:space="preserve"> </w:t>
       </w:r>
       <w:r>
-        <w:t xml:space="preserve">highlights a situation in which affinity imparts greater specificity, and optimal selectivity is achieved by combining these affinity and valency modulation (Fig.</w:t>
+        <w:t xml:space="preserve">highlights a situation in which affinity imparts greater specificity, and optimal selectivity is achieved by combining affinity and valency modulations (Fig.</w:t>
       </w:r>
       <w:r>
         <w:t xml:space="preserve"> </w:t>
@@ -10950,7 +11256,7 @@
         </w:r>
       </w:hyperlink>
       <w:r>
-        <w:t xml:space="preserve">). Increasing the affinity of the ligand for those receptors that are more abundantly expressed on the target cells, and decreasing its affinity for those that are not, enhanced the binding selectivity. Greater differences in receptor expression levels between on- and off-target popuilations corresponded to greater benefits to selectivity when modulating ligand affinties. When target and off-target populations had expressed an identical set of receptors, and only differed in receptor abundances, modulations in valency were effective, where changes to only affinity were not (Fig.</w:t>
+        <w:t xml:space="preserve">). Increasing the affinity of the ligand for those receptors that are more abundantly expressed on the target cells, and decreasing its affinity for those that are not enhanced the binding selectivity. Greater differences in receptor expression levels between on- and off-target populations corresponded to greater benefits to selectivity when modulating ligand affinties. When target and off-target populations had expressed an identical set of receptors and only differed in receptor abundances, modulations in valency were effective, where changes to only affinity were not (Fig.</w:t>
       </w:r>
       <w:r>
         <w:t xml:space="preserve"> </w:t>
@@ -10964,7 +11270,7 @@
         </w:r>
       </w:hyperlink>
       <w:r>
-        <w:t xml:space="preserve">). The efficacy of valency changes was greatly dependent on the kinetics of the receptor-ligand interactions and the difference in receptor abundance as the secondary binding and unbinding rates were a key determinant of ligand binding behavior. Mixtures of therapeutic ligands were found to be mostly ineffective in imparting binding selectivity, but had modest benefits when multiple off-target populations were considered (Fig.</w:t>
+        <w:t xml:space="preserve">). A key determinant of valency change efficacy was the secondary binding and unbinding rate which was greatly dependent on the kinetics of the receptor-ligand interactions and the difference in receptor abundance. Mixtures of therapeutic ligands were found to be mostly ineffective in imparting binding selectivity, and only had modest benefits when multiple off-target populations were considered (Fig.</w:t>
       </w:r>
       <w:r>
         <w:t xml:space="preserve"> </w:t>
@@ -11006,7 +11312,21 @@
         </w:r>
       </w:hyperlink>
       <w:r>
-        <w:t xml:space="preserve">). Finally, we found that combinations of monovalent therapeutic ligands with multivalent antagonistic ligands allowed improved selectivity for target populations expressing relatively fewer receptors to off-target populations.</w:t>
+        <w:t xml:space="preserve">). Finally, we found that combinations of monovalent therapeutic ligands with multivalent antagonistic ligands allowed improved selectivity for target populations expressing relatively fewer receptors to off-target populations (Fig.</w:t>
+      </w:r>
+      <w:r>
+        <w:t xml:space="preserve"> </w:t>
+      </w:r>
+      <w:hyperlink w:anchor="fig:deadLig">
+        <w:r>
+          <w:rPr>
+            <w:rStyle w:val="Hyperlink"/>
+          </w:rPr>
+          <w:t xml:space="preserve">7</w:t>
+        </w:r>
+      </w:hyperlink>
+      <w:r>
+        <w:t xml:space="preserve">).</w:t>
       </w:r>
     </w:p>
     <w:p>
@@ -11188,7 +11508,7 @@
         <w:t xml:space="preserve"> </w:t>
       </w:r>
       <w:r>
-        <w:t xml:space="preserve">These technologies bypass ligand-receptor binding considerations by manipulating the complexities of the immune system to attack cells expressing particular receptors. However, manipulations of the immune system inevitably lead to myriad unintended effects due to the complex regulatory mechanisms which control immune activation and activity. We have shown here that complex and targeted changes to the binding activity of simple therapeutic ligands can be achieved via relatively simple ligand characteristic manipulation. This study lays the framework for how protein engineering specifications can be defined using computational modeling. It should be noted that the application of this logic is reliant on knowledge of the target and off-target cell population receptor expression levels. Future application of the ligand binding logic described in this study could be guided using high throughput single-cell profiling techniques, such as RNA-seq or high-parameter flow cytometry. A computational tool that could translate such data-sets into immediately applicable ligand design criteria may represent a potential avenue for the translation of our analyses into a more broadly applicable ligand engineering tool.</w:t>
+        <w:t xml:space="preserve">These technologies bypass ligand-receptor binding considerations by manipulating the complexities of the immune system to attack cells expressing particular receptors. However, manipulations of the immune system inevitably lead to myriad unintended effects due to the complex regulatory mechanisms which control immune activation and activity. We have shown here that complex and targeted changes to the binding activity of simple therapeutic ligands can be achieved via relatively simple ligand characteristic manipulation. This study lays the framework for how protein engineering specifications can be defined using computational modeling. It should be noted that the application of this logic is reliant on knowledge of the target and off-target cell population receptor expression levels. Future application of the ligand binding logic described in this study could be guided using high-throughput single-cell profiling techniques, such as RNA-seq or high-parameter flow cytometry. A computational tool that could translate such data-sets into immediately applicable ligand design criteria may represent a potential avenue for the translation of our analyses into a more broadly applicable ligand engineering tool.</w:t>
       </w:r>
     </w:p>
     <w:p>

</xml_diff>

<commit_message>
Deploying to gh-pages from  @ cb389ea21ff76b2fab36238d85d0b16ca6836c41 🚀
</commit_message>
<xml_diff>
--- a/manuscript.docx
+++ b/manuscript.docx
@@ -9447,7 +9447,7 @@
         </w:r>
       </w:hyperlink>
       <w:r>
-        <w:t xml:space="preserve">g-l). While affinity, valency, and mixture engineering are able to impart some small contributions to enhanced selectivity, significant improvement is only achieved when combining them all. Here, synergistic combination of strategies can be employed to great effect, granting far superior ligand selectivity. A more difficult design problem is featured in the optimization of</w:t>
+        <w:t xml:space="preserve">g-l). While affinity engineering is unable to impart some small contributions to enhanced selectivity, significant improvement is only achieved when utilizing valency modulation techniques. A more difficult design problem is featured in the optimization of</w:t>
       </w:r>
       <w:r>
         <w:t xml:space="preserve"> </w:t>
@@ -9518,7 +9518,7 @@
         </w:r>
       </w:hyperlink>
       <w:r>
-        <w:t xml:space="preserve">m-r). Since it lies in the midst of the other populations in receptor expression space , any modulation of affinity, valency or combining it with mixture-based strategies seems ineffective.</w:t>
+        <w:t xml:space="preserve">m-r). Since it lies in the midst of the other populations in receptor expression space, any modulation of affinity, valency or combining it with mixture-based strategies seems ineffective. It should be noted that in all described cases, engineering the composition of a mixture of ligands is generaly ineffective for imparting selectivity when the ligand’s design specifications are flexible, and is likely only efficacious when using ligands with static properties and considering multiple off-target populations.</w:t>
       </w:r>
     </w:p>
     <w:p>

</xml_diff>

<commit_message>
Deploying to gh-pages from  @ 8730e799a9752e1f1d099d06c32fdca988c033ce 🚀
</commit_message>
<xml_diff>
--- a/manuscript.docx
+++ b/manuscript.docx
@@ -480,7 +480,7 @@
         <w:pStyle w:val="BodyText"/>
       </w:pPr>
       <w:r>
-        <w:t xml:space="preserve">Further improving cell-specific targeting will require new strategies of engineering specificity. Protein therapies have most extensively been engineered to target specific cell types through mutations that provide high-affinity binding to unique surface antigens.</w:t>
+        <w:t xml:space="preserve">Further improving cell-specific targeting will require new strategies of engineering specificity. Non-cellular therapies such as protein therapies have most extensively been engineered to target specific cell types through mutations that provide high-affinity binding to unique surface antigens.</w:t>
       </w:r>
       <w:hyperlink w:anchor="ref-pF89Nm4u">
         <w:r>
@@ -525,7 +525,7 @@
         <w:t xml:space="preserve"> </w:t>
       </w:r>
       <w:r>
-        <w:t xml:space="preserve">However, protein and other non-cellular therapies have considerable benefits in drug access, manufacturing, and reliability; some of the same benefits have begun to be engineered into these agents.</w:t>
+        <w:t xml:space="preserve">However, non-cellular therapies have considerable benefits in drug access, manufacturing, and reliability; some of the same benefits have begun to be engineered into these agents.</w:t>
       </w:r>
     </w:p>
     <w:p>
@@ -8122,6 +8122,31 @@
         </m:sSubSup>
       </m:oMath>
       <w:r>
+        <w:t xml:space="preserve">. It describes how easily a multivalent ligand bound to a cell monovalently can attain secondary binding. Typically in biochemistry, when there is less steric hindrance among the subunits of a multivalent drug molecule (e.g. longer tether and smaller subunit size), or when there is local receptor clustering on the target cell, secondary binding will be easier to achieve, corresponding to larger</w:t>
+      </w:r>
+      <w:r>
+        <w:t xml:space="preserve"> </w:t>
+      </w:r>
+      <m:oMath>
+        <m:sSubSup>
+          <m:e>
+            <m:r>
+              <m:t>K</m:t>
+            </m:r>
+          </m:e>
+          <m:sub>
+            <m:r>
+              <m:t>x</m:t>
+            </m:r>
+          </m:sub>
+          <m:sup>
+            <m:r>
+              <m:t>*</m:t>
+            </m:r>
+          </m:sup>
+        </m:sSubSup>
+      </m:oMath>
+      <w:r>
         <w:t xml:space="preserve">. We plotted the pattern of bispecific fully bound with</w:t>
       </w:r>
       <w:r>
@@ -8253,7 +8278,7 @@
         <w:t xml:space="preserve"> </w:t>
       </w:r>
       <w:r>
-        <w:t xml:space="preserve">is larger, the ligands are more capable of multimerization, and there will be more fully bound units. To demonstrate how this characteristic of fully bound bispecific ligand imparts cell population specificity, we plotted the ratios of selectivities between some cell population pairs under bispecific versus another drugs given a range of</w:t>
+        <w:t xml:space="preserve">is larger, the ligands are more capable of multimerization, and there will be more fully bound units. To demonstrate how this characteristic of fully bound bispecific ligand imparts cell population specificity, we compared the selectivities between some chosen target-to-off-target cell population pairs under bispecific drugs versus another drugs given a range of</w:t>
       </w:r>
       <w:r>
         <w:t xml:space="preserve"> </w:t>
@@ -8295,7 +8320,7 @@
         </w:r>
       </w:hyperlink>
       <w:r>
-        <w:t xml:space="preserve">g,h). These plotted numbers are ratios of ligand (fully) bound ratios between two cell populations, so when they are larger, it implies that fully bound bispecific ligand has more advantages than its counterpart to impart selective binding between these two cell populations. Figure</w:t>
+        <w:t xml:space="preserve">g,h). These plotted numbers are the selectivities imparted by a bispecific drug divided by the selectivities from a drug mixture of either monovalent (Fig.</w:t>
       </w:r>
       <w:r>
         <w:t xml:space="preserve"> </w:t>
@@ -8309,63 +8334,7 @@
         </w:r>
       </w:hyperlink>
       <w:r>
-        <w:t xml:space="preserve">g compares the selectivities under bispecific ligands versus a 50%-50% mixture of monovalent ligands. The results show that fully bound bispecific can grant better selective binding when</w:t>
-      </w:r>
-      <w:r>
-        <w:t xml:space="preserve"> </w:t>
-      </w:r>
-      <m:oMath>
-        <m:sSubSup>
-          <m:e>
-            <m:r>
-              <m:t>K</m:t>
-            </m:r>
-          </m:e>
-          <m:sub>
-            <m:r>
-              <m:t>x</m:t>
-            </m:r>
-          </m:sub>
-          <m:sup>
-            <m:r>
-              <m:t>*</m:t>
-            </m:r>
-          </m:sup>
-        </m:sSubSup>
-      </m:oMath>
-      <w:r>
-        <w:t xml:space="preserve"> </w:t>
-      </w:r>
-      <w:r>
-        <w:t xml:space="preserve">is small enough. This logical, since when</w:t>
-      </w:r>
-      <w:r>
-        <w:t xml:space="preserve"> </w:t>
-      </w:r>
-      <m:oMath>
-        <m:sSubSup>
-          <m:e>
-            <m:r>
-              <m:t>K</m:t>
-            </m:r>
-          </m:e>
-          <m:sub>
-            <m:r>
-              <m:t>x</m:t>
-            </m:r>
-          </m:sub>
-          <m:sup>
-            <m:r>
-              <m:t>*</m:t>
-            </m:r>
-          </m:sup>
-        </m:sSubSup>
-      </m:oMath>
-      <w:r>
-        <w:t xml:space="preserve"> </w:t>
-      </w:r>
-      <w:r>
-        <w:t xml:space="preserve">is small and crosslinking is rarer, most ligands will bind monovalently, and fully bound bispecific will especially favor the cell populations with higher receptor expression. However, when we compare fully bound bispecific to fully bound homogeneous bivalent mixtures (Fig.</w:t>
+        <w:t xml:space="preserve">g) or homogeneous bivalent (Fig.</w:t>
       </w:r>
       <w:r>
         <w:t xml:space="preserve"> </w:t>
@@ -8379,115 +8348,7 @@
         </w:r>
       </w:hyperlink>
       <w:r>
-        <w:t xml:space="preserve">h), the advantage of bispecific drugs is not obvious except for</w:t>
-      </w:r>
-      <w:r>
-        <w:t xml:space="preserve"> </w:t>
-      </w:r>
-      <m:oMath>
-        <m:sSubSup>
-          <m:e>
-            <m:r>
-              <m:t>R</m:t>
-            </m:r>
-          </m:e>
-          <m:sub>
-            <m:r>
-              <m:t>1</m:t>
-            </m:r>
-          </m:sub>
-          <m:sup>
-            <m:r>
-              <m:t>m</m:t>
-            </m:r>
-            <m:r>
-              <m:t>e</m:t>
-            </m:r>
-            <m:r>
-              <m:t>d</m:t>
-            </m:r>
-          </m:sup>
-        </m:sSubSup>
-        <m:sSubSup>
-          <m:e>
-            <m:r>
-              <m:t>R</m:t>
-            </m:r>
-          </m:e>
-          <m:sub>
-            <m:r>
-              <m:t>2</m:t>
-            </m:r>
-          </m:sub>
-          <m:sup>
-            <m:r>
-              <m:t>h</m:t>
-            </m:r>
-            <m:r>
-              <m:t>i</m:t>
-            </m:r>
-          </m:sup>
-        </m:sSubSup>
-      </m:oMath>
-      <w:r>
-        <w:t xml:space="preserve"> </w:t>
-      </w:r>
-      <w:r>
-        <w:t xml:space="preserve">to</w:t>
-      </w:r>
-      <w:r>
-        <w:t xml:space="preserve"> </w:t>
-      </w:r>
-      <m:oMath>
-        <m:sSubSup>
-          <m:e>
-            <m:r>
-              <m:t>R</m:t>
-            </m:r>
-          </m:e>
-          <m:sub>
-            <m:r>
-              <m:t>1</m:t>
-            </m:r>
-          </m:sub>
-          <m:sup>
-            <m:r>
-              <m:t>h</m:t>
-            </m:r>
-            <m:r>
-              <m:t>i</m:t>
-            </m:r>
-          </m:sup>
-        </m:sSubSup>
-        <m:sSubSup>
-          <m:e>
-            <m:r>
-              <m:t>R</m:t>
-            </m:r>
-          </m:e>
-          <m:sub>
-            <m:r>
-              <m:t>2</m:t>
-            </m:r>
-          </m:sub>
-          <m:sup>
-            <m:r>
-              <m:t>m</m:t>
-            </m:r>
-            <m:r>
-              <m:t>e</m:t>
-            </m:r>
-            <m:r>
-              <m:t>d</m:t>
-            </m:r>
-          </m:sup>
-        </m:sSubSup>
-      </m:oMath>
-      <w:r>
-        <w:t xml:space="preserve"> </w:t>
-      </w:r>
-      <w:r>
-        <w:t xml:space="preserve">selectivity. Given that both therapeutics in comparison only account for fully bound ligands, the effect demonstrated in Figure</w:t>
+        <w:t xml:space="preserve">h). When these quotients are larger, it implies that fully bound bispecific ligand has much larger more advantages than its counterpart to impart selective binding for the chosen target cell populations. Figure</w:t>
       </w:r>
       <w:r>
         <w:t xml:space="preserve"> </w:t>
@@ -8501,6 +8362,198 @@
         </w:r>
       </w:hyperlink>
       <w:r>
+        <w:t xml:space="preserve">g compares the selectivities under bispecific ligands versus a 50%-50% mixture of monovalent ligands. The results show that fully bound bispecific can grant better selective binding when</w:t>
+      </w:r>
+      <w:r>
+        <w:t xml:space="preserve"> </w:t>
+      </w:r>
+      <m:oMath>
+        <m:sSubSup>
+          <m:e>
+            <m:r>
+              <m:t>K</m:t>
+            </m:r>
+          </m:e>
+          <m:sub>
+            <m:r>
+              <m:t>x</m:t>
+            </m:r>
+          </m:sub>
+          <m:sup>
+            <m:r>
+              <m:t>*</m:t>
+            </m:r>
+          </m:sup>
+        </m:sSubSup>
+      </m:oMath>
+      <w:r>
+        <w:t xml:space="preserve"> </w:t>
+      </w:r>
+      <w:r>
+        <w:t xml:space="preserve">is small enough. This logical, since when</w:t>
+      </w:r>
+      <w:r>
+        <w:t xml:space="preserve"> </w:t>
+      </w:r>
+      <m:oMath>
+        <m:sSubSup>
+          <m:e>
+            <m:r>
+              <m:t>K</m:t>
+            </m:r>
+          </m:e>
+          <m:sub>
+            <m:r>
+              <m:t>x</m:t>
+            </m:r>
+          </m:sub>
+          <m:sup>
+            <m:r>
+              <m:t>*</m:t>
+            </m:r>
+          </m:sup>
+        </m:sSubSup>
+      </m:oMath>
+      <w:r>
+        <w:t xml:space="preserve"> </w:t>
+      </w:r>
+      <w:r>
+        <w:t xml:space="preserve">is small and crosslinking is rarer, most ligands will bind monovalently, and fully bound bispecific will especially favor the cell populations with higher receptor expression. However, when we compare fully bound bispecific to fully bound homogeneous bivalent mixtures (Fig.</w:t>
+      </w:r>
+      <w:r>
+        <w:t xml:space="preserve"> </w:t>
+      </w:r>
+      <w:hyperlink w:anchor="fig:bispecific">
+        <w:r>
+          <w:rPr>
+            <w:rStyle w:val="Hyperlink"/>
+          </w:rPr>
+          <w:t xml:space="preserve">5</w:t>
+        </w:r>
+      </w:hyperlink>
+      <w:r>
+        <w:t xml:space="preserve">h), the advantage of bispecific drugs is not obvious except for</w:t>
+      </w:r>
+      <w:r>
+        <w:t xml:space="preserve"> </w:t>
+      </w:r>
+      <m:oMath>
+        <m:sSubSup>
+          <m:e>
+            <m:r>
+              <m:t>R</m:t>
+            </m:r>
+          </m:e>
+          <m:sub>
+            <m:r>
+              <m:t>1</m:t>
+            </m:r>
+          </m:sub>
+          <m:sup>
+            <m:r>
+              <m:t>m</m:t>
+            </m:r>
+            <m:r>
+              <m:t>e</m:t>
+            </m:r>
+            <m:r>
+              <m:t>d</m:t>
+            </m:r>
+          </m:sup>
+        </m:sSubSup>
+        <m:sSubSup>
+          <m:e>
+            <m:r>
+              <m:t>R</m:t>
+            </m:r>
+          </m:e>
+          <m:sub>
+            <m:r>
+              <m:t>2</m:t>
+            </m:r>
+          </m:sub>
+          <m:sup>
+            <m:r>
+              <m:t>h</m:t>
+            </m:r>
+            <m:r>
+              <m:t>i</m:t>
+            </m:r>
+          </m:sup>
+        </m:sSubSup>
+      </m:oMath>
+      <w:r>
+        <w:t xml:space="preserve"> </w:t>
+      </w:r>
+      <w:r>
+        <w:t xml:space="preserve">to</w:t>
+      </w:r>
+      <w:r>
+        <w:t xml:space="preserve"> </w:t>
+      </w:r>
+      <m:oMath>
+        <m:sSubSup>
+          <m:e>
+            <m:r>
+              <m:t>R</m:t>
+            </m:r>
+          </m:e>
+          <m:sub>
+            <m:r>
+              <m:t>1</m:t>
+            </m:r>
+          </m:sub>
+          <m:sup>
+            <m:r>
+              <m:t>h</m:t>
+            </m:r>
+            <m:r>
+              <m:t>i</m:t>
+            </m:r>
+          </m:sup>
+        </m:sSubSup>
+        <m:sSubSup>
+          <m:e>
+            <m:r>
+              <m:t>R</m:t>
+            </m:r>
+          </m:e>
+          <m:sub>
+            <m:r>
+              <m:t>2</m:t>
+            </m:r>
+          </m:sub>
+          <m:sup>
+            <m:r>
+              <m:t>m</m:t>
+            </m:r>
+            <m:r>
+              <m:t>e</m:t>
+            </m:r>
+            <m:r>
+              <m:t>d</m:t>
+            </m:r>
+          </m:sup>
+        </m:sSubSup>
+      </m:oMath>
+      <w:r>
+        <w:t xml:space="preserve"> </w:t>
+      </w:r>
+      <w:r>
+        <w:t xml:space="preserve">selectivity. Given that both therapeutics in comparison only account for fully bound ligands, the effect demonstrated in Figure</w:t>
+      </w:r>
+      <w:r>
+        <w:t xml:space="preserve"> </w:t>
+      </w:r>
+      <w:hyperlink w:anchor="fig:bispecific">
+        <w:r>
+          <w:rPr>
+            <w:rStyle w:val="Hyperlink"/>
+          </w:rPr>
+          <w:t xml:space="preserve">5</w:t>
+        </w:r>
+      </w:hyperlink>
+      <w:r>
         <w:t xml:space="preserve">g no longer holds. Together, we showed that bispecific ligands only exhibit unique advantages in inducing selective binding when they can only be effective when both of their subunits bind and crosslinking is more difficult.</w:t>
       </w:r>
     </w:p>
@@ -8849,22 +8902,7 @@
         </m:sSup>
       </m:oMath>
       <w:r>
-        <w:t xml:space="preserve">. g,h) The ratios of selectivities, thus</w:t>
-      </w:r>
-      <w:r>
-        <w:t xml:space="preserve"> </w:t>
-      </w:r>
-      <w:r>
-        <w:t xml:space="preserve">“</w:t>
-      </w:r>
-      <w:r>
-        <w:t xml:space="preserve">the ratios of binding ratios</w:t>
-      </w:r>
-      <w:r>
-        <w:t xml:space="preserve">”</w:t>
-      </w:r>
-      <w:r>
-        <w:t xml:space="preserve">, varies with</w:t>
+        <w:t xml:space="preserve">. g,h) Comparing bispecific selectivities with mixture selectivities, varies with</w:t>
       </w:r>
       <w:r>
         <w:t xml:space="preserve"> </w:t>
@@ -8889,7 +8927,7 @@
         </m:sSubSup>
       </m:oMath>
       <w:r>
-        <w:t xml:space="preserve">. g) bispecific versus monovalent 50%-50% mixture, h) bispecific versus a 50%-50% homo-bivalent mixture.</w:t>
+        <w:t xml:space="preserve">, the crosslinking constant. When the ratios are larger, bispecific ligands bind to target populations more specifically. g) bispecific selectivities divided by monovalent 50%-50% mixture selectivities, h) bispecific selectivities divided by a 50%-50% homo-bivalent mixture selectivities.</w:t>
       </w:r>
       <w:bookmarkEnd w:id="41"/>
     </w:p>
@@ -9236,22 +9274,7 @@
         </m:sSup>
       </m:oMath>
       <w:r>
-        <w:t xml:space="preserve">. g,h) The ratios of selectivities, thus</w:t>
-      </w:r>
-      <w:r>
-        <w:t xml:space="preserve"> </w:t>
-      </w:r>
-      <w:r>
-        <w:t xml:space="preserve">“</w:t>
-      </w:r>
-      <w:r>
-        <w:t xml:space="preserve">the ratios of binding ratios</w:t>
-      </w:r>
-      <w:r>
-        <w:t xml:space="preserve">”</w:t>
-      </w:r>
-      <w:r>
-        <w:t xml:space="preserve">, varies with</w:t>
+        <w:t xml:space="preserve">. g,h) Comparing bispecific selectivities with mixture selectivities, varies with</w:t>
       </w:r>
       <w:r>
         <w:t xml:space="preserve"> </w:t>
@@ -9276,7 +9299,7 @@
         </m:sSubSup>
       </m:oMath>
       <w:r>
-        <w:t xml:space="preserve">. g) bispecific versus monovalent 50%-50% mixture, h) bispecific versus a 50%-50% homo-bivalent mixture.</w:t>
+        <w:t xml:space="preserve">, the crosslinking constant. When the ratios are larger, bispecific ligands bind to target populations more specifically. g) bispecific selectivities divided by monovalent 50%-50% mixture selectivities, h) bispecific selectivities divided by a 50%-50% homo-bivalent mixture selectivities.</w:t>
       </w:r>
     </w:p>
     <w:bookmarkEnd w:id="0"/>

</xml_diff>

<commit_message>
Deploying to gh-pages from  @ 434ad63badf022792d0d9d660f91209631825d01 🚀
</commit_message>
<xml_diff>
--- a/manuscript.docx
+++ b/manuscript.docx
@@ -78,7 +78,7 @@
         <w:t xml:space="preserve"> </w:t>
       </w:r>
       <w:r>
-        <w:t xml:space="preserve">was automatically generated on October 19, 2020.</w:t>
+        <w:t xml:space="preserve">was automatically generated on October 20, 2020.</w:t>
       </w:r>
       <w:r>
         <w:t xml:space="preserve"> </w:t>
@@ -11279,7 +11279,7 @@
         </w:r>
       </w:hyperlink>
       <w:r>
-        <w:t xml:space="preserve">). Increasing the affinity of the ligand for those receptors that are more abundantly expressed on the target cells, and decreasing its affinity for those that are not enhanced the binding selectivity. Greater differences in receptor expression levels between on- and off-target populations corresponded to greater benefits to selectivity when modulating ligand affinties. When target and off-target populations had expressed an identical set of receptors and only differed in receptor abundances, modulations in valency were effective, where changes to only affinity were not (Fig.</w:t>
+        <w:t xml:space="preserve">). Binding selectivity was enhanced by increasing the affinity of the ligand for those receptors that are more abundantly expressed on the target cells and decreasing its affinity for those that are not. Selectivity depended upon large differences in receptor expression levels between on- and off-target populations. When target and off-target populations expressed the same pattern of receptors and only differed in receptor abundances, modulations in valency, but not affinity, were effective (Fig.</w:t>
       </w:r>
       <w:r>
         <w:t xml:space="preserve"> </w:t>
@@ -11293,7 +11293,7 @@
         </w:r>
       </w:hyperlink>
       <w:r>
-        <w:t xml:space="preserve">). A key determinant of valency change efficacy was the secondary binding and unbinding rate which was greatly dependent on the kinetics of the receptor-ligand interactions and the difference in receptor abundance. Mixtures of therapeutic ligands were found to be mostly ineffective in imparting binding selectivity, and only had modest benefits when multiple off-target populations were considered (Fig.</w:t>
+        <w:t xml:space="preserve">). A key determinant of valency’s effectiveness was the secondary binding and unbinding rate which is dependent on both the kinetics of the receptor-ligand interaction and receptor abundance. Ligand mixtures were mostly ineffective for imparting binding selectivity, and only had modest benefits when considering three or more off-target populations (Fig.</w:t>
       </w:r>
       <w:r>
         <w:t xml:space="preserve"> </w:t>
@@ -11321,7 +11321,7 @@
         </w:r>
       </w:hyperlink>
       <w:r>
-        <w:t xml:space="preserve">). They prefer target populations that have high expression of both receptors over those with high expression of only a single receptor, with the preference for secondary binding as the key determinant for the magnitude of advancement. We found that, while a single ligand engineering strategy dominated in its contributions to cell type selectivity, synergies between these strategies existed in some cases to derive even greater specificity (Fig.</w:t>
+        <w:t xml:space="preserve">). They prefer target populations that have high expression of both receptors over those with high expression of only a single receptor, with the preference for secondary binding as the key determinant for selectivity. We found that, while a single ligand engineering strategy dominated in its contributions to cell type selectivity, synergies between these strategies existed in some cases to derive even greater specificity (Fig.</w:t>
       </w:r>
       <w:r>
         <w:t xml:space="preserve"> </w:t>
@@ -11335,7 +11335,7 @@
         </w:r>
       </w:hyperlink>
       <w:r>
-        <w:t xml:space="preserve">). Finally, we found that combinations of monovalent therapeutic ligands with multivalent antagonistic ligands allowed improved selectivity for target populations expressing relatively fewer receptors to off-target populations (Fig.</w:t>
+        <w:t xml:space="preserve">). Finally, we found that combinations of monovalent therapeutic ligands with multivalent antagonistic ligands allow for selection of target populations based on their lack of receptor expression (Fig.</w:t>
       </w:r>
       <w:r>
         <w:t xml:space="preserve"> </w:t>
@@ -11357,7 +11357,7 @@
         <w:pStyle w:val="BodyText"/>
       </w:pPr>
       <w:r>
-        <w:t xml:space="preserve">While the exploration of our multivalent binding model has elucidated strategies for selective targeting of many populations with respect to one or many off-target populations, several inter-population receptor expression relationships remain challenging to impart selective binding to. For example, target populations that unilaterally express fewer receptors of every type than off-target populations present a unique challenge for the design of a selective ligand. While we computationally show the potential for the simultaneous use of multivalent antagonistic ligands, which bind but do not induce a response, and monovalent agonists to exploit reduced receptor expression levels, the translation of such a therapeutic to a clinical application remains questionable. In cases where a target population expresses fewer receptors of any kind than an off-target population, our analysis suggests that other target receptors or therapeutic strategies should be considered. However, in cases where target populations express more of any type of receptor than an off-target population, we show that one or more of our formulated ligand engineering strategies can be employed to improve binding selectivity.</w:t>
+        <w:t xml:space="preserve">While our multivalent binding model identified strategies for selective targeting in many cases, it also identified situations for which selective binding is challenging. For example, selectively targeting populations based on their absence of receptor expression remains challenging. While we computationally show the potential of using multivalent antagonists with monovalent agonists, implementing this may be challenging. In cases where a target population expresses fewer receptors of any kind than an off-target population, our analysis suggests that targeting other receptors should be considered. However, in cases where target populations express more of any type of receptor than an off-target population, we show that one or more of our formulated ligand engineering strategies can be employed to improve binding selectivity. While we expect the same patterns to apply with greater than two receptors, certain emergent behaviors may exist with tri-specific and more complex ligand binding.</w:t>
       </w:r>
     </w:p>
     <w:p>
@@ -11365,7 +11365,7 @@
         <w:pStyle w:val="BodyText"/>
       </w:pPr>
       <w:r>
-        <w:t xml:space="preserve">A number of strategies are already utilized in existing engineered therapies. For example, affinity changes in the cytokine IL-2 have been used to bias its effects towards either effector or regulatory immune populations.</w:t>
+        <w:t xml:space="preserve">A few of strategies we explored are already utilized in existing engineered therapies. For example, affinity changes to the cytokine IL-2 have been used to bias its effects towards either effector or regulatory immune populations.</w:t>
       </w:r>
       <w:hyperlink w:anchor="ref-FqWAsZ7z">
         <w:r>
@@ -11395,7 +11395,7 @@
         <w:t xml:space="preserve"> </w:t>
       </w:r>
       <w:r>
-        <w:t xml:space="preserve">Varying the valency of tumor-targeted antibodies leads to targeted cell clearance based upon the levels of expressed antigen.</w:t>
+        <w:t xml:space="preserve">Varying the valency of tumor-targeted antibodies leads to selective cell clearance based upon the levels of expressed antigen.</w:t>
       </w:r>
       <w:hyperlink w:anchor="ref-IanZRiFA">
         <w:r>
@@ -11410,7 +11410,7 @@
         <w:t xml:space="preserve"> </w:t>
       </w:r>
       <w:r>
-        <w:t xml:space="preserve">Manipulation of the affinities of fibronectin domains displayed by octovalent nanorings was shown to enhance the selectivity of binding to cancerous cells displaying relatively higher densities of fibronectin receptors compared to native tissue.</w:t>
+        <w:t xml:space="preserve">Manipulating of the affinities of the fibronectin domains on octovalent nanorings was shown to enhance the selectivity of binding to cancerous cells displaying relatively higher densities of fibronectin receptors compared to native tissue.</w:t>
       </w:r>
       <w:hyperlink w:anchor="ref-u2Cb0DBq">
         <w:r>
@@ -11425,7 +11425,7 @@
         <w:t xml:space="preserve"> </w:t>
       </w:r>
       <w:r>
-        <w:t xml:space="preserve">The advantages offered by therapeutics reliant on low-affinity, multivalent interactions to selectively bind cells with high receptor expression densities were also described in a study considering a therapeutic reliant on multivalent interactions between antibodies and therapeutic bound to receptors most prevalently expressed on tumor cells.</w:t>
+        <w:t xml:space="preserve">The tendency of low-affinity, multivalent interactions to target cells expressing high receptor abundances was also described in a study describing the selectivity of multivalent antibody binding to tumor cells bound by a bispecific therapeutic ligand.</w:t>
       </w:r>
       <w:hyperlink w:anchor="ref-B0xrCfE3">
         <w:r>
@@ -11440,7 +11440,7 @@
         <w:t xml:space="preserve"> </w:t>
       </w:r>
       <w:r>
-        <w:t xml:space="preserve">These examples lend support to the accuracy of our model. At the same time, recognizing the previously described ligand engineering approaches as separable strategies provides clearer guidance for future engineering.</w:t>
+        <w:t xml:space="preserve">These examples lend support to the accuracy of our model. At the same time, recognizing these previously described ligand engineering approaches as separable strategies provides clearer guidance for future engineering.</w:t>
       </w:r>
     </w:p>
     <w:p>
@@ -11448,7 +11448,7 @@
         <w:pStyle w:val="BodyText"/>
       </w:pPr>
       <w:r>
-        <w:t xml:space="preserve">Nonetheless, many optimization strategies described in this study have not been exploited in pharmaceutical practice yet, not because of the lack of consideration but due to the complexity of real biological contexts. First, some strategies are not practical biochemically. For example, the manipulation of ligand affinity requires intricate protein engineering, and precise modulation is difficult to attain. Potential dynamic changes in the receptor expression profile of a target population also complicate the matter. It is well documented that cancer cells can escape therapeutic targeting by upregulating</w:t>
+        <w:t xml:space="preserve">Some of the optimization strategies described here have not been exploited in part due to the complexity of real biological applications. First, some strategies may not be biochemically practical. For example, the manipulating ligand affinity requires intricate protein engineering. Potential dynamic changes in the receptor expression profile of a target population also complicate the matter. It is well documented that cancer cells can escape therapeutic targeting by upregulating</w:t>
       </w:r>
       <w:hyperlink w:anchor="ref-3WVNxYBN">
         <w:r>
@@ -11493,7 +11493,7 @@
         <w:t xml:space="preserve"> </w:t>
       </w:r>
       <w:r>
-        <w:t xml:space="preserve">the expression of certain receptors. In this case, not only should the abundance of receptors be considered, but also their variance within a cell population over time. While this work does not intend to solve every aspect of these issues, we propose that using a computational binding model can analyze these strategies quantitatively and collectively from a mechanistic perspective. Even when the absolute mathematical optimum cannot be achieved biochemically, our analyses provide good guidance to what is attainable and how to approach the optimum, accounting those biological complexities and facilitating the implementation of complicated combinations of several strategies.</w:t>
+        <w:t xml:space="preserve">the expression of certain receptors. In this case, both the current and potential abundance of each receptor must be considered. While this work does not intend to solve every aspect of these issues, we propose that using a computational binding model can analyze these strategies quantitatively and collectively from a mechanistic perspective. Even when the absolute mathematical optimum cannot be achieved biochemically, our analyses provide good guidance to what is attainable and how to approach the optimum, accounting for implementation feasibility and facilitating the implementation of strategy combinations.</w:t>
       </w:r>
     </w:p>
     <w:p>
@@ -11501,7 +11501,7 @@
         <w:pStyle w:val="BodyText"/>
       </w:pPr>
       <w:r>
-        <w:t xml:space="preserve">In many therapeutic applications where selective engagement of target cell populations is an important performance metric, such as the treatment of cancer, cellular engineering is becoming increasingly popular.</w:t>
+        <w:t xml:space="preserve">In many therapeutic applications where selective engagement of target cell populations is an important performance metric, such as the treatment of cancer, cellular therapies are becoming increasingly popular.</w:t>
       </w:r>
       <w:hyperlink w:anchor="ref-bi6A2xzH">
         <w:r>
@@ -11516,7 +11516,7 @@
         <w:t xml:space="preserve"> </w:t>
       </w:r>
       <w:r>
-        <w:t xml:space="preserve">Human engineered chimeric antigen receptor (CAR) T cells are being introduced in the clinical setting at a rapid rate, and advances in genetic engineering technologies have enhanced the potential of engineered immune cells to recognize and attack malignant tissues.</w:t>
+        <w:t xml:space="preserve">Human engineered chimeric antigen receptor (CAR) T cells have enhanced the potential to selectively recognize and attack malignant tissues.</w:t>
       </w:r>
       <w:hyperlink w:anchor="ref-Fp4dDXV1">
         <w:r>
@@ -11531,7 +11531,7 @@
         <w:t xml:space="preserve"> </w:t>
       </w:r>
       <w:r>
-        <w:t xml:space="preserve">These technologies bypass ligand-receptor binding considerations by manipulating the complexities of the immune system to attack cells expressing particular receptors. However, manipulations of the immune system inevitably lead to myriad unintended effects due to the complex regulatory mechanisms which control immune activation and activity. We have shown here that complex and targeted changes to the binding activity of simple therapeutic ligands can be achieved via relatively simple ligand characteristic manipulation. This study lays the framework for how protein engineering specifications can be defined using computational modeling. It should be noted that the application of this logic is reliant on knowledge of the target and off-target cell population receptor expression levels. Future application of the ligand binding logic described in this study could be guided using high-throughput single-cell profiling techniques, such as RNA-seq or high-parameter flow cytometry. A computational tool that could translate such data-sets into immediately applicable ligand design criteria may represent a potential avenue for the translation of our analyses into a more broadly applicable ligand engineering tool.</w:t>
+        <w:t xml:space="preserve">These technologies bypass ligand-receptor binding restrictions by allowing recognition in signaling response. However, we have shown here that selectivity can often be attained with relatively simple therapeutic ligands. This study lays the framework for how ligand engineering can be directed using computational modeling. It should be noted that the application of this logic is reliant on knowledge of the target and off-target cell population receptor expression levels. Future application of the ligand binding logic described in this study could be guided using high-throughput single-cell profiling techniques, such as RNA-seq or high-parameter flow cytometry. A computational tool that could directly translate such datasets into ligand design criteria may represent a potential avenue for the translation of our analyses into a more broadly applicable ligand engineering tool.</w:t>
       </w:r>
     </w:p>
     <w:p>

</xml_diff>

<commit_message>
Deploying to gh-pages from  @ fc8a9a5fa61aaaf88bd19df1bba5b2c277111602 🚀
</commit_message>
<xml_diff>
--- a/manuscript.docx
+++ b/manuscript.docx
@@ -11039,7 +11039,7 @@
         <w:t xml:space="preserve"> </w:t>
       </w:r>
       <w:r>
-        <w:t xml:space="preserve">antagonist with varying affinities for receptors 1 and 2, and a monovalent therapeutic receptor agonists with affinities optimized for selectivity. Heatmap values are normalized to specificity imparted with non-binding antagonists. Only amount of agonist bound is considered in determination of selectivity. b-d) Heatmap of agonist (b), and antagonist (c) ligand bound for antagonist and agonist ligand combination shown to imaprt greatest selectivity improvement in (a). d) Heatmap of agonist bound in b,c when no antagonist is present.</w:t>
+        <w:t xml:space="preserve">antagonist with varying affinities for receptors 1 and 2, and a monovalent therapeutic receptor agonists with affinities optimized for selectivity. Only amount of agonist bound is considered in determination of optimal selectivity. b-d) Heatmap of agonist (b), and antagonist (c) ligand bound for antagonist and agonist ligand combination shown to imaprt greatest selectivity improvement in (a). d) Heatmap of agonist bound in b,c when no antagonist is present.</w:t>
       </w:r>
       <w:bookmarkEnd w:id="45"/>
     </w:p>
@@ -11224,7 +11224,7 @@
         <w:t xml:space="preserve"> </w:t>
       </w:r>
       <w:r>
-        <w:t xml:space="preserve">antagonist with varying affinities for receptors 1 and 2, and a monovalent therapeutic receptor agonists with affinities optimized for selectivity. Heatmap values are normalized to specificity imparted with non-binding antagonists. Only amount of agonist bound is considered in determination of selectivity. b-d) Heatmap of agonist (b), and antagonist (c) ligand bound for antagonist and agonist ligand combination shown to imaprt greatest selectivity improvement in (a). d) Heatmap of agonist bound in b,c when no antagonist is present.</w:t>
+        <w:t xml:space="preserve">antagonist with varying affinities for receptors 1 and 2, and a monovalent therapeutic receptor agonists with affinities optimized for selectivity. Only amount of agonist bound is considered in determination of optimal selectivity. b-d) Heatmap of agonist (b), and antagonist (c) ligand bound for antagonist and agonist ligand combination shown to imaprt greatest selectivity improvement in (a). d) Heatmap of agonist bound in b,c when no antagonist is present.</w:t>
       </w:r>
     </w:p>
     <w:bookmarkEnd w:id="0"/>

</xml_diff>

<commit_message>
Deploying to gh-pages from  @ cbb26c67cfa8a35c780dfd7dc6bc20518b994b24 🚀
</commit_message>
<xml_diff>
--- a/manuscript.docx
+++ b/manuscript.docx
@@ -78,7 +78,7 @@
         <w:t xml:space="preserve"> </w:t>
       </w:r>
       <w:r>
-        <w:t xml:space="preserve">was automatically generated on November 16, 2020.</w:t>
+        <w:t xml:space="preserve">was automatically generated on November 17, 2020.</w:t>
       </w:r>
       <w:r>
         <w:t xml:space="preserve"> </w:t>
@@ -452,7 +452,7 @@
         <w:t xml:space="preserve"> </w:t>
       </w:r>
       <w:r>
-        <w:t xml:space="preserve">all can arise through the selection among heterogeneous cell populations. While the immune system takes advantage of heterogeneity at the single-cell level to translate noisy inflammatory signals into robust yet sensitive responses,</w:t>
+        <w:t xml:space="preserve">all can arise through the selection of target cells among heterogeneous cell populations. While the immune system takes advantage of heterogeneity at the single-cell level to translate noisy inflammatory signals into robust yet sensitive responses,</w:t>
       </w:r>
       <w:hyperlink w:anchor="ref-PMID:24919153">
         <w:r>
@@ -465,7 +465,7 @@
         </w:r>
       </w:hyperlink>
       <w:r>
-        <w:t xml:space="preserve"> this heterogeneity impedes our effort of creating a highly specific drug. The intricacies of both inter-population receptor expression difference and intra-population receptor expression heterogeneity present significant challenges that limit the selectivity of therapies within the body.</w:t>
+        <w:t xml:space="preserve"> this heterogeneity impedes our effort of creating a highly specific drug. The intricacies of both inter-population receptor expression differences and intra-population receptor expression heterogeneity present significant challenges that limit the selectivity of therapies within the body.</w:t>
       </w:r>
     </w:p>
     <w:p>
@@ -486,7 +486,7 @@
         </w:r>
       </w:hyperlink>
       <w:r>
-        <w:t xml:space="preserve"> This strategy can enhance specificity, but only to a limited degree, particularly when target cells can only be distinguished by subtle quantitative differences in surface antigen or by combinations of markers. The limitations of single-antigen targeting have led to efforts to engineer logic program and more complex programs into cellular therapies to recognize target cells more specifically.</w:t>
+        <w:t xml:space="preserve"> This strategy can enhance specificity, but only to a limited degree, particularly when target cells can only be distinguished by subtle quantitative differences in surface antigen or by combinations of markers. The limitations of single-antigen targeting have led to efforts to program complex logic into cellular therapies to recognize target cells more specifically.</w:t>
       </w:r>
       <w:hyperlink w:anchor="ref-doi:10.1126/science.aay2790">
         <w:r>
@@ -552,7 +552,7 @@
         </w:r>
       </w:hyperlink>
       <w:r>
-        <w:t xml:space="preserve"> Here, we analyze a suite of molecular approaches for engineering cell-specific binding using a multi-valent, multi-receptor, multi-ligand model. We show that strategies including affinity, valency, binding competition, ligand mixtures, and hetero-valent complexes provide distinct improvements in cell-specific targeting. Finally, we combine these strategies to target cells through combinatorial methods. In total, our results demonstrate that binding programs can offer combinatorial targeting strategies with similar effectiveness as complex engineered cellular therapies and can be engineered using a mechanistic binding model.</w:t>
+        <w:t xml:space="preserve"> Here, we analyze a suite of molecular approaches for engineering cell-specific binding using a multi-valent, multi-receptor, multi-ligand binding model. We show that strategies including affinity, valency, binding competition, ligand mixtures, and hetero-valent complexes provide distinct improvements in cell-specific targeting. Finally, we combine these strategies to target cells through combinatorial methods. In total, our results demonstrate that multi-valent ligands can offer offer effective cell specific targeting without the need to engineer complex cellular therapies, and that their design can be guided using a mechanistic binding model.</w:t>
       </w:r>
     </w:p>
     <w:bookmarkEnd w:id="30"/>
@@ -629,7 +629,7 @@
         <w:pStyle w:val="BodyText"/>
       </w:pPr>
       <w:r>
-        <w:t xml:space="preserve">Here we investigate cell-specific targeting quantitatively by extending a multi-valent, multi-ligand equilibrium binding model. Virtually any therapy, including monoclonal antibodies, small-molecule inhibitors, and cytokines, can be thought of as ligands for respective receptors expressed on target cells. Ligand binding to target cells is the first step and essential for a drug’s intended action; in contrast, binding to off-target cells can result in unintended effects or toxicity. Some cell populations can be distinguished by their expression of a unique receptor not expressed by other populations, but more commonly, target and off-target cells express the same collection of receptors and differ only in their magnitudes of receptor expression. In such situations, engineering drugs to optimize target cell binding while minimizing their off-target cells binding is an area of ongoing research and has inspired a myriad of drug design strategies.</w:t>
+        <w:t xml:space="preserve">Here we investigate cell-specific targeting quantitatively by extending a multi-valent, multi-ligand equilibrium binding model. Virtually any therapy, including monoclonal antibodies, small-molecule inhibitors, and cytokines, can be thought of as ligands for respective receptors expressed on target cells. Ligand binding to target cells is a necessary first step, and essential for a drug’s intended action. In contrast, binding to off-target cells can result in unintended effects or toxicity. Some cell populations can be distinguished by their expression of a unique receptor not expressed by other populations, but more commonly, target and off-target cells express the same collection of receptors and differ only in their magnitudes of receptor expression. In such situations, engineering drugs to optimize target cell binding while minimizing their binding to off-target cells is an area of ongoing research, and has inspired a myriad of drug design strategies.</w:t>
       </w:r>
       <w:hyperlink w:anchor="ref-doi:10.1038/sj.bjc.6604700">
         <w:r>
@@ -1298,7 +1298,20 @@
         <w:t xml:space="preserve"> </w:t>
       </w:r>
       <w:r>
-        <w:t xml:space="preserve">has a wider range. The intrapopulation variance will be accounted for with sigma point filter. We will use this binding model to examine how engineering a ligand using various strategies can improve cell-specific targeting. Although we will only consider two receptor and ligand subunit types respectively, the principles we present can generalize to more complex cases.</w:t>
+        <w:t xml:space="preserve">has a wider range. The intrapopulation variance will be accounted for using sigma point filters.</w:t>
+      </w:r>
+      <w:hyperlink w:anchor="ref-wikidata:Q99353631">
+        <w:r>
+          <w:rPr>
+            <w:rStyle w:val="Hyperlink"/>
+            <w:b/>
+            <w:vertAlign w:val="superscript"/>
+          </w:rPr>
+          <w:t xml:space="preserve">wikidata:Q99353631?</w:t>
+        </w:r>
+      </w:hyperlink>
+      <w:r>
+        <w:t xml:space="preserve"> We will use this binding model to examine how engineering a ligand using various strategies can improve cell-specific targeting. Although we will only consider two receptor and ligand subunit types respectively, the principles we present can generalize to more complex cases.</w:t>
       </w:r>
     </w:p>
     <w:bookmarkEnd w:id="32"/>
@@ -2628,7 +2641,7 @@
         </w:r>
       </w:hyperlink>
       <w:r>
-        <w:t xml:space="preserve">a). We found that when a target cell population expresses a receptor not expressed by off-target cell populations, enhancing the affinity of the drug to this receptor is a clear strategy to increase selective binding to this population. For example,</w:t>
+        <w:t xml:space="preserve">a). We found that when a target cell population expresses a receptor not expressed by off-target cell populations, enhancing the affinity of the drug to this receptor is a clear and effective strategy to increase selective binding to this population. For example,</w:t>
       </w:r>
       <w:r>
         <w:t xml:space="preserve"> </w:t>
@@ -3343,7 +3356,7 @@
         </w:r>
       </w:hyperlink>
       <w:r>
-        <w:t xml:space="preserve">a). For these two pairs, the benefit of affinity changes is limited by the relative discrepancy in receptor amounts (Fig.</w:t>
+        <w:t xml:space="preserve">a). For these two pairs, the benefit of affinity changes is limited by the relative discrepancy in receptor abundances (Fig.</w:t>
       </w:r>
       <w:r>
         <w:t xml:space="preserve"> </w:t>
@@ -4553,7 +4566,7 @@
         </m:r>
       </m:oMath>
       <w:r>
-        <w:t xml:space="preserve">), and the shaded areas indicate the variance caused by intrapopulation heterogeneity, determined by sigma point filter. The ligand binding ratio between</w:t>
+        <w:t xml:space="preserve">), and the shaded areas indicate the variance caused by intrapopulation heterogeneity, determined by sigma point filters. The ligand binding ratio between</w:t>
       </w:r>
       <w:r>
         <w:t xml:space="preserve"> </w:t>
@@ -5023,7 +5036,7 @@
         </w:r>
       </w:hyperlink>
       <w:r>
-        <w:t xml:space="preserve">g). Multivalent ligands will undergo initial binding events at rates unaffected by receptor abundance, but low affinity and receptor density severely limit the possibility of secondary binding events. In contrast, cells with higher receptor abundance accumulate ligand bound by having them binding multivalently, as the forward rate of secondary binding events is greater than that of receptor-ligand disassociation (Fig.</w:t>
+        <w:t xml:space="preserve">g). Multivalent ligands will undergo initial binding events at rates unaffected by steric effects and changes in local concentration, but low affinity and receptor density severely limit the possibility of secondary binding events. In contrast, cells with a higher abundance of receptors accumulate ligand bound by having them bind multivalently, as the forward rate of secondary binding events is greater than that of receptor-ligand disassociation (Fig.</w:t>
       </w:r>
       <w:r>
         <w:t xml:space="preserve"> </w:t>
@@ -5209,7 +5222,7 @@
         </m:sSup>
       </m:oMath>
       <w:r>
-        <w:t xml:space="preserve">. b-d) Ligand binding ratio between various cell populations for ligands of valency ranging from 1 to 16. The shaded areas indicate the variance of binding ratios caused by the intrapopulation heterogeneity and estimated by sigma point filter. b) Ligand bound ratio of</w:t>
+        <w:t xml:space="preserve">. b-d) Ligand binding ratio between various cell populations for ligands of valency ranging from 1 to 16. The shaded areas indicate the variance of binding ratios caused by the intrapopulation heterogeneity and estimated by sigma point filters. b) Ligand bound ratio of</w:t>
       </w:r>
       <w:r>
         <w:t xml:space="preserve"> </w:t>
@@ -5789,7 +5802,7 @@
         </m:sSup>
       </m:oMath>
       <w:r>
-        <w:t xml:space="preserve">. b-d) Ligand binding ratio between various cell populations for ligands of valency ranging from 1 to 16. The shaded areas indicate the variance of binding ratios caused by the intrapopulation heterogeneity and estimated by sigma point filter. b) Ligand bound ratio of</w:t>
+        <w:t xml:space="preserve">. b-d) Ligand binding ratio between various cell populations for ligands of valency ranging from 1 to 16. The shaded areas indicate the variance of binding ratios caused by the intrapopulation heterogeneity and estimated by sigma point filters. b) Ligand bound ratio of</w:t>
       </w:r>
       <w:r>
         <w:t xml:space="preserve"> </w:t>
@@ -6243,7 +6256,7 @@
         </w:r>
       </w:hyperlink>
       <w:r>
-        <w:t xml:space="preserve"> Therefore, it is important to understand how mixtures of complexes influence the overall response.</w:t>
+        <w:t xml:space="preserve"> Therefore, it is important to understand how mixtures of complexes influence overall response.</w:t>
       </w:r>
     </w:p>
     <w:p>
@@ -6251,7 +6264,7 @@
         <w:pStyle w:val="BodyText"/>
       </w:pPr>
       <w:r>
-        <w:t xml:space="preserve">To evaluate the contribution of mixtures, we evaluated model-predicted binding while varying the composition between two distinct monovalent ligands with either</w:t>
+        <w:t xml:space="preserve">To evaluate the contribution of mixtures, we evaluated model-predicted binding while varying the composition between two distinct monovalent ligands, each exhibiting preferential binding to either</w:t>
       </w:r>
       <w:r>
         <w:t xml:space="preserve"> </w:t>
@@ -6294,7 +6307,7 @@
         </m:sSub>
       </m:oMath>
       <w:r>
-        <w:t xml:space="preserve">-preferred binding (Fig.</w:t>
+        <w:t xml:space="preserve">(Fig.</w:t>
       </w:r>
       <w:r>
         <w:t xml:space="preserve"> </w:t>
@@ -6308,7 +6321,7 @@
         </w:r>
       </w:hyperlink>
       <w:r>
-        <w:t xml:space="preserve">a), while maintaining low level cross activity. The trend that arises is very similar to an additive combination of the single ligand cases. This pattern highlights a key limitation of using mixtures for selectivity: selectivity between two populations varies monotonically with the composition, so any mixture combination is no better than using the more specific ligand entirely (Fig.</w:t>
+        <w:t xml:space="preserve">a). The trend that arises is very similar to an additive combination of the single ligand cases. This pattern highlights a key limitation of using mixtures for selectivity: selectivity between two populations varies monotonically with the composition, so any mixture combination is no better than using the more specific ligand entirely (Fig.</w:t>
       </w:r>
       <w:r>
         <w:t xml:space="preserve"> </w:t>
@@ -6778,7 +6791,7 @@
         </m:sSup>
       </m:oMath>
       <w:r>
-        <w:t xml:space="preserve">. b,c) Ratio of ligand bound to cell populations exposed to monovalent mixtures of ligand 1 and 2. The ratio of the target population to the single off target population with the greatest ligand bound is plotted. The shaded areas indicate the variance caused by intrapopulation heterogeneity, estimated by sigma point filter. b) Ligand bound ratio of</w:t>
+        <w:t xml:space="preserve">. b,c) Ratio of ligand bound to cell populations exposed to monovalent mixtures of ligand 1 and 2. The ratio of the target population to the single off target population with the greatest ligand bound is plotted. The shaded areas indicate the variance caused by intrapopulation heterogeneity, estimated by sigma point filters. b) Ligand bound ratio of</w:t>
       </w:r>
       <w:r>
         <w:t xml:space="preserve"> </w:t>
@@ -7239,7 +7252,7 @@
         </m:sSup>
       </m:oMath>
       <w:r>
-        <w:t xml:space="preserve">. b,c) Ratio of ligand bound to cell populations exposed to monovalent mixtures of ligand 1 and 2. The ratio of the target population to the single off target population with the greatest ligand bound is plotted. The shaded areas indicate the variance caused by intrapopulation heterogeneity, estimated by sigma point filter. b) Ligand bound ratio of</w:t>
+        <w:t xml:space="preserve">. b,c) Ratio of ligand bound to cell populations exposed to monovalent mixtures of ligand 1 and 2. The ratio of the target population to the single off target population with the greatest ligand bound is plotted. The shaded areas indicate the variance caused by intrapopulation heterogeneity, estimated by sigma point filters. b) Ligand bound ratio of</w:t>
       </w:r>
       <w:r>
         <w:t xml:space="preserve"> </w:t>
@@ -7523,7 +7536,7 @@
         </w:r>
       </w:hyperlink>
       <w:r>
-        <w:t xml:space="preserve"> However, the number of possible configurations of multispecific drugs is combinatorially large and impossible to enumerate. Here, we use the heterovalent bispecific ligand as an example to explore the unique benefit of multispecificity distinct from any strategy analyzed before. Here, we compare bispecificity with a 50%-50% mixture of two monovalent ligands, and a 50%-50% mixture of two different homogeneous bivalent ligands (Fig.</w:t>
+        <w:t xml:space="preserve"> However, the number of possible configurations of multispecific drugs is combinatorially large and impossible to enumerate. Here, we use heterovalent bispecific ligands as examples to explore the unique benefit of multispecificity distinct from any strategy analyzed before. Here, we compare bispecificity with a 50%-50% mixture of two monovalent ligands, and a 50%-50% mixture of two different homogeneous bivalent ligands (Fig.</w:t>
       </w:r>
       <w:r>
         <w:t xml:space="preserve"> </w:t>
@@ -7587,7 +7600,7 @@
         </w:r>
       </w:hyperlink>
       <w:r>
-        <w:t xml:space="preserve">c), with the same set of parameters in ligand concentration and affinities. Surprisingly, the patterns of ligand binding in these three cases are almost exactly the same, and bispecificity appeared to offer no unique properties. However, many bispecifics only impart their therapeutic action when both of their subunits bind to a target population. For example, in the design of bispecific antibodies, it is common to require both subunits bound to be effective. When the first antigen-binding region of a bispecific antibody docks at an antigen, it will only make a loose connection between the target and the antibody, unable to induce a strong immune response, and only when both antigen-binding regions bind to their target will this bispecific antibody be fully effective.</w:t>
+        <w:t xml:space="preserve">c), with the same set of parameters in ligand concentration and affinities. Surprisingly, the patterns of ligand binding in these three cases are almost exactly the same, and bispecificity appeared to offer no unique properties. However, many bispecifics only impart their therapeutic action when both of their subunits bind to a target population. For example, in the design of bispecific antibodies, it is common to require both subunits bound to be effective.</w:t>
       </w:r>
       <w:hyperlink w:anchor="ref-doi:10.1080/19420862.2015.1062192">
         <w:r>
@@ -7616,7 +7629,7 @@
         </w:r>
       </w:hyperlink>
       <w:r>
-        <w:t xml:space="preserve"> We investigated if bispecific ligands that have to be activated with both of their subunits binding to a target display any special cell population selectivity characteristics.</w:t>
+        <w:t xml:space="preserve"> When the first antigen-binding region of a bispecific antibody docks at an antigen, it will only make a loose connection between the target and the antibody, unable to induce a strong immune response, and only when both antigen-binding regions bind to their target will this bispecific antibody be fully effective. We investigated whether bispecific ligands that have to be activated with both of their subunits binding to a target display any special cell population selectivity characteristics.</w:t>
       </w:r>
     </w:p>
     <w:p>
@@ -7839,7 +7852,7 @@
         </w:r>
       </w:hyperlink>
       <w:r>
-        <w:t xml:space="preserve">e). This concavity of contour lines indicates that for bispecific complexes, double-positive cells bind more ligands fully than singly-positively expressed cells. This should be obvious since these two subunits of the bispecific complex prefer different receptors. The results indicate that bispecific ligands will only exhibit special characteristics when it requires both receptor binding subunits to bind a receptor.</w:t>
+        <w:t xml:space="preserve">e). This concavity of contour lines indicates that for bispecific complexes, double-positive cells bind more ligands fully than cells only strongly expressing one type of receptors. This should be obvious since these two subunits of the bispecific complex prefer different receptors. The results indicate that bispecific ligands will only exhibit special characteristics when it requires both receptor binding subunits to bind a receptor.</w:t>
       </w:r>
     </w:p>
     <w:p>
@@ -7847,7 +7860,7 @@
         <w:pStyle w:val="BodyText"/>
       </w:pPr>
       <w:r>
-        <w:t xml:space="preserve">The specific amount of fully bound ligands depends on the propensity of crosslinking, captured by the constant</w:t>
+        <w:t xml:space="preserve">The specific amount of fully bound ligands is dependent on the ligand’s propensity for crosslinking captured by the constant</w:t>
       </w:r>
       <w:r>
         <w:t xml:space="preserve"> </w:t>
@@ -7914,7 +7927,20 @@
         </m:sSubSup>
       </m:oMath>
       <w:r>
-        <w:t xml:space="preserve">. We plotted the pattern of bispecific fully bound with</w:t>
+        <w:t xml:space="preserve">.</w:t>
+      </w:r>
+      <w:hyperlink w:anchor="ref-doi:10.1016/S0006-3495">
+        <w:r>
+          <w:rPr>
+            <w:rStyle w:val="Hyperlink"/>
+            <w:b/>
+            <w:vertAlign w:val="superscript"/>
+          </w:rPr>
+          <w:t xml:space="preserve">doi:10.1016/S0006-3495?</w:t>
+        </w:r>
+      </w:hyperlink>
+      <w:r>
+        <w:t xml:space="preserve"> We plotted the pattern of bispecific fully bound with</w:t>
       </w:r>
       <w:r>
         <w:t xml:space="preserve"> </w:t>
@@ -11043,7 +11069,7 @@
         </w:r>
       </w:hyperlink>
       <w:r>
-        <w:t xml:space="preserve">). Using a representative set of theoretical cell populations defined by their distinct expression of two receptors, we examined the efficacy of several potential ligand engineering strategies, including changes to affinity, ligand valency, mixtures of species, multi-specificity, and these in combination.</w:t>
+        <w:t xml:space="preserve">). Using a representative set of theoretical cell populations defined by their distinct expression of two receptors, we examined the efficacy of several potential ligand engineering strategies, including changes to affinity, ligand valency, mixtures of species, multi-specificity, antagonist competition, and these in combination.</w:t>
       </w:r>
     </w:p>
     <w:p>
@@ -11079,7 +11105,7 @@
         </w:r>
       </w:hyperlink>
       <w:r>
-        <w:t xml:space="preserve">). A key determinant of valency’s effectiveness was the secondary binding and unbinding rate which is dependent on both the kinetics of the receptor-ligand interaction and receptor abundance. Ligand mixtures were mostly ineffective for imparting binding selectivity, and only had modest benefits when considering three or more off-target populations (Fig.</w:t>
+        <w:t xml:space="preserve">). A key determinant of valency’s effectiveness was the secondary binding and unbinding rate which is dependent on both the kinetics of the receptor-ligand interaction and receptor abundance. Ligand mixtures were mostly ineffective for imparting binding selectivity, and only had modest benefits when considering two or more off-target populations (Fig.</w:t>
       </w:r>
       <w:r>
         <w:t xml:space="preserve"> </w:t>
@@ -11093,7 +11119,7 @@
         </w:r>
       </w:hyperlink>
       <w:r>
-        <w:t xml:space="preserve">). Heterovalent bispecific ligands only showed unique advantages over mixtures of monovalent ligands or bivalent ligands when we restricted our binding quantity to be both subunits bound (Fig.</w:t>
+        <w:t xml:space="preserve">). Heterovalent bispecific ligands only showed unique advantages over mixtures of monovalent ligands or bivalent ligands when solely considering fully bound ligand (Fig.</w:t>
       </w:r>
       <w:r>
         <w:t xml:space="preserve"> </w:t>
@@ -11107,7 +11133,7 @@
         </w:r>
       </w:hyperlink>
       <w:r>
-        <w:t xml:space="preserve">). They prefer target populations that have high expression of both receptors over those with high expression of only a single receptor, with the preference for secondary binding as the key determinant for selectivity. We found that, while a single ligand engineering strategy dominated in its contributions to cell type selectivity, synergies between these strategies existed in some cases to derive even greater specificity (Fig.</w:t>
+        <w:t xml:space="preserve">). These ligands exhibit preferential binding to target populations that have high expression of both receptors over those with high expression of only a single receptor, with the propensity for secondary binding acting as a key determinant for selectivity. We found that, while a single ligand engineering strategy dominated in its contributions to cell type selectivity, synergies between these strategies existed in some cases to derive even greater specificity (Fig.</w:t>
       </w:r>
       <w:r>
         <w:t xml:space="preserve"> </w:t>
@@ -11121,7 +11147,7 @@
         </w:r>
       </w:hyperlink>
       <w:r>
-        <w:t xml:space="preserve">). Finally, we found that combinations of monovalent therapeutic ligands with multivalent antagonistic ligands allow for selection of target populations based on their lack of receptor expression (Fig.</w:t>
+        <w:t xml:space="preserve">). Finally, we found that combinations of monovalent therapeutic ligands with multivalent antagonistic ligands allow for the unique selection of target populations expressing relatively fewer receptors than off-target populations (Fig.</w:t>
       </w:r>
       <w:r>
         <w:t xml:space="preserve"> </w:t>
@@ -11143,7 +11169,7 @@
         <w:pStyle w:val="BodyText"/>
       </w:pPr>
       <w:r>
-        <w:t xml:space="preserve">While our multivalent binding model identified strategies for selective targeting in many cases, it also identified situations for which selective binding is challenging. For example, selectively targeting populations based on their absence of receptor expression remains challenging. While we computationally show the potential of using multivalent antagonists with monovalent agonists, implementing this may be challenging. In cases where a target population expresses fewer receptors of any kind than an off-target population, our analysis suggests that targeting other receptors should be considered. However, in cases where target populations express more of any type of receptor than an off-target population, we show that one or more of our formulated ligand engineering strategies can be employed to improve binding selectivity. While we expect the same patterns to apply with greater than two receptors, certain emergent behaviors may exist with tri-specific and more complex ligand binding.</w:t>
+        <w:t xml:space="preserve">While our multivalent binding model identified strategies for selective targeting in many cases, it also identified situations for which selective binding is challenging. For example, selectively targeting populations based on their absence of receptor expression remains challenging. While we computationally show the potential of using multivalent antagonists with monovalent agonists to selectively target such populations, implementing this may be challenging in practice. In cases where a target population expresses fewer receptors of any kind than an off-target population, our analysis suggests that targeting other receptors should be considered. However, in cases where target populations express more of any type of receptor than an off-target population, we show that one or more of our formulated ligand engineering strategies can be employed to improve binding selectivity. While we expect the same patterns to apply with greater than two receptors, certain emergent behaviors may exist with tri-specific and more complex ligand binding.</w:t>
       </w:r>
     </w:p>
     <w:p>
@@ -11151,7 +11177,7 @@
         <w:pStyle w:val="BodyText"/>
       </w:pPr>
       <w:r>
-        <w:t xml:space="preserve">A few of the strategies that we explored are already utilized in existing engineered therapies. For example, affinity changes to the cytokine IL-2 have been used to bias its effects towards either effector or regulatory immune populations.</w:t>
+        <w:t xml:space="preserve">A few of the strategies that we explored have been utilized in existing engineered therapies. For example, affinity changes to the cytokine IL-2 have been used to bias its effects towards either effector or regulatory immune populations.</w:t>
       </w:r>
       <w:hyperlink w:anchor="ref-doi:10.1158/2159-8290.CD-18-1495">
         <w:r>
@@ -11219,7 +11245,7 @@
         </w:r>
       </w:hyperlink>
       <w:r>
-        <w:t xml:space="preserve"> These examples lend support to the accuracy of our model. At the same time, recognizing these previously described ligand engineering approaches as separable strategies provides clearer guidance for future engineering.</w:t>
+        <w:t xml:space="preserve"> These examples lend support to the accuracy and translational value of our model. At the same time, recognizing these previously described ligand engineering approaches as separable strategies provides clearer guidance for future engineering.</w:t>
       </w:r>
     </w:p>
     <w:p>
@@ -11275,7 +11301,7 @@
         <w:t xml:space="preserve"> </w:t>
       </w:r>
       <w:r>
-        <w:t xml:space="preserve">the expression of certain receptors. In this case, both the current and potential abundance of each receptor must be considered. While this work does not intend to solve every aspect of these issues, we propose that using a computational binding model can analyze these strategies quantitatively and collectively from a mechanistic perspective. Even when the absolute mathematical optimum cannot be achieved biochemically, our analyses provide good guidance to what is attainable and how to approach the optimum, accounting for implementation feasibility and facilitating the implementation of strategy combinations.</w:t>
+        <w:t xml:space="preserve">the expression of certain receptors. In this case, both the current and potential abundance of each receptor must be considered. While this work does not address many of these issues, we propose that using a computational binding model can analyze these strategies quantitatively and collectively from a mechanistic perspective. Even when the absolute mathematically optimal ligand characteristics cannot be achieved biochemically, our analyses provide good guidance to what is attainable and how to approach the optimum, accounting for implementation feasibility and facilitating the implementation of strategy combinations.</w:t>
       </w:r>
     </w:p>
     <w:p>
@@ -14882,7 +14908,7 @@
         <w:pStyle w:val="FirstParagraph"/>
       </w:pPr>
       <w:r>
-        <w:t xml:space="preserve">To consider the intrapopulation variance of a cell population in the optimization, we implemented sigma point filter,</w:t>
+        <w:t xml:space="preserve">To consider the intrapopulation variance of a cell population in the optimization, we implemented the sigma point filters,</w:t>
       </w:r>
       <w:hyperlink w:anchor="ref-wikidata:Q99353631">
         <w:r>

</xml_diff>

<commit_message>
Deploying to gh-pages from  @ b6f37d01e8bc4b5cf15915412f40b403bb8b5055 🚀
</commit_message>
<xml_diff>
--- a/manuscript.docx
+++ b/manuscript.docx
@@ -78,7 +78,7 @@
         <w:t xml:space="preserve"> </w:t>
       </w:r>
       <w:r>
-        <w:t xml:space="preserve">was automatically generated on November 17, 2020.</w:t>
+        <w:t xml:space="preserve">was automatically generated on November 24, 2020.</w:t>
       </w:r>
       <w:r>
         <w:t xml:space="preserve"> </w:t>
@@ -104,7 +104,7 @@
         <w:rPr>
           <w:b/>
         </w:rPr>
-        <w:t xml:space="preserve">Brian Orcutt-Jahns</w:t>
+        <w:t xml:space="preserve">Zhixin Cyrillus Tan</w:t>
       </w:r>
       <w:r>
         <w:t xml:space="preserve"> </w:t>
@@ -120,7 +120,7 @@
           <w:rPr>
             <w:rStyle w:val="Hyperlink"/>
           </w:rPr>
-          <w:t xml:space="preserve">0000-0002-1436-1224</w:t>
+          <w:t xml:space="preserve">0000-0002-5498-5509</w:t>
         </w:r>
       </w:hyperlink>
       <w:r>
@@ -137,7 +137,7 @@
           <w:rPr>
             <w:rStyle w:val="Hyperlink"/>
           </w:rPr>
-          <w:t xml:space="preserve">borcuttjahns</w:t>
+          <w:t xml:space="preserve">cyrillustan</w:t>
         </w:r>
       </w:hyperlink>
       <w:r>
@@ -147,7 +147,7 @@
         <w:t xml:space="preserve"> </w:t>
       </w:r>
       <w:r>
-        <w:t xml:space="preserve">Department of Bioengineering, University of California, Los Angeles</w:t>
+        <w:t xml:space="preserve">Bioinformatics Interdepartmental Program, University of California, Los Angeles; These authors contributed equally.</w:t>
       </w:r>
       <w:r>
         <w:t xml:space="preserve"> </w:t>
@@ -164,7 +164,7 @@
         <w:rPr>
           <w:b/>
         </w:rPr>
-        <w:t xml:space="preserve">Zhixin Cyrillus Tan</w:t>
+        <w:t xml:space="preserve">Brian Orcutt-Jahns</w:t>
       </w:r>
       <w:r>
         <w:t xml:space="preserve"> </w:t>
@@ -180,7 +180,7 @@
           <w:rPr>
             <w:rStyle w:val="Hyperlink"/>
           </w:rPr>
-          <w:t xml:space="preserve">0000-0002-5498-5509</w:t>
+          <w:t xml:space="preserve">0000-0002-1436-1224</w:t>
         </w:r>
       </w:hyperlink>
       <w:r>
@@ -197,7 +197,7 @@
           <w:rPr>
             <w:rStyle w:val="Hyperlink"/>
           </w:rPr>
-          <w:t xml:space="preserve">cyrillustan</w:t>
+          <w:t xml:space="preserve">borcuttjahns</w:t>
         </w:r>
       </w:hyperlink>
       <w:r>
@@ -207,7 +207,7 @@
         <w:t xml:space="preserve"> </w:t>
       </w:r>
       <w:r>
-        <w:t xml:space="preserve">Bioinformatics Interdepartmental Program, University of California, Los Angeles</w:t>
+        <w:t xml:space="preserve">Department of Bioengineering, University of California, Los Angeles; These authors contributed equally.</w:t>
       </w:r>
       <w:r>
         <w:t xml:space="preserve"> </w:t>

</xml_diff>

<commit_message>
Deploying to gh-pages from  @ 4e24285a4e3fe92b03d5d47c65ee21292716db1a 🚀
</commit_message>
<xml_diff>
--- a/manuscript.docx
+++ b/manuscript.docx
@@ -827,6 +827,9 @@
           <m:t>1</m:t>
         </m:r>
         <m:r>
+          <m:t> </m:t>
+        </m:r>
+        <m:r>
           <m:rPr>
             <m:sty m:val="p"/>
           </m:rPr>
@@ -850,6 +853,9 @@
           <m:t>10</m:t>
         </m:r>
         <m:r>
+          <m:t> </m:t>
+        </m:r>
+        <m:r>
           <m:rPr>
             <m:sty m:val="p"/>
           </m:rPr>
@@ -875,11 +881,9 @@
         <m:r>
           <m:t>100</m:t>
         </m:r>
-      </m:oMath>
-      <w:r>
-        <w:t xml:space="preserve"> </w:t>
-      </w:r>
-      <m:oMath>
+        <m:r>
+          <m:t> </m:t>
+        </m:r>
         <m:r>
           <m:rPr>
             <m:sty m:val="p"/>
@@ -2539,6 +2543,9 @@
           <m:t>10</m:t>
         </m:r>
         <m:r>
+          <m:t> </m:t>
+        </m:r>
+        <m:r>
           <m:rPr>
             <m:sty m:val="p"/>
           </m:rPr>
@@ -2563,6 +2570,9 @@
       <m:oMath>
         <m:r>
           <m:t>100</m:t>
+        </m:r>
+        <m:r>
+          <m:t> </m:t>
         </m:r>
         <m:r>
           <m:rPr>
@@ -3370,7 +3380,7 @@
         </w:r>
       </w:hyperlink>
       <w:r>
-        <w:t xml:space="preserve">c,d). Becuase the ratios of receptor expressions between</w:t>
+        <w:t xml:space="preserve">c,d). Since the ratios of receptor expressions between</w:t>
       </w:r>
       <w:r>
         <w:t xml:space="preserve"> </w:t>
@@ -3696,7 +3706,7 @@
         </w:r>
       </w:hyperlink>
       <w:r>
-        <w:t xml:space="preserve">d). Therefore, to use affinity changes for selectivity enhancement, it is critical to identify which receptors a cell population of interest expresses the most uniquely when compared to off-target populations.</w:t>
+        <w:t xml:space="preserve">d). Therefore, to use affinity changes for selectivity enhancement, it is critical to identify which receptors a cell population of interest expresses the most uniquely as compared to off-target populations.</w:t>
       </w:r>
     </w:p>
     <w:p>
@@ -3959,7 +3969,7 @@
         </w:r>
       </w:hyperlink>
       <w:r>
-        <w:t xml:space="preserve">). Our previous work has shown that this binding model can accurately predict the complicated multivalent binding process between IgG antibodies and Fcγ receptors.</w:t>
+        <w:t xml:space="preserve">). Our previous work has shown that this binding model can accurately predict the multivalent binding between IgG antibodies and Fcγ receptors.</w:t>
       </w:r>
       <w:hyperlink w:anchor="ref-pmid:29960887">
         <w:r>
@@ -4032,7 +4042,7 @@
         <w:pStyle w:val="BodyText"/>
       </w:pPr>
       <w:r>
-        <w:t xml:space="preserve">Multivalent ligand binding differs from monovalent binding in its nonlinear relationship with cellular receptor density, allowing multivalent ligands to potentially selectively target cells based on receptor abundance.</w:t>
+        <w:t xml:space="preserve">Multivalent ligand binding differs from monovalent binding in its nonlinear relationship with receptor density, allowing multivalent ligands to potentially selectively target cells based on receptor abundance.</w:t>
       </w:r>
       <w:hyperlink w:anchor="ref-doi:10.1038/srep40098">
         <w:r>
@@ -4099,7 +4109,7 @@
         </m:sSub>
       </m:oMath>
       <w:r>
-        <w:t xml:space="preserve">, and the valency of the ligand is varied across subplots. It is shown that varying ligand valency results in a nonlinear relationship between receptor abundance and binding magnitude. For example, in the monovalent case, there are roughly the same amount of contour lines between</w:t>
+        <w:t xml:space="preserve">, and the valency of the ligand is varied across subplots. Varying ligand valency results in a nonlinear relationship between receptor abundance and binding magnitude. For example, in the monovalent case, there are roughly the same amount of contour lines between</w:t>
       </w:r>
       <w:r>
         <w:t xml:space="preserve"> </w:t>
@@ -4459,7 +4469,7 @@
         </w:r>
       </w:hyperlink>
       <w:r>
-        <w:t xml:space="preserve"> Comparing binding between cell populations predicted by our model exposed to ligands of variable affinities over a range of ligand valency demonstrates the interplay between these factors (Fig.</w:t>
+        <w:t xml:space="preserve"> Comparing binding between cell populations exposed to ligands of variable affinities over a range of ligand valency demonstrates the interplay between these factors (Fig.</w:t>
       </w:r>
       <w:r>
         <w:t xml:space="preserve"> </w:t>
@@ -4923,7 +4933,7 @@
         <w:pStyle w:val="BodyText"/>
       </w:pPr>
       <w:r>
-        <w:t xml:space="preserve">For any specific multivalent ligand at equilibrium, it may bind to any amount of receptors no higher than its valency, which we will refer to as its binding degree. Our model allowed us to identify the mechanism of valency-mediated receptor abundance selectivity by examining the distribution of ligands bound at each degree to different cells for octavalent ligands (valency = 8). A cell expressing</w:t>
+        <w:t xml:space="preserve">For any specific multivalent ligand at equilibrium, it may bind to any number of receptors up to its valency, which we will refer to as its binding degree. Our model allowed us to identify the mechanism of valency-mediated receptor abundance selectivity by examining the distribution of ligands bound at each degree to different cells for octavalent ligands (valency = 8). A cell expressing</w:t>
       </w:r>
       <w:r>
         <w:t xml:space="preserve"> </w:t>
@@ -4976,6 +4986,9 @@
       <m:oMath>
         <m:r>
           <m:t>10</m:t>
+        </m:r>
+        <m:r>
+          <m:t> </m:t>
         </m:r>
         <m:r>
           <m:rPr>
@@ -5036,7 +5049,7 @@
         </w:r>
       </w:hyperlink>
       <w:r>
-        <w:t xml:space="preserve">g). Multivalent ligands will undergo initial binding events at rates unaffected by steric effects and changes in local concentration, but low affinity and receptor density severely limit the possibility of secondary binding events. In contrast, cells with a higher abundance of receptors accumulate ligand bound by having them bind multivalently, as the forward rate of secondary binding events is greater than that of receptor-ligand disassociation (Fig.</w:t>
+        <w:t xml:space="preserve">g). Multivalent ligands undergo initial binding events at rates unaffected by steric effects and changes in local concentration, but low affinity and receptor density severely limit the possibility of secondary binding events. In contrast, cells with a higher abundance of receptors accumulate ligand bound by having them bind multivalently, as the forward rate of secondary binding events is greater than that of receptor-ligand disassociation (Fig.</w:t>
       </w:r>
       <w:r>
         <w:t xml:space="preserve"> </w:t>
@@ -5108,6 +5121,9 @@
           <m:t>100</m:t>
         </m:r>
         <m:r>
+          <m:t> </m:t>
+        </m:r>
+        <m:r>
           <m:rPr>
             <m:sty m:val="p"/>
           </m:rPr>
@@ -5166,6 +5182,9 @@
           <m:t>1</m:t>
         </m:r>
         <m:r>
+          <m:t> </m:t>
+        </m:r>
+        <m:r>
           <m:rPr>
             <m:sty m:val="p"/>
           </m:rPr>
@@ -5567,6 +5586,9 @@
       <m:oMath>
         <m:r>
           <m:t>10</m:t>
+        </m:r>
+        <m:r>
+          <m:t> </m:t>
         </m:r>
         <m:r>
           <m:rPr>
@@ -5688,6 +5710,9 @@
           <m:t>100</m:t>
         </m:r>
         <m:r>
+          <m:t> </m:t>
+        </m:r>
+        <m:r>
           <m:rPr>
             <m:sty m:val="p"/>
           </m:rPr>
@@ -5746,6 +5771,9 @@
           <m:t>1</m:t>
         </m:r>
         <m:r>
+          <m:t> </m:t>
+        </m:r>
+        <m:r>
           <m:rPr>
             <m:sty m:val="p"/>
           </m:rPr>
@@ -6147,6 +6175,9 @@
       <m:oMath>
         <m:r>
           <m:t>10</m:t>
+        </m:r>
+        <m:r>
+          <m:t> </m:t>
         </m:r>
         <m:r>
           <m:rPr>
@@ -6541,7 +6572,7 @@
         </m:sSubSup>
       </m:oMath>
       <w:r>
-        <w:t xml:space="preserve">, we show that a uniform mixture of ligands with high affinity for receptor 1 and 2 provides a modest improvement in targeting selectivity (Fig.</w:t>
+        <w:t xml:space="preserve">, a uniform mixture of ligands with high affinity for receptor 1 and 2 provides a modest improvement in targeting selectivity (Fig.</w:t>
       </w:r>
       <w:r>
         <w:t xml:space="preserve"> </w:t>
@@ -6616,6 +6647,9 @@
           <m:t>1</m:t>
         </m:r>
         <m:r>
+          <m:t> </m:t>
+        </m:r>
+        <m:r>
           <m:rPr>
             <m:sty m:val="p"/>
           </m:rPr>
@@ -6642,6 +6676,9 @@
           <m:t>10</m:t>
         </m:r>
         <m:r>
+          <m:t> </m:t>
+        </m:r>
+        <m:r>
           <m:rPr>
             <m:sty m:val="p"/>
           </m:rPr>
@@ -6668,6 +6705,9 @@
           <m:t>10</m:t>
         </m:r>
         <m:r>
+          <m:t> </m:t>
+        </m:r>
+        <m:r>
           <m:rPr>
             <m:sty m:val="p"/>
           </m:rPr>
@@ -6694,6 +6734,9 @@
           <m:t>1</m:t>
         </m:r>
         <m:r>
+          <m:t> </m:t>
+        </m:r>
+        <m:r>
           <m:rPr>
             <m:sty m:val="p"/>
           </m:rPr>
@@ -6733,6 +6776,9 @@
         </m:r>
         <m:r>
           <m:t>1</m:t>
+        </m:r>
+        <m:r>
+          <m:t> </m:t>
         </m:r>
         <m:r>
           <m:rPr>
@@ -7077,6 +7123,9 @@
           <m:t>1</m:t>
         </m:r>
         <m:r>
+          <m:t> </m:t>
+        </m:r>
+        <m:r>
           <m:rPr>
             <m:sty m:val="p"/>
           </m:rPr>
@@ -7103,6 +7152,9 @@
           <m:t>10</m:t>
         </m:r>
         <m:r>
+          <m:t> </m:t>
+        </m:r>
+        <m:r>
           <m:rPr>
             <m:sty m:val="p"/>
           </m:rPr>
@@ -7129,6 +7181,9 @@
           <m:t>10</m:t>
         </m:r>
         <m:r>
+          <m:t> </m:t>
+        </m:r>
+        <m:r>
           <m:rPr>
             <m:sty m:val="p"/>
           </m:rPr>
@@ -7155,6 +7210,9 @@
           <m:t>1</m:t>
         </m:r>
         <m:r>
+          <m:t> </m:t>
+        </m:r>
+        <m:r>
           <m:rPr>
             <m:sty m:val="p"/>
           </m:rPr>
@@ -7194,6 +7252,9 @@
         </m:r>
         <m:r>
           <m:t>1</m:t>
+        </m:r>
+        <m:r>
+          <m:t> </m:t>
         </m:r>
         <m:r>
           <m:rPr>
@@ -7665,7 +7726,7 @@
         </w:r>
       </w:hyperlink>
       <w:r>
-        <w:t xml:space="preserve">e). The contour plot of fully bound bispecific ligands has more concaved contour lines. For example,</w:t>
+        <w:t xml:space="preserve">e). The contour plot of fully bound bispecific ligands has more convex contour lines. For example,</w:t>
       </w:r>
       <w:r>
         <w:t xml:space="preserve"> </w:t>
@@ -7852,7 +7913,7 @@
         </w:r>
       </w:hyperlink>
       <w:r>
-        <w:t xml:space="preserve">e). This concavity of contour lines indicates that for bispecific complexes, double-positive cells bind more ligands fully than cells only strongly expressing one type of receptors. This should be obvious since these two subunits of the bispecific complex prefer different receptors. The results indicate that bispecific ligands will only exhibit special characteristics when it requires both receptor binding subunits to bind a receptor.</w:t>
+        <w:t xml:space="preserve">e). This convexity of contour lines indicates that for bispecific complexes, double-positive cells bind more ligands fully than cells only strongly expressing one type of receptors. This should be obvious since these two subunits of the bispecific complex prefer different receptors. The results indicate that bispecific ligands will only exhibit special characteristics when it requires both receptor binding subunits to bind a receptor.</w:t>
       </w:r>
     </w:p>
     <w:p>
@@ -9111,7 +9172,7 @@
         <w:pStyle w:val="FirstParagraph"/>
       </w:pPr>
       <w:r>
-        <w:t xml:space="preserve">Each strategy described above provided selectivity benefits in distinct situations, suggesting that they might synergistically improve selectivity when combined. We explored this potential synergy using mathematical optimization to determine the ligand specifications which provided optimal selectivity for our theoretical cell populations. More specifically, we optimized the selectivity of a ligand for a particular population, while considering all other populations to be off-target. Our optimization allowed for ligand characteristics to vary within biologically plausible bounds; which characteristics we allowed to vary defined our examination of the efficacy of our various ligand engineering strategies. We examined optimizing affinity alone, mixture along with affinity, and valency along with affinity, and finally combined all three strategies (Fig.</w:t>
+        <w:t xml:space="preserve">Each strategy described above provided selectivity benefits in distinct situations, suggesting that they might synergistically improve selectivity when combined. We explored this potential synergy using optimization to determine the ligand specifications which provided optimal selectivity for our theoretical cell populations. More specifically, we optimized the selectivity of a ligand for a particular population, while considering all other populations to be off-target. Our optimization allowed ligand characteristics to vary within biologically plausible bounds; which characteristics we allowed to vary defined our examination of the efficacy of our various ligand engineering strategies. We examined optimizing affinity alone, mixture along with affinity, and valency along with affinity, and finally combined all three strategies (Fig.</w:t>
       </w:r>
       <w:r>
         <w:t xml:space="preserve"> </w:t>
@@ -9377,7 +9438,7 @@
         <w:t xml:space="preserve"> </w:t>
       </w:r>
       <w:r>
-        <w:t xml:space="preserve">a,g,m) Optimal selectivity levels (average ligand bound compared to average ligand bound by all other populations) achieved using various ligand engineering techniques. Ligand concentration</w:t>
+        <w:t xml:space="preserve">a,g,m) Optimal selectivity levels (ligand bound on target population divided by average ligand bound by all other populations) achieved using various ligand engineering techniques. Ligand concentration</w:t>
       </w:r>
       <w:r>
         <w:t xml:space="preserve"> </w:t>
@@ -9425,6 +9486,9 @@
           <m:t>1</m:t>
         </m:r>
         <m:r>
+          <m:t> </m:t>
+        </m:r>
+        <m:r>
           <m:rPr>
             <m:sty m:val="p"/>
           </m:rPr>
@@ -9451,6 +9515,9 @@
           <m:t>10</m:t>
         </m:r>
         <m:r>
+          <m:t> </m:t>
+        </m:r>
+        <m:r>
           <m:rPr>
             <m:sty m:val="p"/>
           </m:rPr>
@@ -9475,6 +9542,9 @@
       <m:oMath>
         <m:r>
           <m:t>0.1</m:t>
+        </m:r>
+        <m:r>
+          <m:t> </m:t>
         </m:r>
         <m:r>
           <m:rPr>
@@ -9819,7 +9889,7 @@
         <w:t xml:space="preserve"> </w:t>
       </w:r>
       <w:r>
-        <w:t xml:space="preserve">a,g,m) Optimal selectivity levels (average ligand bound compared to average ligand bound by all other populations) achieved using various ligand engineering techniques. Ligand concentration</w:t>
+        <w:t xml:space="preserve">a,g,m) Optimal selectivity levels (ligand bound on target population divided by average ligand bound by all other populations) achieved using various ligand engineering techniques. Ligand concentration</w:t>
       </w:r>
       <w:r>
         <w:t xml:space="preserve"> </w:t>
@@ -9867,6 +9937,9 @@
           <m:t>1</m:t>
         </m:r>
         <m:r>
+          <m:t> </m:t>
+        </m:r>
+        <m:r>
           <m:rPr>
             <m:sty m:val="p"/>
           </m:rPr>
@@ -9893,6 +9966,9 @@
           <m:t>10</m:t>
         </m:r>
         <m:r>
+          <m:t> </m:t>
+        </m:r>
+        <m:r>
           <m:rPr>
             <m:sty m:val="p"/>
           </m:rPr>
@@ -9917,6 +9993,9 @@
       <m:oMath>
         <m:r>
           <m:t>0.1</m:t>
+        </m:r>
+        <m:r>
+          <m:t> </m:t>
         </m:r>
         <m:r>
           <m:rPr>
@@ -11055,7 +11134,7 @@
         <w:pStyle w:val="FirstParagraph"/>
       </w:pPr>
       <w:r>
-        <w:t xml:space="preserve">Here, we developed and employed a multivalent, multi-ligand, multi-receptor binding model to explore the effectiveness of various ligand engineering strategies for population-selective binding (Fig.</w:t>
+        <w:t xml:space="preserve">Here, we developed and employed a multivalent, multi-ligand, multi-receptor binding model and used it to explore the effectiveness of various ligand engineering strategies for population-selective binding (Fig.</w:t>
       </w:r>
       <w:r>
         <w:t xml:space="preserve"> </w:t>
@@ -11301,7 +11380,7 @@
         <w:t xml:space="preserve"> </w:t>
       </w:r>
       <w:r>
-        <w:t xml:space="preserve">the expression of certain receptors. In this case, both the current and potential abundance of each receptor must be considered. While this work does not address many of these issues, we propose that using a computational binding model can analyze these strategies quantitatively and collectively from a mechanistic perspective. Even when the absolute mathematically optimal ligand characteristics cannot be achieved biochemically, our analyses provide good guidance to what is attainable and how to approach the optimum, accounting for implementation feasibility and facilitating the implementation of strategy combinations.</w:t>
+        <w:t xml:space="preserve">the expression of certain receptors. In this case, both the current and potential abundance of each receptor must be considered. While this work does not address many of these issues, we propose that using a computational binding model can analyze these strategies quantitatively and collectively from a mechanistic perspective. Even when the absolute mathematically optimal ligand characteristics cannot be achieved biochemically, our analyses provide guidance within the bounds of what is attainable and how to approach the optimum, accounting for implementation feasibility and facilitating the implementation of strategy combinations.</w:t>
       </w:r>
     </w:p>
     <w:p>
@@ -11335,7 +11414,7 @@
         </w:r>
       </w:hyperlink>
       <w:r>
-        <w:t xml:space="preserve"> These technologies bypass ligand-receptor binding restrictions by allowing recognition in signaling response. However, we have shown here that selectivity can often be attained with relatively simple therapeutic ligands. This study lays the framework for how ligand engineering can be directed using computational modeling. It should be noted that the application of this logic is reliant on knowledge of the target and off-target cell population receptor expression levels. Future application of the ligand binding logic described in this study could be guided using high-throughput single-cell profiling techniques, such as RNA-seq or high-parameter flow cytometry. A computational tool that could directly translate such datasets into ligand design criteria may represent a potential avenue for the translation of our analyses into a more broadly applicable ligand engineering tool.</w:t>
+        <w:t xml:space="preserve"> These technologies bypass ligand-receptor binding restrictions by allowing recognition in signaling response. However, we have shown here that selectivity can often be attained with relatively simple therapeutic ligands. This study lays the framework for how ligand engineering can be directed using computational modeling. It should be noted that the application of this logic is reliant on knowledge of the target and off-target cell population receptor expression levels. Future application of the ligand binding logic described in this study could be guided using high-throughput single-cell profiling techniques, such as RNA-seq or high-parameter flow cytometry. A computational tool that could directly translate such datasets into ligand design criteria, selecting among potential receptor targets, may represent a potential avenue for the translation of our analyses into a more broadly applicable ligand engineering tool.</w:t>
       </w:r>
     </w:p>
     <w:bookmarkEnd w:id="46"/>
@@ -14750,6 +14829,9 @@
           <m:t>1</m:t>
         </m:r>
         <m:r>
+          <m:t> </m:t>
+        </m:r>
+        <m:r>
           <m:rPr>
             <m:sty m:val="p"/>
           </m:rPr>
@@ -14787,9 +14869,17 @@
             </m:r>
           </m:sup>
         </m:sSup>
-        <m:r>
-          <m:t>∼</m:t>
-        </m:r>
+      </m:oMath>
+      <w:r>
+        <w:t xml:space="preserve"> </w:t>
+      </w:r>
+      <w:r>
+        <w:t xml:space="preserve">to</w:t>
+      </w:r>
+      <w:r>
+        <w:t xml:space="preserve"> </w:t>
+      </w:r>
+      <m:oMath>
         <m:sSup>
           <m:e>
             <m:r>
@@ -14854,6 +14944,9 @@
       <m:oMath>
         <m:r>
           <m:t>10</m:t>
+        </m:r>
+        <m:r>
+          <m:t> </m:t>
         </m:r>
         <m:r>
           <m:rPr>
@@ -14867,11 +14960,22 @@
           </m:rPr>
           <m:t>M</m:t>
         </m:r>
-        <m:r>
-          <m:t>∼</m:t>
-        </m:r>
+      </m:oMath>
+      <w:r>
+        <w:t xml:space="preserve"> </w:t>
+      </w:r>
+      <w:r>
+        <w:t xml:space="preserve">to</w:t>
+      </w:r>
+      <w:r>
+        <w:t xml:space="preserve"> </w:t>
+      </w:r>
+      <m:oMath>
         <m:r>
           <m:t>0.1</m:t>
+        </m:r>
+        <m:r>
+          <m:t> </m:t>
         </m:r>
         <m:r>
           <m:rPr>
@@ -15055,7 +15159,39 @@
         <w:t xml:space="preserve"> </w:t>
       </w:r>
       <w:r>
-        <w:t xml:space="preserve">fibronectin receptors per cell bound to nanorings expressing one, two, four or eight fibronectin binding domains at concentrations of 0.16–500 nM. C5 and B22 are high and low affinity fibronectin binding domains respectively. Using nonlinear least-squares regression, the crosslinking coeffient was found to be</w:t>
+        <w:t xml:space="preserve">fibronectin receptors per cell bound to nanorings expressing one, two, four or eight fibronectin binding domains at concentrations of</w:t>
+      </w:r>
+      <w:r>
+        <w:t xml:space="preserve"> </w:t>
+      </w:r>
+      <m:oMath>
+        <m:r>
+          <m:t>0.16</m:t>
+        </m:r>
+        <m:r>
+          <m:t>–</m:t>
+        </m:r>
+        <m:r>
+          <m:t>500</m:t>
+        </m:r>
+        <m:r>
+          <m:t> </m:t>
+        </m:r>
+        <m:r>
+          <m:rPr>
+            <m:sty m:val="p"/>
+          </m:rPr>
+          <m:t>n</m:t>
+        </m:r>
+        <m:r>
+          <m:rPr>
+            <m:sty m:val="p"/>
+          </m:rPr>
+          <m:t>M</m:t>
+        </m:r>
+      </m:oMath>
+      <w:r>
+        <w:t xml:space="preserve">. C5 and B22 are high and low affinity fibronectin binding domains respectively. Using nonlinear least-squares regression, the crosslinking coefficient was found to be</w:t>
       </w:r>
       <w:r>
         <w:t xml:space="preserve"> </w:t>
@@ -15084,62 +15220,59 @@
         </m:sSup>
       </m:oMath>
       <w:r>
-        <w:t xml:space="preserve">; the association constants for C5 and B22 were found to be</w:t>
-      </w:r>
-      <w:r>
-        <w:t xml:space="preserve"> </w:t>
-      </w:r>
-      <m:oMath>
-        <m:r>
-          <m:t>5.78</m:t>
-        </m:r>
-        <m:r>
-          <m:t>×</m:t>
-        </m:r>
-        <m:sSup>
-          <m:e>
-            <m:r>
-              <m:t>10</m:t>
-            </m:r>
-          </m:e>
-          <m:sup>
-            <m:r>
-              <m:t>−</m:t>
-            </m:r>
-            <m:r>
-              <m:t>5</m:t>
-            </m:r>
-          </m:sup>
-        </m:sSup>
-      </m:oMath>
-      <w:r>
-        <w:t xml:space="preserve">,</w:t>
-      </w:r>
-      <w:r>
-        <w:t xml:space="preserve"> </w:t>
-      </w:r>
-      <m:oMath>
-        <m:r>
-          <m:t>3.08</m:t>
-        </m:r>
-        <m:r>
-          <m:t>×</m:t>
-        </m:r>
-        <m:sSup>
-          <m:e>
-            <m:r>
-              <m:t>10</m:t>
-            </m:r>
-          </m:e>
-          <m:sup>
-            <m:r>
-              <m:t>−</m:t>
-            </m:r>
-            <m:r>
-              <m:t>12</m:t>
-            </m:r>
-          </m:sup>
-        </m:sSup>
+        <w:t xml:space="preserve">; the dissociation constants for C5 and B22 were found to be</w:t>
+      </w:r>
+      <w:r>
+        <w:t xml:space="preserve"> </w:t>
+      </w:r>
+      <m:oMath>
+        <m:r>
+          <m:t>1.73</m:t>
+        </m:r>
+        <m:r>
+          <m:t> </m:t>
+        </m:r>
+        <m:r>
+          <m:rPr>
+            <m:sty m:val="p"/>
+          </m:rPr>
+          <m:t>μ</m:t>
+        </m:r>
+        <m:r>
+          <m:rPr>
+            <m:sty m:val="p"/>
+          </m:rPr>
+          <m:t>M</m:t>
+        </m:r>
+      </m:oMath>
+      <w:r>
+        <w:t xml:space="preserve"> </w:t>
+      </w:r>
+      <w:r>
+        <w:t xml:space="preserve">and</w:t>
+      </w:r>
+      <w:r>
+        <w:t xml:space="preserve"> </w:t>
+      </w:r>
+      <m:oMath>
+        <m:r>
+          <m:t>3.24</m:t>
+        </m:r>
+        <m:r>
+          <m:t> </m:t>
+        </m:r>
+        <m:r>
+          <m:rPr>
+            <m:sty m:val="p"/>
+          </m:rPr>
+          <m:t>μ</m:t>
+        </m:r>
+        <m:r>
+          <m:rPr>
+            <m:sty m:val="p"/>
+          </m:rPr>
+          <m:t>M</m:t>
+        </m:r>
       </m:oMath>
       <w:r>
         <w:t xml:space="preserve"> </w:t>
@@ -15152,7 +15285,7 @@
       </w:r>
       <m:oMath>
         <m:r>
-          <m:t>5.0</m:t>
+          <m:t>5.1</m:t>
         </m:r>
         <m:r>
           <m:t>×</m:t>
@@ -15382,7 +15515,39 @@
         <w:t xml:space="preserve"> </w:t>
       </w:r>
       <w:r>
-        <w:t xml:space="preserve">fibronectin receptors per cell bound to nanorings expressing one, two, four or eight fibronectin binding domains at concentrations of 0.16–500 nM. C5 and B22 are high and low affinity fibronectin binding domains respectively. Using nonlinear least-squares regression, the crosslinking coeffient was found to be</w:t>
+        <w:t xml:space="preserve">fibronectin receptors per cell bound to nanorings expressing one, two, four or eight fibronectin binding domains at concentrations of</w:t>
+      </w:r>
+      <w:r>
+        <w:t xml:space="preserve"> </w:t>
+      </w:r>
+      <m:oMath>
+        <m:r>
+          <m:t>0.16</m:t>
+        </m:r>
+        <m:r>
+          <m:t>–</m:t>
+        </m:r>
+        <m:r>
+          <m:t>500</m:t>
+        </m:r>
+        <m:r>
+          <m:t> </m:t>
+        </m:r>
+        <m:r>
+          <m:rPr>
+            <m:sty m:val="p"/>
+          </m:rPr>
+          <m:t>n</m:t>
+        </m:r>
+        <m:r>
+          <m:rPr>
+            <m:sty m:val="p"/>
+          </m:rPr>
+          <m:t>M</m:t>
+        </m:r>
+      </m:oMath>
+      <w:r>
+        <w:t xml:space="preserve">. C5 and B22 are high and low affinity fibronectin binding domains respectively. Using nonlinear least-squares regression, the crosslinking coefficient was found to be</w:t>
       </w:r>
       <w:r>
         <w:t xml:space="preserve"> </w:t>
@@ -15411,62 +15576,59 @@
         </m:sSup>
       </m:oMath>
       <w:r>
-        <w:t xml:space="preserve">; the association constants for C5 and B22 were found to be</w:t>
-      </w:r>
-      <w:r>
-        <w:t xml:space="preserve"> </w:t>
-      </w:r>
-      <m:oMath>
-        <m:r>
-          <m:t>5.78</m:t>
-        </m:r>
-        <m:r>
-          <m:t>×</m:t>
-        </m:r>
-        <m:sSup>
-          <m:e>
-            <m:r>
-              <m:t>10</m:t>
-            </m:r>
-          </m:e>
-          <m:sup>
-            <m:r>
-              <m:t>−</m:t>
-            </m:r>
-            <m:r>
-              <m:t>5</m:t>
-            </m:r>
-          </m:sup>
-        </m:sSup>
-      </m:oMath>
-      <w:r>
-        <w:t xml:space="preserve">,</w:t>
-      </w:r>
-      <w:r>
-        <w:t xml:space="preserve"> </w:t>
-      </w:r>
-      <m:oMath>
-        <m:r>
-          <m:t>3.08</m:t>
-        </m:r>
-        <m:r>
-          <m:t>×</m:t>
-        </m:r>
-        <m:sSup>
-          <m:e>
-            <m:r>
-              <m:t>10</m:t>
-            </m:r>
-          </m:e>
-          <m:sup>
-            <m:r>
-              <m:t>−</m:t>
-            </m:r>
-            <m:r>
-              <m:t>12</m:t>
-            </m:r>
-          </m:sup>
-        </m:sSup>
+        <w:t xml:space="preserve">; the dissociation constants for C5 and B22 were found to be</w:t>
+      </w:r>
+      <w:r>
+        <w:t xml:space="preserve"> </w:t>
+      </w:r>
+      <m:oMath>
+        <m:r>
+          <m:t>1.73</m:t>
+        </m:r>
+        <m:r>
+          <m:t> </m:t>
+        </m:r>
+        <m:r>
+          <m:rPr>
+            <m:sty m:val="p"/>
+          </m:rPr>
+          <m:t>μ</m:t>
+        </m:r>
+        <m:r>
+          <m:rPr>
+            <m:sty m:val="p"/>
+          </m:rPr>
+          <m:t>M</m:t>
+        </m:r>
+      </m:oMath>
+      <w:r>
+        <w:t xml:space="preserve"> </w:t>
+      </w:r>
+      <w:r>
+        <w:t xml:space="preserve">and</w:t>
+      </w:r>
+      <w:r>
+        <w:t xml:space="preserve"> </w:t>
+      </w:r>
+      <m:oMath>
+        <m:r>
+          <m:t>3.24</m:t>
+        </m:r>
+        <m:r>
+          <m:t> </m:t>
+        </m:r>
+        <m:r>
+          <m:rPr>
+            <m:sty m:val="p"/>
+          </m:rPr>
+          <m:t>μ</m:t>
+        </m:r>
+        <m:r>
+          <m:rPr>
+            <m:sty m:val="p"/>
+          </m:rPr>
+          <m:t>M</m:t>
+        </m:r>
       </m:oMath>
       <w:r>
         <w:t xml:space="preserve"> </w:t>
@@ -15479,7 +15641,7 @@
       </w:r>
       <m:oMath>
         <m:r>
-          <m:t>5.0</m:t>
+          <m:t>5.1</m:t>
         </m:r>
         <m:r>
           <m:t>×</m:t>

</xml_diff>

<commit_message>
Deploying to gh-pages from  @ 1ecba3296ec00decd4269b785a854f5c2ddd813a 🚀
</commit_message>
<xml_diff>
--- a/manuscript.docx
+++ b/manuscript.docx
@@ -78,20 +78,21 @@
         <w:t xml:space="preserve"> </w:t>
       </w:r>
       <w:r>
-        <w:t xml:space="preserve">was automatically generated on November 24, 2020.</w:t>
+        <w:t xml:space="preserve">was automatically generated on November 25, 2020.</w:t>
       </w:r>
       <w:r>
         <w:t xml:space="preserve"> </w:t>
       </w:r>
     </w:p>
-    <w:bookmarkStart w:id="27" w:name="authors"/>
     <w:p>
       <w:pPr>
         <w:pStyle w:val="Heading2"/>
       </w:pPr>
+      <w:bookmarkStart w:id="20" w:name="authors"/>
       <w:r>
         <w:t xml:space="preserve">Authors</w:t>
       </w:r>
+      <w:bookmarkEnd w:id="20"/>
     </w:p>
     <w:p>
       <w:pPr>
@@ -115,7 +116,7 @@
       <w:r>
         <w:t xml:space="preserve"> </w:t>
       </w:r>
-      <w:hyperlink r:id="rId20">
+      <w:hyperlink r:id="rId21">
         <w:r>
           <w:rPr>
             <w:rStyle w:val="Hyperlink"/>
@@ -132,7 +133,7 @@
       <w:r>
         <w:t xml:space="preserve"> </w:t>
       </w:r>
-      <w:hyperlink r:id="rId21">
+      <w:hyperlink r:id="rId22">
         <w:r>
           <w:rPr>
             <w:rStyle w:val="Hyperlink"/>
@@ -175,7 +176,7 @@
       <w:r>
         <w:t xml:space="preserve"> </w:t>
       </w:r>
-      <w:hyperlink r:id="rId22">
+      <w:hyperlink r:id="rId23">
         <w:r>
           <w:rPr>
             <w:rStyle w:val="Hyperlink"/>
@@ -192,7 +193,7 @@
       <w:r>
         <w:t xml:space="preserve"> </w:t>
       </w:r>
-      <w:hyperlink r:id="rId23">
+      <w:hyperlink r:id="rId24">
         <w:r>
           <w:rPr>
             <w:rStyle w:val="Hyperlink"/>
@@ -235,7 +236,7 @@
       <w:r>
         <w:t xml:space="preserve"> </w:t>
       </w:r>
-      <w:hyperlink r:id="rId24">
+      <w:hyperlink r:id="rId25">
         <w:r>
           <w:rPr>
             <w:rStyle w:val="Hyperlink"/>
@@ -248,23 +249,6 @@
       </w:r>
       <w:r>
         <w:t xml:space="preserve">· Github</w:t>
-      </w:r>
-      <w:r>
-        <w:t xml:space="preserve"> </w:t>
-      </w:r>
-      <w:hyperlink r:id="rId25">
-        <w:r>
-          <w:rPr>
-            <w:rStyle w:val="Hyperlink"/>
-          </w:rPr>
-          <w:t xml:space="preserve">aarmey</w:t>
-        </w:r>
-      </w:hyperlink>
-      <w:r>
-        <w:t xml:space="preserve"> </w:t>
-      </w:r>
-      <w:r>
-        <w:t xml:space="preserve">· twitter</w:t>
       </w:r>
       <w:r>
         <w:t xml:space="preserve"> </w:t>
@@ -281,6 +265,23 @@
         <w:t xml:space="preserve"> </w:t>
       </w:r>
       <w:r>
+        <w:t xml:space="preserve">· twitter</w:t>
+      </w:r>
+      <w:r>
+        <w:t xml:space="preserve"> </w:t>
+      </w:r>
+      <w:hyperlink r:id="rId27">
+        <w:r>
+          <w:rPr>
+            <w:rStyle w:val="Hyperlink"/>
+          </w:rPr>
+          <w:t xml:space="preserve">aarmey</w:t>
+        </w:r>
+      </w:hyperlink>
+      <w:r>
+        <w:t xml:space="preserve"> </w:t>
+      </w:r>
+      <w:r>
         <w:t xml:space="preserve"> </w:t>
       </w:r>
       <w:r>
@@ -290,15 +291,15 @@
         <w:t xml:space="preserve"> </w:t>
       </w:r>
     </w:p>
-    <w:bookmarkEnd w:id="27"/>
-    <w:bookmarkStart w:id="28" w:name="abstract"/>
     <w:p>
       <w:pPr>
         <w:pStyle w:val="Heading2"/>
       </w:pPr>
+      <w:bookmarkStart w:id="28" w:name="abstract"/>
       <w:r>
         <w:t xml:space="preserve">Abstract</w:t>
       </w:r>
+      <w:bookmarkEnd w:id="28"/>
     </w:p>
     <w:p>
       <w:pPr>
@@ -308,15 +309,15 @@
         <w:t xml:space="preserve">A critical property of many therapies is their selective binding to specific target populations. Exceptional specificity can arise from high-affinity binding to unique cell surface targets. In many cases, however, therapeutic targets are only expressed at subtly different levels relative to off-target cells. More complex binding strategies have been developed to overcome this limitation, including multi-specific and multi-valent molecules, but these create a combinatorial explosion of design possibilities. Therefore, guiding strategies for developing cell-specific binding are critical to employ these tools. Here, we extend a multi-valent binding model to multi-ligand and multi-receptor interactions. Using this model, we explore a series of mechanisms to engineer cell selectivity, including mixtures of molecules, affinity adjustments, and valency changes. Each of these strategies maximizes selectivity in distinct cases, leading to synergistic improvements when used in combination. Finally, we identify situations in which selectivity cannot be derived through passive binding alone to highlight areas in need of new developments. In total, this work uses a quantitative model to unify a comprehensive set of design guidelines for engineering cell-specific therapies.</w:t>
       </w:r>
     </w:p>
-    <w:bookmarkEnd w:id="28"/>
-    <w:bookmarkStart w:id="29" w:name="summary-points"/>
     <w:p>
       <w:pPr>
         <w:pStyle w:val="Heading2"/>
       </w:pPr>
+      <w:bookmarkStart w:id="29" w:name="summary-points"/>
       <w:r>
         <w:t xml:space="preserve">Summary points</w:t>
       </w:r>
+      <w:bookmarkEnd w:id="29"/>
     </w:p>
     <w:p>
       <w:pPr>
@@ -366,15 +367,15 @@
         <w:t xml:space="preserve">A simple, multivalent ligand-receptor binding model can help to direct therapeutic engineering.</w:t>
       </w:r>
     </w:p>
-    <w:bookmarkEnd w:id="29"/>
-    <w:bookmarkStart w:id="30" w:name="introduction"/>
     <w:p>
       <w:pPr>
         <w:pStyle w:val="Heading2"/>
       </w:pPr>
+      <w:bookmarkStart w:id="30" w:name="introduction"/>
       <w:r>
         <w:t xml:space="preserve">Introduction</w:t>
       </w:r>
+      <w:bookmarkEnd w:id="30"/>
     </w:p>
     <w:p>
       <w:pPr>
@@ -383,53 +384,58 @@
       <w:r>
         <w:t xml:space="preserve">Many drugs both derive their therapeutic benefit and avoid toxicity through selective binding to specific cells within the body. Often, target cells can differ from off-target populations only subtly in surface receptor expression, making selective activation of target cells difficult to achieve. Even with a drug of very specific molecular binding, genetic and non-genetic heterogeneity can create a wide distribution of cell responses. This can result in reduced effectiveness and increased toxicity. Specific cell targeting is a universal challenge in protein-based therapies. For example, in cancer, resistance to anti-tumor antibodies,</w:t>
       </w:r>
-      <w:hyperlink w:anchor="ref-doi:10.1158/1078-0432.CCR-09-1735">
+      <w:hyperlink w:anchor="ref-dr9JS306">
         <w:r>
           <w:rPr>
             <w:rStyle w:val="Hyperlink"/>
-            <w:b/>
             <w:vertAlign w:val="superscript"/>
           </w:rPr>
-          <w:t xml:space="preserve">doi:10.1158/1078-0432.CCR-09-1735?</w:t>
+          <w:t xml:space="preserve">1</w:t>
         </w:r>
       </w:hyperlink>
       <w:r>
-        <w:t xml:space="preserve"> targeted inhibitors,</w:t>
-      </w:r>
-      <w:hyperlink w:anchor="ref-pmid:20129249">
+        <w:t xml:space="preserve"> </w:t>
+      </w:r>
+      <w:r>
+        <w:t xml:space="preserve">targeted inhibitors,</w:t>
+      </w:r>
+      <w:hyperlink w:anchor="ref-QzzeTuTF">
         <w:r>
           <w:rPr>
             <w:rStyle w:val="Hyperlink"/>
-            <w:b/>
             <w:vertAlign w:val="superscript"/>
           </w:rPr>
-          <w:t xml:space="preserve">pmid:20129249?</w:t>
+          <w:t xml:space="preserve">2</w:t>
         </w:r>
       </w:hyperlink>
       <w:r>
-        <w:t xml:space="preserve"> chemotherapies,</w:t>
-      </w:r>
-      <w:hyperlink w:anchor="ref-doi:10.1016/j.cell.2016.03.025">
+        <w:t xml:space="preserve"> </w:t>
+      </w:r>
+      <w:r>
+        <w:t xml:space="preserve">chemotherapies,</w:t>
+      </w:r>
+      <w:hyperlink w:anchor="ref-10v4cJsaH">
         <w:r>
           <w:rPr>
             <w:rStyle w:val="Hyperlink"/>
-            <w:b/>
             <w:vertAlign w:val="superscript"/>
           </w:rPr>
-          <w:t xml:space="preserve">doi:10.1016/j.cell.2016.03.025?</w:t>
+          <w:t xml:space="preserve">3</w:t>
         </w:r>
       </w:hyperlink>
       <w:r>
-        <w:t xml:space="preserve"> and chimeric antigen receptor T cells</w:t>
-      </w:r>
-      <w:hyperlink w:anchor="ref-doi:10.1056/NEJMoa1407222">
+        <w:t xml:space="preserve"> </w:t>
+      </w:r>
+      <w:r>
+        <w:t xml:space="preserve">and chimeric antigen receptor T cells</w:t>
+      </w:r>
+      <w:hyperlink w:anchor="ref-qUZcGLd9">
         <w:r>
           <w:rPr>
             <w:rStyle w:val="Hyperlink"/>
-            <w:b/>
             <w:vertAlign w:val="superscript"/>
           </w:rPr>
-          <w:t xml:space="preserve">doi:10.1056/NEJMoa1407222?</w:t>
+          <w:t xml:space="preserve">4</w:t>
         </w:r>
       </w:hyperlink>
       <w:r>
@@ -438,14 +444,13 @@
         </w:rPr>
         <w:t xml:space="preserve">,</w:t>
       </w:r>
-      <w:hyperlink w:anchor="ref-doi:10.1126/scitranslmed.aaa0984">
+      <w:hyperlink w:anchor="ref-63ewQnLP">
         <w:r>
           <w:rPr>
             <w:rStyle w:val="Hyperlink"/>
-            <w:b/>
             <w:vertAlign w:val="superscript"/>
           </w:rPr>
-          <w:t xml:space="preserve">doi:10.1126/scitranslmed.aaa0984?</w:t>
+          <w:t xml:space="preserve">5</w:t>
         </w:r>
       </w:hyperlink>
       <w:r>
@@ -454,18 +459,20 @@
       <w:r>
         <w:t xml:space="preserve">all can arise through the selection of target cells among heterogeneous cell populations. While the immune system takes advantage of heterogeneity at the single-cell level to translate noisy inflammatory signals into robust yet sensitive responses,</w:t>
       </w:r>
-      <w:hyperlink w:anchor="ref-PMID:24919153">
+      <w:hyperlink w:anchor="ref-3qk2Wsrw">
         <w:r>
           <w:rPr>
             <w:rStyle w:val="Hyperlink"/>
-            <w:b/>
             <w:vertAlign w:val="superscript"/>
           </w:rPr>
-          <w:t xml:space="preserve">PMID:24919153?</w:t>
+          <w:t xml:space="preserve">6</w:t>
         </w:r>
       </w:hyperlink>
       <w:r>
-        <w:t xml:space="preserve"> this heterogeneity impedes our effort of creating a highly specific drug. The intricacies of both inter-population receptor expression differences and intra-population receptor expression heterogeneity present significant challenges that limit the selectivity of therapies within the body.</w:t>
+        <w:t xml:space="preserve"> </w:t>
+      </w:r>
+      <w:r>
+        <w:t xml:space="preserve">this heterogeneity impedes our effort of creating a highly specific drug. The intricacies of both inter-population receptor expression differences and intra-population receptor expression heterogeneity present significant challenges that limit the selectivity of therapies within the body.</w:t>
       </w:r>
     </w:p>
     <w:p>
@@ -475,63 +482,50 @@
       <w:r>
         <w:t xml:space="preserve">Further improving cell-specific targeting will require new strategies of engineering specificity. Non-cellular therapies such as protein therapies have most extensively been engineered to target specific cell types through mutations that provide high-affinity binding to unique surface antigens.</w:t>
       </w:r>
-      <w:hyperlink w:anchor="ref-pmid:25992859">
+      <w:hyperlink w:anchor="ref-pF89Nm4u">
         <w:r>
           <w:rPr>
             <w:rStyle w:val="Hyperlink"/>
-            <w:b/>
             <w:vertAlign w:val="superscript"/>
           </w:rPr>
-          <w:t xml:space="preserve">pmid:25992859?</w:t>
+          <w:t xml:space="preserve">7</w:t>
         </w:r>
       </w:hyperlink>
       <w:r>
-        <w:t xml:space="preserve"> This strategy can enhance specificity, but only to a limited degree, particularly when target cells can only be distinguished by subtle quantitative differences in surface antigen or by combinations of markers. The limitations of single-antigen targeting have led to efforts to program complex logic into cellular therapies to recognize target cells more specifically.</w:t>
-      </w:r>
-      <w:hyperlink w:anchor="ref-doi:10.1126/science.aay2790">
+        <w:t xml:space="preserve"> </w:t>
+      </w:r>
+      <w:r>
+        <w:t xml:space="preserve">This strategy can enhance specificity, but only to a limited degree, particularly when target cells can only be distinguished by subtle quantitative differences in surface antigen or by combinations of markers. The limitations of single-antigen targeting have led to efforts to program complex logic into cellular therapies to recognize target cells more specifically.</w:t>
+      </w:r>
+      <w:hyperlink w:anchor="ref-GCbN2SKa">
         <w:r>
           <w:rPr>
             <w:rStyle w:val="Hyperlink"/>
-            <w:b/>
             <w:vertAlign w:val="superscript"/>
           </w:rPr>
-          <w:t xml:space="preserve">doi:10.1126/science.aay2790?</w:t>
+          <w:t xml:space="preserve">8</w:t>
         </w:r>
       </w:hyperlink>
       <w:r>
         <w:rPr>
           <w:vertAlign w:val="superscript"/>
         </w:rPr>
-        <w:t xml:space="preserve">,</w:t>
-      </w:r>
-      <w:hyperlink w:anchor="ref-pmid:30889382">
+        <w:t xml:space="preserve">–</w:t>
+      </w:r>
+      <w:hyperlink w:anchor="ref-TZjxCK1M">
         <w:r>
           <w:rPr>
             <w:rStyle w:val="Hyperlink"/>
-            <w:b/>
             <w:vertAlign w:val="superscript"/>
           </w:rPr>
-          <w:t xml:space="preserve">pmid:30889382?</w:t>
+          <w:t xml:space="preserve">10</w:t>
         </w:r>
       </w:hyperlink>
       <w:r>
-        <w:rPr>
-          <w:vertAlign w:val="superscript"/>
-        </w:rPr>
-        <w:t xml:space="preserve">,</w:t>
-      </w:r>
-      <w:hyperlink w:anchor="ref-doi:10.1016/j.cell.2018.03.038">
-        <w:r>
-          <w:rPr>
-            <w:rStyle w:val="Hyperlink"/>
-            <w:b/>
-            <w:vertAlign w:val="superscript"/>
-          </w:rPr>
-          <w:t xml:space="preserve">doi:10.1016/j.cell.2018.03.038?</w:t>
-        </w:r>
-      </w:hyperlink>
-      <w:r>
-        <w:t xml:space="preserve"> However, non-cellular therapies have considerable benefits in drug access, manufacturing, and reliability; some of the same benefits have begun to be engineered into these agents.</w:t>
+        <w:t xml:space="preserve"> </w:t>
+      </w:r>
+      <w:r>
+        <w:t xml:space="preserve">However, non-cellular therapies have considerable benefits in drug access, manufacturing, and reliability; some of the same benefits have begun to be engineered into these agents.</w:t>
       </w:r>
     </w:p>
     <w:p>
@@ -541,45 +535,48 @@
       <w:r>
         <w:t xml:space="preserve">The enormous number of potential configurations of ligand designs make computational tools essential for designing highly selective therapies.</w:t>
       </w:r>
-      <w:hyperlink w:anchor="ref-doi:10.1101/812131">
+      <w:hyperlink w:anchor="ref-12Gx1OssI">
         <w:r>
           <w:rPr>
             <w:rStyle w:val="Hyperlink"/>
-            <w:b/>
             <w:vertAlign w:val="superscript"/>
           </w:rPr>
-          <w:t xml:space="preserve">doi:10.1101/812131?</w:t>
+          <w:t xml:space="preserve">11</w:t>
         </w:r>
       </w:hyperlink>
       <w:r>
-        <w:t xml:space="preserve"> Here, we analyze a suite of molecular approaches for engineering cell-specific binding using a multi-valent, multi-receptor, multi-ligand binding model. We show that strategies including affinity, valency, binding competition, ligand mixtures, and hetero-valent complexes provide distinct improvements in cell-specific targeting. Finally, we combine these strategies to target cells through combinatorial methods. In total, our results demonstrate that multi-valent ligands can offer offer effective cell specific targeting without the need to engineer complex cellular therapies, and that their design can be guided using a mechanistic binding model.</w:t>
+        <w:t xml:space="preserve"> </w:t>
+      </w:r>
+      <w:r>
+        <w:t xml:space="preserve">Here, we analyze a suite of molecular approaches for engineering cell-specific binding using a multi-valent, multi-receptor, multi-ligand binding model. We show that strategies including affinity, valency, binding competition, ligand mixtures, and hetero-valent complexes provide distinct improvements in cell-specific targeting. Finally, we combine these strategies to target cells through combinatorial methods. In total, our results demonstrate that multi-valent ligands can offer offer effective cell specific targeting without the need to engineer complex cellular therapies, and that their design can be guided using a mechanistic binding model.</w:t>
       </w:r>
     </w:p>
-    <w:bookmarkEnd w:id="30"/>
-    <w:bookmarkStart w:id="45" w:name="results"/>
     <w:p>
       <w:pPr>
         <w:pStyle w:val="Heading2"/>
       </w:pPr>
+      <w:bookmarkStart w:id="31" w:name="results"/>
       <w:r>
         <w:t xml:space="preserve">Results</w:t>
       </w:r>
+      <w:bookmarkEnd w:id="31"/>
     </w:p>
-    <w:bookmarkStart w:id="32" w:name="Xa70cdaa3dbe889b14a8f05afb46e79dd8fc01bf"/>
     <w:p>
       <w:pPr>
         <w:pStyle w:val="Heading3"/>
       </w:pPr>
+      <w:bookmarkStart w:id="32" w:name="Xa70cdaa3dbe889b14a8f05afb46e79dd8fc01bf"/>
       <w:r>
         <w:t xml:space="preserve">A Model System to Explore the Factors Contributing to Cell Selectivity</w:t>
       </w:r>
+      <w:bookmarkEnd w:id="32"/>
     </w:p>
     <w:bookmarkStart w:id="0" w:name="fig:model"/>
     <w:p>
       <w:pPr>
         <w:pStyle w:val="CaptionedFigure"/>
       </w:pPr>
-      <w:bookmarkStart w:id="31" w:name="fig:model"/>
+      <w:bookmarkStart w:id="33" w:name="fig:model"/>
       <w:r>
         <w:t xml:space="preserve">Figure 1:</w:t>
       </w:r>
@@ -598,7 +595,7 @@
       <w:r>
         <w:t xml:space="preserve">a) A simplified schematic of the binding model. There are two types of receptors and two types of ligand monomers that form a tetravalent complex. b) A cartoon for four cell populations expressing two different receptors at low or high amounts. c) A sample heat/contour map for the model-predicted log ligand bound given the expression of two types of receptors. d) Eight arbitrary theoretical cell populations with various receptor expression profiles.</w:t>
       </w:r>
-      <w:bookmarkEnd w:id="31"/>
+      <w:bookmarkEnd w:id="33"/>
     </w:p>
     <w:p>
       <w:pPr>
@@ -631,50 +628,35 @@
       <w:r>
         <w:t xml:space="preserve">Here we investigate cell-specific targeting quantitatively by extending a multi-valent, multi-ligand equilibrium binding model. Virtually any therapy, including monoclonal antibodies, small-molecule inhibitors, and cytokines, can be thought of as ligands for respective receptors expressed on target cells. Ligand binding to target cells is a necessary first step, and essential for a drug’s intended action. In contrast, binding to off-target cells can result in unintended effects or toxicity. Some cell populations can be distinguished by their expression of a unique receptor not expressed by other populations, but more commonly, target and off-target cells express the same collection of receptors and differ only in their magnitudes of receptor expression. In such situations, engineering drugs to optimize target cell binding while minimizing their binding to off-target cells is an area of ongoing research, and has inspired a myriad of drug design strategies.</w:t>
       </w:r>
-      <w:hyperlink w:anchor="ref-doi:10.1038/sj.bjc.6604700">
+      <w:hyperlink w:anchor="ref-10kZoPeON">
         <w:r>
           <w:rPr>
             <w:rStyle w:val="Hyperlink"/>
-            <w:b/>
             <w:vertAlign w:val="superscript"/>
           </w:rPr>
-          <w:t xml:space="preserve">doi:10.1038/sj.bjc.6604700?</w:t>
+          <w:t xml:space="preserve">12</w:t>
         </w:r>
       </w:hyperlink>
       <w:r>
         <w:rPr>
           <w:vertAlign w:val="superscript"/>
         </w:rPr>
-        <w:t xml:space="preserve">,</w:t>
-      </w:r>
-      <w:hyperlink w:anchor="ref-doi:10.1021/cb6003788">
+        <w:t xml:space="preserve">–</w:t>
+      </w:r>
+      <w:hyperlink w:anchor="ref-LOh8Ljpe">
         <w:r>
           <w:rPr>
             <w:rStyle w:val="Hyperlink"/>
-            <w:b/>
             <w:vertAlign w:val="superscript"/>
           </w:rPr>
-          <w:t xml:space="preserve">doi:10.1021/cb6003788?</w:t>
+          <w:t xml:space="preserve">14</w:t>
         </w:r>
       </w:hyperlink>
       <w:r>
-        <w:rPr>
-          <w:vertAlign w:val="superscript"/>
-        </w:rPr>
-        <w:t xml:space="preserve">,</w:t>
-      </w:r>
-      <w:hyperlink w:anchor="ref-doi:10.1038/s41586-018-0830-7">
-        <w:r>
-          <w:rPr>
-            <w:rStyle w:val="Hyperlink"/>
-            <w:b/>
-            <w:vertAlign w:val="superscript"/>
-          </w:rPr>
-          <w:t xml:space="preserve">doi:10.1038/s41586-018-0830-7?</w:t>
-        </w:r>
-      </w:hyperlink>
-      <w:r>
-        <w:t xml:space="preserve"> In this work, we define cell population selectivity as the ratio of the number of ligands bound to target cell populations divided by the number of ligands bound to off-target cell populations. We will use a quantitative binding estimation for each cell population to examine these strategies.</w:t>
+        <w:t xml:space="preserve"> </w:t>
+      </w:r>
+      <w:r>
+        <w:t xml:space="preserve">In this work, we define cell population selectivity as the ratio of the number of ligands bound to target cell populations divided by the number of ligands bound to off-target cell populations. We will use a quantitative binding estimation for each cell population to examine these strategies.</w:t>
       </w:r>
     </w:p>
     <w:p>
@@ -946,18 +928,20 @@
       <w:r>
         <w:t xml:space="preserve">). Alternatively, we can think of moving from one point to another as a change of expression profile for a cell population. This situation might correspond to some cues inducing expression of a receptor, such as interferon-induced upregulation of MHC and regulatory T cell upregulation of IL-2R⍺.</w:t>
       </w:r>
-      <w:hyperlink w:anchor="ref-DOI:10.1073/pnas.0812851107">
+      <w:hyperlink w:anchor="ref-11Hb1fNV6">
         <w:r>
           <w:rPr>
             <w:rStyle w:val="Hyperlink"/>
-            <w:b/>
             <w:vertAlign w:val="superscript"/>
           </w:rPr>
-          <w:t xml:space="preserve">DOI:10.1073/pnas.0812851107?</w:t>
+          <w:t xml:space="preserve">15</w:t>
         </w:r>
       </w:hyperlink>
       <w:r>
-        <w:t xml:space="preserve"> When the amount of receptor 1 (</w:t>
+        <w:t xml:space="preserve"> </w:t>
+      </w:r>
+      <w:r>
+        <w:t xml:space="preserve">When the amount of receptor 1 (</w:t>
       </w:r>
       <m:oMath>
         <m:sSub>
@@ -1304,36 +1288,38 @@
       <w:r>
         <w:t xml:space="preserve">has a wider range. The intrapopulation variance will be accounted for using sigma point filters.</w:t>
       </w:r>
-      <w:hyperlink w:anchor="ref-wikidata:Q99353631">
+      <w:hyperlink w:anchor="ref-VKATSjfe">
         <w:r>
           <w:rPr>
             <w:rStyle w:val="Hyperlink"/>
-            <w:b/>
             <w:vertAlign w:val="superscript"/>
           </w:rPr>
-          <w:t xml:space="preserve">wikidata:Q99353631?</w:t>
+          <w:t xml:space="preserve">16</w:t>
         </w:r>
       </w:hyperlink>
       <w:r>
-        <w:t xml:space="preserve"> We will use this binding model to examine how engineering a ligand using various strategies can improve cell-specific targeting. Although we will only consider two receptor and ligand subunit types respectively, the principles we present can generalize to more complex cases.</w:t>
+        <w:t xml:space="preserve"> </w:t>
+      </w:r>
+      <w:r>
+        <w:t xml:space="preserve">We will use this binding model to examine how engineering a ligand using various strategies can improve cell-specific targeting. Although we will only consider two receptor and ligand subunit types respectively, the principles we present can generalize to more complex cases.</w:t>
       </w:r>
     </w:p>
-    <w:bookmarkEnd w:id="32"/>
-    <w:bookmarkStart w:id="34" w:name="X3f454457126066982ffeefe0ffacd278d4d7c10"/>
     <w:p>
       <w:pPr>
         <w:pStyle w:val="Heading3"/>
       </w:pPr>
+      <w:bookmarkStart w:id="34" w:name="X3f454457126066982ffeefe0ffacd278d4d7c10"/>
       <w:r>
         <w:t xml:space="preserve">Affinity Provides Selectivity Toward Cell Populations with Divergent Receptor Expression</w:t>
       </w:r>
+      <w:bookmarkEnd w:id="34"/>
     </w:p>
     <w:bookmarkStart w:id="0" w:name="fig:affinity"/>
     <w:p>
       <w:pPr>
         <w:pStyle w:val="CaptionedFigure"/>
       </w:pPr>
-      <w:bookmarkStart w:id="33" w:name="fig:affinity"/>
+      <w:bookmarkStart w:id="35" w:name="fig:affinity"/>
       <w:r>
         <w:t xml:space="preserve">Figure 2:</w:t>
       </w:r>
@@ -1927,7 +1913,7 @@
       <w:r>
         <w:t xml:space="preserve">.</w:t>
       </w:r>
-      <w:bookmarkEnd w:id="33"/>
+      <w:bookmarkEnd w:id="35"/>
     </w:p>
     <w:p>
       <w:pPr>
@@ -3940,15 +3926,15 @@
         <w:t xml:space="preserve">are more balanced. Thus, a population’s receptor expression heterogeneity and variation are important factors to consider when modulating ligand affinity.</w:t>
       </w:r>
     </w:p>
-    <w:bookmarkEnd w:id="34"/>
-    <w:bookmarkStart w:id="36" w:name="Xbf61cf771d8dee967b9caf4848bd57facde9c74"/>
     <w:p>
       <w:pPr>
         <w:pStyle w:val="Heading3"/>
       </w:pPr>
+      <w:bookmarkStart w:id="36" w:name="Xbf61cf771d8dee967b9caf4848bd57facde9c74"/>
       <w:r>
         <w:t xml:space="preserve">Valency Enables Selectivity Based on Quantitative Differences in Receptor Abundance</w:t>
       </w:r>
+      <w:bookmarkEnd w:id="36"/>
     </w:p>
     <w:p>
       <w:pPr>
@@ -3971,31 +3957,35 @@
       <w:r>
         <w:t xml:space="preserve">). Our previous work has shown that this binding model can accurately predict the multivalent binding between IgG antibodies and Fcγ receptors.</w:t>
       </w:r>
-      <w:hyperlink w:anchor="ref-pmid:29960887">
+      <w:hyperlink w:anchor="ref-11gk5tUo7">
         <w:r>
           <w:rPr>
             <w:rStyle w:val="Hyperlink"/>
-            <w:b/>
             <w:vertAlign w:val="superscript"/>
           </w:rPr>
-          <w:t xml:space="preserve">pmid:29960887?</w:t>
+          <w:t xml:space="preserve">17</w:t>
         </w:r>
       </w:hyperlink>
       <w:r>
-        <w:t xml:space="preserve"> To further demonstrate our model’s capacity to predict multivalent binding activity, we fit our model to a set of published experimental measurements wherein fluorescently labeled nanorings were assembled with specific numbers of binding units.</w:t>
-      </w:r>
-      <w:hyperlink w:anchor="ref-doi:10.1021/jacs.8b09198">
+        <w:t xml:space="preserve"> </w:t>
+      </w:r>
+      <w:r>
+        <w:t xml:space="preserve">To further demonstrate our model’s capacity to predict multivalent binding activity, we fit our model to a set of published experimental measurements wherein fluorescently labeled nanorings were assembled with specific numbers of binding units.</w:t>
+      </w:r>
+      <w:hyperlink w:anchor="ref-u2Cb0DBq">
         <w:r>
           <w:rPr>
             <w:rStyle w:val="Hyperlink"/>
-            <w:b/>
             <w:vertAlign w:val="superscript"/>
           </w:rPr>
-          <w:t xml:space="preserve">doi:10.1021/jacs.8b09198?</w:t>
+          <w:t xml:space="preserve">18</w:t>
         </w:r>
       </w:hyperlink>
       <w:r>
-        <w:t xml:space="preserve"> After fitting to determine the crosslinking coefficient of multivalent nanorings (</w:t>
+        <w:t xml:space="preserve"> </w:t>
+      </w:r>
+      <w:r>
+        <w:t xml:space="preserve">After fitting to determine the crosslinking coefficient of multivalent nanorings (</w:t>
       </w:r>
       <m:oMath>
         <m:sSubSup>
@@ -4044,18 +4034,20 @@
       <w:r>
         <w:t xml:space="preserve">Multivalent ligand binding differs from monovalent binding in its nonlinear relationship with receptor density, allowing multivalent ligands to potentially selectively target cells based on receptor abundance.</w:t>
       </w:r>
-      <w:hyperlink w:anchor="ref-doi:10.1038/srep40098">
+      <w:hyperlink w:anchor="ref-IanZRiFA">
         <w:r>
           <w:rPr>
             <w:rStyle w:val="Hyperlink"/>
-            <w:b/>
             <w:vertAlign w:val="superscript"/>
           </w:rPr>
-          <w:t xml:space="preserve">doi:10.1038/srep40098?</w:t>
+          <w:t xml:space="preserve">19</w:t>
         </w:r>
       </w:hyperlink>
       <w:r>
-        <w:t xml:space="preserve"> The effects of varying ligand valency are visualized in Fig.</w:t>
+        <w:t xml:space="preserve"> </w:t>
+      </w:r>
+      <w:r>
+        <w:t xml:space="preserve">The effects of varying ligand valency are visualized in Fig.</w:t>
       </w:r>
       <w:r>
         <w:t xml:space="preserve"> </w:t>
@@ -4442,14 +4434,13 @@
       <w:r>
         <w:t xml:space="preserve">Selectivity derived by changing valency requires coordinate changes in affinity. As many previous studies have suggested, multi-valent ligands can demonstrate particular selectivity to target populations with high receptor abundances when their subunits have low affinity to the receptors.</w:t>
       </w:r>
-      <w:hyperlink w:anchor="ref-doi:10.1021/cb6003788">
+      <w:hyperlink w:anchor="ref-B0xrCfE3">
         <w:r>
           <w:rPr>
             <w:rStyle w:val="Hyperlink"/>
-            <w:b/>
             <w:vertAlign w:val="superscript"/>
           </w:rPr>
-          <w:t xml:space="preserve">doi:10.1021/cb6003788?</w:t>
+          <w:t xml:space="preserve">13</w:t>
         </w:r>
       </w:hyperlink>
       <w:r>
@@ -4458,18 +4449,20 @@
         </w:rPr>
         <w:t xml:space="preserve">,</w:t>
       </w:r>
-      <w:hyperlink w:anchor="ref-doi:10.1021/jacs.8b09198">
+      <w:hyperlink w:anchor="ref-u2Cb0DBq">
         <w:r>
           <w:rPr>
             <w:rStyle w:val="Hyperlink"/>
-            <w:b/>
             <w:vertAlign w:val="superscript"/>
           </w:rPr>
-          <w:t xml:space="preserve">doi:10.1021/jacs.8b09198?</w:t>
+          <w:t xml:space="preserve">18</w:t>
         </w:r>
       </w:hyperlink>
       <w:r>
-        <w:t xml:space="preserve"> Comparing binding between cell populations exposed to ligands of variable affinities over a range of ligand valency demonstrates the interplay between these factors (Fig.</w:t>
+        <w:t xml:space="preserve"> </w:t>
+      </w:r>
+      <w:r>
+        <w:t xml:space="preserve">Comparing binding between cell populations exposed to ligands of variable affinities over a range of ligand valency demonstrates the interplay between these factors (Fig.</w:t>
       </w:r>
       <w:r>
         <w:t xml:space="preserve"> </w:t>
@@ -5071,7 +5064,7 @@
       <w:pPr>
         <w:pStyle w:val="CaptionedFigure"/>
       </w:pPr>
-      <w:bookmarkStart w:id="35" w:name="fig:valency"/>
+      <w:bookmarkStart w:id="37" w:name="fig:valency"/>
       <w:r>
         <w:t xml:space="preserve">Figure 3:</w:t>
       </w:r>
@@ -5655,7 +5648,7 @@
       <w:r>
         <w:t xml:space="preserve">receptors. g) Ratio of forward to reverse binding rate for secondary binding events for multivalent ligands to cells expressing variable amounts of receptors.</w:t>
       </w:r>
-      <w:bookmarkEnd w:id="35"/>
+      <w:bookmarkEnd w:id="37"/>
     </w:p>
     <w:p>
       <w:pPr>
@@ -6246,15 +6239,15 @@
       </w:r>
     </w:p>
     <w:bookmarkEnd w:id="0"/>
-    <w:bookmarkEnd w:id="36"/>
-    <w:bookmarkStart w:id="38" w:name="X7f819264ae88ea78993615f064bd20b2428e55e"/>
     <w:p>
       <w:pPr>
         <w:pStyle w:val="Heading3"/>
       </w:pPr>
+      <w:bookmarkStart w:id="38" w:name="X7f819264ae88ea78993615f064bd20b2428e55e"/>
       <w:r>
         <w:t xml:space="preserve">Non-Overlapping Ligand Targeting Drives a Limited Selectivity Enhancement of Mixtures</w:t>
       </w:r>
+      <w:bookmarkEnd w:id="38"/>
     </w:p>
     <w:p>
       <w:pPr>
@@ -6263,31 +6256,35 @@
       <w:r>
         <w:t xml:space="preserve">While most therapies rely on the action of a single molecular species, mixtures may enhance selectivity through combinations of actions.</w:t>
       </w:r>
-      <w:hyperlink w:anchor="ref-doi:10.1038/nbt.1549">
+      <w:hyperlink w:anchor="ref-luDqQ0zL">
         <w:r>
           <w:rPr>
             <w:rStyle w:val="Hyperlink"/>
-            <w:b/>
             <w:vertAlign w:val="superscript"/>
           </w:rPr>
-          <w:t xml:space="preserve">doi:10.1038/nbt.1549?</w:t>
+          <w:t xml:space="preserve">20</w:t>
         </w:r>
       </w:hyperlink>
       <w:r>
-        <w:t xml:space="preserve"> Furthermore, some biologics inevitably act as mixtures of species through heterogeneity in glycosylation and the presence of endogenous ligands.</w:t>
-      </w:r>
-      <w:hyperlink w:anchor="ref-DOI:10.1002/rcm.3330">
+        <w:t xml:space="preserve"> </w:t>
+      </w:r>
+      <w:r>
+        <w:t xml:space="preserve">Furthermore, some biologics inevitably act as mixtures of species through heterogeneity in glycosylation and the presence of endogenous ligands.</w:t>
+      </w:r>
+      <w:hyperlink w:anchor="ref-eR2h4yr3">
         <w:r>
           <w:rPr>
             <w:rStyle w:val="Hyperlink"/>
-            <w:b/>
             <w:vertAlign w:val="superscript"/>
           </w:rPr>
-          <w:t xml:space="preserve">DOI:10.1002/rcm.3330?</w:t>
+          <w:t xml:space="preserve">21</w:t>
         </w:r>
       </w:hyperlink>
       <w:r>
-        <w:t xml:space="preserve"> Therefore, it is important to understand how mixtures of complexes influence overall response.</w:t>
+        <w:t xml:space="preserve"> </w:t>
+      </w:r>
+      <w:r>
+        <w:t xml:space="preserve">Therefore, it is important to understand how mixtures of complexes influence overall response.</w:t>
       </w:r>
     </w:p>
     <w:p>
@@ -6588,14 +6585,13 @@
       <w:r>
         <w:t xml:space="preserve">c). However, even in these cases, the magnitude of selectivity enhancement is modest. Finally, although we only consider the amount of binding, ligands can have non-overlapping signaling effects even with identical amounts of binding. In these cases, the effect of combinations can be distinct from either individual ligand.</w:t>
       </w:r>
-      <w:hyperlink w:anchor="ref-pmid:28886385">
+      <w:hyperlink w:anchor="ref-11gk5tUo7">
         <w:r>
           <w:rPr>
             <w:rStyle w:val="Hyperlink"/>
-            <w:b/>
             <w:vertAlign w:val="superscript"/>
           </w:rPr>
-          <w:t xml:space="preserve">pmid:28886385?</w:t>
+          <w:t xml:space="preserve">17</w:t>
         </w:r>
       </w:hyperlink>
       <w:r>
@@ -6604,14 +6600,13 @@
         </w:rPr>
         <w:t xml:space="preserve">,</w:t>
       </w:r>
-      <w:hyperlink w:anchor="ref-pmid:29960887">
+      <w:hyperlink w:anchor="ref-8lU1hNlA">
         <w:r>
           <w:rPr>
             <w:rStyle w:val="Hyperlink"/>
-            <w:b/>
             <w:vertAlign w:val="superscript"/>
           </w:rPr>
-          <w:t xml:space="preserve">pmid:29960887?</w:t>
+          <w:t xml:space="preserve">22</w:t>
         </w:r>
       </w:hyperlink>
     </w:p>
@@ -6620,7 +6615,7 @@
       <w:pPr>
         <w:pStyle w:val="CaptionedFigure"/>
       </w:pPr>
-      <w:bookmarkStart w:id="37" w:name="fig:mixture"/>
+      <w:bookmarkStart w:id="39" w:name="fig:mixture"/>
       <w:r>
         <w:t xml:space="preserve">Figure 4:</w:t>
       </w:r>
@@ -7091,7 +7086,7 @@
       <w:r>
         <w:t xml:space="preserve">.</w:t>
       </w:r>
-      <w:bookmarkEnd w:id="37"/>
+      <w:bookmarkEnd w:id="39"/>
     </w:p>
     <w:p>
       <w:pPr>
@@ -7569,15 +7564,15 @@
       </w:r>
     </w:p>
     <w:bookmarkEnd w:id="0"/>
-    <w:bookmarkEnd w:id="38"/>
-    <w:bookmarkStart w:id="40" w:name="X6121a27614a240825e6e8895d4acf0ebac196e1"/>
     <w:p>
       <w:pPr>
         <w:pStyle w:val="Heading3"/>
       </w:pPr>
+      <w:bookmarkStart w:id="40" w:name="X6121a27614a240825e6e8895d4acf0ebac196e1"/>
       <w:r>
         <w:t xml:space="preserve">Heterovalent Bispecific Ligands Exhibit Unique Charateristics When Activated Fully Bound</w:t>
       </w:r>
+      <w:bookmarkEnd w:id="40"/>
     </w:p>
     <w:p>
       <w:pPr>
@@ -7586,18 +7581,20 @@
       <w:r>
         <w:t xml:space="preserve">Constructing multispecific drugs has become a promising new strategy for finer target cell specificity with the advancement of engineering techniques.</w:t>
       </w:r>
-      <w:hyperlink w:anchor="ref-doi:10.1038/s41586-020-2168-1">
+      <w:hyperlink w:anchor="ref-iG3t9Py2">
         <w:r>
           <w:rPr>
             <w:rStyle w:val="Hyperlink"/>
-            <w:b/>
             <w:vertAlign w:val="superscript"/>
           </w:rPr>
-          <w:t xml:space="preserve">doi:10.1038/s41586-020-2168-1?</w:t>
+          <w:t xml:space="preserve">23</w:t>
         </w:r>
       </w:hyperlink>
       <w:r>
-        <w:t xml:space="preserve"> However, the number of possible configurations of multispecific drugs is combinatorially large and impossible to enumerate. Here, we use heterovalent bispecific ligands as examples to explore the unique benefit of multispecificity distinct from any strategy analyzed before. Here, we compare bispecificity with a 50%-50% mixture of two monovalent ligands, and a 50%-50% mixture of two different homogeneous bivalent ligands (Fig.</w:t>
+        <w:t xml:space="preserve"> </w:t>
+      </w:r>
+      <w:r>
+        <w:t xml:space="preserve">However, the number of possible configurations of multispecific drugs is combinatorially large and impossible to enumerate. Here, we use heterovalent bispecific ligands as examples to explore the unique benefit of multispecificity distinct from any strategy analyzed before. Here, we compare bispecificity with a 50%-50% mixture of two monovalent ligands, and a 50%-50% mixture of two different homogeneous bivalent ligands (Fig.</w:t>
       </w:r>
       <w:r>
         <w:t xml:space="preserve"> </w:t>
@@ -7663,14 +7660,13 @@
       <w:r>
         <w:t xml:space="preserve">c), with the same set of parameters in ligand concentration and affinities. Surprisingly, the patterns of ligand binding in these three cases are almost exactly the same, and bispecificity appeared to offer no unique properties. However, many bispecifics only impart their therapeutic action when both of their subunits bind to a target population. For example, in the design of bispecific antibodies, it is common to require both subunits bound to be effective.</w:t>
       </w:r>
-      <w:hyperlink w:anchor="ref-doi:10.1080/19420862.2015.1062192">
+      <w:hyperlink w:anchor="ref-18yoQOgm4">
         <w:r>
           <w:rPr>
             <w:rStyle w:val="Hyperlink"/>
-            <w:b/>
             <w:vertAlign w:val="superscript"/>
           </w:rPr>
-          <w:t xml:space="preserve">doi:10.1080/19420862.2015.1062192?</w:t>
+          <w:t xml:space="preserve">24</w:t>
         </w:r>
       </w:hyperlink>
       <w:r>
@@ -7679,18 +7675,20 @@
         </w:rPr>
         <w:t xml:space="preserve">,</w:t>
       </w:r>
-      <w:hyperlink w:anchor="ref-pmid:30145356">
+      <w:hyperlink w:anchor="ref-y7JtEfom">
         <w:r>
           <w:rPr>
             <w:rStyle w:val="Hyperlink"/>
-            <w:b/>
             <w:vertAlign w:val="superscript"/>
           </w:rPr>
-          <w:t xml:space="preserve">pmid:30145356?</w:t>
+          <w:t xml:space="preserve">25</w:t>
         </w:r>
       </w:hyperlink>
       <w:r>
-        <w:t xml:space="preserve"> When the first antigen-binding region of a bispecific antibody docks at an antigen, it will only make a loose connection between the target and the antibody, unable to induce a strong immune response, and only when both antigen-binding regions bind to their target will this bispecific antibody be fully effective. We investigated whether bispecific ligands that have to be activated with both of their subunits binding to a target display any special cell population selectivity characteristics.</w:t>
+        <w:t xml:space="preserve"> </w:t>
+      </w:r>
+      <w:r>
+        <w:t xml:space="preserve">When the first antigen-binding region of a bispecific antibody docks at an antigen, it will only make a loose connection between the target and the antibody, unable to induce a strong immune response, and only when both antigen-binding regions bind to their target will this bispecific antibody be fully effective. We investigated whether bispecific ligands that have to be activated with both of their subunits binding to a target display any special cell population selectivity characteristics.</w:t>
       </w:r>
     </w:p>
     <w:p>
@@ -7990,18 +7988,18 @@
       <w:r>
         <w:t xml:space="preserve">.</w:t>
       </w:r>
-      <w:hyperlink w:anchor="ref-doi:10.1016/S0006-3495">
-        <w:r>
-          <w:rPr>
-            <w:rStyle w:val="Hyperlink"/>
-            <w:b/>
-            <w:vertAlign w:val="superscript"/>
-          </w:rPr>
-          <w:t xml:space="preserve">doi:10.1016/S0006-3495?</w:t>
-        </w:r>
-      </w:hyperlink>
-      <w:r>
-        <w:t xml:space="preserve"> We plotted the pattern of bispecific fully bound with</w:t>
+      <w:r>
+        <w:rPr>
+          <w:b/>
+          <w:vertAlign w:val="superscript"/>
+        </w:rPr>
+        <w:t xml:space="preserve">???</w:t>
+      </w:r>
+      <w:r>
+        <w:t xml:space="preserve"> </w:t>
+      </w:r>
+      <w:r>
+        <w:t xml:space="preserve">We plotted the pattern of bispecific fully bound with</w:t>
       </w:r>
       <w:r>
         <w:t xml:space="preserve"> </w:t>
@@ -8416,7 +8414,7 @@
       <w:pPr>
         <w:pStyle w:val="CaptionedFigure"/>
       </w:pPr>
-      <w:bookmarkStart w:id="39" w:name="fig:bispecific"/>
+      <w:bookmarkStart w:id="41" w:name="fig:bispecific"/>
       <w:r>
         <w:t xml:space="preserve">Figure 5:</w:t>
       </w:r>
@@ -8783,7 +8781,7 @@
       <w:r>
         <w:t xml:space="preserve">, the crosslinking constant. When the ratios are larger, bispecific ligands bind to target populations more specifically. g) bispecific selectivities divided by monovalent 50%-50% mixture selectivities, h) bispecific selectivities divided by a 50%-50% homo-bivalent mixture selectivities. i) Cartoons of bispecific ligands and ligand fully bound binding model.</w:t>
       </w:r>
-      <w:bookmarkEnd w:id="39"/>
+      <w:bookmarkEnd w:id="41"/>
     </w:p>
     <w:p>
       <w:pPr>
@@ -9157,15 +9155,15 @@
       </w:r>
     </w:p>
     <w:bookmarkEnd w:id="0"/>
-    <w:bookmarkEnd w:id="40"/>
-    <w:bookmarkStart w:id="42" w:name="X5a8bba87a1565e1cc47943d74aa22985ccf8689"/>
     <w:p>
       <w:pPr>
         <w:pStyle w:val="Heading3"/>
       </w:pPr>
+      <w:bookmarkStart w:id="42" w:name="X5a8bba87a1565e1cc47943d74aa22985ccf8689"/>
       <w:r>
         <w:t xml:space="preserve">Combining Strategies For Superior Selectivity</w:t>
       </w:r>
+      <w:bookmarkEnd w:id="42"/>
     </w:p>
     <w:p>
       <w:pPr>
@@ -9405,14 +9403,13 @@
       <w:r>
         <w:t xml:space="preserve">Our results highlight that both in singular and combined strategies for therapeutic manipulation, the target and off-target populations dictate the optimal approach. It is also clear that combined approaches do offer synergies which can be harnessed, but that those are only emergent in particular therapeutic situations.</w:t>
       </w:r>
-      <w:hyperlink w:anchor="ref-pmid:30145356">
+      <w:hyperlink w:anchor="ref-y7JtEfom">
         <w:r>
           <w:rPr>
             <w:rStyle w:val="Hyperlink"/>
-            <w:b/>
             <w:vertAlign w:val="superscript"/>
           </w:rPr>
-          <w:t xml:space="preserve">pmid:30145356?</w:t>
+          <w:t xml:space="preserve">25</w:t>
         </w:r>
       </w:hyperlink>
     </w:p>
@@ -9421,7 +9418,7 @@
       <w:pPr>
         <w:pStyle w:val="CaptionedFigure"/>
       </w:pPr>
-      <w:bookmarkStart w:id="41" w:name="fig:combination"/>
+      <w:bookmarkStart w:id="43" w:name="fig:combination"/>
       <w:r>
         <w:t xml:space="preserve">Figure 6:</w:t>
       </w:r>
@@ -9867,7 +9864,7 @@
       <w:r>
         <w:t xml:space="preserve">.</w:t>
       </w:r>
-      <w:bookmarkEnd w:id="41"/>
+      <w:bookmarkEnd w:id="43"/>
     </w:p>
     <w:p>
       <w:pPr>
@@ -10320,15 +10317,15 @@
       </w:r>
     </w:p>
     <w:bookmarkEnd w:id="0"/>
-    <w:bookmarkEnd w:id="42"/>
-    <w:bookmarkStart w:id="44" w:name="X94d61dc6a943133c806d80032df7da8a7f37fba"/>
     <w:p>
       <w:pPr>
         <w:pStyle w:val="Heading3"/>
       </w:pPr>
+      <w:bookmarkStart w:id="44" w:name="X94d61dc6a943133c806d80032df7da8a7f37fba"/>
       <w:r>
         <w:t xml:space="preserve">Using Binding Competition to Invert Receptor Targeting</w:t>
       </w:r>
+      <w:bookmarkEnd w:id="44"/>
     </w:p>
     <w:p>
       <w:pPr>
@@ -10344,16 +10341,13 @@
         <w:t xml:space="preserve">“</w:t>
       </w:r>
       <w:r>
-        <w:t xml:space="preserve">dead ligand,</w:t>
+        <w:t xml:space="preserve">dead ligand</w:t>
       </w:r>
       <w:r>
         <w:t xml:space="preserve">”</w:t>
       </w:r>
       <w:r>
-        <w:t xml:space="preserve"> </w:t>
-      </w:r>
-      <w:r>
-        <w:t xml:space="preserve">could invert this relationship.</w:t>
+        <w:t xml:space="preserve">, could invert this relationship.</w:t>
       </w:r>
     </w:p>
     <w:p>
@@ -10751,7 +10745,7 @@
       <w:pPr>
         <w:pStyle w:val="CaptionedFigure"/>
       </w:pPr>
-      <w:bookmarkStart w:id="43" w:name="fig:deadLig"/>
+      <w:bookmarkStart w:id="45" w:name="fig:deadLig"/>
       <w:r>
         <w:t xml:space="preserve">Figure 7:</w:t>
       </w:r>
@@ -10931,7 +10925,7 @@
       <w:r>
         <w:t xml:space="preserve">antagonist with varying affinities for receptors 1 and 2, and a monovalent therapeutic receptor agonists with affinities optimized for selectivity. Only amount of agonist bound is considered in determination of optimal selectivity. b-d) Heatmap of agonist (b), and antagonist (c) ligand bound for antagonist and agonist ligand combination shown to impart greatest selectivity improvement in (a). d) Heatmap of agonist bound in b,c when no antagonist is present.</w:t>
       </w:r>
-      <w:bookmarkEnd w:id="43"/>
+      <w:bookmarkEnd w:id="45"/>
     </w:p>
     <w:p>
       <w:pPr>
@@ -11118,16 +11112,15 @@
       </w:r>
     </w:p>
     <w:bookmarkEnd w:id="0"/>
-    <w:bookmarkEnd w:id="44"/>
-    <w:bookmarkEnd w:id="45"/>
-    <w:bookmarkStart w:id="46" w:name="discussion"/>
     <w:p>
       <w:pPr>
         <w:pStyle w:val="Heading2"/>
       </w:pPr>
+      <w:bookmarkStart w:id="46" w:name="discussion"/>
       <w:r>
         <w:t xml:space="preserve">Discussion</w:t>
       </w:r>
+      <w:bookmarkEnd w:id="46"/>
     </w:p>
     <w:p>
       <w:pPr>
@@ -11258,14 +11251,13 @@
       <w:r>
         <w:t xml:space="preserve">A few of the strategies that we explored have been utilized in existing engineered therapies. For example, affinity changes to the cytokine IL-2 have been used to bias its effects towards either effector or regulatory immune populations.</w:t>
       </w:r>
-      <w:hyperlink w:anchor="ref-doi:10.1158/2159-8290.CD-18-1495">
+      <w:hyperlink w:anchor="ref-FqWAsZ7z">
         <w:r>
           <w:rPr>
             <w:rStyle w:val="Hyperlink"/>
-            <w:b/>
             <w:vertAlign w:val="superscript"/>
           </w:rPr>
-          <w:t xml:space="preserve">doi:10.1158/2159-8290.CD-18-1495?</w:t>
+          <w:t xml:space="preserve">26</w:t>
         </w:r>
       </w:hyperlink>
       <w:r>
@@ -11274,57 +11266,65 @@
         </w:rPr>
         <w:t xml:space="preserve">,</w:t>
       </w:r>
-      <w:hyperlink w:anchor="ref-pmid:30446251">
+      <w:hyperlink w:anchor="ref-L2k7ECfb">
         <w:r>
           <w:rPr>
             <w:rStyle w:val="Hyperlink"/>
-            <w:b/>
             <w:vertAlign w:val="superscript"/>
           </w:rPr>
-          <w:t xml:space="preserve">pmid:30446251?</w:t>
+          <w:t xml:space="preserve">27</w:t>
         </w:r>
       </w:hyperlink>
       <w:r>
-        <w:t xml:space="preserve"> Varying the valency of tumor-targeted antibodies leads to selective cell clearance based upon the levels of expressed antigen.</w:t>
-      </w:r>
-      <w:hyperlink w:anchor="ref-doi:10.1038/srep40098">
+        <w:t xml:space="preserve"> </w:t>
+      </w:r>
+      <w:r>
+        <w:t xml:space="preserve">Varying the valency of tumor-targeted antibodies leads to selective cell clearance based upon the levels of expressed antigen.</w:t>
+      </w:r>
+      <w:hyperlink w:anchor="ref-IanZRiFA">
         <w:r>
           <w:rPr>
             <w:rStyle w:val="Hyperlink"/>
-            <w:b/>
             <w:vertAlign w:val="superscript"/>
           </w:rPr>
-          <w:t xml:space="preserve">doi:10.1038/srep40098?</w:t>
+          <w:t xml:space="preserve">19</w:t>
         </w:r>
       </w:hyperlink>
       <w:r>
-        <w:t xml:space="preserve"> Manipulating of the affinities of the fibronectin domains on octovalent nanorings was shown to enhance the selectivity of binding to cancerous cells displaying relatively higher densities of fibronectin receptors compared to native tissue.</w:t>
-      </w:r>
-      <w:hyperlink w:anchor="ref-doi:10.1021/jacs.8b09198">
+        <w:t xml:space="preserve"> </w:t>
+      </w:r>
+      <w:r>
+        <w:t xml:space="preserve">Manipulating of the affinities of the fibronectin domains on octovalent nanorings was shown to enhance the selectivity of binding to cancerous cells displaying relatively higher densities of fibronectin receptors compared to native tissue.</w:t>
+      </w:r>
+      <w:hyperlink w:anchor="ref-u2Cb0DBq">
         <w:r>
           <w:rPr>
             <w:rStyle w:val="Hyperlink"/>
-            <w:b/>
             <w:vertAlign w:val="superscript"/>
           </w:rPr>
-          <w:t xml:space="preserve">doi:10.1021/jacs.8b09198?</w:t>
+          <w:t xml:space="preserve">18</w:t>
         </w:r>
       </w:hyperlink>
       <w:r>
-        <w:t xml:space="preserve"> The tendency of low-affinity, multivalent interactions to target cells expressing high receptor abundances was also described in a study describing the selectivity of multivalent antibody binding to tumor cells bound by a bispecific therapeutic ligand.</w:t>
-      </w:r>
-      <w:hyperlink w:anchor="ref-doi:10.1021/cb6003788">
+        <w:t xml:space="preserve"> </w:t>
+      </w:r>
+      <w:r>
+        <w:t xml:space="preserve">The tendency of low-affinity, multivalent interactions to target cells expressing high receptor abundances was also described in a study describing the selectivity of multivalent antibody binding to tumor cells bound by a bispecific therapeutic ligand.</w:t>
+      </w:r>
+      <w:hyperlink w:anchor="ref-B0xrCfE3">
         <w:r>
           <w:rPr>
             <w:rStyle w:val="Hyperlink"/>
-            <w:b/>
             <w:vertAlign w:val="superscript"/>
           </w:rPr>
-          <w:t xml:space="preserve">doi:10.1021/cb6003788?</w:t>
+          <w:t xml:space="preserve">13</w:t>
         </w:r>
       </w:hyperlink>
       <w:r>
-        <w:t xml:space="preserve"> These examples lend support to the accuracy and translational value of our model. At the same time, recognizing these previously described ligand engineering approaches as separable strategies provides clearer guidance for future engineering.</w:t>
+        <w:t xml:space="preserve"> </w:t>
+      </w:r>
+      <w:r>
+        <w:t xml:space="preserve">These examples lend support to the accuracy and translational value of our model. At the same time, recognizing these previously described ligand engineering approaches as separable strategies provides clearer guidance for future engineering.</w:t>
       </w:r>
     </w:p>
     <w:p>
@@ -11334,14 +11334,13 @@
       <w:r>
         <w:t xml:space="preserve">Some of the optimization strategies described here have not been exploited in part due to the complexity of real biological applications. First, some strategies may not be biochemically practical. For example, the manipulating ligand affinity requires intricate protein engineering. Potential dynamic changes in the receptor expression profile of a target population also complicate the matter. It is well documented that cancer cells can escape therapeutic targeting by upregulating</w:t>
       </w:r>
-      <w:hyperlink w:anchor="ref-doi:10.1016/j.devcel.2019.07.010">
+      <w:hyperlink w:anchor="ref-3WVNxYBN">
         <w:r>
           <w:rPr>
             <w:rStyle w:val="Hyperlink"/>
-            <w:b/>
             <w:vertAlign w:val="superscript"/>
           </w:rPr>
-          <w:t xml:space="preserve">doi:10.1016/j.devcel.2019.07.010?</w:t>
+          <w:t xml:space="preserve">28</w:t>
         </w:r>
       </w:hyperlink>
       <w:r>
@@ -11350,14 +11349,13 @@
         </w:rPr>
         <w:t xml:space="preserve">,</w:t>
       </w:r>
-      <w:hyperlink w:anchor="ref-doi:10.1158/0008-5472.CAN-13-0602">
+      <w:hyperlink w:anchor="ref-PIRfSNMl">
         <w:r>
           <w:rPr>
             <w:rStyle w:val="Hyperlink"/>
-            <w:b/>
             <w:vertAlign w:val="superscript"/>
           </w:rPr>
-          <w:t xml:space="preserve">doi:10.1158/0008-5472.CAN-13-0602?</w:t>
+          <w:t xml:space="preserve">29</w:t>
         </w:r>
       </w:hyperlink>
       <w:r>
@@ -11366,14 +11364,13 @@
       <w:r>
         <w:t xml:space="preserve">or downregulating</w:t>
       </w:r>
-      <w:hyperlink w:anchor="ref-pmid:14534734">
+      <w:hyperlink w:anchor="ref-uMIi8rGN">
         <w:r>
           <w:rPr>
             <w:rStyle w:val="Hyperlink"/>
-            <w:b/>
             <w:vertAlign w:val="superscript"/>
           </w:rPr>
-          <w:t xml:space="preserve">pmid:14534734?</w:t>
+          <w:t xml:space="preserve">30</w:t>
         </w:r>
       </w:hyperlink>
       <w:r>
@@ -11390,51 +11387,56 @@
       <w:r>
         <w:t xml:space="preserve">In many therapeutic applications where selective engagement of target cell populations is an important performance metric, such as the treatment of cancer, cellular therapies are becoming increasingly popular.</w:t>
       </w:r>
-      <w:hyperlink w:anchor="Xeddd29a1d91d18f0470a23d37ad9fb61648bd6d">
+      <w:hyperlink w:anchor="ref-bi6A2xzH">
         <w:r>
           <w:rPr>
             <w:rStyle w:val="Hyperlink"/>
-            <w:b/>
             <w:vertAlign w:val="superscript"/>
           </w:rPr>
-          <w:t xml:space="preserve">doi:10.1146/annurev-immunol-042718-041407?</w:t>
+          <w:t xml:space="preserve">31</w:t>
         </w:r>
       </w:hyperlink>
       <w:r>
-        <w:t xml:space="preserve"> Human engineered chimeric antigen receptor (CAR) T cells have enhanced the potential to selectively recognize and attack malignant tissues.</w:t>
-      </w:r>
-      <w:hyperlink w:anchor="ref-doi:10.1016/j.ymthe.2017.06.012">
+        <w:t xml:space="preserve"> </w:t>
+      </w:r>
+      <w:r>
+        <w:t xml:space="preserve">Human engineered chimeric antigen receptor (CAR) T cells have enhanced the potential to selectively recognize and attack malignant tissues.</w:t>
+      </w:r>
+      <w:hyperlink w:anchor="ref-Fp4dDXV1">
         <w:r>
           <w:rPr>
             <w:rStyle w:val="Hyperlink"/>
-            <w:b/>
             <w:vertAlign w:val="superscript"/>
           </w:rPr>
-          <w:t xml:space="preserve">doi:10.1016/j.ymthe.2017.06.012?</w:t>
+          <w:t xml:space="preserve">32</w:t>
         </w:r>
       </w:hyperlink>
       <w:r>
-        <w:t xml:space="preserve"> These technologies bypass ligand-receptor binding restrictions by allowing recognition in signaling response. However, we have shown here that selectivity can often be attained with relatively simple therapeutic ligands. This study lays the framework for how ligand engineering can be directed using computational modeling. It should be noted that the application of this logic is reliant on knowledge of the target and off-target cell population receptor expression levels. Future application of the ligand binding logic described in this study could be guided using high-throughput single-cell profiling techniques, such as RNA-seq or high-parameter flow cytometry. A computational tool that could directly translate such datasets into ligand design criteria, selecting among potential receptor targets, may represent a potential avenue for the translation of our analyses into a more broadly applicable ligand engineering tool.</w:t>
+        <w:t xml:space="preserve"> </w:t>
+      </w:r>
+      <w:r>
+        <w:t xml:space="preserve">These technologies bypass ligand-receptor binding restrictions by allowing recognition in signaling response. However, we have shown here that selectivity can often be attained with relatively simple therapeutic ligands. This study lays the framework for how ligand engineering can be directed using computational modeling. It should be noted that the application of this logic is reliant on knowledge of the target and off-target cell population receptor expression levels. Future application of the ligand binding logic described in this study could be guided using high-throughput single-cell profiling techniques, such as RNA-seq or high-parameter flow cytometry. A computational tool that could directly translate such datasets into ligand design criteria, selecting among potential receptor targets, may represent a potential avenue for the translation of our analyses into a more broadly applicable ligand engineering tool.</w:t>
       </w:r>
     </w:p>
-    <w:bookmarkEnd w:id="46"/>
-    <w:bookmarkStart w:id="54" w:name="materials-and-methods"/>
     <w:p>
       <w:pPr>
         <w:pStyle w:val="Heading2"/>
       </w:pPr>
+      <w:bookmarkStart w:id="47" w:name="materials-and-methods"/>
       <w:r>
         <w:t xml:space="preserve">Materials and Methods</w:t>
       </w:r>
+      <w:bookmarkEnd w:id="47"/>
     </w:p>
-    <w:bookmarkStart w:id="48" w:name="data-and-software-availability"/>
     <w:p>
       <w:pPr>
         <w:pStyle w:val="Heading3"/>
       </w:pPr>
+      <w:bookmarkStart w:id="48" w:name="data-and-software-availability"/>
       <w:r>
         <w:t xml:space="preserve">Data and Software Availability</w:t>
       </w:r>
+      <w:bookmarkEnd w:id="48"/>
     </w:p>
     <w:p>
       <w:pPr>
@@ -11446,7 +11448,7 @@
       <w:r>
         <w:t xml:space="preserve"> </w:t>
       </w:r>
-      <w:hyperlink r:id="rId47">
+      <w:hyperlink r:id="rId49">
         <w:r>
           <w:rPr>
             <w:rStyle w:val="Hyperlink"/>
@@ -11458,15 +11460,15 @@
         <w:t xml:space="preserve">.</w:t>
       </w:r>
     </w:p>
-    <w:bookmarkEnd w:id="48"/>
-    <w:bookmarkStart w:id="49" w:name="Xbc4502bc21dcbb32d50a52a1b617accc52dd1c2"/>
     <w:p>
       <w:pPr>
         <w:pStyle w:val="Heading3"/>
       </w:pPr>
+      <w:bookmarkStart w:id="50" w:name="Xbc4502bc21dcbb32d50a52a1b617accc52dd1c2"/>
       <w:r>
         <w:t xml:space="preserve">Generalized multi-ligand, multi-receptor multivalent binding model</w:t>
       </w:r>
+      <w:bookmarkEnd w:id="50"/>
     </w:p>
     <w:p>
       <w:pPr>
@@ -11475,18 +11477,20 @@
       <w:r>
         <w:t xml:space="preserve">To model multivalent ligand complexes, we extended our previous binding model to the multi-ligand case.</w:t>
       </w:r>
-      <w:hyperlink w:anchor="ref-pmid:29960887">
+      <w:hyperlink w:anchor="ref-11gk5tUo7">
         <w:r>
           <w:rPr>
             <w:rStyle w:val="Hyperlink"/>
-            <w:b/>
             <w:vertAlign w:val="superscript"/>
           </w:rPr>
-          <w:t xml:space="preserve">pmid:29960887?</w:t>
+          <w:t xml:space="preserve">17</w:t>
         </w:r>
       </w:hyperlink>
       <w:r>
-        <w:t xml:space="preserve"> We define</w:t>
+        <w:t xml:space="preserve"> </w:t>
+      </w:r>
+      <w:r>
+        <w:t xml:space="preserve">We define</w:t>
       </w:r>
       <w:r>
         <w:t xml:space="preserve"> </w:t>
@@ -12975,15 +12979,15 @@
         <w:t xml:space="preserve">$$ L_{\mathrm{bound}} = \frac{L_0}{K_x^* } \left [\left(\sum_{i=1\\ j=0}^{i=N_L\\ j=N_R}{{φ_{ij}}^{q_{ij}}}\right)^f -1 \right] .$$</w:t>
       </w:r>
     </w:p>
-    <w:bookmarkEnd w:id="49"/>
-    <w:bookmarkStart w:id="50" w:name="X24bd08806ffb8547c5a72680f5305356ed2b829"/>
     <w:p>
       <w:pPr>
         <w:pStyle w:val="Heading3"/>
       </w:pPr>
+      <w:bookmarkStart w:id="51" w:name="X24bd08806ffb8547c5a72680f5305356ed2b829"/>
       <w:r>
         <w:t xml:space="preserve">Generalized multivalent binding model with defined complexes</w:t>
       </w:r>
+      <w:bookmarkEnd w:id="51"/>
     </w:p>
     <w:p>
       <w:pPr>
@@ -14714,15 +14718,15 @@
         </m:oMath>
       </m:oMathPara>
     </w:p>
-    <w:bookmarkEnd w:id="50"/>
-    <w:bookmarkStart w:id="51" w:name="mathematical-optimization"/>
     <w:p>
       <w:pPr>
         <w:pStyle w:val="Heading3"/>
       </w:pPr>
+      <w:bookmarkStart w:id="52" w:name="mathematical-optimization"/>
       <w:r>
         <w:t xml:space="preserve">Mathematical optimization</w:t>
       </w:r>
+      <w:bookmarkEnd w:id="52"/>
     </w:p>
     <w:p>
       <w:pPr>
@@ -14746,18 +14750,20 @@
       <w:r>
         <w:t xml:space="preserve">to combine several strategies and achieve optimal selectivity.</w:t>
       </w:r>
-      <w:hyperlink w:anchor="ref-doi:10.1038/s41592-019-0686-2">
+      <w:hyperlink w:anchor="ref-8Miti2Gz">
         <w:r>
           <w:rPr>
             <w:rStyle w:val="Hyperlink"/>
-            <w:b/>
             <w:vertAlign w:val="superscript"/>
           </w:rPr>
-          <w:t xml:space="preserve">doi:10.1038/s41592-019-0686-2?</w:t>
+          <w:t xml:space="preserve">33</w:t>
         </w:r>
       </w:hyperlink>
       <w:r>
-        <w:t xml:space="preserve"> Unless specified otherwise, the initial values for optimization were</w:t>
+        <w:t xml:space="preserve"> </w:t>
+      </w:r>
+      <w:r>
+        <w:t xml:space="preserve">Unless specified otherwise, the initial values for optimization were</w:t>
       </w:r>
       <w:r>
         <w:t xml:space="preserve"> </w:t>
@@ -14997,15 +15003,15 @@
         <w:t xml:space="preserve">for the affinity dissociation constants.</w:t>
       </w:r>
     </w:p>
-    <w:bookmarkEnd w:id="51"/>
-    <w:bookmarkStart w:id="52" w:name="sigma-point-filter"/>
     <w:p>
       <w:pPr>
         <w:pStyle w:val="Heading3"/>
       </w:pPr>
+      <w:bookmarkStart w:id="53" w:name="sigma-point-filter"/>
       <w:r>
         <w:t xml:space="preserve">Sigma point filter</w:t>
       </w:r>
+      <w:bookmarkEnd w:id="53"/>
     </w:p>
     <w:p>
       <w:pPr>
@@ -15014,29 +15020,31 @@
       <w:r>
         <w:t xml:space="preserve">To consider the intrapopulation variance of a cell population in the optimization, we implemented the sigma point filters,</w:t>
       </w:r>
-      <w:hyperlink w:anchor="ref-wikidata:Q99353631">
+      <w:hyperlink w:anchor="ref-VKATSjfe">
         <w:r>
           <w:rPr>
             <w:rStyle w:val="Hyperlink"/>
-            <w:b/>
             <w:vertAlign w:val="superscript"/>
           </w:rPr>
-          <w:t xml:space="preserve">wikidata:Q99353631?</w:t>
+          <w:t xml:space="preserve">16</w:t>
         </w:r>
       </w:hyperlink>
       <w:r>
-        <w:t xml:space="preserve"> a computationally efficient method to approximate the variance proprogated through an ordinary differential equation-based model.</w:t>
+        <w:t xml:space="preserve"> </w:t>
+      </w:r>
+      <w:r>
+        <w:t xml:space="preserve">a computationally efficient method to approximate the variance proprogated through an ordinary differential equation-based model.</w:t>
       </w:r>
     </w:p>
-    <w:bookmarkEnd w:id="52"/>
-    <w:bookmarkStart w:id="53" w:name="reimplementation-of-csizmar-et-al."/>
     <w:p>
       <w:pPr>
         <w:pStyle w:val="Heading3"/>
       </w:pPr>
+      <w:bookmarkStart w:id="54" w:name="reimplementation-of-csizmar-et-al."/>
       <w:r>
         <w:t xml:space="preserve">Reimplementation of Csizmar et al.</w:t>
       </w:r>
+      <w:bookmarkEnd w:id="54"/>
     </w:p>
     <w:p>
       <w:pPr>
@@ -15045,18 +15053,20 @@
       <w:r>
         <w:t xml:space="preserve">To validate our model, we recapitulated multivalent binding data from Csizmar et al. using our multivalent binding model (Fig. S1).</w:t>
       </w:r>
-      <w:hyperlink w:anchor="ref-doi:10.1021/jacs.8b09198">
+      <w:hyperlink w:anchor="ref-u2Cb0DBq">
         <w:r>
           <w:rPr>
             <w:rStyle w:val="Hyperlink"/>
-            <w:b/>
             <w:vertAlign w:val="superscript"/>
           </w:rPr>
-          <w:t xml:space="preserve">doi:10.1021/jacs.8b09198?</w:t>
+          <w:t xml:space="preserve">18</w:t>
         </w:r>
       </w:hyperlink>
       <w:r>
-        <w:t xml:space="preserve"> Here, fluorescently labeled nanorings displaying 1, 2, 4, and 8 fibronectin clones, which bind to epithelial cell adhesion molecule (EpCAM) antigens, were fabricated. Binding activity of nanorings displaying both high (C5) and low (B22) affinity EpCAM binding domains was measured. Binding to an EpCAM</w:t>
+        <w:t xml:space="preserve"> </w:t>
+      </w:r>
+      <w:r>
+        <w:t xml:space="preserve">Here, fluorescently labeled nanorings displaying 1, 2, 4, and 8 fibronectin clones, which bind to epithelial cell adhesion molecule (EpCAM) antigens, were fabricated. Binding activity of nanorings displaying both high (C5) and low (B22) affinity EpCAM binding domains was measured. Binding to an EpCAM</w:t>
       </w:r>
       <w:r>
         <w:rPr>
@@ -15097,23 +15107,22 @@
         <w:t xml:space="preserve">antigens/cell) population was measured using flow cytometry. We used nonlinear least squares optimization, as described above, to fit our multivalent binding model to the binding data, using a unique scaling factor for each fibronectin clone to convert between measured fluorescent intensity and magnitude of ligand bound. We allowed affinity of the fibronectin clones to vary during optimization.</w:t>
       </w:r>
     </w:p>
-    <w:bookmarkEnd w:id="53"/>
-    <w:bookmarkEnd w:id="54"/>
-    <w:bookmarkStart w:id="56" w:name="supplementary-figures"/>
     <w:p>
       <w:pPr>
         <w:pStyle w:val="Heading2"/>
       </w:pPr>
+      <w:bookmarkStart w:id="55" w:name="supplementary-figures"/>
       <w:r>
         <w:t xml:space="preserve">Supplementary Figures</w:t>
       </w:r>
+      <w:bookmarkEnd w:id="55"/>
     </w:p>
     <w:bookmarkStart w:id="0" w:name="fig:Csizmar"/>
     <w:p>
       <w:pPr>
         <w:pStyle w:val="CaptionedFigure"/>
       </w:pPr>
-      <w:bookmarkStart w:id="55" w:name="fig:Csizmar"/>
+      <w:bookmarkStart w:id="56" w:name="fig:Csizmar"/>
       <w:r>
         <w:t xml:space="preserve">Figure 8:</w:t>
       </w:r>
@@ -15449,22 +15458,21 @@
         <w:t xml:space="preserve"> </w:t>
       </w:r>
       <w:r>
-        <w:t xml:space="preserve">receptors per cell as described in Csizmar et al..</w:t>
-      </w:r>
-      <w:hyperlink w:anchor="ref-doi:10.1021/jacs.8b09198">
+        <w:t xml:space="preserve">receptors per cell as described in Csizmar et al. </w:t>
+      </w:r>
+      <w:hyperlink w:anchor="ref-u2Cb0DBq">
         <w:r>
           <w:rPr>
             <w:rStyle w:val="Hyperlink"/>
-            <w:b/>
             <w:vertAlign w:val="superscript"/>
           </w:rPr>
-          <w:t xml:space="preserve">doi:10.1021/jacs.8b09198?</w:t>
+          <w:t xml:space="preserve">18</w:t>
         </w:r>
       </w:hyperlink>
       <w:r>
-        <w:t xml:space="preserve"> Fluorescence was predicted for interactions with octa- and tetravalent ligands expressing either C5 or B22 fibronecting binding domains. c) Predicted binding ratios of MCF-7 cells to MDA cells when bound with octa- and tetravalent ligands expressing either C5 or B22 fibronecting binding domains.</w:t>
-      </w:r>
-      <w:bookmarkEnd w:id="55"/>
+        <w:t xml:space="preserve">. Fluorescence was predicted for interactions with octa- and tetravalent ligands expressing either C5 or B22 fibronecting binding domains. c) Predicted binding ratios of MCF-7 cells to MDA cells when bound with octa- and tetravalent ligands expressing either C5 or B22 fibronecting binding domains.</w:t>
+      </w:r>
+      <w:bookmarkEnd w:id="56"/>
     </w:p>
     <w:p>
       <w:pPr>
@@ -15805,32 +15813,31 @@
         <w:t xml:space="preserve"> </w:t>
       </w:r>
       <w:r>
-        <w:t xml:space="preserve">receptors per cell as described in Csizmar et al..</w:t>
-      </w:r>
-      <w:hyperlink w:anchor="ref-doi:10.1021/jacs.8b09198">
+        <w:t xml:space="preserve">receptors per cell as described in Csizmar et al. </w:t>
+      </w:r>
+      <w:hyperlink w:anchor="ref-u2Cb0DBq">
         <w:r>
           <w:rPr>
             <w:rStyle w:val="Hyperlink"/>
-            <w:b/>
             <w:vertAlign w:val="superscript"/>
           </w:rPr>
-          <w:t xml:space="preserve">doi:10.1021/jacs.8b09198?</w:t>
+          <w:t xml:space="preserve">18</w:t>
         </w:r>
       </w:hyperlink>
       <w:r>
-        <w:t xml:space="preserve"> Fluorescence was predicted for interactions with octa- and tetravalent ligands expressing either C5 or B22 fibronecting binding domains. c) Predicted binding ratios of MCF-7 cells to MDA cells when bound with octa- and tetravalent ligands expressing either C5 or B22 fibronecting binding domains.</w:t>
+        <w:t xml:space="preserve">. Fluorescence was predicted for interactions with octa- and tetravalent ligands expressing either C5 or B22 fibronecting binding domains. c) Predicted binding ratios of MCF-7 cells to MDA cells when bound with octa- and tetravalent ligands expressing either C5 or B22 fibronecting binding domains.</w:t>
       </w:r>
     </w:p>
     <w:bookmarkEnd w:id="0"/>
-    <w:bookmarkEnd w:id="56"/>
-    <w:bookmarkStart w:id="57" w:name="acknowledgements"/>
     <w:p>
       <w:pPr>
         <w:pStyle w:val="Heading2"/>
       </w:pPr>
+      <w:bookmarkStart w:id="57" w:name="acknowledgements"/>
       <w:r>
         <w:t xml:space="preserve">Acknowledgements</w:t>
       </w:r>
+      <w:bookmarkEnd w:id="57"/>
     </w:p>
     <w:p>
       <w:pPr>
@@ -15855,15 +15862,15 @@
         <w:t xml:space="preserve">The authors declare no competing financial interests.</w:t>
       </w:r>
     </w:p>
-    <w:bookmarkEnd w:id="57"/>
-    <w:bookmarkStart w:id="58" w:name="author-contributions-statement"/>
     <w:p>
       <w:pPr>
         <w:pStyle w:val="Heading2"/>
       </w:pPr>
+      <w:bookmarkStart w:id="58" w:name="author-contributions-statement"/>
       <w:r>
         <w:t xml:space="preserve">Author contributions statement</w:t>
       </w:r>
+      <w:bookmarkEnd w:id="58"/>
     </w:p>
     <w:p>
       <w:pPr>
@@ -15873,19 +15880,1354 @@
         <w:t xml:space="preserve">A.S.M. concieved of the work. All authors implemented the analysis and wrote the paper.</w:t>
       </w:r>
     </w:p>
-    <w:bookmarkEnd w:id="58"/>
-    <w:bookmarkStart w:id="60" w:name="references"/>
     <w:p>
       <w:pPr>
         <w:pStyle w:val="Heading2"/>
       </w:pPr>
+      <w:bookmarkStart w:id="59" w:name="references"/>
       <w:r>
         <w:t xml:space="preserve">References</w:t>
       </w:r>
+      <w:bookmarkEnd w:id="59"/>
     </w:p>
-    <w:bookmarkStart w:id="59" w:name="refs"/>
-    <w:bookmarkEnd w:id="59"/>
+    <w:bookmarkStart w:id="95" w:name="refs"/>
+    <w:bookmarkStart w:id="60" w:name="ref-dr9JS306"/>
+    <w:p>
+      <w:pPr>
+        <w:pStyle w:val="Bibliography"/>
+      </w:pPr>
+      <w:r>
+        <w:t xml:space="preserve">1. Mittendorf, E. A.</w:t>
+      </w:r>
+      <w:r>
+        <w:t xml:space="preserve"> </w:t>
+      </w:r>
+      <w:r>
+        <w:rPr>
+          <w:i/>
+        </w:rPr>
+        <w:t xml:space="preserve">et al.</w:t>
+      </w:r>
+      <w:r>
+        <w:t xml:space="preserve"> </w:t>
+      </w:r>
+      <w:r>
+        <w:t xml:space="preserve">Loss of HER2 Amplification Following Trastuzumab-Based Neoadjuvant Systemic Therapy and Survival Outcomes.</w:t>
+      </w:r>
+      <w:r>
+        <w:t xml:space="preserve"> </w:t>
+      </w:r>
+      <w:r>
+        <w:rPr>
+          <w:i/>
+        </w:rPr>
+        <w:t xml:space="preserve">Clinical Cancer Research</w:t>
+      </w:r>
+      <w:r>
+        <w:t xml:space="preserve"> </w:t>
+      </w:r>
+      <w:r>
+        <w:rPr>
+          <w:b/>
+        </w:rPr>
+        <w:t xml:space="preserve">15</w:t>
+      </w:r>
+      <w:r>
+        <w:t xml:space="preserve">, 7381–7388 (2009).</w:t>
+      </w:r>
+    </w:p>
     <w:bookmarkEnd w:id="60"/>
+    <w:bookmarkStart w:id="61" w:name="ref-QzzeTuTF"/>
+    <w:p>
+      <w:pPr>
+        <w:pStyle w:val="Bibliography"/>
+      </w:pPr>
+      <w:r>
+        <w:t xml:space="preserve">2. Turke, A. B.</w:t>
+      </w:r>
+      <w:r>
+        <w:t xml:space="preserve"> </w:t>
+      </w:r>
+      <w:r>
+        <w:rPr>
+          <w:i/>
+        </w:rPr>
+        <w:t xml:space="preserve">et al.</w:t>
+      </w:r>
+      <w:r>
+        <w:t xml:space="preserve"> </w:t>
+      </w:r>
+      <w:r>
+        <w:t xml:space="preserve">Preexistence and clonal selection of MET amplification in EGFR mutant NSCLC.</w:t>
+      </w:r>
+      <w:r>
+        <w:t xml:space="preserve"> </w:t>
+      </w:r>
+      <w:r>
+        <w:rPr>
+          <w:i/>
+        </w:rPr>
+        <w:t xml:space="preserve">Cancer Cell</w:t>
+      </w:r>
+      <w:r>
+        <w:t xml:space="preserve"> </w:t>
+      </w:r>
+      <w:r>
+        <w:rPr>
+          <w:b/>
+        </w:rPr>
+        <w:t xml:space="preserve">17</w:t>
+      </w:r>
+      <w:r>
+        <w:t xml:space="preserve">, 77–88 (2010).</w:t>
+      </w:r>
+    </w:p>
+    <w:bookmarkEnd w:id="61"/>
+    <w:bookmarkStart w:id="62" w:name="ref-10v4cJsaH"/>
+    <w:p>
+      <w:pPr>
+        <w:pStyle w:val="Bibliography"/>
+      </w:pPr>
+      <w:r>
+        <w:t xml:space="preserve">3. Paek, A., Liu, J., Loewer, A., Forrester, W. &amp; Lahav, G. Cell-to-Cell Variation in p53 Dynamics Leads to Fractional Killing.</w:t>
+      </w:r>
+      <w:r>
+        <w:t xml:space="preserve"> </w:t>
+      </w:r>
+      <w:r>
+        <w:rPr>
+          <w:i/>
+        </w:rPr>
+        <w:t xml:space="preserve">Cell</w:t>
+      </w:r>
+      <w:r>
+        <w:t xml:space="preserve"> </w:t>
+      </w:r>
+      <w:r>
+        <w:rPr>
+          <w:b/>
+        </w:rPr>
+        <w:t xml:space="preserve">165</w:t>
+      </w:r>
+      <w:r>
+        <w:t xml:space="preserve">, 631–642 (2016).</w:t>
+      </w:r>
+    </w:p>
+    <w:bookmarkEnd w:id="62"/>
+    <w:bookmarkStart w:id="63" w:name="ref-qUZcGLd9"/>
+    <w:p>
+      <w:pPr>
+        <w:pStyle w:val="Bibliography"/>
+      </w:pPr>
+      <w:r>
+        <w:t xml:space="preserve">4. Maude, S. L.</w:t>
+      </w:r>
+      <w:r>
+        <w:t xml:space="preserve"> </w:t>
+      </w:r>
+      <w:r>
+        <w:rPr>
+          <w:i/>
+        </w:rPr>
+        <w:t xml:space="preserve">et al.</w:t>
+      </w:r>
+      <w:r>
+        <w:t xml:space="preserve"> </w:t>
+      </w:r>
+      <w:r>
+        <w:t xml:space="preserve">Chimeric Antigen Receptor T Cells for Sustained Remissions in Leukemia.</w:t>
+      </w:r>
+      <w:r>
+        <w:t xml:space="preserve"> </w:t>
+      </w:r>
+      <w:r>
+        <w:rPr>
+          <w:i/>
+        </w:rPr>
+        <w:t xml:space="preserve">New England Journal of Medicine</w:t>
+      </w:r>
+      <w:r>
+        <w:t xml:space="preserve"> </w:t>
+      </w:r>
+      <w:r>
+        <w:rPr>
+          <w:b/>
+        </w:rPr>
+        <w:t xml:space="preserve">371</w:t>
+      </w:r>
+      <w:r>
+        <w:t xml:space="preserve">, 1507–1517 (2014).</w:t>
+      </w:r>
+    </w:p>
+    <w:bookmarkEnd w:id="63"/>
+    <w:bookmarkStart w:id="64" w:name="ref-63ewQnLP"/>
+    <w:p>
+      <w:pPr>
+        <w:pStyle w:val="Bibliography"/>
+      </w:pPr>
+      <w:r>
+        <w:t xml:space="preserve">5. O’Rourke, D. M.</w:t>
+      </w:r>
+      <w:r>
+        <w:t xml:space="preserve"> </w:t>
+      </w:r>
+      <w:r>
+        <w:rPr>
+          <w:i/>
+        </w:rPr>
+        <w:t xml:space="preserve">et al.</w:t>
+      </w:r>
+      <w:r>
+        <w:t xml:space="preserve"> </w:t>
+      </w:r>
+      <w:r>
+        <w:t xml:space="preserve">A single dose of peripherally infused EGFRvIII-directed CAR T cells mediates antigen loss and induces adaptive resistance in patients with recurrent glioblastoma.</w:t>
+      </w:r>
+      <w:r>
+        <w:t xml:space="preserve"> </w:t>
+      </w:r>
+      <w:r>
+        <w:rPr>
+          <w:i/>
+        </w:rPr>
+        <w:t xml:space="preserve">Science Translational Medicine</w:t>
+      </w:r>
+      <w:r>
+        <w:t xml:space="preserve"> </w:t>
+      </w:r>
+      <w:r>
+        <w:rPr>
+          <w:b/>
+        </w:rPr>
+        <w:t xml:space="preserve">9</w:t>
+      </w:r>
+      <w:r>
+        <w:t xml:space="preserve">, eaaa0984 (2017).</w:t>
+      </w:r>
+    </w:p>
+    <w:bookmarkEnd w:id="64"/>
+    <w:bookmarkStart w:id="65" w:name="ref-3qk2Wsrw"/>
+    <w:p>
+      <w:pPr>
+        <w:pStyle w:val="Bibliography"/>
+      </w:pPr>
+      <w:r>
+        <w:t xml:space="preserve">6. Shalek, A. K.</w:t>
+      </w:r>
+      <w:r>
+        <w:t xml:space="preserve"> </w:t>
+      </w:r>
+      <w:r>
+        <w:rPr>
+          <w:i/>
+        </w:rPr>
+        <w:t xml:space="preserve">et al.</w:t>
+      </w:r>
+      <w:r>
+        <w:t xml:space="preserve"> </w:t>
+      </w:r>
+      <w:r>
+        <w:t xml:space="preserve">Single-cell RNA-seq reveals dynamic paracrine control of cellular variation.</w:t>
+      </w:r>
+      <w:r>
+        <w:t xml:space="preserve"> </w:t>
+      </w:r>
+      <w:r>
+        <w:rPr>
+          <w:i/>
+        </w:rPr>
+        <w:t xml:space="preserve">Nature</w:t>
+      </w:r>
+      <w:r>
+        <w:t xml:space="preserve"> </w:t>
+      </w:r>
+      <w:r>
+        <w:rPr>
+          <w:b/>
+        </w:rPr>
+        <w:t xml:space="preserve">510</w:t>
+      </w:r>
+      <w:r>
+        <w:t xml:space="preserve">, 363–9 (2014).</w:t>
+      </w:r>
+    </w:p>
+    <w:bookmarkEnd w:id="65"/>
+    <w:bookmarkStart w:id="66" w:name="ref-pF89Nm4u"/>
+    <w:p>
+      <w:pPr>
+        <w:pStyle w:val="Bibliography"/>
+      </w:pPr>
+      <w:r>
+        <w:t xml:space="preserve">7. Mitra, S.</w:t>
+      </w:r>
+      <w:r>
+        <w:t xml:space="preserve"> </w:t>
+      </w:r>
+      <w:r>
+        <w:rPr>
+          <w:i/>
+        </w:rPr>
+        <w:t xml:space="preserve">et al.</w:t>
+      </w:r>
+      <w:r>
+        <w:t xml:space="preserve"> </w:t>
+      </w:r>
+      <w:r>
+        <w:t xml:space="preserve">Interleukin-2 activity can be fine tuned with engineered receptor signaling clamps.</w:t>
+      </w:r>
+      <w:r>
+        <w:t xml:space="preserve"> </w:t>
+      </w:r>
+      <w:r>
+        <w:rPr>
+          <w:i/>
+        </w:rPr>
+        <w:t xml:space="preserve">Immunity</w:t>
+      </w:r>
+      <w:r>
+        <w:t xml:space="preserve"> </w:t>
+      </w:r>
+      <w:r>
+        <w:rPr>
+          <w:b/>
+        </w:rPr>
+        <w:t xml:space="preserve">42</w:t>
+      </w:r>
+      <w:r>
+        <w:t xml:space="preserve">, 826–38 (2015).</w:t>
+      </w:r>
+    </w:p>
+    <w:bookmarkEnd w:id="66"/>
+    <w:bookmarkStart w:id="67" w:name="ref-GCbN2SKa"/>
+    <w:p>
+      <w:pPr>
+        <w:pStyle w:val="Bibliography"/>
+      </w:pPr>
+      <w:r>
+        <w:t xml:space="preserve">8. Chen, Z.</w:t>
+      </w:r>
+      <w:r>
+        <w:t xml:space="preserve"> </w:t>
+      </w:r>
+      <w:r>
+        <w:rPr>
+          <w:i/>
+        </w:rPr>
+        <w:t xml:space="preserve">et al.</w:t>
+      </w:r>
+      <w:r>
+        <w:t xml:space="preserve"> </w:t>
+      </w:r>
+      <w:r>
+        <w:t xml:space="preserve">De novo design of protein logic gates.</w:t>
+      </w:r>
+      <w:r>
+        <w:t xml:space="preserve"> </w:t>
+      </w:r>
+      <w:r>
+        <w:rPr>
+          <w:i/>
+        </w:rPr>
+        <w:t xml:space="preserve">Science</w:t>
+      </w:r>
+      <w:r>
+        <w:t xml:space="preserve"> </w:t>
+      </w:r>
+      <w:r>
+        <w:rPr>
+          <w:b/>
+        </w:rPr>
+        <w:t xml:space="preserve">368</w:t>
+      </w:r>
+      <w:r>
+        <w:t xml:space="preserve">, 78–84 (2020).</w:t>
+      </w:r>
+    </w:p>
+    <w:bookmarkEnd w:id="67"/>
+    <w:bookmarkStart w:id="68" w:name="ref-4XrP8kd6"/>
+    <w:p>
+      <w:pPr>
+        <w:pStyle w:val="Bibliography"/>
+      </w:pPr>
+      <w:r>
+        <w:t xml:space="preserve">9. Srivastava, S.</w:t>
+      </w:r>
+      <w:r>
+        <w:t xml:space="preserve"> </w:t>
+      </w:r>
+      <w:r>
+        <w:rPr>
+          <w:i/>
+        </w:rPr>
+        <w:t xml:space="preserve">et al.</w:t>
+      </w:r>
+      <w:r>
+        <w:t xml:space="preserve"> </w:t>
+      </w:r>
+      <w:r>
+        <w:t xml:space="preserve">Logic-Gated ROR1 Chimeric Antigen Receptor Expression Rescues T Cell-Mediated Toxicity to Normal Tissues and Enables Selective Tumor Targeting.</w:t>
+      </w:r>
+      <w:r>
+        <w:t xml:space="preserve"> </w:t>
+      </w:r>
+      <w:r>
+        <w:rPr>
+          <w:i/>
+        </w:rPr>
+        <w:t xml:space="preserve">Cancer Cell</w:t>
+      </w:r>
+      <w:r>
+        <w:t xml:space="preserve"> </w:t>
+      </w:r>
+      <w:r>
+        <w:rPr>
+          <w:b/>
+        </w:rPr>
+        <w:t xml:space="preserve">35</w:t>
+      </w:r>
+      <w:r>
+        <w:t xml:space="preserve">, 489–503.e8 (2019).</w:t>
+      </w:r>
+    </w:p>
+    <w:bookmarkEnd w:id="68"/>
+    <w:bookmarkStart w:id="69" w:name="ref-TZjxCK1M"/>
+    <w:p>
+      <w:pPr>
+        <w:pStyle w:val="Bibliography"/>
+      </w:pPr>
+      <w:r>
+        <w:t xml:space="preserve">10. Cho, J. H., Collins, J. J. &amp; Wong, W. W. Universal Chimeric Antigen Receptors for Multiplexed and Logical Control of T Cell Responses.</w:t>
+      </w:r>
+      <w:r>
+        <w:t xml:space="preserve"> </w:t>
+      </w:r>
+      <w:r>
+        <w:rPr>
+          <w:i/>
+        </w:rPr>
+        <w:t xml:space="preserve">Cell</w:t>
+      </w:r>
+      <w:r>
+        <w:t xml:space="preserve"> </w:t>
+      </w:r>
+      <w:r>
+        <w:rPr>
+          <w:b/>
+        </w:rPr>
+        <w:t xml:space="preserve">173</w:t>
+      </w:r>
+      <w:r>
+        <w:t xml:space="preserve">, 1426–1438.e11 (2018).</w:t>
+      </w:r>
+    </w:p>
+    <w:bookmarkEnd w:id="69"/>
+    <w:bookmarkStart w:id="71" w:name="ref-12Gx1OssI"/>
+    <w:p>
+      <w:pPr>
+        <w:pStyle w:val="Bibliography"/>
+      </w:pPr>
+      <w:r>
+        <w:t xml:space="preserve">11. Ianevski, A., Giri, A. K. &amp; Aittokallio, T. Fully-automated cell-type identification with specific markers extracted from single-cell transcriptomic data.</w:t>
+      </w:r>
+      <w:r>
+        <w:t xml:space="preserve"> </w:t>
+      </w:r>
+      <w:r>
+        <w:rPr>
+          <w:i/>
+        </w:rPr>
+        <w:t xml:space="preserve">bioRxiv</w:t>
+      </w:r>
+      <w:r>
+        <w:t xml:space="preserve"> </w:t>
+      </w:r>
+      <w:r>
+        <w:t xml:space="preserve">(2019). doi:</w:t>
+      </w:r>
+      <w:hyperlink r:id="rId70">
+        <w:r>
+          <w:rPr>
+            <w:rStyle w:val="Hyperlink"/>
+          </w:rPr>
+          <w:t xml:space="preserve">10.1101/812131</w:t>
+        </w:r>
+      </w:hyperlink>
+    </w:p>
+    <w:bookmarkEnd w:id="71"/>
+    <w:bookmarkStart w:id="72" w:name="ref-10kZoPeON"/>
+    <w:p>
+      <w:pPr>
+        <w:pStyle w:val="Bibliography"/>
+      </w:pPr>
+      <w:r>
+        <w:t xml:space="preserve">12. Robinson, M. K.</w:t>
+      </w:r>
+      <w:r>
+        <w:t xml:space="preserve"> </w:t>
+      </w:r>
+      <w:r>
+        <w:rPr>
+          <w:i/>
+        </w:rPr>
+        <w:t xml:space="preserve">et al.</w:t>
+      </w:r>
+      <w:r>
+        <w:t xml:space="preserve"> </w:t>
+      </w:r>
+      <w:r>
+        <w:t xml:space="preserve">Targeting ErbB2 and ErbB3 with a bispecific single-chain Fv enhances targeting selectivity and induces a therapeutic effect in vitro.</w:t>
+      </w:r>
+      <w:r>
+        <w:t xml:space="preserve"> </w:t>
+      </w:r>
+      <w:r>
+        <w:rPr>
+          <w:i/>
+        </w:rPr>
+        <w:t xml:space="preserve">British Journal of Cancer</w:t>
+      </w:r>
+      <w:r>
+        <w:t xml:space="preserve"> </w:t>
+      </w:r>
+      <w:r>
+        <w:rPr>
+          <w:b/>
+        </w:rPr>
+        <w:t xml:space="preserve">99</w:t>
+      </w:r>
+      <w:r>
+        <w:t xml:space="preserve">, 1415–1425 (2008).</w:t>
+      </w:r>
+    </w:p>
+    <w:bookmarkEnd w:id="72"/>
+    <w:bookmarkStart w:id="73" w:name="ref-B0xrCfE3"/>
+    <w:p>
+      <w:pPr>
+        <w:pStyle w:val="Bibliography"/>
+      </w:pPr>
+      <w:r>
+        <w:t xml:space="preserve">13. Carlson, C. B., Mowery, P., Owen, R. M., Dykhuizen, E. C. &amp; Kiessling, L. L. Selective Tumor Cell Targeting Using Low-Affinity, Multivalent Interactions.</w:t>
+      </w:r>
+      <w:r>
+        <w:t xml:space="preserve"> </w:t>
+      </w:r>
+      <w:r>
+        <w:rPr>
+          <w:i/>
+        </w:rPr>
+        <w:t xml:space="preserve">ACS Chemical Biology</w:t>
+      </w:r>
+      <w:r>
+        <w:t xml:space="preserve"> </w:t>
+      </w:r>
+      <w:r>
+        <w:rPr>
+          <w:b/>
+        </w:rPr>
+        <w:t xml:space="preserve">2</w:t>
+      </w:r>
+      <w:r>
+        <w:t xml:space="preserve">, 119–127 (2007).</w:t>
+      </w:r>
+    </w:p>
+    <w:bookmarkEnd w:id="73"/>
+    <w:bookmarkStart w:id="74" w:name="ref-LOh8Ljpe"/>
+    <w:p>
+      <w:pPr>
+        <w:pStyle w:val="Bibliography"/>
+      </w:pPr>
+      <w:r>
+        <w:t xml:space="preserve">14. Silva, D.-A.</w:t>
+      </w:r>
+      <w:r>
+        <w:t xml:space="preserve"> </w:t>
+      </w:r>
+      <w:r>
+        <w:rPr>
+          <w:i/>
+        </w:rPr>
+        <w:t xml:space="preserve">et al.</w:t>
+      </w:r>
+      <w:r>
+        <w:t xml:space="preserve"> </w:t>
+      </w:r>
+      <w:r>
+        <w:t xml:space="preserve">De novo design of potent and selective mimics of IL-2 and IL-15.</w:t>
+      </w:r>
+      <w:r>
+        <w:t xml:space="preserve"> </w:t>
+      </w:r>
+      <w:r>
+        <w:rPr>
+          <w:i/>
+        </w:rPr>
+        <w:t xml:space="preserve">Nature</w:t>
+      </w:r>
+      <w:r>
+        <w:t xml:space="preserve"> </w:t>
+      </w:r>
+      <w:r>
+        <w:rPr>
+          <w:b/>
+        </w:rPr>
+        <w:t xml:space="preserve">565</w:t>
+      </w:r>
+      <w:r>
+        <w:t xml:space="preserve">, 186–191 (2019).</w:t>
+      </w:r>
+    </w:p>
+    <w:bookmarkEnd w:id="74"/>
+    <w:bookmarkStart w:id="75" w:name="ref-11Hb1fNV6"/>
+    <w:p>
+      <w:pPr>
+        <w:pStyle w:val="Bibliography"/>
+      </w:pPr>
+      <w:r>
+        <w:t xml:space="preserve">15. Busse, D.</w:t>
+      </w:r>
+      <w:r>
+        <w:t xml:space="preserve"> </w:t>
+      </w:r>
+      <w:r>
+        <w:rPr>
+          <w:i/>
+        </w:rPr>
+        <w:t xml:space="preserve">et al.</w:t>
+      </w:r>
+      <w:r>
+        <w:t xml:space="preserve"> </w:t>
+      </w:r>
+      <w:r>
+        <w:t xml:space="preserve">Competing feedback loops shape IL-2 signaling between helper and regulatory T lymphocytes in cellular microenvironments.</w:t>
+      </w:r>
+      <w:r>
+        <w:t xml:space="preserve"> </w:t>
+      </w:r>
+      <w:r>
+        <w:rPr>
+          <w:i/>
+        </w:rPr>
+        <w:t xml:space="preserve">Proceedings of the National Academy of Sciences</w:t>
+      </w:r>
+      <w:r>
+        <w:t xml:space="preserve"> </w:t>
+      </w:r>
+      <w:r>
+        <w:rPr>
+          <w:b/>
+        </w:rPr>
+        <w:t xml:space="preserve">107</w:t>
+      </w:r>
+      <w:r>
+        <w:t xml:space="preserve">, 3058–3063 (2010).</w:t>
+      </w:r>
+    </w:p>
+    <w:bookmarkEnd w:id="75"/>
+    <w:bookmarkStart w:id="76" w:name="ref-VKATSjfe"/>
+    <w:p>
+      <w:pPr>
+        <w:pStyle w:val="Bibliography"/>
+      </w:pPr>
+      <w:r>
+        <w:t xml:space="preserve">16. Merwe, R. van der. Sigma-Point Kalman Filters for Probabilistic Inference in Dynamic State-Space Models. (2004).</w:t>
+      </w:r>
+    </w:p>
+    <w:bookmarkEnd w:id="76"/>
+    <w:bookmarkStart w:id="77" w:name="ref-11gk5tUo7"/>
+    <w:p>
+      <w:pPr>
+        <w:pStyle w:val="Bibliography"/>
+      </w:pPr>
+      <w:r>
+        <w:t xml:space="preserve">17. Robinett, R. A.</w:t>
+      </w:r>
+      <w:r>
+        <w:t xml:space="preserve"> </w:t>
+      </w:r>
+      <w:r>
+        <w:rPr>
+          <w:i/>
+        </w:rPr>
+        <w:t xml:space="preserve">et al.</w:t>
+      </w:r>
+      <w:r>
+        <w:t xml:space="preserve"> </w:t>
+      </w:r>
+      <w:r>
+        <w:t xml:space="preserve">Dissecting FcγR Regulation through a Multivalent Binding Model.</w:t>
+      </w:r>
+      <w:r>
+        <w:t xml:space="preserve"> </w:t>
+      </w:r>
+      <w:r>
+        <w:rPr>
+          <w:i/>
+        </w:rPr>
+        <w:t xml:space="preserve">Cell Syst</w:t>
+      </w:r>
+      <w:r>
+        <w:t xml:space="preserve"> </w:t>
+      </w:r>
+      <w:r>
+        <w:rPr>
+          <w:b/>
+        </w:rPr>
+        <w:t xml:space="preserve">7</w:t>
+      </w:r>
+      <w:r>
+        <w:t xml:space="preserve">, 41–48.e5 (2018).</w:t>
+      </w:r>
+    </w:p>
+    <w:bookmarkEnd w:id="77"/>
+    <w:bookmarkStart w:id="78" w:name="ref-u2Cb0DBq"/>
+    <w:p>
+      <w:pPr>
+        <w:pStyle w:val="Bibliography"/>
+      </w:pPr>
+      <w:r>
+        <w:t xml:space="preserve">18. Csizmar, C. M.</w:t>
+      </w:r>
+      <w:r>
+        <w:t xml:space="preserve"> </w:t>
+      </w:r>
+      <w:r>
+        <w:rPr>
+          <w:i/>
+        </w:rPr>
+        <w:t xml:space="preserve">et al.</w:t>
+      </w:r>
+      <w:r>
+        <w:t xml:space="preserve"> </w:t>
+      </w:r>
+      <w:r>
+        <w:t xml:space="preserve">Multivalent Ligand Binding to Cell Membrane Antigens: Defining the Interplay of Affinity, Valency, and Expression Density.</w:t>
+      </w:r>
+      <w:r>
+        <w:t xml:space="preserve"> </w:t>
+      </w:r>
+      <w:r>
+        <w:rPr>
+          <w:i/>
+        </w:rPr>
+        <w:t xml:space="preserve">Journal of the American Chemical Society</w:t>
+      </w:r>
+      <w:r>
+        <w:t xml:space="preserve"> </w:t>
+      </w:r>
+      <w:r>
+        <w:rPr>
+          <w:b/>
+        </w:rPr>
+        <w:t xml:space="preserve">141</w:t>
+      </w:r>
+      <w:r>
+        <w:t xml:space="preserve">, 251–261 (2018).</w:t>
+      </w:r>
+    </w:p>
+    <w:bookmarkEnd w:id="78"/>
+    <w:bookmarkStart w:id="79" w:name="ref-IanZRiFA"/>
+    <w:p>
+      <w:pPr>
+        <w:pStyle w:val="Bibliography"/>
+      </w:pPr>
+      <w:r>
+        <w:t xml:space="preserve">19. Mazor, Y.</w:t>
+      </w:r>
+      <w:r>
+        <w:t xml:space="preserve"> </w:t>
+      </w:r>
+      <w:r>
+        <w:rPr>
+          <w:i/>
+        </w:rPr>
+        <w:t xml:space="preserve">et al.</w:t>
+      </w:r>
+      <w:r>
+        <w:t xml:space="preserve"> </w:t>
+      </w:r>
+      <w:r>
+        <w:t xml:space="preserve">Enhanced tumor-targeting selectivity by modulating bispecific antibody binding affinity and format valence.</w:t>
+      </w:r>
+      <w:r>
+        <w:t xml:space="preserve"> </w:t>
+      </w:r>
+      <w:r>
+        <w:rPr>
+          <w:i/>
+        </w:rPr>
+        <w:t xml:space="preserve">Scientific Reports</w:t>
+      </w:r>
+      <w:r>
+        <w:t xml:space="preserve"> </w:t>
+      </w:r>
+      <w:r>
+        <w:rPr>
+          <w:b/>
+        </w:rPr>
+        <w:t xml:space="preserve">7</w:t>
+      </w:r>
+      <w:r>
+        <w:t xml:space="preserve">, (2017).</w:t>
+      </w:r>
+    </w:p>
+    <w:bookmarkEnd w:id="79"/>
+    <w:bookmarkStart w:id="80" w:name="ref-luDqQ0zL"/>
+    <w:p>
+      <w:pPr>
+        <w:pStyle w:val="Bibliography"/>
+      </w:pPr>
+      <w:r>
+        <w:t xml:space="preserve">20. Lehár, J.</w:t>
+      </w:r>
+      <w:r>
+        <w:t xml:space="preserve"> </w:t>
+      </w:r>
+      <w:r>
+        <w:rPr>
+          <w:i/>
+        </w:rPr>
+        <w:t xml:space="preserve">et al.</w:t>
+      </w:r>
+      <w:r>
+        <w:t xml:space="preserve"> </w:t>
+      </w:r>
+      <w:r>
+        <w:t xml:space="preserve">Synergistic drug combinations tend to improve therapeutically relevant selectivity.</w:t>
+      </w:r>
+      <w:r>
+        <w:t xml:space="preserve"> </w:t>
+      </w:r>
+      <w:r>
+        <w:rPr>
+          <w:i/>
+        </w:rPr>
+        <w:t xml:space="preserve">Nature Biotechnology</w:t>
+      </w:r>
+      <w:r>
+        <w:t xml:space="preserve"> </w:t>
+      </w:r>
+      <w:r>
+        <w:rPr>
+          <w:b/>
+        </w:rPr>
+        <w:t xml:space="preserve">27</w:t>
+      </w:r>
+      <w:r>
+        <w:t xml:space="preserve">, 659–666 (2009).</w:t>
+      </w:r>
+    </w:p>
+    <w:bookmarkEnd w:id="80"/>
+    <w:bookmarkStart w:id="81" w:name="ref-eR2h4yr3"/>
+    <w:p>
+      <w:pPr>
+        <w:pStyle w:val="Bibliography"/>
+      </w:pPr>
+      <w:r>
+        <w:t xml:space="preserve">21. Olivova, P., Chen, W., Chakraborty, A. B. &amp; Gebler, J. C. Determination of N-glycosylation sites and site heterogeneity in a monoclonal antibody by electrospray quadrupole ion-mobility time-of-flight mass spectrometry.</w:t>
+      </w:r>
+      <w:r>
+        <w:t xml:space="preserve"> </w:t>
+      </w:r>
+      <w:r>
+        <w:rPr>
+          <w:i/>
+        </w:rPr>
+        <w:t xml:space="preserve">Rapid Communications in Mass Spectrometry</w:t>
+      </w:r>
+      <w:r>
+        <w:t xml:space="preserve"> </w:t>
+      </w:r>
+      <w:r>
+        <w:rPr>
+          <w:b/>
+        </w:rPr>
+        <w:t xml:space="preserve">22</w:t>
+      </w:r>
+      <w:r>
+        <w:t xml:space="preserve">, 29–40 (2008).</w:t>
+      </w:r>
+    </w:p>
+    <w:bookmarkEnd w:id="81"/>
+    <w:bookmarkStart w:id="82" w:name="ref-8lU1hNlA"/>
+    <w:p>
+      <w:pPr>
+        <w:pStyle w:val="Bibliography"/>
+      </w:pPr>
+      <w:r>
+        <w:t xml:space="preserve">22. Antebi, Y. E.</w:t>
+      </w:r>
+      <w:r>
+        <w:t xml:space="preserve"> </w:t>
+      </w:r>
+      <w:r>
+        <w:rPr>
+          <w:i/>
+        </w:rPr>
+        <w:t xml:space="preserve">et al.</w:t>
+      </w:r>
+      <w:r>
+        <w:t xml:space="preserve"> </w:t>
+      </w:r>
+      <w:r>
+        <w:t xml:space="preserve">Combinatorial Signal Perception in the BMP Pathway.</w:t>
+      </w:r>
+      <w:r>
+        <w:t xml:space="preserve"> </w:t>
+      </w:r>
+      <w:r>
+        <w:rPr>
+          <w:i/>
+        </w:rPr>
+        <w:t xml:space="preserve">Cell</w:t>
+      </w:r>
+      <w:r>
+        <w:t xml:space="preserve"> </w:t>
+      </w:r>
+      <w:r>
+        <w:rPr>
+          <w:b/>
+        </w:rPr>
+        <w:t xml:space="preserve">170</w:t>
+      </w:r>
+      <w:r>
+        <w:t xml:space="preserve">, 1184–1196.e24 (2017).</w:t>
+      </w:r>
+    </w:p>
+    <w:bookmarkEnd w:id="82"/>
+    <w:bookmarkStart w:id="83" w:name="ref-iG3t9Py2"/>
+    <w:p>
+      <w:pPr>
+        <w:pStyle w:val="Bibliography"/>
+      </w:pPr>
+      <w:r>
+        <w:t xml:space="preserve">23. Deshaies, R. J. Multispecific drugs herald a new era of biopharmaceutical innovation.</w:t>
+      </w:r>
+      <w:r>
+        <w:t xml:space="preserve"> </w:t>
+      </w:r>
+      <w:r>
+        <w:rPr>
+          <w:i/>
+        </w:rPr>
+        <w:t xml:space="preserve">Nature</w:t>
+      </w:r>
+      <w:r>
+        <w:t xml:space="preserve"> </w:t>
+      </w:r>
+      <w:r>
+        <w:rPr>
+          <w:b/>
+        </w:rPr>
+        <w:t xml:space="preserve">580</w:t>
+      </w:r>
+      <w:r>
+        <w:t xml:space="preserve">, 329–338 (2020).</w:t>
+      </w:r>
+    </w:p>
+    <w:bookmarkEnd w:id="83"/>
+    <w:bookmarkStart w:id="84" w:name="ref-18yoQOgm4"/>
+    <w:p>
+      <w:pPr>
+        <w:pStyle w:val="Bibliography"/>
+      </w:pPr>
+      <w:r>
+        <w:t xml:space="preserve">24. Piccione, E. C.</w:t>
+      </w:r>
+      <w:r>
+        <w:t xml:space="preserve"> </w:t>
+      </w:r>
+      <w:r>
+        <w:rPr>
+          <w:i/>
+        </w:rPr>
+        <w:t xml:space="preserve">et al.</w:t>
+      </w:r>
+      <w:r>
+        <w:t xml:space="preserve"> </w:t>
+      </w:r>
+      <w:r>
+        <w:t xml:space="preserve">A bispecific antibody targeting CD47 and CD20 selectively binds and eliminates dual antigen expressing lymphoma cells.</w:t>
+      </w:r>
+      <w:r>
+        <w:t xml:space="preserve"> </w:t>
+      </w:r>
+      <w:r>
+        <w:rPr>
+          <w:i/>
+        </w:rPr>
+        <w:t xml:space="preserve">mAbs</w:t>
+      </w:r>
+      <w:r>
+        <w:t xml:space="preserve"> </w:t>
+      </w:r>
+      <w:r>
+        <w:rPr>
+          <w:b/>
+        </w:rPr>
+        <w:t xml:space="preserve">7</w:t>
+      </w:r>
+      <w:r>
+        <w:t xml:space="preserve">, 946–956 (2015).</w:t>
+      </w:r>
+    </w:p>
+    <w:bookmarkEnd w:id="84"/>
+    <w:bookmarkStart w:id="85" w:name="ref-y7JtEfom"/>
+    <w:p>
+      <w:pPr>
+        <w:pStyle w:val="Bibliography"/>
+      </w:pPr>
+      <w:r>
+        <w:t xml:space="preserve">25. Qi, J., Chen, S.-S., Chiorazzi, N. &amp; Rader, C. An IgG1-like bispecific antibody targeting CD52 and CD20 for the treatment of B-cell malignancies.</w:t>
+      </w:r>
+      <w:r>
+        <w:t xml:space="preserve"> </w:t>
+      </w:r>
+      <w:r>
+        <w:rPr>
+          <w:i/>
+        </w:rPr>
+        <w:t xml:space="preserve">Methods</w:t>
+      </w:r>
+      <w:r>
+        <w:t xml:space="preserve"> </w:t>
+      </w:r>
+      <w:r>
+        <w:rPr>
+          <w:b/>
+        </w:rPr>
+        <w:t xml:space="preserve">154</w:t>
+      </w:r>
+      <w:r>
+        <w:t xml:space="preserve">, 70–76 (2018).</w:t>
+      </w:r>
+    </w:p>
+    <w:bookmarkEnd w:id="85"/>
+    <w:bookmarkStart w:id="86" w:name="ref-FqWAsZ7z"/>
+    <w:p>
+      <w:pPr>
+        <w:pStyle w:val="Bibliography"/>
+      </w:pPr>
+      <w:r>
+        <w:t xml:space="preserve">26. Bentebibel, S.-E.</w:t>
+      </w:r>
+      <w:r>
+        <w:t xml:space="preserve"> </w:t>
+      </w:r>
+      <w:r>
+        <w:rPr>
+          <w:i/>
+        </w:rPr>
+        <w:t xml:space="preserve">et al.</w:t>
+      </w:r>
+      <w:r>
+        <w:t xml:space="preserve"> </w:t>
+      </w:r>
+      <w:r>
+        <w:t xml:space="preserve">A First-in-Human Study and Biomarker Analysis of NKTR-214, a Novel IL2Rβγ-Biased Cytokine, in Patients with Advanced or Metastatic Solid Tumors.</w:t>
+      </w:r>
+      <w:r>
+        <w:t xml:space="preserve"> </w:t>
+      </w:r>
+      <w:r>
+        <w:rPr>
+          <w:i/>
+        </w:rPr>
+        <w:t xml:space="preserve">Cancer Discovery</w:t>
+      </w:r>
+      <w:r>
+        <w:t xml:space="preserve"> </w:t>
+      </w:r>
+      <w:r>
+        <w:rPr>
+          <w:b/>
+        </w:rPr>
+        <w:t xml:space="preserve">9</w:t>
+      </w:r>
+      <w:r>
+        <w:t xml:space="preserve">, 711–721 (2019).</w:t>
+      </w:r>
+    </w:p>
+    <w:bookmarkEnd w:id="86"/>
+    <w:bookmarkStart w:id="87" w:name="ref-L2k7ECfb"/>
+    <w:p>
+      <w:pPr>
+        <w:pStyle w:val="Bibliography"/>
+      </w:pPr>
+      <w:r>
+        <w:t xml:space="preserve">27. Peterson, L. B.</w:t>
+      </w:r>
+      <w:r>
+        <w:t xml:space="preserve"> </w:t>
+      </w:r>
+      <w:r>
+        <w:rPr>
+          <w:i/>
+        </w:rPr>
+        <w:t xml:space="preserve">et al.</w:t>
+      </w:r>
+      <w:r>
+        <w:t xml:space="preserve"> </w:t>
+      </w:r>
+      <w:r>
+        <w:t xml:space="preserve">A long-lived IL-2 mutein that selectively activates and expands regulatory T cells as a therapy for autoimmune disease.</w:t>
+      </w:r>
+      <w:r>
+        <w:t xml:space="preserve"> </w:t>
+      </w:r>
+      <w:r>
+        <w:rPr>
+          <w:i/>
+        </w:rPr>
+        <w:t xml:space="preserve">J Autoimmun</w:t>
+      </w:r>
+      <w:r>
+        <w:t xml:space="preserve"> </w:t>
+      </w:r>
+      <w:r>
+        <w:rPr>
+          <w:b/>
+        </w:rPr>
+        <w:t xml:space="preserve">95</w:t>
+      </w:r>
+      <w:r>
+        <w:t xml:space="preserve">, 1–14 (2018).</w:t>
+      </w:r>
+    </w:p>
+    <w:bookmarkEnd w:id="87"/>
+    <w:bookmarkStart w:id="88" w:name="ref-3WVNxYBN"/>
+    <w:p>
+      <w:pPr>
+        <w:pStyle w:val="Bibliography"/>
+      </w:pPr>
+      <w:r>
+        <w:t xml:space="preserve">28. Towers, C. G.</w:t>
+      </w:r>
+      <w:r>
+        <w:t xml:space="preserve"> </w:t>
+      </w:r>
+      <w:r>
+        <w:rPr>
+          <w:i/>
+        </w:rPr>
+        <w:t xml:space="preserve">et al.</w:t>
+      </w:r>
+      <w:r>
+        <w:t xml:space="preserve"> </w:t>
+      </w:r>
+      <w:r>
+        <w:t xml:space="preserve">Cancer Cells Upregulate NRF2 Signaling to Adapt to Autophagy Inhibition.</w:t>
+      </w:r>
+      <w:r>
+        <w:t xml:space="preserve"> </w:t>
+      </w:r>
+      <w:r>
+        <w:rPr>
+          <w:i/>
+        </w:rPr>
+        <w:t xml:space="preserve">Developmental Cell</w:t>
+      </w:r>
+      <w:r>
+        <w:t xml:space="preserve"> </w:t>
+      </w:r>
+      <w:r>
+        <w:rPr>
+          <w:b/>
+        </w:rPr>
+        <w:t xml:space="preserve">50</w:t>
+      </w:r>
+      <w:r>
+        <w:t xml:space="preserve">, 690–703.e6 (2019).</w:t>
+      </w:r>
+    </w:p>
+    <w:bookmarkEnd w:id="88"/>
+    <w:bookmarkStart w:id="89" w:name="ref-PIRfSNMl"/>
+    <w:p>
+      <w:pPr>
+        <w:pStyle w:val="Bibliography"/>
+      </w:pPr>
+      <w:r>
+        <w:t xml:space="preserve">29. Knowles, L. M.</w:t>
+      </w:r>
+      <w:r>
+        <w:t xml:space="preserve"> </w:t>
+      </w:r>
+      <w:r>
+        <w:rPr>
+          <w:i/>
+        </w:rPr>
+        <w:t xml:space="preserve">et al.</w:t>
+      </w:r>
+      <w:r>
+        <w:t xml:space="preserve"> </w:t>
+      </w:r>
+      <w:r>
+        <w:t xml:space="preserve">Integrin v 3 and Fibronectin Upregulate Slug in Cancer Cells to Promote Clot Invasion and Metastasis.</w:t>
+      </w:r>
+      <w:r>
+        <w:t xml:space="preserve"> </w:t>
+      </w:r>
+      <w:r>
+        <w:rPr>
+          <w:i/>
+        </w:rPr>
+        <w:t xml:space="preserve">Cancer Research</w:t>
+      </w:r>
+      <w:r>
+        <w:t xml:space="preserve"> </w:t>
+      </w:r>
+      <w:r>
+        <w:rPr>
+          <w:b/>
+        </w:rPr>
+        <w:t xml:space="preserve">73</w:t>
+      </w:r>
+      <w:r>
+        <w:t xml:space="preserve">, 6175–6184 (2013).</w:t>
+      </w:r>
+    </w:p>
+    <w:bookmarkEnd w:id="89"/>
+    <w:bookmarkStart w:id="90" w:name="ref-uMIi8rGN"/>
+    <w:p>
+      <w:pPr>
+        <w:pStyle w:val="Bibliography"/>
+      </w:pPr>
+      <w:r>
+        <w:t xml:space="preserve">30. Bubeník, J. Tumour MHC class I downregulation and immunotherapy (Review).</w:t>
+      </w:r>
+      <w:r>
+        <w:t xml:space="preserve"> </w:t>
+      </w:r>
+      <w:r>
+        <w:rPr>
+          <w:i/>
+        </w:rPr>
+        <w:t xml:space="preserve">Oncol Rep</w:t>
+      </w:r>
+      <w:r>
+        <w:t xml:space="preserve"> </w:t>
+      </w:r>
+      <w:r>
+        <w:rPr>
+          <w:b/>
+        </w:rPr>
+        <w:t xml:space="preserve">10</w:t>
+      </w:r>
+      <w:r>
+        <w:t xml:space="preserve">, 2005–8</w:t>
+      </w:r>
+    </w:p>
+    <w:bookmarkEnd w:id="90"/>
+    <w:bookmarkStart w:id="91" w:name="ref-bi6A2xzH"/>
+    <w:p>
+      <w:pPr>
+        <w:pStyle w:val="Bibliography"/>
+      </w:pPr>
+      <w:r>
+        <w:t xml:space="preserve">31. Guedan, S., Ruella, M. &amp; June, C. H. Emerging Cellular Therapies for Cancer.</w:t>
+      </w:r>
+      <w:r>
+        <w:t xml:space="preserve"> </w:t>
+      </w:r>
+      <w:r>
+        <w:rPr>
+          <w:i/>
+        </w:rPr>
+        <w:t xml:space="preserve">Annual Review of Immunology</w:t>
+      </w:r>
+      <w:r>
+        <w:t xml:space="preserve"> </w:t>
+      </w:r>
+      <w:r>
+        <w:rPr>
+          <w:b/>
+        </w:rPr>
+        <w:t xml:space="preserve">37</w:t>
+      </w:r>
+      <w:r>
+        <w:t xml:space="preserve">, 145–171 (2019).</w:t>
+      </w:r>
+    </w:p>
+    <w:bookmarkEnd w:id="91"/>
+    <w:bookmarkStart w:id="92" w:name="ref-Fp4dDXV1"/>
+    <w:p>
+      <w:pPr>
+        <w:pStyle w:val="Bibliography"/>
+      </w:pPr>
+      <w:r>
+        <w:t xml:space="preserve">32. Rezvani, K., Rouce, R., Liu, E. &amp; Shpall, E. Engineering Natural Killer Cells for Cancer Immunotherapy.</w:t>
+      </w:r>
+      <w:r>
+        <w:t xml:space="preserve"> </w:t>
+      </w:r>
+      <w:r>
+        <w:rPr>
+          <w:i/>
+        </w:rPr>
+        <w:t xml:space="preserve">Molecular Therapy</w:t>
+      </w:r>
+      <w:r>
+        <w:t xml:space="preserve"> </w:t>
+      </w:r>
+      <w:r>
+        <w:rPr>
+          <w:b/>
+        </w:rPr>
+        <w:t xml:space="preserve">25</w:t>
+      </w:r>
+      <w:r>
+        <w:t xml:space="preserve">, 1769–1781 (2017).</w:t>
+      </w:r>
+    </w:p>
+    <w:bookmarkEnd w:id="92"/>
+    <w:bookmarkStart w:id="94" w:name="ref-8Miti2Gz"/>
+    <w:p>
+      <w:pPr>
+        <w:pStyle w:val="Bibliography"/>
+      </w:pPr>
+      <w:r>
+        <w:t xml:space="preserve">33. Virtanen, P.</w:t>
+      </w:r>
+      <w:r>
+        <w:t xml:space="preserve"> </w:t>
+      </w:r>
+      <w:r>
+        <w:rPr>
+          <w:i/>
+        </w:rPr>
+        <w:t xml:space="preserve">et al.</w:t>
+      </w:r>
+      <w:r>
+        <w:t xml:space="preserve"> </w:t>
+      </w:r>
+      <w:r>
+        <w:t xml:space="preserve">SciPy 1.0: fundamental algorithms for scientific computing in Python.</w:t>
+      </w:r>
+      <w:r>
+        <w:t xml:space="preserve"> </w:t>
+      </w:r>
+      <w:r>
+        <w:rPr>
+          <w:i/>
+        </w:rPr>
+        <w:t xml:space="preserve">Nature Methods</w:t>
+      </w:r>
+      <w:r>
+        <w:t xml:space="preserve"> </w:t>
+      </w:r>
+      <w:r>
+        <w:t xml:space="preserve">(2020). doi:</w:t>
+      </w:r>
+      <w:hyperlink r:id="rId93">
+        <w:r>
+          <w:rPr>
+            <w:rStyle w:val="Hyperlink"/>
+          </w:rPr>
+          <w:t xml:space="preserve">10.1038/s41592-019-0686-2</w:t>
+        </w:r>
+      </w:hyperlink>
+    </w:p>
+    <w:bookmarkEnd w:id="94"/>
+    <w:bookmarkEnd w:id="95"/>
     <w:sectPr>
       <w:pgSz w:w="12240" w:h="15840"/>
       <w:pgMar w:top="1440" w:right="1440" w:bottom="1440" w:left="1440" w:header="720" w:footer="720" w:gutter="0"/>

</xml_diff>

<commit_message>
Deploying to gh-pages from  @ a373389286e26653343f960adb5a33e0b76e7221 🚀
</commit_message>
<xml_diff>
--- a/manuscript.docx
+++ b/manuscript.docx
@@ -7988,13 +7988,15 @@
       <w:r>
         <w:t xml:space="preserve">.</w:t>
       </w:r>
-      <w:r>
-        <w:rPr>
-          <w:b/>
-          <w:vertAlign w:val="superscript"/>
-        </w:rPr>
-        <w:t xml:space="preserve">???</w:t>
-      </w:r>
+      <w:hyperlink w:anchor="ref-uVvF8Fgs">
+        <w:r>
+          <w:rPr>
+            <w:rStyle w:val="Hyperlink"/>
+            <w:vertAlign w:val="superscript"/>
+          </w:rPr>
+          <w:t xml:space="preserve">26</w:t>
+        </w:r>
+      </w:hyperlink>
       <w:r>
         <w:t xml:space="preserve"> </w:t>
       </w:r>
@@ -11257,7 +11259,7 @@
             <w:rStyle w:val="Hyperlink"/>
             <w:vertAlign w:val="superscript"/>
           </w:rPr>
-          <w:t xml:space="preserve">26</w:t>
+          <w:t xml:space="preserve">27</w:t>
         </w:r>
       </w:hyperlink>
       <w:r>
@@ -11272,7 +11274,7 @@
             <w:rStyle w:val="Hyperlink"/>
             <w:vertAlign w:val="superscript"/>
           </w:rPr>
-          <w:t xml:space="preserve">27</w:t>
+          <w:t xml:space="preserve">28</w:t>
         </w:r>
       </w:hyperlink>
       <w:r>
@@ -11340,7 +11342,7 @@
             <w:rStyle w:val="Hyperlink"/>
             <w:vertAlign w:val="superscript"/>
           </w:rPr>
-          <w:t xml:space="preserve">28</w:t>
+          <w:t xml:space="preserve">29</w:t>
         </w:r>
       </w:hyperlink>
       <w:r>
@@ -11350,21 +11352,6 @@
         <w:t xml:space="preserve">,</w:t>
       </w:r>
       <w:hyperlink w:anchor="ref-PIRfSNMl">
-        <w:r>
-          <w:rPr>
-            <w:rStyle w:val="Hyperlink"/>
-            <w:vertAlign w:val="superscript"/>
-          </w:rPr>
-          <w:t xml:space="preserve">29</w:t>
-        </w:r>
-      </w:hyperlink>
-      <w:r>
-        <w:t xml:space="preserve"> </w:t>
-      </w:r>
-      <w:r>
-        <w:t xml:space="preserve">or downregulating</w:t>
-      </w:r>
-      <w:hyperlink w:anchor="ref-uMIi8rGN">
         <w:r>
           <w:rPr>
             <w:rStyle w:val="Hyperlink"/>
@@ -11377,17 +11364,9 @@
         <w:t xml:space="preserve"> </w:t>
       </w:r>
       <w:r>
-        <w:t xml:space="preserve">the expression of certain receptors. In this case, both the current and potential abundance of each receptor must be considered. While this work does not address many of these issues, we propose that using a computational binding model can analyze these strategies quantitatively and collectively from a mechanistic perspective. Even when the absolute mathematically optimal ligand characteristics cannot be achieved biochemically, our analyses provide guidance within the bounds of what is attainable and how to approach the optimum, accounting for implementation feasibility and facilitating the implementation of strategy combinations.</w:t>
-      </w:r>
-    </w:p>
-    <w:p>
-      <w:pPr>
-        <w:pStyle w:val="BodyText"/>
-      </w:pPr>
-      <w:r>
-        <w:t xml:space="preserve">In many therapeutic applications where selective engagement of target cell populations is an important performance metric, such as the treatment of cancer, cellular therapies are becoming increasingly popular.</w:t>
-      </w:r>
-      <w:hyperlink w:anchor="ref-bi6A2xzH">
+        <w:t xml:space="preserve">or downregulating</w:t>
+      </w:r>
+      <w:hyperlink w:anchor="ref-uMIi8rGN">
         <w:r>
           <w:rPr>
             <w:rStyle w:val="Hyperlink"/>
@@ -11400,6 +11379,29 @@
         <w:t xml:space="preserve"> </w:t>
       </w:r>
       <w:r>
+        <w:t xml:space="preserve">the expression of certain receptors. In this case, both the current and potential abundance of each receptor must be considered. While this work does not address many of these issues, we propose that using a computational binding model can analyze these strategies quantitatively and collectively from a mechanistic perspective. Even when the absolute mathematically optimal ligand characteristics cannot be achieved biochemically, our analyses provide guidance within the bounds of what is attainable and how to approach the optimum, accounting for implementation feasibility and facilitating the implementation of strategy combinations.</w:t>
+      </w:r>
+    </w:p>
+    <w:p>
+      <w:pPr>
+        <w:pStyle w:val="BodyText"/>
+      </w:pPr>
+      <w:r>
+        <w:t xml:space="preserve">In many therapeutic applications where selective engagement of target cell populations is an important performance metric, such as the treatment of cancer, cellular therapies are becoming increasingly popular.</w:t>
+      </w:r>
+      <w:hyperlink w:anchor="ref-bi6A2xzH">
+        <w:r>
+          <w:rPr>
+            <w:rStyle w:val="Hyperlink"/>
+            <w:vertAlign w:val="superscript"/>
+          </w:rPr>
+          <w:t xml:space="preserve">32</w:t>
+        </w:r>
+      </w:hyperlink>
+      <w:r>
+        <w:t xml:space="preserve"> </w:t>
+      </w:r>
+      <w:r>
         <w:t xml:space="preserve">Human engineered chimeric antigen receptor (CAR) T cells have enhanced the potential to selectively recognize and attack malignant tissues.</w:t>
       </w:r>
       <w:hyperlink w:anchor="ref-Fp4dDXV1">
@@ -11408,7 +11410,7 @@
             <w:rStyle w:val="Hyperlink"/>
             <w:vertAlign w:val="superscript"/>
           </w:rPr>
-          <w:t xml:space="preserve">32</w:t>
+          <w:t xml:space="preserve">33</w:t>
         </w:r>
       </w:hyperlink>
       <w:r>
@@ -14756,7 +14758,7 @@
             <w:rStyle w:val="Hyperlink"/>
             <w:vertAlign w:val="superscript"/>
           </w:rPr>
-          <w:t xml:space="preserve">33</w:t>
+          <w:t xml:space="preserve">34</w:t>
         </w:r>
       </w:hyperlink>
       <w:r>
@@ -15890,7 +15892,7 @@
       </w:r>
       <w:bookmarkEnd w:id="59"/>
     </w:p>
-    <w:bookmarkStart w:id="95" w:name="refs"/>
+    <w:bookmarkStart w:id="96" w:name="refs"/>
     <w:bookmarkStart w:id="60" w:name="ref-dr9JS306"/>
     <w:p>
       <w:pPr>
@@ -16902,13 +16904,44 @@
       </w:r>
     </w:p>
     <w:bookmarkEnd w:id="85"/>
-    <w:bookmarkStart w:id="86" w:name="ref-FqWAsZ7z"/>
+    <w:bookmarkStart w:id="86" w:name="ref-uVvF8Fgs"/>
     <w:p>
       <w:pPr>
         <w:pStyle w:val="Bibliography"/>
       </w:pPr>
       <w:r>
-        <w:t xml:space="preserve">26. Bentebibel, S.-E.</w:t>
+        <w:t xml:space="preserve">26. Hlavacek, W. S., Posner, R. G. &amp; Perelson, A. S. Steric effects on multivalent ligand-receptor binding: exclusion of ligand sites by bound cell surface receptors.</w:t>
+      </w:r>
+      <w:r>
+        <w:t xml:space="preserve"> </w:t>
+      </w:r>
+      <w:r>
+        <w:rPr>
+          <w:i/>
+        </w:rPr>
+        <w:t xml:space="preserve">Biophys J</w:t>
+      </w:r>
+      <w:r>
+        <w:t xml:space="preserve"> </w:t>
+      </w:r>
+      <w:r>
+        <w:rPr>
+          <w:b/>
+        </w:rPr>
+        <w:t xml:space="preserve">76</w:t>
+      </w:r>
+      <w:r>
+        <w:t xml:space="preserve">, 3031–43 (1999).</w:t>
+      </w:r>
+    </w:p>
+    <w:bookmarkEnd w:id="86"/>
+    <w:bookmarkStart w:id="87" w:name="ref-FqWAsZ7z"/>
+    <w:p>
+      <w:pPr>
+        <w:pStyle w:val="Bibliography"/>
+      </w:pPr>
+      <w:r>
+        <w:t xml:space="preserve">27. Bentebibel, S.-E.</w:t>
       </w:r>
       <w:r>
         <w:t xml:space="preserve"> </w:t>
@@ -16947,14 +16980,14 @@
         <w:t xml:space="preserve">, 711–721 (2019).</w:t>
       </w:r>
     </w:p>
-    <w:bookmarkEnd w:id="86"/>
-    <w:bookmarkStart w:id="87" w:name="ref-L2k7ECfb"/>
+    <w:bookmarkEnd w:id="87"/>
+    <w:bookmarkStart w:id="88" w:name="ref-L2k7ECfb"/>
     <w:p>
       <w:pPr>
         <w:pStyle w:val="Bibliography"/>
       </w:pPr>
       <w:r>
-        <w:t xml:space="preserve">27. Peterson, L. B.</w:t>
+        <w:t xml:space="preserve">28. Peterson, L. B.</w:t>
       </w:r>
       <w:r>
         <w:t xml:space="preserve"> </w:t>
@@ -16993,14 +17026,14 @@
         <w:t xml:space="preserve">, 1–14 (2018).</w:t>
       </w:r>
     </w:p>
-    <w:bookmarkEnd w:id="87"/>
-    <w:bookmarkStart w:id="88" w:name="ref-3WVNxYBN"/>
+    <w:bookmarkEnd w:id="88"/>
+    <w:bookmarkStart w:id="89" w:name="ref-3WVNxYBN"/>
     <w:p>
       <w:pPr>
         <w:pStyle w:val="Bibliography"/>
       </w:pPr>
       <w:r>
-        <w:t xml:space="preserve">28. Towers, C. G.</w:t>
+        <w:t xml:space="preserve">29. Towers, C. G.</w:t>
       </w:r>
       <w:r>
         <w:t xml:space="preserve"> </w:t>
@@ -17039,14 +17072,14 @@
         <w:t xml:space="preserve">, 690–703.e6 (2019).</w:t>
       </w:r>
     </w:p>
-    <w:bookmarkEnd w:id="88"/>
-    <w:bookmarkStart w:id="89" w:name="ref-PIRfSNMl"/>
+    <w:bookmarkEnd w:id="89"/>
+    <w:bookmarkStart w:id="90" w:name="ref-PIRfSNMl"/>
     <w:p>
       <w:pPr>
         <w:pStyle w:val="Bibliography"/>
       </w:pPr>
       <w:r>
-        <w:t xml:space="preserve">29. Knowles, L. M.</w:t>
+        <w:t xml:space="preserve">30. Knowles, L. M.</w:t>
       </w:r>
       <w:r>
         <w:t xml:space="preserve"> </w:t>
@@ -17085,14 +17118,14 @@
         <w:t xml:space="preserve">, 6175–6184 (2013).</w:t>
       </w:r>
     </w:p>
-    <w:bookmarkEnd w:id="89"/>
-    <w:bookmarkStart w:id="90" w:name="ref-uMIi8rGN"/>
+    <w:bookmarkEnd w:id="90"/>
+    <w:bookmarkStart w:id="91" w:name="ref-uMIi8rGN"/>
     <w:p>
       <w:pPr>
         <w:pStyle w:val="Bibliography"/>
       </w:pPr>
       <w:r>
-        <w:t xml:space="preserve">30. Bubeník, J. Tumour MHC class I downregulation and immunotherapy (Review).</w:t>
+        <w:t xml:space="preserve">31. Bubeník, J. Tumour MHC class I downregulation and immunotherapy (Review).</w:t>
       </w:r>
       <w:r>
         <w:t xml:space="preserve"> </w:t>
@@ -17116,14 +17149,14 @@
         <w:t xml:space="preserve">, 2005–8</w:t>
       </w:r>
     </w:p>
-    <w:bookmarkEnd w:id="90"/>
-    <w:bookmarkStart w:id="91" w:name="ref-bi6A2xzH"/>
+    <w:bookmarkEnd w:id="91"/>
+    <w:bookmarkStart w:id="92" w:name="ref-bi6A2xzH"/>
     <w:p>
       <w:pPr>
         <w:pStyle w:val="Bibliography"/>
       </w:pPr>
       <w:r>
-        <w:t xml:space="preserve">31. Guedan, S., Ruella, M. &amp; June, C. H. Emerging Cellular Therapies for Cancer.</w:t>
+        <w:t xml:space="preserve">32. Guedan, S., Ruella, M. &amp; June, C. H. Emerging Cellular Therapies for Cancer.</w:t>
       </w:r>
       <w:r>
         <w:t xml:space="preserve"> </w:t>
@@ -17147,14 +17180,14 @@
         <w:t xml:space="preserve">, 145–171 (2019).</w:t>
       </w:r>
     </w:p>
-    <w:bookmarkEnd w:id="91"/>
-    <w:bookmarkStart w:id="92" w:name="ref-Fp4dDXV1"/>
+    <w:bookmarkEnd w:id="92"/>
+    <w:bookmarkStart w:id="93" w:name="ref-Fp4dDXV1"/>
     <w:p>
       <w:pPr>
         <w:pStyle w:val="Bibliography"/>
       </w:pPr>
       <w:r>
-        <w:t xml:space="preserve">32. Rezvani, K., Rouce, R., Liu, E. &amp; Shpall, E. Engineering Natural Killer Cells for Cancer Immunotherapy.</w:t>
+        <w:t xml:space="preserve">33. Rezvani, K., Rouce, R., Liu, E. &amp; Shpall, E. Engineering Natural Killer Cells for Cancer Immunotherapy.</w:t>
       </w:r>
       <w:r>
         <w:t xml:space="preserve"> </w:t>
@@ -17178,14 +17211,14 @@
         <w:t xml:space="preserve">, 1769–1781 (2017).</w:t>
       </w:r>
     </w:p>
-    <w:bookmarkEnd w:id="92"/>
-    <w:bookmarkStart w:id="94" w:name="ref-8Miti2Gz"/>
+    <w:bookmarkEnd w:id="93"/>
+    <w:bookmarkStart w:id="95" w:name="ref-8Miti2Gz"/>
     <w:p>
       <w:pPr>
         <w:pStyle w:val="Bibliography"/>
       </w:pPr>
       <w:r>
-        <w:t xml:space="preserve">33. Virtanen, P.</w:t>
+        <w:t xml:space="preserve">34. Virtanen, P.</w:t>
       </w:r>
       <w:r>
         <w:t xml:space="preserve"> </w:t>
@@ -17217,7 +17250,7 @@
       <w:r>
         <w:t xml:space="preserve">(2020). doi:</w:t>
       </w:r>
-      <w:hyperlink r:id="rId93">
+      <w:hyperlink r:id="rId94">
         <w:r>
           <w:rPr>
             <w:rStyle w:val="Hyperlink"/>
@@ -17226,8 +17259,8 @@
         </w:r>
       </w:hyperlink>
     </w:p>
-    <w:bookmarkEnd w:id="94"/>
     <w:bookmarkEnd w:id="95"/>
+    <w:bookmarkEnd w:id="96"/>
     <w:sectPr>
       <w:pgSz w:w="12240" w:h="15840"/>
       <w:pgMar w:top="1440" w:right="1440" w:bottom="1440" w:left="1440" w:header="720" w:footer="720" w:gutter="0"/>

</xml_diff>

<commit_message>
Deploying to gh-pages from  @ f82953e0a37de45c668fab41adc342e2c0885215 🚀
</commit_message>
<xml_diff>
--- a/manuscript.docx
+++ b/manuscript.docx
@@ -78,7 +78,7 @@
         <w:t xml:space="preserve"> </w:t>
       </w:r>
       <w:r>
-        <w:t xml:space="preserve">was automatically generated on November 25, 2020.</w:t>
+        <w:t xml:space="preserve">was automatically generated on November 30, 2020.</w:t>
       </w:r>
       <w:r>
         <w:t xml:space="preserve"> </w:t>
@@ -313,58 +313,18 @@
       <w:pPr>
         <w:pStyle w:val="Heading2"/>
       </w:pPr>
-      <w:bookmarkStart w:id="29" w:name="summary-points"/>
-      <w:r>
-        <w:t xml:space="preserve">Summary points</w:t>
+      <w:bookmarkStart w:id="29" w:name="significance-statement"/>
+      <w:r>
+        <w:t xml:space="preserve">Significance Statement</w:t>
       </w:r>
       <w:bookmarkEnd w:id="29"/>
     </w:p>
     <w:p>
       <w:pPr>
-        <w:numPr>
-          <w:ilvl w:val="0"/>
-          <w:numId w:val="1002"/>
-        </w:numPr>
-        <w:pStyle w:val="Compact"/>
+        <w:pStyle w:val="FirstParagraph"/>
       </w:pPr>
       <w:r>
-        <w:t xml:space="preserve">Affinity, valency, and other alterations to target cell binding provide enhanced selectivity in specific situations.</w:t>
-      </w:r>
-    </w:p>
-    <w:p>
-      <w:pPr>
-        <w:numPr>
-          <w:ilvl w:val="0"/>
-          <w:numId w:val="1002"/>
-        </w:numPr>
-        <w:pStyle w:val="Compact"/>
-      </w:pPr>
-      <w:r>
-        <w:t xml:space="preserve">Evidence for the effectiveness and limitations of each strategy are abundant within the drug development literature.</w:t>
-      </w:r>
-    </w:p>
-    <w:p>
-      <w:pPr>
-        <w:numPr>
-          <w:ilvl w:val="0"/>
-          <w:numId w:val="1002"/>
-        </w:numPr>
-        <w:pStyle w:val="Compact"/>
-      </w:pPr>
-      <w:r>
-        <w:t xml:space="preserve">Combining strategies can offer enhanced selectivity.</w:t>
-      </w:r>
-    </w:p>
-    <w:p>
-      <w:pPr>
-        <w:numPr>
-          <w:ilvl w:val="0"/>
-          <w:numId w:val="1002"/>
-        </w:numPr>
-        <w:pStyle w:val="Compact"/>
-      </w:pPr>
-      <w:r>
-        <w:t xml:space="preserve">A simple, multivalent ligand-receptor binding model can help to direct therapeutic engineering.</w:t>
+        <w:t xml:space="preserve">Selective binding to specific target cells is a critical property of many therapies. To provide enhanced selectivity in specific situations, a series of new strategies have been proposed in the drug development literature, including affinity, valency, multi-valent compounds, and other alterations to target cell binding. We have developed a simple, multivalent ligand-receptor binding model that can help to direct therapeutic engineering. Here, using this model, we provide generalized and quantitative analyses of the effectiveness and limitations of each strategy. We also demonstrate that combining strategies can offer enhanced selectivity. This work will provide guidance for future therapeutic development.</w:t>
       </w:r>
     </w:p>
     <w:p>
@@ -15892,7 +15852,7 @@
       </w:r>
       <w:bookmarkEnd w:id="59"/>
     </w:p>
-    <w:bookmarkStart w:id="96" w:name="refs"/>
+    <w:bookmarkStart w:id="95" w:name="refs"/>
     <w:bookmarkStart w:id="60" w:name="ref-dr9JS306"/>
     <w:p>
       <w:pPr>
@@ -16338,7 +16298,7 @@
         <w:rPr>
           <w:i/>
         </w:rPr>
-        <w:t xml:space="preserve">bioRxiv</w:t>
+        <w:t xml:space="preserve">Cold Spring Harbor Laboratory</w:t>
       </w:r>
       <w:r>
         <w:t xml:space="preserve"> </w:t>
@@ -16669,7 +16629,7 @@
         <w:t xml:space="preserve">7</w:t>
       </w:r>
       <w:r>
-        <w:t xml:space="preserve">, (2017).</w:t>
+        <w:t xml:space="preserve">, 40098 (2017).</w:t>
       </w:r>
     </w:p>
     <w:bookmarkEnd w:id="79"/>
@@ -17212,7 +17172,7 @@
       </w:r>
     </w:p>
     <w:bookmarkEnd w:id="93"/>
-    <w:bookmarkStart w:id="95" w:name="ref-8Miti2Gz"/>
+    <w:bookmarkStart w:id="94" w:name="ref-8Miti2Gz"/>
     <w:p>
       <w:pPr>
         <w:pStyle w:val="Bibliography"/>
@@ -17248,19 +17208,17 @@
         <w:t xml:space="preserve"> </w:t>
       </w:r>
       <w:r>
-        <w:t xml:space="preserve">(2020). doi:</w:t>
-      </w:r>
-      <w:hyperlink r:id="rId94">
-        <w:r>
-          <w:rPr>
-            <w:rStyle w:val="Hyperlink"/>
-          </w:rPr>
-          <w:t xml:space="preserve">10.1038/s41592-019-0686-2</w:t>
-        </w:r>
-      </w:hyperlink>
+        <w:rPr>
+          <w:b/>
+        </w:rPr>
+        <w:t xml:space="preserve">17</w:t>
+      </w:r>
+      <w:r>
+        <w:t xml:space="preserve">, 261–272 (2020).</w:t>
+      </w:r>
     </w:p>
+    <w:bookmarkEnd w:id="94"/>
     <w:bookmarkEnd w:id="95"/>
-    <w:bookmarkEnd w:id="96"/>
     <w:sectPr>
       <w:pgSz w:w="12240" w:h="15840"/>
       <w:pgMar w:top="1440" w:right="1440" w:bottom="1440" w:left="1440" w:header="720" w:footer="720" w:gutter="0"/>
@@ -17790,9 +17748,6 @@
     <w:abstractNumId w:val="990"/>
   </w:num>
   <w:num w:numId="1001">
-    <w:abstractNumId w:val="991"/>
-  </w:num>
-  <w:num w:numId="1002">
     <w:abstractNumId w:val="991"/>
   </w:num>
 </w:numbering>

</xml_diff>

<commit_message>
Deploying to gh-pages from  @ 3b2728f900df550863552b6993641ddd350334d5 🚀
</commit_message>
<xml_diff>
--- a/manuscript.docx
+++ b/manuscript.docx
@@ -78,7 +78,7 @@
         <w:t xml:space="preserve"> </w:t>
       </w:r>
       <w:r>
-        <w:t xml:space="preserve">was automatically generated on December 3, 2020.</w:t>
+        <w:t xml:space="preserve">was automatically generated on December 10, 2020.</w:t>
       </w:r>
       <w:r>
         <w:t xml:space="preserve"> </w:t>
@@ -7528,9 +7528,9 @@
       <w:pPr>
         <w:pStyle w:val="Heading3"/>
       </w:pPr>
-      <w:bookmarkStart w:id="40" w:name="X6121a27614a240825e6e8895d4acf0ebac196e1"/>
-      <w:r>
-        <w:t xml:space="preserve">Heterovalent Bispecific Ligands Exhibit Unique Charateristics When Activated Fully Bound</w:t>
+      <w:bookmarkStart w:id="40" w:name="X00cc7a65eac07f9ac8c67eeeec4153b25a8ab28"/>
+      <w:r>
+        <w:t xml:space="preserve">Heterovalent Bispecific Ligands Exhibit Unique Characteristics When Activated Fully Bound</w:t>
       </w:r>
       <w:bookmarkEnd w:id="40"/>
     </w:p>

</xml_diff>

<commit_message>
Deploying to gh-pages from  @ 83ebe4d0a6ea6729d04ecb77a5bdde266947cb73 🚀
</commit_message>
<xml_diff>
--- a/manuscript.docx
+++ b/manuscript.docx
@@ -78,7 +78,7 @@
         <w:t xml:space="preserve"> </w:t>
       </w:r>
       <w:r>
-        <w:t xml:space="preserve">was automatically generated on December 10, 2020.</w:t>
+        <w:t xml:space="preserve">was automatically generated on April 27, 2021.</w:t>
       </w:r>
       <w:r>
         <w:t xml:space="preserve"> </w:t>
@@ -711,7 +711,7 @@
         <w:pStyle w:val="BodyText"/>
       </w:pPr>
       <w:r>
-        <w:t xml:space="preserve">As a simplification, we will consider theoretical cell populations that express only two receptors capable of binding ligand (Fig.</w:t>
+        <w:t xml:space="preserve">As a simplification, we will consider theoretical cell populations that express only two receptors capable of binding ligand uniformally distributed across the cell surface (Fig.</w:t>
       </w:r>
       <w:r>
         <w:t xml:space="preserve"> </w:t>
@@ -3984,7 +3984,27 @@
         </m:sSub>
       </m:oMath>
       <w:r>
-        <w:t xml:space="preserve">), our model was able to accurately match the binding of nanorings with four or eight subunits to cells expressing a known abundance of receptor partners (Fig. S1a).</w:t>
+        <w:t xml:space="preserve">), our model was able to accurately match the binding of nanorings with four or eight subunits to cells expressing a known abundance of receptor partners (Fig. S1a). It should be noted that the model was allowed to alter the experimentally measured affinities of the receptor-ligand interactions to fit the experimental data, but was also able to fit the data using experimentally determined affinities with respectable accuracy (</w:t>
+      </w:r>
+      <m:oMath>
+        <m:sSup>
+          <m:e>
+            <m:r>
+              <m:t>R</m:t>
+            </m:r>
+          </m:e>
+          <m:sup>
+            <m:r>
+              <m:t>2</m:t>
+            </m:r>
+          </m:sup>
+        </m:sSup>
+      </m:oMath>
+      <w:r>
+        <w:t xml:space="preserve"> </w:t>
+      </w:r>
+      <w:r>
+        <w:t xml:space="preserve">of 0.95 when fitting affinities vs. 0.70 when using experimentally determined affinities).</w:t>
       </w:r>
     </w:p>
     <w:p>
@@ -9132,7 +9152,50 @@
         <w:pStyle w:val="FirstParagraph"/>
       </w:pPr>
       <w:r>
-        <w:t xml:space="preserve">Each strategy described above provided selectivity benefits in distinct situations, suggesting that they might synergistically improve selectivity when combined. We explored this potential synergy using optimization to determine the ligand specifications which provided optimal selectivity for our theoretical cell populations. More specifically, we optimized the selectivity of a ligand for a particular population, while considering all other populations to be off-target. Our optimization allowed ligand characteristics to vary within biologically plausible bounds; which characteristics we allowed to vary defined our examination of the efficacy of our various ligand engineering strategies. We examined optimizing affinity alone, mixture along with affinity, and valency along with affinity, and finally combined all three strategies (Fig.</w:t>
+        <w:t xml:space="preserve">Each strategy described above provided selectivity benefits in distinct situations, suggesting that they might synergistically improve selectivity when combined. We explored this potential synergy using optimization to determine the ligand specifications which provided optimal selectivity for our theoretical cell populations. More specifically, we optimized the selectivity of a ligand for a particular population, while considering all other populations to be off-target. Our optimization allowed ligand characteristics to vary within biologically plausible bounds. Model specific parameters such as</w:t>
+      </w:r>
+      <w:r>
+        <w:t xml:space="preserve"> </w:t>
+      </w:r>
+      <m:oMath>
+        <m:sSubSup>
+          <m:e>
+            <m:r>
+              <m:t>K</m:t>
+            </m:r>
+          </m:e>
+          <m:sub>
+            <m:r>
+              <m:t>x</m:t>
+            </m:r>
+          </m:sub>
+          <m:sup>
+            <m:r>
+              <m:t>*</m:t>
+            </m:r>
+          </m:sup>
+        </m:sSubSup>
+      </m:oMath>
+      <w:r>
+        <w:t xml:space="preserve"> </w:t>
+      </w:r>
+      <w:r>
+        <w:t xml:space="preserve">were bound according to their observed values when fit to other binding processes.</w:t>
+      </w:r>
+      <w:hyperlink w:anchor="ref-u2Cb0DBq">
+        <w:r>
+          <w:rPr>
+            <w:rStyle w:val="Hyperlink"/>
+            <w:vertAlign w:val="superscript"/>
+          </w:rPr>
+          <w:t xml:space="preserve">18</w:t>
+        </w:r>
+      </w:hyperlink>
+      <w:r>
+        <w:t xml:space="preserve"> </w:t>
+      </w:r>
+      <w:r>
+        <w:t xml:space="preserve">Which characteristics we allowed to vary defined our examination of the efficacy of our various ligand engineering strategies. We examined optimizing affinity alone, mixture along with affinity, and valency along with affinity, and finally combined all three strategies (Fig.</w:t>
       </w:r>
       <w:r>
         <w:t xml:space="preserve"> </w:t>
@@ -9146,7 +9209,7 @@
         </w:r>
       </w:hyperlink>
       <w:r>
-        <w:t xml:space="preserve">).</w:t>
+        <w:t xml:space="preserve">). It should be noted that the parameter space is not convex, and a grid-search strategy was used for strategies where valency and affinity allowed to vary simultaneously in order to locate the global maximum selectivity.</w:t>
       </w:r>
     </w:p>
     <w:p>
@@ -9435,7 +9498,25 @@
         </m:r>
       </m:oMath>
       <w:r>
-        <w:t xml:space="preserve">. Xo ligands are monovalent ligands with affinities of</w:t>
+        <w:t xml:space="preserve">.</w:t>
+      </w:r>
+      <w:r>
+        <w:t xml:space="preserve"> </w:t>
+      </w:r>
+      <w:r>
+        <w:t xml:space="preserve">“</w:t>
+      </w:r>
+      <w:r>
+        <w:t xml:space="preserve">Unaltered</w:t>
+      </w:r>
+      <w:r>
+        <w:t xml:space="preserve">”</w:t>
+      </w:r>
+      <w:r>
+        <w:t xml:space="preserve"> </w:t>
+      </w:r>
+      <w:r>
+        <w:t xml:space="preserve">ligands are monovalent ligands with affinities of</w:t>
       </w:r>
       <w:r>
         <w:t xml:space="preserve"> </w:t>
@@ -9886,7 +9967,25 @@
         </m:r>
       </m:oMath>
       <w:r>
-        <w:t xml:space="preserve">. Xo ligands are monovalent ligands with affinities of</w:t>
+        <w:t xml:space="preserve">.</w:t>
+      </w:r>
+      <w:r>
+        <w:t xml:space="preserve"> </w:t>
+      </w:r>
+      <w:r>
+        <w:t xml:space="preserve">“</w:t>
+      </w:r>
+      <w:r>
+        <w:t xml:space="preserve">Unaltered</w:t>
+      </w:r>
+      <w:r>
+        <w:t xml:space="preserve">”</w:t>
+      </w:r>
+      <w:r>
+        <w:t xml:space="preserve"> </w:t>
+      </w:r>
+      <w:r>
+        <w:t xml:space="preserve">ligands are monovalent ligands with affinities of</w:t>
       </w:r>
       <w:r>
         <w:t xml:space="preserve"> </w:t>
@@ -11219,7 +11318,7 @@
             <w:rStyle w:val="Hyperlink"/>
             <w:vertAlign w:val="superscript"/>
           </w:rPr>
-          <w:t xml:space="preserve">27</w:t>
+          <w:t xml:space="preserve">28</w:t>
         </w:r>
       </w:hyperlink>
       <w:r>
@@ -11234,7 +11333,7 @@
             <w:rStyle w:val="Hyperlink"/>
             <w:vertAlign w:val="superscript"/>
           </w:rPr>
-          <w:t xml:space="preserve">28</w:t>
+          <w:t xml:space="preserve">29</w:t>
         </w:r>
       </w:hyperlink>
       <w:r>
@@ -11302,7 +11401,7 @@
             <w:rStyle w:val="Hyperlink"/>
             <w:vertAlign w:val="superscript"/>
           </w:rPr>
-          <w:t xml:space="preserve">29</w:t>
+          <w:t xml:space="preserve">30</w:t>
         </w:r>
       </w:hyperlink>
       <w:r>
@@ -11312,21 +11411,6 @@
         <w:t xml:space="preserve">,</w:t>
       </w:r>
       <w:hyperlink w:anchor="ref-PIRfSNMl">
-        <w:r>
-          <w:rPr>
-            <w:rStyle w:val="Hyperlink"/>
-            <w:vertAlign w:val="superscript"/>
-          </w:rPr>
-          <w:t xml:space="preserve">30</w:t>
-        </w:r>
-      </w:hyperlink>
-      <w:r>
-        <w:t xml:space="preserve"> </w:t>
-      </w:r>
-      <w:r>
-        <w:t xml:space="preserve">or downregulating</w:t>
-      </w:r>
-      <w:hyperlink w:anchor="ref-uMIi8rGN">
         <w:r>
           <w:rPr>
             <w:rStyle w:val="Hyperlink"/>
@@ -11339,17 +11423,9 @@
         <w:t xml:space="preserve"> </w:t>
       </w:r>
       <w:r>
-        <w:t xml:space="preserve">the expression of certain receptors. In this case, both the current and potential abundance of each receptor must be considered. While this work does not address many of these issues, we propose that using a computational binding model can analyze these strategies quantitatively and collectively from a mechanistic perspective. Even when the absolute mathematically optimal ligand characteristics cannot be achieved biochemically, our analyses provide guidance within the bounds of what is attainable and how to approach the optimum, accounting for implementation feasibility and facilitating the implementation of strategy combinations.</w:t>
-      </w:r>
-    </w:p>
-    <w:p>
-      <w:pPr>
-        <w:pStyle w:val="BodyText"/>
-      </w:pPr>
-      <w:r>
-        <w:t xml:space="preserve">In many therapeutic applications where selective engagement of target cell populations is an important performance metric, such as the treatment of cancer, cellular therapies are becoming increasingly popular.</w:t>
-      </w:r>
-      <w:hyperlink w:anchor="ref-bi6A2xzH">
+        <w:t xml:space="preserve">or downregulating</w:t>
+      </w:r>
+      <w:hyperlink w:anchor="ref-uMIi8rGN">
         <w:r>
           <w:rPr>
             <w:rStyle w:val="Hyperlink"/>
@@ -11362,6 +11438,29 @@
         <w:t xml:space="preserve"> </w:t>
       </w:r>
       <w:r>
+        <w:t xml:space="preserve">the expression of certain receptors. In this case, both the current and potential abundance of each receptor must be considered. While this work does not address many of these issues, we propose that using a computational binding model can analyze these strategies quantitatively and collectively from a mechanistic perspective. Even when the absolute mathematically optimal ligand characteristics cannot be achieved biochemically, our analyses provide guidance within the bounds of what is attainable and how to approach the optimum, accounting for implementation feasibility and facilitating the implementation of strategy combinations.</w:t>
+      </w:r>
+    </w:p>
+    <w:p>
+      <w:pPr>
+        <w:pStyle w:val="BodyText"/>
+      </w:pPr>
+      <w:r>
+        <w:t xml:space="preserve">In many therapeutic applications where selective engagement of target cell populations is an important performance metric, such as the treatment of cancer, cellular therapies are becoming increasingly popular.</w:t>
+      </w:r>
+      <w:hyperlink w:anchor="ref-bi6A2xzH">
+        <w:r>
+          <w:rPr>
+            <w:rStyle w:val="Hyperlink"/>
+            <w:vertAlign w:val="superscript"/>
+          </w:rPr>
+          <w:t xml:space="preserve">33</w:t>
+        </w:r>
+      </w:hyperlink>
+      <w:r>
+        <w:t xml:space="preserve"> </w:t>
+      </w:r>
+      <w:r>
         <w:t xml:space="preserve">Human engineered chimeric antigen receptor (CAR) T cells have enhanced the potential to selectively recognize and attack malignant tissues.</w:t>
       </w:r>
       <w:hyperlink w:anchor="ref-Fp4dDXV1">
@@ -11370,7 +11469,7 @@
             <w:rStyle w:val="Hyperlink"/>
             <w:vertAlign w:val="superscript"/>
           </w:rPr>
-          <w:t xml:space="preserve">33</w:t>
+          <w:t xml:space="preserve">34</w:t>
         </w:r>
       </w:hyperlink>
       <w:r>
@@ -11621,7 +11720,35 @@
         </m:sSub>
       </m:oMath>
       <w:r>
-        <w:t xml:space="preserve">, and the complexes consist of random ligand monomer assortments according to their relative proportion. The number of ligand complexes in the solution is usually much greater than that of the receptors, so we assume binding does not deplete the ligand concentration. The proportion of ligand</w:t>
+        <w:t xml:space="preserve">, and the complexes consist of random ligand monomer assortments according to their relative proportion. The number of ligand complexes in the solution is usually much greater than that of the receptors, so we assume binding does not deplete the ligand concentration. We also assume that receptors are uniformally distributed across the cell surface; should different receptors be organized in discrete domains, the model would need to be updated to account for different</w:t>
+      </w:r>
+      <w:r>
+        <w:t xml:space="preserve"> </w:t>
+      </w:r>
+      <m:oMath>
+        <m:sSubSup>
+          <m:e>
+            <m:r>
+              <m:t>K</m:t>
+            </m:r>
+          </m:e>
+          <m:sub>
+            <m:r>
+              <m:t>x</m:t>
+            </m:r>
+          </m:sub>
+          <m:sup>
+            <m:r>
+              <m:t>*</m:t>
+            </m:r>
+          </m:sup>
+        </m:sSubSup>
+      </m:oMath>
+      <w:r>
+        <w:t xml:space="preserve"> </w:t>
+      </w:r>
+      <w:r>
+        <w:t xml:space="preserve">values for each receptor population and accompanying domain. The proportion of ligand</w:t>
       </w:r>
       <w:r>
         <w:t xml:space="preserve"> </w:t>
@@ -14718,7 +14845,7 @@
             <w:rStyle w:val="Hyperlink"/>
             <w:vertAlign w:val="superscript"/>
           </w:rPr>
-          <w:t xml:space="preserve">34</w:t>
+          <w:t xml:space="preserve">35</w:t>
         </w:r>
       </w:hyperlink>
       <w:r>
@@ -14787,7 +14914,7 @@
         </m:r>
       </m:oMath>
       <w:r>
-        <w:t xml:space="preserve">, 100% ligand 1 for mixture composition, and</w:t>
+        <w:t xml:space="preserve">, 90% ligand 1 for mixture composition, and</w:t>
       </w:r>
       <w:r>
         <w:t xml:space="preserve"> </w:t>
@@ -15852,7 +15979,7 @@
       </w:r>
       <w:bookmarkEnd w:id="59"/>
     </w:p>
-    <w:bookmarkStart w:id="95" w:name="refs"/>
+    <w:bookmarkStart w:id="96" w:name="refs"/>
     <w:bookmarkStart w:id="60" w:name="ref-dr9JS306"/>
     <w:p>
       <w:pPr>
@@ -16895,13 +17022,13 @@
       </w:r>
     </w:p>
     <w:bookmarkEnd w:id="86"/>
-    <w:bookmarkStart w:id="87" w:name="ref-FqWAsZ7z"/>
+    <w:bookmarkStart w:id="87" w:name="ref-lFjmqXvb"/>
     <w:p>
       <w:pPr>
         <w:pStyle w:val="Bibliography"/>
       </w:pPr>
       <w:r>
-        <w:t xml:space="preserve">27. Bentebibel, S.-E.</w:t>
+        <w:t xml:space="preserve">27. Robinett, R. A.</w:t>
       </w:r>
       <w:r>
         <w:t xml:space="preserve"> </w:t>
@@ -16916,6 +17043,52 @@
         <w:t xml:space="preserve"> </w:t>
       </w:r>
       <w:r>
+        <w:t xml:space="preserve">Dissecting FcγR Regulation through a Multivalent Binding Model.</w:t>
+      </w:r>
+      <w:r>
+        <w:t xml:space="preserve"> </w:t>
+      </w:r>
+      <w:r>
+        <w:rPr>
+          <w:i/>
+        </w:rPr>
+        <w:t xml:space="preserve">Cell Systems</w:t>
+      </w:r>
+      <w:r>
+        <w:t xml:space="preserve"> </w:t>
+      </w:r>
+      <w:r>
+        <w:rPr>
+          <w:b/>
+        </w:rPr>
+        <w:t xml:space="preserve">7</w:t>
+      </w:r>
+      <w:r>
+        <w:t xml:space="preserve">, 41–48.e5 (2018).</w:t>
+      </w:r>
+    </w:p>
+    <w:bookmarkEnd w:id="87"/>
+    <w:bookmarkStart w:id="88" w:name="ref-FqWAsZ7z"/>
+    <w:p>
+      <w:pPr>
+        <w:pStyle w:val="Bibliography"/>
+      </w:pPr>
+      <w:r>
+        <w:t xml:space="preserve">28. Bentebibel, S.-E.</w:t>
+      </w:r>
+      <w:r>
+        <w:t xml:space="preserve"> </w:t>
+      </w:r>
+      <w:r>
+        <w:rPr>
+          <w:i/>
+        </w:rPr>
+        <w:t xml:space="preserve">et al.</w:t>
+      </w:r>
+      <w:r>
+        <w:t xml:space="preserve"> </w:t>
+      </w:r>
+      <w:r>
         <w:t xml:space="preserve">A First-in-Human Study and Biomarker Analysis of NKTR-214, a Novel IL2Rβγ-Biased Cytokine, in Patients with Advanced or Metastatic Solid Tumors.</w:t>
       </w:r>
       <w:r>
@@ -16940,14 +17113,14 @@
         <w:t xml:space="preserve">, 711–721 (2019).</w:t>
       </w:r>
     </w:p>
-    <w:bookmarkEnd w:id="87"/>
-    <w:bookmarkStart w:id="88" w:name="ref-L2k7ECfb"/>
+    <w:bookmarkEnd w:id="88"/>
+    <w:bookmarkStart w:id="89" w:name="ref-L2k7ECfb"/>
     <w:p>
       <w:pPr>
         <w:pStyle w:val="Bibliography"/>
       </w:pPr>
       <w:r>
-        <w:t xml:space="preserve">28. Peterson, L. B.</w:t>
+        <w:t xml:space="preserve">29. Peterson, L. B.</w:t>
       </w:r>
       <w:r>
         <w:t xml:space="preserve"> </w:t>
@@ -16986,14 +17159,14 @@
         <w:t xml:space="preserve">, 1–14 (2018).</w:t>
       </w:r>
     </w:p>
-    <w:bookmarkEnd w:id="88"/>
-    <w:bookmarkStart w:id="89" w:name="ref-3WVNxYBN"/>
+    <w:bookmarkEnd w:id="89"/>
+    <w:bookmarkStart w:id="90" w:name="ref-3WVNxYBN"/>
     <w:p>
       <w:pPr>
         <w:pStyle w:val="Bibliography"/>
       </w:pPr>
       <w:r>
-        <w:t xml:space="preserve">29. Towers, C. G.</w:t>
+        <w:t xml:space="preserve">30. Towers, C. G.</w:t>
       </w:r>
       <w:r>
         <w:t xml:space="preserve"> </w:t>
@@ -17032,14 +17205,14 @@
         <w:t xml:space="preserve">, 690–703.e6 (2019).</w:t>
       </w:r>
     </w:p>
-    <w:bookmarkEnd w:id="89"/>
-    <w:bookmarkStart w:id="90" w:name="ref-PIRfSNMl"/>
+    <w:bookmarkEnd w:id="90"/>
+    <w:bookmarkStart w:id="91" w:name="ref-PIRfSNMl"/>
     <w:p>
       <w:pPr>
         <w:pStyle w:val="Bibliography"/>
       </w:pPr>
       <w:r>
-        <w:t xml:space="preserve">30. Knowles, L. M.</w:t>
+        <w:t xml:space="preserve">31. Knowles, L. M.</w:t>
       </w:r>
       <w:r>
         <w:t xml:space="preserve"> </w:t>
@@ -17054,7 +17227,7 @@
         <w:t xml:space="preserve"> </w:t>
       </w:r>
       <w:r>
-        <w:t xml:space="preserve">Integrin v 3 and Fibronectin Upregulate Slug in Cancer Cells to Promote Clot Invasion and Metastasis.</w:t>
+        <w:t xml:space="preserve">Integrin αvβ3 and Fibronectin Upregulate Slug in Cancer Cells to Promote Clot Invasion and Metastasis.</w:t>
       </w:r>
       <w:r>
         <w:t xml:space="preserve"> </w:t>
@@ -17078,14 +17251,14 @@
         <w:t xml:space="preserve">, 6175–6184 (2013).</w:t>
       </w:r>
     </w:p>
-    <w:bookmarkEnd w:id="90"/>
-    <w:bookmarkStart w:id="91" w:name="ref-uMIi8rGN"/>
+    <w:bookmarkEnd w:id="91"/>
+    <w:bookmarkStart w:id="92" w:name="ref-uMIi8rGN"/>
     <w:p>
       <w:pPr>
         <w:pStyle w:val="Bibliography"/>
       </w:pPr>
       <w:r>
-        <w:t xml:space="preserve">31. Bubeník, J. Tumour MHC class I downregulation and immunotherapy (Review).</w:t>
+        <w:t xml:space="preserve">32. Bubeník, J. Tumour MHC class I downregulation and immunotherapy (Review).</w:t>
       </w:r>
       <w:r>
         <w:t xml:space="preserve"> </w:t>
@@ -17109,14 +17282,14 @@
         <w:t xml:space="preserve">, 2005–8</w:t>
       </w:r>
     </w:p>
-    <w:bookmarkEnd w:id="91"/>
-    <w:bookmarkStart w:id="92" w:name="ref-bi6A2xzH"/>
+    <w:bookmarkEnd w:id="92"/>
+    <w:bookmarkStart w:id="93" w:name="ref-bi6A2xzH"/>
     <w:p>
       <w:pPr>
         <w:pStyle w:val="Bibliography"/>
       </w:pPr>
       <w:r>
-        <w:t xml:space="preserve">32. Guedan, S., Ruella, M. &amp; June, C. H. Emerging Cellular Therapies for Cancer.</w:t>
+        <w:t xml:space="preserve">33. Guedan, S., Ruella, M. &amp; June, C. H. Emerging Cellular Therapies for Cancer.</w:t>
       </w:r>
       <w:r>
         <w:t xml:space="preserve"> </w:t>
@@ -17140,14 +17313,14 @@
         <w:t xml:space="preserve">, 145–171 (2019).</w:t>
       </w:r>
     </w:p>
-    <w:bookmarkEnd w:id="92"/>
-    <w:bookmarkStart w:id="93" w:name="ref-Fp4dDXV1"/>
+    <w:bookmarkEnd w:id="93"/>
+    <w:bookmarkStart w:id="94" w:name="ref-Fp4dDXV1"/>
     <w:p>
       <w:pPr>
         <w:pStyle w:val="Bibliography"/>
       </w:pPr>
       <w:r>
-        <w:t xml:space="preserve">33. Rezvani, K., Rouce, R., Liu, E. &amp; Shpall, E. Engineering Natural Killer Cells for Cancer Immunotherapy.</w:t>
+        <w:t xml:space="preserve">34. Rezvani, K., Rouce, R., Liu, E. &amp; Shpall, E. Engineering Natural Killer Cells for Cancer Immunotherapy.</w:t>
       </w:r>
       <w:r>
         <w:t xml:space="preserve"> </w:t>
@@ -17171,14 +17344,14 @@
         <w:t xml:space="preserve">, 1769–1781 (2017).</w:t>
       </w:r>
     </w:p>
-    <w:bookmarkEnd w:id="93"/>
-    <w:bookmarkStart w:id="94" w:name="ref-8Miti2Gz"/>
+    <w:bookmarkEnd w:id="94"/>
+    <w:bookmarkStart w:id="95" w:name="ref-8Miti2Gz"/>
     <w:p>
       <w:pPr>
         <w:pStyle w:val="Bibliography"/>
       </w:pPr>
       <w:r>
-        <w:t xml:space="preserve">34. Virtanen, P.</w:t>
+        <w:t xml:space="preserve">35. Virtanen, P.</w:t>
       </w:r>
       <w:r>
         <w:t xml:space="preserve"> </w:t>
@@ -17217,8 +17390,8 @@
         <w:t xml:space="preserve">, 261–272 (2020).</w:t>
       </w:r>
     </w:p>
-    <w:bookmarkEnd w:id="94"/>
     <w:bookmarkEnd w:id="95"/>
+    <w:bookmarkEnd w:id="96"/>
     <w:sectPr>
       <w:pgSz w:w="12240" w:h="15840"/>
       <w:pgMar w:top="1440" w:right="1440" w:bottom="1440" w:left="1440" w:header="720" w:footer="720" w:gutter="0"/>

</xml_diff>

<commit_message>
Deploying to gh-pages from  @ f1d956296ec9c085577828db064b50c23622b943 🚀
</commit_message>
<xml_diff>
--- a/manuscript.docx
+++ b/manuscript.docx
@@ -78,7 +78,7 @@
         <w:t xml:space="preserve"> </w:t>
       </w:r>
       <w:r>
-        <w:t xml:space="preserve">was automatically generated on April 27, 2021.</w:t>
+        <w:t xml:space="preserve">was automatically generated on April 28, 2021.</w:t>
       </w:r>
       <w:r>
         <w:t xml:space="preserve"> </w:t>
@@ -705,6 +705,15 @@
       <w:r>
         <w:t xml:space="preserve">, which describes how easily a multivalent ligand bound to a cell monovalently can attain secondary binding. Another consideration that must be made when modeling multivalent binding processes is whether ligand complexes are formed via random assortment of monomers, or whether the monomer composition is uniform across complexes by engineering. We developed a multivalent binding model that calculates the amount of ligand bound at equilibrium taking each of these factors into account (see methods).</w:t>
       </w:r>
+      <w:hyperlink w:anchor="ref-1FOIPTTFA">
+        <w:r>
+          <w:rPr>
+            <w:rStyle w:val="Hyperlink"/>
+            <w:vertAlign w:val="superscript"/>
+          </w:rPr>
+          <w:t xml:space="preserve">15</w:t>
+        </w:r>
+      </w:hyperlink>
     </w:p>
     <w:p>
       <w:pPr>
@@ -894,7 +903,7 @@
             <w:rStyle w:val="Hyperlink"/>
             <w:vertAlign w:val="superscript"/>
           </w:rPr>
-          <w:t xml:space="preserve">15</w:t>
+          <w:t xml:space="preserve">16</w:t>
         </w:r>
       </w:hyperlink>
       <w:r>
@@ -1254,7 +1263,7 @@
             <w:rStyle w:val="Hyperlink"/>
             <w:vertAlign w:val="superscript"/>
           </w:rPr>
-          <w:t xml:space="preserve">16</w:t>
+          <w:t xml:space="preserve">17</w:t>
         </w:r>
       </w:hyperlink>
       <w:r>
@@ -3923,7 +3932,7 @@
             <w:rStyle w:val="Hyperlink"/>
             <w:vertAlign w:val="superscript"/>
           </w:rPr>
-          <w:t xml:space="preserve">17</w:t>
+          <w:t xml:space="preserve">18</w:t>
         </w:r>
       </w:hyperlink>
       <w:r>
@@ -3938,7 +3947,7 @@
             <w:rStyle w:val="Hyperlink"/>
             <w:vertAlign w:val="superscript"/>
           </w:rPr>
-          <w:t xml:space="preserve">18</w:t>
+          <w:t xml:space="preserve">19</w:t>
         </w:r>
       </w:hyperlink>
       <w:r>
@@ -4020,7 +4029,7 @@
             <w:rStyle w:val="Hyperlink"/>
             <w:vertAlign w:val="superscript"/>
           </w:rPr>
-          <w:t xml:space="preserve">19</w:t>
+          <w:t xml:space="preserve">20</w:t>
         </w:r>
       </w:hyperlink>
       <w:r>
@@ -4435,7 +4444,7 @@
             <w:rStyle w:val="Hyperlink"/>
             <w:vertAlign w:val="superscript"/>
           </w:rPr>
-          <w:t xml:space="preserve">18</w:t>
+          <w:t xml:space="preserve">19</w:t>
         </w:r>
       </w:hyperlink>
       <w:r>
@@ -6242,7 +6251,7 @@
             <w:rStyle w:val="Hyperlink"/>
             <w:vertAlign w:val="superscript"/>
           </w:rPr>
-          <w:t xml:space="preserve">20</w:t>
+          <w:t xml:space="preserve">21</w:t>
         </w:r>
       </w:hyperlink>
       <w:r>
@@ -6257,7 +6266,7 @@
             <w:rStyle w:val="Hyperlink"/>
             <w:vertAlign w:val="superscript"/>
           </w:rPr>
-          <w:t xml:space="preserve">21</w:t>
+          <w:t xml:space="preserve">22</w:t>
         </w:r>
       </w:hyperlink>
       <w:r>
@@ -6571,7 +6580,7 @@
             <w:rStyle w:val="Hyperlink"/>
             <w:vertAlign w:val="superscript"/>
           </w:rPr>
-          <w:t xml:space="preserve">17</w:t>
+          <w:t xml:space="preserve">18</w:t>
         </w:r>
       </w:hyperlink>
       <w:r>
@@ -6586,7 +6595,7 @@
             <w:rStyle w:val="Hyperlink"/>
             <w:vertAlign w:val="superscript"/>
           </w:rPr>
-          <w:t xml:space="preserve">22</w:t>
+          <w:t xml:space="preserve">23</w:t>
         </w:r>
       </w:hyperlink>
     </w:p>
@@ -7567,7 +7576,7 @@
             <w:rStyle w:val="Hyperlink"/>
             <w:vertAlign w:val="superscript"/>
           </w:rPr>
-          <w:t xml:space="preserve">23</w:t>
+          <w:t xml:space="preserve">24</w:t>
         </w:r>
       </w:hyperlink>
       <w:r>
@@ -7646,7 +7655,7 @@
             <w:rStyle w:val="Hyperlink"/>
             <w:vertAlign w:val="superscript"/>
           </w:rPr>
-          <w:t xml:space="preserve">24</w:t>
+          <w:t xml:space="preserve">25</w:t>
         </w:r>
       </w:hyperlink>
       <w:r>
@@ -7661,7 +7670,7 @@
             <w:rStyle w:val="Hyperlink"/>
             <w:vertAlign w:val="superscript"/>
           </w:rPr>
-          <w:t xml:space="preserve">25</w:t>
+          <w:t xml:space="preserve">26</w:t>
         </w:r>
       </w:hyperlink>
       <w:r>
@@ -7974,7 +7983,7 @@
             <w:rStyle w:val="Hyperlink"/>
             <w:vertAlign w:val="superscript"/>
           </w:rPr>
-          <w:t xml:space="preserve">26</w:t>
+          <w:t xml:space="preserve">27</w:t>
         </w:r>
       </w:hyperlink>
       <w:r>
@@ -9152,50 +9161,7 @@
         <w:pStyle w:val="FirstParagraph"/>
       </w:pPr>
       <w:r>
-        <w:t xml:space="preserve">Each strategy described above provided selectivity benefits in distinct situations, suggesting that they might synergistically improve selectivity when combined. We explored this potential synergy using optimization to determine the ligand specifications which provided optimal selectivity for our theoretical cell populations. More specifically, we optimized the selectivity of a ligand for a particular population, while considering all other populations to be off-target. Our optimization allowed ligand characteristics to vary within biologically plausible bounds. Model specific parameters such as</w:t>
-      </w:r>
-      <w:r>
-        <w:t xml:space="preserve"> </w:t>
-      </w:r>
-      <m:oMath>
-        <m:sSubSup>
-          <m:e>
-            <m:r>
-              <m:t>K</m:t>
-            </m:r>
-          </m:e>
-          <m:sub>
-            <m:r>
-              <m:t>x</m:t>
-            </m:r>
-          </m:sub>
-          <m:sup>
-            <m:r>
-              <m:t>*</m:t>
-            </m:r>
-          </m:sup>
-        </m:sSubSup>
-      </m:oMath>
-      <w:r>
-        <w:t xml:space="preserve"> </w:t>
-      </w:r>
-      <w:r>
-        <w:t xml:space="preserve">were bound according to their observed values when fit to other binding processes.</w:t>
-      </w:r>
-      <w:hyperlink w:anchor="ref-u2Cb0DBq">
-        <w:r>
-          <w:rPr>
-            <w:rStyle w:val="Hyperlink"/>
-            <w:vertAlign w:val="superscript"/>
-          </w:rPr>
-          <w:t xml:space="preserve">18</w:t>
-        </w:r>
-      </w:hyperlink>
-      <w:r>
-        <w:t xml:space="preserve"> </w:t>
-      </w:r>
-      <w:r>
-        <w:t xml:space="preserve">Which characteristics we allowed to vary defined our examination of the efficacy of our various ligand engineering strategies. We examined optimizing affinity alone, mixture along with affinity, and valency along with affinity, and finally combined all three strategies (Fig.</w:t>
+        <w:t xml:space="preserve">Each strategy described above provided selectivity benefits in distinct situations, suggesting that they might synergistically improve selectivity when combined. We explored this potential synergy using optimization to determine the ligand specifications which provided optimal selectivity for our theoretical cell populations. More specifically, we optimized the selectivity of a ligand for a particular population, while considering all other populations to be off-target. Our optimization allowed ligand characteristics to vary within biologically plausible bounds, which characteristics we allowed to vary defined our examination of the efficacy of our various ligand engineering strategies. We examined optimizing affinity alone, mixture along with affinity, and valency along with affinity, and finally combined all three strategies (Fig.</w:t>
       </w:r>
       <w:r>
         <w:t xml:space="preserve"> </w:t>
@@ -9434,7 +9400,7 @@
             <w:rStyle w:val="Hyperlink"/>
             <w:vertAlign w:val="superscript"/>
           </w:rPr>
-          <w:t xml:space="preserve">25</w:t>
+          <w:t xml:space="preserve">26</w:t>
         </w:r>
       </w:hyperlink>
     </w:p>
@@ -11348,7 +11314,7 @@
             <w:rStyle w:val="Hyperlink"/>
             <w:vertAlign w:val="superscript"/>
           </w:rPr>
-          <w:t xml:space="preserve">19</w:t>
+          <w:t xml:space="preserve">20</w:t>
         </w:r>
       </w:hyperlink>
       <w:r>
@@ -11363,7 +11329,7 @@
             <w:rStyle w:val="Hyperlink"/>
             <w:vertAlign w:val="superscript"/>
           </w:rPr>
-          <w:t xml:space="preserve">18</w:t>
+          <w:t xml:space="preserve">19</w:t>
         </w:r>
       </w:hyperlink>
       <w:r>
@@ -11538,13 +11504,28 @@
       <w:r>
         <w:t xml:space="preserve">To model multivalent ligand complexes, we extended our previous binding model to the multi-ligand case.</w:t>
       </w:r>
+      <w:hyperlink w:anchor="ref-1FOIPTTFA">
+        <w:r>
+          <w:rPr>
+            <w:rStyle w:val="Hyperlink"/>
+            <w:vertAlign w:val="superscript"/>
+          </w:rPr>
+          <w:t xml:space="preserve">15</w:t>
+        </w:r>
+      </w:hyperlink>
+      <w:r>
+        <w:rPr>
+          <w:vertAlign w:val="superscript"/>
+        </w:rPr>
+        <w:t xml:space="preserve">,</w:t>
+      </w:r>
       <w:hyperlink w:anchor="ref-11gk5tUo7">
         <w:r>
           <w:rPr>
             <w:rStyle w:val="Hyperlink"/>
             <w:vertAlign w:val="superscript"/>
           </w:rPr>
-          <w:t xml:space="preserve">17</w:t>
+          <w:t xml:space="preserve">18</w:t>
         </w:r>
       </w:hyperlink>
       <w:r>
@@ -14914,7 +14895,7 @@
         </m:r>
       </m:oMath>
       <w:r>
-        <w:t xml:space="preserve">, 90% ligand 1 for mixture composition, and</w:t>
+        <w:t xml:space="preserve">, 100% ligand 1 for mixture composition, and</w:t>
       </w:r>
       <w:r>
         <w:t xml:space="preserve"> </w:t>
@@ -14943,7 +14924,32 @@
         <w:t xml:space="preserve"> </w:t>
       </w:r>
       <w:r>
-        <w:t xml:space="preserve">for the affinity dissociation constants. The boundaries were</w:t>
+        <w:t xml:space="preserve">for the affinity dissociation constants. For</w:t>
+      </w:r>
+      <w:r>
+        <w:t xml:space="preserve"> </w:t>
+      </w:r>
+      <m:oMath>
+        <m:sSubSup>
+          <m:e>
+            <m:r>
+              <m:t>K</m:t>
+            </m:r>
+          </m:e>
+          <m:sub>
+            <m:r>
+              <m:t>x</m:t>
+            </m:r>
+          </m:sub>
+          <m:sup>
+            <m:r>
+              <m:t>*</m:t>
+            </m:r>
+          </m:sup>
+        </m:sSubSup>
+      </m:oMath>
+      <w:r>
+        <w:t xml:space="preserve">, our previous study on IgG-Fc receptor interaction utilized this binding model and fit it on in vitro immune complex binding measurement. Its value was roughly</w:t>
       </w:r>
       <w:r>
         <w:t xml:space="preserve"> </w:t>
@@ -14960,6 +14966,193 @@
               <m:t>−</m:t>
             </m:r>
             <m:r>
+              <m:t>12</m:t>
+            </m:r>
+          </m:sup>
+        </m:sSup>
+      </m:oMath>
+      <w:r>
+        <w:t xml:space="preserve">.</w:t>
+      </w:r>
+      <w:hyperlink w:anchor="ref-lFjmqXvb">
+        <w:r>
+          <w:rPr>
+            <w:rStyle w:val="Hyperlink"/>
+            <w:vertAlign w:val="superscript"/>
+          </w:rPr>
+          <w:t xml:space="preserve">36</w:t>
+        </w:r>
+      </w:hyperlink>
+      <w:r>
+        <w:t xml:space="preserve"> </w:t>
+      </w:r>
+      <w:r>
+        <w:t xml:space="preserve">In this study, we fit our model to the multivalent nanoring measurements (See</w:t>
+      </w:r>
+      <w:r>
+        <w:t xml:space="preserve"> </w:t>
+      </w:r>
+      <w:r>
+        <w:t xml:space="preserve">“</w:t>
+      </w:r>
+      <w:r>
+        <w:t xml:space="preserve">Reimplementation of Csizmar et al. </w:t>
+      </w:r>
+      <w:hyperlink w:anchor="ref-u2Cb0DBq">
+        <w:r>
+          <w:rPr>
+            <w:rStyle w:val="Hyperlink"/>
+            <w:vertAlign w:val="superscript"/>
+          </w:rPr>
+          <w:t xml:space="preserve">19</w:t>
+        </w:r>
+      </w:hyperlink>
+      <w:r>
+        <w:t xml:space="preserve">”</w:t>
+      </w:r>
+      <w:r>
+        <w:t xml:space="preserve">), and the</w:t>
+      </w:r>
+      <w:r>
+        <w:t xml:space="preserve"> </w:t>
+      </w:r>
+      <m:oMath>
+        <m:sSubSup>
+          <m:e>
+            <m:r>
+              <m:t>K</m:t>
+            </m:r>
+          </m:e>
+          <m:sub>
+            <m:r>
+              <m:t>x</m:t>
+            </m:r>
+          </m:sub>
+          <m:sup>
+            <m:r>
+              <m:t>*</m:t>
+            </m:r>
+          </m:sup>
+        </m:sSubSup>
+      </m:oMath>
+      <w:r>
+        <w:t xml:space="preserve"> </w:t>
+      </w:r>
+      <w:r>
+        <w:t xml:space="preserve">values were in similar range (</w:t>
+      </w:r>
+      <m:oMath>
+        <m:sSup>
+          <m:e>
+            <m:r>
+              <m:t>10</m:t>
+            </m:r>
+          </m:e>
+          <m:sup>
+            <m:r>
+              <m:t>−</m:t>
+            </m:r>
+            <m:r>
+              <m:t>12.7</m:t>
+            </m:r>
+          </m:sup>
+        </m:sSup>
+      </m:oMath>
+      <w:r>
+        <w:t xml:space="preserve"> </w:t>
+      </w:r>
+      <w:r>
+        <w:t xml:space="preserve">and</w:t>
+      </w:r>
+      <w:r>
+        <w:t xml:space="preserve"> </w:t>
+      </w:r>
+      <m:oMath>
+        <m:sSup>
+          <m:e>
+            <m:r>
+              <m:t>10</m:t>
+            </m:r>
+          </m:e>
+          <m:sup>
+            <m:r>
+              <m:t>−</m:t>
+            </m:r>
+            <m:r>
+              <m:t>14.7</m:t>
+            </m:r>
+          </m:sup>
+        </m:sSup>
+      </m:oMath>
+      <w:r>
+        <w:t xml:space="preserve">). Here, we allow</w:t>
+      </w:r>
+      <w:r>
+        <w:t xml:space="preserve"> </w:t>
+      </w:r>
+      <m:oMath>
+        <m:sSubSup>
+          <m:e>
+            <m:r>
+              <m:t>K</m:t>
+            </m:r>
+          </m:e>
+          <m:sub>
+            <m:r>
+              <m:t>x</m:t>
+            </m:r>
+          </m:sub>
+          <m:sup>
+            <m:r>
+              <m:t>*</m:t>
+            </m:r>
+          </m:sup>
+        </m:sSubSup>
+      </m:oMath>
+      <w:r>
+        <w:t xml:space="preserve"> </w:t>
+      </w:r>
+      <w:r>
+        <w:t xml:space="preserve">to float 1000 times up and down from</w:t>
+      </w:r>
+      <w:r>
+        <w:t xml:space="preserve"> </w:t>
+      </w:r>
+      <m:oMath>
+        <m:sSup>
+          <m:e>
+            <m:r>
+              <m:t>10</m:t>
+            </m:r>
+          </m:e>
+          <m:sup>
+            <m:r>
+              <m:t>−</m:t>
+            </m:r>
+            <m:r>
+              <m:t>12</m:t>
+            </m:r>
+          </m:sup>
+        </m:sSup>
+      </m:oMath>
+      <w:r>
+        <w:t xml:space="preserve">, thus</w:t>
+      </w:r>
+      <w:r>
+        <w:t xml:space="preserve"> </w:t>
+      </w:r>
+      <m:oMath>
+        <m:sSup>
+          <m:e>
+            <m:r>
+              <m:t>10</m:t>
+            </m:r>
+          </m:e>
+          <m:sup>
+            <m:r>
+              <m:t>−</m:t>
+            </m:r>
+            <m:r>
               <m:t>15</m:t>
             </m:r>
           </m:sup>
@@ -14992,35 +15185,7 @@
         </m:sSup>
       </m:oMath>
       <w:r>
-        <w:t xml:space="preserve"> </w:t>
-      </w:r>
-      <w:r>
-        <w:t xml:space="preserve">for</w:t>
-      </w:r>
-      <w:r>
-        <w:t xml:space="preserve"> </w:t>
-      </w:r>
-      <m:oMath>
-        <m:sSubSup>
-          <m:e>
-            <m:r>
-              <m:t>K</m:t>
-            </m:r>
-          </m:e>
-          <m:sub>
-            <m:r>
-              <m:t>x</m:t>
-            </m:r>
-          </m:sub>
-          <m:sup>
-            <m:r>
-              <m:t>*</m:t>
-            </m:r>
-          </m:sup>
-        </m:sSubSup>
-      </m:oMath>
-      <w:r>
-        <w:t xml:space="preserve">, 1–16 for</w:t>
+        <w:t xml:space="preserve">. The boundaries were 1–16 for</w:t>
       </w:r>
       <w:r>
         <w:t xml:space="preserve"> </w:t>
@@ -15115,7 +15280,7 @@
             <w:rStyle w:val="Hyperlink"/>
             <w:vertAlign w:val="superscript"/>
           </w:rPr>
-          <w:t xml:space="preserve">16</w:t>
+          <w:t xml:space="preserve">17</w:t>
         </w:r>
       </w:hyperlink>
       <w:r>
@@ -15148,7 +15313,7 @@
             <w:rStyle w:val="Hyperlink"/>
             <w:vertAlign w:val="superscript"/>
           </w:rPr>
-          <w:t xml:space="preserve">18</w:t>
+          <w:t xml:space="preserve">19</w:t>
         </w:r>
       </w:hyperlink>
       <w:r>
@@ -15213,7 +15378,7 @@
       </w:pPr>
       <w:bookmarkStart w:id="56" w:name="fig:Csizmar"/>
       <w:r>
-        <w:t xml:space="preserve">Figure 8:</w:t>
+        <w:t xml:space="preserve">Figure S1:</w:t>
       </w:r>
       <w:r>
         <w:t xml:space="preserve"> </w:t>
@@ -15555,7 +15720,7 @@
             <w:rStyle w:val="Hyperlink"/>
             <w:vertAlign w:val="superscript"/>
           </w:rPr>
-          <w:t xml:space="preserve">18</w:t>
+          <w:t xml:space="preserve">19</w:t>
         </w:r>
       </w:hyperlink>
       <w:r>
@@ -15568,7 +15733,7 @@
         <w:pStyle w:val="ImageCaption"/>
       </w:pPr>
       <w:r>
-        <w:t xml:space="preserve">Figure 8:</w:t>
+        <w:t xml:space="preserve">Figure S1:</w:t>
       </w:r>
       <w:r>
         <w:t xml:space="preserve"> </w:t>
@@ -15910,7 +16075,7 @@
             <w:rStyle w:val="Hyperlink"/>
             <w:vertAlign w:val="superscript"/>
           </w:rPr>
-          <w:t xml:space="preserve">18</w:t>
+          <w:t xml:space="preserve">19</w:t>
         </w:r>
       </w:hyperlink>
       <w:r>
@@ -15979,7 +16144,7 @@
       </w:r>
       <w:bookmarkEnd w:id="59"/>
     </w:p>
-    <w:bookmarkStart w:id="96" w:name="refs"/>
+    <w:bookmarkStart w:id="98" w:name="refs"/>
     <w:bookmarkStart w:id="60" w:name="ref-dr9JS306"/>
     <w:p>
       <w:pPr>
@@ -16566,13 +16731,46 @@
       </w:r>
     </w:p>
     <w:bookmarkEnd w:id="74"/>
-    <w:bookmarkStart w:id="75" w:name="ref-11Hb1fNV6"/>
+    <w:bookmarkStart w:id="76" w:name="ref-1FOIPTTFA"/>
     <w:p>
       <w:pPr>
         <w:pStyle w:val="Bibliography"/>
       </w:pPr>
       <w:r>
-        <w:t xml:space="preserve">15. Busse, D.</w:t>
+        <w:t xml:space="preserve">15. Tan, Z. C. &amp; Meyer, A. S. A general model of multivalent binding with ligands of heterotypic subunits and multiple surface receptors.</w:t>
+      </w:r>
+      <w:r>
+        <w:t xml:space="preserve"> </w:t>
+      </w:r>
+      <w:r>
+        <w:rPr>
+          <w:i/>
+        </w:rPr>
+        <w:t xml:space="preserve">Cold Spring Harbor Laboratory</w:t>
+      </w:r>
+      <w:r>
+        <w:t xml:space="preserve"> </w:t>
+      </w:r>
+      <w:r>
+        <w:t xml:space="preserve">(2021). doi:</w:t>
+      </w:r>
+      <w:hyperlink r:id="rId75">
+        <w:r>
+          <w:rPr>
+            <w:rStyle w:val="Hyperlink"/>
+          </w:rPr>
+          <w:t xml:space="preserve">10.1101/2021.03.10.434776</w:t>
+        </w:r>
+      </w:hyperlink>
+    </w:p>
+    <w:bookmarkEnd w:id="76"/>
+    <w:bookmarkStart w:id="77" w:name="ref-11Hb1fNV6"/>
+    <w:p>
+      <w:pPr>
+        <w:pStyle w:val="Bibliography"/>
+      </w:pPr>
+      <w:r>
+        <w:t xml:space="preserve">16. Busse, D.</w:t>
       </w:r>
       <w:r>
         <w:t xml:space="preserve"> </w:t>
@@ -16611,24 +16809,24 @@
         <w:t xml:space="preserve">, 3058–3063 (2010).</w:t>
       </w:r>
     </w:p>
-    <w:bookmarkEnd w:id="75"/>
-    <w:bookmarkStart w:id="76" w:name="ref-VKATSjfe"/>
+    <w:bookmarkEnd w:id="77"/>
+    <w:bookmarkStart w:id="78" w:name="ref-VKATSjfe"/>
     <w:p>
       <w:pPr>
         <w:pStyle w:val="Bibliography"/>
       </w:pPr>
       <w:r>
-        <w:t xml:space="preserve">16. Merwe, R. van der. Sigma-Point Kalman Filters for Probabilistic Inference in Dynamic State-Space Models. (2004).</w:t>
+        <w:t xml:space="preserve">17. Merwe, R. van der. Sigma-Point Kalman Filters for Probabilistic Inference in Dynamic State-Space Models. (2004).</w:t>
       </w:r>
     </w:p>
-    <w:bookmarkEnd w:id="76"/>
-    <w:bookmarkStart w:id="77" w:name="ref-11gk5tUo7"/>
+    <w:bookmarkEnd w:id="78"/>
+    <w:bookmarkStart w:id="79" w:name="ref-11gk5tUo7"/>
     <w:p>
       <w:pPr>
         <w:pStyle w:val="Bibliography"/>
       </w:pPr>
       <w:r>
-        <w:t xml:space="preserve">17. Robinett, R. A.</w:t>
+        <w:t xml:space="preserve">18. Robinett, R. A.</w:t>
       </w:r>
       <w:r>
         <w:t xml:space="preserve"> </w:t>
@@ -16667,14 +16865,14 @@
         <w:t xml:space="preserve">, 41–48.e5 (2018).</w:t>
       </w:r>
     </w:p>
-    <w:bookmarkEnd w:id="77"/>
-    <w:bookmarkStart w:id="78" w:name="ref-u2Cb0DBq"/>
+    <w:bookmarkEnd w:id="79"/>
+    <w:bookmarkStart w:id="80" w:name="ref-u2Cb0DBq"/>
     <w:p>
       <w:pPr>
         <w:pStyle w:val="Bibliography"/>
       </w:pPr>
       <w:r>
-        <w:t xml:space="preserve">18. Csizmar, C. M.</w:t>
+        <w:t xml:space="preserve">19. Csizmar, C. M.</w:t>
       </w:r>
       <w:r>
         <w:t xml:space="preserve"> </w:t>
@@ -16713,14 +16911,14 @@
         <w:t xml:space="preserve">, 251–261 (2018).</w:t>
       </w:r>
     </w:p>
-    <w:bookmarkEnd w:id="78"/>
-    <w:bookmarkStart w:id="79" w:name="ref-IanZRiFA"/>
+    <w:bookmarkEnd w:id="80"/>
+    <w:bookmarkStart w:id="81" w:name="ref-IanZRiFA"/>
     <w:p>
       <w:pPr>
         <w:pStyle w:val="Bibliography"/>
       </w:pPr>
       <w:r>
-        <w:t xml:space="preserve">19. Mazor, Y.</w:t>
+        <w:t xml:space="preserve">20. Mazor, Y.</w:t>
       </w:r>
       <w:r>
         <w:t xml:space="preserve"> </w:t>
@@ -16759,14 +16957,14 @@
         <w:t xml:space="preserve">, 40098 (2017).</w:t>
       </w:r>
     </w:p>
-    <w:bookmarkEnd w:id="79"/>
-    <w:bookmarkStart w:id="80" w:name="ref-luDqQ0zL"/>
+    <w:bookmarkEnd w:id="81"/>
+    <w:bookmarkStart w:id="82" w:name="ref-luDqQ0zL"/>
     <w:p>
       <w:pPr>
         <w:pStyle w:val="Bibliography"/>
       </w:pPr>
       <w:r>
-        <w:t xml:space="preserve">20. Lehár, J.</w:t>
+        <w:t xml:space="preserve">21. Lehár, J.</w:t>
       </w:r>
       <w:r>
         <w:t xml:space="preserve"> </w:t>
@@ -16805,14 +17003,14 @@
         <w:t xml:space="preserve">, 659–666 (2009).</w:t>
       </w:r>
     </w:p>
-    <w:bookmarkEnd w:id="80"/>
-    <w:bookmarkStart w:id="81" w:name="ref-eR2h4yr3"/>
+    <w:bookmarkEnd w:id="82"/>
+    <w:bookmarkStart w:id="83" w:name="ref-eR2h4yr3"/>
     <w:p>
       <w:pPr>
         <w:pStyle w:val="Bibliography"/>
       </w:pPr>
       <w:r>
-        <w:t xml:space="preserve">21. Olivova, P., Chen, W., Chakraborty, A. B. &amp; Gebler, J. C. Determination of N-glycosylation sites and site heterogeneity in a monoclonal antibody by electrospray quadrupole ion-mobility time-of-flight mass spectrometry.</w:t>
+        <w:t xml:space="preserve">22. Olivova, P., Chen, W., Chakraborty, A. B. &amp; Gebler, J. C. Determination of N-glycosylation sites and site heterogeneity in a monoclonal antibody by electrospray quadrupole ion-mobility time-of-flight mass spectrometry.</w:t>
       </w:r>
       <w:r>
         <w:t xml:space="preserve"> </w:t>
@@ -16836,14 +17034,14 @@
         <w:t xml:space="preserve">, 29–40 (2008).</w:t>
       </w:r>
     </w:p>
-    <w:bookmarkEnd w:id="81"/>
-    <w:bookmarkStart w:id="82" w:name="ref-8lU1hNlA"/>
+    <w:bookmarkEnd w:id="83"/>
+    <w:bookmarkStart w:id="84" w:name="ref-8lU1hNlA"/>
     <w:p>
       <w:pPr>
         <w:pStyle w:val="Bibliography"/>
       </w:pPr>
       <w:r>
-        <w:t xml:space="preserve">22. Antebi, Y. E.</w:t>
+        <w:t xml:space="preserve">23. Antebi, Y. E.</w:t>
       </w:r>
       <w:r>
         <w:t xml:space="preserve"> </w:t>
@@ -16882,14 +17080,14 @@
         <w:t xml:space="preserve">, 1184–1196.e24 (2017).</w:t>
       </w:r>
     </w:p>
-    <w:bookmarkEnd w:id="82"/>
-    <w:bookmarkStart w:id="83" w:name="ref-iG3t9Py2"/>
+    <w:bookmarkEnd w:id="84"/>
+    <w:bookmarkStart w:id="85" w:name="ref-iG3t9Py2"/>
     <w:p>
       <w:pPr>
         <w:pStyle w:val="Bibliography"/>
       </w:pPr>
       <w:r>
-        <w:t xml:space="preserve">23. Deshaies, R. J. Multispecific drugs herald a new era of biopharmaceutical innovation.</w:t>
+        <w:t xml:space="preserve">24. Deshaies, R. J. Multispecific drugs herald a new era of biopharmaceutical innovation.</w:t>
       </w:r>
       <w:r>
         <w:t xml:space="preserve"> </w:t>
@@ -16913,14 +17111,14 @@
         <w:t xml:space="preserve">, 329–338 (2020).</w:t>
       </w:r>
     </w:p>
-    <w:bookmarkEnd w:id="83"/>
-    <w:bookmarkStart w:id="84" w:name="ref-18yoQOgm4"/>
+    <w:bookmarkEnd w:id="85"/>
+    <w:bookmarkStart w:id="86" w:name="ref-18yoQOgm4"/>
     <w:p>
       <w:pPr>
         <w:pStyle w:val="Bibliography"/>
       </w:pPr>
       <w:r>
-        <w:t xml:space="preserve">24. Piccione, E. C.</w:t>
+        <w:t xml:space="preserve">25. Piccione, E. C.</w:t>
       </w:r>
       <w:r>
         <w:t xml:space="preserve"> </w:t>
@@ -16959,14 +17157,14 @@
         <w:t xml:space="preserve">, 946–956 (2015).</w:t>
       </w:r>
     </w:p>
-    <w:bookmarkEnd w:id="84"/>
-    <w:bookmarkStart w:id="85" w:name="ref-y7JtEfom"/>
+    <w:bookmarkEnd w:id="86"/>
+    <w:bookmarkStart w:id="87" w:name="ref-y7JtEfom"/>
     <w:p>
       <w:pPr>
         <w:pStyle w:val="Bibliography"/>
       </w:pPr>
       <w:r>
-        <w:t xml:space="preserve">25. Qi, J., Chen, S.-S., Chiorazzi, N. &amp; Rader, C. An IgG1-like bispecific antibody targeting CD52 and CD20 for the treatment of B-cell malignancies.</w:t>
+        <w:t xml:space="preserve">26. Qi, J., Chen, S.-S., Chiorazzi, N. &amp; Rader, C. An IgG1-like bispecific antibody targeting CD52 and CD20 for the treatment of B-cell malignancies.</w:t>
       </w:r>
       <w:r>
         <w:t xml:space="preserve"> </w:t>
@@ -16990,14 +17188,14 @@
         <w:t xml:space="preserve">, 70–76 (2018).</w:t>
       </w:r>
     </w:p>
-    <w:bookmarkEnd w:id="85"/>
-    <w:bookmarkStart w:id="86" w:name="ref-uVvF8Fgs"/>
+    <w:bookmarkEnd w:id="87"/>
+    <w:bookmarkStart w:id="88" w:name="ref-uVvF8Fgs"/>
     <w:p>
       <w:pPr>
         <w:pStyle w:val="Bibliography"/>
       </w:pPr>
       <w:r>
-        <w:t xml:space="preserve">26. Hlavacek, W. S., Posner, R. G. &amp; Perelson, A. S. Steric effects on multivalent ligand-receptor binding: exclusion of ligand sites by bound cell surface receptors.</w:t>
+        <w:t xml:space="preserve">27. Hlavacek, W. S., Posner, R. G. &amp; Perelson, A. S. Steric effects on multivalent ligand-receptor binding: exclusion of ligand sites by bound cell surface receptors.</w:t>
       </w:r>
       <w:r>
         <w:t xml:space="preserve"> </w:t>
@@ -17021,14 +17219,14 @@
         <w:t xml:space="preserve">, 3031–43 (1999).</w:t>
       </w:r>
     </w:p>
-    <w:bookmarkEnd w:id="86"/>
-    <w:bookmarkStart w:id="87" w:name="ref-lFjmqXvb"/>
+    <w:bookmarkEnd w:id="88"/>
+    <w:bookmarkStart w:id="89" w:name="ref-FqWAsZ7z"/>
     <w:p>
       <w:pPr>
         <w:pStyle w:val="Bibliography"/>
       </w:pPr>
       <w:r>
-        <w:t xml:space="preserve">27. Robinett, R. A.</w:t>
+        <w:t xml:space="preserve">28. Bentebibel, S.-E.</w:t>
       </w:r>
       <w:r>
         <w:t xml:space="preserve"> </w:t>
@@ -17043,6 +17241,329 @@
         <w:t xml:space="preserve"> </w:t>
       </w:r>
       <w:r>
+        <w:t xml:space="preserve">A First-in-Human Study and Biomarker Analysis of NKTR-214, a Novel IL2Rβγ-Biased Cytokine, in Patients with Advanced or Metastatic Solid Tumors.</w:t>
+      </w:r>
+      <w:r>
+        <w:t xml:space="preserve"> </w:t>
+      </w:r>
+      <w:r>
+        <w:rPr>
+          <w:i/>
+        </w:rPr>
+        <w:t xml:space="preserve">Cancer Discovery</w:t>
+      </w:r>
+      <w:r>
+        <w:t xml:space="preserve"> </w:t>
+      </w:r>
+      <w:r>
+        <w:rPr>
+          <w:b/>
+        </w:rPr>
+        <w:t xml:space="preserve">9</w:t>
+      </w:r>
+      <w:r>
+        <w:t xml:space="preserve">, 711–721 (2019).</w:t>
+      </w:r>
+    </w:p>
+    <w:bookmarkEnd w:id="89"/>
+    <w:bookmarkStart w:id="90" w:name="ref-L2k7ECfb"/>
+    <w:p>
+      <w:pPr>
+        <w:pStyle w:val="Bibliography"/>
+      </w:pPr>
+      <w:r>
+        <w:t xml:space="preserve">29. Peterson, L. B.</w:t>
+      </w:r>
+      <w:r>
+        <w:t xml:space="preserve"> </w:t>
+      </w:r>
+      <w:r>
+        <w:rPr>
+          <w:i/>
+        </w:rPr>
+        <w:t xml:space="preserve">et al.</w:t>
+      </w:r>
+      <w:r>
+        <w:t xml:space="preserve"> </w:t>
+      </w:r>
+      <w:r>
+        <w:t xml:space="preserve">A long-lived IL-2 mutein that selectively activates and expands regulatory T cells as a therapy for autoimmune disease.</w:t>
+      </w:r>
+      <w:r>
+        <w:t xml:space="preserve"> </w:t>
+      </w:r>
+      <w:r>
+        <w:rPr>
+          <w:i/>
+        </w:rPr>
+        <w:t xml:space="preserve">J Autoimmun</w:t>
+      </w:r>
+      <w:r>
+        <w:t xml:space="preserve"> </w:t>
+      </w:r>
+      <w:r>
+        <w:rPr>
+          <w:b/>
+        </w:rPr>
+        <w:t xml:space="preserve">95</w:t>
+      </w:r>
+      <w:r>
+        <w:t xml:space="preserve">, 1–14 (2018).</w:t>
+      </w:r>
+    </w:p>
+    <w:bookmarkEnd w:id="90"/>
+    <w:bookmarkStart w:id="91" w:name="ref-3WVNxYBN"/>
+    <w:p>
+      <w:pPr>
+        <w:pStyle w:val="Bibliography"/>
+      </w:pPr>
+      <w:r>
+        <w:t xml:space="preserve">30. Towers, C. G.</w:t>
+      </w:r>
+      <w:r>
+        <w:t xml:space="preserve"> </w:t>
+      </w:r>
+      <w:r>
+        <w:rPr>
+          <w:i/>
+        </w:rPr>
+        <w:t xml:space="preserve">et al.</w:t>
+      </w:r>
+      <w:r>
+        <w:t xml:space="preserve"> </w:t>
+      </w:r>
+      <w:r>
+        <w:t xml:space="preserve">Cancer Cells Upregulate NRF2 Signaling to Adapt to Autophagy Inhibition.</w:t>
+      </w:r>
+      <w:r>
+        <w:t xml:space="preserve"> </w:t>
+      </w:r>
+      <w:r>
+        <w:rPr>
+          <w:i/>
+        </w:rPr>
+        <w:t xml:space="preserve">Developmental Cell</w:t>
+      </w:r>
+      <w:r>
+        <w:t xml:space="preserve"> </w:t>
+      </w:r>
+      <w:r>
+        <w:rPr>
+          <w:b/>
+        </w:rPr>
+        <w:t xml:space="preserve">50</w:t>
+      </w:r>
+      <w:r>
+        <w:t xml:space="preserve">, 690–703.e6 (2019).</w:t>
+      </w:r>
+    </w:p>
+    <w:bookmarkEnd w:id="91"/>
+    <w:bookmarkStart w:id="92" w:name="ref-PIRfSNMl"/>
+    <w:p>
+      <w:pPr>
+        <w:pStyle w:val="Bibliography"/>
+      </w:pPr>
+      <w:r>
+        <w:t xml:space="preserve">31. Knowles, L. M.</w:t>
+      </w:r>
+      <w:r>
+        <w:t xml:space="preserve"> </w:t>
+      </w:r>
+      <w:r>
+        <w:rPr>
+          <w:i/>
+        </w:rPr>
+        <w:t xml:space="preserve">et al.</w:t>
+      </w:r>
+      <w:r>
+        <w:t xml:space="preserve"> </w:t>
+      </w:r>
+      <w:r>
+        <w:t xml:space="preserve">Integrin αvβ3 and Fibronectin Upregulate Slug in Cancer Cells to Promote Clot Invasion and Metastasis.</w:t>
+      </w:r>
+      <w:r>
+        <w:t xml:space="preserve"> </w:t>
+      </w:r>
+      <w:r>
+        <w:rPr>
+          <w:i/>
+        </w:rPr>
+        <w:t xml:space="preserve">Cancer Research</w:t>
+      </w:r>
+      <w:r>
+        <w:t xml:space="preserve"> </w:t>
+      </w:r>
+      <w:r>
+        <w:rPr>
+          <w:b/>
+        </w:rPr>
+        <w:t xml:space="preserve">73</w:t>
+      </w:r>
+      <w:r>
+        <w:t xml:space="preserve">, 6175–6184 (2013).</w:t>
+      </w:r>
+    </w:p>
+    <w:bookmarkEnd w:id="92"/>
+    <w:bookmarkStart w:id="93" w:name="ref-uMIi8rGN"/>
+    <w:p>
+      <w:pPr>
+        <w:pStyle w:val="Bibliography"/>
+      </w:pPr>
+      <w:r>
+        <w:t xml:space="preserve">32. Bubeník, J. Tumour MHC class I downregulation and immunotherapy (Review).</w:t>
+      </w:r>
+      <w:r>
+        <w:t xml:space="preserve"> </w:t>
+      </w:r>
+      <w:r>
+        <w:rPr>
+          <w:i/>
+        </w:rPr>
+        <w:t xml:space="preserve">Oncol Rep</w:t>
+      </w:r>
+      <w:r>
+        <w:t xml:space="preserve"> </w:t>
+      </w:r>
+      <w:r>
+        <w:rPr>
+          <w:b/>
+        </w:rPr>
+        <w:t xml:space="preserve">10</w:t>
+      </w:r>
+      <w:r>
+        <w:t xml:space="preserve">, 2005–8</w:t>
+      </w:r>
+    </w:p>
+    <w:bookmarkEnd w:id="93"/>
+    <w:bookmarkStart w:id="94" w:name="ref-bi6A2xzH"/>
+    <w:p>
+      <w:pPr>
+        <w:pStyle w:val="Bibliography"/>
+      </w:pPr>
+      <w:r>
+        <w:t xml:space="preserve">33. Guedan, S., Ruella, M. &amp; June, C. H. Emerging Cellular Therapies for Cancer.</w:t>
+      </w:r>
+      <w:r>
+        <w:t xml:space="preserve"> </w:t>
+      </w:r>
+      <w:r>
+        <w:rPr>
+          <w:i/>
+        </w:rPr>
+        <w:t xml:space="preserve">Annual Review of Immunology</w:t>
+      </w:r>
+      <w:r>
+        <w:t xml:space="preserve"> </w:t>
+      </w:r>
+      <w:r>
+        <w:rPr>
+          <w:b/>
+        </w:rPr>
+        <w:t xml:space="preserve">37</w:t>
+      </w:r>
+      <w:r>
+        <w:t xml:space="preserve">, 145–171 (2019).</w:t>
+      </w:r>
+    </w:p>
+    <w:bookmarkEnd w:id="94"/>
+    <w:bookmarkStart w:id="95" w:name="ref-Fp4dDXV1"/>
+    <w:p>
+      <w:pPr>
+        <w:pStyle w:val="Bibliography"/>
+      </w:pPr>
+      <w:r>
+        <w:t xml:space="preserve">34. Rezvani, K., Rouce, R., Liu, E. &amp; Shpall, E. Engineering Natural Killer Cells for Cancer Immunotherapy.</w:t>
+      </w:r>
+      <w:r>
+        <w:t xml:space="preserve"> </w:t>
+      </w:r>
+      <w:r>
+        <w:rPr>
+          <w:i/>
+        </w:rPr>
+        <w:t xml:space="preserve">Molecular Therapy</w:t>
+      </w:r>
+      <w:r>
+        <w:t xml:space="preserve"> </w:t>
+      </w:r>
+      <w:r>
+        <w:rPr>
+          <w:b/>
+        </w:rPr>
+        <w:t xml:space="preserve">25</w:t>
+      </w:r>
+      <w:r>
+        <w:t xml:space="preserve">, 1769–1781 (2017).</w:t>
+      </w:r>
+    </w:p>
+    <w:bookmarkEnd w:id="95"/>
+    <w:bookmarkStart w:id="96" w:name="ref-8Miti2Gz"/>
+    <w:p>
+      <w:pPr>
+        <w:pStyle w:val="Bibliography"/>
+      </w:pPr>
+      <w:r>
+        <w:t xml:space="preserve">35. Virtanen, P.</w:t>
+      </w:r>
+      <w:r>
+        <w:t xml:space="preserve"> </w:t>
+      </w:r>
+      <w:r>
+        <w:rPr>
+          <w:i/>
+        </w:rPr>
+        <w:t xml:space="preserve">et al.</w:t>
+      </w:r>
+      <w:r>
+        <w:t xml:space="preserve"> </w:t>
+      </w:r>
+      <w:r>
+        <w:t xml:space="preserve">SciPy 1.0: fundamental algorithms for scientific computing in Python.</w:t>
+      </w:r>
+      <w:r>
+        <w:t xml:space="preserve"> </w:t>
+      </w:r>
+      <w:r>
+        <w:rPr>
+          <w:i/>
+        </w:rPr>
+        <w:t xml:space="preserve">Nature Methods</w:t>
+      </w:r>
+      <w:r>
+        <w:t xml:space="preserve"> </w:t>
+      </w:r>
+      <w:r>
+        <w:rPr>
+          <w:b/>
+        </w:rPr>
+        <w:t xml:space="preserve">17</w:t>
+      </w:r>
+      <w:r>
+        <w:t xml:space="preserve">, 261–272 (2020).</w:t>
+      </w:r>
+    </w:p>
+    <w:bookmarkEnd w:id="96"/>
+    <w:bookmarkStart w:id="97" w:name="ref-lFjmqXvb"/>
+    <w:p>
+      <w:pPr>
+        <w:pStyle w:val="Bibliography"/>
+      </w:pPr>
+      <w:r>
+        <w:t xml:space="preserve">36. Robinett, R. A.</w:t>
+      </w:r>
+      <w:r>
+        <w:t xml:space="preserve"> </w:t>
+      </w:r>
+      <w:r>
+        <w:rPr>
+          <w:i/>
+        </w:rPr>
+        <w:t xml:space="preserve">et al.</w:t>
+      </w:r>
+      <w:r>
+        <w:t xml:space="preserve"> </w:t>
+      </w:r>
+      <w:r>
         <w:t xml:space="preserve">Dissecting FcγR Regulation through a Multivalent Binding Model.</w:t>
       </w:r>
       <w:r>
@@ -17067,331 +17588,8 @@
         <w:t xml:space="preserve">, 41–48.e5 (2018).</w:t>
       </w:r>
     </w:p>
-    <w:bookmarkEnd w:id="87"/>
-    <w:bookmarkStart w:id="88" w:name="ref-FqWAsZ7z"/>
-    <w:p>
-      <w:pPr>
-        <w:pStyle w:val="Bibliography"/>
-      </w:pPr>
-      <w:r>
-        <w:t xml:space="preserve">28. Bentebibel, S.-E.</w:t>
-      </w:r>
-      <w:r>
-        <w:t xml:space="preserve"> </w:t>
-      </w:r>
-      <w:r>
-        <w:rPr>
-          <w:i/>
-        </w:rPr>
-        <w:t xml:space="preserve">et al.</w:t>
-      </w:r>
-      <w:r>
-        <w:t xml:space="preserve"> </w:t>
-      </w:r>
-      <w:r>
-        <w:t xml:space="preserve">A First-in-Human Study and Biomarker Analysis of NKTR-214, a Novel IL2Rβγ-Biased Cytokine, in Patients with Advanced or Metastatic Solid Tumors.</w:t>
-      </w:r>
-      <w:r>
-        <w:t xml:space="preserve"> </w:t>
-      </w:r>
-      <w:r>
-        <w:rPr>
-          <w:i/>
-        </w:rPr>
-        <w:t xml:space="preserve">Cancer Discovery</w:t>
-      </w:r>
-      <w:r>
-        <w:t xml:space="preserve"> </w:t>
-      </w:r>
-      <w:r>
-        <w:rPr>
-          <w:b/>
-        </w:rPr>
-        <w:t xml:space="preserve">9</w:t>
-      </w:r>
-      <w:r>
-        <w:t xml:space="preserve">, 711–721 (2019).</w:t>
-      </w:r>
-    </w:p>
-    <w:bookmarkEnd w:id="88"/>
-    <w:bookmarkStart w:id="89" w:name="ref-L2k7ECfb"/>
-    <w:p>
-      <w:pPr>
-        <w:pStyle w:val="Bibliography"/>
-      </w:pPr>
-      <w:r>
-        <w:t xml:space="preserve">29. Peterson, L. B.</w:t>
-      </w:r>
-      <w:r>
-        <w:t xml:space="preserve"> </w:t>
-      </w:r>
-      <w:r>
-        <w:rPr>
-          <w:i/>
-        </w:rPr>
-        <w:t xml:space="preserve">et al.</w:t>
-      </w:r>
-      <w:r>
-        <w:t xml:space="preserve"> </w:t>
-      </w:r>
-      <w:r>
-        <w:t xml:space="preserve">A long-lived IL-2 mutein that selectively activates and expands regulatory T cells as a therapy for autoimmune disease.</w:t>
-      </w:r>
-      <w:r>
-        <w:t xml:space="preserve"> </w:t>
-      </w:r>
-      <w:r>
-        <w:rPr>
-          <w:i/>
-        </w:rPr>
-        <w:t xml:space="preserve">J Autoimmun</w:t>
-      </w:r>
-      <w:r>
-        <w:t xml:space="preserve"> </w:t>
-      </w:r>
-      <w:r>
-        <w:rPr>
-          <w:b/>
-        </w:rPr>
-        <w:t xml:space="preserve">95</w:t>
-      </w:r>
-      <w:r>
-        <w:t xml:space="preserve">, 1–14 (2018).</w:t>
-      </w:r>
-    </w:p>
-    <w:bookmarkEnd w:id="89"/>
-    <w:bookmarkStart w:id="90" w:name="ref-3WVNxYBN"/>
-    <w:p>
-      <w:pPr>
-        <w:pStyle w:val="Bibliography"/>
-      </w:pPr>
-      <w:r>
-        <w:t xml:space="preserve">30. Towers, C. G.</w:t>
-      </w:r>
-      <w:r>
-        <w:t xml:space="preserve"> </w:t>
-      </w:r>
-      <w:r>
-        <w:rPr>
-          <w:i/>
-        </w:rPr>
-        <w:t xml:space="preserve">et al.</w:t>
-      </w:r>
-      <w:r>
-        <w:t xml:space="preserve"> </w:t>
-      </w:r>
-      <w:r>
-        <w:t xml:space="preserve">Cancer Cells Upregulate NRF2 Signaling to Adapt to Autophagy Inhibition.</w:t>
-      </w:r>
-      <w:r>
-        <w:t xml:space="preserve"> </w:t>
-      </w:r>
-      <w:r>
-        <w:rPr>
-          <w:i/>
-        </w:rPr>
-        <w:t xml:space="preserve">Developmental Cell</w:t>
-      </w:r>
-      <w:r>
-        <w:t xml:space="preserve"> </w:t>
-      </w:r>
-      <w:r>
-        <w:rPr>
-          <w:b/>
-        </w:rPr>
-        <w:t xml:space="preserve">50</w:t>
-      </w:r>
-      <w:r>
-        <w:t xml:space="preserve">, 690–703.e6 (2019).</w:t>
-      </w:r>
-    </w:p>
-    <w:bookmarkEnd w:id="90"/>
-    <w:bookmarkStart w:id="91" w:name="ref-PIRfSNMl"/>
-    <w:p>
-      <w:pPr>
-        <w:pStyle w:val="Bibliography"/>
-      </w:pPr>
-      <w:r>
-        <w:t xml:space="preserve">31. Knowles, L. M.</w:t>
-      </w:r>
-      <w:r>
-        <w:t xml:space="preserve"> </w:t>
-      </w:r>
-      <w:r>
-        <w:rPr>
-          <w:i/>
-        </w:rPr>
-        <w:t xml:space="preserve">et al.</w:t>
-      </w:r>
-      <w:r>
-        <w:t xml:space="preserve"> </w:t>
-      </w:r>
-      <w:r>
-        <w:t xml:space="preserve">Integrin αvβ3 and Fibronectin Upregulate Slug in Cancer Cells to Promote Clot Invasion and Metastasis.</w:t>
-      </w:r>
-      <w:r>
-        <w:t xml:space="preserve"> </w:t>
-      </w:r>
-      <w:r>
-        <w:rPr>
-          <w:i/>
-        </w:rPr>
-        <w:t xml:space="preserve">Cancer Research</w:t>
-      </w:r>
-      <w:r>
-        <w:t xml:space="preserve"> </w:t>
-      </w:r>
-      <w:r>
-        <w:rPr>
-          <w:b/>
-        </w:rPr>
-        <w:t xml:space="preserve">73</w:t>
-      </w:r>
-      <w:r>
-        <w:t xml:space="preserve">, 6175–6184 (2013).</w:t>
-      </w:r>
-    </w:p>
-    <w:bookmarkEnd w:id="91"/>
-    <w:bookmarkStart w:id="92" w:name="ref-uMIi8rGN"/>
-    <w:p>
-      <w:pPr>
-        <w:pStyle w:val="Bibliography"/>
-      </w:pPr>
-      <w:r>
-        <w:t xml:space="preserve">32. Bubeník, J. Tumour MHC class I downregulation and immunotherapy (Review).</w:t>
-      </w:r>
-      <w:r>
-        <w:t xml:space="preserve"> </w:t>
-      </w:r>
-      <w:r>
-        <w:rPr>
-          <w:i/>
-        </w:rPr>
-        <w:t xml:space="preserve">Oncol Rep</w:t>
-      </w:r>
-      <w:r>
-        <w:t xml:space="preserve"> </w:t>
-      </w:r>
-      <w:r>
-        <w:rPr>
-          <w:b/>
-        </w:rPr>
-        <w:t xml:space="preserve">10</w:t>
-      </w:r>
-      <w:r>
-        <w:t xml:space="preserve">, 2005–8</w:t>
-      </w:r>
-    </w:p>
-    <w:bookmarkEnd w:id="92"/>
-    <w:bookmarkStart w:id="93" w:name="ref-bi6A2xzH"/>
-    <w:p>
-      <w:pPr>
-        <w:pStyle w:val="Bibliography"/>
-      </w:pPr>
-      <w:r>
-        <w:t xml:space="preserve">33. Guedan, S., Ruella, M. &amp; June, C. H. Emerging Cellular Therapies for Cancer.</w:t>
-      </w:r>
-      <w:r>
-        <w:t xml:space="preserve"> </w:t>
-      </w:r>
-      <w:r>
-        <w:rPr>
-          <w:i/>
-        </w:rPr>
-        <w:t xml:space="preserve">Annual Review of Immunology</w:t>
-      </w:r>
-      <w:r>
-        <w:t xml:space="preserve"> </w:t>
-      </w:r>
-      <w:r>
-        <w:rPr>
-          <w:b/>
-        </w:rPr>
-        <w:t xml:space="preserve">37</w:t>
-      </w:r>
-      <w:r>
-        <w:t xml:space="preserve">, 145–171 (2019).</w:t>
-      </w:r>
-    </w:p>
-    <w:bookmarkEnd w:id="93"/>
-    <w:bookmarkStart w:id="94" w:name="ref-Fp4dDXV1"/>
-    <w:p>
-      <w:pPr>
-        <w:pStyle w:val="Bibliography"/>
-      </w:pPr>
-      <w:r>
-        <w:t xml:space="preserve">34. Rezvani, K., Rouce, R., Liu, E. &amp; Shpall, E. Engineering Natural Killer Cells for Cancer Immunotherapy.</w:t>
-      </w:r>
-      <w:r>
-        <w:t xml:space="preserve"> </w:t>
-      </w:r>
-      <w:r>
-        <w:rPr>
-          <w:i/>
-        </w:rPr>
-        <w:t xml:space="preserve">Molecular Therapy</w:t>
-      </w:r>
-      <w:r>
-        <w:t xml:space="preserve"> </w:t>
-      </w:r>
-      <w:r>
-        <w:rPr>
-          <w:b/>
-        </w:rPr>
-        <w:t xml:space="preserve">25</w:t>
-      </w:r>
-      <w:r>
-        <w:t xml:space="preserve">, 1769–1781 (2017).</w:t>
-      </w:r>
-    </w:p>
-    <w:bookmarkEnd w:id="94"/>
-    <w:bookmarkStart w:id="95" w:name="ref-8Miti2Gz"/>
-    <w:p>
-      <w:pPr>
-        <w:pStyle w:val="Bibliography"/>
-      </w:pPr>
-      <w:r>
-        <w:t xml:space="preserve">35. Virtanen, P.</w:t>
-      </w:r>
-      <w:r>
-        <w:t xml:space="preserve"> </w:t>
-      </w:r>
-      <w:r>
-        <w:rPr>
-          <w:i/>
-        </w:rPr>
-        <w:t xml:space="preserve">et al.</w:t>
-      </w:r>
-      <w:r>
-        <w:t xml:space="preserve"> </w:t>
-      </w:r>
-      <w:r>
-        <w:t xml:space="preserve">SciPy 1.0: fundamental algorithms for scientific computing in Python.</w:t>
-      </w:r>
-      <w:r>
-        <w:t xml:space="preserve"> </w:t>
-      </w:r>
-      <w:r>
-        <w:rPr>
-          <w:i/>
-        </w:rPr>
-        <w:t xml:space="preserve">Nature Methods</w:t>
-      </w:r>
-      <w:r>
-        <w:t xml:space="preserve"> </w:t>
-      </w:r>
-      <w:r>
-        <w:rPr>
-          <w:b/>
-        </w:rPr>
-        <w:t xml:space="preserve">17</w:t>
-      </w:r>
-      <w:r>
-        <w:t xml:space="preserve">, 261–272 (2020).</w:t>
-      </w:r>
-    </w:p>
-    <w:bookmarkEnd w:id="95"/>
-    <w:bookmarkEnd w:id="96"/>
+    <w:bookmarkEnd w:id="97"/>
+    <w:bookmarkEnd w:id="98"/>
     <w:sectPr>
       <w:pgSz w:w="12240" w:h="15840"/>
       <w:pgMar w:top="1440" w:right="1440" w:bottom="1440" w:left="1440" w:header="720" w:footer="720" w:gutter="0"/>

</xml_diff>